<commit_message>
Set up text formatting and linked zotero references for citing
</commit_message>
<xml_diff>
--- a/reports/LAPSE_primary_publication.docx
+++ b/reports/LAPSE_primary_publication.docx
@@ -148,7 +148,19 @@
         <w:pStyle w:val="FirstParagraph"/>
       </w:pPr>
       <w:r>
-        <w:t xml:space="preserve">Eurocentric colonial stewardship of natural resources in Canada is administered through a decentralized, multi-sector array of federal, provincial, territorial, and municipal constitutional authority (Ray et al 2021; Campbell and Thomas 2002). Stemming from the Constitution Act, legislative control over fisheries and ecological stewardship has been a reactionary process of assigning authority through two orders of government (federal and provincial) for new environmental issues as they arise, which creates a complex and overlapping governance distribution (Becklumb 2013). The dual roles, from the adaption of British Common Law to the Canadian situation, can lead to confusion around management prerogatives (Thompson 1974) and jurisdictional authority is rarely the responsibility of one level of government (Campbell and Thomas 2002) or one department (Figures 1 and 2).</w:t>
+        <w:t xml:space="preserve">Eurocentric colonial stewardship of natural resources in Canada is administered through a decentralized, multi-sector array of federal, provincial, territorial, and municipal constitutional authority</w:t>
+      </w:r>
+      <w:r>
+        <w:t xml:space="preserve"> </w:t>
+      </w:r>
+      <w:r>
+        <w:t xml:space="preserve">(Ray et al. 2021)</w:t>
+      </w:r>
+      <w:r>
+        <w:t xml:space="preserve"> </w:t>
+      </w:r>
+      <w:r>
+        <w:t xml:space="preserve">(Ray et al 2021; Campbell and Thomas 2002). Stemming from the Constitution Act, legislative control over fisheries and ecological stewardship has been a reactionary process of assigning authority through two orders of government (federal and provincial) for new environmental issues as they arise, which creates a complex and overlapping governance distribution (Becklumb 2013). The dual roles, from the adaption of British Common Law to the Canadian situation, can lead to confusion around management prerogatives (Thompson 1974) and jurisdictional authority is rarely the responsibility of one level of government (Campbell and Thomas 2002) or one department (Figures 1 and 2).</w:t>
       </w:r>
     </w:p>
     <w:p>
@@ -817,25 +829,7 @@
         <w:pStyle w:val="FirstParagraph"/>
       </w:pPr>
       <w:r>
-        <w:t xml:space="preserve">• Salmon biology, why salmon management can be difficult (geography etc.). How human activities influence salmon habitat</w:t>
-      </w:r>
-      <w:r>
-        <w:t xml:space="preserve"> </w:t>
-      </w:r>
-      <w:r>
-        <w:t xml:space="preserve">• Intro to IUCN threats. Why use.</w:t>
-      </w:r>
-      <w:r>
-        <w:t xml:space="preserve"> </w:t>
-      </w:r>
-      <w:r>
-        <w:t xml:space="preserve">• IUCN threats are designed for biodiversity. Salmon are managed for diversity. IUCN threats are used in the COSEWIC RPA process</w:t>
-      </w:r>
-      <w:r>
-        <w:t xml:space="preserve"> </w:t>
-      </w:r>
-      <w:r>
-        <w:t xml:space="preserve">• Examples</w:t>
+        <w:t xml:space="preserve">• Salmon biology, why salmon management can be difficult (geography etc.). How human activities influence salmon habitat • Intro to IUCN threats. Why use. • IUCN threats are designed for biodiversity. Salmon are managed for diversity. IUCN threats are used in the COSEWIC RPA process • Examples</w:t>
       </w:r>
     </w:p>
     <w:p>
@@ -1058,19 +1052,7 @@
         <w:pStyle w:val="FirstParagraph"/>
       </w:pPr>
       <w:r>
-        <w:t xml:space="preserve">• The keyword matching process allows for assessment of other categories as well</w:t>
-      </w:r>
-      <w:r>
-        <w:t xml:space="preserve"> </w:t>
-      </w:r>
-      <w:r>
-        <w:t xml:space="preserve">• Can interrogate a measure of context to the clauses (ie. Prohibitions vs exemptions).</w:t>
-      </w:r>
-      <w:r>
-        <w:t xml:space="preserve"> </w:t>
-      </w:r>
-      <w:r>
-        <w:t xml:space="preserve">• Useful for looking up licencing sections</w:t>
+        <w:t xml:space="preserve">• The keyword matching process allows for assessment of other categories as well • Can interrogate a measure of context to the clauses (ie. Prohibitions vs exemptions). • Useful for looking up licencing sections</w:t>
       </w:r>
     </w:p>
     <w:p>
@@ -1410,13 +1392,7 @@
         <w:pStyle w:val="FirstParagraph"/>
       </w:pPr>
       <w:r>
-        <w:t xml:space="preserve">• Multiple keywords are assigned to one clause. Example: pollution and aquaculture</w:t>
-      </w:r>
-      <w:r>
-        <w:t xml:space="preserve"> </w:t>
-      </w:r>
-      <w:r>
-        <w:t xml:space="preserve">• Analyzing co-occurrence can create insights for related threats.</w:t>
+        <w:t xml:space="preserve">• Multiple keywords are assigned to one clause. Example: pollution and aquaculture • Analyzing co-occurrence can create insights for related threats.</w:t>
       </w:r>
     </w:p>
     <w:p>
@@ -1530,13 +1506,7 @@
         <w:pStyle w:val="FirstParagraph"/>
       </w:pPr>
       <w:r>
-        <w:t xml:space="preserve">• The LAPSE framework can be a useful way for practitioners to query relevant legislation for salmon management topics.</w:t>
-      </w:r>
-      <w:r>
-        <w:t xml:space="preserve"> </w:t>
-      </w:r>
-      <w:r>
-        <w:t xml:space="preserve">• Users can use keywords to search legislation already using CanLii, but using management domains and IUCN threats, we are able to link clauses to more specific salmon biological aspects • Not only does the process link legislation to specific salmon concerns, but this process is also linked to real-world salmon management through the WSP CU and RPA processes, which incorporates threat rankings by CU.</w:t>
+        <w:t xml:space="preserve">• The LAPSE framework can be a useful way for practitioners to query relevant legislation for salmon management topics. • Users can use keywords to search legislation already using CanLii, but using management domains and IUCN threats, we are able to link clauses to more specific salmon biological aspects • Not only does the process link legislation to specific salmon concerns, but this process is also linked to real-world salmon management through the WSP CU and RPA processes, which incorporates threat rankings by CU.</w:t>
       </w:r>
     </w:p>
     <w:p>
@@ -1564,7 +1534,7 @@
       </w:r>
     </w:p>
     <w:bookmarkEnd w:id="32"/>
-    <w:bookmarkStart w:id="33" w:name="references"/>
+    <w:bookmarkStart w:id="36" w:name="references"/>
     <w:p>
       <w:pPr>
         <w:pStyle w:val="Heading1"/>
@@ -1573,8 +1543,65 @@
         <w:t xml:space="preserve">References</w:t>
       </w:r>
     </w:p>
-    <w:bookmarkEnd w:id="33"/>
-    <w:bookmarkStart w:id="34" w:name="supplementary-material"/>
+    <w:bookmarkStart w:id="35" w:name="refs"/>
+    <w:bookmarkStart w:id="34" w:name="ref-ray2021"/>
+    <w:p>
+      <w:pPr>
+        <w:pStyle w:val="Bibliography"/>
+      </w:pPr>
+      <w:r>
+        <w:t xml:space="preserve">Ray, J.C., Grimm, J., and Olive, A. 2021. The biodiversity crisis in</w:t>
+      </w:r>
+      <w:r>
+        <w:t xml:space="preserve"> </w:t>
+      </w:r>
+      <w:r>
+        <w:t xml:space="preserve">Canada</w:t>
+      </w:r>
+      <w:r>
+        <w:t xml:space="preserve">:</w:t>
+      </w:r>
+      <w:r>
+        <w:t xml:space="preserve"> </w:t>
+      </w:r>
+      <w:r>
+        <w:t xml:space="preserve">Failures</w:t>
+      </w:r>
+      <w:r>
+        <w:t xml:space="preserve"> </w:t>
+      </w:r>
+      <w:r>
+        <w:t xml:space="preserve">and challenges of federal and sub-national strategic and legal frameworks. FACETS</w:t>
+      </w:r>
+      <w:r>
+        <w:t xml:space="preserve"> </w:t>
+      </w:r>
+      <w:r>
+        <w:rPr>
+          <w:b/>
+          <w:bCs/>
+        </w:rPr>
+        <w:t xml:space="preserve">6</w:t>
+      </w:r>
+      <w:r>
+        <w:t xml:space="preserve">: 1044–1068. doi:</w:t>
+      </w:r>
+      <w:hyperlink r:id="rId33">
+        <w:r>
+          <w:rPr>
+            <w:rStyle w:val="Hyperlink"/>
+          </w:rPr>
+          <w:t xml:space="preserve">10.1139/facets-2020-0075</w:t>
+        </w:r>
+      </w:hyperlink>
+      <w:r>
+        <w:t xml:space="preserve">.</w:t>
+      </w:r>
+    </w:p>
+    <w:bookmarkEnd w:id="34"/>
+    <w:bookmarkEnd w:id="35"/>
+    <w:bookmarkEnd w:id="36"/>
+    <w:bookmarkStart w:id="37" w:name="supplementary-material"/>
     <w:p>
       <w:pPr>
         <w:pStyle w:val="Heading1"/>
@@ -1591,7 +1618,7 @@
         <w:t xml:space="preserve">*Links or downloads for the LAPSE tool materials (app etc.)</w:t>
       </w:r>
     </w:p>
-    <w:bookmarkEnd w:id="34"/>
+    <w:bookmarkEnd w:id="37"/>
     <w:sectPr>
       <w:headerReference r:id="rId10" w:type="even"/>
       <w:headerReference r:id="rId9" w:type="default"/>
@@ -2669,7 +2696,7 @@
   <w:style w:default="1" w:styleId="Normal" w:type="paragraph">
     <w:name w:val="Normal"/>
     <w:qFormat/>
-    <w:rsid w:val="00B95B90"/>
+    <w:rsid w:val="00D40977"/>
     <w:rPr>
       <w:rFonts w:ascii="Times New Roman" w:hAnsi="Times New Roman"/>
     </w:rPr>
@@ -3234,6 +3261,18 @@
     <w:rPr>
       <w:rFonts w:ascii="Times New Roman" w:hAnsi="Times New Roman"/>
     </w:rPr>
+  </w:style>
+  <w:style w:styleId="Bibliography" w:type="paragraph">
+    <w:name w:val="Bibliography"/>
+    <w:basedOn w:val="Normal"/>
+    <w:next w:val="Normal"/>
+    <w:uiPriority w:val="37"/>
+    <w:semiHidden/>
+    <w:unhideWhenUsed/>
+    <w:rsid w:val="00D40977"/>
+    <w:pPr>
+      <w:ind w:hanging="720" w:left="720"/>
+    </w:pPr>
   </w:style>
   <w:style w:type="paragraph" w:customStyle="1" w:styleId="SourceCode">
     <w:name w:val="Source Code"/>

</xml_diff>

<commit_message>
revised for references and figures
</commit_message>
<xml_diff>
--- a/reports/LAPSE_primary_publication.docx
+++ b/reports/LAPSE_primary_publication.docx
@@ -134,7 +134,7 @@
         <w:t xml:space="preserve">2025-12-17</w:t>
       </w:r>
     </w:p>
-    <w:bookmarkStart w:id="20" w:name="Xb0d16233fb0ea58f7a8e05661af0f015fa4029e"/>
+    <w:bookmarkStart w:id="28" w:name="Xb0d16233fb0ea58f7a8e05661af0f015fa4029e"/>
     <w:p>
       <w:pPr>
         <w:pStyle w:val="Heading1"/>
@@ -154,37 +154,200 @@
         <w:t xml:space="preserve"> </w:t>
       </w:r>
       <w:r>
+        <w:t xml:space="preserve">(Campbell and Thomas 2002; Ray et al. 2021)</w:t>
+      </w:r>
+      <w:r>
+        <w:t xml:space="preserve">. Stemming from the Constitution Act, legislative control over fisheries and ecological stewardship has been a reactionary process of assigning authority through two orders of government (federal and provincial) for new environmental issues as they arise, which creates a complex and overlapping governance distribution</w:t>
+      </w:r>
+      <w:r>
+        <w:t xml:space="preserve"> </w:t>
+      </w:r>
+      <w:r>
+        <w:t xml:space="preserve">(Becklumb 2013)</w:t>
+      </w:r>
+      <w:r>
+        <w:t xml:space="preserve">. The dual roles, from the adaption of British Common Law to the Canadian situation, can lead to confusion around management prerogatives</w:t>
+      </w:r>
+      <w:r>
+        <w:t xml:space="preserve"> </w:t>
+      </w:r>
+      <w:r>
+        <w:t xml:space="preserve">(Thompson 1974)</w:t>
+      </w:r>
+      <w:r>
+        <w:t xml:space="preserve"> </w:t>
+      </w:r>
+      <w:r>
+        <w:t xml:space="preserve">and jurisdictional authority is rarely the responsibility of one level of government</w:t>
+      </w:r>
+      <w:r>
+        <w:t xml:space="preserve"> </w:t>
+      </w:r>
+      <w:r>
+        <w:t xml:space="preserve">(Campbell and Thomas 2002)</w:t>
+      </w:r>
+      <w:r>
+        <w:t xml:space="preserve"> </w:t>
+      </w:r>
+      <w:r>
+        <w:t xml:space="preserve">or one department (Figures 1 and 2).</w:t>
+      </w:r>
+    </w:p>
+    <w:p>
+      <w:pPr>
+        <w:pStyle w:val="CaptionedFigure"/>
+      </w:pPr>
+      <w:r>
+        <w:drawing>
+          <wp:inline>
+            <wp:extent cx="5943600" cy="4953000"/>
+            <wp:effectExtent b="0" l="0" r="0" t="0"/>
+            <wp:docPr descr="Figure 1: Federal jurisdiction: Legislation to Agency relationships." title="" id="21" name="Picture"/>
+            <a:graphic>
+              <a:graphicData uri="http://schemas.openxmlformats.org/drawingml/2006/picture">
+                <pic:pic>
+                  <pic:nvPicPr>
+                    <pic:cNvPr descr="LAPSE_primary_publication_files/figure-docx/fig-sankey-federal-1.png" id="22" name="Picture"/>
+                    <pic:cNvPicPr>
+                      <a:picLocks noChangeArrowheads="1" noChangeAspect="1"/>
+                    </pic:cNvPicPr>
+                  </pic:nvPicPr>
+                  <pic:blipFill>
+                    <a:blip r:embed="rId20"/>
+                    <a:stretch>
+                      <a:fillRect/>
+                    </a:stretch>
+                  </pic:blipFill>
+                  <pic:spPr bwMode="auto">
+                    <a:xfrm>
+                      <a:off x="0" y="0"/>
+                      <a:ext cx="5943600" cy="4953000"/>
+                    </a:xfrm>
+                    <a:prstGeom prst="rect">
+                      <a:avLst/>
+                    </a:prstGeom>
+                    <a:noFill/>
+                    <a:ln w="9525">
+                      <a:noFill/>
+                      <a:headEnd/>
+                      <a:tailEnd/>
+                    </a:ln>
+                  </pic:spPr>
+                </pic:pic>
+              </a:graphicData>
+            </a:graphic>
+          </wp:inline>
+        </w:drawing>
+      </w:r>
+    </w:p>
+    <w:p>
+      <w:pPr>
+        <w:pStyle w:val="ImageCaption"/>
+      </w:pPr>
+      <w:bookmarkStart w:id="23" w:name="fig:fig-sankey-federal"/>
+      <w:bookmarkEnd w:id="23"/>
+      <w:r>
+        <w:t xml:space="preserve">Figure 1: Federal jurisdiction: Legislation to Agency relationships.</w:t>
+      </w:r>
+    </w:p>
+    <w:p>
+      <w:pPr>
+        <w:pStyle w:val="CaptionedFigure"/>
+      </w:pPr>
+      <w:r>
+        <w:drawing>
+          <wp:inline>
+            <wp:extent cx="5943600" cy="5094514"/>
+            <wp:effectExtent b="0" l="0" r="0" t="0"/>
+            <wp:docPr descr="Figure 2: Provincial jurisdiction: Legislation to Agency relationships." title="" id="25" name="Picture"/>
+            <a:graphic>
+              <a:graphicData uri="http://schemas.openxmlformats.org/drawingml/2006/picture">
+                <pic:pic>
+                  <pic:nvPicPr>
+                    <pic:cNvPr descr="LAPSE_primary_publication_files/figure-docx/fig-sankey-provincial-1.png" id="26" name="Picture"/>
+                    <pic:cNvPicPr>
+                      <a:picLocks noChangeArrowheads="1" noChangeAspect="1"/>
+                    </pic:cNvPicPr>
+                  </pic:nvPicPr>
+                  <pic:blipFill>
+                    <a:blip r:embed="rId24"/>
+                    <a:stretch>
+                      <a:fillRect/>
+                    </a:stretch>
+                  </pic:blipFill>
+                  <pic:spPr bwMode="auto">
+                    <a:xfrm>
+                      <a:off x="0" y="0"/>
+                      <a:ext cx="5943600" cy="5094514"/>
+                    </a:xfrm>
+                    <a:prstGeom prst="rect">
+                      <a:avLst/>
+                    </a:prstGeom>
+                    <a:noFill/>
+                    <a:ln w="9525">
+                      <a:noFill/>
+                      <a:headEnd/>
+                      <a:tailEnd/>
+                    </a:ln>
+                  </pic:spPr>
+                </pic:pic>
+              </a:graphicData>
+            </a:graphic>
+          </wp:inline>
+        </w:drawing>
+      </w:r>
+    </w:p>
+    <w:p>
+      <w:pPr>
+        <w:pStyle w:val="ImageCaption"/>
+      </w:pPr>
+      <w:bookmarkStart w:id="27" w:name="fig:fig-sankey-provincial"/>
+      <w:bookmarkEnd w:id="27"/>
+      <w:r>
+        <w:t xml:space="preserve">Figure 2: Provincial jurisdiction: Legislation to Agency relationships.</w:t>
+      </w:r>
+    </w:p>
+    <w:p>
+      <w:pPr>
+        <w:pStyle w:val="BodyText"/>
+      </w:pPr>
+      <w:r>
+        <w:t xml:space="preserve">The fragmented federal jurisdiction over natural resources has always been ambiguous and limited with 89% of resources located within provincial legislative authority</w:t>
+      </w:r>
+      <w:r>
+        <w:t xml:space="preserve"> </w:t>
+      </w:r>
+      <w:r>
         <w:t xml:space="preserve">(Ray et al. 2021)</w:t>
       </w:r>
       <w:r>
-        <w:t xml:space="preserve"> </w:t>
-      </w:r>
-      <w:r>
-        <w:t xml:space="preserve">(Ray et al 2021; Campbell and Thomas 2002). Stemming from the Constitution Act, legislative control over fisheries and ecological stewardship has been a reactionary process of assigning authority through two orders of government (federal and provincial) for new environmental issues as they arise, which creates a complex and overlapping governance distribution (Becklumb 2013). The dual roles, from the adaption of British Common Law to the Canadian situation, can lead to confusion around management prerogatives (Thompson 1974) and jurisdictional authority is rarely the responsibility of one level of government (Campbell and Thomas 2002) or one department (Figures 1 and 2).</w:t>
-      </w:r>
-    </w:p>
-    <w:p>
-      <w:pPr>
-        <w:pStyle w:val="BodyText"/>
-      </w:pPr>
-      <w:r>
-        <w:t xml:space="preserve">!! Figure 1 &amp; 2</w:t>
-      </w:r>
-    </w:p>
-    <w:p>
-      <w:pPr>
-        <w:pStyle w:val="BodyText"/>
-      </w:pPr>
-      <w:r>
-        <w:t xml:space="preserve">The fragmented federal jurisdiction over natural resources has always been ambiguous and limited with 89% of resources located within provincial legislative authority (Ray et al 2021). Provinces have jurisdiction over most wildlife within their borders; however, the federal government has jurisdiction over wildlife on federal land (e.g. national parks), as well as, migratory birds and aquatic species including marine mammals and fish (Becklumb 2013, Kraus et al 2021). While salmon and salmon fisheries are regulated federally, water use and watercourse management and the corresponding aquatic habitat is managed by the provinces.</w:t>
-      </w:r>
-    </w:p>
-    <w:p>
-      <w:pPr>
-        <w:pStyle w:val="BodyText"/>
-      </w:pPr>
-      <w:r>
-        <w:t xml:space="preserve">Watercourse management is not, however, strictly provincial jurisdiction. The federal government regulates fisheries and navigable waters in oceans, lakes, rivers, and streams even within provincial boundaries (Becklumb 2013; Swerdfager and Olive 2023). Federal fisheries governance also includes the quality of fish-bearing waters, and both federal and provincial governments have authority to designate protected areas.</w:t>
+        <w:t xml:space="preserve">. Provinces have jurisdiction over most wildlife within their borders; however, the federal government has jurisdiction over wildlife on federal land (e.g. national parks), as well as, migratory birds and aquatic species including marine mammals and fish</w:t>
+      </w:r>
+      <w:r>
+        <w:t xml:space="preserve"> </w:t>
+      </w:r>
+      <w:r>
+        <w:t xml:space="preserve">(Becklumb 2013; Kraus et al. 2021)</w:t>
+      </w:r>
+      <w:r>
+        <w:t xml:space="preserve">. While salmon and salmon fisheries are regulated federally, water use and watercourse management and the corresponding aquatic habitat is managed by the provinces.</w:t>
+      </w:r>
+    </w:p>
+    <w:p>
+      <w:pPr>
+        <w:pStyle w:val="BodyText"/>
+      </w:pPr>
+      <w:r>
+        <w:t xml:space="preserve">Watercourse management is not, however, strictly provincial jurisdiction. The federal government regulates fisheries and navigable waters in oceans, lakes, rivers, and streams even within provincial boundaries</w:t>
+      </w:r>
+      <w:r>
+        <w:t xml:space="preserve"> </w:t>
+      </w:r>
+      <w:r>
+        <w:t xml:space="preserve">(Becklumb 2013; Swerdfager and Olive 2023)</w:t>
+      </w:r>
+      <w:r>
+        <w:t xml:space="preserve">. Federal fisheries governance also includes the quality of fish-bearing waters, and both federal and provincial governments have authority to designate protected areas.</w:t>
       </w:r>
     </w:p>
     <w:p>
@@ -200,11 +363,47 @@
         <w:pStyle w:val="BodyText"/>
       </w:pPr>
       <w:r>
-        <w:t xml:space="preserve">Projects that influence environmental factors can be subject to both provincial and federal environmental assessments during the planning stages (Becklumb 2013). Natural resource legislation and programs often operate on a sector-by-sector and individual resource basis where integrated stewardship relies on scale-appropriate planning and decision making (Ray et al 2021). Provinces generally decide when, or if, to regulate on matters of environmental concern (Campbell and Thomas 2002). British Columbia is even more decentralized than other provinces, especially in terms of species at risk legislation, because British Columbia’s relevant provisions are spread over the greatest number of statutes and regulations (Bogetti and Mason 2025).</w:t>
-      </w:r>
-    </w:p>
-    <w:bookmarkEnd w:id="20"/>
-    <w:bookmarkStart w:id="21" w:name="salmon-populations-at-risk"/>
+        <w:t xml:space="preserve">Projects that influence environmental factors can be subject to both provincial and federal environmental assessments during the planning stages</w:t>
+      </w:r>
+      <w:r>
+        <w:t xml:space="preserve"> </w:t>
+      </w:r>
+      <w:r>
+        <w:t xml:space="preserve">(Becklumb 2013)</w:t>
+      </w:r>
+      <w:r>
+        <w:t xml:space="preserve">. Natural resource legislation and programs often operate on a sector-by-sector and individual resource basis where integrated stewardship relies on scale-appropriate planning and decision making</w:t>
+      </w:r>
+      <w:r>
+        <w:t xml:space="preserve"> </w:t>
+      </w:r>
+      <w:r>
+        <w:t xml:space="preserve">(Ray et al. 2021)</w:t>
+      </w:r>
+      <w:r>
+        <w:t xml:space="preserve">. Provinces generally decide when, or if, to regulate on matters of environmental concern</w:t>
+      </w:r>
+      <w:r>
+        <w:t xml:space="preserve"> </w:t>
+      </w:r>
+      <w:r>
+        <w:t xml:space="preserve">(Campbell and Thomas 2002)</w:t>
+      </w:r>
+      <w:r>
+        <w:t xml:space="preserve">. British Columbia is even more decentralized than other provinces, especially in terms of species at risk legislation, because British Columbia’s relevant provisions are spread over the greatest number of statutes and regulations</w:t>
+      </w:r>
+      <w:r>
+        <w:t xml:space="preserve"> </w:t>
+      </w:r>
+      <w:r>
+        <w:t xml:space="preserve">(Bogetti and Mason 2025)</w:t>
+      </w:r>
+      <w:r>
+        <w:t xml:space="preserve">.</w:t>
+      </w:r>
+    </w:p>
+    <w:bookmarkEnd w:id="28"/>
+    <w:bookmarkStart w:id="29" w:name="salmon-populations-at-risk"/>
     <w:p>
       <w:pPr>
         <w:pStyle w:val="Heading1"/>
@@ -218,7 +417,28 @@
         <w:pStyle w:val="FirstParagraph"/>
       </w:pPr>
       <w:r>
-        <w:t xml:space="preserve">Despite considerable financial investments in salmon conservation and habitat restoration programs, as well as, the revision of management frameworks (e.g. Canada’s Policy for Conservation of Wild Pacific Salmon), Pacific salmon populations continue to decline in British Columbia and the number of populations monitored continues to drop (Price et al 2017; Bisson et al 2009; Nelitz et al 2011). Price et al (2017) found that</w:t>
+        <w:t xml:space="preserve">Despite considerable financial investments in salmon conservation and habitat restoration programs, as well as, the revision of management frameworks (e.g. Canada’s Policy for Conservation of Wild Pacific Salmon), Pacific salmon populations continue to decline in British Columbia and the number of populations monitored continues to drop</w:t>
+      </w:r>
+      <w:r>
+        <w:t xml:space="preserve"> </w:t>
+      </w:r>
+      <w:r>
+        <w:t xml:space="preserve">(Bisson et al. 2009; Price et al. 2017)</w:t>
+      </w:r>
+      <w:r>
+        <w:t xml:space="preserve">.</w:t>
+      </w:r>
+      <w:r>
+        <w:t xml:space="preserve"> </w:t>
+      </w:r>
+      <w:r>
+        <w:t xml:space="preserve">Price et al. (2017)</w:t>
+      </w:r>
+      <w:r>
+        <w:t xml:space="preserve"> </w:t>
+      </w:r>
+      <w:r>
+        <w:t xml:space="preserve">found that</w:t>
       </w:r>
       <w:r>
         <w:t xml:space="preserve"> </w:t>
@@ -236,15 +456,42 @@
         <w:t xml:space="preserve"> </w:t>
       </w:r>
       <w:r>
-        <w:t xml:space="preserve">Of the monitored streams along the north and central coast, ninety-six percent consistently fell below escapement targets (adults returning to spawn) from 1950 to 2005 (Price et al 2017). While difficult to pinpoint a single cause, the decline of salmon populations and habitat capacity is recognized as a consequence of human activity, especially the loss or degradation of freshwater habitat (Bisson et al 2009); however, industrial development and urbanization continues to grow unabated within watersheds.</w:t>
-      </w:r>
-    </w:p>
-    <w:p>
-      <w:pPr>
-        <w:pStyle w:val="BodyText"/>
-      </w:pPr>
-      <w:r>
-        <w:t xml:space="preserve">Federal departments differ in how they implement the same legislation. For example, during the Species At Risk Act listing process, Fisheries and Oceans Canada (DFO) conducts socio-economic analyses, whereas Environment and Climate Change Canada (ECCC) does not (Turcotte et al 2021). Canada’s Policy for Conservation of Wild Pacific Salmon (WSP) outlines a process for Pacific salmon stewardship using the precautionary principle and the scope of salmon diversity protection at the Conservation Unit (CU): genetically and (or) geographically distinct populations. These misaligned processes create where even when a salmon population is assessed as</w:t>
+        <w:t xml:space="preserve">Of the monitored streams along the north and central coast, ninety-six percent consistently fell below escapement targets (adults returning to spawn) from 1950 to 2005</w:t>
+      </w:r>
+      <w:r>
+        <w:t xml:space="preserve"> </w:t>
+      </w:r>
+      <w:r>
+        <w:t xml:space="preserve">(Price et al. 2017)</w:t>
+      </w:r>
+      <w:r>
+        <w:t xml:space="preserve">. While difficult to pinpoint a single cause, the decline of salmon populations and habitat capacity is recognized as a consequence of human activity, especially the loss or degradation of freshwater habitat</w:t>
+      </w:r>
+      <w:r>
+        <w:t xml:space="preserve"> </w:t>
+      </w:r>
+      <w:r>
+        <w:t xml:space="preserve">(Bisson et al. 2009)</w:t>
+      </w:r>
+      <w:r>
+        <w:t xml:space="preserve">; however, industrial development and urbanization continues to grow unabated within watersheds.</w:t>
+      </w:r>
+    </w:p>
+    <w:p>
+      <w:pPr>
+        <w:pStyle w:val="BodyText"/>
+      </w:pPr>
+      <w:r>
+        <w:t xml:space="preserve">Federal departments differ in how they implement the same legislation. For example, during the Species At Risk Act listing process, Fisheries and Oceans Canada (DFO) conducts socio-economic analyses, whereas Environment and Climate Change Canada (ECCC) does not</w:t>
+      </w:r>
+      <w:r>
+        <w:t xml:space="preserve"> </w:t>
+      </w:r>
+      <w:r>
+        <w:t xml:space="preserve">(Turcotte et al. 2021)</w:t>
+      </w:r>
+      <w:r>
+        <w:t xml:space="preserve">. Canada’s Policy for Conservation of Wild Pacific Salmon (WSP) outlines a process for Pacific salmon stewardship using the precautionary principle and the scope of salmon diversity protection at the Conservation Unit (CU): genetically and (or) geographically distinct populations. These misaligned processes create where even when a salmon population is assessed as</w:t>
       </w:r>
       <w:r>
         <w:t xml:space="preserve"> </w:t>
@@ -265,8 +512,8 @@
         <w:t xml:space="preserve">through COSEWIC (Cultus Lake sockeye), the population could still be omitted from the List of Endangered Species (Order) for economic and political reasons (co-migrating with other stocks), denying the population larger legislative protections.</w:t>
       </w:r>
     </w:p>
-    <w:bookmarkEnd w:id="21"/>
-    <w:bookmarkStart w:id="22" w:name="X57d7d8d53ff4272e7fbbbbb35544d9a3ac5bd2f"/>
+    <w:bookmarkEnd w:id="29"/>
+    <w:bookmarkStart w:id="30" w:name="X57d7d8d53ff4272e7fbbbbb35544d9a3ac5bd2f"/>
     <w:p>
       <w:pPr>
         <w:pStyle w:val="Heading1"/>
@@ -280,23 +527,89 @@
         <w:pStyle w:val="FirstParagraph"/>
       </w:pPr>
       <w:r>
-        <w:t xml:space="preserve">Socio-political boundaries at multiple spatial scales across a species’ range increases ambiguity regarding the ownership and regulation of space (Dallimer and Strange 2015). This patchwork of authority is prominent in Pacific salmon management due to the complicated geographic nature of the salmon anadromous life cycle, spanning a variety of freshwater and marine ecosystems coast-wide and across international boundaries. The sustainable stewardship of resilient salmon populations relies on their ability to access a variety of watercourses with connectivity between habitats (Carlson and Baylis 2022) also including ephemeral habitats, which are important for fry and juvenile rearing (Dionne et al 2023).</w:t>
-      </w:r>
-    </w:p>
-    <w:p>
-      <w:pPr>
-        <w:pStyle w:val="BodyText"/>
-      </w:pPr>
-      <w:r>
-        <w:t xml:space="preserve">Nearly all salmon populations utilize watersheds with multiple ownerships, which creates inconsistent regulation and a patchwork of disconnected critical habitat (Bisson et al 2009). Freshwater habitat in terms of water quantity (discharge and timing) and water quality (temperature and chemistry) are impacted by actions and conditions throughout the entire watershed. Changes in freshwater habitat affects that habitat use timing by salmon and subsequently the salmon life cycle. For example, British Columbia coastal streams with rain-dominated hydrology generally produce ocean-type Chinook salmon (migrate to the ocean within their first year), while snow-dominated interior watersheds produce stream-type Chinook who overwinter in freshwater for one year or more (Dionne et al 2023). Governance over any land use process throughout most watersheds in British Columbia has an impact on salmon population production, habitat capacity, and corresponding long-term food security for British Columbian communities.</w:t>
-      </w:r>
-    </w:p>
-    <w:p>
-      <w:pPr>
-        <w:pStyle w:val="BodyText"/>
-      </w:pPr>
-      <w:r>
-        <w:t xml:space="preserve">Federal parliament and provincial legislatures rely on broadly discretionary terms in statutes that appear protective (Collins and Sossin 2019), but may chronically fail to prevent environmental degradation (Bankes et al 2014). One term can make the difference between a clause being mandatory or discretionary (</w:t>
+        <w:t xml:space="preserve">Socio-political boundaries at multiple spatial scales across a species’ range increases ambiguity regarding the ownership and regulation of space</w:t>
+      </w:r>
+      <w:r>
+        <w:t xml:space="preserve"> </w:t>
+      </w:r>
+      <w:r>
+        <w:t xml:space="preserve">(Dallimer and Strange 2015)</w:t>
+      </w:r>
+      <w:r>
+        <w:t xml:space="preserve">. This patchwork of authority is prominent in Pacific salmon management due to the complicated geographic nature of the salmon anadromous life cycle, spanning a variety of freshwater and marine ecosystems coast-wide and across international boundaries. The sustainable stewardship of resilient salmon populations relies on their ability to access a variety of watercourses with connectivity between habitats</w:t>
+      </w:r>
+      <w:r>
+        <w:t xml:space="preserve"> </w:t>
+      </w:r>
+      <w:r>
+        <w:t xml:space="preserve">(Carlson and Baylis 2022)</w:t>
+      </w:r>
+      <w:r>
+        <w:t xml:space="preserve"> </w:t>
+      </w:r>
+      <w:r>
+        <w:t xml:space="preserve">also including ephemeral habitats, which are important for fry and juvenile rearing</w:t>
+      </w:r>
+      <w:r>
+        <w:t xml:space="preserve"> </w:t>
+      </w:r>
+      <w:r>
+        <w:t xml:space="preserve">(Dionne 2023)</w:t>
+      </w:r>
+      <w:r>
+        <w:t xml:space="preserve">.</w:t>
+      </w:r>
+    </w:p>
+    <w:p>
+      <w:pPr>
+        <w:pStyle w:val="BodyText"/>
+      </w:pPr>
+      <w:r>
+        <w:t xml:space="preserve">Nearly all salmon populations utilize watersheds with multiple ownerships, which creates inconsistent regulation and a patchwork of disconnected critical habitat</w:t>
+      </w:r>
+      <w:r>
+        <w:t xml:space="preserve"> </w:t>
+      </w:r>
+      <w:r>
+        <w:t xml:space="preserve">(Bisson et al. 2009)</w:t>
+      </w:r>
+      <w:r>
+        <w:t xml:space="preserve">. Freshwater habitat in terms of water quantity (discharge and timing) and water quality (temperature and chemistry) are impacted by actions and conditions throughout the entire watershed. Changes in freshwater habitat affects that habitat use timing by salmon and subsequently the salmon life cycle. For example, British Columbia coastal streams with rain-dominated hydrology generally produce ocean-type Chinook salmon (migrate to the ocean within their first year), while snow-dominated interior watersheds produce stream-type Chinook who overwinter in freshwater for one year or more</w:t>
+      </w:r>
+      <w:r>
+        <w:t xml:space="preserve"> </w:t>
+      </w:r>
+      <w:r>
+        <w:t xml:space="preserve">(Dionne 2023)</w:t>
+      </w:r>
+      <w:r>
+        <w:t xml:space="preserve">. Governance over any land use process throughout most watersheds in British Columbia has an impact on salmon population production, habitat capacity, and corresponding long-term food security for British Columbian communities.</w:t>
+      </w:r>
+    </w:p>
+    <w:p>
+      <w:pPr>
+        <w:pStyle w:val="BodyText"/>
+      </w:pPr>
+      <w:r>
+        <w:t xml:space="preserve">Federal parliament and provincial legislatures rely on broadly discretionary terms in statutes that appear protective</w:t>
+      </w:r>
+      <w:r>
+        <w:t xml:space="preserve"> </w:t>
+      </w:r>
+      <w:r>
+        <w:t xml:space="preserve">(Collins and Sossin 2019)</w:t>
+      </w:r>
+      <w:r>
+        <w:t xml:space="preserve">, but may chronically fail to prevent environmental degradation</w:t>
+      </w:r>
+      <w:r>
+        <w:t xml:space="preserve"> </w:t>
+      </w:r>
+      <w:r>
+        <w:t xml:space="preserve">(Bankes et al. 2014)</w:t>
+      </w:r>
+      <w:r>
+        <w:t xml:space="preserve">. One term can make the difference between a clause being mandatory or discretionary (</w:t>
       </w:r>
       <w:r>
         <w:t xml:space="preserve">“</w:t>
@@ -326,11 +639,29 @@
         <w:t xml:space="preserve">”</w:t>
       </w:r>
       <w:r>
-        <w:t xml:space="preserve">), allowing an official to only exercise that authority or responsibility when economically feasible. The same laws that prohibit killing fish or damaging habitat also contain provisions to authorize those activities through licences, permits, and exemptions (Swerdfager and Olive 2023). This vagueness creates a large dependance on the executive to explain these implementation gaps (Bankes et al 2014), allowing for arbitrary and somewhat dysfunctional management styles lacking a broader overseer or responsible agency across the entire salmon life cycle.</w:t>
-      </w:r>
-    </w:p>
-    <w:bookmarkEnd w:id="22"/>
-    <w:bookmarkStart w:id="23" w:name="Xf99c42c3166c79d6e14b14d7da12046c07a47b6"/>
+        <w:t xml:space="preserve">), allowing an official to only exercise that authority or responsibility when economically feasible. The same laws that prohibit killing fish or damaging habitat also contain provisions to authorize those activities through licences, permits, and exemptions</w:t>
+      </w:r>
+      <w:r>
+        <w:t xml:space="preserve"> </w:t>
+      </w:r>
+      <w:r>
+        <w:t xml:space="preserve">(Swerdfager and Olive 2023)</w:t>
+      </w:r>
+      <w:r>
+        <w:t xml:space="preserve">. This vagueness creates a large dependence on the executive to explain these implementation gaps</w:t>
+      </w:r>
+      <w:r>
+        <w:t xml:space="preserve"> </w:t>
+      </w:r>
+      <w:r>
+        <w:t xml:space="preserve">(Bankes et al. 2014)</w:t>
+      </w:r>
+      <w:r>
+        <w:t xml:space="preserve">, allowing for arbitrary and somewhat dysfunctional management styles lacking a broader overseer or responsible agency across the entire salmon life cycle.</w:t>
+      </w:r>
+    </w:p>
+    <w:bookmarkEnd w:id="30"/>
+    <w:bookmarkStart w:id="31" w:name="Xf99c42c3166c79d6e14b14d7da12046c07a47b6"/>
     <w:p>
       <w:pPr>
         <w:pStyle w:val="Heading1"/>
@@ -367,8 +698,8 @@
         <w:t xml:space="preserve">”</w:t>
       </w:r>
     </w:p>
-    <w:bookmarkEnd w:id="23"/>
-    <w:bookmarkStart w:id="24" w:name="Xdc8f2bc31f71866589eff63e7a083c6ae57eb8b"/>
+    <w:bookmarkEnd w:id="31"/>
+    <w:bookmarkStart w:id="32" w:name="Xdc8f2bc31f71866589eff63e7a083c6ae57eb8b"/>
     <w:p>
       <w:pPr>
         <w:pStyle w:val="Heading1"/>
@@ -456,8 +787,8 @@
         <w:t xml:space="preserve">Through the CanLII website, the user may look up the keywords queried in each act and regulation chosen. This allows the user to quickly assess the context of the word in the legislation and determine if the section is relevant to Pacific salmon. The full list of legislation reviewed in this process is available in Appendix 1.</w:t>
       </w:r>
     </w:p>
-    <w:bookmarkEnd w:id="24"/>
-    <w:bookmarkStart w:id="25" w:name="legistics-parsing-legislation"/>
+    <w:bookmarkEnd w:id="32"/>
+    <w:bookmarkStart w:id="33" w:name="legistics-parsing-legislation"/>
     <w:p>
       <w:pPr>
         <w:pStyle w:val="Heading1"/>
@@ -541,11 +872,20 @@
         <w:pStyle w:val="BodyText"/>
       </w:pPr>
       <w:r>
-        <w:t xml:space="preserve">The number of statutes per se is not generally indicative of overall quality or potential effectiveness of any legal framework (Ray et al 2021).</w:t>
-      </w:r>
-    </w:p>
-    <w:bookmarkEnd w:id="25"/>
-    <w:bookmarkStart w:id="26" w:name="keyword-development"/>
+        <w:t xml:space="preserve">The number of statutes per se is not generally indicative of overall quality or potential effectiveness of any legal framework</w:t>
+      </w:r>
+      <w:r>
+        <w:t xml:space="preserve"> </w:t>
+      </w:r>
+      <w:r>
+        <w:t xml:space="preserve">(Ray et al. 2021)</w:t>
+      </w:r>
+      <w:r>
+        <w:t xml:space="preserve">.</w:t>
+      </w:r>
+    </w:p>
+    <w:bookmarkEnd w:id="33"/>
+    <w:bookmarkStart w:id="34" w:name="keyword-development"/>
     <w:p>
       <w:pPr>
         <w:pStyle w:val="Heading1"/>
@@ -814,8 +1154,8 @@
         <w:t xml:space="preserve">as a keyword is important for the accuracy of categorization. Outputs were reviewed iteratively, and keyword revision was a continuous process to: • find more relevant bigram or trigram alternatives (, • remove keywords where sections are already matched with other, more applicable keywords, and • search for more specific word variations (plural, past tense, etc.)</w:t>
       </w:r>
     </w:p>
-    <w:bookmarkEnd w:id="26"/>
-    <w:bookmarkStart w:id="27" w:name="X06bc8cf00ca5baea230857c3fdd1788ec12acc8"/>
+    <w:bookmarkEnd w:id="34"/>
+    <w:bookmarkStart w:id="35" w:name="X06bc8cf00ca5baea230857c3fdd1788ec12acc8"/>
     <w:p>
       <w:pPr>
         <w:pStyle w:val="Heading1"/>
@@ -829,15 +1169,48 @@
         <w:pStyle w:val="FirstParagraph"/>
       </w:pPr>
       <w:r>
-        <w:t xml:space="preserve">• Salmon biology, why salmon management can be difficult (geography etc.). How human activities influence salmon habitat • Intro to IUCN threats. Why use. • IUCN threats are designed for biodiversity. Salmon are managed for diversity. IUCN threats are used in the COSEWIC RPA process • Examples</w:t>
-      </w:r>
-    </w:p>
-    <w:p>
-      <w:pPr>
-        <w:pStyle w:val="BodyText"/>
-      </w:pPr>
-      <w:r>
-        <w:t xml:space="preserve">Management decisions and activities related to salmon are often in response to identifiable threats to salmon health and population status. Human systems can be categorized as direct threats to biodiversity more specifically for conservation strategies (Salafsky et al 2024). The International Union for Conservation of Nature (IUCN) and Conservation Measures Partnership (CMP) has developed a hierarchical grouping of threats used globally by conservation practitioners. IUCN direct threat categories are widely used to assess threats as part of IUCN red list assessments, as well as, in status assessments for Pacific salmon populations conducted by the Committee for the Status of Endangered Wildlife in Canada (COSEWIC). For this study, the IUCN - CMP Direct Threats Classification 4.0 was used to categorize legislation by direct threats to salmon conservation. Level 2 threat classification was used as the finest resolution that could be applied consistently.</w:t>
+        <w:t xml:space="preserve">• Salmon biology, why salmon management can be difficult (geography etc.). How human activities influence salmon habitat</w:t>
+      </w:r>
+    </w:p>
+    <w:p>
+      <w:pPr>
+        <w:pStyle w:val="BodyText"/>
+      </w:pPr>
+      <w:r>
+        <w:t xml:space="preserve">• Intro to IUCN threats. Why use.</w:t>
+      </w:r>
+    </w:p>
+    <w:p>
+      <w:pPr>
+        <w:pStyle w:val="BodyText"/>
+      </w:pPr>
+      <w:r>
+        <w:t xml:space="preserve">• IUCN threats are designed for biodiversity. Salmon are managed for diversity. IUCN threats are used in the COSEWIC RPA process</w:t>
+      </w:r>
+    </w:p>
+    <w:p>
+      <w:pPr>
+        <w:pStyle w:val="BodyText"/>
+      </w:pPr>
+      <w:r>
+        <w:t xml:space="preserve">• Examples</w:t>
+      </w:r>
+    </w:p>
+    <w:p>
+      <w:pPr>
+        <w:pStyle w:val="BodyText"/>
+      </w:pPr>
+      <w:r>
+        <w:t xml:space="preserve">Management decisions and activities related to salmon are often in response to identifiable threats to salmon health and population status. Human systems can be categorized as direct threats to biodiversity more specifically for conservation strategies</w:t>
+      </w:r>
+      <w:r>
+        <w:t xml:space="preserve"> </w:t>
+      </w:r>
+      <w:r>
+        <w:t xml:space="preserve">(Salafsky et al. 2008)</w:t>
+      </w:r>
+      <w:r>
+        <w:t xml:space="preserve">. The International Union for Conservation of Nature (IUCN) and Conservation Measures Partnership (CMP) has developed a hierarchical grouping of threats used globally by conservation practitioners. IUCN direct threat categories are widely used to assess threats as part of IUCN red list assessments, as well as, in status assessments for Pacific salmon populations conducted by the Committee for the Status of Endangered Wildlife in Canada (COSEWIC). For this study, the IUCN - CMP Direct Threats Classification 4.0 was used to categorize legislation by direct threats to salmon conservation. Level 2 threat classification was used as the finest resolution that could be applied consistently.</w:t>
       </w:r>
     </w:p>
     <w:p>
@@ -856,14 +1229,14 @@
         <w:t xml:space="preserve">IUCN Level 2 categories are more specific, and the categorization process matched to 25 categories (Figure 5) that parallel the management domain categories. Multiple IUCN threats comprise a management domain; however Water-Borne &amp; Other Effluent Pollution (9.1) matched with the highest number of sections (as in the management domains) followed by Fishing, Harvesting &amp; Controlling Aquatic Species (5.4). Eight IUCN threat categories make up the Water Use and Watercourse Modifications management domain, but Dams &amp; Water Management / Use (7.2) has the majority of matches.</w:t>
       </w:r>
     </w:p>
-    <w:bookmarkEnd w:id="27"/>
-    <w:bookmarkStart w:id="28" w:name="X41bdb39aace5af49d4bf81685cea35a70babccd"/>
+    <w:bookmarkEnd w:id="35"/>
+    <w:bookmarkStart w:id="36" w:name="X21d2b709a3b2e27437c410286f2936ef3517541"/>
     <w:p>
       <w:pPr>
         <w:pStyle w:val="Heading1"/>
       </w:pPr>
       <w:r>
-        <w:t xml:space="preserve">Management domains and the LAPSE framework • Not all salmon management categories are threats. Need categories for other factors. • Management domains as an interface • The LAPSE process and tool.</w:t>
+        <w:t xml:space="preserve">Management domains and the LAPSE framework</w:t>
       </w:r>
     </w:p>
     <w:p>
@@ -871,6 +1244,30 @@
         <w:pStyle w:val="FirstParagraph"/>
       </w:pPr>
       <w:r>
+        <w:t xml:space="preserve">• Not all salmon management categories are threats. Need categories for other factors.</w:t>
+      </w:r>
+    </w:p>
+    <w:p>
+      <w:pPr>
+        <w:pStyle w:val="BodyText"/>
+      </w:pPr>
+      <w:r>
+        <w:t xml:space="preserve">• Management domains as an interface</w:t>
+      </w:r>
+    </w:p>
+    <w:p>
+      <w:pPr>
+        <w:pStyle w:val="BodyText"/>
+      </w:pPr>
+      <w:r>
+        <w:t xml:space="preserve">• The LAPSE process and tool.</w:t>
+      </w:r>
+    </w:p>
+    <w:p>
+      <w:pPr>
+        <w:pStyle w:val="BodyText"/>
+      </w:pPr>
+      <w:r>
         <w:t xml:space="preserve">Management domains represent a reframing of multi-jurisdictional issues by salmon management concern rather than specific agency. This tool can then be used by practitioners to view actual binding legislation when considering actions or proposals. Using the IUCN-CMP Direct Threats Classification 4.0, and other broader categories identified through this exercise process, the following management domains were identified:</w:t>
       </w:r>
     </w:p>
@@ -897,7 +1294,47 @@
         <w:t xml:space="preserve"> </w:t>
       </w:r>
       <w:r>
-        <w:t xml:space="preserve">classification was developed as part of this study to parallel management domains and categorize clauses based on their direct application to Pacific salmon. The scope was determined by the specificity of the language used in the section. The scope categories were defined as follows: • 1 – Salmon: refers to Pacific salmon specifically • 2 – Fish: refers to fish that include salmon • 3 – Habitat: refers to any habitat that includes salmon habitat • 4 – Governance: refers to administrative processes and structure</w:t>
+        <w:t xml:space="preserve">classification was developed as part of this study to parallel management domains and categorize clauses based on their direct application to Pacific salmon. The scope was determined by the specificity of the language used in the section.</w:t>
+      </w:r>
+    </w:p>
+    <w:p>
+      <w:pPr>
+        <w:pStyle w:val="BodyText"/>
+      </w:pPr>
+      <w:r>
+        <w:t xml:space="preserve">The scope categories were defined as follows:</w:t>
+      </w:r>
+    </w:p>
+    <w:p>
+      <w:pPr>
+        <w:pStyle w:val="BodyText"/>
+      </w:pPr>
+      <w:r>
+        <w:t xml:space="preserve">• 1 – Salmon: refers to Pacific salmon specifically</w:t>
+      </w:r>
+    </w:p>
+    <w:p>
+      <w:pPr>
+        <w:pStyle w:val="BodyText"/>
+      </w:pPr>
+      <w:r>
+        <w:t xml:space="preserve">• 2 – Fish: refers to fish that include salmon</w:t>
+      </w:r>
+    </w:p>
+    <w:p>
+      <w:pPr>
+        <w:pStyle w:val="BodyText"/>
+      </w:pPr>
+      <w:r>
+        <w:t xml:space="preserve">• 3 – Habitat: refers to any habitat that includes salmon habitat</w:t>
+      </w:r>
+    </w:p>
+    <w:p>
+      <w:pPr>
+        <w:pStyle w:val="BodyText"/>
+      </w:pPr>
+      <w:r>
+        <w:t xml:space="preserve">• 4 – Governance: refers to administrative processes and structure</w:t>
       </w:r>
     </w:p>
     <w:p>
@@ -1037,8 +1474,8 @@
         <w:t xml:space="preserve">More federal legislation sections matched with salmon harvest categories than provincial, as shown in Figures 4 and 5 above. Pacific salmon-specific language (1 - Salmon scope) also matched more federal statutes, specifically, the British Columbia Sport Fishing Regulations, 1996; National Parks of Canada Fishing Regulations; and Pacific Fishery Regulations 1993 (Figure 7).</w:t>
       </w:r>
     </w:p>
-    <w:bookmarkEnd w:id="28"/>
-    <w:bookmarkStart w:id="29" w:name="legislative-factors-clause-types"/>
+    <w:bookmarkEnd w:id="36"/>
+    <w:bookmarkStart w:id="37" w:name="legislative-factors-clause-types"/>
     <w:p>
       <w:pPr>
         <w:pStyle w:val="Heading1"/>
@@ -1052,7 +1489,23 @@
         <w:pStyle w:val="FirstParagraph"/>
       </w:pPr>
       <w:r>
-        <w:t xml:space="preserve">• The keyword matching process allows for assessment of other categories as well • Can interrogate a measure of context to the clauses (ie. Prohibitions vs exemptions). • Useful for looking up licencing sections</w:t>
+        <w:t xml:space="preserve">• The keyword matching process allows for assessment of other categories as well</w:t>
+      </w:r>
+    </w:p>
+    <w:p>
+      <w:pPr>
+        <w:pStyle w:val="BodyText"/>
+      </w:pPr>
+      <w:r>
+        <w:t xml:space="preserve">• Can interrogate a measure of context to the clauses (ie. Prohibitions vs exemptions).</w:t>
+      </w:r>
+    </w:p>
+    <w:p>
+      <w:pPr>
+        <w:pStyle w:val="BodyText"/>
+      </w:pPr>
+      <w:r>
+        <w:t xml:space="preserve">• Useful for looking up licencing sections</w:t>
       </w:r>
     </w:p>
     <w:p>
@@ -1086,7 +1539,47 @@
         <w:pStyle w:val="BodyText"/>
       </w:pPr>
       <w:r>
-        <w:t xml:space="preserve">Clause Type Categories: • Administration, Application, &amp; Structure • Authorization &amp; Mandate • Designation • Instruction • Interpretation &amp; Purpose • Licence, Permitting, &amp; Exemptions • Prohibition, Restriction, or Limitation</w:t>
+        <w:t xml:space="preserve">Clause Type Categories:</w:t>
+      </w:r>
+    </w:p>
+    <w:p>
+      <w:pPr>
+        <w:pStyle w:val="BodyText"/>
+      </w:pPr>
+      <w:r>
+        <w:t xml:space="preserve">• Administration, Application, &amp; Structure</w:t>
+      </w:r>
+    </w:p>
+    <w:p>
+      <w:pPr>
+        <w:pStyle w:val="BodyText"/>
+      </w:pPr>
+      <w:r>
+        <w:t xml:space="preserve">• Authorization &amp; Mandate • Designation • Instruction</w:t>
+      </w:r>
+    </w:p>
+    <w:p>
+      <w:pPr>
+        <w:pStyle w:val="BodyText"/>
+      </w:pPr>
+      <w:r>
+        <w:t xml:space="preserve">• Interpretation &amp; Purpose</w:t>
+      </w:r>
+    </w:p>
+    <w:p>
+      <w:pPr>
+        <w:pStyle w:val="BodyText"/>
+      </w:pPr>
+      <w:r>
+        <w:t xml:space="preserve">• Licence, Permitting, &amp; Exemptions</w:t>
+      </w:r>
+    </w:p>
+    <w:p>
+      <w:pPr>
+        <w:pStyle w:val="BodyText"/>
+      </w:pPr>
+      <w:r>
+        <w:t xml:space="preserve">• Prohibition, Restriction, or Limitation</w:t>
       </w:r>
     </w:p>
     <w:p>
@@ -1115,8 +1608,8 @@
         <w:t xml:space="preserve">(Appendix III) to clauses. The tally below shows the clause, section, and statute count for the clause type categories for clauses that were also matched to management domain categories.</w:t>
       </w:r>
     </w:p>
-    <w:bookmarkEnd w:id="29"/>
-    <w:bookmarkStart w:id="30" w:name="X3d1f28ebf57a42a02e6321b912ef3127a66a1d5"/>
+    <w:bookmarkEnd w:id="37"/>
+    <w:bookmarkStart w:id="38" w:name="X3d1f28ebf57a42a02e6321b912ef3127a66a1d5"/>
     <w:p>
       <w:pPr>
         <w:pStyle w:val="Heading1"/>
@@ -1174,7 +1667,10 @@
         <w:t xml:space="preserve"> </w:t>
       </w:r>
       <w:r>
-        <w:t xml:space="preserve">(Canada ed. 2005). Since CUs are the most current unit for managing salmon in British Columbia, we incorporated CUs in this effort.</w:t>
+        <w:t xml:space="preserve">(Canada 2005)</w:t>
+      </w:r>
+      <w:r>
+        <w:t xml:space="preserve">. Since CUs are the most current unit for managing salmon in British Columbia, we incorporated CUs in this effort.</w:t>
       </w:r>
     </w:p>
     <w:p>
@@ -1250,7 +1746,10 @@
         <w:t xml:space="preserve"> </w:t>
       </w:r>
       <w:r>
-        <w:t xml:space="preserve">(DFO 2020; DFO 2022). This threat was assigned to one sockeye and three Chinook conservation units, all in the Fraser Interior area related to the</w:t>
+        <w:t xml:space="preserve">(DFO 2020, 2022)</w:t>
+      </w:r>
+      <w:r>
+        <w:t xml:space="preserve">. This threat was assigned to one sockeye and three Chinook conservation units, all in the Fraser Interior area related to the</w:t>
       </w:r>
       <w:r>
         <w:t xml:space="preserve"> </w:t>
@@ -1268,7 +1767,39 @@
         <w:t xml:space="preserve"> </w:t>
       </w:r>
       <w:r>
-        <w:t xml:space="preserve">in 2018 (DFO 2020; DFO 2022): • Chinook: CK-10, MIDDLE FRASER RIVER_SP_1.3 • Chinook: CK-11, MIDDLE FRASER RIVER_SU_1.3 • Chinook: CK-12, UPPER FRASER RIVER_SP_1.3 • Sockeye: SEL-06-14, TAKLA/TREMBLEUR-EARLY STUART TIMING</w:t>
+        <w:t xml:space="preserve">in 2018 (DFO 2020; DFO 2022):</w:t>
+      </w:r>
+    </w:p>
+    <w:p>
+      <w:pPr>
+        <w:pStyle w:val="BodyText"/>
+      </w:pPr>
+      <w:r>
+        <w:t xml:space="preserve">• Chinook: CK-10, MIDDLE FRASER RIVER_SP_1.3</w:t>
+      </w:r>
+    </w:p>
+    <w:p>
+      <w:pPr>
+        <w:pStyle w:val="BodyText"/>
+      </w:pPr>
+      <w:r>
+        <w:t xml:space="preserve">• Chinook: CK-11, MIDDLE FRASER RIVER_SU_1.3</w:t>
+      </w:r>
+    </w:p>
+    <w:p>
+      <w:pPr>
+        <w:pStyle w:val="BodyText"/>
+      </w:pPr>
+      <w:r>
+        <w:t xml:space="preserve">• Chinook: CK-12, UPPER FRASER RIVER_SP_1.3</w:t>
+      </w:r>
+    </w:p>
+    <w:p>
+      <w:pPr>
+        <w:pStyle w:val="BodyText"/>
+      </w:pPr>
+      <w:r>
+        <w:t xml:space="preserve">• Sockeye: SEL-06-14, TAKLA/TREMBLEUR-EARLY STUART TIMING</w:t>
       </w:r>
     </w:p>
     <w:p>
@@ -1296,7 +1827,31 @@
         <w:pStyle w:val="BodyText"/>
       </w:pPr>
       <w:r>
-        <w:t xml:space="preserve">IUCN 7.2 Dams &amp; Water Management / Use • Bessette creek and irrigation/groundwater • The most relevant legislation and why • A summary of clause types</w:t>
+        <w:t xml:space="preserve">IUCN 7.2 Dams &amp; Water Management / Use</w:t>
+      </w:r>
+    </w:p>
+    <w:p>
+      <w:pPr>
+        <w:pStyle w:val="BodyText"/>
+      </w:pPr>
+      <w:r>
+        <w:t xml:space="preserve">• Bessette creek and irrigation/groundwater</w:t>
+      </w:r>
+    </w:p>
+    <w:p>
+      <w:pPr>
+        <w:pStyle w:val="BodyText"/>
+      </w:pPr>
+      <w:r>
+        <w:t xml:space="preserve">• The most relevant legislation and why</w:t>
+      </w:r>
+    </w:p>
+    <w:p>
+      <w:pPr>
+        <w:pStyle w:val="BodyText"/>
+      </w:pPr>
+      <w:r>
+        <w:t xml:space="preserve">• A summary of clause types</w:t>
       </w:r>
     </w:p>
     <w:p>
@@ -1340,19 +1895,41 @@
         <w:t xml:space="preserve"> </w:t>
       </w:r>
       <w:r>
-        <w:t xml:space="preserve">(DFO 2020). Water extraction, including groundwater, for irrigation and domestic purposes is listed as the most significant concern (DFO 2020). This threat was assigned to one Chinook conservation unit in the Fraser</w:t>
-      </w:r>
-    </w:p>
-    <w:p>
-      <w:pPr>
-        <w:pStyle w:val="BodyText"/>
-      </w:pPr>
-      <w:r>
-        <w:t xml:space="preserve">Interior area: • Chinook: CK-16, SOUTH THOMPSON-BESSETTE CREEK_SU_1.2</w:t>
-      </w:r>
-      <w:r>
-        <w:t xml:space="preserve"> </w:t>
-      </w:r>
+        <w:t xml:space="preserve">(DFO 2020)</w:t>
+      </w:r>
+      <w:r>
+        <w:t xml:space="preserve">. Water extraction, including groundwater, for irrigation and domestic purposes is listed as the most significant concern</w:t>
+      </w:r>
+      <w:r>
+        <w:t xml:space="preserve"> </w:t>
+      </w:r>
+      <w:r>
+        <w:t xml:space="preserve">(DFO 2020)</w:t>
+      </w:r>
+      <w:r>
+        <w:t xml:space="preserve">. This threat was assigned to one Chinook conservation unit in the Fraser</w:t>
+      </w:r>
+    </w:p>
+    <w:p>
+      <w:pPr>
+        <w:pStyle w:val="BodyText"/>
+      </w:pPr>
+      <w:r>
+        <w:t xml:space="preserve">Interior area:</w:t>
+      </w:r>
+    </w:p>
+    <w:p>
+      <w:pPr>
+        <w:pStyle w:val="BodyText"/>
+      </w:pPr>
+      <w:r>
+        <w:t xml:space="preserve">• Chinook: CK-16, SOUTH THOMPSON-BESSETTE CREEK_SU_1.2</w:t>
+      </w:r>
+    </w:p>
+    <w:p>
+      <w:pPr>
+        <w:pStyle w:val="BodyText"/>
+      </w:pPr>
       <w:r>
         <w:t xml:space="preserve">“</w:t>
       </w:r>
@@ -1377,8 +1954,8 @@
         <w:t xml:space="preserve">The clause type matches for Dams and Water Management / Use was much more evenly distributed (Figure 16) likely due to the large number of clause matches in total for that IUCN threat category. Interpretation &amp; Purpose matched the most clauses (includes Definition sections), while Administration, Application, &amp; Structure matched the fewest clauses followed by Prohibition, Restriction, or Limitation.</w:t>
       </w:r>
     </w:p>
-    <w:bookmarkEnd w:id="30"/>
-    <w:bookmarkStart w:id="31" w:name="co-occurrence-of-management-domains"/>
+    <w:bookmarkEnd w:id="38"/>
+    <w:bookmarkStart w:id="39" w:name="co-occurrence-of-management-domains"/>
     <w:p>
       <w:pPr>
         <w:pStyle w:val="Heading1"/>
@@ -1392,7 +1969,15 @@
         <w:pStyle w:val="FirstParagraph"/>
       </w:pPr>
       <w:r>
-        <w:t xml:space="preserve">• Multiple keywords are assigned to one clause. Example: pollution and aquaculture • Analyzing co-occurrence can create insights for related threats.</w:t>
+        <w:t xml:space="preserve">• Multiple keywords are assigned to one clause. Example: pollution and aquaculture</w:t>
+      </w:r>
+    </w:p>
+    <w:p>
+      <w:pPr>
+        <w:pStyle w:val="BodyText"/>
+      </w:pPr>
+      <w:r>
+        <w:t xml:space="preserve">• Analyzing co-occurrence can create insights for related threats.</w:t>
       </w:r>
     </w:p>
     <w:p>
@@ -1491,8 +2076,8 @@
         <w:t xml:space="preserve">Domain co-occurrence within sections allows for an interesting study of how management domains overlap (Figure 11). A frequent co-occurrence among management domains doesn’t necessarily represent a relationship in reality, simply the legal framing used to regulate these aspects. The Pollution management domain and Water Use and Watercourse Modifications are in the top four most matched to sections (Figure 4), and expectedly, these domains have the largest number of co-occurrences. Both domains relate generally to the impacts from anthropogenic industrialization and commercial development, which is reflected in the legal language.</w:t>
       </w:r>
     </w:p>
-    <w:bookmarkEnd w:id="31"/>
-    <w:bookmarkStart w:id="32" w:name="conclusions"/>
+    <w:bookmarkEnd w:id="39"/>
+    <w:bookmarkStart w:id="40" w:name="conclusions"/>
     <w:p>
       <w:pPr>
         <w:pStyle w:val="Heading1"/>
@@ -1506,7 +2091,23 @@
         <w:pStyle w:val="FirstParagraph"/>
       </w:pPr>
       <w:r>
-        <w:t xml:space="preserve">• The LAPSE framework can be a useful way for practitioners to query relevant legislation for salmon management topics. • Users can use keywords to search legislation already using CanLii, but using management domains and IUCN threats, we are able to link clauses to more specific salmon biological aspects • Not only does the process link legislation to specific salmon concerns, but this process is also linked to real-world salmon management through the WSP CU and RPA processes, which incorporates threat rankings by CU.</w:t>
+        <w:t xml:space="preserve">• The LAPSE framework can be a useful way for practitioners to query relevant legislation for salmon management topics.</w:t>
+      </w:r>
+    </w:p>
+    <w:p>
+      <w:pPr>
+        <w:pStyle w:val="BodyText"/>
+      </w:pPr>
+      <w:r>
+        <w:t xml:space="preserve">• Users can use keywords to search legislation already using CanLii, but using management domains and IUCN threats, we are able to link clauses to more specific salmon biological aspects</w:t>
+      </w:r>
+    </w:p>
+    <w:p>
+      <w:pPr>
+        <w:pStyle w:val="BodyText"/>
+      </w:pPr>
+      <w:r>
+        <w:t xml:space="preserve">• Not only does the process link legislation to specific salmon concerns, but this process is also linked to real-world salmon management through the WSP CU and RPA processes, which incorporates threat rankings by CU.</w:t>
       </w:r>
     </w:p>
     <w:p>
@@ -1522,7 +2123,31 @@
         <w:pStyle w:val="BodyText"/>
       </w:pPr>
       <w:r>
-        <w:t xml:space="preserve">The LAPSE tool provides a novel approach of linking legal language with salmon management categorization by developing management domain categories based on internationally recognized biodiversity threat categories (IUCN threats). The methods developed to identify and match salmon management keywords and keyphrases to clauses allow for multiple outputs and opportunities including: • An extensive list of legislation (acts, regulations, sections, and paragraphs) relevant to a human activity or salmon management decisions • Assessment of the nature or context of the legislation (clause type) by management domain and threat • Assessment of the overlap and connectedness in management domains (co-occurrence) to better understand the relationship between salmon threats</w:t>
+        <w:t xml:space="preserve">The LAPSE tool provides a novel approach of linking legal language with salmon management categorization by developing management domain categories based on internationally recognized biodiversity threat categories (IUCN threats). The methods developed to identify and match salmon management keywords and keyphrases to clauses allow for multiple outputs and opportunities including:</w:t>
+      </w:r>
+    </w:p>
+    <w:p>
+      <w:pPr>
+        <w:pStyle w:val="BodyText"/>
+      </w:pPr>
+      <w:r>
+        <w:t xml:space="preserve">• An extensive list of legislation (acts, regulations, sections, and paragraphs) relevant to a human activity or salmon management decisions</w:t>
+      </w:r>
+    </w:p>
+    <w:p>
+      <w:pPr>
+        <w:pStyle w:val="BodyText"/>
+      </w:pPr>
+      <w:r>
+        <w:t xml:space="preserve">• Assessment of the nature or context of the legislation (clause type) by management domain and threat</w:t>
+      </w:r>
+    </w:p>
+    <w:p>
+      <w:pPr>
+        <w:pStyle w:val="BodyText"/>
+      </w:pPr>
+      <w:r>
+        <w:t xml:space="preserve">• Assessment of the overlap and connectedness in management domains (co-occurrence) to better understand the relationship between salmon threats</w:t>
       </w:r>
     </w:p>
     <w:p>
@@ -1533,8 +2158,8 @@
         <w:t xml:space="preserve">While this process and tool are relatively new and untested, further development could lead to a better integration of salmon management decisions and administrative responsibility.</w:t>
       </w:r>
     </w:p>
-    <w:bookmarkEnd w:id="32"/>
-    <w:bookmarkStart w:id="36" w:name="references"/>
+    <w:bookmarkEnd w:id="40"/>
+    <w:bookmarkStart w:id="72" w:name="references"/>
     <w:p>
       <w:pPr>
         <w:pStyle w:val="Heading1"/>
@@ -1543,14 +2168,35 @@
         <w:t xml:space="preserve">References</w:t>
       </w:r>
     </w:p>
-    <w:bookmarkStart w:id="35" w:name="refs"/>
-    <w:bookmarkStart w:id="34" w:name="ref-ray2021"/>
+    <w:bookmarkStart w:id="71" w:name="refs"/>
+    <w:bookmarkStart w:id="42" w:name="ref-bankes2014"/>
     <w:p>
       <w:pPr>
         <w:pStyle w:val="Bibliography"/>
       </w:pPr>
       <w:r>
-        <w:t xml:space="preserve">Ray, J.C., Grimm, J., and Olive, A. 2021. The biodiversity crisis in</w:t>
+        <w:t xml:space="preserve">Bankes, N., Mascher, S., and Olszynski, M. 2014. Can</w:t>
+      </w:r>
+      <w:r>
+        <w:t xml:space="preserve"> </w:t>
+      </w:r>
+      <w:r>
+        <w:t xml:space="preserve">Environmental Laws Fulfill Their Promise</w:t>
+      </w:r>
+      <w:r>
+        <w:t xml:space="preserve">?</w:t>
+      </w:r>
+      <w:r>
+        <w:t xml:space="preserve"> </w:t>
+      </w:r>
+      <w:r>
+        <w:t xml:space="preserve">Stories</w:t>
+      </w:r>
+      <w:r>
+        <w:t xml:space="preserve"> </w:t>
+      </w:r>
+      <w:r>
+        <w:t xml:space="preserve">from</w:t>
       </w:r>
       <w:r>
         <w:t xml:space="preserve"> </w:t>
@@ -1559,19 +2205,7 @@
         <w:t xml:space="preserve">Canada</w:t>
       </w:r>
       <w:r>
-        <w:t xml:space="preserve">:</w:t>
-      </w:r>
-      <w:r>
-        <w:t xml:space="preserve"> </w:t>
-      </w:r>
-      <w:r>
-        <w:t xml:space="preserve">Failures</w:t>
-      </w:r>
-      <w:r>
-        <w:t xml:space="preserve"> </w:t>
-      </w:r>
-      <w:r>
-        <w:t xml:space="preserve">and challenges of federal and sub-national strategic and legal frameworks. FACETS</w:t>
+        <w:t xml:space="preserve">. Sustainability</w:t>
       </w:r>
       <w:r>
         <w:t xml:space="preserve"> </w:t>
@@ -1584,9 +2218,796 @@
         <w:t xml:space="preserve">6</w:t>
       </w:r>
       <w:r>
+        <w:t xml:space="preserve">(9): 6024–6048. doi:</w:t>
+      </w:r>
+      <w:hyperlink r:id="rId41">
+        <w:r>
+          <w:rPr>
+            <w:rStyle w:val="Hyperlink"/>
+          </w:rPr>
+          <w:t xml:space="preserve">10.3390/su6096024</w:t>
+        </w:r>
+      </w:hyperlink>
+      <w:r>
+        <w:t xml:space="preserve">.</w:t>
+      </w:r>
+    </w:p>
+    <w:bookmarkEnd w:id="42"/>
+    <w:bookmarkStart w:id="43" w:name="ref-becklumb2013"/>
+    <w:p>
+      <w:pPr>
+        <w:pStyle w:val="Bibliography"/>
+      </w:pPr>
+      <w:r>
+        <w:t xml:space="preserve">Becklumb, P. 2013. Federal and</w:t>
+      </w:r>
+      <w:r>
+        <w:t xml:space="preserve"> </w:t>
+      </w:r>
+      <w:r>
+        <w:t xml:space="preserve">Provincial Jurisdiction</w:t>
+      </w:r>
+      <w:r>
+        <w:t xml:space="preserve"> </w:t>
+      </w:r>
+      <w:r>
+        <w:t xml:space="preserve">to</w:t>
+      </w:r>
+      <w:r>
+        <w:t xml:space="preserve"> </w:t>
+      </w:r>
+      <w:r>
+        <w:t xml:space="preserve">Regulate Environmental Issues</w:t>
+      </w:r>
+      <w:r>
+        <w:t xml:space="preserve">.</w:t>
+      </w:r>
+    </w:p>
+    <w:bookmarkEnd w:id="43"/>
+    <w:bookmarkStart w:id="45" w:name="ref-bisson2009"/>
+    <w:p>
+      <w:pPr>
+        <w:pStyle w:val="Bibliography"/>
+      </w:pPr>
+      <w:r>
+        <w:t xml:space="preserve">Bisson, P.A., Dunham, J.B., and Reeves, G.H. 2009. Freshwater</w:t>
+      </w:r>
+      <w:r>
+        <w:t xml:space="preserve"> </w:t>
+      </w:r>
+      <w:r>
+        <w:t xml:space="preserve">Ecosystems</w:t>
+      </w:r>
+      <w:r>
+        <w:t xml:space="preserve"> </w:t>
+      </w:r>
+      <w:r>
+        <w:t xml:space="preserve">and</w:t>
+      </w:r>
+      <w:r>
+        <w:t xml:space="preserve"> </w:t>
+      </w:r>
+      <w:r>
+        <w:t xml:space="preserve">Resilience</w:t>
+      </w:r>
+      <w:r>
+        <w:t xml:space="preserve"> </w:t>
+      </w:r>
+      <w:r>
+        <w:t xml:space="preserve">of</w:t>
+      </w:r>
+      <w:r>
+        <w:t xml:space="preserve"> </w:t>
+      </w:r>
+      <w:r>
+        <w:t xml:space="preserve">Pacific Salmon</w:t>
+      </w:r>
+      <w:r>
+        <w:t xml:space="preserve">:</w:t>
+      </w:r>
+      <w:r>
+        <w:t xml:space="preserve"> </w:t>
+      </w:r>
+      <w:r>
+        <w:t xml:space="preserve">Habitat Management Based</w:t>
+      </w:r>
+      <w:r>
+        <w:t xml:space="preserve"> </w:t>
+      </w:r>
+      <w:r>
+        <w:t xml:space="preserve">on</w:t>
+      </w:r>
+      <w:r>
+        <w:t xml:space="preserve"> </w:t>
+      </w:r>
+      <w:r>
+        <w:t xml:space="preserve">Natural Variability</w:t>
+      </w:r>
+      <w:r>
+        <w:t xml:space="preserve">. E&amp;S</w:t>
+      </w:r>
+      <w:r>
+        <w:t xml:space="preserve"> </w:t>
+      </w:r>
+      <w:r>
+        <w:rPr>
+          <w:b/>
+          <w:bCs/>
+        </w:rPr>
+        <w:t xml:space="preserve">14</w:t>
+      </w:r>
+      <w:r>
+        <w:t xml:space="preserve">(1): art45. doi:</w:t>
+      </w:r>
+      <w:hyperlink r:id="rId44">
+        <w:r>
+          <w:rPr>
+            <w:rStyle w:val="Hyperlink"/>
+          </w:rPr>
+          <w:t xml:space="preserve">10.5751/ES-02784-140145</w:t>
+        </w:r>
+      </w:hyperlink>
+      <w:r>
+        <w:t xml:space="preserve">.</w:t>
+      </w:r>
+    </w:p>
+    <w:bookmarkEnd w:id="45"/>
+    <w:bookmarkStart w:id="47" w:name="ref-bogetti2025"/>
+    <w:p>
+      <w:pPr>
+        <w:pStyle w:val="Bibliography"/>
+      </w:pPr>
+      <w:r>
+        <w:t xml:space="preserve">Bogetti, J.M., and Mason, C.W. 2025. To protect or forget?</w:t>
+      </w:r>
+      <w:r>
+        <w:t xml:space="preserve"> </w:t>
+      </w:r>
+      <w:r>
+        <w:t xml:space="preserve">Comparing</w:t>
+      </w:r>
+      <w:r>
+        <w:t xml:space="preserve"> </w:t>
+      </w:r>
+      <w:r>
+        <w:t xml:space="preserve">species at risk legislation across</w:t>
+      </w:r>
+      <w:r>
+        <w:t xml:space="preserve"> </w:t>
+      </w:r>
+      <w:r>
+        <w:t xml:space="preserve">Canada</w:t>
+      </w:r>
+      <w:r>
+        <w:t xml:space="preserve">’s common-law provinces. FACETS</w:t>
+      </w:r>
+      <w:r>
+        <w:t xml:space="preserve"> </w:t>
+      </w:r>
+      <w:r>
+        <w:rPr>
+          <w:b/>
+          <w:bCs/>
+        </w:rPr>
+        <w:t xml:space="preserve">10</w:t>
+      </w:r>
+      <w:r>
+        <w:t xml:space="preserve">: 1–11. doi:</w:t>
+      </w:r>
+      <w:hyperlink r:id="rId46">
+        <w:r>
+          <w:rPr>
+            <w:rStyle w:val="Hyperlink"/>
+          </w:rPr>
+          <w:t xml:space="preserve">10.1139/facets-2025-0031</w:t>
+        </w:r>
+      </w:hyperlink>
+      <w:r>
+        <w:t xml:space="preserve">.</w:t>
+      </w:r>
+    </w:p>
+    <w:bookmarkEnd w:id="47"/>
+    <w:bookmarkStart w:id="49" w:name="ref-campbell2002"/>
+    <w:p>
+      <w:pPr>
+        <w:pStyle w:val="Bibliography"/>
+      </w:pPr>
+      <w:r>
+        <w:t xml:space="preserve">Campbell, M.L., and Thomas, V.G. 2002. Constitutional</w:t>
+      </w:r>
+      <w:r>
+        <w:t xml:space="preserve"> </w:t>
+      </w:r>
+      <w:r>
+        <w:t xml:space="preserve">Impacts</w:t>
+      </w:r>
+      <w:r>
+        <w:t xml:space="preserve"> </w:t>
+      </w:r>
+      <w:r>
+        <w:t xml:space="preserve">on</w:t>
+      </w:r>
+      <w:r>
+        <w:t xml:space="preserve"> </w:t>
+      </w:r>
+      <w:r>
+        <w:t xml:space="preserve">Conservation</w:t>
+      </w:r>
+      <w:r>
+        <w:t xml:space="preserve">:</w:t>
+      </w:r>
+      <w:r>
+        <w:t xml:space="preserve"> </w:t>
+      </w:r>
+      <w:r>
+        <w:t xml:space="preserve">Effects</w:t>
+      </w:r>
+      <w:r>
+        <w:t xml:space="preserve"> </w:t>
+      </w:r>
+      <w:r>
+        <w:t xml:space="preserve">of</w:t>
+      </w:r>
+      <w:r>
+        <w:t xml:space="preserve"> </w:t>
+      </w:r>
+      <w:r>
+        <w:t xml:space="preserve">Federalism</w:t>
+      </w:r>
+      <w:r>
+        <w:t xml:space="preserve"> </w:t>
+      </w:r>
+      <w:r>
+        <w:t xml:space="preserve">on</w:t>
+      </w:r>
+      <w:r>
+        <w:t xml:space="preserve"> </w:t>
+      </w:r>
+      <w:r>
+        <w:t xml:space="preserve">Biodiversity Protection</w:t>
+      </w:r>
+      <w:r>
+        <w:t xml:space="preserve">. Environmental Policy and Law</w:t>
+      </w:r>
+      <w:r>
+        <w:t xml:space="preserve"> </w:t>
+      </w:r>
+      <w:r>
+        <w:rPr>
+          <w:b/>
+          <w:bCs/>
+        </w:rPr>
+        <w:t xml:space="preserve">32</w:t>
+      </w:r>
+      <w:r>
+        <w:t xml:space="preserve">(5): 223–232. doi:</w:t>
+      </w:r>
+      <w:hyperlink r:id="rId48">
+        <w:r>
+          <w:rPr>
+            <w:rStyle w:val="Hyperlink"/>
+          </w:rPr>
+          <w:t xml:space="preserve">10.3233/EPL-2002-32_5_13</w:t>
+        </w:r>
+      </w:hyperlink>
+      <w:r>
+        <w:t xml:space="preserve">.</w:t>
+      </w:r>
+    </w:p>
+    <w:bookmarkEnd w:id="49"/>
+    <w:bookmarkStart w:id="50" w:name="ref-canada2005"/>
+    <w:p>
+      <w:pPr>
+        <w:pStyle w:val="Bibliography"/>
+      </w:pPr>
+      <w:r>
+        <w:t xml:space="preserve">Canada (</w:t>
+      </w:r>
+      <w:r>
+        <w:rPr>
+          <w:i/>
+          <w:iCs/>
+        </w:rPr>
+        <w:t xml:space="preserve">Editor</w:t>
+      </w:r>
+      <w:r>
+        <w:t xml:space="preserve">). 2005. Canada’s policy for conservation of wild pacific salmon.</w:t>
+      </w:r>
+      <w:r>
+        <w:t xml:space="preserve"> </w:t>
+      </w:r>
+      <w:r>
+        <w:t xml:space="preserve">Department of Fisheries and Oceans</w:t>
+      </w:r>
+      <w:r>
+        <w:t xml:space="preserve">, Vancouver, BC.</w:t>
+      </w:r>
+    </w:p>
+    <w:bookmarkEnd w:id="50"/>
+    <w:bookmarkStart w:id="51" w:name="ref-carlson2022"/>
+    <w:p>
+      <w:pPr>
+        <w:pStyle w:val="Bibliography"/>
+      </w:pPr>
+      <w:r>
+        <w:t xml:space="preserve">Carlson, D., and Baylis, V. 2022. How</w:t>
+      </w:r>
+      <w:r>
+        <w:t xml:space="preserve"> </w:t>
+      </w:r>
+      <w:r>
+        <w:t xml:space="preserve">Crown</w:t>
+      </w:r>
+      <w:r>
+        <w:t xml:space="preserve"> </w:t>
+      </w:r>
+      <w:r>
+        <w:t xml:space="preserve">laws and policy normalize cumulative harm to salmon watersheds in</w:t>
+      </w:r>
+      <w:r>
+        <w:t xml:space="preserve"> </w:t>
+      </w:r>
+      <w:r>
+        <w:t xml:space="preserve">British Columbia</w:t>
+      </w:r>
+      <w:r>
+        <w:t xml:space="preserve">:</w:t>
+      </w:r>
+    </w:p>
+    <w:bookmarkEnd w:id="51"/>
+    <w:bookmarkStart w:id="52" w:name="ref-collins2019"/>
+    <w:p>
+      <w:pPr>
+        <w:pStyle w:val="Bibliography"/>
+      </w:pPr>
+      <w:r>
+        <w:t xml:space="preserve">Collins, L., and Sossin, L. 2019. Approach to</w:t>
+      </w:r>
+      <w:r>
+        <w:t xml:space="preserve"> </w:t>
+      </w:r>
+      <w:r>
+        <w:t xml:space="preserve">Constitutional Principles</w:t>
+      </w:r>
+      <w:r>
+        <w:t xml:space="preserve"> </w:t>
+      </w:r>
+      <w:r>
+        <w:t xml:space="preserve">and</w:t>
+      </w:r>
+      <w:r>
+        <w:t xml:space="preserve"> </w:t>
+      </w:r>
+      <w:r>
+        <w:t xml:space="preserve">Environmental Discretion</w:t>
+      </w:r>
+      <w:r>
+        <w:t xml:space="preserve"> </w:t>
+      </w:r>
+      <w:r>
+        <w:t xml:space="preserve">in</w:t>
+      </w:r>
+      <w:r>
+        <w:t xml:space="preserve"> </w:t>
+      </w:r>
+      <w:r>
+        <w:t xml:space="preserve">Canada</w:t>
+      </w:r>
+      <w:r>
+        <w:t xml:space="preserve">.</w:t>
+      </w:r>
+      <w:r>
+        <w:t xml:space="preserve"> </w:t>
+      </w:r>
+      <w:r>
+        <w:rPr>
+          <w:b/>
+          <w:bCs/>
+        </w:rPr>
+        <w:t xml:space="preserve">52</w:t>
+      </w:r>
+      <w:r>
+        <w:t xml:space="preserve">.</w:t>
+      </w:r>
+    </w:p>
+    <w:bookmarkEnd w:id="52"/>
+    <w:bookmarkStart w:id="54" w:name="ref-dallimer2015"/>
+    <w:p>
+      <w:pPr>
+        <w:pStyle w:val="Bibliography"/>
+      </w:pPr>
+      <w:r>
+        <w:t xml:space="preserve">Dallimer, M., and Strange, N. 2015. Why socio-political borders and boundaries matter in conservation. Trends in Ecology &amp; Evolution</w:t>
+      </w:r>
+      <w:r>
+        <w:t xml:space="preserve"> </w:t>
+      </w:r>
+      <w:r>
+        <w:rPr>
+          <w:b/>
+          <w:bCs/>
+        </w:rPr>
+        <w:t xml:space="preserve">30</w:t>
+      </w:r>
+      <w:r>
+        <w:t xml:space="preserve">(3): 132–139. doi:</w:t>
+      </w:r>
+      <w:hyperlink r:id="rId53">
+        <w:r>
+          <w:rPr>
+            <w:rStyle w:val="Hyperlink"/>
+          </w:rPr>
+          <w:t xml:space="preserve">10.1016/j.tree.2014.12.004</w:t>
+        </w:r>
+      </w:hyperlink>
+      <w:r>
+        <w:t xml:space="preserve">.</w:t>
+      </w:r>
+    </w:p>
+    <w:bookmarkEnd w:id="54"/>
+    <w:bookmarkStart w:id="55" w:name="ref-dfo2020"/>
+    <w:p>
+      <w:pPr>
+        <w:pStyle w:val="Bibliography"/>
+      </w:pPr>
+      <w:r>
+        <w:t xml:space="preserve">DFO. 2020.</w:t>
+      </w:r>
+      <w:r>
+        <w:t xml:space="preserve"> </w:t>
+      </w:r>
+      <w:r>
+        <w:t xml:space="preserve">RECOVERY POTENTIAL ASSESSMENT FOR</w:t>
+      </w:r>
+      <w:r>
+        <w:t xml:space="preserve"> </w:t>
+      </w:r>
+      <w:r>
+        <w:t xml:space="preserve">11</w:t>
+      </w:r>
+      <w:r>
+        <w:t xml:space="preserve"> </w:t>
+      </w:r>
+      <w:r>
+        <w:t xml:space="preserve">DESIGNATABLE UNITS OF FRASER RIVER CHINOOK SALMON</w:t>
+      </w:r>
+      <w:r>
+        <w:t xml:space="preserve">,</w:t>
+      </w:r>
+      <w:r>
+        <w:t xml:space="preserve"> </w:t>
+      </w:r>
+      <w:r>
+        <w:t xml:space="preserve">ONCORHYNCHUSTSHAWYTCHA</w:t>
+      </w:r>
+      <w:r>
+        <w:t xml:space="preserve">,</w:t>
+      </w:r>
+      <w:r>
+        <w:t xml:space="preserve"> </w:t>
+      </w:r>
+      <w:r>
+        <w:t xml:space="preserve">PART</w:t>
+      </w:r>
+      <w:r>
+        <w:t xml:space="preserve"> </w:t>
+      </w:r>
+      <w:r>
+        <w:t xml:space="preserve">1:</w:t>
+      </w:r>
+      <w:r>
+        <w:t xml:space="preserve"> </w:t>
+      </w:r>
+      <w:r>
+        <w:t xml:space="preserve">ELEMENTS</w:t>
+      </w:r>
+      <w:r>
+        <w:t xml:space="preserve"> </w:t>
+      </w:r>
+      <w:r>
+        <w:t xml:space="preserve">1</w:t>
+      </w:r>
+      <w:r>
+        <w:t xml:space="preserve"> </w:t>
+      </w:r>
+      <w:r>
+        <w:t xml:space="preserve">TO</w:t>
+      </w:r>
+      <w:r>
+        <w:t xml:space="preserve"> </w:t>
+      </w:r>
+      <w:r>
+        <w:t xml:space="preserve">11.</w:t>
+      </w:r>
+    </w:p>
+    <w:bookmarkEnd w:id="55"/>
+    <w:bookmarkStart w:id="56" w:name="ref-dfo2022"/>
+    <w:p>
+      <w:pPr>
+        <w:pStyle w:val="Bibliography"/>
+      </w:pPr>
+      <w:r>
+        <w:t xml:space="preserve">DFO. 2022. Recovery</w:t>
+      </w:r>
+      <w:r>
+        <w:t xml:space="preserve"> </w:t>
+      </w:r>
+      <w:r>
+        <w:t xml:space="preserve">Potential Assessment</w:t>
+      </w:r>
+      <w:r>
+        <w:t xml:space="preserve"> </w:t>
+      </w:r>
+      <w:r>
+        <w:t xml:space="preserve">for</w:t>
+      </w:r>
+      <w:r>
+        <w:t xml:space="preserve"> </w:t>
+      </w:r>
+      <w:r>
+        <w:t xml:space="preserve">Fraser River Sockeye Salmon</w:t>
+      </w:r>
+      <w:r>
+        <w:t xml:space="preserve"> </w:t>
+      </w:r>
+      <w:r>
+        <w:t xml:space="preserve">(</w:t>
+      </w:r>
+      <w:r>
+        <w:t xml:space="preserve">Oncorhynchus</w:t>
+      </w:r>
+      <w:r>
+        <w:t xml:space="preserve"> </w:t>
+      </w:r>
+      <w:r>
+        <w:t xml:space="preserve">nerka) –</w:t>
+      </w:r>
+      <w:r>
+        <w:t xml:space="preserve"> </w:t>
+      </w:r>
+      <w:r>
+        <w:t xml:space="preserve">Nine Designatable Units</w:t>
+      </w:r>
+      <w:r>
+        <w:t xml:space="preserve"> </w:t>
+      </w:r>
+      <w:r>
+        <w:t xml:space="preserve">–</w:t>
+      </w:r>
+      <w:r>
+        <w:t xml:space="preserve"> </w:t>
+      </w:r>
+      <w:r>
+        <w:t xml:space="preserve">Part</w:t>
+      </w:r>
+      <w:r>
+        <w:t xml:space="preserve"> </w:t>
+      </w:r>
+      <w:r>
+        <w:t xml:space="preserve">2:</w:t>
+      </w:r>
+      <w:r>
+        <w:t xml:space="preserve"> </w:t>
+      </w:r>
+      <w:r>
+        <w:t xml:space="preserve">Habitat</w:t>
+      </w:r>
+      <w:r>
+        <w:t xml:space="preserve">,</w:t>
+      </w:r>
+      <w:r>
+        <w:t xml:space="preserve"> </w:t>
+      </w:r>
+      <w:r>
+        <w:t xml:space="preserve">Threats Assessment</w:t>
+      </w:r>
+      <w:r>
+        <w:t xml:space="preserve">,</w:t>
+      </w:r>
+      <w:r>
+        <w:t xml:space="preserve"> </w:t>
+      </w:r>
+      <w:r>
+        <w:t xml:space="preserve">Mitigation</w:t>
+      </w:r>
+      <w:r>
+        <w:t xml:space="preserve">,</w:t>
+      </w:r>
+      <w:r>
+        <w:t xml:space="preserve"> </w:t>
+      </w:r>
+      <w:r>
+        <w:t xml:space="preserve">And Allowable Harm</w:t>
+      </w:r>
+      <w:r>
+        <w:t xml:space="preserve">.</w:t>
+      </w:r>
+    </w:p>
+    <w:bookmarkEnd w:id="56"/>
+    <w:bookmarkStart w:id="57" w:name="ref-dionne2023"/>
+    <w:p>
+      <w:pPr>
+        <w:pStyle w:val="Bibliography"/>
+      </w:pPr>
+      <w:r>
+        <w:t xml:space="preserve">Dionne, K. 2023. Recovery potential assessment for southern</w:t>
+      </w:r>
+      <w:r>
+        <w:t xml:space="preserve"> </w:t>
+      </w:r>
+      <w:r>
+        <w:t xml:space="preserve">British Columbian</w:t>
+      </w:r>
+      <w:r>
+        <w:t xml:space="preserve"> </w:t>
+      </w:r>
+      <w:r>
+        <w:t xml:space="preserve">chinook populations,</w:t>
+      </w:r>
+      <w:r>
+        <w:t xml:space="preserve"> </w:t>
+      </w:r>
+      <w:r>
+        <w:t xml:space="preserve">Fraser</w:t>
+      </w:r>
+      <w:r>
+        <w:t xml:space="preserve"> </w:t>
+      </w:r>
+      <w:r>
+        <w:t xml:space="preserve">and southern mainland chinook designatable units (1, 6, 13 and 15). Canadian Science Advisory Secretariat (CSAS), Ottawa ON.</w:t>
+      </w:r>
+    </w:p>
+    <w:bookmarkEnd w:id="57"/>
+    <w:bookmarkStart w:id="59" w:name="ref-kraus2021"/>
+    <w:p>
+      <w:pPr>
+        <w:pStyle w:val="Bibliography"/>
+      </w:pPr>
+      <w:r>
+        <w:t xml:space="preserve">Kraus, D., Murphy, S., and Armitage, D. 2021. Ten bridges on the road to recovering</w:t>
+      </w:r>
+      <w:r>
+        <w:t xml:space="preserve"> </w:t>
+      </w:r>
+      <w:r>
+        <w:t xml:space="preserve">Canada</w:t>
+      </w:r>
+      <w:r>
+        <w:t xml:space="preserve">’s endangered species. FACETS</w:t>
+      </w:r>
+      <w:r>
+        <w:t xml:space="preserve"> </w:t>
+      </w:r>
+      <w:r>
+        <w:rPr>
+          <w:b/>
+          <w:bCs/>
+        </w:rPr>
+        <w:t xml:space="preserve">6</w:t>
+      </w:r>
+      <w:r>
+        <w:t xml:space="preserve">: 1088–1127. doi:</w:t>
+      </w:r>
+      <w:hyperlink r:id="rId58">
+        <w:r>
+          <w:rPr>
+            <w:rStyle w:val="Hyperlink"/>
+          </w:rPr>
+          <w:t xml:space="preserve">10.1139/facets-2020-0084</w:t>
+        </w:r>
+      </w:hyperlink>
+      <w:r>
+        <w:t xml:space="preserve">.</w:t>
+      </w:r>
+    </w:p>
+    <w:bookmarkEnd w:id="59"/>
+    <w:bookmarkStart w:id="61" w:name="ref-price2017"/>
+    <w:p>
+      <w:pPr>
+        <w:pStyle w:val="Bibliography"/>
+      </w:pPr>
+      <w:r>
+        <w:t xml:space="preserve">Price, M.H.H., English, K.K., Rosenberger, A.G., MacDuffee, M., and Reynolds, J.D. 2017. Canada’s</w:t>
+      </w:r>
+      <w:r>
+        <w:t xml:space="preserve"> </w:t>
+      </w:r>
+      <w:r>
+        <w:t xml:space="preserve">Wild Salmon Policy</w:t>
+      </w:r>
+      <w:r>
+        <w:t xml:space="preserve">:</w:t>
+      </w:r>
+      <w:r>
+        <w:t xml:space="preserve"> </w:t>
+      </w:r>
+      <w:r>
+        <w:t xml:space="preserve">An</w:t>
+      </w:r>
+      <w:r>
+        <w:t xml:space="preserve"> </w:t>
+      </w:r>
+      <w:r>
+        <w:t xml:space="preserve">assessment of conservation progress in</w:t>
+      </w:r>
+      <w:r>
+        <w:t xml:space="preserve"> </w:t>
+      </w:r>
+      <w:r>
+        <w:t xml:space="preserve">British Columbia</w:t>
+      </w:r>
+      <w:r>
+        <w:t xml:space="preserve">. Can. J. Fish. Aquat. Sci.</w:t>
+      </w:r>
+      <w:r>
+        <w:t xml:space="preserve"> </w:t>
+      </w:r>
+      <w:r>
+        <w:rPr>
+          <w:b/>
+          <w:bCs/>
+        </w:rPr>
+        <w:t xml:space="preserve">74</w:t>
+      </w:r>
+      <w:r>
+        <w:t xml:space="preserve">(10): 1507–1518. doi:</w:t>
+      </w:r>
+      <w:hyperlink r:id="rId60">
+        <w:r>
+          <w:rPr>
+            <w:rStyle w:val="Hyperlink"/>
+          </w:rPr>
+          <w:t xml:space="preserve">10.1139/cjfas-2017-0127</w:t>
+        </w:r>
+      </w:hyperlink>
+      <w:r>
+        <w:t xml:space="preserve">.</w:t>
+      </w:r>
+    </w:p>
+    <w:bookmarkEnd w:id="61"/>
+    <w:bookmarkStart w:id="63" w:name="ref-ray2021"/>
+    <w:p>
+      <w:pPr>
+        <w:pStyle w:val="Bibliography"/>
+      </w:pPr>
+      <w:r>
+        <w:t xml:space="preserve">Ray, J.C., Grimm, J., and Olive, A. 2021. The biodiversity crisis in</w:t>
+      </w:r>
+      <w:r>
+        <w:t xml:space="preserve"> </w:t>
+      </w:r>
+      <w:r>
+        <w:t xml:space="preserve">Canada</w:t>
+      </w:r>
+      <w:r>
+        <w:t xml:space="preserve">:</w:t>
+      </w:r>
+      <w:r>
+        <w:t xml:space="preserve"> </w:t>
+      </w:r>
+      <w:r>
+        <w:t xml:space="preserve">Failures</w:t>
+      </w:r>
+      <w:r>
+        <w:t xml:space="preserve"> </w:t>
+      </w:r>
+      <w:r>
+        <w:t xml:space="preserve">and challenges of federal and sub-national strategic and legal frameworks. FACETS</w:t>
+      </w:r>
+      <w:r>
+        <w:t xml:space="preserve"> </w:t>
+      </w:r>
+      <w:r>
+        <w:rPr>
+          <w:b/>
+          <w:bCs/>
+        </w:rPr>
+        <w:t xml:space="preserve">6</w:t>
+      </w:r>
+      <w:r>
         <w:t xml:space="preserve">: 1044–1068. doi:</w:t>
       </w:r>
-      <w:hyperlink r:id="rId33">
+      <w:hyperlink r:id="rId62">
         <w:r>
           <w:rPr>
             <w:rStyle w:val="Hyperlink"/>
@@ -1598,10 +3019,268 @@
         <w:t xml:space="preserve">.</w:t>
       </w:r>
     </w:p>
-    <w:bookmarkEnd w:id="34"/>
-    <w:bookmarkEnd w:id="35"/>
-    <w:bookmarkEnd w:id="36"/>
-    <w:bookmarkStart w:id="37" w:name="supplementary-material"/>
+    <w:bookmarkEnd w:id="63"/>
+    <w:bookmarkStart w:id="65" w:name="ref-salafsky2008"/>
+    <w:p>
+      <w:pPr>
+        <w:pStyle w:val="Bibliography"/>
+      </w:pPr>
+      <w:r>
+        <w:t xml:space="preserve">Salafsky, N., Salzer, D., Stattersfield, A.J., Hilton‐Taylor, C., Neugarten, R., Butchart, S.H.M., Collen, B., Cox, N., Master, L.L., O’Connor, S., and Wilkie, D. 2008. A</w:t>
+      </w:r>
+      <w:r>
+        <w:t xml:space="preserve"> </w:t>
+      </w:r>
+      <w:r>
+        <w:t xml:space="preserve">Standard Lexicon</w:t>
+      </w:r>
+      <w:r>
+        <w:t xml:space="preserve"> </w:t>
+      </w:r>
+      <w:r>
+        <w:t xml:space="preserve">for</w:t>
+      </w:r>
+      <w:r>
+        <w:t xml:space="preserve"> </w:t>
+      </w:r>
+      <w:r>
+        <w:t xml:space="preserve">Biodiversity Conservation</w:t>
+      </w:r>
+      <w:r>
+        <w:t xml:space="preserve">:</w:t>
+      </w:r>
+      <w:r>
+        <w:t xml:space="preserve"> </w:t>
+      </w:r>
+      <w:r>
+        <w:t xml:space="preserve">Unified Classifications</w:t>
+      </w:r>
+      <w:r>
+        <w:t xml:space="preserve"> </w:t>
+      </w:r>
+      <w:r>
+        <w:t xml:space="preserve">of</w:t>
+      </w:r>
+      <w:r>
+        <w:t xml:space="preserve"> </w:t>
+      </w:r>
+      <w:r>
+        <w:t xml:space="preserve">Threats</w:t>
+      </w:r>
+      <w:r>
+        <w:t xml:space="preserve"> </w:t>
+      </w:r>
+      <w:r>
+        <w:t xml:space="preserve">and</w:t>
+      </w:r>
+      <w:r>
+        <w:t xml:space="preserve"> </w:t>
+      </w:r>
+      <w:r>
+        <w:t xml:space="preserve">Actions</w:t>
+      </w:r>
+      <w:r>
+        <w:t xml:space="preserve">. Conservation Biology</w:t>
+      </w:r>
+      <w:r>
+        <w:t xml:space="preserve"> </w:t>
+      </w:r>
+      <w:r>
+        <w:rPr>
+          <w:b/>
+          <w:bCs/>
+        </w:rPr>
+        <w:t xml:space="preserve">22</w:t>
+      </w:r>
+      <w:r>
+        <w:t xml:space="preserve">(4): 897–911. doi:</w:t>
+      </w:r>
+      <w:hyperlink r:id="rId64">
+        <w:r>
+          <w:rPr>
+            <w:rStyle w:val="Hyperlink"/>
+          </w:rPr>
+          <w:t xml:space="preserve">10.1111/j.1523-1739.2008.00937.x</w:t>
+        </w:r>
+      </w:hyperlink>
+      <w:r>
+        <w:t xml:space="preserve">.</w:t>
+      </w:r>
+    </w:p>
+    <w:bookmarkEnd w:id="65"/>
+    <w:bookmarkStart w:id="67" w:name="ref-swerdfager2023"/>
+    <w:p>
+      <w:pPr>
+        <w:pStyle w:val="Bibliography"/>
+      </w:pPr>
+      <w:r>
+        <w:t xml:space="preserve">Swerdfager, T., and Olive, A. 2023. Laws matter: A foundational approach to biodiversity conservation in</w:t>
+      </w:r>
+      <w:r>
+        <w:t xml:space="preserve"> </w:t>
+      </w:r>
+      <w:r>
+        <w:t xml:space="preserve">Canada</w:t>
+      </w:r>
+      <w:r>
+        <w:t xml:space="preserve">. FACETS</w:t>
+      </w:r>
+      <w:r>
+        <w:t xml:space="preserve"> </w:t>
+      </w:r>
+      <w:r>
+        <w:rPr>
+          <w:b/>
+          <w:bCs/>
+        </w:rPr>
+        <w:t xml:space="preserve">8</w:t>
+      </w:r>
+      <w:r>
+        <w:t xml:space="preserve">: 1–13. doi:</w:t>
+      </w:r>
+      <w:hyperlink r:id="rId66">
+        <w:r>
+          <w:rPr>
+            <w:rStyle w:val="Hyperlink"/>
+          </w:rPr>
+          <w:t xml:space="preserve">10.1139/facets-2022-0095</w:t>
+        </w:r>
+      </w:hyperlink>
+      <w:r>
+        <w:t xml:space="preserve">.</w:t>
+      </w:r>
+    </w:p>
+    <w:bookmarkEnd w:id="67"/>
+    <w:bookmarkStart w:id="68" w:name="ref-thompson1974"/>
+    <w:p>
+      <w:pPr>
+        <w:pStyle w:val="Bibliography"/>
+      </w:pPr>
+      <w:r>
+        <w:t xml:space="preserve">Thompson, P.C. 1974. Institutional</w:t>
+      </w:r>
+      <w:r>
+        <w:t xml:space="preserve"> </w:t>
+      </w:r>
+      <w:r>
+        <w:t xml:space="preserve">Constraints</w:t>
+      </w:r>
+      <w:r>
+        <w:t xml:space="preserve"> </w:t>
+      </w:r>
+      <w:r>
+        <w:t xml:space="preserve">in</w:t>
+      </w:r>
+      <w:r>
+        <w:t xml:space="preserve"> </w:t>
+      </w:r>
+      <w:r>
+        <w:t xml:space="preserve">Fisheries Management</w:t>
+      </w:r>
+      <w:r>
+        <w:t xml:space="preserve">.</w:t>
+      </w:r>
+    </w:p>
+    <w:bookmarkEnd w:id="68"/>
+    <w:bookmarkStart w:id="70" w:name="ref-turcotte2021"/>
+    <w:p>
+      <w:pPr>
+        <w:pStyle w:val="Bibliography"/>
+      </w:pPr>
+      <w:r>
+        <w:t xml:space="preserve">Turcotte, A., Kermany, N., Foster, S., Proctor, C.A., Gilmour, S.M., Doria, M., Sebes, J., Whitton, J., Cooke, S.J., and Bennett, J.R. 2021. Fixing the</w:t>
+      </w:r>
+      <w:r>
+        <w:t xml:space="preserve"> </w:t>
+      </w:r>
+      <w:r>
+        <w:t xml:space="preserve">Canadian</w:t>
+      </w:r>
+      <w:r>
+        <w:t xml:space="preserve"> </w:t>
+      </w:r>
+      <w:r>
+        <w:rPr>
+          <w:i/>
+          <w:iCs/>
+        </w:rPr>
+        <w:t xml:space="preserve">Species</w:t>
+      </w:r>
+      <w:r>
+        <w:rPr>
+          <w:i/>
+          <w:iCs/>
+        </w:rPr>
+        <w:t xml:space="preserve"> </w:t>
+      </w:r>
+      <w:r>
+        <w:rPr>
+          <w:i/>
+          <w:iCs/>
+        </w:rPr>
+        <w:t xml:space="preserve">at</w:t>
+      </w:r>
+      <w:r>
+        <w:rPr>
+          <w:i/>
+          <w:iCs/>
+        </w:rPr>
+        <w:t xml:space="preserve"> </w:t>
+      </w:r>
+      <w:r>
+        <w:rPr>
+          <w:i/>
+          <w:iCs/>
+        </w:rPr>
+        <w:t xml:space="preserve">Risk Act</w:t>
+      </w:r>
+      <w:r>
+        <w:t xml:space="preserve"> </w:t>
+      </w:r>
+      <w:r>
+        <w:t xml:space="preserve">:</w:t>
+      </w:r>
+      <w:r>
+        <w:t xml:space="preserve"> </w:t>
+      </w:r>
+      <w:r>
+        <w:t xml:space="preserve">Identifying</w:t>
+      </w:r>
+      <w:r>
+        <w:t xml:space="preserve"> </w:t>
+      </w:r>
+      <w:r>
+        <w:t xml:space="preserve">major issues and recommendations for increasing accountability and efficiency. FACETS</w:t>
+      </w:r>
+      <w:r>
+        <w:t xml:space="preserve"> </w:t>
+      </w:r>
+      <w:r>
+        <w:rPr>
+          <w:b/>
+          <w:bCs/>
+        </w:rPr>
+        <w:t xml:space="preserve">6</w:t>
+      </w:r>
+      <w:r>
+        <w:t xml:space="preserve">: 1474–1494. doi:</w:t>
+      </w:r>
+      <w:hyperlink r:id="rId69">
+        <w:r>
+          <w:rPr>
+            <w:rStyle w:val="Hyperlink"/>
+          </w:rPr>
+          <w:t xml:space="preserve">10.1139/facets-2020-0064</w:t>
+        </w:r>
+      </w:hyperlink>
+      <w:r>
+        <w:t xml:space="preserve">.</w:t>
+      </w:r>
+    </w:p>
+    <w:bookmarkEnd w:id="70"/>
+    <w:bookmarkEnd w:id="71"/>
+    <w:bookmarkEnd w:id="72"/>
+    <w:bookmarkStart w:id="73" w:name="supplementary-material"/>
     <w:p>
       <w:pPr>
         <w:pStyle w:val="Heading1"/>
@@ -1618,7 +3297,7 @@
         <w:t xml:space="preserve">*Links or downloads for the LAPSE tool materials (app etc.)</w:t>
       </w:r>
     </w:p>
-    <w:bookmarkEnd w:id="37"/>
+    <w:bookmarkEnd w:id="73"/>
     <w:sectPr>
       <w:headerReference r:id="rId10" w:type="even"/>
       <w:headerReference r:id="rId9" w:type="default"/>

</xml_diff>

<commit_message>
Revised content and figures
</commit_message>
<xml_diff>
--- a/reports/LAPSE_primary_publication.docx
+++ b/reports/LAPSE_primary_publication.docx
@@ -365,19 +365,23 @@
     </w:p>
     <w:p>
       <w:pPr>
-        <w:pStyle w:val="BodyText"/>
+        <w:pStyle w:val="Compact"/>
+        <w:numPr>
+          <w:ilvl w:val="0"/>
+          <w:numId w:val="1001"/>
+        </w:numPr>
       </w:pPr>
       <w:r>
         <w:rPr>
           <w:b/>
           <w:bCs/>
         </w:rPr>
-        <w:t xml:space="preserve">&lt;need to format these charts better. Overlapping font. Maybe side-by-side charts? Or just one chart as an example?&gt;</w:t>
+        <w:t xml:space="preserve">need to format these charts better. Overlapping font. Maybe side-by-side charts? Or just one chart as an example?</w:t>
       </w:r>
     </w:p>
     <w:p>
       <w:pPr>
-        <w:pStyle w:val="BodyText"/>
+        <w:pStyle w:val="FirstParagraph"/>
       </w:pPr>
       <w:r>
         <w:t xml:space="preserve">Acts and regulations in British Columbia might be designed to address one broad category of human activity, but this activity can cover many aspects of salmon management. For example, the provincial</w:t>
@@ -613,14 +617,18 @@
     </w:p>
     <w:p>
       <w:pPr>
-        <w:pStyle w:val="BodyText"/>
+        <w:pStyle w:val="Compact"/>
+        <w:numPr>
+          <w:ilvl w:val="0"/>
+          <w:numId w:val="1002"/>
+        </w:numPr>
       </w:pPr>
       <w:r>
         <w:rPr>
           <w:b/>
           <w:bCs/>
         </w:rPr>
-        <w:t xml:space="preserve">&lt;Include Atkinson 2025 study on monitoring declines&gt;</w:t>
+        <w:t xml:space="preserve">Include Atkinson 2025 study on monitoring declines</w:t>
       </w:r>
     </w:p>
     <w:bookmarkEnd w:id="29"/>
@@ -2455,6 +2463,14 @@
         </w:tc>
       </w:tr>
     </w:tbl>
+    <w:p>
+      <w:pPr>
+        <w:pStyle w:val="BodyText"/>
+      </w:pPr>
+      <w:r>
+        <w:br/>
+      </w:r>
+    </w:p>
     <w:bookmarkEnd w:id="38"/>
     <w:bookmarkStart w:id="43" w:name="legistics-parsing-legislation"/>
     <w:p>
@@ -2654,7 +2670,23 @@
         <w:pStyle w:val="BodyText"/>
       </w:pPr>
       <w:r>
-        <w:t xml:space="preserve">We derived keyword lists from the IUCN - CMP Direct Threats Classification 4.0 examples and definitions; word frequency analyses (unigrams, bigrams, and trigrams) of collected legislation; and iterative researcher input and revision. The keyword and keyphrase development process required an iterative researcher revision step because of the varied context of language. While the words used in the IUCN threat definitions may be specific to those threats, they may not be relevant to salmon management and may also have multiple meanings leading to an over-assignment of categories. For example, the word</w:t>
+        <w:t xml:space="preserve">We derived keyword lists from the</w:t>
+      </w:r>
+      <w:r>
+        <w:t xml:space="preserve"> </w:t>
+      </w:r>
+      <w:r>
+        <w:rPr>
+          <w:i/>
+          <w:iCs/>
+        </w:rPr>
+        <w:t xml:space="preserve">IUCN - CMP Direct Threats Classification 4.0</w:t>
+      </w:r>
+      <w:r>
+        <w:t xml:space="preserve"> </w:t>
+      </w:r>
+      <w:r>
+        <w:t xml:space="preserve">examples and definitions; word frequency analyses (unigrams, bigrams, and trigrams) of collected legislation; and iterative researcher input and revision. The keyword and keyphrase development process required an iterative researcher revision step because of the varied context of language. While the words used in the IUCN threat definitions may be specific to those threats, they may not be relevant to salmon management and may also have multiple meanings leading to an over-assignment of categories. For example, the word</w:t>
       </w:r>
       <w:r>
         <w:t xml:space="preserve"> </w:t>
@@ -2847,14 +2879,18 @@
     </w:p>
     <w:p>
       <w:pPr>
-        <w:pStyle w:val="BodyText"/>
+        <w:pStyle w:val="Compact"/>
+        <w:numPr>
+          <w:ilvl w:val="0"/>
+          <w:numId w:val="1003"/>
+        </w:numPr>
       </w:pPr>
       <w:r>
         <w:rPr>
           <w:b/>
           <w:bCs/>
         </w:rPr>
-        <w:t xml:space="preserve">&lt;The number of statutes per se is not generally indicative of overall quality or potential effectiveness of any legal framework</w:t>
+        <w:t xml:space="preserve">The number of statutes per se is not generally indicative of overall quality or potential effectiveness of any legal framework</w:t>
       </w:r>
       <w:r>
         <w:rPr>
@@ -2869,13 +2905,6 @@
           <w:bCs/>
         </w:rPr>
         <w:t xml:space="preserve">(Ray et al. 2021)</w:t>
-      </w:r>
-      <w:r>
-        <w:rPr>
-          <w:b/>
-          <w:bCs/>
-        </w:rPr>
-        <w:t xml:space="preserve">&gt;</w:t>
       </w:r>
     </w:p>
     <w:bookmarkEnd w:id="45"/>
@@ -6710,6 +6739,14 @@
         </w:tc>
       </w:tr>
     </w:tbl>
+    <w:p>
+      <w:pPr>
+        <w:pStyle w:val="BodyText"/>
+      </w:pPr>
+      <w:r>
+        <w:br/>
+      </w:r>
+    </w:p>
     <w:p>
       <w:pPr>
         <w:pStyle w:val="BodyText"/>
@@ -6798,13 +6835,70 @@
         <w:pStyle w:val="FirstParagraph"/>
       </w:pPr>
       <w:r>
-        <w:t xml:space="preserve">IUCN Level 2 categories are more specific, and the categorization process matched to 25 categories (</w:t>
+        <w:t xml:space="preserve">IUCN Level 2 categories are more specific, and the categorization process matched to 25 categories (Figure</w:t>
+      </w:r>
+      <w:r>
+        <w:t xml:space="preserve"> </w:t>
       </w:r>
       <w:r>
         <w:t xml:space="preserve">6</w:t>
       </w:r>
       <w:r>
-        <w:t xml:space="preserve">) that parallel the management domain categories. Multiple IUCN threats comprise a management domain; however Water-Borne &amp; Other Effluent Pollution (9.1) matched with the highest number of sections (as in the management domains) followed by Fishing, Harvesting &amp; Controlling Aquatic Species (5.4). Eight IUCN threat categories make up the Water Use and Watercourse Modifications management domain, but Dams &amp; Water Management / Use (7.2) has the majority of matches.</w:t>
+        <w:t xml:space="preserve">) that parallel the management domain categories. Multiple IUCN threats comprise a management domain; however</w:t>
+      </w:r>
+      <w:r>
+        <w:t xml:space="preserve"> </w:t>
+      </w:r>
+      <w:r>
+        <w:t xml:space="preserve">“</w:t>
+      </w:r>
+      <w:r>
+        <w:t xml:space="preserve">9.1 Water-Borne &amp; Other Effluent Pollution</w:t>
+      </w:r>
+      <w:r>
+        <w:t xml:space="preserve">”</w:t>
+      </w:r>
+      <w:r>
+        <w:t xml:space="preserve"> </w:t>
+      </w:r>
+      <w:r>
+        <w:t xml:space="preserve">matched with the highest number of sections (as in the management domains) followed by</w:t>
+      </w:r>
+      <w:r>
+        <w:t xml:space="preserve"> </w:t>
+      </w:r>
+      <w:r>
+        <w:t xml:space="preserve">“</w:t>
+      </w:r>
+      <w:r>
+        <w:t xml:space="preserve">5.4 Fishing, Harvesting &amp; Controlling Aquatic Species.</w:t>
+      </w:r>
+      <w:r>
+        <w:t xml:space="preserve">”</w:t>
+      </w:r>
+      <w:r>
+        <w:t xml:space="preserve"> </w:t>
+      </w:r>
+      <w:r>
+        <w:t xml:space="preserve">Eight IUCN threat categories make up the Water Use and Watercourse Modifications management domain, but</w:t>
+      </w:r>
+      <w:r>
+        <w:t xml:space="preserve"> </w:t>
+      </w:r>
+      <w:r>
+        <w:t xml:space="preserve">“</w:t>
+      </w:r>
+      <w:r>
+        <w:t xml:space="preserve">7.2 Dams &amp; Water Management / Use</w:t>
+      </w:r>
+      <w:r>
+        <w:t xml:space="preserve">”</w:t>
+      </w:r>
+      <w:r>
+        <w:t xml:space="preserve"> </w:t>
+      </w:r>
+      <w:r>
+        <w:t xml:space="preserve">has the majority of matches.</w:t>
       </w:r>
     </w:p>
     <w:p>
@@ -8509,6 +8603,9 @@
         <w:pStyle w:val="BodyText"/>
       </w:pPr>
       <w:r>
+        <w:br/>
+      </w:r>
+      <w:r>
         <w:t xml:space="preserve">Pacific salmon-specific language (</w:t>
       </w:r>
       <w:r>
@@ -8651,6 +8748,14 @@
         <w:t xml:space="preserve">, coloured by jurisdiction.</w:t>
       </w:r>
     </w:p>
+    <w:p>
+      <w:pPr>
+        <w:pStyle w:val="BodyText"/>
+      </w:pPr>
+      <w:r>
+        <w:br/>
+      </w:r>
+    </w:p>
     <w:bookmarkEnd w:id="66"/>
     <w:bookmarkEnd w:id="67"/>
     <w:bookmarkStart w:id="69" w:name="legislative-factors-clause-types"/>
@@ -17086,8 +17191,16 @@
         </w:tc>
       </w:tr>
     </w:tbl>
+    <w:p>
+      <w:pPr>
+        <w:pStyle w:val="BodyText"/>
+      </w:pPr>
+      <w:r>
+        <w:br/>
+      </w:r>
+    </w:p>
     <w:bookmarkEnd w:id="69"/>
-    <w:bookmarkStart w:id="75" w:name="X3d1f28ebf57a42a02e6321b912ef3127a66a1d5"/>
+    <w:bookmarkStart w:id="87" w:name="X3d1f28ebf57a42a02e6321b912ef3127a66a1d5"/>
     <w:p>
       <w:pPr>
         <w:pStyle w:val="Heading1"/>
@@ -20889,7 +21002,7 @@
         <w:pStyle w:val="BodyText"/>
       </w:pPr>
       <w:r>
-        <w:t xml:space="preserve">Twenty-seven Conservation Units (CU) were included in this exercise, having been assessed through the COSEWIC Recovery Potential Assessment (RPA) process. RPAs used the same IUCN threat categories for assessment ranked from low to extreme by CU. Figure 9 shows the aggregate of the rankings regardless of threat, but stacked by species. More CUs had IUCN threats ranked from negligible to low while a few CUs had extreme to high rankings, specifically for Chinook and lake type sockeye.</w:t>
+        <w:br/>
       </w:r>
     </w:p>
     <w:p>
@@ -20897,7 +21010,88 @@
         <w:pStyle w:val="BodyText"/>
       </w:pPr>
       <w:r>
-        <w:t xml:space="preserve">The RPA process identified two IUCN threat categories as being extreme or extreme-high ranking. Geological Events (10.1) received an extreme ranking, and Dams &amp; Water Management / Use (7.2) received an extreme-high ranking (Figure 10). Appendices IV and V of this report use these categories as case studies to demonstrate how the use of the LAPSE tool framework can identify relevant legislation.</w:t>
+        <w:t xml:space="preserve">The RPA process identified two IUCN threat categories as being</w:t>
+      </w:r>
+      <w:r>
+        <w:t xml:space="preserve"> </w:t>
+      </w:r>
+      <w:r>
+        <w:t xml:space="preserve">“</w:t>
+      </w:r>
+      <w:r>
+        <w:t xml:space="preserve">Extreme</w:t>
+      </w:r>
+      <w:r>
+        <w:t xml:space="preserve">”</w:t>
+      </w:r>
+      <w:r>
+        <w:t xml:space="preserve"> </w:t>
+      </w:r>
+      <w:r>
+        <w:t xml:space="preserve">or</w:t>
+      </w:r>
+      <w:r>
+        <w:t xml:space="preserve"> </w:t>
+      </w:r>
+      <w:r>
+        <w:t xml:space="preserve">“</w:t>
+      </w:r>
+      <w:r>
+        <w:t xml:space="preserve">Extreme-High</w:t>
+      </w:r>
+      <w:r>
+        <w:t xml:space="preserve">”</w:t>
+      </w:r>
+      <w:r>
+        <w:t xml:space="preserve"> </w:t>
+      </w:r>
+      <w:r>
+        <w:t xml:space="preserve">ranking (Figure</w:t>
+      </w:r>
+      <w:r>
+        <w:t xml:space="preserve"> </w:t>
+      </w:r>
+      <w:r>
+        <w:t xml:space="preserve">9</w:t>
+      </w:r>
+      <w:r>
+        <w:t xml:space="preserve">).</w:t>
+      </w:r>
+      <w:r>
+        <w:t xml:space="preserve"> </w:t>
+      </w:r>
+      <w:r>
+        <w:t xml:space="preserve">“</w:t>
+      </w:r>
+      <w:r>
+        <w:t xml:space="preserve">10.1 Geological Events</w:t>
+      </w:r>
+      <w:r>
+        <w:t xml:space="preserve">”</w:t>
+      </w:r>
+      <w:r>
+        <w:t xml:space="preserve"> </w:t>
+      </w:r>
+      <w:r>
+        <w:t xml:space="preserve">received an extreme ranking, and</w:t>
+      </w:r>
+      <w:r>
+        <w:t xml:space="preserve"> </w:t>
+      </w:r>
+      <w:r>
+        <w:t xml:space="preserve">“</w:t>
+      </w:r>
+      <w:r>
+        <w:t xml:space="preserve">7.2 Dams &amp; Water Management / Use</w:t>
+      </w:r>
+      <w:r>
+        <w:t xml:space="preserve">”</w:t>
+      </w:r>
+      <w:r>
+        <w:t xml:space="preserve"> </w:t>
+      </w:r>
+      <w:r>
+        <w:t xml:space="preserve">received an extreme-high ranking.</w:t>
       </w:r>
     </w:p>
     <w:p>
@@ -20957,12 +21151,699 @@
         <w:t xml:space="preserve">Figure 9: Conservation Unit count across IUCN threat categories and RPA threat rankings. Darker cells indicate more Conservation Units assessed at that threat level.</w:t>
       </w:r>
     </w:p>
+    <w:bookmarkStart w:id="80" w:name="case-study-iucn-10.1-geological-events"/>
+    <w:p>
+      <w:pPr>
+        <w:pStyle w:val="Heading2"/>
+      </w:pPr>
+      <w:r>
+        <w:t xml:space="preserve">Case Study: IUCN 10.1 Geological events</w:t>
+      </w:r>
+    </w:p>
+    <w:p>
+      <w:pPr>
+        <w:pStyle w:val="FirstParagraph"/>
+      </w:pPr>
+      <w:r>
+        <w:t xml:space="preserve">One IUCN threat was assessed as</w:t>
+      </w:r>
+      <w:r>
+        <w:t xml:space="preserve"> </w:t>
+      </w:r>
+      <w:r>
+        <w:t xml:space="preserve">“</w:t>
+      </w:r>
+      <w:r>
+        <w:t xml:space="preserve">Extreme</w:t>
+      </w:r>
+      <w:r>
+        <w:t xml:space="preserve">”</w:t>
+      </w:r>
+      <w:r>
+        <w:t xml:space="preserve"> </w:t>
+      </w:r>
+      <w:r>
+        <w:t xml:space="preserve">through COSEWIC Recovery Potential Assessment processes, which was</w:t>
+      </w:r>
+      <w:r>
+        <w:t xml:space="preserve"> </w:t>
+      </w:r>
+      <w:r>
+        <w:t xml:space="preserve">“</w:t>
+      </w:r>
+      <w:r>
+        <w:t xml:space="preserve">10.1 Geological Events</w:t>
+      </w:r>
+      <w:r>
+        <w:t xml:space="preserve">”</w:t>
+      </w:r>
+      <w:r>
+        <w:t xml:space="preserve"> </w:t>
+      </w:r>
+      <w:r>
+        <w:t xml:space="preserve">(DFO 2020, 2022)</w:t>
+      </w:r>
+      <w:r>
+        <w:t xml:space="preserve">. This threat was assigned to one sockeye and three Chinook conservation units (Table</w:t>
+      </w:r>
+      <w:r>
+        <w:t xml:space="preserve"> </w:t>
+      </w:r>
+      <w:r>
+        <w:t xml:space="preserve">6</w:t>
+      </w:r>
+      <w:r>
+        <w:t xml:space="preserve">), all in the Fraser Interior area related to the</w:t>
+      </w:r>
+      <w:r>
+        <w:t xml:space="preserve"> </w:t>
+      </w:r>
+      <w:r>
+        <w:t xml:space="preserve">“</w:t>
+      </w:r>
+      <w:r>
+        <w:t xml:space="preserve">ongoing effects from Big Bar landslide</w:t>
+      </w:r>
+      <w:r>
+        <w:t xml:space="preserve">”</w:t>
+      </w:r>
+      <w:r>
+        <w:t xml:space="preserve"> </w:t>
+      </w:r>
+      <w:r>
+        <w:t xml:space="preserve">in 2018</w:t>
+      </w:r>
+      <w:r>
+        <w:t xml:space="preserve"> </w:t>
+      </w:r>
+      <w:r>
+        <w:t xml:space="preserve">(DFO 2020, 2022)</w:t>
+      </w:r>
+      <w:r>
+        <w:t xml:space="preserve">:</w:t>
+      </w:r>
+    </w:p>
+    <w:p>
+      <w:pPr>
+        <w:pStyle w:val="TableCaption"/>
+      </w:pPr>
+      <w:bookmarkStart w:id="75" w:name="tab:cu-extreme-threat-table"/>
+      <w:bookmarkEnd w:id="75"/>
+      <w:r>
+        <w:t xml:space="preserve">Table 6:</w:t>
+      </w:r>
+      <w:r>
+        <w:t xml:space="preserve"> </w:t>
+      </w:r>
+      <w:r>
+        <w:t xml:space="preserve">Conservation Units with Extreme RPA threat ranking.</w:t>
+      </w:r>
+    </w:p>
+    <w:tbl xmlns:w="http://schemas.openxmlformats.org/wordprocessingml/2006/main" xmlns:r="http://schemas.openxmlformats.org/officeDocument/2006/relationships" xmlns:w14="http://schemas.microsoft.com/office/word/2010/wordml" xmlns:wp="http://schemas.openxmlformats.org/drawingml/2006/wordprocessingDrawing" xmlns:a="http://schemas.openxmlformats.org/drawingml/2006/main" xmlns:pic="http://schemas.openxmlformats.org/drawingml/2006/picture">
+      <w:tblPr>
+        <w:tblLayout w:type="autofit"/>
+        <w:jc w:val="center"/>
+        <w:tblW w:type="pct" w:w="5000"/>
+        <w:tblLook w:firstRow="1" w:lastRow="0" w:firstColumn="0" w:lastColumn="0" w:noHBand="0" w:noVBand="1"/>
+      </w:tblPr>
+      <w:tr>
+        <w:trPr>
+          <w:trHeight w:val="360" w:hRule="auto"/>
+          <w:tblHeader/>
+        </w:trPr>
+        header1
+        <w:tc>
+          <w:tcPr>
+            <w:tcBorders>
+              <w:bottom w:val="single" w:sz="12" w:space="0" w:color="666666"/>
+              <w:top w:val="single" w:sz="12" w:space="0" w:color="666666"/>
+              <w:left w:val="none" w:sz="0" w:space="0" w:color="000000"/>
+              <w:right w:val="none" w:sz="0" w:space="0" w:color="000000"/>
+            </w:tcBorders>
+            <w:shd w:val="clear" w:color="auto" w:fill="FFFFFF"/>
+            <w:tcMar>
+              <w:top w:w="0" w:type="dxa"/>
+              <w:bottom w:w="0" w:type="dxa"/>
+              <w:left w:w="0" w:type="dxa"/>
+              <w:right w:w="0" w:type="dxa"/>
+            </w:tcMar>
+            <w:vAlign w:val="center"/>
+          </w:tcPr>
+          <w:p>
+            <w:pPr>
+              <w:jc w:val="left"/>
+              <w:pBdr>
+                <w:bottom w:val="none" w:sz="0" w:space="0" w:color="000000"/>
+                <w:top w:val="none" w:sz="0" w:space="0" w:color="000000"/>
+                <w:left w:val="none" w:sz="0" w:space="0" w:color="000000"/>
+                <w:right w:val="none" w:sz="0" w:space="0" w:color="000000"/>
+              </w:pBdr>
+              <w:spacing w:after="100" w:before="100" w:line="240"/>
+              <w:ind w:left="100" w:right="100" w:firstLine="0" w:firstLineChars="0"/>
+              <w:rPr>
+                <w:rFonts w:ascii="Arial" w:hAnsi="Arial" w:eastAsia="Arial" w:cs="Arial"/>
+                <w:i w:val="false"/>
+                <w:b w:val="true"/>
+                <w:u w:val="none"/>
+                <w:strike w:val="false"/>
+                <w:sz w:val="22"/>
+                <w:szCs w:val="22"/>
+                <w:color w:val="000000"/>
+              </w:rPr>
+            </w:pPr>
+            <w:r xmlns:w="http://schemas.openxmlformats.org/wordprocessingml/2006/main" xmlns:wp="http://schemas.openxmlformats.org/drawingml/2006/wordprocessingDrawing" xmlns:r="http://schemas.openxmlformats.org/officeDocument/2006/relationships" xmlns:w14="http://schemas.microsoft.com/office/word/2010/wordml">
+              <w:rPr>
+                <w:rFonts w:ascii="Arial" w:hAnsi="Arial" w:eastAsia="Arial" w:cs="Arial"/>
+                <w:i w:val="false"/>
+                <w:b w:val="true"/>
+                <w:u w:val="none"/>
+                <w:strike w:val="false"/>
+                <w:sz w:val="22"/>
+                <w:szCs w:val="22"/>
+                <w:color w:val="000000"/>
+              </w:rPr>
+              <w:t xml:space="preserve">Species</w:t>
+            </w:r>
+          </w:p>
+        </w:tc>
+        <w:tc>
+          <w:tcPr>
+            <w:tcBorders>
+              <w:bottom w:val="single" w:sz="12" w:space="0" w:color="666666"/>
+              <w:top w:val="single" w:sz="12" w:space="0" w:color="666666"/>
+              <w:left w:val="none" w:sz="0" w:space="0" w:color="000000"/>
+              <w:right w:val="none" w:sz="0" w:space="0" w:color="000000"/>
+            </w:tcBorders>
+            <w:shd w:val="clear" w:color="auto" w:fill="FFFFFF"/>
+            <w:tcMar>
+              <w:top w:w="0" w:type="dxa"/>
+              <w:bottom w:w="0" w:type="dxa"/>
+              <w:left w:w="0" w:type="dxa"/>
+              <w:right w:w="0" w:type="dxa"/>
+            </w:tcMar>
+            <w:vAlign w:val="center"/>
+          </w:tcPr>
+          <w:p>
+            <w:pPr>
+              <w:jc w:val="left"/>
+              <w:pBdr>
+                <w:bottom w:val="none" w:sz="0" w:space="0" w:color="000000"/>
+                <w:top w:val="none" w:sz="0" w:space="0" w:color="000000"/>
+                <w:left w:val="none" w:sz="0" w:space="0" w:color="000000"/>
+                <w:right w:val="none" w:sz="0" w:space="0" w:color="000000"/>
+              </w:pBdr>
+              <w:spacing w:after="100" w:before="100" w:line="240"/>
+              <w:ind w:left="100" w:right="100" w:firstLine="0" w:firstLineChars="0"/>
+              <w:rPr>
+                <w:rFonts w:ascii="Arial" w:hAnsi="Arial" w:eastAsia="Arial" w:cs="Arial"/>
+                <w:i w:val="false"/>
+                <w:b w:val="true"/>
+                <w:u w:val="none"/>
+                <w:strike w:val="false"/>
+                <w:sz w:val="22"/>
+                <w:szCs w:val="22"/>
+                <w:color w:val="000000"/>
+              </w:rPr>
+            </w:pPr>
+            <w:r xmlns:w="http://schemas.openxmlformats.org/wordprocessingml/2006/main" xmlns:wp="http://schemas.openxmlformats.org/drawingml/2006/wordprocessingDrawing" xmlns:r="http://schemas.openxmlformats.org/officeDocument/2006/relationships" xmlns:w14="http://schemas.microsoft.com/office/word/2010/wordml">
+              <w:rPr>
+                <w:rFonts w:ascii="Arial" w:hAnsi="Arial" w:eastAsia="Arial" w:cs="Arial"/>
+                <w:i w:val="false"/>
+                <w:b w:val="true"/>
+                <w:u w:val="none"/>
+                <w:strike w:val="false"/>
+                <w:sz w:val="22"/>
+                <w:szCs w:val="22"/>
+                <w:color w:val="000000"/>
+              </w:rPr>
+              <w:t xml:space="preserve">Conservation Unit</w:t>
+            </w:r>
+          </w:p>
+        </w:tc>
+      </w:tr>
+      <w:tr>
+        <w:trPr>
+          <w:trHeight w:val="360" w:hRule="auto"/>
+        </w:trPr>
+        body1
+        <w:tc>
+          <w:tcPr>
+            <w:tcBorders>
+              <w:bottom w:val="none" w:sz="0" w:space="0" w:color="000000"/>
+              <w:top w:val="single" w:sz="12" w:space="0" w:color="666666"/>
+              <w:left w:val="none" w:sz="0" w:space="0" w:color="000000"/>
+              <w:right w:val="none" w:sz="0" w:space="0" w:color="000000"/>
+            </w:tcBorders>
+            <w:shd w:val="clear" w:color="auto" w:fill="FFFFFF"/>
+            <w:tcMar>
+              <w:top w:w="0" w:type="dxa"/>
+              <w:bottom w:w="0" w:type="dxa"/>
+              <w:left w:w="0" w:type="dxa"/>
+              <w:right w:w="0" w:type="dxa"/>
+            </w:tcMar>
+            <w:vAlign w:val="center"/>
+          </w:tcPr>
+          <w:p>
+            <w:pPr>
+              <w:jc w:val="left"/>
+              <w:pBdr>
+                <w:bottom w:val="none" w:sz="0" w:space="0" w:color="000000"/>
+                <w:top w:val="none" w:sz="0" w:space="0" w:color="000000"/>
+                <w:left w:val="none" w:sz="0" w:space="0" w:color="000000"/>
+                <w:right w:val="none" w:sz="0" w:space="0" w:color="000000"/>
+              </w:pBdr>
+              <w:spacing w:after="100" w:before="100" w:line="240"/>
+              <w:ind w:left="100" w:right="100" w:firstLine="0" w:firstLineChars="0"/>
+              <w:rPr>
+                <w:rFonts w:ascii="Arial" w:hAnsi="Arial" w:eastAsia="Arial" w:cs="Arial"/>
+                <w:i w:val="false"/>
+                <w:b w:val="false"/>
+                <w:u w:val="none"/>
+                <w:strike w:val="false"/>
+                <w:sz w:val="22"/>
+                <w:szCs w:val="22"/>
+                <w:color w:val="000000"/>
+              </w:rPr>
+            </w:pPr>
+            <w:r xmlns:w="http://schemas.openxmlformats.org/wordprocessingml/2006/main" xmlns:wp="http://schemas.openxmlformats.org/drawingml/2006/wordprocessingDrawing" xmlns:r="http://schemas.openxmlformats.org/officeDocument/2006/relationships" xmlns:w14="http://schemas.microsoft.com/office/word/2010/wordml">
+              <w:rPr>
+                <w:rFonts w:ascii="Arial" w:hAnsi="Arial" w:eastAsia="Arial" w:cs="Arial"/>
+                <w:i w:val="false"/>
+                <w:b w:val="false"/>
+                <w:u w:val="none"/>
+                <w:strike w:val="false"/>
+                <w:sz w:val="22"/>
+                <w:szCs w:val="22"/>
+                <w:color w:val="000000"/>
+              </w:rPr>
+              <w:t xml:space="preserve">Chinook</w:t>
+            </w:r>
+          </w:p>
+        </w:tc>
+        <w:tc>
+          <w:tcPr>
+            <w:tcBorders>
+              <w:bottom w:val="none" w:sz="0" w:space="0" w:color="000000"/>
+              <w:top w:val="single" w:sz="12" w:space="0" w:color="666666"/>
+              <w:left w:val="none" w:sz="0" w:space="0" w:color="000000"/>
+              <w:right w:val="none" w:sz="0" w:space="0" w:color="000000"/>
+            </w:tcBorders>
+            <w:shd w:val="clear" w:color="auto" w:fill="FFFFFF"/>
+            <w:tcMar>
+              <w:top w:w="0" w:type="dxa"/>
+              <w:bottom w:w="0" w:type="dxa"/>
+              <w:left w:w="0" w:type="dxa"/>
+              <w:right w:w="0" w:type="dxa"/>
+            </w:tcMar>
+            <w:vAlign w:val="center"/>
+          </w:tcPr>
+          <w:p>
+            <w:pPr>
+              <w:jc w:val="left"/>
+              <w:pBdr>
+                <w:bottom w:val="none" w:sz="0" w:space="0" w:color="000000"/>
+                <w:top w:val="none" w:sz="0" w:space="0" w:color="000000"/>
+                <w:left w:val="none" w:sz="0" w:space="0" w:color="000000"/>
+                <w:right w:val="none" w:sz="0" w:space="0" w:color="000000"/>
+              </w:pBdr>
+              <w:spacing w:after="100" w:before="100" w:line="240"/>
+              <w:ind w:left="100" w:right="100" w:firstLine="0" w:firstLineChars="0"/>
+              <w:rPr>
+                <w:rFonts w:ascii="Arial" w:hAnsi="Arial" w:eastAsia="Arial" w:cs="Arial"/>
+                <w:i w:val="false"/>
+                <w:b w:val="false"/>
+                <w:u w:val="none"/>
+                <w:strike w:val="false"/>
+                <w:sz w:val="22"/>
+                <w:szCs w:val="22"/>
+                <w:color w:val="000000"/>
+              </w:rPr>
+            </w:pPr>
+            <w:r xmlns:w="http://schemas.openxmlformats.org/wordprocessingml/2006/main" xmlns:wp="http://schemas.openxmlformats.org/drawingml/2006/wordprocessingDrawing" xmlns:r="http://schemas.openxmlformats.org/officeDocument/2006/relationships" xmlns:w14="http://schemas.microsoft.com/office/word/2010/wordml">
+              <w:rPr>
+                <w:rFonts w:ascii="Arial" w:hAnsi="Arial" w:eastAsia="Arial" w:cs="Arial"/>
+                <w:i w:val="false"/>
+                <w:b w:val="false"/>
+                <w:u w:val="none"/>
+                <w:strike w:val="false"/>
+                <w:sz w:val="22"/>
+                <w:szCs w:val="22"/>
+                <w:color w:val="000000"/>
+              </w:rPr>
+              <w:t xml:space="preserve">MIDDLE FRASER RIVER_SP_1.3</w:t>
+            </w:r>
+          </w:p>
+        </w:tc>
+      </w:tr>
+      <w:tr>
+        <w:trPr>
+          <w:trHeight w:val="360" w:hRule="auto"/>
+        </w:trPr>
+        body2
+        <w:tc>
+          <w:tcPr>
+            <w:tcBorders>
+              <w:bottom w:val="none" w:sz="0" w:space="0" w:color="000000"/>
+              <w:top w:val="none" w:sz="0" w:space="0" w:color="000000"/>
+              <w:left w:val="none" w:sz="0" w:space="0" w:color="000000"/>
+              <w:right w:val="none" w:sz="0" w:space="0" w:color="000000"/>
+            </w:tcBorders>
+            <w:shd w:val="clear" w:color="auto" w:fill="FFFFFF"/>
+            <w:tcMar>
+              <w:top w:w="0" w:type="dxa"/>
+              <w:bottom w:w="0" w:type="dxa"/>
+              <w:left w:w="0" w:type="dxa"/>
+              <w:right w:w="0" w:type="dxa"/>
+            </w:tcMar>
+            <w:vAlign w:val="center"/>
+          </w:tcPr>
+          <w:p>
+            <w:pPr>
+              <w:jc w:val="left"/>
+              <w:pBdr>
+                <w:bottom w:val="none" w:sz="0" w:space="0" w:color="000000"/>
+                <w:top w:val="none" w:sz="0" w:space="0" w:color="000000"/>
+                <w:left w:val="none" w:sz="0" w:space="0" w:color="000000"/>
+                <w:right w:val="none" w:sz="0" w:space="0" w:color="000000"/>
+              </w:pBdr>
+              <w:spacing w:after="100" w:before="100" w:line="240"/>
+              <w:ind w:left="100" w:right="100" w:firstLine="0" w:firstLineChars="0"/>
+              <w:rPr>
+                <w:rFonts w:ascii="Arial" w:hAnsi="Arial" w:eastAsia="Arial" w:cs="Arial"/>
+                <w:i w:val="false"/>
+                <w:b w:val="false"/>
+                <w:u w:val="none"/>
+                <w:strike w:val="false"/>
+                <w:sz w:val="22"/>
+                <w:szCs w:val="22"/>
+                <w:color w:val="000000"/>
+              </w:rPr>
+            </w:pPr>
+            <w:r xmlns:w="http://schemas.openxmlformats.org/wordprocessingml/2006/main" xmlns:wp="http://schemas.openxmlformats.org/drawingml/2006/wordprocessingDrawing" xmlns:r="http://schemas.openxmlformats.org/officeDocument/2006/relationships" xmlns:w14="http://schemas.microsoft.com/office/word/2010/wordml">
+              <w:rPr>
+                <w:rFonts w:ascii="Arial" w:hAnsi="Arial" w:eastAsia="Arial" w:cs="Arial"/>
+                <w:i w:val="false"/>
+                <w:b w:val="false"/>
+                <w:u w:val="none"/>
+                <w:strike w:val="false"/>
+                <w:sz w:val="22"/>
+                <w:szCs w:val="22"/>
+                <w:color w:val="000000"/>
+              </w:rPr>
+              <w:t xml:space="preserve">Chinook</w:t>
+            </w:r>
+          </w:p>
+        </w:tc>
+        <w:tc>
+          <w:tcPr>
+            <w:tcBorders>
+              <w:bottom w:val="none" w:sz="0" w:space="0" w:color="000000"/>
+              <w:top w:val="none" w:sz="0" w:space="0" w:color="000000"/>
+              <w:left w:val="none" w:sz="0" w:space="0" w:color="000000"/>
+              <w:right w:val="none" w:sz="0" w:space="0" w:color="000000"/>
+            </w:tcBorders>
+            <w:shd w:val="clear" w:color="auto" w:fill="FFFFFF"/>
+            <w:tcMar>
+              <w:top w:w="0" w:type="dxa"/>
+              <w:bottom w:w="0" w:type="dxa"/>
+              <w:left w:w="0" w:type="dxa"/>
+              <w:right w:w="0" w:type="dxa"/>
+            </w:tcMar>
+            <w:vAlign w:val="center"/>
+          </w:tcPr>
+          <w:p>
+            <w:pPr>
+              <w:jc w:val="left"/>
+              <w:pBdr>
+                <w:bottom w:val="none" w:sz="0" w:space="0" w:color="000000"/>
+                <w:top w:val="none" w:sz="0" w:space="0" w:color="000000"/>
+                <w:left w:val="none" w:sz="0" w:space="0" w:color="000000"/>
+                <w:right w:val="none" w:sz="0" w:space="0" w:color="000000"/>
+              </w:pBdr>
+              <w:spacing w:after="100" w:before="100" w:line="240"/>
+              <w:ind w:left="100" w:right="100" w:firstLine="0" w:firstLineChars="0"/>
+              <w:rPr>
+                <w:rFonts w:ascii="Arial" w:hAnsi="Arial" w:eastAsia="Arial" w:cs="Arial"/>
+                <w:i w:val="false"/>
+                <w:b w:val="false"/>
+                <w:u w:val="none"/>
+                <w:strike w:val="false"/>
+                <w:sz w:val="22"/>
+                <w:szCs w:val="22"/>
+                <w:color w:val="000000"/>
+              </w:rPr>
+            </w:pPr>
+            <w:r xmlns:w="http://schemas.openxmlformats.org/wordprocessingml/2006/main" xmlns:wp="http://schemas.openxmlformats.org/drawingml/2006/wordprocessingDrawing" xmlns:r="http://schemas.openxmlformats.org/officeDocument/2006/relationships" xmlns:w14="http://schemas.microsoft.com/office/word/2010/wordml">
+              <w:rPr>
+                <w:rFonts w:ascii="Arial" w:hAnsi="Arial" w:eastAsia="Arial" w:cs="Arial"/>
+                <w:i w:val="false"/>
+                <w:b w:val="false"/>
+                <w:u w:val="none"/>
+                <w:strike w:val="false"/>
+                <w:sz w:val="22"/>
+                <w:szCs w:val="22"/>
+                <w:color w:val="000000"/>
+              </w:rPr>
+              <w:t xml:space="preserve">MIDDLE FRASER RIVER_SU_1.3</w:t>
+            </w:r>
+          </w:p>
+        </w:tc>
+      </w:tr>
+      <w:tr>
+        <w:trPr>
+          <w:trHeight w:val="360" w:hRule="auto"/>
+        </w:trPr>
+        body3
+        <w:tc>
+          <w:tcPr>
+            <w:tcBorders>
+              <w:bottom w:val="none" w:sz="0" w:space="0" w:color="000000"/>
+              <w:top w:val="none" w:sz="0" w:space="0" w:color="000000"/>
+              <w:left w:val="none" w:sz="0" w:space="0" w:color="000000"/>
+              <w:right w:val="none" w:sz="0" w:space="0" w:color="000000"/>
+            </w:tcBorders>
+            <w:shd w:val="clear" w:color="auto" w:fill="FFFFFF"/>
+            <w:tcMar>
+              <w:top w:w="0" w:type="dxa"/>
+              <w:bottom w:w="0" w:type="dxa"/>
+              <w:left w:w="0" w:type="dxa"/>
+              <w:right w:w="0" w:type="dxa"/>
+            </w:tcMar>
+            <w:vAlign w:val="center"/>
+          </w:tcPr>
+          <w:p>
+            <w:pPr>
+              <w:jc w:val="left"/>
+              <w:pBdr>
+                <w:bottom w:val="none" w:sz="0" w:space="0" w:color="000000"/>
+                <w:top w:val="none" w:sz="0" w:space="0" w:color="000000"/>
+                <w:left w:val="none" w:sz="0" w:space="0" w:color="000000"/>
+                <w:right w:val="none" w:sz="0" w:space="0" w:color="000000"/>
+              </w:pBdr>
+              <w:spacing w:after="100" w:before="100" w:line="240"/>
+              <w:ind w:left="100" w:right="100" w:firstLine="0" w:firstLineChars="0"/>
+              <w:rPr>
+                <w:rFonts w:ascii="Arial" w:hAnsi="Arial" w:eastAsia="Arial" w:cs="Arial"/>
+                <w:i w:val="false"/>
+                <w:b w:val="false"/>
+                <w:u w:val="none"/>
+                <w:strike w:val="false"/>
+                <w:sz w:val="22"/>
+                <w:szCs w:val="22"/>
+                <w:color w:val="000000"/>
+              </w:rPr>
+            </w:pPr>
+            <w:r xmlns:w="http://schemas.openxmlformats.org/wordprocessingml/2006/main" xmlns:wp="http://schemas.openxmlformats.org/drawingml/2006/wordprocessingDrawing" xmlns:r="http://schemas.openxmlformats.org/officeDocument/2006/relationships" xmlns:w14="http://schemas.microsoft.com/office/word/2010/wordml">
+              <w:rPr>
+                <w:rFonts w:ascii="Arial" w:hAnsi="Arial" w:eastAsia="Arial" w:cs="Arial"/>
+                <w:i w:val="false"/>
+                <w:b w:val="false"/>
+                <w:u w:val="none"/>
+                <w:strike w:val="false"/>
+                <w:sz w:val="22"/>
+                <w:szCs w:val="22"/>
+                <w:color w:val="000000"/>
+              </w:rPr>
+              <w:t xml:space="preserve">Chinook</w:t>
+            </w:r>
+          </w:p>
+        </w:tc>
+        <w:tc>
+          <w:tcPr>
+            <w:tcBorders>
+              <w:bottom w:val="none" w:sz="0" w:space="0" w:color="000000"/>
+              <w:top w:val="none" w:sz="0" w:space="0" w:color="000000"/>
+              <w:left w:val="none" w:sz="0" w:space="0" w:color="000000"/>
+              <w:right w:val="none" w:sz="0" w:space="0" w:color="000000"/>
+            </w:tcBorders>
+            <w:shd w:val="clear" w:color="auto" w:fill="FFFFFF"/>
+            <w:tcMar>
+              <w:top w:w="0" w:type="dxa"/>
+              <w:bottom w:w="0" w:type="dxa"/>
+              <w:left w:w="0" w:type="dxa"/>
+              <w:right w:w="0" w:type="dxa"/>
+            </w:tcMar>
+            <w:vAlign w:val="center"/>
+          </w:tcPr>
+          <w:p>
+            <w:pPr>
+              <w:jc w:val="left"/>
+              <w:pBdr>
+                <w:bottom w:val="none" w:sz="0" w:space="0" w:color="000000"/>
+                <w:top w:val="none" w:sz="0" w:space="0" w:color="000000"/>
+                <w:left w:val="none" w:sz="0" w:space="0" w:color="000000"/>
+                <w:right w:val="none" w:sz="0" w:space="0" w:color="000000"/>
+              </w:pBdr>
+              <w:spacing w:after="100" w:before="100" w:line="240"/>
+              <w:ind w:left="100" w:right="100" w:firstLine="0" w:firstLineChars="0"/>
+              <w:rPr>
+                <w:rFonts w:ascii="Arial" w:hAnsi="Arial" w:eastAsia="Arial" w:cs="Arial"/>
+                <w:i w:val="false"/>
+                <w:b w:val="false"/>
+                <w:u w:val="none"/>
+                <w:strike w:val="false"/>
+                <w:sz w:val="22"/>
+                <w:szCs w:val="22"/>
+                <w:color w:val="000000"/>
+              </w:rPr>
+            </w:pPr>
+            <w:r xmlns:w="http://schemas.openxmlformats.org/wordprocessingml/2006/main" xmlns:wp="http://schemas.openxmlformats.org/drawingml/2006/wordprocessingDrawing" xmlns:r="http://schemas.openxmlformats.org/officeDocument/2006/relationships" xmlns:w14="http://schemas.microsoft.com/office/word/2010/wordml">
+              <w:rPr>
+                <w:rFonts w:ascii="Arial" w:hAnsi="Arial" w:eastAsia="Arial" w:cs="Arial"/>
+                <w:i w:val="false"/>
+                <w:b w:val="false"/>
+                <w:u w:val="none"/>
+                <w:strike w:val="false"/>
+                <w:sz w:val="22"/>
+                <w:szCs w:val="22"/>
+                <w:color w:val="000000"/>
+              </w:rPr>
+              <w:t xml:space="preserve">UPPER FRASER RIVER_SP_1.3</w:t>
+            </w:r>
+          </w:p>
+        </w:tc>
+      </w:tr>
+      <w:tr>
+        <w:trPr>
+          <w:trHeight w:val="360" w:hRule="auto"/>
+        </w:trPr>
+        body4
+        <w:tc>
+          <w:tcPr>
+            <w:tcBorders>
+              <w:bottom w:val="single" w:sz="12" w:space="0" w:color="666666"/>
+              <w:top w:val="none" w:sz="0" w:space="0" w:color="000000"/>
+              <w:left w:val="none" w:sz="0" w:space="0" w:color="000000"/>
+              <w:right w:val="none" w:sz="0" w:space="0" w:color="000000"/>
+            </w:tcBorders>
+            <w:shd w:val="clear" w:color="auto" w:fill="FFFFFF"/>
+            <w:tcMar>
+              <w:top w:w="0" w:type="dxa"/>
+              <w:bottom w:w="0" w:type="dxa"/>
+              <w:left w:w="0" w:type="dxa"/>
+              <w:right w:w="0" w:type="dxa"/>
+            </w:tcMar>
+            <w:vAlign w:val="center"/>
+          </w:tcPr>
+          <w:p>
+            <w:pPr>
+              <w:jc w:val="left"/>
+              <w:pBdr>
+                <w:bottom w:val="none" w:sz="0" w:space="0" w:color="000000"/>
+                <w:top w:val="none" w:sz="0" w:space="0" w:color="000000"/>
+                <w:left w:val="none" w:sz="0" w:space="0" w:color="000000"/>
+                <w:right w:val="none" w:sz="0" w:space="0" w:color="000000"/>
+              </w:pBdr>
+              <w:spacing w:after="100" w:before="100" w:line="240"/>
+              <w:ind w:left="100" w:right="100" w:firstLine="0" w:firstLineChars="0"/>
+              <w:rPr>
+                <w:rFonts w:ascii="Arial" w:hAnsi="Arial" w:eastAsia="Arial" w:cs="Arial"/>
+                <w:i w:val="false"/>
+                <w:b w:val="false"/>
+                <w:u w:val="none"/>
+                <w:strike w:val="false"/>
+                <w:sz w:val="22"/>
+                <w:szCs w:val="22"/>
+                <w:color w:val="000000"/>
+              </w:rPr>
+            </w:pPr>
+            <w:r xmlns:w="http://schemas.openxmlformats.org/wordprocessingml/2006/main" xmlns:wp="http://schemas.openxmlformats.org/drawingml/2006/wordprocessingDrawing" xmlns:r="http://schemas.openxmlformats.org/officeDocument/2006/relationships" xmlns:w14="http://schemas.microsoft.com/office/word/2010/wordml">
+              <w:rPr>
+                <w:rFonts w:ascii="Arial" w:hAnsi="Arial" w:eastAsia="Arial" w:cs="Arial"/>
+                <w:i w:val="false"/>
+                <w:b w:val="false"/>
+                <w:u w:val="none"/>
+                <w:strike w:val="false"/>
+                <w:sz w:val="22"/>
+                <w:szCs w:val="22"/>
+                <w:color w:val="000000"/>
+              </w:rPr>
+              <w:t xml:space="preserve">Sockeye</w:t>
+            </w:r>
+          </w:p>
+        </w:tc>
+        <w:tc>
+          <w:tcPr>
+            <w:tcBorders>
+              <w:bottom w:val="single" w:sz="12" w:space="0" w:color="666666"/>
+              <w:top w:val="none" w:sz="0" w:space="0" w:color="000000"/>
+              <w:left w:val="none" w:sz="0" w:space="0" w:color="000000"/>
+              <w:right w:val="none" w:sz="0" w:space="0" w:color="000000"/>
+            </w:tcBorders>
+            <w:shd w:val="clear" w:color="auto" w:fill="FFFFFF"/>
+            <w:tcMar>
+              <w:top w:w="0" w:type="dxa"/>
+              <w:bottom w:w="0" w:type="dxa"/>
+              <w:left w:w="0" w:type="dxa"/>
+              <w:right w:w="0" w:type="dxa"/>
+            </w:tcMar>
+            <w:vAlign w:val="center"/>
+          </w:tcPr>
+          <w:p>
+            <w:pPr>
+              <w:jc w:val="left"/>
+              <w:pBdr>
+                <w:bottom w:val="none" w:sz="0" w:space="0" w:color="000000"/>
+                <w:top w:val="none" w:sz="0" w:space="0" w:color="000000"/>
+                <w:left w:val="none" w:sz="0" w:space="0" w:color="000000"/>
+                <w:right w:val="none" w:sz="0" w:space="0" w:color="000000"/>
+              </w:pBdr>
+              <w:spacing w:after="100" w:before="100" w:line="240"/>
+              <w:ind w:left="100" w:right="100" w:firstLine="0" w:firstLineChars="0"/>
+              <w:rPr>
+                <w:rFonts w:ascii="Arial" w:hAnsi="Arial" w:eastAsia="Arial" w:cs="Arial"/>
+                <w:i w:val="false"/>
+                <w:b w:val="false"/>
+                <w:u w:val="none"/>
+                <w:strike w:val="false"/>
+                <w:sz w:val="22"/>
+                <w:szCs w:val="22"/>
+                <w:color w:val="000000"/>
+              </w:rPr>
+            </w:pPr>
+            <w:r xmlns:w="http://schemas.openxmlformats.org/wordprocessingml/2006/main" xmlns:wp="http://schemas.openxmlformats.org/drawingml/2006/wordprocessingDrawing" xmlns:r="http://schemas.openxmlformats.org/officeDocument/2006/relationships" xmlns:w14="http://schemas.microsoft.com/office/word/2010/wordml">
+              <w:rPr>
+                <w:rFonts w:ascii="Arial" w:hAnsi="Arial" w:eastAsia="Arial" w:cs="Arial"/>
+                <w:i w:val="false"/>
+                <w:b w:val="false"/>
+                <w:u w:val="none"/>
+                <w:strike w:val="false"/>
+                <w:sz w:val="22"/>
+                <w:szCs w:val="22"/>
+                <w:color w:val="000000"/>
+              </w:rPr>
+              <w:t xml:space="preserve">TAKLA/TREMBLEUR-EARLY STUART TIMING</w:t>
+            </w:r>
+          </w:p>
+        </w:tc>
+      </w:tr>
+    </w:tbl>
     <w:p>
       <w:pPr>
         <w:pStyle w:val="BodyText"/>
       </w:pPr>
       <w:r>
-        <w:t xml:space="preserve">IUCN 10.1 Geological events</w:t>
+        <w:br/>
       </w:r>
     </w:p>
     <w:p>
@@ -20970,7 +21851,523 @@
         <w:pStyle w:val="BodyText"/>
       </w:pPr>
       <w:r>
-        <w:t xml:space="preserve">• Big bar slide</w:t>
+        <w:t xml:space="preserve">“</w:t>
+      </w:r>
+      <w:r>
+        <w:t xml:space="preserve">10.1 Geological events</w:t>
+      </w:r>
+      <w:r>
+        <w:t xml:space="preserve">”</w:t>
+      </w:r>
+      <w:r>
+        <w:t xml:space="preserve"> </w:t>
+      </w:r>
+      <w:r>
+        <w:t xml:space="preserve">is not a large category to be assigned to appropriate legislation (Figure</w:t>
+      </w:r>
+      <w:r>
+        <w:t xml:space="preserve"> </w:t>
+      </w:r>
+      <w:r>
+        <w:t xml:space="preserve">6</w:t>
+      </w:r>
+      <w:r>
+        <w:t xml:space="preserve">. Aside from landscape-scale changes due to actions like forestry or mining, much of the nature of this category might not be viewed as human-caused or managed. Subsequently, this threat has a small proportion of keywords that match the relevant legislation. The</w:t>
+      </w:r>
+      <w:r>
+        <w:t xml:space="preserve"> </w:t>
+      </w:r>
+      <w:r>
+        <w:t xml:space="preserve">“</w:t>
+      </w:r>
+      <w:r>
+        <w:t xml:space="preserve">Designation</w:t>
+      </w:r>
+      <w:r>
+        <w:t xml:space="preserve">”</w:t>
+      </w:r>
+      <w:r>
+        <w:t xml:space="preserve"> </w:t>
+      </w:r>
+      <w:r>
+        <w:t xml:space="preserve">clause type category matched the largest proportion of clauses that also match</w:t>
+      </w:r>
+      <w:r>
+        <w:t xml:space="preserve"> </w:t>
+      </w:r>
+      <w:r>
+        <w:t xml:space="preserve">“</w:t>
+      </w:r>
+      <w:r>
+        <w:t xml:space="preserve">10.1 Geological Events.</w:t>
+      </w:r>
+      <w:r>
+        <w:t xml:space="preserve">”</w:t>
+      </w:r>
+      <w:r>
+        <w:t xml:space="preserve"> </w:t>
+      </w:r>
+      <w:r>
+        <w:t xml:space="preserve">This is largely due to the designation of avalanche and landslide areas.</w:t>
+      </w:r>
+      <w:r>
+        <w:t xml:space="preserve"> </w:t>
+      </w:r>
+      <w:r>
+        <w:t xml:space="preserve">“</w:t>
+      </w:r>
+      <w:r>
+        <w:t xml:space="preserve">Instruction</w:t>
+      </w:r>
+      <w:r>
+        <w:t xml:space="preserve">”</w:t>
+      </w:r>
+      <w:r>
+        <w:t xml:space="preserve"> </w:t>
+      </w:r>
+      <w:r>
+        <w:t xml:space="preserve">also had a large proportion of clause type matches due to the nature of forestry legislation and the prevalence of forestry actions to result in landslides.</w:t>
+      </w:r>
+      <w:r>
+        <w:t xml:space="preserve"> </w:t>
+      </w:r>
+      <w:r>
+        <w:t xml:space="preserve">“</w:t>
+      </w:r>
+      <w:r>
+        <w:t xml:space="preserve">Prohibition, Restriction, or Limitation</w:t>
+      </w:r>
+      <w:r>
+        <w:t xml:space="preserve">”</w:t>
+      </w:r>
+      <w:r>
+        <w:t xml:space="preserve"> </w:t>
+      </w:r>
+      <w:r>
+        <w:t xml:space="preserve">clause types matched the fewest clauses.</w:t>
+      </w:r>
+    </w:p>
+    <w:p>
+      <w:pPr>
+        <w:pStyle w:val="CaptionedFigure"/>
+      </w:pPr>
+      <w:r>
+        <w:drawing>
+          <wp:inline>
+            <wp:extent cx="5943600" cy="4245428"/>
+            <wp:effectExtent b="0" l="0" r="0" t="0"/>
+            <wp:docPr descr="Figure 10: Section counts by clause type for IUCN threat category 10.1 Geological Events." title="" id="77" name="Picture"/>
+            <a:graphic>
+              <a:graphicData uri="http://schemas.openxmlformats.org/drawingml/2006/picture">
+                <pic:pic>
+                  <pic:nvPicPr>
+                    <pic:cNvPr descr="LAPSE_primary_publication_files/figure-docx/fig-clause-type-geological-events-1.png" id="78" name="Picture"/>
+                    <pic:cNvPicPr>
+                      <a:picLocks noChangeArrowheads="1" noChangeAspect="1"/>
+                    </pic:cNvPicPr>
+                  </pic:nvPicPr>
+                  <pic:blipFill>
+                    <a:blip r:embed="rId76"/>
+                    <a:stretch>
+                      <a:fillRect/>
+                    </a:stretch>
+                  </pic:blipFill>
+                  <pic:spPr bwMode="auto">
+                    <a:xfrm>
+                      <a:off x="0" y="0"/>
+                      <a:ext cx="5943600" cy="4245428"/>
+                    </a:xfrm>
+                    <a:prstGeom prst="rect">
+                      <a:avLst/>
+                    </a:prstGeom>
+                    <a:noFill/>
+                    <a:ln w="9525">
+                      <a:noFill/>
+                      <a:headEnd/>
+                      <a:tailEnd/>
+                    </a:ln>
+                  </pic:spPr>
+                </pic:pic>
+              </a:graphicData>
+            </a:graphic>
+          </wp:inline>
+        </w:drawing>
+      </w:r>
+    </w:p>
+    <w:p>
+      <w:pPr>
+        <w:pStyle w:val="ImageCaption"/>
+      </w:pPr>
+      <w:bookmarkStart w:id="79" w:name="fig:fig-clause-type-geological-events"/>
+      <w:bookmarkEnd w:id="79"/>
+      <w:r>
+        <w:t xml:space="preserve">Figure 10: Section counts by clause type for IUCN threat category 10.1 Geological Events.</w:t>
+      </w:r>
+    </w:p>
+    <w:p>
+      <w:pPr>
+        <w:numPr>
+          <w:ilvl w:val="0"/>
+          <w:numId w:val="1004"/>
+        </w:numPr>
+      </w:pPr>
+      <w:r>
+        <w:rPr>
+          <w:b/>
+          <w:bCs/>
+        </w:rPr>
+        <w:t xml:space="preserve">Add more description of Big Bar slide</w:t>
+      </w:r>
+    </w:p>
+    <w:p>
+      <w:pPr>
+        <w:numPr>
+          <w:ilvl w:val="0"/>
+          <w:numId w:val="1004"/>
+        </w:numPr>
+      </w:pPr>
+      <w:r>
+        <w:rPr>
+          <w:b/>
+          <w:bCs/>
+        </w:rPr>
+        <w:t xml:space="preserve">Comment on the most relevant legislation and why</w:t>
+      </w:r>
+    </w:p>
+    <w:bookmarkEnd w:id="80"/>
+    <w:bookmarkStart w:id="86" w:name="X0845d6834917053ec444eadf52e64b0021c48a3"/>
+    <w:p>
+      <w:pPr>
+        <w:pStyle w:val="Heading2"/>
+      </w:pPr>
+      <w:r>
+        <w:t xml:space="preserve">Case Study: IUCN 7.2 Dams &amp; Water Management / Use</w:t>
+      </w:r>
+    </w:p>
+    <w:p>
+      <w:pPr>
+        <w:pStyle w:val="FirstParagraph"/>
+      </w:pPr>
+      <w:r>
+        <w:t xml:space="preserve">One IUCN threat was assessed as</w:t>
+      </w:r>
+      <w:r>
+        <w:t xml:space="preserve"> </w:t>
+      </w:r>
+      <w:r>
+        <w:t xml:space="preserve">“</w:t>
+      </w:r>
+      <w:r>
+        <w:t xml:space="preserve">Extreme-High</w:t>
+      </w:r>
+      <w:r>
+        <w:t xml:space="preserve">”</w:t>
+      </w:r>
+      <w:r>
+        <w:t xml:space="preserve"> </w:t>
+      </w:r>
+      <w:r>
+        <w:t xml:space="preserve">through COSEWIC Recovery Potential Assessment processes, which was</w:t>
+      </w:r>
+      <w:r>
+        <w:t xml:space="preserve"> </w:t>
+      </w:r>
+      <w:r>
+        <w:t xml:space="preserve">“</w:t>
+      </w:r>
+      <w:r>
+        <w:t xml:space="preserve">7.2 Dams &amp; Water Management / Use</w:t>
+      </w:r>
+      <w:r>
+        <w:t xml:space="preserve">”</w:t>
+      </w:r>
+      <w:r>
+        <w:t xml:space="preserve"> </w:t>
+      </w:r>
+      <w:r>
+        <w:t xml:space="preserve">(DFO 2020)</w:t>
+      </w:r>
+      <w:r>
+        <w:t xml:space="preserve">. Water extraction, including groundwater, for irrigation and domestic purposes is listed as the most significant concern</w:t>
+      </w:r>
+      <w:r>
+        <w:t xml:space="preserve"> </w:t>
+      </w:r>
+      <w:r>
+        <w:t xml:space="preserve">(DFO 2020)</w:t>
+      </w:r>
+      <w:r>
+        <w:t xml:space="preserve">. This threat was assigned to one Chinook conservation unit in the Fraser Interior area (Table</w:t>
+      </w:r>
+      <w:r>
+        <w:t xml:space="preserve"> </w:t>
+      </w:r>
+      <w:r>
+        <w:t xml:space="preserve">7</w:t>
+      </w:r>
+      <w:r>
+        <w:t xml:space="preserve">).</w:t>
+      </w:r>
+    </w:p>
+    <w:p>
+      <w:pPr>
+        <w:pStyle w:val="TableCaption"/>
+      </w:pPr>
+      <w:bookmarkStart w:id="81" w:name="tab:cu-extreme-high-threat-table"/>
+      <w:bookmarkEnd w:id="81"/>
+      <w:r>
+        <w:t xml:space="preserve">Table 7:</w:t>
+      </w:r>
+      <w:r>
+        <w:t xml:space="preserve"> </w:t>
+      </w:r>
+      <w:r>
+        <w:t xml:space="preserve">Conservation Units with Extreme-High RPA threat ranking.</w:t>
+      </w:r>
+    </w:p>
+    <w:tbl xmlns:w="http://schemas.openxmlformats.org/wordprocessingml/2006/main" xmlns:r="http://schemas.openxmlformats.org/officeDocument/2006/relationships" xmlns:w14="http://schemas.microsoft.com/office/word/2010/wordml" xmlns:wp="http://schemas.openxmlformats.org/drawingml/2006/wordprocessingDrawing" xmlns:a="http://schemas.openxmlformats.org/drawingml/2006/main" xmlns:pic="http://schemas.openxmlformats.org/drawingml/2006/picture">
+      <w:tblPr>
+        <w:tblLayout w:type="autofit"/>
+        <w:jc w:val="center"/>
+        <w:tblW w:type="pct" w:w="5000"/>
+        <w:tblLook w:firstRow="1" w:lastRow="0" w:firstColumn="0" w:lastColumn="0" w:noHBand="0" w:noVBand="1"/>
+      </w:tblPr>
+      <w:tr>
+        <w:trPr>
+          <w:trHeight w:val="360" w:hRule="auto"/>
+          <w:tblHeader/>
+        </w:trPr>
+        header1
+        <w:tc>
+          <w:tcPr>
+            <w:tcBorders>
+              <w:bottom w:val="single" w:sz="12" w:space="0" w:color="666666"/>
+              <w:top w:val="single" w:sz="12" w:space="0" w:color="666666"/>
+              <w:left w:val="none" w:sz="0" w:space="0" w:color="000000"/>
+              <w:right w:val="none" w:sz="0" w:space="0" w:color="000000"/>
+            </w:tcBorders>
+            <w:shd w:val="clear" w:color="auto" w:fill="FFFFFF"/>
+            <w:tcMar>
+              <w:top w:w="0" w:type="dxa"/>
+              <w:bottom w:w="0" w:type="dxa"/>
+              <w:left w:w="0" w:type="dxa"/>
+              <w:right w:w="0" w:type="dxa"/>
+            </w:tcMar>
+            <w:vAlign w:val="center"/>
+          </w:tcPr>
+          <w:p>
+            <w:pPr>
+              <w:jc w:val="left"/>
+              <w:pBdr>
+                <w:bottom w:val="none" w:sz="0" w:space="0" w:color="000000"/>
+                <w:top w:val="none" w:sz="0" w:space="0" w:color="000000"/>
+                <w:left w:val="none" w:sz="0" w:space="0" w:color="000000"/>
+                <w:right w:val="none" w:sz="0" w:space="0" w:color="000000"/>
+              </w:pBdr>
+              <w:spacing w:after="100" w:before="100" w:line="240"/>
+              <w:ind w:left="100" w:right="100" w:firstLine="0" w:firstLineChars="0"/>
+              <w:rPr>
+                <w:rFonts w:ascii="Arial" w:hAnsi="Arial" w:eastAsia="Arial" w:cs="Arial"/>
+                <w:i w:val="false"/>
+                <w:b w:val="true"/>
+                <w:u w:val="none"/>
+                <w:strike w:val="false"/>
+                <w:sz w:val="22"/>
+                <w:szCs w:val="22"/>
+                <w:color w:val="000000"/>
+              </w:rPr>
+            </w:pPr>
+            <w:r xmlns:w="http://schemas.openxmlformats.org/wordprocessingml/2006/main" xmlns:wp="http://schemas.openxmlformats.org/drawingml/2006/wordprocessingDrawing" xmlns:r="http://schemas.openxmlformats.org/officeDocument/2006/relationships" xmlns:w14="http://schemas.microsoft.com/office/word/2010/wordml">
+              <w:rPr>
+                <w:rFonts w:ascii="Arial" w:hAnsi="Arial" w:eastAsia="Arial" w:cs="Arial"/>
+                <w:i w:val="false"/>
+                <w:b w:val="true"/>
+                <w:u w:val="none"/>
+                <w:strike w:val="false"/>
+                <w:sz w:val="22"/>
+                <w:szCs w:val="22"/>
+                <w:color w:val="000000"/>
+              </w:rPr>
+              <w:t xml:space="preserve">Species</w:t>
+            </w:r>
+          </w:p>
+        </w:tc>
+        <w:tc>
+          <w:tcPr>
+            <w:tcBorders>
+              <w:bottom w:val="single" w:sz="12" w:space="0" w:color="666666"/>
+              <w:top w:val="single" w:sz="12" w:space="0" w:color="666666"/>
+              <w:left w:val="none" w:sz="0" w:space="0" w:color="000000"/>
+              <w:right w:val="none" w:sz="0" w:space="0" w:color="000000"/>
+            </w:tcBorders>
+            <w:shd w:val="clear" w:color="auto" w:fill="FFFFFF"/>
+            <w:tcMar>
+              <w:top w:w="0" w:type="dxa"/>
+              <w:bottom w:w="0" w:type="dxa"/>
+              <w:left w:w="0" w:type="dxa"/>
+              <w:right w:w="0" w:type="dxa"/>
+            </w:tcMar>
+            <w:vAlign w:val="center"/>
+          </w:tcPr>
+          <w:p>
+            <w:pPr>
+              <w:jc w:val="left"/>
+              <w:pBdr>
+                <w:bottom w:val="none" w:sz="0" w:space="0" w:color="000000"/>
+                <w:top w:val="none" w:sz="0" w:space="0" w:color="000000"/>
+                <w:left w:val="none" w:sz="0" w:space="0" w:color="000000"/>
+                <w:right w:val="none" w:sz="0" w:space="0" w:color="000000"/>
+              </w:pBdr>
+              <w:spacing w:after="100" w:before="100" w:line="240"/>
+              <w:ind w:left="100" w:right="100" w:firstLine="0" w:firstLineChars="0"/>
+              <w:rPr>
+                <w:rFonts w:ascii="Arial" w:hAnsi="Arial" w:eastAsia="Arial" w:cs="Arial"/>
+                <w:i w:val="false"/>
+                <w:b w:val="true"/>
+                <w:u w:val="none"/>
+                <w:strike w:val="false"/>
+                <w:sz w:val="22"/>
+                <w:szCs w:val="22"/>
+                <w:color w:val="000000"/>
+              </w:rPr>
+            </w:pPr>
+            <w:r xmlns:w="http://schemas.openxmlformats.org/wordprocessingml/2006/main" xmlns:wp="http://schemas.openxmlformats.org/drawingml/2006/wordprocessingDrawing" xmlns:r="http://schemas.openxmlformats.org/officeDocument/2006/relationships" xmlns:w14="http://schemas.microsoft.com/office/word/2010/wordml">
+              <w:rPr>
+                <w:rFonts w:ascii="Arial" w:hAnsi="Arial" w:eastAsia="Arial" w:cs="Arial"/>
+                <w:i w:val="false"/>
+                <w:b w:val="true"/>
+                <w:u w:val="none"/>
+                <w:strike w:val="false"/>
+                <w:sz w:val="22"/>
+                <w:szCs w:val="22"/>
+                <w:color w:val="000000"/>
+              </w:rPr>
+              <w:t xml:space="preserve">Conservation Unit</w:t>
+            </w:r>
+          </w:p>
+        </w:tc>
+      </w:tr>
+      <w:tr>
+        <w:trPr>
+          <w:trHeight w:val="360" w:hRule="auto"/>
+        </w:trPr>
+        body1
+        <w:tc>
+          <w:tcPr>
+            <w:tcBorders>
+              <w:bottom w:val="single" w:sz="12" w:space="0" w:color="666666"/>
+              <w:top w:val="single" w:sz="12" w:space="0" w:color="666666"/>
+              <w:left w:val="none" w:sz="0" w:space="0" w:color="000000"/>
+              <w:right w:val="none" w:sz="0" w:space="0" w:color="000000"/>
+            </w:tcBorders>
+            <w:shd w:val="clear" w:color="auto" w:fill="FFFFFF"/>
+            <w:tcMar>
+              <w:top w:w="0" w:type="dxa"/>
+              <w:bottom w:w="0" w:type="dxa"/>
+              <w:left w:w="0" w:type="dxa"/>
+              <w:right w:w="0" w:type="dxa"/>
+            </w:tcMar>
+            <w:vAlign w:val="center"/>
+          </w:tcPr>
+          <w:p>
+            <w:pPr>
+              <w:jc w:val="left"/>
+              <w:pBdr>
+                <w:bottom w:val="none" w:sz="0" w:space="0" w:color="000000"/>
+                <w:top w:val="none" w:sz="0" w:space="0" w:color="000000"/>
+                <w:left w:val="none" w:sz="0" w:space="0" w:color="000000"/>
+                <w:right w:val="none" w:sz="0" w:space="0" w:color="000000"/>
+              </w:pBdr>
+              <w:spacing w:after="100" w:before="100" w:line="240"/>
+              <w:ind w:left="100" w:right="100" w:firstLine="0" w:firstLineChars="0"/>
+              <w:rPr>
+                <w:rFonts w:ascii="Arial" w:hAnsi="Arial" w:eastAsia="Arial" w:cs="Arial"/>
+                <w:i w:val="false"/>
+                <w:b w:val="false"/>
+                <w:u w:val="none"/>
+                <w:strike w:val="false"/>
+                <w:sz w:val="22"/>
+                <w:szCs w:val="22"/>
+                <w:color w:val="000000"/>
+              </w:rPr>
+            </w:pPr>
+            <w:r xmlns:w="http://schemas.openxmlformats.org/wordprocessingml/2006/main" xmlns:wp="http://schemas.openxmlformats.org/drawingml/2006/wordprocessingDrawing" xmlns:r="http://schemas.openxmlformats.org/officeDocument/2006/relationships" xmlns:w14="http://schemas.microsoft.com/office/word/2010/wordml">
+              <w:rPr>
+                <w:rFonts w:ascii="Arial" w:hAnsi="Arial" w:eastAsia="Arial" w:cs="Arial"/>
+                <w:i w:val="false"/>
+                <w:b w:val="false"/>
+                <w:u w:val="none"/>
+                <w:strike w:val="false"/>
+                <w:sz w:val="22"/>
+                <w:szCs w:val="22"/>
+                <w:color w:val="000000"/>
+              </w:rPr>
+              <w:t xml:space="preserve">Chinook</w:t>
+            </w:r>
+          </w:p>
+        </w:tc>
+        <w:tc>
+          <w:tcPr>
+            <w:tcBorders>
+              <w:bottom w:val="single" w:sz="12" w:space="0" w:color="666666"/>
+              <w:top w:val="single" w:sz="12" w:space="0" w:color="666666"/>
+              <w:left w:val="none" w:sz="0" w:space="0" w:color="000000"/>
+              <w:right w:val="none" w:sz="0" w:space="0" w:color="000000"/>
+            </w:tcBorders>
+            <w:shd w:val="clear" w:color="auto" w:fill="FFFFFF"/>
+            <w:tcMar>
+              <w:top w:w="0" w:type="dxa"/>
+              <w:bottom w:w="0" w:type="dxa"/>
+              <w:left w:w="0" w:type="dxa"/>
+              <w:right w:w="0" w:type="dxa"/>
+            </w:tcMar>
+            <w:vAlign w:val="center"/>
+          </w:tcPr>
+          <w:p>
+            <w:pPr>
+              <w:jc w:val="left"/>
+              <w:pBdr>
+                <w:bottom w:val="none" w:sz="0" w:space="0" w:color="000000"/>
+                <w:top w:val="none" w:sz="0" w:space="0" w:color="000000"/>
+                <w:left w:val="none" w:sz="0" w:space="0" w:color="000000"/>
+                <w:right w:val="none" w:sz="0" w:space="0" w:color="000000"/>
+              </w:pBdr>
+              <w:spacing w:after="100" w:before="100" w:line="240"/>
+              <w:ind w:left="100" w:right="100" w:firstLine="0" w:firstLineChars="0"/>
+              <w:rPr>
+                <w:rFonts w:ascii="Arial" w:hAnsi="Arial" w:eastAsia="Arial" w:cs="Arial"/>
+                <w:i w:val="false"/>
+                <w:b w:val="false"/>
+                <w:u w:val="none"/>
+                <w:strike w:val="false"/>
+                <w:sz w:val="22"/>
+                <w:szCs w:val="22"/>
+                <w:color w:val="000000"/>
+              </w:rPr>
+            </w:pPr>
+            <w:r xmlns:w="http://schemas.openxmlformats.org/wordprocessingml/2006/main" xmlns:wp="http://schemas.openxmlformats.org/drawingml/2006/wordprocessingDrawing" xmlns:r="http://schemas.openxmlformats.org/officeDocument/2006/relationships" xmlns:w14="http://schemas.microsoft.com/office/word/2010/wordml">
+              <w:rPr>
+                <w:rFonts w:ascii="Arial" w:hAnsi="Arial" w:eastAsia="Arial" w:cs="Arial"/>
+                <w:i w:val="false"/>
+                <w:b w:val="false"/>
+                <w:u w:val="none"/>
+                <w:strike w:val="false"/>
+                <w:sz w:val="22"/>
+                <w:szCs w:val="22"/>
+                <w:color w:val="000000"/>
+              </w:rPr>
+              <w:t xml:space="preserve">SOUTH THOMPSON-BESSETTE CREEK_SU_1.2</w:t>
+            </w:r>
+          </w:p>
+        </w:tc>
+      </w:tr>
+    </w:tbl>
+    <w:p>
+      <w:pPr>
+        <w:pStyle w:val="BodyText"/>
+      </w:pPr>
+      <w:r>
+        <w:br/>
       </w:r>
     </w:p>
     <w:p>
@@ -20978,7 +22375,28 @@
         <w:pStyle w:val="BodyText"/>
       </w:pPr>
       <w:r>
-        <w:t xml:space="preserve">• The most relevant legislation and why</w:t>
+        <w:t xml:space="preserve">“</w:t>
+      </w:r>
+      <w:r>
+        <w:t xml:space="preserve">7.2 Dams and Water Management / Use</w:t>
+      </w:r>
+      <w:r>
+        <w:t xml:space="preserve">”</w:t>
+      </w:r>
+      <w:r>
+        <w:t xml:space="preserve"> </w:t>
+      </w:r>
+      <w:r>
+        <w:t xml:space="preserve">is one of the largest categories matched with appropriate legislation (Figure</w:t>
+      </w:r>
+      <w:r>
+        <w:t xml:space="preserve"> </w:t>
+      </w:r>
+      <w:r>
+        <w:t xml:space="preserve">6</w:t>
+      </w:r>
+      <w:r>
+        <w:t xml:space="preserve">). Aside from pollution and fisheries, watercourse alterations are recognized as one of the top human activities that require regulation. This threat also has a large proportion of keywords that match the relevant legislation.</w:t>
       </w:r>
     </w:p>
     <w:p>
@@ -20986,7 +22404,215 @@
         <w:pStyle w:val="BodyText"/>
       </w:pPr>
       <w:r>
-        <w:t xml:space="preserve">• A summary of clause types</w:t>
+        <w:t xml:space="preserve">The clause type matches for Dams and Water Management / Use was much more evenly distributed likely due to the large number of clause matches in total for that IUCN threat category.</w:t>
+      </w:r>
+      <w:r>
+        <w:t xml:space="preserve"> </w:t>
+      </w:r>
+      <w:r>
+        <w:t xml:space="preserve">“</w:t>
+      </w:r>
+      <w:r>
+        <w:t xml:space="preserve">Interpretation &amp; Purpose</w:t>
+      </w:r>
+      <w:r>
+        <w:t xml:space="preserve">”</w:t>
+      </w:r>
+      <w:r>
+        <w:t xml:space="preserve"> </w:t>
+      </w:r>
+      <w:r>
+        <w:t xml:space="preserve">matched the most clauses (includes Definition sections), while</w:t>
+      </w:r>
+      <w:r>
+        <w:t xml:space="preserve"> </w:t>
+      </w:r>
+      <w:r>
+        <w:t xml:space="preserve">“</w:t>
+      </w:r>
+      <w:r>
+        <w:t xml:space="preserve">Administration, Application, &amp; Structure</w:t>
+      </w:r>
+      <w:r>
+        <w:t xml:space="preserve">”</w:t>
+      </w:r>
+      <w:r>
+        <w:t xml:space="preserve"> </w:t>
+      </w:r>
+      <w:r>
+        <w:t xml:space="preserve">matched the fewest clauses followed by</w:t>
+      </w:r>
+      <w:r>
+        <w:t xml:space="preserve"> </w:t>
+      </w:r>
+      <w:r>
+        <w:t xml:space="preserve">“</w:t>
+      </w:r>
+      <w:r>
+        <w:t xml:space="preserve">Prohibition, Restriction, or Limitation.</w:t>
+      </w:r>
+      <w:r>
+        <w:t xml:space="preserve">”</w:t>
+      </w:r>
+    </w:p>
+    <w:p>
+      <w:pPr>
+        <w:pStyle w:val="CaptionedFigure"/>
+      </w:pPr>
+      <w:r>
+        <w:drawing>
+          <wp:inline>
+            <wp:extent cx="5943600" cy="4245428"/>
+            <wp:effectExtent b="0" l="0" r="0" t="0"/>
+            <wp:docPr descr="Figure 11: Section counts by clause type for IUCN threat category 7.2 Dams &amp; Water Management / Use." title="" id="83" name="Picture"/>
+            <a:graphic>
+              <a:graphicData uri="http://schemas.openxmlformats.org/drawingml/2006/picture">
+                <pic:pic>
+                  <pic:nvPicPr>
+                    <pic:cNvPr descr="LAPSE_primary_publication_files/figure-docx/fig-clause-type-water-use-1.png" id="84" name="Picture"/>
+                    <pic:cNvPicPr>
+                      <a:picLocks noChangeArrowheads="1" noChangeAspect="1"/>
+                    </pic:cNvPicPr>
+                  </pic:nvPicPr>
+                  <pic:blipFill>
+                    <a:blip r:embed="rId82"/>
+                    <a:stretch>
+                      <a:fillRect/>
+                    </a:stretch>
+                  </pic:blipFill>
+                  <pic:spPr bwMode="auto">
+                    <a:xfrm>
+                      <a:off x="0" y="0"/>
+                      <a:ext cx="5943600" cy="4245428"/>
+                    </a:xfrm>
+                    <a:prstGeom prst="rect">
+                      <a:avLst/>
+                    </a:prstGeom>
+                    <a:noFill/>
+                    <a:ln w="9525">
+                      <a:noFill/>
+                      <a:headEnd/>
+                      <a:tailEnd/>
+                    </a:ln>
+                  </pic:spPr>
+                </pic:pic>
+              </a:graphicData>
+            </a:graphic>
+          </wp:inline>
+        </w:drawing>
+      </w:r>
+    </w:p>
+    <w:p>
+      <w:pPr>
+        <w:pStyle w:val="ImageCaption"/>
+      </w:pPr>
+      <w:bookmarkStart w:id="85" w:name="fig:fig-clause-type-water-use"/>
+      <w:bookmarkEnd w:id="85"/>
+      <w:r>
+        <w:t xml:space="preserve">Figure 11: Section counts by clause type for IUCN threat category 7.2 Dams &amp; Water Management / Use.</w:t>
+      </w:r>
+    </w:p>
+    <w:p>
+      <w:pPr>
+        <w:numPr>
+          <w:ilvl w:val="0"/>
+          <w:numId w:val="1005"/>
+        </w:numPr>
+      </w:pPr>
+      <w:r>
+        <w:rPr>
+          <w:b/>
+          <w:bCs/>
+        </w:rPr>
+        <w:t xml:space="preserve">add more description of Bessette Creek</w:t>
+      </w:r>
+    </w:p>
+    <w:p>
+      <w:pPr>
+        <w:numPr>
+          <w:ilvl w:val="0"/>
+          <w:numId w:val="1005"/>
+        </w:numPr>
+      </w:pPr>
+      <w:r>
+        <w:rPr>
+          <w:b/>
+          <w:bCs/>
+        </w:rPr>
+        <w:t xml:space="preserve">Comment on the most relevant legislation and why</w:t>
+      </w:r>
+    </w:p>
+    <w:bookmarkEnd w:id="86"/>
+    <w:bookmarkEnd w:id="87"/>
+    <w:bookmarkStart w:id="88" w:name="co-occurrence-of-management-domains"/>
+    <w:p>
+      <w:pPr>
+        <w:pStyle w:val="Heading1"/>
+      </w:pPr>
+      <w:r>
+        <w:t xml:space="preserve">Co-occurrence of management domains</w:t>
+      </w:r>
+    </w:p>
+    <w:p>
+      <w:pPr>
+        <w:pStyle w:val="FirstParagraph"/>
+      </w:pPr>
+      <w:r>
+        <w:t xml:space="preserve">Management domains can overlap within sections and clauses. For example the provincial Land-based Finfish Waste Control Regulation (Environmental Management Act) states in Section 2 that:</w:t>
+      </w:r>
+      <w:r>
+        <w:t xml:space="preserve"> </w:t>
+      </w:r>
+      <w:r>
+        <w:t xml:space="preserve">“</w:t>
+      </w:r>
+      <w:r>
+        <w:t xml:space="preserve">The owner of a land-based finfish facility is exempt from section 6 (2) and (3) of the Environmental Management Act with respect to the discharge of wastes from the land-based finfish facility if the owner…</w:t>
+      </w:r>
+      <w:r>
+        <w:t xml:space="preserve">”</w:t>
+      </w:r>
+      <w:r>
+        <w:t xml:space="preserve"> </w:t>
+      </w:r>
+      <w:r>
+        <w:t xml:space="preserve">This clause matched appropriately with both the</w:t>
+      </w:r>
+      <w:r>
+        <w:t xml:space="preserve"> </w:t>
+      </w:r>
+      <w:r>
+        <w:t xml:space="preserve">“</w:t>
+      </w:r>
+      <w:r>
+        <w:t xml:space="preserve">Aquaculture and Hatcheries</w:t>
+      </w:r>
+      <w:r>
+        <w:t xml:space="preserve">”</w:t>
+      </w:r>
+      <w:r>
+        <w:t xml:space="preserve"> </w:t>
+      </w:r>
+      <w:r>
+        <w:t xml:space="preserve">and</w:t>
+      </w:r>
+      <w:r>
+        <w:t xml:space="preserve"> </w:t>
+      </w:r>
+      <w:r>
+        <w:t xml:space="preserve">“</w:t>
+      </w:r>
+      <w:r>
+        <w:t xml:space="preserve">Pollution</w:t>
+      </w:r>
+      <w:r>
+        <w:t xml:space="preserve">”</w:t>
+      </w:r>
+      <w:r>
+        <w:t xml:space="preserve"> </w:t>
+      </w:r>
+      <w:r>
+        <w:t xml:space="preserve">management domains. Because the matching process allows for multiple keywords to be matched per clause, this method allows for an assessment of co-occurrences and connections between management domains.</w:t>
       </w:r>
     </w:p>
     <w:p>
@@ -20994,7 +22620,7 @@
         <w:pStyle w:val="BodyText"/>
       </w:pPr>
       <w:r>
-        <w:t xml:space="preserve">One IUCN threat was assessed as</w:t>
+        <w:t xml:space="preserve">The LAPSE keyword matching process allows that multiple management domains (and IUCN threats) can be matched to clauses and sections. This dynamic is not a flaw, but rather a way of showing the complexities of legal language as related to salmon management. For example, Section 7 of the federal Aquaculture Activities Regulations (Fisheries Act) states that:</w:t>
       </w:r>
       <w:r>
         <w:t xml:space="preserve"> </w:t>
@@ -21003,7 +22629,7 @@
         <w:t xml:space="preserve">“</w:t>
       </w:r>
       <w:r>
-        <w:t xml:space="preserve">Extreme</w:t>
+        <w:t xml:space="preserve">The owner or the operator of the aquaculture facility must, in depositing a deleterious substance referred to in paragraph 2(a) or (b), take reasonable measures to minimize detriment to fish and fish habitat outside the facility…</w:t>
       </w:r>
       <w:r>
         <w:t xml:space="preserve">”</w:t>
@@ -21012,46 +22638,7 @@
         <w:t xml:space="preserve"> </w:t>
       </w:r>
       <w:r>
-        <w:t xml:space="preserve">through COSEWIC Recovery Potential Assessment processes, which was</w:t>
-      </w:r>
-      <w:r>
-        <w:t xml:space="preserve"> </w:t>
-      </w:r>
-      <w:r>
-        <w:t xml:space="preserve">“</w:t>
-      </w:r>
-      <w:r>
-        <w:t xml:space="preserve">10.1 Geological Events</w:t>
-      </w:r>
-      <w:r>
-        <w:t xml:space="preserve">”</w:t>
-      </w:r>
-      <w:r>
-        <w:t xml:space="preserve"> </w:t>
-      </w:r>
-      <w:r>
-        <w:t xml:space="preserve">(DFO 2020, 2022)</w:t>
-      </w:r>
-      <w:r>
-        <w:t xml:space="preserve">. This threat was assigned to one sockeye and three Chinook conservation units, all in the Fraser Interior area related to the</w:t>
-      </w:r>
-      <w:r>
-        <w:t xml:space="preserve"> </w:t>
-      </w:r>
-      <w:r>
-        <w:t xml:space="preserve">“</w:t>
-      </w:r>
-      <w:r>
-        <w:t xml:space="preserve">ongoing effects from Big Bar landslide</w:t>
-      </w:r>
-      <w:r>
-        <w:t xml:space="preserve">”</w:t>
-      </w:r>
-      <w:r>
-        <w:t xml:space="preserve"> </w:t>
-      </w:r>
-      <w:r>
-        <w:t xml:space="preserve">in 2018 (DFO 2020; DFO 2022):</w:t>
+        <w:t xml:space="preserve">Keywords in this clause correctly match to the Pollution, as well as, Aquaculture and Hatcheries management domains. Assigning only one management domain would over-simplify the classification in terms of salmon management as the clause clearly references both aquaculture and pollution. This section could be important for users searching either aquaculture or pollution regulations for a particular watercourse.</w:t>
       </w:r>
     </w:p>
     <w:p>
@@ -21059,7 +22646,25 @@
         <w:pStyle w:val="BodyText"/>
       </w:pPr>
       <w:r>
-        <w:t xml:space="preserve">• Chinook: CK-10, MIDDLE FRASER RIVER_SP_1.3</w:t>
+        <w:t xml:space="preserve">Domain co-occurrence within sections allows for an interesting study of how management domains overlap (Figure 11). A frequent co-occurrence among management domains doesn’t necessarily represent a relationship in reality, simply the legal framing used to regulate these aspects. The Pollution management domain and Water Use and Watercourse Modifications are in the top four most matched to sections (Figure 4), and expectedly, these domains have the largest number of co-occurrences. Both domains relate generally to the impacts from anthropogenic industrialization and commercial development, which is reflected in the legal language.</w:t>
+      </w:r>
+    </w:p>
+    <w:bookmarkEnd w:id="88"/>
+    <w:bookmarkStart w:id="89" w:name="conclusions"/>
+    <w:p>
+      <w:pPr>
+        <w:pStyle w:val="Heading1"/>
+      </w:pPr>
+      <w:r>
+        <w:t xml:space="preserve">Conclusions</w:t>
+      </w:r>
+    </w:p>
+    <w:p>
+      <w:pPr>
+        <w:pStyle w:val="FirstParagraph"/>
+      </w:pPr>
+      <w:r>
+        <w:t xml:space="preserve">Pacific salmon management projects (e.g. monitoring, restoration, enhancement, etc.) and decision processes often consider policies, methodologies, and literature, but the federal and provincial legislation that regulates human activities is not often reviewed. Legislative language can be vague and illusive, and the administrative structure of salmon jurisdiction in British Columbia is a decentralized and overlapping mosaic. The disconnect between legislative and natural resource language can lead to ineffective compliance with social values. The Legislation Applicable to Pacific Salmon and Ecosystems (LAPSE) process developed through this study attempts to bridge the language gap to equip practitioners with fuller knowledge of the legal landscape available.</w:t>
       </w:r>
     </w:p>
     <w:p>
@@ -21067,393 +22672,21 @@
         <w:pStyle w:val="BodyText"/>
       </w:pPr>
       <w:r>
-        <w:t xml:space="preserve">• Chinook: CK-11, MIDDLE FRASER RIVER_SU_1.3</w:t>
+        <w:t xml:space="preserve">The LAPSE tool provides a novel approach of linking legal language with salmon management categorization by developing management domain categories based on internationally recognized biodiversity threat categories (IUCN threats). The methods developed to identify and match salmon management keywords and keyphrases to clauses allow for multiple outputs and opportunities including: an extensive list of legislation (acts, regulations, sections, and paragraphs) relevant to a human activity or salmon management decisions; assessment of the nature or context of the statute (clause type) by management domain and threat; assessment of the overlap and connectedness in management domains (co-occurrence) to better understand the relationship between salmon threats in legislation. While this process and tool are relatively new and untested, further development could lead to a better integration of salmon management decisions and administrative responsibility.</w:t>
       </w:r>
     </w:p>
-    <w:p>
-      <w:pPr>
-        <w:pStyle w:val="BodyText"/>
-      </w:pPr>
-      <w:r>
-        <w:t xml:space="preserve">• Chinook: CK-12, UPPER FRASER RIVER_SP_1.3</w:t>
-      </w:r>
-    </w:p>
-    <w:p>
-      <w:pPr>
-        <w:pStyle w:val="BodyText"/>
-      </w:pPr>
-      <w:r>
-        <w:t xml:space="preserve">• Sockeye: SEL-06-14, TAKLA/TREMBLEUR-EARLY STUART TIMING</w:t>
-      </w:r>
-    </w:p>
-    <w:p>
-      <w:pPr>
-        <w:pStyle w:val="BodyText"/>
-      </w:pPr>
-      <w:r>
-        <w:t xml:space="preserve">“</w:t>
-      </w:r>
-      <w:r>
-        <w:t xml:space="preserve">Geological events</w:t>
-      </w:r>
-      <w:r>
-        <w:t xml:space="preserve">”</w:t>
-      </w:r>
-      <w:r>
-        <w:t xml:space="preserve"> </w:t>
-      </w:r>
-      <w:r>
-        <w:t xml:space="preserve">is not a large category to be assigned to appropriate legislation (Figure 5). Aside from landscape-scale changes due to actions like forestry or mining, much of the nature of this category might not be viewed as human-caused or managed. Subsequently, this threat has a small proportion of keywords that match the relevant legislation: The Designation clause type category matched the largest proportion of clauses that also match Geological Events (Figure 14). This is largely due to the designation of avalanche and landslide areas. Instruction also had a large proportion of clause type matches due to the nature of forestry legislation and the prevalence of forestry actions to result in landslides. Prohibition, Restriction, or Limitation clause types matched the fewest clauses.</w:t>
-      </w:r>
-    </w:p>
-    <w:p>
-      <w:pPr>
-        <w:pStyle w:val="BodyText"/>
-      </w:pPr>
-      <w:r>
-        <w:t xml:space="preserve">IUCN 7.2 Dams &amp; Water Management / Use</w:t>
-      </w:r>
-    </w:p>
-    <w:p>
-      <w:pPr>
-        <w:pStyle w:val="BodyText"/>
-      </w:pPr>
-      <w:r>
-        <w:t xml:space="preserve">• Bessette creek and irrigation/groundwater</w:t>
-      </w:r>
-    </w:p>
-    <w:p>
-      <w:pPr>
-        <w:pStyle w:val="BodyText"/>
-      </w:pPr>
-      <w:r>
-        <w:t xml:space="preserve">• The most relevant legislation and why</w:t>
-      </w:r>
-    </w:p>
-    <w:p>
-      <w:pPr>
-        <w:pStyle w:val="BodyText"/>
-      </w:pPr>
-      <w:r>
-        <w:t xml:space="preserve">• A summary of clause types</w:t>
-      </w:r>
-    </w:p>
-    <w:p>
-      <w:pPr>
-        <w:pStyle w:val="BodyText"/>
-      </w:pPr>
-      <w:r>
-        <w:t xml:space="preserve">One IUCN threat was assessed as</w:t>
-      </w:r>
-      <w:r>
-        <w:t xml:space="preserve"> </w:t>
-      </w:r>
-      <w:r>
-        <w:t xml:space="preserve">“</w:t>
-      </w:r>
-      <w:r>
-        <w:t xml:space="preserve">Extreme-High</w:t>
-      </w:r>
-      <w:r>
-        <w:t xml:space="preserve">”</w:t>
-      </w:r>
-      <w:r>
-        <w:t xml:space="preserve"> </w:t>
-      </w:r>
-      <w:r>
-        <w:t xml:space="preserve">through COSEWIC Recovery Potential Assessment processes, which was</w:t>
-      </w:r>
-      <w:r>
-        <w:t xml:space="preserve"> </w:t>
-      </w:r>
-      <w:r>
-        <w:t xml:space="preserve">“</w:t>
-      </w:r>
-      <w:r>
-        <w:t xml:space="preserve">7.2 Dams &amp; Water Management / Use</w:t>
-      </w:r>
-      <w:r>
-        <w:t xml:space="preserve">”</w:t>
-      </w:r>
-      <w:r>
-        <w:t xml:space="preserve"> </w:t>
-      </w:r>
-      <w:r>
-        <w:t xml:space="preserve">(DFO 2020)</w:t>
-      </w:r>
-      <w:r>
-        <w:t xml:space="preserve">. Water extraction, including groundwater, for irrigation and domestic purposes is listed as the most significant concern</w:t>
-      </w:r>
-      <w:r>
-        <w:t xml:space="preserve"> </w:t>
-      </w:r>
-      <w:r>
-        <w:t xml:space="preserve">(DFO 2020)</w:t>
-      </w:r>
-      <w:r>
-        <w:t xml:space="preserve">. This threat was assigned to one Chinook conservation unit in the Fraser</w:t>
-      </w:r>
-    </w:p>
-    <w:p>
-      <w:pPr>
-        <w:pStyle w:val="BodyText"/>
-      </w:pPr>
-      <w:r>
-        <w:t xml:space="preserve">Interior area:</w:t>
-      </w:r>
-    </w:p>
-    <w:p>
-      <w:pPr>
-        <w:pStyle w:val="BodyText"/>
-      </w:pPr>
-      <w:r>
-        <w:t xml:space="preserve">• Chinook: CK-16, SOUTH THOMPSON-BESSETTE CREEK_SU_1.2</w:t>
-      </w:r>
-    </w:p>
-    <w:p>
-      <w:pPr>
-        <w:pStyle w:val="BodyText"/>
-      </w:pPr>
-      <w:r>
-        <w:t xml:space="preserve">“</w:t>
-      </w:r>
-      <w:r>
-        <w:t xml:space="preserve">Dams and Water Management / Use</w:t>
-      </w:r>
-      <w:r>
-        <w:t xml:space="preserve">”</w:t>
-      </w:r>
-      <w:r>
-        <w:t xml:space="preserve"> </w:t>
-      </w:r>
-      <w:r>
-        <w:t xml:space="preserve">is one of the largest categories matched with appropriate legislation (Figure 5). Aside from pollution and fisheries, watercourse alterations are recognized as one of the top human activities that require regulation. This threat also has a large proportion of keywords that match the relevant legislation:</w:t>
-      </w:r>
-    </w:p>
-    <w:p>
-      <w:pPr>
-        <w:pStyle w:val="BodyText"/>
-      </w:pPr>
-      <w:r>
-        <w:t xml:space="preserve">The clause type matches for Dams and Water Management / Use was much more evenly distributed (Figure 16) likely due to the large number of clause matches in total for that IUCN threat category. Interpretation &amp; Purpose matched the most clauses (includes Definition sections), while Administration, Application, &amp; Structure matched the fewest clauses followed by Prohibition, Restriction, or Limitation.</w:t>
-      </w:r>
-    </w:p>
-    <w:bookmarkEnd w:id="75"/>
-    <w:bookmarkStart w:id="76" w:name="co-occurrence-of-management-domains"/>
+    <w:bookmarkEnd w:id="89"/>
+    <w:bookmarkStart w:id="131" w:name="references"/>
     <w:p>
       <w:pPr>
         <w:pStyle w:val="Heading1"/>
       </w:pPr>
       <w:r>
-        <w:t xml:space="preserve">Co-occurrence of management domains</w:t>
+        <w:t xml:space="preserve">References</w:t>
       </w:r>
     </w:p>
-    <w:p>
-      <w:pPr>
-        <w:pStyle w:val="FirstParagraph"/>
-      </w:pPr>
-      <w:r>
-        <w:t xml:space="preserve">• Multiple keywords are assigned to one clause. Example: pollution and aquaculture</w:t>
-      </w:r>
-    </w:p>
-    <w:p>
-      <w:pPr>
-        <w:pStyle w:val="BodyText"/>
-      </w:pPr>
-      <w:r>
-        <w:t xml:space="preserve">• Analyzing co-occurrence can create insights for related threats.</w:t>
-      </w:r>
-    </w:p>
-    <w:p>
-      <w:pPr>
-        <w:pStyle w:val="BodyText"/>
-      </w:pPr>
-      <w:r>
-        <w:t xml:space="preserve">Management domains can overlap within sections and clauses. For example the provincial Land-based Finfish Waste Control Regulation (Environmental Management Act) states in Section 2 that:</w:t>
-      </w:r>
-      <w:r>
-        <w:t xml:space="preserve"> </w:t>
-      </w:r>
-      <w:r>
-        <w:t xml:space="preserve">“</w:t>
-      </w:r>
-      <w:r>
-        <w:t xml:space="preserve">The owner of a land-based finfish facility is exempt from section 6 (2) and (3) of the Environmental Management Act with respect to the discharge of wastes from the land-based finfish facility if the owner…</w:t>
-      </w:r>
-      <w:r>
-        <w:t xml:space="preserve">”</w:t>
-      </w:r>
-      <w:r>
-        <w:t xml:space="preserve"> </w:t>
-      </w:r>
-      <w:r>
-        <w:t xml:space="preserve">This clause matched appropriately with both the</w:t>
-      </w:r>
-      <w:r>
-        <w:t xml:space="preserve"> </w:t>
-      </w:r>
-      <w:r>
-        <w:t xml:space="preserve">“</w:t>
-      </w:r>
-      <w:r>
-        <w:t xml:space="preserve">Aquaculture and Hatcheries</w:t>
-      </w:r>
-      <w:r>
-        <w:t xml:space="preserve">”</w:t>
-      </w:r>
-      <w:r>
-        <w:t xml:space="preserve"> </w:t>
-      </w:r>
-      <w:r>
-        <w:t xml:space="preserve">and</w:t>
-      </w:r>
-      <w:r>
-        <w:t xml:space="preserve"> </w:t>
-      </w:r>
-      <w:r>
-        <w:t xml:space="preserve">“</w:t>
-      </w:r>
-      <w:r>
-        <w:t xml:space="preserve">Pollution</w:t>
-      </w:r>
-      <w:r>
-        <w:t xml:space="preserve">”</w:t>
-      </w:r>
-      <w:r>
-        <w:t xml:space="preserve"> </w:t>
-      </w:r>
-      <w:r>
-        <w:t xml:space="preserve">management domains. Because the matching process allows for multiple keywords to be matched per clause, this method allows for an assessment of co-occurrences and connections between management domains.</w:t>
-      </w:r>
-    </w:p>
-    <w:p>
-      <w:pPr>
-        <w:pStyle w:val="BodyText"/>
-      </w:pPr>
-      <w:r>
-        <w:t xml:space="preserve">The LAPSE keyword matching process allows that multiple management domains (and IUCN threats) can be matched to clauses and sections. This dynamic is not a flaw, but rather a way of showing the complexities of legal language as related to salmon management. For example, Section 7 of the federal Aquaculture Activities Regulations (Fisheries Act) states that:</w:t>
-      </w:r>
-      <w:r>
-        <w:t xml:space="preserve"> </w:t>
-      </w:r>
-      <w:r>
-        <w:t xml:space="preserve">“</w:t>
-      </w:r>
-      <w:r>
-        <w:t xml:space="preserve">The owner or the operator of the aquaculture facility must, in depositing a deleterious substance referred to in paragraph 2(a) or (b), take reasonable measures to minimize detriment to fish and fish habitat outside the facility…</w:t>
-      </w:r>
-      <w:r>
-        <w:t xml:space="preserve">”</w:t>
-      </w:r>
-      <w:r>
-        <w:t xml:space="preserve"> </w:t>
-      </w:r>
-      <w:r>
-        <w:t xml:space="preserve">Keywords in this clause correctly match to the Pollution, as well as, Aquaculture and Hatcheries management domains. Assigning only one management domain would over-simplify the classification in terms of salmon management as the clause clearly references both aquaculture and pollution. This section could be important for users searching either aquaculture or pollution regulations for a particular watercourse.</w:t>
-      </w:r>
-    </w:p>
-    <w:p>
-      <w:pPr>
-        <w:pStyle w:val="BodyText"/>
-      </w:pPr>
-      <w:r>
-        <w:t xml:space="preserve">Domain co-occurrence within sections allows for an interesting study of how management domains overlap (Figure 11). A frequent co-occurrence among management domains doesn’t necessarily represent a relationship in reality, simply the legal framing used to regulate these aspects. The Pollution management domain and Water Use and Watercourse Modifications are in the top four most matched to sections (Figure 4), and expectedly, these domains have the largest number of co-occurrences. Both domains relate generally to the impacts from anthropogenic industrialization and commercial development, which is reflected in the legal language.</w:t>
-      </w:r>
-    </w:p>
-    <w:bookmarkEnd w:id="76"/>
-    <w:bookmarkStart w:id="77" w:name="conclusions"/>
-    <w:p>
-      <w:pPr>
-        <w:pStyle w:val="Heading1"/>
-      </w:pPr>
-      <w:r>
-        <w:t xml:space="preserve">Conclusions</w:t>
-      </w:r>
-    </w:p>
-    <w:p>
-      <w:pPr>
-        <w:pStyle w:val="FirstParagraph"/>
-      </w:pPr>
-      <w:r>
-        <w:t xml:space="preserve">• The LAPSE framework can be a useful way for practitioners to query relevant legislation for salmon management topics.</w:t>
-      </w:r>
-    </w:p>
-    <w:p>
-      <w:pPr>
-        <w:pStyle w:val="BodyText"/>
-      </w:pPr>
-      <w:r>
-        <w:t xml:space="preserve">• Users can use keywords to search legislation already using CanLii, but using management domains and IUCN threats, we are able to link clauses to more specific salmon biological aspects</w:t>
-      </w:r>
-    </w:p>
-    <w:p>
-      <w:pPr>
-        <w:pStyle w:val="BodyText"/>
-      </w:pPr>
-      <w:r>
-        <w:t xml:space="preserve">• Not only does the process link legislation to specific salmon concerns, but this process is also linked to real-world salmon management through the WSP CU and RPA processes, which incorporates threat rankings by CU.</w:t>
-      </w:r>
-    </w:p>
-    <w:p>
-      <w:pPr>
-        <w:pStyle w:val="BodyText"/>
-      </w:pPr>
-      <w:r>
-        <w:t xml:space="preserve">Pacific salmon management projects (e.g. monitoring, restoration, enhancement, etc.) and decision processes often consider policies, methodologies, and literature, but the federal and provincial legislation that regulates human activities is not often reviewed. Legislative language can be vague and illusive, and the administrative structure of salmon jurisdiction in British Columbia is a decentralized and overlapping mosaic. The disconnect between legislative and natural resource language can lead to ineffective compliance with social values. The Legislation Applicable to Pacific Salmon and Ecosystems (LAPSE) process developed through this study attempts to bridge the language gap to equip practitioners with fuller knowledge of the legal landscape available.</w:t>
-      </w:r>
-    </w:p>
-    <w:p>
-      <w:pPr>
-        <w:pStyle w:val="BodyText"/>
-      </w:pPr>
-      <w:r>
-        <w:t xml:space="preserve">The LAPSE tool provides a novel approach of linking legal language with salmon management categorization by developing management domain categories based on internationally recognized biodiversity threat categories (IUCN threats). The methods developed to identify and match salmon management keywords and keyphrases to clauses allow for multiple outputs and opportunities including:</w:t>
-      </w:r>
-    </w:p>
-    <w:p>
-      <w:pPr>
-        <w:pStyle w:val="BodyText"/>
-      </w:pPr>
-      <w:r>
-        <w:t xml:space="preserve">• An extensive list of legislation (acts, regulations, sections, and paragraphs) relevant to a human activity or salmon management decisions</w:t>
-      </w:r>
-    </w:p>
-    <w:p>
-      <w:pPr>
-        <w:pStyle w:val="BodyText"/>
-      </w:pPr>
-      <w:r>
-        <w:t xml:space="preserve">• Assessment of the nature or context of the legislation (clause type) by management domain and threat</w:t>
-      </w:r>
-    </w:p>
-    <w:p>
-      <w:pPr>
-        <w:pStyle w:val="BodyText"/>
-      </w:pPr>
-      <w:r>
-        <w:t xml:space="preserve">• Assessment of the overlap and connectedness in management domains (co-occurrence) to better understand the relationship between salmon threats</w:t>
-      </w:r>
-    </w:p>
-    <w:p>
-      <w:pPr>
-        <w:pStyle w:val="BodyText"/>
-      </w:pPr>
-      <w:r>
-        <w:t xml:space="preserve">While this process and tool are relatively new and untested, further development could lead to a better integration of salmon management decisions and administrative responsibility.</w:t>
-      </w:r>
-    </w:p>
-    <w:bookmarkEnd w:id="77"/>
-    <w:bookmarkStart w:id="119" w:name="references"/>
-    <w:p>
-      <w:pPr>
-        <w:pStyle w:val="Heading1"/>
-      </w:pPr>
-      <w:r>
-        <w:t xml:space="preserve">References</w:t>
-      </w:r>
-    </w:p>
-    <w:bookmarkStart w:id="118" w:name="refs"/>
-    <w:bookmarkStart w:id="78" w:name="ref-arbeider2020"/>
+    <w:bookmarkStart w:id="130" w:name="refs"/>
+    <w:bookmarkStart w:id="90" w:name="ref-arbeider2020"/>
     <w:p>
       <w:pPr>
         <w:pStyle w:val="Bibliography"/>
@@ -21471,8 +22704,8 @@
         <w:t xml:space="preserve">.</w:t>
       </w:r>
     </w:p>
-    <w:bookmarkEnd w:id="78"/>
-    <w:bookmarkStart w:id="80" w:name="ref-bankes2014"/>
+    <w:bookmarkEnd w:id="90"/>
+    <w:bookmarkStart w:id="92" w:name="ref-bankes2014"/>
     <w:p>
       <w:pPr>
         <w:pStyle w:val="Bibliography"/>
@@ -21523,7 +22756,7 @@
       <w:r>
         <w:t xml:space="preserve">(9): 6024–6048. doi:</w:t>
       </w:r>
-      <w:hyperlink r:id="rId79">
+      <w:hyperlink r:id="rId91">
         <w:r>
           <w:rPr>
             <w:rStyle w:val="Hyperlink"/>
@@ -21535,8 +22768,8 @@
         <w:t xml:space="preserve">.</w:t>
       </w:r>
     </w:p>
-    <w:bookmarkEnd w:id="80"/>
-    <w:bookmarkStart w:id="81" w:name="ref-becklumb2013"/>
+    <w:bookmarkEnd w:id="92"/>
+    <w:bookmarkStart w:id="93" w:name="ref-becklumb2013"/>
     <w:p>
       <w:pPr>
         <w:pStyle w:val="Bibliography"/>
@@ -21566,8 +22799,8 @@
         <w:t xml:space="preserve">.</w:t>
       </w:r>
     </w:p>
-    <w:bookmarkEnd w:id="81"/>
-    <w:bookmarkStart w:id="83" w:name="ref-bisson2009"/>
+    <w:bookmarkEnd w:id="93"/>
+    <w:bookmarkStart w:id="95" w:name="ref-bisson2009"/>
     <w:p>
       <w:pPr>
         <w:pStyle w:val="Bibliography"/>
@@ -21642,7 +22875,7 @@
       <w:r>
         <w:t xml:space="preserve">(1): art45. doi:</w:t>
       </w:r>
-      <w:hyperlink r:id="rId82">
+      <w:hyperlink r:id="rId94">
         <w:r>
           <w:rPr>
             <w:rStyle w:val="Hyperlink"/>
@@ -21654,8 +22887,8 @@
         <w:t xml:space="preserve">.</w:t>
       </w:r>
     </w:p>
-    <w:bookmarkEnd w:id="83"/>
-    <w:bookmarkStart w:id="85" w:name="ref-bogetti2025"/>
+    <w:bookmarkEnd w:id="95"/>
+    <w:bookmarkStart w:id="97" w:name="ref-bogetti2025"/>
     <w:p>
       <w:pPr>
         <w:pStyle w:val="Bibliography"/>
@@ -21697,7 +22930,7 @@
       <w:r>
         <w:t xml:space="preserve">: 1–11. doi:</w:t>
       </w:r>
-      <w:hyperlink r:id="rId84">
+      <w:hyperlink r:id="rId96">
         <w:r>
           <w:rPr>
             <w:rStyle w:val="Hyperlink"/>
@@ -21709,8 +22942,8 @@
         <w:t xml:space="preserve">.</w:t>
       </w:r>
     </w:p>
-    <w:bookmarkEnd w:id="85"/>
-    <w:bookmarkStart w:id="87" w:name="ref-campbell2002"/>
+    <w:bookmarkEnd w:id="97"/>
+    <w:bookmarkStart w:id="99" w:name="ref-campbell2002"/>
     <w:p>
       <w:pPr>
         <w:pStyle w:val="Bibliography"/>
@@ -21785,7 +23018,7 @@
       <w:r>
         <w:t xml:space="preserve">(5): 223–232. doi:</w:t>
       </w:r>
-      <w:hyperlink r:id="rId86">
+      <w:hyperlink r:id="rId98">
         <w:r>
           <w:rPr>
             <w:rStyle w:val="Hyperlink"/>
@@ -21797,8 +23030,8 @@
         <w:t xml:space="preserve">.</w:t>
       </w:r>
     </w:p>
-    <w:bookmarkEnd w:id="87"/>
-    <w:bookmarkStart w:id="88" w:name="ref-canada2005"/>
+    <w:bookmarkEnd w:id="99"/>
+    <w:bookmarkStart w:id="100" w:name="ref-canada2005"/>
     <w:p>
       <w:pPr>
         <w:pStyle w:val="Bibliography"/>
@@ -21826,8 +23059,8 @@
         <w:t xml:space="preserve">, Vancouver, BC.</w:t>
       </w:r>
     </w:p>
-    <w:bookmarkEnd w:id="88"/>
-    <w:bookmarkStart w:id="90" w:name="X0deca4265bf6bbafed91be61c4a47264114da06"/>
+    <w:bookmarkEnd w:id="100"/>
+    <w:bookmarkStart w:id="102" w:name="X0deca4265bf6bbafed91be61c4a47264114da06"/>
     <w:p>
       <w:pPr>
         <w:pStyle w:val="Bibliography"/>
@@ -21847,7 +23080,7 @@
       <w:r>
         <w:t xml:space="preserve"> </w:t>
       </w:r>
-      <w:hyperlink r:id="rId89">
+      <w:hyperlink r:id="rId101">
         <w:r>
           <w:rPr>
             <w:rStyle w:val="Hyperlink"/>
@@ -21862,8 +23095,8 @@
         <w:t xml:space="preserve">[accessed 18 December 2025].</w:t>
       </w:r>
     </w:p>
-    <w:bookmarkEnd w:id="90"/>
-    <w:bookmarkStart w:id="91" w:name="ref-carlson2022"/>
+    <w:bookmarkEnd w:id="102"/>
+    <w:bookmarkStart w:id="103" w:name="ref-carlson2022"/>
     <w:p>
       <w:pPr>
         <w:pStyle w:val="Bibliography"/>
@@ -21893,8 +23126,8 @@
         <w:t xml:space="preserve">:</w:t>
       </w:r>
     </w:p>
-    <w:bookmarkEnd w:id="91"/>
-    <w:bookmarkStart w:id="92" w:name="ref-collins2019"/>
+    <w:bookmarkEnd w:id="103"/>
+    <w:bookmarkStart w:id="104" w:name="ref-collins2019"/>
     <w:p>
       <w:pPr>
         <w:pStyle w:val="Bibliography"/>
@@ -21949,8 +23182,8 @@
         <w:t xml:space="preserve">.</w:t>
       </w:r>
     </w:p>
-    <w:bookmarkEnd w:id="92"/>
-    <w:bookmarkStart w:id="94" w:name="ref-dallimer2015"/>
+    <w:bookmarkEnd w:id="104"/>
+    <w:bookmarkStart w:id="106" w:name="ref-dallimer2015"/>
     <w:p>
       <w:pPr>
         <w:pStyle w:val="Bibliography"/>
@@ -21971,7 +23204,7 @@
       <w:r>
         <w:t xml:space="preserve">(3): 132–139. doi:</w:t>
       </w:r>
-      <w:hyperlink r:id="rId93">
+      <w:hyperlink r:id="rId105">
         <w:r>
           <w:rPr>
             <w:rStyle w:val="Hyperlink"/>
@@ -21983,8 +23216,8 @@
         <w:t xml:space="preserve">.</w:t>
       </w:r>
     </w:p>
-    <w:bookmarkEnd w:id="94"/>
-    <w:bookmarkStart w:id="96" w:name="ref-departmentofjusticecanada2022"/>
+    <w:bookmarkEnd w:id="106"/>
+    <w:bookmarkStart w:id="108" w:name="ref-departmentofjusticecanada2022"/>
     <w:p>
       <w:pPr>
         <w:pStyle w:val="Bibliography"/>
@@ -22004,7 +23237,7 @@
       <w:r>
         <w:t xml:space="preserve"> </w:t>
       </w:r>
-      <w:hyperlink r:id="rId95">
+      <w:hyperlink r:id="rId107">
         <w:r>
           <w:rPr>
             <w:rStyle w:val="Hyperlink"/>
@@ -22019,8 +23252,8 @@
         <w:t xml:space="preserve">[accessed 18 December 2025].</w:t>
       </w:r>
     </w:p>
-    <w:bookmarkEnd w:id="96"/>
-    <w:bookmarkStart w:id="97" w:name="ref-dfo2020"/>
+    <w:bookmarkEnd w:id="108"/>
+    <w:bookmarkStart w:id="109" w:name="ref-dfo2020"/>
     <w:p>
       <w:pPr>
         <w:pStyle w:val="Bibliography"/>
@@ -22095,8 +23328,8 @@
         <w:t xml:space="preserve">11.</w:t>
       </w:r>
     </w:p>
-    <w:bookmarkEnd w:id="97"/>
-    <w:bookmarkStart w:id="98" w:name="ref-dfo2022"/>
+    <w:bookmarkEnd w:id="109"/>
+    <w:bookmarkStart w:id="110" w:name="ref-dfo2022"/>
     <w:p>
       <w:pPr>
         <w:pStyle w:val="Bibliography"/>
@@ -22198,8 +23431,8 @@
         <w:t xml:space="preserve">.</w:t>
       </w:r>
     </w:p>
-    <w:bookmarkEnd w:id="98"/>
-    <w:bookmarkStart w:id="99" w:name="ref-dionne2023"/>
+    <w:bookmarkEnd w:id="110"/>
+    <w:bookmarkStart w:id="111" w:name="ref-dionne2023"/>
     <w:p>
       <w:pPr>
         <w:pStyle w:val="Bibliography"/>
@@ -22232,8 +23465,8 @@
         <w:t xml:space="preserve">and southern mainland chinook designatable units (1, 6, 13 and 15). Canadian Science Advisory Secretariat (CSAS), Ottawa ON.</w:t>
       </w:r>
     </w:p>
-    <w:bookmarkEnd w:id="99"/>
-    <w:bookmarkStart w:id="101" w:name="ref-kraus2021"/>
+    <w:bookmarkEnd w:id="111"/>
+    <w:bookmarkStart w:id="113" w:name="ref-kraus2021"/>
     <w:p>
       <w:pPr>
         <w:pStyle w:val="Bibliography"/>
@@ -22263,7 +23496,7 @@
       <w:r>
         <w:t xml:space="preserve">: 1088–1127. doi:</w:t>
       </w:r>
-      <w:hyperlink r:id="rId100">
+      <w:hyperlink r:id="rId112">
         <w:r>
           <w:rPr>
             <w:rStyle w:val="Hyperlink"/>
@@ -22275,8 +23508,8 @@
         <w:t xml:space="preserve">.</w:t>
       </w:r>
     </w:p>
-    <w:bookmarkEnd w:id="101"/>
-    <w:bookmarkStart w:id="102" w:name="ref-marentette2020"/>
+    <w:bookmarkEnd w:id="113"/>
+    <w:bookmarkStart w:id="114" w:name="ref-marentette2020"/>
     <w:p>
       <w:pPr>
         <w:pStyle w:val="Bibliography"/>
@@ -22318,8 +23551,8 @@
         <w:t xml:space="preserve">, Ottawa, ON.</w:t>
       </w:r>
     </w:p>
-    <w:bookmarkEnd w:id="102"/>
-    <w:bookmarkStart w:id="104" w:name="ref-mccune2013"/>
+    <w:bookmarkEnd w:id="114"/>
+    <w:bookmarkStart w:id="116" w:name="ref-mccune2013"/>
     <w:p>
       <w:pPr>
         <w:pStyle w:val="Bibliography"/>
@@ -22364,7 +23597,7 @@
       <w:r>
         <w:t xml:space="preserve">: 254–265. doi:</w:t>
       </w:r>
-      <w:hyperlink r:id="rId103">
+      <w:hyperlink r:id="rId115">
         <w:r>
           <w:rPr>
             <w:rStyle w:val="Hyperlink"/>
@@ -22376,8 +23609,8 @@
         <w:t xml:space="preserve">.</w:t>
       </w:r>
     </w:p>
-    <w:bookmarkEnd w:id="104"/>
-    <w:bookmarkStart w:id="106" w:name="ref-price2017"/>
+    <w:bookmarkEnd w:id="116"/>
+    <w:bookmarkStart w:id="118" w:name="ref-price2017"/>
     <w:p>
       <w:pPr>
         <w:pStyle w:val="Bibliography"/>
@@ -22428,7 +23661,7 @@
       <w:r>
         <w:t xml:space="preserve">(10): 1507–1518. doi:</w:t>
       </w:r>
-      <w:hyperlink r:id="rId105">
+      <w:hyperlink r:id="rId117">
         <w:r>
           <w:rPr>
             <w:rStyle w:val="Hyperlink"/>
@@ -22440,8 +23673,8 @@
         <w:t xml:space="preserve">.</w:t>
       </w:r>
     </w:p>
-    <w:bookmarkEnd w:id="106"/>
-    <w:bookmarkStart w:id="108" w:name="ref-ray2021"/>
+    <w:bookmarkEnd w:id="118"/>
+    <w:bookmarkStart w:id="120" w:name="ref-ray2021"/>
     <w:p>
       <w:pPr>
         <w:pStyle w:val="Bibliography"/>
@@ -22483,7 +23716,7 @@
       <w:r>
         <w:t xml:space="preserve">: 1044–1068. doi:</w:t>
       </w:r>
-      <w:hyperlink r:id="rId107">
+      <w:hyperlink r:id="rId119">
         <w:r>
           <w:rPr>
             <w:rStyle w:val="Hyperlink"/>
@@ -22495,8 +23728,8 @@
         <w:t xml:space="preserve">.</w:t>
       </w:r>
     </w:p>
-    <w:bookmarkEnd w:id="108"/>
-    <w:bookmarkStart w:id="110" w:name="ref-salafsky2025"/>
+    <w:bookmarkEnd w:id="120"/>
+    <w:bookmarkStart w:id="122" w:name="ref-salafsky2025"/>
     <w:p>
       <w:pPr>
         <w:pStyle w:val="Bibliography"/>
@@ -22517,7 +23750,7 @@
       <w:r>
         <w:t xml:space="preserve">(3): e14434. doi:</w:t>
       </w:r>
-      <w:hyperlink r:id="rId109">
+      <w:hyperlink r:id="rId121">
         <w:r>
           <w:rPr>
             <w:rStyle w:val="Hyperlink"/>
@@ -22529,8 +23762,8 @@
         <w:t xml:space="preserve">.</w:t>
       </w:r>
     </w:p>
-    <w:bookmarkEnd w:id="110"/>
-    <w:bookmarkStart w:id="112" w:name="ref-salafsky2008"/>
+    <w:bookmarkEnd w:id="122"/>
+    <w:bookmarkStart w:id="124" w:name="ref-salafsky2008"/>
     <w:p>
       <w:pPr>
         <w:pStyle w:val="Bibliography"/>
@@ -22605,7 +23838,7 @@
       <w:r>
         <w:t xml:space="preserve">(4): 897–911. doi:</w:t>
       </w:r>
-      <w:hyperlink r:id="rId111">
+      <w:hyperlink r:id="rId123">
         <w:r>
           <w:rPr>
             <w:rStyle w:val="Hyperlink"/>
@@ -22617,8 +23850,8 @@
         <w:t xml:space="preserve">.</w:t>
       </w:r>
     </w:p>
-    <w:bookmarkEnd w:id="112"/>
-    <w:bookmarkStart w:id="114" w:name="ref-swerdfager2023"/>
+    <w:bookmarkEnd w:id="124"/>
+    <w:bookmarkStart w:id="126" w:name="ref-swerdfager2023"/>
     <w:p>
       <w:pPr>
         <w:pStyle w:val="Bibliography"/>
@@ -22648,7 +23881,7 @@
       <w:r>
         <w:t xml:space="preserve">: 1–13. doi:</w:t>
       </w:r>
-      <w:hyperlink r:id="rId113">
+      <w:hyperlink r:id="rId125">
         <w:r>
           <w:rPr>
             <w:rStyle w:val="Hyperlink"/>
@@ -22660,8 +23893,8 @@
         <w:t xml:space="preserve">.</w:t>
       </w:r>
     </w:p>
-    <w:bookmarkEnd w:id="114"/>
-    <w:bookmarkStart w:id="115" w:name="ref-thompson1974"/>
+    <w:bookmarkEnd w:id="126"/>
+    <w:bookmarkStart w:id="127" w:name="ref-thompson1974"/>
     <w:p>
       <w:pPr>
         <w:pStyle w:val="Bibliography"/>
@@ -22691,8 +23924,8 @@
         <w:t xml:space="preserve">.</w:t>
       </w:r>
     </w:p>
-    <w:bookmarkEnd w:id="115"/>
-    <w:bookmarkStart w:id="117" w:name="ref-turcotte2021"/>
+    <w:bookmarkEnd w:id="127"/>
+    <w:bookmarkStart w:id="129" w:name="ref-turcotte2021"/>
     <w:p>
       <w:pPr>
         <w:pStyle w:val="Bibliography"/>
@@ -22775,7 +24008,7 @@
       <w:r>
         <w:t xml:space="preserve">: 1474–1494. doi:</w:t>
       </w:r>
-      <w:hyperlink r:id="rId116">
+      <w:hyperlink r:id="rId128">
         <w:r>
           <w:rPr>
             <w:rStyle w:val="Hyperlink"/>
@@ -22787,10 +24020,10 @@
         <w:t xml:space="preserve">.</w:t>
       </w:r>
     </w:p>
-    <w:bookmarkEnd w:id="117"/>
-    <w:bookmarkEnd w:id="118"/>
-    <w:bookmarkEnd w:id="119"/>
-    <w:bookmarkStart w:id="120" w:name="supplementary-material"/>
+    <w:bookmarkEnd w:id="129"/>
+    <w:bookmarkEnd w:id="130"/>
+    <w:bookmarkEnd w:id="131"/>
+    <w:bookmarkStart w:id="132" w:name="supplementary-material"/>
     <w:p>
       <w:pPr>
         <w:pStyle w:val="Heading1"/>
@@ -22801,13 +24034,21 @@
     </w:p>
     <w:p>
       <w:pPr>
-        <w:pStyle w:val="FirstParagraph"/>
+        <w:pStyle w:val="Compact"/>
+        <w:numPr>
+          <w:ilvl w:val="0"/>
+          <w:numId w:val="1006"/>
+        </w:numPr>
       </w:pPr>
       <w:r>
-        <w:t xml:space="preserve">*Links or downloads for the LAPSE tool materials (app etc.)</w:t>
+        <w:rPr>
+          <w:b/>
+          <w:bCs/>
+        </w:rPr>
+        <w:t xml:space="preserve">Links or downloads for the LAPSE tool materials (app etc.)</w:t>
       </w:r>
     </w:p>
-    <w:bookmarkEnd w:id="120"/>
+    <w:bookmarkEnd w:id="132"/>
     <w:sectPr>
       <w:headerReference r:id="rId10" w:type="even"/>
       <w:headerReference r:id="rId9" w:type="default"/>
@@ -23364,8 +24605,129 @@
       </w:pPr>
     </w:lvl>
   </w:abstractNum>
+  <w:abstractNum w:abstractNumId="991">
+    <w:nsid w:val="0000A991"/>
+    <w:multiLevelType w:val="multilevel"/>
+    <w:lvl w:ilvl="0">
+      <w:numFmt w:val="bullet"/>
+      <w:lvlText w:val=""/>
+      <w:lvlJc w:val="left"/>
+      <w:pPr>
+        <w:ind w:left="720" w:hanging="360"/>
+      </w:pPr>
+      <w:rPr>
+        <w:rFonts w:ascii="Symbol" w:hAnsi="Symbol" w:cs="Symbol" w:hint="default"/>
+      </w:rPr>
+    </w:lvl>
+    <w:lvl w:ilvl="1">
+      <w:numFmt w:val="bullet"/>
+      <w:lvlText w:val="o"/>
+      <w:lvlJc w:val="left"/>
+      <w:pPr>
+        <w:ind w:left="1440" w:hanging="360"/>
+      </w:pPr>
+      <w:rPr>
+        <w:rFonts w:ascii="Courier New" w:hAnsi="Courier New" w:cs="Courier New" w:hint="default"/>
+      </w:rPr>
+    </w:lvl>
+    <w:lvl w:ilvl="2">
+      <w:numFmt w:val="bullet"/>
+      <w:lvlText w:val=""/>
+      <w:lvlJc w:val="left"/>
+      <w:pPr>
+        <w:ind w:left="2160" w:hanging="360"/>
+      </w:pPr>
+      <w:rPr>
+        <w:rFonts w:ascii="Wingdings" w:hAnsi="Wingdings" w:cs="Wingdings" w:hint="default"/>
+      </w:rPr>
+    </w:lvl>
+    <w:lvl w:ilvl="3">
+      <w:numFmt w:val="bullet"/>
+      <w:lvlText w:val=""/>
+      <w:lvlJc w:val="left"/>
+      <w:pPr>
+        <w:ind w:left="2880" w:hanging="360"/>
+      </w:pPr>
+      <w:rPr>
+        <w:rFonts w:ascii="Symbol" w:hAnsi="Symbol" w:cs="Symbol" w:hint="default"/>
+      </w:rPr>
+    </w:lvl>
+    <w:lvl w:ilvl="4">
+      <w:numFmt w:val="bullet"/>
+      <w:lvlText w:val="o"/>
+      <w:lvlJc w:val="left"/>
+      <w:pPr>
+        <w:ind w:left="3600" w:hanging="360"/>
+      </w:pPr>
+      <w:rPr>
+        <w:rFonts w:ascii="Courier New" w:hAnsi="Courier New" w:cs="Courier New" w:hint="default"/>
+      </w:rPr>
+    </w:lvl>
+    <w:lvl w:ilvl="5">
+      <w:numFmt w:val="bullet"/>
+      <w:lvlText w:val=""/>
+      <w:lvlJc w:val="left"/>
+      <w:pPr>
+        <w:ind w:left="4320" w:hanging="360"/>
+      </w:pPr>
+      <w:rPr>
+        <w:rFonts w:ascii="Wingdings" w:hAnsi="Wingdings" w:cs="Wingdings" w:hint="default"/>
+      </w:rPr>
+    </w:lvl>
+    <w:lvl w:ilvl="6">
+      <w:numFmt w:val="bullet"/>
+      <w:lvlText w:val=""/>
+      <w:lvlJc w:val="left"/>
+      <w:pPr>
+        <w:ind w:left="5040" w:hanging="360"/>
+      </w:pPr>
+      <w:rPr>
+        <w:rFonts w:ascii="Symbol" w:hAnsi="Symbol" w:cs="Symbol" w:hint="default"/>
+      </w:rPr>
+    </w:lvl>
+    <w:lvl w:ilvl="7">
+      <w:numFmt w:val="bullet"/>
+      <w:lvlText w:val="o"/>
+      <w:lvlJc w:val="left"/>
+      <w:pPr>
+        <w:ind w:left="5760" w:hanging="360"/>
+      </w:pPr>
+      <w:rPr>
+        <w:rFonts w:ascii="Courier New" w:hAnsi="Courier New" w:cs="Courier New" w:hint="default"/>
+      </w:rPr>
+    </w:lvl>
+    <w:lvl w:ilvl="8">
+      <w:numFmt w:val="bullet"/>
+      <w:lvlText w:val=""/>
+      <w:lvlJc w:val="left"/>
+      <w:pPr>
+        <w:ind w:left="6480" w:hanging="360"/>
+      </w:pPr>
+      <w:rPr>
+        <w:rFonts w:ascii="Wingdings" w:hAnsi="Wingdings" w:cs="Wingdings" w:hint="default"/>
+      </w:rPr>
+    </w:lvl>
+  </w:abstractNum>
   <w:num w:numId="1000">
     <w:abstractNumId w:val="990"/>
+  </w:num>
+  <w:num w:numId="1001">
+    <w:abstractNumId w:val="991"/>
+  </w:num>
+  <w:num w:numId="1002">
+    <w:abstractNumId w:val="991"/>
+  </w:num>
+  <w:num w:numId="1003">
+    <w:abstractNumId w:val="991"/>
+  </w:num>
+  <w:num w:numId="1004">
+    <w:abstractNumId w:val="991"/>
+  </w:num>
+  <w:num w:numId="1005">
+    <w:abstractNumId w:val="991"/>
+  </w:num>
+  <w:num w:numId="1006">
+    <w:abstractNumId w:val="991"/>
   </w:num>
 </w:numbering>
 </file>

</xml_diff>

<commit_message>
Reran with Cory's edits
</commit_message>
<xml_diff>
--- a/reports/LAPSE_primary_publication.docx
+++ b/reports/LAPSE_primary_publication.docx
@@ -131,16 +131,25 @@
         <w:pStyle w:val="Date"/>
       </w:pPr>
       <w:r>
-        <w:t xml:space="preserve">2025-12-19</w:t>
+        <w:t xml:space="preserve">2026-01-05</w:t>
       </w:r>
     </w:p>
-    <w:bookmarkStart w:id="28" w:name="Xb0d16233fb0ea58f7a8e05661af0f015fa4029e"/>
+    <w:bookmarkStart w:id="32" w:name="introduction"/>
     <w:p>
       <w:pPr>
         <w:pStyle w:val="Heading1"/>
       </w:pPr>
       <w:r>
-        <w:t xml:space="preserve">The decentralized, multi-sector patchwork of Pacific salmon governance in Canada</w:t>
+        <w:t xml:space="preserve">Introduction</w:t>
+      </w:r>
+    </w:p>
+    <w:bookmarkStart w:id="28" w:name="X23eb75eb73759b85a41a4830e98a3f1b0635388"/>
+    <w:p>
+      <w:pPr>
+        <w:pStyle w:val="Heading2"/>
+      </w:pPr>
+      <w:r>
+        <w:t xml:space="preserve">The patchwork of Pacific salmon governance in Canada</w:t>
       </w:r>
     </w:p>
     <w:p>
@@ -148,7 +157,7 @@
         <w:pStyle w:val="FirstParagraph"/>
       </w:pPr>
       <w:r>
-        <w:t xml:space="preserve">Eurocentric colonial stewardship of natural resources in Canada is administered through a decentralized, multi-sector array of federal, provincial, territorial, and municipal constitutional authority</w:t>
+        <w:t xml:space="preserve">Eurocentric colonial stewardship of natural resources in Canada is administered through a decentralized, multi-sector array of federal, provincial, and territorial constitutional authority</w:t>
       </w:r>
       <w:r>
         <w:t xml:space="preserve"> </w:t>
@@ -166,7 +175,16 @@
         <w:t xml:space="preserve">(Becklumb 2013)</w:t>
       </w:r>
       <w:r>
-        <w:t xml:space="preserve">. The dual roles, from the adaption of British Common Law to the Canadian situation, can lead to confusion around management prerogatives</w:t>
+        <w:t xml:space="preserve">. Provinces have jurisdiction over most wildlife within their borders; however, the federal government has jurisdiction over wildlife on federal land (e.g. national parks), as well as, migratory birds and aquatic species including marine mammals and fish</w:t>
+      </w:r>
+      <w:r>
+        <w:t xml:space="preserve"> </w:t>
+      </w:r>
+      <w:r>
+        <w:t xml:space="preserve">(Becklumb 2013; Kraus et al. 2021)</w:t>
+      </w:r>
+      <w:r>
+        <w:t xml:space="preserve">. The dual roles - arising from the adaptation of British Common Law to the Canadian situation - can lead to confusion around management prerogatives</w:t>
       </w:r>
       <w:r>
         <w:t xml:space="preserve"> </w:t>
@@ -187,31 +205,7 @@
         <w:t xml:space="preserve">(Campbell and Thomas 2002)</w:t>
       </w:r>
       <w:r>
-        <w:t xml:space="preserve"> </w:t>
-      </w:r>
-      <w:r>
-        <w:t xml:space="preserve">or one department (Figures</w:t>
-      </w:r>
-      <w:r>
-        <w:t xml:space="preserve"> </w:t>
-      </w:r>
-      <w:r>
-        <w:t xml:space="preserve">1</w:t>
-      </w:r>
-      <w:r>
-        <w:t xml:space="preserve"> </w:t>
-      </w:r>
-      <w:r>
-        <w:t xml:space="preserve">and</w:t>
-      </w:r>
-      <w:r>
-        <w:t xml:space="preserve"> </w:t>
-      </w:r>
-      <w:r>
-        <w:t xml:space="preserve">2</w:t>
-      </w:r>
-      <w:r>
-        <w:t xml:space="preserve">).</w:t>
+        <w:t xml:space="preserve">.</w:t>
       </w:r>
     </w:p>
     <w:p>
@@ -219,25 +213,7 @@
         <w:pStyle w:val="BodyText"/>
       </w:pPr>
       <w:r>
-        <w:t xml:space="preserve">The fragmented federal jurisdiction over natural resources has always been ambiguous and limited with 89% of resources located within provincial legislative authority</w:t>
-      </w:r>
-      <w:r>
-        <w:t xml:space="preserve"> </w:t>
-      </w:r>
-      <w:r>
-        <w:t xml:space="preserve">(Ray et al. 2021)</w:t>
-      </w:r>
-      <w:r>
-        <w:t xml:space="preserve">. Provinces have jurisdiction over most wildlife within their borders; however, the federal government has jurisdiction over wildlife on federal land (e.g. national parks), as well as, migratory birds and aquatic species including marine mammals and fish</w:t>
-      </w:r>
-      <w:r>
-        <w:t xml:space="preserve"> </w:t>
-      </w:r>
-      <w:r>
-        <w:t xml:space="preserve">(Becklumb 2013; Kraus et al. 2021)</w:t>
-      </w:r>
-      <w:r>
-        <w:t xml:space="preserve">. While salmon and salmon fisheries are regulated federally, water use and watercourse management and the corresponding aquatic habitat is managed by the provinces. However, watercourse management is not strictly provincial jurisdiction. The federal government regulates fisheries and navigable waters in oceans, lakes, rivers, and streams even within provincial boundaries</w:t>
+        <w:t xml:space="preserve">The patchwork of legislative authority is most prominent in Pacific salmon management due to their geographically widespread, anadromous life cycle that spans international boundaries and freshwater and marine ecosystems. While salmon and salmon fisheries are regulated federally, water use and watercourse management and the corresponding aquatic habitat is managed by the provinces. However, watercourse management is not strictly provincial jurisdiction. The federal government regulates fisheries and navigable waters in oceans, lakes, rivers, and streams even within provincial boundaries</w:t>
       </w:r>
       <w:r>
         <w:t xml:space="preserve"> </w:t>
@@ -400,7 +376,16 @@
         <w:t xml:space="preserve"> </w:t>
       </w:r>
       <w:r>
-        <w:t xml:space="preserve">is specific to forestry practices and planning, along with cattle ranging, but in terms of salmon threats, these activities impact many aspects including stream hydrology, water temperature, effluent, riparian habitat destruction, watercourse changes from road infrastructure, and the spread of invasive species.</w:t>
+        <w:t xml:space="preserve">is specific to forestry practices and planning, along with cattle ranging, but in terms of salmon threats, these activities impact many aspects including stream hydrology, water temperature, effluent, riparian habitat destruction, watercourse changes from road infrastructure</w:t>
+      </w:r>
+      <w:r>
+        <w:t xml:space="preserve"> </w:t>
+      </w:r>
+      <w:r>
+        <w:t xml:space="preserve">(Ulaski et al. 2025)</w:t>
+      </w:r>
+      <w:r>
+        <w:t xml:space="preserve">, and the spread of invasive species.</w:t>
       </w:r>
     </w:p>
     <w:p>
@@ -448,13 +433,13 @@
       </w:r>
     </w:p>
     <w:bookmarkEnd w:id="28"/>
-    <w:bookmarkStart w:id="29" w:name="salmon-populations-at-risk"/>
+    <w:bookmarkStart w:id="29" w:name="X97ee571fad33b77695a285dcc3cc021aa783b7a"/>
     <w:p>
       <w:pPr>
-        <w:pStyle w:val="Heading1"/>
+        <w:pStyle w:val="Heading2"/>
       </w:pPr>
       <w:r>
-        <w:t xml:space="preserve">Salmon populations at risk</w:t>
+        <w:t xml:space="preserve">Complexity in addressing declines of Pacific Salmon</w:t>
       </w:r>
     </w:p>
     <w:p>
@@ -462,65 +447,32 @@
         <w:pStyle w:val="FirstParagraph"/>
       </w:pPr>
       <w:r>
-        <w:t xml:space="preserve">Despite considerable financial investment in salmon conservation and habitat restoration programs, as well as, the revision of management frameworks (e.g. </w:t>
+        <w:t xml:space="preserve">Despite considerable attention towards policies and recovery programs for salmon conservation and governance (e.g. </w:t>
       </w:r>
       <w:r>
         <w:rPr>
           <w:i/>
           <w:iCs/>
         </w:rPr>
-        <w:t xml:space="preserve">Canada’s Policy for Conservation of Wild Pacific Salmon</w:t>
-      </w:r>
-      <w:r>
-        <w:t xml:space="preserve">), Pacific salmon populations continue to decline in British Columbia, and the number of populations monitored continues to drop</w:t>
-      </w:r>
-      <w:r>
-        <w:t xml:space="preserve"> </w:t>
-      </w:r>
-      <w:r>
-        <w:t xml:space="preserve">(Bisson et al. 2009; Price et al. 2017)</w:t>
-      </w:r>
-      <w:r>
-        <w:t xml:space="preserve">.</w:t>
-      </w:r>
-      <w:r>
-        <w:t xml:space="preserve"> </w:t>
-      </w:r>
-      <w:r>
-        <w:t xml:space="preserve">Price et al. (2017)</w:t>
-      </w:r>
-      <w:r>
-        <w:t xml:space="preserve"> </w:t>
-      </w:r>
-      <w:r>
-        <w:t xml:space="preserve">found that</w:t>
-      </w:r>
-      <w:r>
-        <w:t xml:space="preserve"> </w:t>
-      </w:r>
-      <w:r>
-        <w:t xml:space="preserve">“</w:t>
-      </w:r>
-      <w:r>
-        <w:t xml:space="preserve">as of 1993, 600 of 9204 salmon runs were considered at high risk of extirpation, 63 at moderate risk, and 57 were of special concern; 105 stream populations throughout BC were documented as extirpated.</w:t>
-      </w:r>
-      <w:r>
-        <w:t xml:space="preserve">”</w:t>
-      </w:r>
-      <w:r>
-        <w:t xml:space="preserve"> </w:t>
-      </w:r>
-      <w:r>
-        <w:t xml:space="preserve">Of the monitored streams along the north and central coast, ninety-six percent consistently fell below escapement targets (adults returning to spawn) from 1950 to 2005</w:t>
-      </w:r>
-      <w:r>
-        <w:t xml:space="preserve"> </w:t>
-      </w:r>
-      <w:r>
-        <w:t xml:space="preserve">(Price et al. 2017)</w:t>
-      </w:r>
-      <w:r>
-        <w:t xml:space="preserve">. While difficult to pinpoint a single cause, the decline of salmon populations and habitat capacity is recognized as a consequence of human activity, especially the loss or degradation of freshwater habitat</w:t>
+        <w:t xml:space="preserve">Canada’s Policy for Conservation of Wild Pacific Salmon, the Pacific Salmon Strategy Initiative</w:t>
+      </w:r>
+      <w:r>
+        <w:t xml:space="preserve">), Pacific salmon populations are generally declining across Canada, while the number of populations monitored continues to drop</w:t>
+      </w:r>
+      <w:r>
+        <w:t xml:space="preserve"> </w:t>
+      </w:r>
+      <w:r>
+        <w:t xml:space="preserve">(Price et al. 2017; Atkinson et al. 2024)</w:t>
+      </w:r>
+      <w:r>
+        <w:t xml:space="preserve">. The causes of Pacific salmon declines in Canada are varied and have been the subject of numerous studies and reviews over the last few decades (e.g. the Cohen Commission 2010, Report of the Standing Committee On Fisheries and Oceans 2021,</w:t>
+      </w:r>
+      <w:r>
+        <w:t xml:space="preserve">(Grant et al. 2019)</w:t>
+      </w:r>
+      <w:r>
+        <w:t xml:space="preserve">). Declines are recognized as a consequence of human activity, including the loss or degradation of freshwater habitat</w:t>
       </w:r>
       <w:r>
         <w:t xml:space="preserve"> </w:t>
@@ -529,7 +481,7 @@
         <w:t xml:space="preserve">(Bisson et al. 2009)</w:t>
       </w:r>
       <w:r>
-        <w:t xml:space="preserve">; however, industrial development and urbanization continues to spread and compound within watersheds.</w:t>
+        <w:t xml:space="preserve">, unsustainable fisheries harvest, and climate change.</w:t>
       </w:r>
     </w:p>
     <w:p>
@@ -537,7 +489,76 @@
         <w:pStyle w:val="BodyText"/>
       </w:pPr>
       <w:r>
-        <w:t xml:space="preserve">Federal departments differ in how they implement the same legislation. For example, during the</w:t>
+        <w:t xml:space="preserve">In response to declines, commercial fisheries harvests have been substantially curtailed in recent decades</w:t>
+      </w:r>
+      <w:r>
+        <w:t xml:space="preserve"> </w:t>
+      </w:r>
+      <w:r>
+        <w:t xml:space="preserve">(Del Valle et al. 2024)</w:t>
+      </w:r>
+      <w:r>
+        <w:t xml:space="preserve"> </w:t>
+      </w:r>
+      <w:r>
+        <w:t xml:space="preserve">as Fisheries and Oceans Canada aims to manage fisheries to preserve biodiversity in a manner consistent with the Wild Salmon Policy and the Precautionary Approach. Fisheries, particularly commercial fisheries, are legislated under the distinct authority of the Fisheries Act where laws and regulations prescribe how, when, and where fisheries harvest may occur within Canadian waters. There is no ambiguity in jurisdiction or responsibility, at least for fisheries intercepting Pacific salmon within Canada, therefore fisheries harvest impacts can be adjusted relatively easily in response to declines or changing abundances. Fisheries also result in direct mortality to salmon, therefore, impacts can be directly measured and managed using quantifiable targets, assuming adequate monitoring information is collected.</w:t>
+      </w:r>
+    </w:p>
+    <w:p>
+      <w:pPr>
+        <w:pStyle w:val="BodyText"/>
+      </w:pPr>
+      <w:r>
+        <w:t xml:space="preserve">By contrast, threats to salmon habitat require a much more coordinated and inter-jurisdictional approach to evaluate and address. Freshwater habitat, including water quantity (discharge and timing) and water quality (temperature and chemistry), are impacted by actions and conditions throughout the entire watershed. Local activities, such as forestry and urbanisation, act cumulatively and compound with climate changes to degrade salmon watersheds, threatening their ability to sustain salmon abundance and diversity</w:t>
+      </w:r>
+      <w:r>
+        <w:t xml:space="preserve"> </w:t>
+      </w:r>
+      <w:r>
+        <w:t xml:space="preserve">(Moore et al. 2025)</w:t>
+      </w:r>
+      <w:r>
+        <w:t xml:space="preserve">. Impacts from activities are often indirect, requiring monitoring and long-term studies to identify with confidence</w:t>
+      </w:r>
+      <w:r>
+        <w:t xml:space="preserve"> </w:t>
+      </w:r>
+      <w:r>
+        <w:t xml:space="preserve">(Ulaski et al. 2025)</w:t>
+      </w:r>
+      <w:r>
+        <w:t xml:space="preserve">. Regulation of threats to salmon freshwater habitat in British Columbia therefore requires the application of multiple acts and regulations across both federal and provincial jurisdiction, where the impacts from activities and the benefits of mitigation are uncertain and spread out over time and space.</w:t>
+      </w:r>
+    </w:p>
+    <w:p>
+      <w:pPr>
+        <w:pStyle w:val="BodyText"/>
+      </w:pPr>
+      <w:r>
+        <w:t xml:space="preserve">For example, regulation of forestry under the Forestry Act, water licensing under the Water Sustainability Act, environmental assessment of a mine under the Environmental Assessment Act, enforcement of activities that cause harm to salmon habitat under the Fisheries Act ….</w:t>
+      </w:r>
+    </w:p>
+    <w:p>
+      <w:pPr>
+        <w:pStyle w:val="BodyText"/>
+      </w:pPr>
+      <w:r>
+        <w:t xml:space="preserve">Amidst this uncertainty and complexity, multiple assessment frameworks have been developed to evaluate risks arising from anthropogenic activities and limiting factors for the survival and recovery of Pacific salmon populations [</w:t>
+      </w:r>
+      <w:r>
+        <w:t xml:space="preserve">Chalifour et al. (2022)</w:t>
+      </w:r>
+      <w:r>
+        <w:t xml:space="preserve">;</w:t>
+      </w:r>
+      <w:r>
+        <w:t xml:space="preserve"> </w:t>
+      </w:r>
+      <w:r>
+        <w:t xml:space="preserve">Salafsky et al. (2008)</w:t>
+      </w:r>
+      <w:r>
+        <w:t xml:space="preserve">; RAMS citation?]. While varied in their approaches, these frameworks generally aim to be comprehensive in assessing the wide range of threats that may impact Pacific salmon across their life cycle to inform status assessments, recovery planning, and conservation strategies. One of the most widely used risk assessment frameworks for Pacific salmon is the</w:t>
       </w:r>
       <w:r>
         <w:t xml:space="preserve"> </w:t>
@@ -547,98 +568,49 @@
           <w:i/>
           <w:iCs/>
         </w:rPr>
-        <w:t xml:space="preserve">Species At Risk Act</w:t>
-      </w:r>
-      <w:r>
-        <w:t xml:space="preserve"> </w:t>
-      </w:r>
-      <w:r>
-        <w:t xml:space="preserve">listing process, Fisheries and Oceans Canada (DFO) conducts socio-economic analyses, whereas Environment and Climate Change Canada (ECCC) does not</w:t>
-      </w:r>
-      <w:r>
-        <w:t xml:space="preserve"> </w:t>
-      </w:r>
-      <w:r>
-        <w:t xml:space="preserve">(Turcotte et al. 2021)</w:t>
+        <w:t xml:space="preserve">International Union for Conservation of Nature</w:t>
+      </w:r>
+      <w:r>
+        <w:t xml:space="preserve"> </w:t>
+      </w:r>
+      <w:r>
+        <w:t xml:space="preserve">(IUCN) Direct Threats Classification</w:t>
+      </w:r>
+      <w:r>
+        <w:t xml:space="preserve"> </w:t>
+      </w:r>
+      <w:r>
+        <w:t xml:space="preserve">(Salafsky et al. 2008)</w:t>
+      </w:r>
+      <w:r>
+        <w:t xml:space="preserve">, which is applied for Recovery Potential Assessments as part of Species at Risk Act listing processes and for COSEWIC status assessments</w:t>
+      </w:r>
+      <w:r>
+        <w:t xml:space="preserve"> </w:t>
+      </w:r>
+      <w:r>
+        <w:t xml:space="preserve">(Arbeider et al. 2020; Dionne 2023; Doutaz et al. 2023)</w:t>
       </w:r>
       <w:r>
         <w:t xml:space="preserve">.</w:t>
-      </w:r>
-      <w:r>
-        <w:t xml:space="preserve"> </w:t>
-      </w:r>
-      <w:r>
-        <w:rPr>
-          <w:i/>
-          <w:iCs/>
-        </w:rPr>
-        <w:t xml:space="preserve">Canada’s Policy for Conservation of Wild Pacific Salmon</w:t>
-      </w:r>
-      <w:r>
-        <w:t xml:space="preserve"> </w:t>
-      </w:r>
-      <w:r>
-        <w:t xml:space="preserve">(WSP) outlines a process for Pacific salmon stewardship using the precautionary principle and the scope of salmon diversity protection to the Conservation Unit (CU): genetically and (or) geographically distinct populations. These misaligned processes create a situation where even when a salmon population is assessed as</w:t>
-      </w:r>
-      <w:r>
-        <w:t xml:space="preserve"> </w:t>
-      </w:r>
-      <w:r>
-        <w:t xml:space="preserve">“</w:t>
-      </w:r>
-      <w:r>
-        <w:t xml:space="preserve">endangered</w:t>
-      </w:r>
-      <w:r>
-        <w:t xml:space="preserve">”</w:t>
-      </w:r>
-      <w:r>
-        <w:t xml:space="preserve"> </w:t>
-      </w:r>
-      <w:r>
-        <w:t xml:space="preserve">through COSEWIC (Cultus Lake sockeye), the population could still be omitted from the</w:t>
-      </w:r>
-      <w:r>
-        <w:t xml:space="preserve"> </w:t>
-      </w:r>
-      <w:r>
-        <w:rPr>
-          <w:i/>
-          <w:iCs/>
-        </w:rPr>
-        <w:t xml:space="preserve">List of Endangered Species</w:t>
-      </w:r>
-      <w:r>
-        <w:t xml:space="preserve"> </w:t>
-      </w:r>
-      <w:r>
-        <w:t xml:space="preserve">(Order) for economic and political reasons (co-migrating with other stocks), denying the population larger legislative protections.</w:t>
       </w:r>
     </w:p>
     <w:p>
       <w:pPr>
-        <w:pStyle w:val="Compact"/>
-        <w:numPr>
-          <w:ilvl w:val="0"/>
-          <w:numId w:val="1002"/>
-        </w:numPr>
+        <w:pStyle w:val="BodyText"/>
       </w:pPr>
       <w:r>
-        <w:rPr>
-          <w:b/>
-          <w:bCs/>
-        </w:rPr>
-        <w:t xml:space="preserve">Include Atkinson 2025 study on monitoring declines</w:t>
+        <w:t xml:space="preserve">Assuming there is agreement upon the most important threats, risk assessments are intended to guide the development of recovery plans and mitigation actions with the ultimate aim of reversing declines and improving conservation status. A key challenge is identifying actions that are impactful and feasible across the wide geographic range and diverse life history of Pacific salmon. In many cases, regulatory complexity, ambiguous responsibility, and dispersed authority become barriers to effective and timely action.</w:t>
       </w:r>
     </w:p>
     <w:bookmarkEnd w:id="29"/>
-    <w:bookmarkStart w:id="30" w:name="X57d7d8d53ff4272e7fbbbbb35544d9a3ac5bd2f"/>
+    <w:bookmarkStart w:id="31" w:name="Xf99c42c3166c79d6e14b14d7da12046c07a47b6"/>
     <w:p>
       <w:pPr>
-        <w:pStyle w:val="Heading1"/>
+        <w:pStyle w:val="Heading2"/>
       </w:pPr>
       <w:r>
-        <w:t xml:space="preserve">Salmon life cycle complexities and management shortcomings</w:t>
+        <w:t xml:space="preserve">Why study salmon legislation: purpose and objectives</w:t>
       </w:r>
     </w:p>
     <w:p>
@@ -646,37 +618,21 @@
         <w:pStyle w:val="FirstParagraph"/>
       </w:pPr>
       <w:r>
-        <w:t xml:space="preserve">Socio-political boundaries at multiple spatial scales across a species’ range increase ambiguity regarding the ownership and regulation of space</w:t>
-      </w:r>
-      <w:r>
-        <w:t xml:space="preserve"> </w:t>
-      </w:r>
-      <w:r>
-        <w:t xml:space="preserve">(Dallimer and Strange 2015)</w:t>
-      </w:r>
-      <w:r>
-        <w:t xml:space="preserve">. This patchwork of authority is prominent in Pacific salmon management due to the complicated geographic nature of the salmon anadromous life cycle, spanning a variety of freshwater and marine ecosystems coast-wide and across international boundaries. The sustainable stewardship of salmon populations relies on their ability to access a variety of watercourses with connectivity between habitats</w:t>
-      </w:r>
-      <w:r>
-        <w:t xml:space="preserve"> </w:t>
-      </w:r>
-      <w:r>
-        <w:t xml:space="preserve">(Carlson and Baylis 2022)</w:t>
-      </w:r>
-      <w:r>
-        <w:t xml:space="preserve"> </w:t>
-      </w:r>
-      <w:r>
-        <w:t xml:space="preserve">including ephemeral habitats, which are important for fry and juvenile rearing</w:t>
-      </w:r>
-      <w:r>
-        <w:t xml:space="preserve"> </w:t>
-      </w:r>
-      <w:r>
-        <w:t xml:space="preserve">(Dionne 2023)</w:t>
-      </w:r>
-      <w:r>
-        <w:t xml:space="preserve">.</w:t>
+        <w:t xml:space="preserve">The need for collaborative, coordinated action to address Pacific salmon declines is recognized by governments throughout policies, plans, and initiatives (e.g. the WSP,</w:t>
+      </w:r>
+      <w:r>
+        <w:t xml:space="preserve"> </w:t>
+      </w:r>
+      <w:hyperlink r:id="rId30">
+        <w:r>
+          <w:rPr>
+            <w:rStyle w:val="Hyperlink"/>
+          </w:rPr>
+          <w:t xml:space="preserve">the trilateral accord 2024</w:t>
+        </w:r>
+      </w:hyperlink>
+      <w:r>
+        <w:t xml:space="preserve">). Coordinated action requires adequate organizational capacity and systems for implementation to ensure that regulatory controls and mitigation activities address underlying threats to salmon and their habitat. However, linking threats and recovery actions to the relevant regulatory systems can be complex because salmon are often affected by multiple threats that each span across agencies and governmental jurisdiction.</w:t>
       </w:r>
     </w:p>
     <w:p>
@@ -684,25 +640,114 @@
         <w:pStyle w:val="BodyText"/>
       </w:pPr>
       <w:r>
-        <w:t xml:space="preserve">Nearly all salmon populations utilize watersheds with multiple ownership, which creates inconsistent regulation and a patchwork of disconnected critical habitat</w:t>
-      </w:r>
-      <w:r>
-        <w:t xml:space="preserve"> </w:t>
-      </w:r>
-      <w:r>
-        <w:t xml:space="preserve">(Bisson et al. 2009)</w:t>
-      </w:r>
-      <w:r>
-        <w:t xml:space="preserve">. Freshwater habitat in terms of water quantity (discharge and timing) and water quality (temperature and chemistry) are impacted by actions and conditions throughout the entire watershed. Changes in freshwater habitat affects that habitat use timing by salmon and subsequently the salmon life cycle. For example, British Columbia coastal streams with rain-dominated hydrology generally produce ocean-type Chinook salmon (migrate to the ocean within their first year), while snow-dominated interior watersheds produce stream-type Chinook who overwinter in freshwater for one year or more</w:t>
-      </w:r>
-      <w:r>
-        <w:t xml:space="preserve"> </w:t>
-      </w:r>
-      <w:r>
-        <w:t xml:space="preserve">(Dionne 2023)</w:t>
-      </w:r>
-      <w:r>
-        <w:t xml:space="preserve">. Governance over any land use process throughout most watersheds in British Columbia has an impact on salmon population production, habitat capacity, and corresponding long-term food security for British Columbian communities.</w:t>
+        <w:t xml:space="preserve">In this study, we seek to decode the complexity between salmon threats and environmental legislation by creating an interface between regulatory language and anthropogenic threat categories. We describe and apply the Legislation Applicable to Pacific Salmon and their Ecosystems (LAPSE) database, a repository of federal and provincial legislation and regulations that apply to Pacific salmon in British Columbia. Using a novel method for parsing and classifying legislative clauses, we develop keyword relationships between IUCN threats classifications and XXXX clauses from XX acts and XX regulations. By creating an extensive, open-source, and easily accessible database linking legislation to salmon, we aim to facilitate a better understanding of the legislative and regulatory context through which salmon and their ecosystems are governed in British Columbia, while providing a framework to support systematic and critical reviews of strengths and shortcomings of regulations with respect to salmon threats.</w:t>
+      </w:r>
+    </w:p>
+    <w:bookmarkEnd w:id="31"/>
+    <w:bookmarkEnd w:id="32"/>
+    <w:bookmarkStart w:id="37" w:name="X06bc8cf00ca5baea230857c3fdd1788ec12acc8"/>
+    <w:p>
+      <w:pPr>
+        <w:pStyle w:val="Heading1"/>
+      </w:pPr>
+      <w:r>
+        <w:t xml:space="preserve">International Union for Conservation of Nature (IUCN) threat categories</w:t>
+      </w:r>
+    </w:p>
+    <w:p>
+      <w:pPr>
+        <w:pStyle w:val="FirstParagraph"/>
+      </w:pPr>
+      <w:r>
+        <w:t xml:space="preserve">Management decisions and activities related to salmon are often in response to identifiable threats to salmon health and population status. Legislated recovery planning also relies on a description of identified threats</w:t>
+      </w:r>
+      <w:r>
+        <w:t xml:space="preserve"> </w:t>
+      </w:r>
+      <w:r>
+        <w:t xml:space="preserve">(McCune et al. 2013)</w:t>
+      </w:r>
+      <w:r>
+        <w:t xml:space="preserve">. Human systems can be categorized as direct threats to biodiversity more specifically for conservation strategies</w:t>
+      </w:r>
+      <w:r>
+        <w:t xml:space="preserve"> </w:t>
+      </w:r>
+      <w:r>
+        <w:t xml:space="preserve">(Salafsky et al. 2008)</w:t>
+      </w:r>
+      <w:r>
+        <w:t xml:space="preserve">. The</w:t>
+      </w:r>
+      <w:r>
+        <w:t xml:space="preserve"> </w:t>
+      </w:r>
+      <w:r>
+        <w:rPr>
+          <w:i/>
+          <w:iCs/>
+        </w:rPr>
+        <w:t xml:space="preserve">International Union for Conservation of Nature</w:t>
+      </w:r>
+      <w:r>
+        <w:t xml:space="preserve"> </w:t>
+      </w:r>
+      <w:r>
+        <w:t xml:space="preserve">(IUCN) and</w:t>
+      </w:r>
+      <w:r>
+        <w:t xml:space="preserve"> </w:t>
+      </w:r>
+      <w:r>
+        <w:rPr>
+          <w:i/>
+          <w:iCs/>
+        </w:rPr>
+        <w:t xml:space="preserve">Conservation Measures Partnership</w:t>
+      </w:r>
+      <w:r>
+        <w:t xml:space="preserve"> </w:t>
+      </w:r>
+      <w:r>
+        <w:t xml:space="preserve">(CMP) has developed a hierarchical grouping of threats used globally by conservation practitioners. IUCN direct threat categories are widely used to assess threats as part of IUCN red list assessments, as well as, in status assessments for Pacific salmon populations conducted by the</w:t>
+      </w:r>
+      <w:r>
+        <w:t xml:space="preserve"> </w:t>
+      </w:r>
+      <w:r>
+        <w:rPr>
+          <w:i/>
+          <w:iCs/>
+        </w:rPr>
+        <w:t xml:space="preserve">Committee for the Status of Endangered Wildlife in Canada</w:t>
+      </w:r>
+      <w:r>
+        <w:t xml:space="preserve"> </w:t>
+      </w:r>
+      <w:r>
+        <w:t xml:space="preserve">(COSEWIC). For this study, the</w:t>
+      </w:r>
+      <w:r>
+        <w:t xml:space="preserve"> </w:t>
+      </w:r>
+      <w:r>
+        <w:rPr>
+          <w:i/>
+          <w:iCs/>
+        </w:rPr>
+        <w:t xml:space="preserve">IUCN - CMP Direct Threats Classification 4.0</w:t>
+      </w:r>
+      <w:r>
+        <w:t xml:space="preserve"> </w:t>
+      </w:r>
+      <w:r>
+        <w:t xml:space="preserve">(Salafsky et al. 2025)</w:t>
+      </w:r>
+      <w:r>
+        <w:t xml:space="preserve"> </w:t>
+      </w:r>
+      <w:r>
+        <w:t xml:space="preserve">was used to categorize legislation by direct threats to salmon conservation. Level 2 threat classification was used as the finest resolution that could be applied consistently.</w:t>
       </w:r>
     </w:p>
     <w:p>
@@ -710,224 +755,6 @@
         <w:pStyle w:val="BodyText"/>
       </w:pPr>
       <w:r>
-        <w:t xml:space="preserve">Federal parliament and provincial legislatures rely on broadly discretionary terms in statutes that appear protective</w:t>
-      </w:r>
-      <w:r>
-        <w:t xml:space="preserve"> </w:t>
-      </w:r>
-      <w:r>
-        <w:t xml:space="preserve">(Collins and Sossin 2019)</w:t>
-      </w:r>
-      <w:r>
-        <w:t xml:space="preserve">, but may chronically fail to prevent environmental degradation</w:t>
-      </w:r>
-      <w:r>
-        <w:t xml:space="preserve"> </w:t>
-      </w:r>
-      <w:r>
-        <w:t xml:space="preserve">(Bankes et al. 2014)</w:t>
-      </w:r>
-      <w:r>
-        <w:t xml:space="preserve">. One term can make the difference between a clause being mandatory or discretionary (</w:t>
-      </w:r>
-      <w:r>
-        <w:t xml:space="preserve">“</w:t>
-      </w:r>
-      <w:r>
-        <w:t xml:space="preserve">shall</w:t>
-      </w:r>
-      <w:r>
-        <w:t xml:space="preserve">”</w:t>
-      </w:r>
-      <w:r>
-        <w:t xml:space="preserve"> </w:t>
-      </w:r>
-      <w:r>
-        <w:t xml:space="preserve">as opposed to</w:t>
-      </w:r>
-      <w:r>
-        <w:t xml:space="preserve"> </w:t>
-      </w:r>
-      <w:r>
-        <w:t xml:space="preserve">“</w:t>
-      </w:r>
-      <w:r>
-        <w:t xml:space="preserve">may</w:t>
-      </w:r>
-      <w:r>
-        <w:t xml:space="preserve">”</w:t>
-      </w:r>
-      <w:r>
-        <w:t xml:space="preserve">), allowing an official to only exercise that authority or responsibility when economically feasible. The same laws that prohibit killing fish or damaging habitat also contain provisions to authorize those activities through licences, permits, and exemptions</w:t>
-      </w:r>
-      <w:r>
-        <w:t xml:space="preserve"> </w:t>
-      </w:r>
-      <w:r>
-        <w:t xml:space="preserve">(Swerdfager and Olive 2023)</w:t>
-      </w:r>
-      <w:r>
-        <w:t xml:space="preserve">. This vagueness creates a large dependence on the executive to explain these implementation gaps</w:t>
-      </w:r>
-      <w:r>
-        <w:t xml:space="preserve"> </w:t>
-      </w:r>
-      <w:r>
-        <w:t xml:space="preserve">(Bankes et al. 2014)</w:t>
-      </w:r>
-      <w:r>
-        <w:t xml:space="preserve">, allowing for arbitrary and somewhat dysfunctional management styles lacking a broader overseer or responsible agency across the entire salmon life cycle.</w:t>
-      </w:r>
-    </w:p>
-    <w:bookmarkEnd w:id="30"/>
-    <w:bookmarkStart w:id="31" w:name="Xf99c42c3166c79d6e14b14d7da12046c07a47b6"/>
-    <w:p>
-      <w:pPr>
-        <w:pStyle w:val="Heading1"/>
-      </w:pPr>
-      <w:r>
-        <w:t xml:space="preserve">Why study salmon legislation: purpose and objectives</w:t>
-      </w:r>
-    </w:p>
-    <w:p>
-      <w:pPr>
-        <w:pStyle w:val="FirstParagraph"/>
-      </w:pPr>
-      <w:r>
-        <w:t xml:space="preserve">The need for collaborative, transparent decision-making in Pacific salmon management is recognized throughout policies, plans, and initiatives, such as the PSSI and the WSP. Successful conservation and rebuilding of Pacific salmon populations therefore requires coordination of activities across regulatory frameworks. However, such coordination requires adequate organizational capacity and systems for effective implementation to ensure that regulatory controls and mitigation activities address underlying threats that reduce salmon population productivity and limit habitat capacity. Creating an interface between legislative language and salmon biological and ecological components can make regulations more accessible and understandable to practitioners, while providing a framework to support systematic and critical reviews of strengths and shortcomings of regulations with respect to salmon threats.</w:t>
-      </w:r>
-    </w:p>
-    <w:p>
-      <w:pPr>
-        <w:pStyle w:val="BodyText"/>
-      </w:pPr>
-      <w:r>
-        <w:t xml:space="preserve">The overall goal of this effort was to outline a framework and process to better understand the legislative context that governs Pacific salmon in British Columbia related to human activities across jurisdictions. To achieve this, the more specific objectives were to: 1) categorize specific legislation by anthropogenic threats to Pacific salmon; 2) assess legislative factors by threat categorization; and 3) assess threats in a current salmon management context. To better categorize legislation aligned with salmon threats and create an interface between biological management and the regulatory context, this study defined discrete areas of administrative responsibility for Pacific salmon as</w:t>
-      </w:r>
-      <w:r>
-        <w:t xml:space="preserve"> </w:t>
-      </w:r>
-      <w:r>
-        <w:t xml:space="preserve">“</w:t>
-      </w:r>
-      <w:r>
-        <w:t xml:space="preserve">management domains.</w:t>
-      </w:r>
-      <w:r>
-        <w:t xml:space="preserve">”</w:t>
-      </w:r>
-    </w:p>
-    <w:bookmarkEnd w:id="31"/>
-    <w:bookmarkStart w:id="36" w:name="X06bc8cf00ca5baea230857c3fdd1788ec12acc8"/>
-    <w:p>
-      <w:pPr>
-        <w:pStyle w:val="Heading1"/>
-      </w:pPr>
-      <w:r>
-        <w:t xml:space="preserve">International Union for Conservation of Nature (IUCN) threat categories</w:t>
-      </w:r>
-    </w:p>
-    <w:p>
-      <w:pPr>
-        <w:pStyle w:val="FirstParagraph"/>
-      </w:pPr>
-      <w:r>
-        <w:t xml:space="preserve">Management decisions and activities related to salmon are often in response to identifiable threats to salmon health and population status. Legislated recovery planning also relies on a description of identified threats</w:t>
-      </w:r>
-      <w:r>
-        <w:t xml:space="preserve"> </w:t>
-      </w:r>
-      <w:r>
-        <w:t xml:space="preserve">(McCune et al. 2013)</w:t>
-      </w:r>
-      <w:r>
-        <w:t xml:space="preserve">. Human systems can be categorized as direct threats to biodiversity more specifically for conservation strategies</w:t>
-      </w:r>
-      <w:r>
-        <w:t xml:space="preserve"> </w:t>
-      </w:r>
-      <w:r>
-        <w:t xml:space="preserve">(Salafsky et al. 2008)</w:t>
-      </w:r>
-      <w:r>
-        <w:t xml:space="preserve">. The</w:t>
-      </w:r>
-      <w:r>
-        <w:t xml:space="preserve"> </w:t>
-      </w:r>
-      <w:r>
-        <w:rPr>
-          <w:i/>
-          <w:iCs/>
-        </w:rPr>
-        <w:t xml:space="preserve">International Union for Conservation of Nature</w:t>
-      </w:r>
-      <w:r>
-        <w:t xml:space="preserve"> </w:t>
-      </w:r>
-      <w:r>
-        <w:t xml:space="preserve">(IUCN) and</w:t>
-      </w:r>
-      <w:r>
-        <w:t xml:space="preserve"> </w:t>
-      </w:r>
-      <w:r>
-        <w:rPr>
-          <w:i/>
-          <w:iCs/>
-        </w:rPr>
-        <w:t xml:space="preserve">Conservation Measures Partnership</w:t>
-      </w:r>
-      <w:r>
-        <w:t xml:space="preserve"> </w:t>
-      </w:r>
-      <w:r>
-        <w:t xml:space="preserve">(CMP) has developed a hierarchical grouping of threats used globally by conservation practitioners. IUCN direct threat categories are widely used to assess threats as part of IUCN red list assessments, as well as, in status assessments for Pacific salmon populations conducted by the</w:t>
-      </w:r>
-      <w:r>
-        <w:t xml:space="preserve"> </w:t>
-      </w:r>
-      <w:r>
-        <w:rPr>
-          <w:i/>
-          <w:iCs/>
-        </w:rPr>
-        <w:t xml:space="preserve">Committee for the Status of Endangered Wildlife in Canada</w:t>
-      </w:r>
-      <w:r>
-        <w:t xml:space="preserve"> </w:t>
-      </w:r>
-      <w:r>
-        <w:t xml:space="preserve">(COSEWIC). For this study, the</w:t>
-      </w:r>
-      <w:r>
-        <w:t xml:space="preserve"> </w:t>
-      </w:r>
-      <w:r>
-        <w:rPr>
-          <w:i/>
-          <w:iCs/>
-        </w:rPr>
-        <w:t xml:space="preserve">IUCN - CMP Direct Threats Classification 4.0</w:t>
-      </w:r>
-      <w:r>
-        <w:t xml:space="preserve"> </w:t>
-      </w:r>
-      <w:r>
-        <w:t xml:space="preserve">(Salafsky et al. 2025)</w:t>
-      </w:r>
-      <w:r>
-        <w:t xml:space="preserve"> </w:t>
-      </w:r>
-      <w:r>
-        <w:t xml:space="preserve">was used to categorize legislation by direct threats to salmon conservation. Level 2 threat classification was used as the finest resolution that could be applied consistently.</w:t>
-      </w:r>
-    </w:p>
-    <w:p>
-      <w:pPr>
-        <w:pStyle w:val="BodyText"/>
-      </w:pPr>
-      <w:r>
         <w:t xml:space="preserve">Legislative clauses that influence Pacific salmon governance in British Columbia are not always associated with conservation threats. As well, some clauses may involve all threats. For example, statutes that outline species status or determine ecological reserves have relevance to how salmon are managed, but can’t be attributed to any one IUCN threat category. Pacific salmon life history also ranges over a broad geography of marine and freshwater habitat (including terrestrial watershed aspects), touching on almost every conservation threat available. We developed management domain categories through this study as a clearer and more comprehensive alignment between regulatory administrative concern and conservation threat categories (Figure</w:t>
       </w:r>
       <w:r>
@@ -949,18 +776,18 @@
           <wp:inline>
             <wp:extent cx="5943600" cy="3343275"/>
             <wp:effectExtent b="0" l="0" r="0" t="0"/>
-            <wp:docPr descr="Figure 3: Flowchart showing alignment of IUCN Level 2 threat categories with Management Domain in relation to legislation and jurisdiction." title="" id="33" name="Picture"/>
+            <wp:docPr descr="Figure 3: Flowchart showing alignment of IUCN Level 2 threat categories with Management Domain in relation to legislation and jurisdiction." title="" id="34" name="Picture"/>
             <a:graphic>
               <a:graphicData uri="http://schemas.openxmlformats.org/drawingml/2006/picture">
                 <pic:pic>
                   <pic:nvPicPr>
-                    <pic:cNvPr descr="../assets/Management%20Domain%20Flowchart.png" id="34" name="Picture"/>
+                    <pic:cNvPr descr="../assets/Management%20Domain%20Flowchart.png" id="35" name="Picture"/>
                     <pic:cNvPicPr>
                       <a:picLocks noChangeArrowheads="1" noChangeAspect="1"/>
                     </pic:cNvPicPr>
                   </pic:nvPicPr>
                   <pic:blipFill>
-                    <a:blip r:embed="rId32"/>
+                    <a:blip r:embed="rId33"/>
                     <a:stretch>
                       <a:fillRect/>
                     </a:stretch>
@@ -991,14 +818,14 @@
       <w:pPr>
         <w:pStyle w:val="ImageCaption"/>
       </w:pPr>
-      <w:bookmarkStart w:id="35" w:name="fig:fig-flowchart-image"/>
-      <w:bookmarkEnd w:id="35"/>
+      <w:bookmarkStart w:id="36" w:name="fig:fig-flowchart-image"/>
+      <w:bookmarkEnd w:id="36"/>
       <w:r>
         <w:t xml:space="preserve">Figure 3: Flowchart showing alignment of IUCN Level 2 threat categories with Management Domain in relation to legislation and jurisdiction.</w:t>
       </w:r>
     </w:p>
-    <w:bookmarkEnd w:id="36"/>
-    <w:bookmarkStart w:id="46" w:name="a-process-for-clause-categorization"/>
+    <w:bookmarkEnd w:id="37"/>
+    <w:bookmarkStart w:id="47" w:name="a-process-for-clause-categorization"/>
     <w:p>
       <w:pPr>
         <w:pStyle w:val="Heading1"/>
@@ -1012,10 +839,10 @@
         <w:pStyle w:val="FirstParagraph"/>
       </w:pPr>
       <w:r>
-        <w:t xml:space="preserve">Assessment of legislative context is prone to subjective interpretation. The inclusion and exclusion of both the overall acts and the clauses within the acts creates points of assumption and bias. For this exercise we cast as wide a net as possible and created a process that is publicly accessible, automated, and repeatable. Other researchers may repeat this process as future legislation and language changes. The process steps are: accumulate and review legislation (CanLii); parse legislation by clause (paragraph), section, and heading (R); match management domain and IUCN threat keywords to clauses (R); assign salmon-specific scope catgories (R); match clause type keywords to clauses (R).</w:t>
+        <w:t xml:space="preserve">Assessment of legislative context is prone to subjective interpretation. The inclusion and exclusion of both the overall acts and the clauses within the acts creates points of assumption and bias. For this exercise we cast as wide a net as possible and created a process that is publicly accessible, automated, and repeatable if legislation changes. The process steps are: accumulate and review legislation (CanLii); parse legislation by clause (paragraph), section, and heading; match management domain and IUCN threat keywords to clauses; assign salmon-specific scope categories; match clause type keywords to clauses.</w:t>
       </w:r>
     </w:p>
-    <w:bookmarkStart w:id="38" w:name="legislation-accumulation-and-review"/>
+    <w:bookmarkStart w:id="39" w:name="legislation-accumulation-and-review"/>
     <w:p>
       <w:pPr>
         <w:pStyle w:val="Heading2"/>
@@ -1115,8 +942,8 @@
       <w:pPr>
         <w:pStyle w:val="TableCaption"/>
       </w:pPr>
-      <w:bookmarkStart w:id="37" w:name="tab:legislation-summary-table"/>
-      <w:bookmarkEnd w:id="37"/>
+      <w:bookmarkStart w:id="38" w:name="tab:legislation-summary-table"/>
+      <w:bookmarkEnd w:id="38"/>
       <w:r>
         <w:t xml:space="preserve">Table 1:</w:t>
       </w:r>
@@ -2471,8 +2298,8 @@
         <w:br/>
       </w:r>
     </w:p>
-    <w:bookmarkEnd w:id="38"/>
-    <w:bookmarkStart w:id="43" w:name="legistics-parsing-legislation"/>
+    <w:bookmarkEnd w:id="39"/>
+    <w:bookmarkStart w:id="44" w:name="legistics-parsing-legislation"/>
     <w:p>
       <w:pPr>
         <w:pStyle w:val="Heading2"/>
@@ -2528,18 +2355,18 @@
           <wp:inline>
             <wp:extent cx="5943600" cy="2139048"/>
             <wp:effectExtent b="0" l="0" r="0" t="0"/>
-            <wp:docPr descr="Figure 4: Fisheries Act (federal) examples of paragraph parsing from HTML code." title="" id="40" name="Picture"/>
+            <wp:docPr descr="Figure 4: Fisheries Act (federal) examples of paragraph parsing from HTML code." title="" id="41" name="Picture"/>
             <a:graphic>
               <a:graphicData uri="http://schemas.openxmlformats.org/drawingml/2006/picture">
                 <pic:pic>
                   <pic:nvPicPr>
-                    <pic:cNvPr descr="../assets/Legistics%20Paragraphing.png" id="41" name="Picture"/>
+                    <pic:cNvPr descr="../assets/Legistics%20Paragraphing.png" id="42" name="Picture"/>
                     <pic:cNvPicPr>
                       <a:picLocks noChangeArrowheads="1" noChangeAspect="1"/>
                     </pic:cNvPicPr>
                   </pic:nvPicPr>
                   <pic:blipFill>
-                    <a:blip r:embed="rId39"/>
+                    <a:blip r:embed="rId40"/>
                     <a:stretch>
                       <a:fillRect/>
                     </a:stretch>
@@ -2570,8 +2397,8 @@
       <w:pPr>
         <w:pStyle w:val="ImageCaption"/>
       </w:pPr>
-      <w:bookmarkStart w:id="42" w:name="fig:fig-legistics-paragraphing"/>
-      <w:bookmarkEnd w:id="42"/>
+      <w:bookmarkStart w:id="43" w:name="fig:fig-legistics-paragraphing"/>
+      <w:bookmarkEnd w:id="43"/>
       <w:r>
         <w:t xml:space="preserve">Figure 4: Fisheries Act (federal) examples of paragraph parsing from HTML code.</w:t>
       </w:r>
@@ -2629,8 +2456,8 @@
         <w:t xml:space="preserve">package to extract the text of each clause, then grouped by section and heading.</w:t>
       </w:r>
     </w:p>
-    <w:bookmarkEnd w:id="43"/>
-    <w:bookmarkStart w:id="44" w:name="compendium-development"/>
+    <w:bookmarkEnd w:id="44"/>
+    <w:bookmarkStart w:id="45" w:name="compendium-development"/>
     <w:p>
       <w:pPr>
         <w:pStyle w:val="Heading2"/>
@@ -2647,8 +2474,8 @@
         <w:t xml:space="preserve">The parsed legislation was stored in a SQLite database with datatables including jurisdiction, act name, legislation name, legislation type, paragraph content, section, heading, management domain, IUCN threat category, scope, and keywords matched. Storing the data as a database rather than one large spreadsheet allowed for a more dynamic and versatile system for querying, while streamlining the parsing and collection process.</w:t>
       </w:r>
     </w:p>
-    <w:bookmarkEnd w:id="44"/>
-    <w:bookmarkStart w:id="45" w:name="keyword-and-keyphrase-development"/>
+    <w:bookmarkEnd w:id="45"/>
+    <w:bookmarkStart w:id="46" w:name="keyword-and-keyphrase-development"/>
     <w:p>
       <w:pPr>
         <w:pStyle w:val="Heading2"/>
@@ -2882,7 +2709,7 @@
         <w:pStyle w:val="Compact"/>
         <w:numPr>
           <w:ilvl w:val="0"/>
-          <w:numId w:val="1003"/>
+          <w:numId w:val="1002"/>
         </w:numPr>
       </w:pPr>
       <w:r>
@@ -2907,9 +2734,9 @@
         <w:t xml:space="preserve">(Ray et al. 2021)</w:t>
       </w:r>
     </w:p>
-    <w:bookmarkEnd w:id="45"/>
     <w:bookmarkEnd w:id="46"/>
-    <w:bookmarkStart w:id="67" w:name="X21d2b709a3b2e27437c410286f2936ef3517541"/>
+    <w:bookmarkEnd w:id="47"/>
+    <w:bookmarkStart w:id="68" w:name="X21d2b709a3b2e27437c410286f2936ef3517541"/>
     <w:p>
       <w:pPr>
         <w:pStyle w:val="Heading1"/>
@@ -2939,8 +2766,8 @@
       <w:pPr>
         <w:pStyle w:val="TableCaption"/>
       </w:pPr>
-      <w:bookmarkStart w:id="47" w:name="tab:management-domain-tally"/>
-      <w:bookmarkEnd w:id="47"/>
+      <w:bookmarkStart w:id="48" w:name="tab:management-domain-tally"/>
+      <w:bookmarkEnd w:id="48"/>
       <w:r>
         <w:t xml:space="preserve">Table 2:</w:t>
       </w:r>
@@ -6773,18 +6600,18 @@
           <wp:inline>
             <wp:extent cx="5943600" cy="4457699"/>
             <wp:effectExtent b="0" l="0" r="0" t="0"/>
-            <wp:docPr descr="Figure 5: Count of sections matched by management domain, stacked by jurisdiction." title="" id="49" name="Picture"/>
+            <wp:docPr descr="Figure 5: Count of sections matched by management domain, stacked by jurisdiction." title="" id="50" name="Picture"/>
             <a:graphic>
               <a:graphicData uri="http://schemas.openxmlformats.org/drawingml/2006/picture">
                 <pic:pic>
                   <pic:nvPicPr>
-                    <pic:cNvPr descr="LAPSE_primary_publication_files/figure-docx/section-count-by-management-domain-1.png" id="50" name="Picture"/>
+                    <pic:cNvPr descr="LAPSE_primary_publication_files/figure-docx/section-count-by-management-domain-1.png" id="51" name="Picture"/>
                     <pic:cNvPicPr>
                       <a:picLocks noChangeArrowheads="1" noChangeAspect="1"/>
                     </pic:cNvPicPr>
                   </pic:nvPicPr>
                   <pic:blipFill>
-                    <a:blip r:embed="rId48"/>
+                    <a:blip r:embed="rId49"/>
                     <a:stretch>
                       <a:fillRect/>
                     </a:stretch>
@@ -6815,13 +6642,13 @@
       <w:pPr>
         <w:pStyle w:val="ImageCaption"/>
       </w:pPr>
-      <w:bookmarkStart w:id="51" w:name="fig:section-count-by-management-domain"/>
-      <w:bookmarkEnd w:id="51"/>
+      <w:bookmarkStart w:id="52" w:name="fig:section-count-by-management-domain"/>
+      <w:bookmarkEnd w:id="52"/>
       <w:r>
         <w:t xml:space="preserve">Figure 5: Count of sections matched by management domain, stacked by jurisdiction.</w:t>
       </w:r>
     </w:p>
-    <w:bookmarkStart w:id="56" w:name="iucn-level-2-categories"/>
+    <w:bookmarkStart w:id="57" w:name="iucn-level-2-categories"/>
     <w:p>
       <w:pPr>
         <w:pStyle w:val="Heading2"/>
@@ -6910,18 +6737,18 @@
           <wp:inline>
             <wp:extent cx="5943600" cy="4754880"/>
             <wp:effectExtent b="0" l="0" r="0" t="0"/>
-            <wp:docPr descr="Figure 6: Section counts by IUCN threat category, separated by jurisdiction." title="" id="53" name="Picture"/>
+            <wp:docPr descr="Figure 6: Section counts by IUCN threat category, separated by jurisdiction." title="" id="54" name="Picture"/>
             <a:graphic>
               <a:graphicData uri="http://schemas.openxmlformats.org/drawingml/2006/picture">
                 <pic:pic>
                   <pic:nvPicPr>
-                    <pic:cNvPr descr="LAPSE_primary_publication_files/figure-docx/fig-section-count-by-iucn-1.png" id="54" name="Picture"/>
+                    <pic:cNvPr descr="LAPSE_primary_publication_files/figure-docx/fig-section-count-by-iucn-1.png" id="55" name="Picture"/>
                     <pic:cNvPicPr>
                       <a:picLocks noChangeArrowheads="1" noChangeAspect="1"/>
                     </pic:cNvPicPr>
                   </pic:nvPicPr>
                   <pic:blipFill>
-                    <a:blip r:embed="rId52"/>
+                    <a:blip r:embed="rId53"/>
                     <a:stretch>
                       <a:fillRect/>
                     </a:stretch>
@@ -6952,14 +6779,14 @@
       <w:pPr>
         <w:pStyle w:val="ImageCaption"/>
       </w:pPr>
-      <w:bookmarkStart w:id="55" w:name="fig:fig-section-count-by-iucn"/>
-      <w:bookmarkEnd w:id="55"/>
+      <w:bookmarkStart w:id="56" w:name="fig:fig-section-count-by-iucn"/>
+      <w:bookmarkEnd w:id="56"/>
       <w:r>
         <w:t xml:space="preserve">Figure 6: Section counts by IUCN threat category, separated by jurisdiction.</w:t>
       </w:r>
     </w:p>
-    <w:bookmarkEnd w:id="56"/>
-    <w:bookmarkStart w:id="66" w:name="salmon-specific-scope"/>
+    <w:bookmarkEnd w:id="57"/>
+    <w:bookmarkStart w:id="67" w:name="salmon-specific-scope"/>
     <w:p>
       <w:pPr>
         <w:pStyle w:val="Heading2"/>
@@ -7084,18 +6911,18 @@
           <wp:inline>
             <wp:extent cx="5943600" cy="5200649"/>
             <wp:effectExtent b="0" l="0" r="0" t="0"/>
-            <wp:docPr descr="Figure 7: Proportion of sections by management domain, displayed as concentric rings representing scope categories (inner to outer: 1 - Salmon, 2 - Fish, 3 - Habitat, 4 - Governance)." title="" id="58" name="Picture"/>
+            <wp:docPr descr="Figure 7: Proportion of sections by management domain, displayed as concentric rings representing scope categories (inner to outer: 1 - Salmon, 2 - Fish, 3 - Habitat, 4 - Governance)." title="" id="59" name="Picture"/>
             <a:graphic>
               <a:graphicData uri="http://schemas.openxmlformats.org/drawingml/2006/picture">
                 <pic:pic>
                   <pic:nvPicPr>
-                    <pic:cNvPr descr="LAPSE_primary_publication_files/figure-docx/multiscope-donut-1.png" id="59" name="Picture"/>
+                    <pic:cNvPr descr="LAPSE_primary_publication_files/figure-docx/multiscope-donut-1.png" id="60" name="Picture"/>
                     <pic:cNvPicPr>
                       <a:picLocks noChangeArrowheads="1" noChangeAspect="1"/>
                     </pic:cNvPicPr>
                   </pic:nvPicPr>
                   <pic:blipFill>
-                    <a:blip r:embed="rId57"/>
+                    <a:blip r:embed="rId58"/>
                     <a:stretch>
                       <a:fillRect/>
                     </a:stretch>
@@ -7126,8 +6953,8 @@
       <w:pPr>
         <w:pStyle w:val="ImageCaption"/>
       </w:pPr>
-      <w:bookmarkStart w:id="60" w:name="fig:multiscope-donut"/>
-      <w:bookmarkEnd w:id="60"/>
+      <w:bookmarkStart w:id="61" w:name="fig:multiscope-donut"/>
+      <w:bookmarkEnd w:id="61"/>
       <w:r>
         <w:t xml:space="preserve">Figure 7: Proportion of sections by management domain, displayed as concentric rings representing scope categories (inner to outer: 1 - Salmon, 2 - Fish, 3 - Habitat, 4 - Governance).</w:t>
       </w:r>
@@ -7240,8 +7067,8 @@
       <w:pPr>
         <w:pStyle w:val="TableCaption"/>
       </w:pPr>
-      <w:bookmarkStart w:id="61" w:name="tab:scope-tally"/>
-      <w:bookmarkEnd w:id="61"/>
+      <w:bookmarkStart w:id="62" w:name="tab:scope-tally"/>
+      <w:bookmarkEnd w:id="62"/>
       <w:r>
         <w:t xml:space="preserve">Table 3:</w:t>
       </w:r>
@@ -8685,18 +8512,18 @@
           <wp:inline>
             <wp:extent cx="5943600" cy="4457699"/>
             <wp:effectExtent b="0" l="0" r="0" t="0"/>
-            <wp:docPr descr="Figure 8: Count of sections by legislation for scope category ‘1 - Salmon’, coloured by jurisdiction." title="" id="63" name="Picture"/>
+            <wp:docPr descr="Figure 8: Count of sections by legislation for scope category ‘1 - Salmon’, coloured by jurisdiction." title="" id="64" name="Picture"/>
             <a:graphic>
               <a:graphicData uri="http://schemas.openxmlformats.org/drawingml/2006/picture">
                 <pic:pic>
                   <pic:nvPicPr>
-                    <pic:cNvPr descr="LAPSE_primary_publication_files/figure-docx/section-count-salmon-scope-1.png" id="64" name="Picture"/>
+                    <pic:cNvPr descr="LAPSE_primary_publication_files/figure-docx/section-count-salmon-scope-1.png" id="65" name="Picture"/>
                     <pic:cNvPicPr>
                       <a:picLocks noChangeArrowheads="1" noChangeAspect="1"/>
                     </pic:cNvPicPr>
                   </pic:nvPicPr>
                   <pic:blipFill>
-                    <a:blip r:embed="rId62"/>
+                    <a:blip r:embed="rId63"/>
                     <a:stretch>
                       <a:fillRect/>
                     </a:stretch>
@@ -8727,8 +8554,8 @@
       <w:pPr>
         <w:pStyle w:val="ImageCaption"/>
       </w:pPr>
-      <w:bookmarkStart w:id="65" w:name="fig:section-count-salmon-scope"/>
-      <w:bookmarkEnd w:id="65"/>
+      <w:bookmarkStart w:id="66" w:name="fig:section-count-salmon-scope"/>
+      <w:bookmarkEnd w:id="66"/>
       <w:r>
         <w:t xml:space="preserve">Figure 8: Count of sections by legislation for scope category</w:t>
       </w:r>
@@ -8756,9 +8583,9 @@
         <w:br/>
       </w:r>
     </w:p>
-    <w:bookmarkEnd w:id="66"/>
     <w:bookmarkEnd w:id="67"/>
-    <w:bookmarkStart w:id="69" w:name="legislative-factors-clause-types"/>
+    <w:bookmarkEnd w:id="68"/>
+    <w:bookmarkStart w:id="70" w:name="legislative-factors-clause-types"/>
     <w:p>
       <w:pPr>
         <w:pStyle w:val="Heading1"/>
@@ -8806,8 +8633,8 @@
       <w:pPr>
         <w:pStyle w:val="TableCaption"/>
       </w:pPr>
-      <w:bookmarkStart w:id="68" w:name="tab:clause-type-with-domain-tally"/>
-      <w:bookmarkEnd w:id="68"/>
+      <w:bookmarkStart w:id="69" w:name="tab:clause-type-with-domain-tally"/>
+      <w:bookmarkEnd w:id="69"/>
       <w:r>
         <w:t xml:space="preserve">Table 4:</w:t>
       </w:r>
@@ -17199,8 +17026,8 @@
         <w:br/>
       </w:r>
     </w:p>
-    <w:bookmarkEnd w:id="69"/>
-    <w:bookmarkStart w:id="87" w:name="X3d1f28ebf57a42a02e6321b912ef3127a66a1d5"/>
+    <w:bookmarkEnd w:id="70"/>
+    <w:bookmarkStart w:id="88" w:name="X3d1f28ebf57a42a02e6321b912ef3127a66a1d5"/>
     <w:p>
       <w:pPr>
         <w:pStyle w:val="Heading1"/>
@@ -17328,8 +17155,8 @@
       <w:pPr>
         <w:pStyle w:val="TableCaption"/>
       </w:pPr>
-      <w:bookmarkStart w:id="70" w:name="tab:cu-species-cu-name-table"/>
-      <w:bookmarkEnd w:id="70"/>
+      <w:bookmarkStart w:id="71" w:name="tab:cu-species-cu-name-table"/>
+      <w:bookmarkEnd w:id="71"/>
       <w:r>
         <w:t xml:space="preserve">Table 5:</w:t>
       </w:r>
@@ -21103,18 +20930,18 @@
           <wp:inline>
             <wp:extent cx="5943600" cy="4457699"/>
             <wp:effectExtent b="0" l="0" r="0" t="0"/>
-            <wp:docPr descr="Figure 9: Conservation Unit count across IUCN threat categories and RPA threat rankings. Darker cells indicate more Conservation Units assessed at that threat level." title="" id="72" name="Picture"/>
+            <wp:docPr descr="Figure 9: Conservation Unit count across IUCN threat categories and RPA threat rankings. Darker cells indicate more Conservation Units assessed at that threat level." title="" id="73" name="Picture"/>
             <a:graphic>
               <a:graphicData uri="http://schemas.openxmlformats.org/drawingml/2006/picture">
                 <pic:pic>
                   <pic:nvPicPr>
-                    <pic:cNvPr descr="LAPSE_primary_publication_files/figure-docx/cu-ranking-heatmap-1.png" id="73" name="Picture"/>
+                    <pic:cNvPr descr="LAPSE_primary_publication_files/figure-docx/cu-ranking-heatmap-1.png" id="74" name="Picture"/>
                     <pic:cNvPicPr>
                       <a:picLocks noChangeArrowheads="1" noChangeAspect="1"/>
                     </pic:cNvPicPr>
                   </pic:nvPicPr>
                   <pic:blipFill>
-                    <a:blip r:embed="rId71"/>
+                    <a:blip r:embed="rId72"/>
                     <a:stretch>
                       <a:fillRect/>
                     </a:stretch>
@@ -21145,13 +20972,13 @@
       <w:pPr>
         <w:pStyle w:val="ImageCaption"/>
       </w:pPr>
-      <w:bookmarkStart w:id="74" w:name="fig:cu-ranking-heatmap"/>
-      <w:bookmarkEnd w:id="74"/>
+      <w:bookmarkStart w:id="75" w:name="fig:cu-ranking-heatmap"/>
+      <w:bookmarkEnd w:id="75"/>
       <w:r>
         <w:t xml:space="preserve">Figure 9: Conservation Unit count across IUCN threat categories and RPA threat rankings. Darker cells indicate more Conservation Units assessed at that threat level.</w:t>
       </w:r>
     </w:p>
-    <w:bookmarkStart w:id="80" w:name="case-study-iucn-10.1-geological-events"/>
+    <w:bookmarkStart w:id="81" w:name="case-study-iucn-10.1-geological-events"/>
     <w:p>
       <w:pPr>
         <w:pStyle w:val="Heading2"/>
@@ -21247,8 +21074,8 @@
       <w:pPr>
         <w:pStyle w:val="TableCaption"/>
       </w:pPr>
-      <w:bookmarkStart w:id="75" w:name="tab:cu-extreme-threat-table"/>
-      <w:bookmarkEnd w:id="75"/>
+      <w:bookmarkStart w:id="76" w:name="tab:cu-extreme-threat-table"/>
+      <w:bookmarkEnd w:id="76"/>
       <w:r>
         <w:t xml:space="preserve">Table 6:</w:t>
       </w:r>
@@ -21956,18 +21783,18 @@
           <wp:inline>
             <wp:extent cx="5943600" cy="4245428"/>
             <wp:effectExtent b="0" l="0" r="0" t="0"/>
-            <wp:docPr descr="Figure 10: Section counts by clause type for IUCN threat category 10.1 Geological Events." title="" id="77" name="Picture"/>
+            <wp:docPr descr="Figure 10: Section counts by clause type for IUCN threat category 10.1 Geological Events." title="" id="78" name="Picture"/>
             <a:graphic>
               <a:graphicData uri="http://schemas.openxmlformats.org/drawingml/2006/picture">
                 <pic:pic>
                   <pic:nvPicPr>
-                    <pic:cNvPr descr="LAPSE_primary_publication_files/figure-docx/fig-clause-type-geological-events-1.png" id="78" name="Picture"/>
+                    <pic:cNvPr descr="LAPSE_primary_publication_files/figure-docx/fig-clause-type-geological-events-1.png" id="79" name="Picture"/>
                     <pic:cNvPicPr>
                       <a:picLocks noChangeArrowheads="1" noChangeAspect="1"/>
                     </pic:cNvPicPr>
                   </pic:nvPicPr>
                   <pic:blipFill>
-                    <a:blip r:embed="rId76"/>
+                    <a:blip r:embed="rId77"/>
                     <a:stretch>
                       <a:fillRect/>
                     </a:stretch>
@@ -21998,8 +21825,8 @@
       <w:pPr>
         <w:pStyle w:val="ImageCaption"/>
       </w:pPr>
-      <w:bookmarkStart w:id="79" w:name="fig:fig-clause-type-geological-events"/>
-      <w:bookmarkEnd w:id="79"/>
+      <w:bookmarkStart w:id="80" w:name="fig:fig-clause-type-geological-events"/>
+      <w:bookmarkEnd w:id="80"/>
       <w:r>
         <w:t xml:space="preserve">Figure 10: Section counts by clause type for IUCN threat category 10.1 Geological Events.</w:t>
       </w:r>
@@ -22008,7 +21835,7 @@
       <w:pPr>
         <w:numPr>
           <w:ilvl w:val="0"/>
-          <w:numId w:val="1004"/>
+          <w:numId w:val="1003"/>
         </w:numPr>
       </w:pPr>
       <w:r>
@@ -22023,7 +21850,7 @@
       <w:pPr>
         <w:numPr>
           <w:ilvl w:val="0"/>
-          <w:numId w:val="1004"/>
+          <w:numId w:val="1003"/>
         </w:numPr>
       </w:pPr>
       <w:r>
@@ -22034,8 +21861,8 @@
         <w:t xml:space="preserve">Comment on the most relevant legislation and why</w:t>
       </w:r>
     </w:p>
-    <w:bookmarkEnd w:id="80"/>
-    <w:bookmarkStart w:id="86" w:name="X0845d6834917053ec444eadf52e64b0021c48a3"/>
+    <w:bookmarkEnd w:id="81"/>
+    <w:bookmarkStart w:id="87" w:name="X0845d6834917053ec444eadf52e64b0021c48a3"/>
     <w:p>
       <w:pPr>
         <w:pStyle w:val="Heading2"/>
@@ -22113,8 +21940,8 @@
       <w:pPr>
         <w:pStyle w:val="TableCaption"/>
       </w:pPr>
-      <w:bookmarkStart w:id="81" w:name="tab:cu-extreme-high-threat-table"/>
-      <w:bookmarkEnd w:id="81"/>
+      <w:bookmarkStart w:id="82" w:name="tab:cu-extreme-high-threat-table"/>
+      <w:bookmarkEnd w:id="82"/>
       <w:r>
         <w:t xml:space="preserve">Table 7:</w:t>
       </w:r>
@@ -22464,18 +22291,18 @@
           <wp:inline>
             <wp:extent cx="5943600" cy="4245428"/>
             <wp:effectExtent b="0" l="0" r="0" t="0"/>
-            <wp:docPr descr="Figure 11: Section counts by clause type for IUCN threat category 7.2 Dams &amp; Water Management / Use." title="" id="83" name="Picture"/>
+            <wp:docPr descr="Figure 11: Section counts by clause type for IUCN threat category 7.2 Dams &amp; Water Management / Use." title="" id="84" name="Picture"/>
             <a:graphic>
               <a:graphicData uri="http://schemas.openxmlformats.org/drawingml/2006/picture">
                 <pic:pic>
                   <pic:nvPicPr>
-                    <pic:cNvPr descr="LAPSE_primary_publication_files/figure-docx/fig-clause-type-water-use-1.png" id="84" name="Picture"/>
+                    <pic:cNvPr descr="LAPSE_primary_publication_files/figure-docx/fig-clause-type-water-use-1.png" id="85" name="Picture"/>
                     <pic:cNvPicPr>
                       <a:picLocks noChangeArrowheads="1" noChangeAspect="1"/>
                     </pic:cNvPicPr>
                   </pic:nvPicPr>
                   <pic:blipFill>
-                    <a:blip r:embed="rId82"/>
+                    <a:blip r:embed="rId83"/>
                     <a:stretch>
                       <a:fillRect/>
                     </a:stretch>
@@ -22506,8 +22333,8 @@
       <w:pPr>
         <w:pStyle w:val="ImageCaption"/>
       </w:pPr>
-      <w:bookmarkStart w:id="85" w:name="fig:fig-clause-type-water-use"/>
-      <w:bookmarkEnd w:id="85"/>
+      <w:bookmarkStart w:id="86" w:name="fig:fig-clause-type-water-use"/>
+      <w:bookmarkEnd w:id="86"/>
       <w:r>
         <w:t xml:space="preserve">Figure 11: Section counts by clause type for IUCN threat category 7.2 Dams &amp; Water Management / Use.</w:t>
       </w:r>
@@ -22516,7 +22343,7 @@
       <w:pPr>
         <w:numPr>
           <w:ilvl w:val="0"/>
-          <w:numId w:val="1005"/>
+          <w:numId w:val="1004"/>
         </w:numPr>
       </w:pPr>
       <w:r>
@@ -22531,7 +22358,7 @@
       <w:pPr>
         <w:numPr>
           <w:ilvl w:val="0"/>
-          <w:numId w:val="1005"/>
+          <w:numId w:val="1004"/>
         </w:numPr>
       </w:pPr>
       <w:r>
@@ -22542,9 +22369,9 @@
         <w:t xml:space="preserve">Comment on the most relevant legislation and why</w:t>
       </w:r>
     </w:p>
-    <w:bookmarkEnd w:id="86"/>
     <w:bookmarkEnd w:id="87"/>
-    <w:bookmarkStart w:id="88" w:name="co-occurrence-of-management-domains"/>
+    <w:bookmarkEnd w:id="88"/>
+    <w:bookmarkStart w:id="89" w:name="co-occurrence-of-management-domains"/>
     <w:p>
       <w:pPr>
         <w:pStyle w:val="Heading1"/>
@@ -22649,14 +22476,14 @@
         <w:t xml:space="preserve">Domain co-occurrence within sections allows for an interesting study of how management domains overlap (Figure 11). A frequent co-occurrence among management domains doesn’t necessarily represent a relationship in reality, simply the legal framing used to regulate these aspects. The Pollution management domain and Water Use and Watercourse Modifications are in the top four most matched to sections (Figure 4), and expectedly, these domains have the largest number of co-occurrences. Both domains relate generally to the impacts from anthropogenic industrialization and commercial development, which is reflected in the legal language.</w:t>
       </w:r>
     </w:p>
-    <w:bookmarkEnd w:id="88"/>
-    <w:bookmarkStart w:id="89" w:name="conclusions"/>
+    <w:bookmarkEnd w:id="89"/>
+    <w:bookmarkStart w:id="91" w:name="discussion"/>
     <w:p>
       <w:pPr>
         <w:pStyle w:val="Heading1"/>
       </w:pPr>
       <w:r>
-        <w:t xml:space="preserve">Conclusions</w:t>
+        <w:t xml:space="preserve">Discussion</w:t>
       </w:r>
     </w:p>
     <w:p>
@@ -22664,7 +22491,16 @@
         <w:pStyle w:val="FirstParagraph"/>
       </w:pPr>
       <w:r>
-        <w:t xml:space="preserve">Pacific salmon management projects (e.g. monitoring, restoration, enhancement, etc.) and decision processes often consider policies, methodologies, and literature, but the federal and provincial legislation that regulates human activities is not often reviewed. Legislative language can be vague and illusive, and the administrative structure of salmon jurisdiction in British Columbia is a decentralized and overlapping mosaic. The disconnect between legislative and natural resource language can lead to ineffective compliance with social values. The Legislation Applicable to Pacific Salmon and Ecosystems (LAPSE) process developed through this study attempts to bridge the language gap to equip practitioners with fuller knowledge of the legal landscape available.</w:t>
+        <w:t xml:space="preserve">Socio-political boundaries at multiple spatial scales across a species’ range increase ambiguity regarding the ownership and regulation of space</w:t>
+      </w:r>
+      <w:r>
+        <w:t xml:space="preserve"> </w:t>
+      </w:r>
+      <w:r>
+        <w:t xml:space="preserve">(Dallimer and Strange 2015)</w:t>
+      </w:r>
+      <w:r>
+        <w:t xml:space="preserve">.</w:t>
       </w:r>
     </w:p>
     <w:p>
@@ -22672,11 +22508,186 @@
         <w:pStyle w:val="BodyText"/>
       </w:pPr>
       <w:r>
+        <w:t xml:space="preserve">Federal parliament and provincial legislatures rely on broadly discretionary terms in statutes that appear protective</w:t>
+      </w:r>
+      <w:r>
+        <w:t xml:space="preserve"> </w:t>
+      </w:r>
+      <w:r>
+        <w:t xml:space="preserve">(Collins and Sossin 2019)</w:t>
+      </w:r>
+      <w:r>
+        <w:t xml:space="preserve">, but may chronically fail to prevent environmental degradation</w:t>
+      </w:r>
+      <w:r>
+        <w:t xml:space="preserve"> </w:t>
+      </w:r>
+      <w:r>
+        <w:t xml:space="preserve">(Bankes et al. 2014)</w:t>
+      </w:r>
+      <w:r>
+        <w:t xml:space="preserve">. One term can make the difference between a clause being mandatory or discretionary (</w:t>
+      </w:r>
+      <w:r>
+        <w:t xml:space="preserve">“</w:t>
+      </w:r>
+      <w:r>
+        <w:t xml:space="preserve">shall</w:t>
+      </w:r>
+      <w:r>
+        <w:t xml:space="preserve">”</w:t>
+      </w:r>
+      <w:r>
+        <w:t xml:space="preserve"> </w:t>
+      </w:r>
+      <w:r>
+        <w:t xml:space="preserve">as opposed to</w:t>
+      </w:r>
+      <w:r>
+        <w:t xml:space="preserve"> </w:t>
+      </w:r>
+      <w:r>
+        <w:t xml:space="preserve">“</w:t>
+      </w:r>
+      <w:r>
+        <w:t xml:space="preserve">may</w:t>
+      </w:r>
+      <w:r>
+        <w:t xml:space="preserve">”</w:t>
+      </w:r>
+      <w:r>
+        <w:t xml:space="preserve">), allowing an official to only exercise that authority or responsibility when economically feasible. The same laws that prohibit killing fish or damaging habitat also contain provisions to authorize those activities through licences, permits, and exemptions</w:t>
+      </w:r>
+      <w:r>
+        <w:t xml:space="preserve"> </w:t>
+      </w:r>
+      <w:r>
+        <w:t xml:space="preserve">(Swerdfager and Olive 2023)</w:t>
+      </w:r>
+      <w:r>
+        <w:t xml:space="preserve">. This vagueness creates a large dependence on the executive to explain these implementation gaps</w:t>
+      </w:r>
+      <w:r>
+        <w:t xml:space="preserve"> </w:t>
+      </w:r>
+      <w:r>
+        <w:t xml:space="preserve">(Bankes et al. 2014)</w:t>
+      </w:r>
+      <w:r>
+        <w:t xml:space="preserve">, allowing for arbitrary and somewhat dysfunctional management styles lacking a broader overseer or responsible agency across the entire salmon life cycle.</w:t>
+      </w:r>
+    </w:p>
+    <w:p>
+      <w:pPr>
+        <w:pStyle w:val="BodyText"/>
+      </w:pPr>
+      <w:r>
+        <w:t xml:space="preserve">Federal departments differ in how they implement the same legislation. For example, during the</w:t>
+      </w:r>
+      <w:r>
+        <w:t xml:space="preserve"> </w:t>
+      </w:r>
+      <w:r>
+        <w:rPr>
+          <w:i/>
+          <w:iCs/>
+        </w:rPr>
+        <w:t xml:space="preserve">Species At Risk Act</w:t>
+      </w:r>
+      <w:r>
+        <w:t xml:space="preserve"> </w:t>
+      </w:r>
+      <w:r>
+        <w:t xml:space="preserve">listing process, Fisheries and Oceans Canada (DFO) conducts socio-economic analyses, whereas Environment and Climate Change Canada (ECCC) does not</w:t>
+      </w:r>
+      <w:r>
+        <w:t xml:space="preserve"> </w:t>
+      </w:r>
+      <w:r>
+        <w:t xml:space="preserve">(Turcotte et al. 2021)</w:t>
+      </w:r>
+      <w:r>
+        <w:t xml:space="preserve">.</w:t>
+      </w:r>
+      <w:r>
+        <w:t xml:space="preserve"> </w:t>
+      </w:r>
+      <w:r>
+        <w:rPr>
+          <w:i/>
+          <w:iCs/>
+        </w:rPr>
+        <w:t xml:space="preserve">Canada’s Policy for Conservation of Wild Pacific Salmon</w:t>
+      </w:r>
+      <w:r>
+        <w:t xml:space="preserve"> </w:t>
+      </w:r>
+      <w:r>
+        <w:t xml:space="preserve">(WSP) outlines a process for Pacific salmon stewardship using the precautionary principle and the scope of salmon diversity protection to the Conservation Unit (CU): genetically and (or) geographically distinct populations. These misaligned processes create a situation where even when a salmon population is assessed as</w:t>
+      </w:r>
+      <w:r>
+        <w:t xml:space="preserve"> </w:t>
+      </w:r>
+      <w:r>
+        <w:t xml:space="preserve">“</w:t>
+      </w:r>
+      <w:r>
+        <w:t xml:space="preserve">endangered</w:t>
+      </w:r>
+      <w:r>
+        <w:t xml:space="preserve">”</w:t>
+      </w:r>
+      <w:r>
+        <w:t xml:space="preserve"> </w:t>
+      </w:r>
+      <w:r>
+        <w:t xml:space="preserve">through COSEWIC (Cultus Lake sockeye), the population could still be omitted from the</w:t>
+      </w:r>
+      <w:r>
+        <w:t xml:space="preserve"> </w:t>
+      </w:r>
+      <w:r>
+        <w:rPr>
+          <w:i/>
+          <w:iCs/>
+        </w:rPr>
+        <w:t xml:space="preserve">List of Endangered Species</w:t>
+      </w:r>
+      <w:r>
+        <w:t xml:space="preserve"> </w:t>
+      </w:r>
+      <w:r>
+        <w:t xml:space="preserve">(Order) for economic and political reasons (co-migrating with other stocks), denying the population larger legislative protections.</w:t>
+      </w:r>
+    </w:p>
+    <w:bookmarkStart w:id="90" w:name="conclusions"/>
+    <w:p>
+      <w:pPr>
+        <w:pStyle w:val="Heading2"/>
+      </w:pPr>
+      <w:r>
+        <w:t xml:space="preserve">Conclusions</w:t>
+      </w:r>
+    </w:p>
+    <w:p>
+      <w:pPr>
+        <w:pStyle w:val="FirstParagraph"/>
+      </w:pPr>
+      <w:r>
+        <w:t xml:space="preserve">Pacific salmon management projects (e.g. monitoring, restoration, enhancement, etc.) and decision processes often consider policies, methodologies, and literature, but the federal and provincial legislation that regulates human activities is not often reviewed. Legislative language can be vague and illusive, and the administrative structure of salmon jurisdiction in British Columbia is a decentralized and overlapping mosaic. The disconnect between legislative and natural resource language can lead to ineffective compliance with social values. The Legislation Applicable to Pacific Salmon and Ecosystems (LAPSE) process developed through this study attempts to bridge the language gap to equip practitioners with fuller knowledge of the legal landscape available.</w:t>
+      </w:r>
+    </w:p>
+    <w:p>
+      <w:pPr>
+        <w:pStyle w:val="BodyText"/>
+      </w:pPr>
+      <w:r>
         <w:t xml:space="preserve">The LAPSE tool provides a novel approach of linking legal language with salmon management categorization by developing management domain categories based on internationally recognized biodiversity threat categories (IUCN threats). The methods developed to identify and match salmon management keywords and keyphrases to clauses allow for multiple outputs and opportunities including: an extensive list of legislation (acts, regulations, sections, and paragraphs) relevant to a human activity or salmon management decisions; assessment of the nature or context of the statute (clause type) by management domain and threat; assessment of the overlap and connectedness in management domains (co-occurrence) to better understand the relationship between salmon threats in legislation. While this process and tool are relatively new and untested, further development could lead to a better integration of salmon management decisions and administrative responsibility.</w:t>
       </w:r>
     </w:p>
-    <w:bookmarkEnd w:id="89"/>
-    <w:bookmarkStart w:id="131" w:name="references"/>
+    <w:bookmarkEnd w:id="90"/>
+    <w:bookmarkEnd w:id="91"/>
+    <w:bookmarkStart w:id="144" w:name="references"/>
     <w:p>
       <w:pPr>
         <w:pStyle w:val="Heading1"/>
@@ -22685,8 +22696,8 @@
         <w:t xml:space="preserve">References</w:t>
       </w:r>
     </w:p>
-    <w:bookmarkStart w:id="130" w:name="refs"/>
-    <w:bookmarkStart w:id="90" w:name="ref-arbeider2020"/>
+    <w:bookmarkStart w:id="143" w:name="refs"/>
+    <w:bookmarkStart w:id="92" w:name="ref-arbeider2020"/>
     <w:p>
       <w:pPr>
         <w:pStyle w:val="Bibliography"/>
@@ -22704,8 +22715,41 @@
         <w:t xml:space="preserve">.</w:t>
       </w:r>
     </w:p>
-    <w:bookmarkEnd w:id="90"/>
-    <w:bookmarkStart w:id="92" w:name="ref-bankes2014"/>
+    <w:bookmarkEnd w:id="92"/>
+    <w:bookmarkStart w:id="94" w:name="ref-atkinson2024"/>
+    <w:p>
+      <w:pPr>
+        <w:pStyle w:val="Bibliography"/>
+      </w:pPr>
+      <w:r>
+        <w:t xml:space="preserve">Atkinson, E.M., Carturan, B.S., Atkinson, C.P., Bateman, A.W., Connors, K., Hertz, E., and Peacock, S.J. 2024, December 5. Monitoring for fisheries or for fish?</w:t>
+      </w:r>
+      <w:r>
+        <w:t xml:space="preserve"> </w:t>
+      </w:r>
+      <w:r>
+        <w:t xml:space="preserve">Declines</w:t>
+      </w:r>
+      <w:r>
+        <w:t xml:space="preserve"> </w:t>
+      </w:r>
+      <w:r>
+        <w:t xml:space="preserve">in monitoring of salmon spawners continue despite a conservation crisis. doi:</w:t>
+      </w:r>
+      <w:hyperlink r:id="rId93">
+        <w:r>
+          <w:rPr>
+            <w:rStyle w:val="Hyperlink"/>
+          </w:rPr>
+          <w:t xml:space="preserve">10.1101/2024.12.01.626233</w:t>
+        </w:r>
+      </w:hyperlink>
+      <w:r>
+        <w:t xml:space="preserve">.</w:t>
+      </w:r>
+    </w:p>
+    <w:bookmarkEnd w:id="94"/>
+    <w:bookmarkStart w:id="96" w:name="ref-bankes2014"/>
     <w:p>
       <w:pPr>
         <w:pStyle w:val="Bibliography"/>
@@ -22756,7 +22800,7 @@
       <w:r>
         <w:t xml:space="preserve">(9): 6024–6048. doi:</w:t>
       </w:r>
-      <w:hyperlink r:id="rId91">
+      <w:hyperlink r:id="rId95">
         <w:r>
           <w:rPr>
             <w:rStyle w:val="Hyperlink"/>
@@ -22768,8 +22812,8 @@
         <w:t xml:space="preserve">.</w:t>
       </w:r>
     </w:p>
-    <w:bookmarkEnd w:id="92"/>
-    <w:bookmarkStart w:id="93" w:name="ref-becklumb2013"/>
+    <w:bookmarkEnd w:id="96"/>
+    <w:bookmarkStart w:id="97" w:name="ref-becklumb2013"/>
     <w:p>
       <w:pPr>
         <w:pStyle w:val="Bibliography"/>
@@ -22799,8 +22843,8 @@
         <w:t xml:space="preserve">.</w:t>
       </w:r>
     </w:p>
-    <w:bookmarkEnd w:id="93"/>
-    <w:bookmarkStart w:id="95" w:name="ref-bisson2009"/>
+    <w:bookmarkEnd w:id="97"/>
+    <w:bookmarkStart w:id="99" w:name="ref-bisson2009"/>
     <w:p>
       <w:pPr>
         <w:pStyle w:val="Bibliography"/>
@@ -22875,7 +22919,7 @@
       <w:r>
         <w:t xml:space="preserve">(1): art45. doi:</w:t>
       </w:r>
-      <w:hyperlink r:id="rId94">
+      <w:hyperlink r:id="rId98">
         <w:r>
           <w:rPr>
             <w:rStyle w:val="Hyperlink"/>
@@ -22887,8 +22931,8 @@
         <w:t xml:space="preserve">.</w:t>
       </w:r>
     </w:p>
-    <w:bookmarkEnd w:id="95"/>
-    <w:bookmarkStart w:id="97" w:name="ref-bogetti2025"/>
+    <w:bookmarkEnd w:id="99"/>
+    <w:bookmarkStart w:id="101" w:name="ref-bogetti2025"/>
     <w:p>
       <w:pPr>
         <w:pStyle w:val="Bibliography"/>
@@ -22930,7 +22974,7 @@
       <w:r>
         <w:t xml:space="preserve">: 1–11. doi:</w:t>
       </w:r>
-      <w:hyperlink r:id="rId96">
+      <w:hyperlink r:id="rId100">
         <w:r>
           <w:rPr>
             <w:rStyle w:val="Hyperlink"/>
@@ -22942,8 +22986,8 @@
         <w:t xml:space="preserve">.</w:t>
       </w:r>
     </w:p>
-    <w:bookmarkEnd w:id="97"/>
-    <w:bookmarkStart w:id="99" w:name="ref-campbell2002"/>
+    <w:bookmarkEnd w:id="101"/>
+    <w:bookmarkStart w:id="103" w:name="ref-campbell2002"/>
     <w:p>
       <w:pPr>
         <w:pStyle w:val="Bibliography"/>
@@ -23018,7 +23062,7 @@
       <w:r>
         <w:t xml:space="preserve">(5): 223–232. doi:</w:t>
       </w:r>
-      <w:hyperlink r:id="rId98">
+      <w:hyperlink r:id="rId102">
         <w:r>
           <w:rPr>
             <w:rStyle w:val="Hyperlink"/>
@@ -23030,8 +23074,8 @@
         <w:t xml:space="preserve">.</w:t>
       </w:r>
     </w:p>
-    <w:bookmarkEnd w:id="99"/>
-    <w:bookmarkStart w:id="100" w:name="ref-canada2005"/>
+    <w:bookmarkEnd w:id="103"/>
+    <w:bookmarkStart w:id="104" w:name="ref-canada2005"/>
     <w:p>
       <w:pPr>
         <w:pStyle w:val="Bibliography"/>
@@ -23059,8 +23103,8 @@
         <w:t xml:space="preserve">, Vancouver, BC.</w:t>
       </w:r>
     </w:p>
-    <w:bookmarkEnd w:id="100"/>
-    <w:bookmarkStart w:id="102" w:name="X0deca4265bf6bbafed91be61c4a47264114da06"/>
+    <w:bookmarkEnd w:id="104"/>
+    <w:bookmarkStart w:id="106" w:name="X0deca4265bf6bbafed91be61c4a47264114da06"/>
     <w:p>
       <w:pPr>
         <w:pStyle w:val="Bibliography"/>
@@ -23080,7 +23124,7 @@
       <w:r>
         <w:t xml:space="preserve"> </w:t>
       </w:r>
-      <w:hyperlink r:id="rId101">
+      <w:hyperlink r:id="rId105">
         <w:r>
           <w:rPr>
             <w:rStyle w:val="Hyperlink"/>
@@ -23095,39 +23139,29 @@
         <w:t xml:space="preserve">[accessed 18 December 2025].</w:t>
       </w:r>
     </w:p>
-    <w:bookmarkEnd w:id="102"/>
-    <w:bookmarkStart w:id="103" w:name="ref-carlson2022"/>
+    <w:bookmarkEnd w:id="106"/>
+    <w:bookmarkStart w:id="108" w:name="ref-chalifour2022"/>
     <w:p>
       <w:pPr>
         <w:pStyle w:val="Bibliography"/>
       </w:pPr>
       <w:r>
-        <w:t xml:space="preserve">Carlson, D., and Baylis, V. 2022. How</w:t>
-      </w:r>
-      <w:r>
-        <w:t xml:space="preserve"> </w:t>
-      </w:r>
-      <w:r>
-        <w:t xml:space="preserve">Crown</w:t>
-      </w:r>
-      <w:r>
-        <w:t xml:space="preserve"> </w:t>
-      </w:r>
-      <w:r>
-        <w:t xml:space="preserve">laws and policy normalize cumulative harm to salmon watersheds in</w:t>
-      </w:r>
-      <w:r>
-        <w:t xml:space="preserve"> </w:t>
-      </w:r>
-      <w:r>
-        <w:t xml:space="preserve">British Columbia</w:t>
-      </w:r>
-      <w:r>
-        <w:t xml:space="preserve">:</w:t>
+        <w:t xml:space="preserve">Chalifour, L., Holt, C., Camaclang, A.E., Bradford, M.J., Dixon, R., Finn, R.J.R., Hemming, V., Hinch, S.G., Levings, C.D., MacDuffee, M., Nishimura, D.J.H., Pearson, M., Reynolds, J.D., Scott, D.C., Spremberg, U., Stark, S., Stevens, J., Baum, J.K., and Martin, T.G. 2022. Identifying a pathway towards recovery for depleted wild pacific salmon populations in a large watershed under multiple stressors. Journal of Applied Ecology (November 2021): 2212–2226. doi:</w:t>
+      </w:r>
+      <w:hyperlink r:id="rId107">
+        <w:r>
+          <w:rPr>
+            <w:rStyle w:val="Hyperlink"/>
+          </w:rPr>
+          <w:t xml:space="preserve">10.1111/1365-2664.14239</w:t>
+        </w:r>
+      </w:hyperlink>
+      <w:r>
+        <w:t xml:space="preserve">.</w:t>
       </w:r>
     </w:p>
-    <w:bookmarkEnd w:id="103"/>
-    <w:bookmarkStart w:id="104" w:name="ref-collins2019"/>
+    <w:bookmarkEnd w:id="108"/>
+    <w:bookmarkStart w:id="109" w:name="ref-collins2019"/>
     <w:p>
       <w:pPr>
         <w:pStyle w:val="Bibliography"/>
@@ -23182,8 +23216,8 @@
         <w:t xml:space="preserve">.</w:t>
       </w:r>
     </w:p>
-    <w:bookmarkEnd w:id="104"/>
-    <w:bookmarkStart w:id="106" w:name="ref-dallimer2015"/>
+    <w:bookmarkEnd w:id="109"/>
+    <w:bookmarkStart w:id="111" w:name="ref-dallimer2015"/>
     <w:p>
       <w:pPr>
         <w:pStyle w:val="Bibliography"/>
@@ -23204,7 +23238,7 @@
       <w:r>
         <w:t xml:space="preserve">(3): 132–139. doi:</w:t>
       </w:r>
-      <w:hyperlink r:id="rId105">
+      <w:hyperlink r:id="rId110">
         <w:r>
           <w:rPr>
             <w:rStyle w:val="Hyperlink"/>
@@ -23216,13 +23250,53 @@
         <w:t xml:space="preserve">.</w:t>
       </w:r>
     </w:p>
-    <w:bookmarkEnd w:id="106"/>
-    <w:bookmarkStart w:id="108" w:name="ref-departmentofjusticecanada2022"/>
+    <w:bookmarkEnd w:id="111"/>
+    <w:bookmarkStart w:id="113" w:name="ref-delvalle2024"/>
     <w:p>
       <w:pPr>
         <w:pStyle w:val="Bibliography"/>
       </w:pPr>
       <w:r>
+        <w:t xml:space="preserve">Del Valle, E., Neal, B., Martínez-Candelas, I., Dann, P., Webb, D., and McClenachan, L. 2024. Fishing in turbulent waters: Resilience, risk, and trust in british columbia</w:t>
+      </w:r>
+      <w:r>
+        <w:t xml:space="preserve">’</w:t>
+      </w:r>
+      <w:r>
+        <w:t xml:space="preserve">s declining commercial salmon fishery. Facets</w:t>
+      </w:r>
+      <w:r>
+        <w:t xml:space="preserve"> </w:t>
+      </w:r>
+      <w:r>
+        <w:rPr>
+          <w:b/>
+          <w:bCs/>
+        </w:rPr>
+        <w:t xml:space="preserve">9</w:t>
+      </w:r>
+      <w:r>
+        <w:t xml:space="preserve">(1): 1–17. doi:</w:t>
+      </w:r>
+      <w:hyperlink r:id="rId112">
+        <w:r>
+          <w:rPr>
+            <w:rStyle w:val="Hyperlink"/>
+          </w:rPr>
+          <w:t xml:space="preserve">10.1139/facets-2023-0204</w:t>
+        </w:r>
+      </w:hyperlink>
+      <w:r>
+        <w:t xml:space="preserve">.</w:t>
+      </w:r>
+    </w:p>
+    <w:bookmarkEnd w:id="113"/>
+    <w:bookmarkStart w:id="115" w:name="ref-departmentofjusticecanada2022"/>
+    <w:p>
+      <w:pPr>
+        <w:pStyle w:val="Bibliography"/>
+      </w:pPr>
+      <w:r>
         <w:t xml:space="preserve">Department of Justice Canada. 2022, August 29. Legistics</w:t>
       </w:r>
       <w:r>
@@ -23237,7 +23311,7 @@
       <w:r>
         <w:t xml:space="preserve"> </w:t>
       </w:r>
-      <w:hyperlink r:id="rId107">
+      <w:hyperlink r:id="rId114">
         <w:r>
           <w:rPr>
             <w:rStyle w:val="Hyperlink"/>
@@ -23252,8 +23326,8 @@
         <w:t xml:space="preserve">[accessed 18 December 2025].</w:t>
       </w:r>
     </w:p>
-    <w:bookmarkEnd w:id="108"/>
-    <w:bookmarkStart w:id="109" w:name="ref-dfo2020"/>
+    <w:bookmarkEnd w:id="115"/>
+    <w:bookmarkStart w:id="116" w:name="ref-dfo2020"/>
     <w:p>
       <w:pPr>
         <w:pStyle w:val="Bibliography"/>
@@ -23328,8 +23402,8 @@
         <w:t xml:space="preserve">11.</w:t>
       </w:r>
     </w:p>
-    <w:bookmarkEnd w:id="109"/>
-    <w:bookmarkStart w:id="110" w:name="ref-dfo2022"/>
+    <w:bookmarkEnd w:id="116"/>
+    <w:bookmarkStart w:id="117" w:name="ref-dfo2022"/>
     <w:p>
       <w:pPr>
         <w:pStyle w:val="Bibliography"/>
@@ -23431,8 +23505,8 @@
         <w:t xml:space="preserve">.</w:t>
       </w:r>
     </w:p>
-    <w:bookmarkEnd w:id="110"/>
-    <w:bookmarkStart w:id="111" w:name="ref-dionne2023"/>
+    <w:bookmarkEnd w:id="117"/>
+    <w:bookmarkStart w:id="118" w:name="ref-dionne2023"/>
     <w:p>
       <w:pPr>
         <w:pStyle w:val="Bibliography"/>
@@ -23465,8 +23539,28 @@
         <w:t xml:space="preserve">and southern mainland chinook designatable units (1, 6, 13 and 15). Canadian Science Advisory Secretariat (CSAS), Ottawa ON.</w:t>
       </w:r>
     </w:p>
-    <w:bookmarkEnd w:id="111"/>
-    <w:bookmarkStart w:id="113" w:name="ref-kraus2021"/>
+    <w:bookmarkEnd w:id="118"/>
+    <w:bookmarkStart w:id="119" w:name="ref-doutaz2023"/>
+    <w:p>
+      <w:pPr>
+        <w:pStyle w:val="Bibliography"/>
+      </w:pPr>
+      <w:r>
+        <w:t xml:space="preserve">Doutaz, D., Huang, A., Decker, S., and Vivian, T. 2023. Recovery potential assessment for fraser river sockeye salmon (oncorhynchus nerka), nine designatable units part 2: Biology, habitat, threats, mitigations and allowable harm - elements 1-11, 14, 16-18, 22.</w:t>
+      </w:r>
+    </w:p>
+    <w:bookmarkEnd w:id="119"/>
+    <w:bookmarkStart w:id="120" w:name="ref-grant2019"/>
+    <w:p>
+      <w:pPr>
+        <w:pStyle w:val="Bibliography"/>
+      </w:pPr>
+      <w:r>
+        <w:t xml:space="preserve">Grant, S.C.H., MacDonald, B.L., and Winston, M.L. 2019. State of canadian pacific salmon: Responses to changing climate and habitats.</w:t>
+      </w:r>
+    </w:p>
+    <w:bookmarkEnd w:id="120"/>
+    <w:bookmarkStart w:id="122" w:name="ref-kraus2021"/>
     <w:p>
       <w:pPr>
         <w:pStyle w:val="Bibliography"/>
@@ -23496,7 +23590,7 @@
       <w:r>
         <w:t xml:space="preserve">: 1088–1127. doi:</w:t>
       </w:r>
-      <w:hyperlink r:id="rId112">
+      <w:hyperlink r:id="rId121">
         <w:r>
           <w:rPr>
             <w:rStyle w:val="Hyperlink"/>
@@ -23508,8 +23602,8 @@
         <w:t xml:space="preserve">.</w:t>
       </w:r>
     </w:p>
-    <w:bookmarkEnd w:id="113"/>
-    <w:bookmarkStart w:id="114" w:name="ref-marentette2020"/>
+    <w:bookmarkEnd w:id="122"/>
+    <w:bookmarkStart w:id="123" w:name="ref-marentette2020"/>
     <w:p>
       <w:pPr>
         <w:pStyle w:val="Bibliography"/>
@@ -23551,8 +23645,8 @@
         <w:t xml:space="preserve">, Ottawa, ON.</w:t>
       </w:r>
     </w:p>
-    <w:bookmarkEnd w:id="114"/>
-    <w:bookmarkStart w:id="116" w:name="ref-mccune2013"/>
+    <w:bookmarkEnd w:id="123"/>
+    <w:bookmarkStart w:id="125" w:name="ref-mccune2013"/>
     <w:p>
       <w:pPr>
         <w:pStyle w:val="Bibliography"/>
@@ -23597,7 +23691,7 @@
       <w:r>
         <w:t xml:space="preserve">: 254–265. doi:</w:t>
       </w:r>
-      <w:hyperlink r:id="rId115">
+      <w:hyperlink r:id="rId124">
         <w:r>
           <w:rPr>
             <w:rStyle w:val="Hyperlink"/>
@@ -23609,8 +23703,29 @@
         <w:t xml:space="preserve">.</w:t>
       </w:r>
     </w:p>
-    <w:bookmarkEnd w:id="116"/>
-    <w:bookmarkStart w:id="118" w:name="ref-price2017"/>
+    <w:bookmarkEnd w:id="125"/>
+    <w:bookmarkStart w:id="127" w:name="ref-moore2025"/>
+    <w:p>
+      <w:pPr>
+        <w:pStyle w:val="Bibliography"/>
+      </w:pPr>
+      <w:r>
+        <w:t xml:space="preserve">Moore, J.W., Ulaski, M.E., Wilson, K.L., Martin, T.G., Kuiper, S.D., Peacock, S.J., Braun, D.C., Naman, S.M., Pitman, K.J., Reid, A.J., Rosenfeld, J.S., Sainsbury, N.C., Wilson, S.M., and Zdasiuk, B.J. 2025. A Safe Operating Space for Salmon Watersheds Under Rapid Climate Change. Fish and Fisheries: faf.70027. doi:</w:t>
+      </w:r>
+      <w:hyperlink r:id="rId126">
+        <w:r>
+          <w:rPr>
+            <w:rStyle w:val="Hyperlink"/>
+          </w:rPr>
+          <w:t xml:space="preserve">10.1111/faf.70027</w:t>
+        </w:r>
+      </w:hyperlink>
+      <w:r>
+        <w:t xml:space="preserve">.</w:t>
+      </w:r>
+    </w:p>
+    <w:bookmarkEnd w:id="127"/>
+    <w:bookmarkStart w:id="129" w:name="ref-price2017"/>
     <w:p>
       <w:pPr>
         <w:pStyle w:val="Bibliography"/>
@@ -23661,7 +23776,7 @@
       <w:r>
         <w:t xml:space="preserve">(10): 1507–1518. doi:</w:t>
       </w:r>
-      <w:hyperlink r:id="rId117">
+      <w:hyperlink r:id="rId128">
         <w:r>
           <w:rPr>
             <w:rStyle w:val="Hyperlink"/>
@@ -23673,8 +23788,8 @@
         <w:t xml:space="preserve">.</w:t>
       </w:r>
     </w:p>
-    <w:bookmarkEnd w:id="118"/>
-    <w:bookmarkStart w:id="120" w:name="ref-ray2021"/>
+    <w:bookmarkEnd w:id="129"/>
+    <w:bookmarkStart w:id="131" w:name="ref-ray2021"/>
     <w:p>
       <w:pPr>
         <w:pStyle w:val="Bibliography"/>
@@ -23716,7 +23831,7 @@
       <w:r>
         <w:t xml:space="preserve">: 1044–1068. doi:</w:t>
       </w:r>
-      <w:hyperlink r:id="rId119">
+      <w:hyperlink r:id="rId130">
         <w:r>
           <w:rPr>
             <w:rStyle w:val="Hyperlink"/>
@@ -23728,8 +23843,8 @@
         <w:t xml:space="preserve">.</w:t>
       </w:r>
     </w:p>
-    <w:bookmarkEnd w:id="120"/>
-    <w:bookmarkStart w:id="122" w:name="ref-salafsky2025"/>
+    <w:bookmarkEnd w:id="131"/>
+    <w:bookmarkStart w:id="133" w:name="ref-salafsky2025"/>
     <w:p>
       <w:pPr>
         <w:pStyle w:val="Bibliography"/>
@@ -23750,7 +23865,7 @@
       <w:r>
         <w:t xml:space="preserve">(3): e14434. doi:</w:t>
       </w:r>
-      <w:hyperlink r:id="rId121">
+      <w:hyperlink r:id="rId132">
         <w:r>
           <w:rPr>
             <w:rStyle w:val="Hyperlink"/>
@@ -23762,8 +23877,8 @@
         <w:t xml:space="preserve">.</w:t>
       </w:r>
     </w:p>
-    <w:bookmarkEnd w:id="122"/>
-    <w:bookmarkStart w:id="124" w:name="ref-salafsky2008"/>
+    <w:bookmarkEnd w:id="133"/>
+    <w:bookmarkStart w:id="135" w:name="ref-salafsky2008"/>
     <w:p>
       <w:pPr>
         <w:pStyle w:val="Bibliography"/>
@@ -23838,7 +23953,7 @@
       <w:r>
         <w:t xml:space="preserve">(4): 897–911. doi:</w:t>
       </w:r>
-      <w:hyperlink r:id="rId123">
+      <w:hyperlink r:id="rId134">
         <w:r>
           <w:rPr>
             <w:rStyle w:val="Hyperlink"/>
@@ -23850,8 +23965,8 @@
         <w:t xml:space="preserve">.</w:t>
       </w:r>
     </w:p>
-    <w:bookmarkEnd w:id="124"/>
-    <w:bookmarkStart w:id="126" w:name="ref-swerdfager2023"/>
+    <w:bookmarkEnd w:id="135"/>
+    <w:bookmarkStart w:id="137" w:name="ref-swerdfager2023"/>
     <w:p>
       <w:pPr>
         <w:pStyle w:val="Bibliography"/>
@@ -23881,7 +23996,7 @@
       <w:r>
         <w:t xml:space="preserve">: 1–13. doi:</w:t>
       </w:r>
-      <w:hyperlink r:id="rId125">
+      <w:hyperlink r:id="rId136">
         <w:r>
           <w:rPr>
             <w:rStyle w:val="Hyperlink"/>
@@ -23893,8 +24008,8 @@
         <w:t xml:space="preserve">.</w:t>
       </w:r>
     </w:p>
-    <w:bookmarkEnd w:id="126"/>
-    <w:bookmarkStart w:id="127" w:name="ref-thompson1974"/>
+    <w:bookmarkEnd w:id="137"/>
+    <w:bookmarkStart w:id="138" w:name="ref-thompson1974"/>
     <w:p>
       <w:pPr>
         <w:pStyle w:val="Bibliography"/>
@@ -23924,8 +24039,8 @@
         <w:t xml:space="preserve">.</w:t>
       </w:r>
     </w:p>
-    <w:bookmarkEnd w:id="127"/>
-    <w:bookmarkStart w:id="129" w:name="ref-turcotte2021"/>
+    <w:bookmarkEnd w:id="138"/>
+    <w:bookmarkStart w:id="140" w:name="ref-turcotte2021"/>
     <w:p>
       <w:pPr>
         <w:pStyle w:val="Bibliography"/>
@@ -24008,7 +24123,7 @@
       <w:r>
         <w:t xml:space="preserve">: 1474–1494. doi:</w:t>
       </w:r>
-      <w:hyperlink r:id="rId128">
+      <w:hyperlink r:id="rId139">
         <w:r>
           <w:rPr>
             <w:rStyle w:val="Hyperlink"/>
@@ -24020,10 +24135,62 @@
         <w:t xml:space="preserve">.</w:t>
       </w:r>
     </w:p>
-    <w:bookmarkEnd w:id="129"/>
-    <w:bookmarkEnd w:id="130"/>
-    <w:bookmarkEnd w:id="131"/>
-    <w:bookmarkStart w:id="132" w:name="supplementary-material"/>
+    <w:bookmarkEnd w:id="140"/>
+    <w:bookmarkStart w:id="142" w:name="ref-ulaski2025"/>
+    <w:p>
+      <w:pPr>
+        <w:pStyle w:val="Bibliography"/>
+      </w:pPr>
+      <w:r>
+        <w:t xml:space="preserve">Ulaski, M.E., Moore, J.W., Carlson, D., Taddei, K.F., Kriese, K., Griggs, J., Murray, C.C., Adams, M., Wilson, K.L., Reid, A., Sainsbury, N., Cannon, S., Griggs, E., and Martin, T.G. 2025. Barriers and opportunities for the effective management of cumulative effects in salmon ecosystems in</w:t>
+      </w:r>
+      <w:r>
+        <w:t xml:space="preserve"> </w:t>
+      </w:r>
+      <w:r>
+        <w:t xml:space="preserve">British Columbia</w:t>
+      </w:r>
+      <w:r>
+        <w:t xml:space="preserve">,</w:t>
+      </w:r>
+      <w:r>
+        <w:t xml:space="preserve"> </w:t>
+      </w:r>
+      <w:r>
+        <w:t xml:space="preserve">Canada</w:t>
+      </w:r>
+      <w:r>
+        <w:t xml:space="preserve">. FACETS</w:t>
+      </w:r>
+      <w:r>
+        <w:t xml:space="preserve"> </w:t>
+      </w:r>
+      <w:r>
+        <w:rPr>
+          <w:b/>
+          <w:bCs/>
+        </w:rPr>
+        <w:t xml:space="preserve">10</w:t>
+      </w:r>
+      <w:r>
+        <w:t xml:space="preserve">: 1–25. doi:</w:t>
+      </w:r>
+      <w:hyperlink r:id="rId141">
+        <w:r>
+          <w:rPr>
+            <w:rStyle w:val="Hyperlink"/>
+          </w:rPr>
+          <w:t xml:space="preserve">10.1139/facets-2024-0348</w:t>
+        </w:r>
+      </w:hyperlink>
+      <w:r>
+        <w:t xml:space="preserve">.</w:t>
+      </w:r>
+    </w:p>
+    <w:bookmarkEnd w:id="142"/>
+    <w:bookmarkEnd w:id="143"/>
+    <w:bookmarkEnd w:id="144"/>
+    <w:bookmarkStart w:id="145" w:name="supplementary-material"/>
     <w:p>
       <w:pPr>
         <w:pStyle w:val="Heading1"/>
@@ -24037,7 +24204,7 @@
         <w:pStyle w:val="Compact"/>
         <w:numPr>
           <w:ilvl w:val="0"/>
-          <w:numId w:val="1006"/>
+          <w:numId w:val="1005"/>
         </w:numPr>
       </w:pPr>
       <w:r>
@@ -24048,7 +24215,7 @@
         <w:t xml:space="preserve">Links or downloads for the LAPSE tool materials (app etc.)</w:t>
       </w:r>
     </w:p>
-    <w:bookmarkEnd w:id="132"/>
+    <w:bookmarkEnd w:id="145"/>
     <w:sectPr>
       <w:headerReference r:id="rId10" w:type="even"/>
       <w:headerReference r:id="rId9" w:type="default"/>
@@ -24724,9 +24891,6 @@
     <w:abstractNumId w:val="991"/>
   </w:num>
   <w:num w:numId="1005">
-    <w:abstractNumId w:val="991"/>
-  </w:num>
-  <w:num w:numId="1006">
     <w:abstractNumId w:val="991"/>
   </w:num>
 </w:numbering>

</xml_diff>

<commit_message>
Added Dan's edits and comments
</commit_message>
<xml_diff>
--- a/reports/LAPSE_primary_publication.docx
+++ b/reports/LAPSE_primary_publication.docx
@@ -131,7 +131,7 @@
         <w:pStyle w:val="Date"/>
       </w:pPr>
       <w:r>
-        <w:t xml:space="preserve">2026-01-07</w:t>
+        <w:t xml:space="preserve">2026-01-08</w:t>
       </w:r>
     </w:p>
     <w:bookmarkStart w:id="32" w:name="introduction"/>
@@ -756,21 +756,18 @@
     </w:p>
     <w:p>
       <w:pPr>
-        <w:pStyle w:val="BodyText"/>
+        <w:pStyle w:val="Compact"/>
+        <w:numPr>
+          <w:ilvl w:val="0"/>
+          <w:numId w:val="1002"/>
+        </w:numPr>
       </w:pPr>
       <w:r>
-        <w:t xml:space="preserve">In this study, we seek to decode the complexity between salmon threats and environmental legislation by creating an interface between regulatory language and anthropogenic threat categories. We describe and apply the Legislation Applicable to Pacific Salmon and their Ecosystems (LAPSE) database, a repository of federal and provincial legislation and regulations that apply to Pacific salmon in British Columbia. Using a novel method for parsing and classifying legislative clauses, we develop keyword relationships between IUCN threats classifications and XXXX clauses from XX acts and XX regulations. By creating an extensive, open-source, and easily accessible database linking legislation to salmon, we aim to facilitate a better understanding of the legislative and regulatory context through which salmon and their ecosystems are governed in British Columbia, while providing a framework to support systematic and critical reviews of strengths and shortcomings of regulations with respect to salmon threats.</w:t>
-      </w:r>
-    </w:p>
-    <w:bookmarkEnd w:id="31"/>
-    <w:bookmarkEnd w:id="32"/>
-    <w:bookmarkStart w:id="37" w:name="X06bc8cf00ca5baea230857c3fdd1788ec12acc8"/>
-    <w:p>
-      <w:pPr>
-        <w:pStyle w:val="Heading1"/>
-      </w:pPr>
-      <w:r>
-        <w:t xml:space="preserve">International Union for Conservation of Nature (IUCN) threat categories</w:t>
+        <w:rPr>
+          <w:b/>
+          <w:bCs/>
+        </w:rPr>
+        <w:t xml:space="preserve">Add examples of rebuilding plans, OK Chinook, WCVI Chinook, Fish stock provision rebuilding plans (DG)</w:t>
       </w:r>
     </w:p>
     <w:p>
@@ -778,6 +775,25 @@
         <w:pStyle w:val="FirstParagraph"/>
       </w:pPr>
       <w:r>
+        <w:t xml:space="preserve">In this study, we seek to decode the complexity between salmon threats and environmental legislation by creating an interface between regulatory language and anthropogenic threat categories. We describe and apply the Legislation Applicable to Pacific Salmon and their Ecosystems (LAPSE) database, a repository of federal and provincial legislation and regulations that apply to Pacific salmon in British Columbia. Using a novel method for parsing and classifying legislative clauses, we develop keyword relationships between IUCN threats classifications and XXXX clauses from XX acts and XX regulations. By creating an extensive, open-source, and easily accessible database linking legislation to salmon, we aim to facilitate a better understanding of the legislative and regulatory context through which salmon and their ecosystems are governed in British Columbia, while providing a framework to support systematic and critical reviews of strengths and shortcomings of regulations with respect to salmon threats.</w:t>
+      </w:r>
+    </w:p>
+    <w:bookmarkEnd w:id="31"/>
+    <w:bookmarkEnd w:id="32"/>
+    <w:bookmarkStart w:id="38" w:name="X06bc8cf00ca5baea230857c3fdd1788ec12acc8"/>
+    <w:p>
+      <w:pPr>
+        <w:pStyle w:val="Heading1"/>
+      </w:pPr>
+      <w:r>
+        <w:t xml:space="preserve">International Union for Conservation of Nature (IUCN) threat categories</w:t>
+      </w:r>
+    </w:p>
+    <w:p>
+      <w:pPr>
+        <w:pStyle w:val="FirstParagraph"/>
+      </w:pPr>
+      <w:r>
         <w:t xml:space="preserve">Management decisions and activities related to salmon are often in response to identifiable threats to salmon health and population status. Legislated recovery planning also relies on a description of identified threats</w:t>
       </w:r>
       <w:r>
@@ -866,12 +882,103 @@
         <w:t xml:space="preserve"> </w:t>
       </w:r>
       <w:r>
-        <w:t xml:space="preserve">was used to categorize legislation by direct threats to salmon conservation. Level 2 threat classification was used as the finest resolution that could be applied consistently.</w:t>
+        <w:t xml:space="preserve">was used to categorize legislation by direct threats to salmon conservation.</w:t>
+      </w:r>
+      <w:r>
+        <w:t xml:space="preserve"> </w:t>
+      </w:r>
+      <w:r>
+        <w:rPr>
+          <w:b/>
+          <w:bCs/>
+        </w:rPr>
+        <w:t xml:space="preserve">Level 2 threat classification</w:t>
+      </w:r>
+      <w:r>
+        <w:t xml:space="preserve"> </w:t>
+      </w:r>
+      <w:r>
+        <w:t xml:space="preserve">was used as the finest resolution that could be applied consistently.</w:t>
       </w:r>
     </w:p>
     <w:p>
       <w:pPr>
-        <w:pStyle w:val="BodyText"/>
+        <w:pStyle w:val="Compact"/>
+        <w:numPr>
+          <w:ilvl w:val="0"/>
+          <w:numId w:val="1003"/>
+        </w:numPr>
+      </w:pPr>
+      <w:r>
+        <w:rPr>
+          <w:b/>
+          <w:bCs/>
+        </w:rPr>
+        <w:t xml:space="preserve">DG - Not everyone will be familiar with the different threat levels in this framework. Before this sentence, a brief explanation of the threats hierarchy could help the unfamiliar reader. You could point the reader to the original publication of this framework (</w:t>
+      </w:r>
+      <w:hyperlink r:id="rId33">
+        <w:r>
+          <w:rPr>
+            <w:rStyle w:val="Hyperlink"/>
+            <w:b/>
+            <w:bCs/>
+          </w:rPr>
+          <w:t xml:space="preserve">The Society for Conservation Biology</w:t>
+        </w:r>
+      </w:hyperlink>
+      <w:r>
+        <w:rPr>
+          <w:b/>
+          <w:bCs/>
+        </w:rPr>
+        <w:t xml:space="preserve">), and/or summarize some key information from this paper, such as,</w:t>
+      </w:r>
+      <w:r>
+        <w:rPr>
+          <w:b/>
+          <w:bCs/>
+        </w:rPr>
+        <w:t xml:space="preserve"> </w:t>
+      </w:r>
+      <w:r>
+        <w:rPr>
+          <w:b/>
+          <w:bCs/>
+        </w:rPr>
+        <w:t xml:space="preserve">“</w:t>
+      </w:r>
+      <w:r>
+        <w:rPr>
+          <w:b/>
+          <w:bCs/>
+        </w:rPr>
+        <w:t xml:space="preserve">The threat classification hierarchically categorizes threats into three levels. Each level one category (e.g., Agriculture &amp; Aquaculture) is further subdivided into several level two categories (e.g., Annual &amp; Perennial Non-Timber Crops, Marine &amp; Freshwater Aquaculture), and are subsequently into numerous level three and four categories.</w:t>
+      </w:r>
+      <w:r>
+        <w:rPr>
+          <w:b/>
+          <w:bCs/>
+        </w:rPr>
+        <w:t xml:space="preserve">”</w:t>
+      </w:r>
+      <w:r>
+        <w:rPr>
+          <w:b/>
+          <w:bCs/>
+        </w:rPr>
+        <w:t xml:space="preserve"> </w:t>
+      </w:r>
+      <w:r>
+        <w:rPr>
+          <w:b/>
+          <w:bCs/>
+        </w:rPr>
+        <w:t xml:space="preserve">Something like this could help the reader follow the sentence that explains why level two was chosen (consistent application).</w:t>
+      </w:r>
+    </w:p>
+    <w:p>
+      <w:pPr>
+        <w:pStyle w:val="FirstParagraph"/>
       </w:pPr>
       <w:r>
         <w:t xml:space="preserve">Legislative clauses that influence Pacific salmon governance in British Columbia are not always associated with conservation threats. As well, some clauses may involve all threats. For example, statutes that outline species status or determine ecological reserves have relevance to how salmon are managed, but can’t be attributed to any one IUCN threat category. Pacific salmon life history also ranges over a broad geography of marine and freshwater habitat (including terrestrial watershed aspects), touching on almost every conservation threat available. We developed management domain categories through this study as a clearer and more comprehensive alignment between regulatory administrative concern and conservation threat categories (Figure</w:t>
@@ -895,18 +1002,18 @@
           <wp:inline>
             <wp:extent cx="5943600" cy="3343275"/>
             <wp:effectExtent b="0" l="0" r="0" t="0"/>
-            <wp:docPr descr="Figure 3: Flowchart showing alignment of IUCN Level 2 threat categories with Management Domain in relation to legislation and jurisdiction." title="" id="34" name="Picture"/>
+            <wp:docPr descr="Figure 3: Flowchart showing alignment of IUCN Level 2 threat categories with Management Domain in relation to legislation and jurisdiction." title="" id="35" name="Picture"/>
             <a:graphic>
               <a:graphicData uri="http://schemas.openxmlformats.org/drawingml/2006/picture">
                 <pic:pic>
                   <pic:nvPicPr>
-                    <pic:cNvPr descr="../assets/Management%20Domain%20Flowchart.png" id="35" name="Picture"/>
+                    <pic:cNvPr descr="../assets/Management%20Domain%20Flowchart.png" id="36" name="Picture"/>
                     <pic:cNvPicPr>
                       <a:picLocks noChangeArrowheads="1" noChangeAspect="1"/>
                     </pic:cNvPicPr>
                   </pic:nvPicPr>
                   <pic:blipFill>
-                    <a:blip r:embed="rId33"/>
+                    <a:blip r:embed="rId34"/>
                     <a:stretch>
                       <a:fillRect/>
                     </a:stretch>
@@ -937,14 +1044,14 @@
       <w:pPr>
         <w:pStyle w:val="ImageCaption"/>
       </w:pPr>
-      <w:bookmarkStart w:id="36" w:name="fig:fig-flowchart-image"/>
-      <w:bookmarkEnd w:id="36"/>
+      <w:bookmarkStart w:id="37" w:name="fig:fig-flowchart-image"/>
+      <w:bookmarkEnd w:id="37"/>
       <w:r>
         <w:t xml:space="preserve">Figure 3: Flowchart showing alignment of IUCN Level 2 threat categories with Management Domain in relation to legislation and jurisdiction.</w:t>
       </w:r>
     </w:p>
-    <w:bookmarkEnd w:id="37"/>
-    <w:bookmarkStart w:id="47" w:name="a-process-for-clause-categorization"/>
+    <w:bookmarkEnd w:id="38"/>
+    <w:bookmarkStart w:id="48" w:name="a-process-for-clause-categorization"/>
     <w:p>
       <w:pPr>
         <w:pStyle w:val="Heading1"/>
@@ -961,7 +1068,7 @@
         <w:t xml:space="preserve">Assessment of legislative context is prone to subjective interpretation. The inclusion and exclusion of both the overall acts and the clauses within the acts creates points of assumption and bias. For this exercise we cast as wide a net as possible and created a process that is publicly accessible, automated, and repeatable if legislation changes. The process steps are: accumulate and review legislation (CanLii); parse legislation by clause (paragraph), section, and heading; match management domain and IUCN threat keywords to clauses; assign salmon-specific scope categories; match clause type keywords to clauses.</w:t>
       </w:r>
     </w:p>
-    <w:bookmarkStart w:id="39" w:name="legislation-accumulation-and-review"/>
+    <w:bookmarkStart w:id="40" w:name="legislation-accumulation-and-review"/>
     <w:p>
       <w:pPr>
         <w:pStyle w:val="Heading2"/>
@@ -1037,12 +1144,56 @@
         <w:t xml:space="preserve">(Canadian Legal Information Institute 2025)</w:t>
       </w:r>
       <w:r>
-        <w:t xml:space="preserve">, provides an excellent resource for searching federal and provincial legislation by keyword search. We used CanLii through a step-wise, systematic process to query Pacific salmon specific terms (salmon, Chinook, sockeye, etc.); extract other keywords from the salmon-specific legislation (word frequency analysis using udpipe R package); query found keywords and IUCN Threat description wording in CanLII to find adjacent legislation; filter legislation regionally (excluding provinces other than BC); and download HTML files for relevant legislation directly from government websites</w:t>
+        <w:t xml:space="preserve">, provides an excellent resource for searching federal and provincial legislation by keyword search. We used CanLii through a step-wise, systematic process to query Pacific salmon specific terms (salmon, Chinook, sockeye, etc.); extract other keywords from the salmon-specific legislation (word frequency analysis using udpipe R package); query found keywords and IUCN Threat description wording in CanLII to find adjacent legislation; filter legislation regionally (excluding provinces other than BC); and download HTML files for relevant legislation directly from government websites.</w:t>
       </w:r>
     </w:p>
     <w:p>
       <w:pPr>
-        <w:pStyle w:val="BodyText"/>
+        <w:pStyle w:val="Compact"/>
+        <w:numPr>
+          <w:ilvl w:val="0"/>
+          <w:numId w:val="1004"/>
+        </w:numPr>
+      </w:pPr>
+      <w:r>
+        <w:rPr>
+          <w:b/>
+          <w:bCs/>
+        </w:rPr>
+        <w:t xml:space="preserve">DG - Needs citation - citation(</w:t>
+      </w:r>
+      <w:r>
+        <w:rPr>
+          <w:b/>
+          <w:bCs/>
+        </w:rPr>
+        <w:t xml:space="preserve">“</w:t>
+      </w:r>
+      <w:r>
+        <w:rPr>
+          <w:b/>
+          <w:bCs/>
+        </w:rPr>
+        <w:t xml:space="preserve">packagename</w:t>
+      </w:r>
+      <w:r>
+        <w:rPr>
+          <w:b/>
+          <w:bCs/>
+        </w:rPr>
+        <w:t xml:space="preserve">”</w:t>
+      </w:r>
+      <w:r>
+        <w:rPr>
+          <w:b/>
+          <w:bCs/>
+        </w:rPr>
+        <w:t xml:space="preserve">) in R can get you this</w:t>
+      </w:r>
+    </w:p>
+    <w:p>
+      <w:pPr>
+        <w:pStyle w:val="FirstParagraph"/>
       </w:pPr>
       <w:r>
         <w:t xml:space="preserve">Through the CanLII website, the user may look up the keywords queried in each statute chosen. This allows the user to quickly assess the context of the word in the legislation and determine if the section is relevant to Pacific salmon. The number of statutes collected for inclusion in this study is shown in Table</w:t>
@@ -1061,8 +1212,8 @@
       <w:pPr>
         <w:pStyle w:val="TableCaption"/>
       </w:pPr>
-      <w:bookmarkStart w:id="38" w:name="tab:legislation-summary-table"/>
-      <w:bookmarkEnd w:id="38"/>
+      <w:bookmarkStart w:id="39" w:name="tab:legislation-summary-table"/>
+      <w:bookmarkEnd w:id="39"/>
       <w:r>
         <w:t xml:space="preserve">Table 1:</w:t>
       </w:r>
@@ -2417,8 +2568,8 @@
         <w:br/>
       </w:r>
     </w:p>
-    <w:bookmarkEnd w:id="39"/>
-    <w:bookmarkStart w:id="44" w:name="legistics-parsing-legislation"/>
+    <w:bookmarkEnd w:id="40"/>
+    <w:bookmarkStart w:id="45" w:name="legistics-parsing-legislation"/>
     <w:p>
       <w:pPr>
         <w:pStyle w:val="Heading2"/>
@@ -2474,18 +2625,18 @@
           <wp:inline>
             <wp:extent cx="5943600" cy="2139048"/>
             <wp:effectExtent b="0" l="0" r="0" t="0"/>
-            <wp:docPr descr="Figure 4: Fisheries Act (federal) examples of paragraph parsing from HTML code." title="" id="41" name="Picture"/>
+            <wp:docPr descr="Figure 4: Fisheries Act (federal) examples of paragraph parsing from HTML code." title="" id="42" name="Picture"/>
             <a:graphic>
               <a:graphicData uri="http://schemas.openxmlformats.org/drawingml/2006/picture">
                 <pic:pic>
                   <pic:nvPicPr>
-                    <pic:cNvPr descr="../assets/Legistics%20Paragraphing.png" id="42" name="Picture"/>
+                    <pic:cNvPr descr="../assets/Legistics%20Paragraphing.png" id="43" name="Picture"/>
                     <pic:cNvPicPr>
                       <a:picLocks noChangeArrowheads="1" noChangeAspect="1"/>
                     </pic:cNvPicPr>
                   </pic:nvPicPr>
                   <pic:blipFill>
-                    <a:blip r:embed="rId40"/>
+                    <a:blip r:embed="rId41"/>
                     <a:stretch>
                       <a:fillRect/>
                     </a:stretch>
@@ -2516,10 +2667,16 @@
       <w:pPr>
         <w:pStyle w:val="ImageCaption"/>
       </w:pPr>
-      <w:bookmarkStart w:id="43" w:name="fig:fig-legistics-paragraphing"/>
-      <w:bookmarkEnd w:id="43"/>
-      <w:r>
-        <w:t xml:space="preserve">Figure 4: Fisheries Act (federal) examples of paragraph parsing from HTML code.</w:t>
+      <w:bookmarkStart w:id="44" w:name="fig:fig-legistics-paragraphing"/>
+      <w:bookmarkEnd w:id="44"/>
+      <w:r>
+        <w:t xml:space="preserve">Figure 4:</w:t>
+      </w:r>
+      <w:r>
+        <w:t xml:space="preserve"> </w:t>
+      </w:r>
+      <w:r>
+        <w:t xml:space="preserve">Fisheries Act (federal) examples of paragraph parsing from HTML code.</w:t>
       </w:r>
     </w:p>
     <w:p>
@@ -2573,254 +2730,6 @@
       </w:r>
       <w:r>
         <w:t xml:space="preserve">package to extract the text of each clause, then grouped by section and heading.</w:t>
-      </w:r>
-    </w:p>
-    <w:bookmarkEnd w:id="44"/>
-    <w:bookmarkStart w:id="45" w:name="compendium-development"/>
-    <w:p>
-      <w:pPr>
-        <w:pStyle w:val="Heading2"/>
-      </w:pPr>
-      <w:r>
-        <w:t xml:space="preserve">Compendium development</w:t>
-      </w:r>
-    </w:p>
-    <w:p>
-      <w:pPr>
-        <w:pStyle w:val="FirstParagraph"/>
-      </w:pPr>
-      <w:r>
-        <w:t xml:space="preserve">The parsed legislation was stored in a SQLite database with datatables including jurisdiction, act name, legislation name, legislation type, paragraph content, section, heading, management domain, IUCN threat category, scope, and keywords matched. Storing the data as a database rather than one large spreadsheet allowed for a more dynamic and versatile system for querying, while streamlining the parsing and collection process.</w:t>
-      </w:r>
-    </w:p>
-    <w:bookmarkEnd w:id="45"/>
-    <w:bookmarkStart w:id="46" w:name="keyword-and-keyphrase-development"/>
-    <w:p>
-      <w:pPr>
-        <w:pStyle w:val="Heading2"/>
-      </w:pPr>
-      <w:r>
-        <w:t xml:space="preserve">Keyword and keyphrase development</w:t>
-      </w:r>
-    </w:p>
-    <w:p>
-      <w:pPr>
-        <w:pStyle w:val="FirstParagraph"/>
-      </w:pPr>
-      <w:r>
-        <w:t xml:space="preserve">The management domain and IUCN threat matching process pivoted around an established list of keywords and phrases relevant to Pacific salmon management. Keywords act as the language link between categorization and the legislative clauses. Keywords must be specific enough to match an IUCN threat, yet general enough to appear in multiple acts and regulations that span many decades of legislative language.</w:t>
-      </w:r>
-    </w:p>
-    <w:p>
-      <w:pPr>
-        <w:pStyle w:val="BodyText"/>
-      </w:pPr>
-      <w:r>
-        <w:t xml:space="preserve">We derived keyword lists from the</w:t>
-      </w:r>
-      <w:r>
-        <w:t xml:space="preserve"> </w:t>
-      </w:r>
-      <w:r>
-        <w:rPr>
-          <w:i/>
-          <w:iCs/>
-        </w:rPr>
-        <w:t xml:space="preserve">IUCN - CMP Direct Threats Classification 4.0</w:t>
-      </w:r>
-      <w:r>
-        <w:t xml:space="preserve"> </w:t>
-      </w:r>
-      <w:r>
-        <w:t xml:space="preserve">examples and definitions; word frequency analyses (unigrams, bigrams, and trigrams) of collected legislation; and iterative researcher input and revision. The keyword and keyphrase development process required an iterative researcher revision step because of the varied context of language. While the words used in the IUCN threat definitions may be specific to those threats, they may not be relevant to salmon management and may also have multiple meanings leading to an over-assignment of categories. For example, the word</w:t>
-      </w:r>
-      <w:r>
-        <w:t xml:space="preserve"> </w:t>
-      </w:r>
-      <w:r>
-        <w:t xml:space="preserve">“</w:t>
-      </w:r>
-      <w:r>
-        <w:t xml:space="preserve">landfill</w:t>
-      </w:r>
-      <w:r>
-        <w:t xml:space="preserve">”</w:t>
-      </w:r>
-      <w:r>
-        <w:t xml:space="preserve"> </w:t>
-      </w:r>
-      <w:r>
-        <w:t xml:space="preserve">is listed on the IUCN threat examples for</w:t>
-      </w:r>
-      <w:r>
-        <w:t xml:space="preserve"> </w:t>
-      </w:r>
-      <w:r>
-        <w:t xml:space="preserve">“</w:t>
-      </w:r>
-      <w:r>
-        <w:t xml:space="preserve">1.2 Commercial &amp; Industrial Areas.</w:t>
-      </w:r>
-      <w:r>
-        <w:t xml:space="preserve">”</w:t>
-      </w:r>
-      <w:r>
-        <w:t xml:space="preserve"> </w:t>
-      </w:r>
-      <w:r>
-        <w:t xml:space="preserve">Much of the collected legislation deals with pollution, in which landfills are mentioned. However, for salmon habitat, the threat would come from water effluent, and pollution would be a more accurate designation.</w:t>
-      </w:r>
-      <w:r>
-        <w:t xml:space="preserve"> </w:t>
-      </w:r>
-      <w:r>
-        <w:t xml:space="preserve">“</w:t>
-      </w:r>
-      <w:r>
-        <w:t xml:space="preserve">Landfill</w:t>
-      </w:r>
-      <w:r>
-        <w:t xml:space="preserve">”</w:t>
-      </w:r>
-      <w:r>
-        <w:t xml:space="preserve"> </w:t>
-      </w:r>
-      <w:r>
-        <w:t xml:space="preserve">as a keyword adds many clauses that could be considered outside of the scope of this tool, and so</w:t>
-      </w:r>
-      <w:r>
-        <w:t xml:space="preserve"> </w:t>
-      </w:r>
-      <w:r>
-        <w:t xml:space="preserve">“</w:t>
-      </w:r>
-      <w:r>
-        <w:t xml:space="preserve">landfill</w:t>
-      </w:r>
-      <w:r>
-        <w:t xml:space="preserve">”</w:t>
-      </w:r>
-      <w:r>
-        <w:t xml:space="preserve"> </w:t>
-      </w:r>
-      <w:r>
-        <w:t xml:space="preserve">was removed from the keyword list. Conversely, the word</w:t>
-      </w:r>
-      <w:r>
-        <w:t xml:space="preserve"> </w:t>
-      </w:r>
-      <w:r>
-        <w:t xml:space="preserve">“</w:t>
-      </w:r>
-      <w:r>
-        <w:t xml:space="preserve">riparian</w:t>
-      </w:r>
-      <w:r>
-        <w:t xml:space="preserve">”</w:t>
-      </w:r>
-      <w:r>
-        <w:t xml:space="preserve"> </w:t>
-      </w:r>
-      <w:r>
-        <w:t xml:space="preserve">is very relevant to salmon habitat management in British Columbia, yet that word doesn’t appear in the IUCN threat examples or word frequency analyses. As well,</w:t>
-      </w:r>
-      <w:r>
-        <w:t xml:space="preserve"> </w:t>
-      </w:r>
-      <w:r>
-        <w:t xml:space="preserve">“</w:t>
-      </w:r>
-      <w:r>
-        <w:t xml:space="preserve">riparian</w:t>
-      </w:r>
-      <w:r>
-        <w:t xml:space="preserve">”</w:t>
-      </w:r>
-      <w:r>
-        <w:t xml:space="preserve"> </w:t>
-      </w:r>
-      <w:r>
-        <w:t xml:space="preserve">doesn’t appear in word frequency analyses of other legislation.</w:t>
-      </w:r>
-      <w:r>
-        <w:t xml:space="preserve"> </w:t>
-      </w:r>
-      <w:r>
-        <w:t xml:space="preserve">“</w:t>
-      </w:r>
-      <w:r>
-        <w:t xml:space="preserve">Riparian</w:t>
-      </w:r>
-      <w:r>
-        <w:t xml:space="preserve">”</w:t>
-      </w:r>
-      <w:r>
-        <w:t xml:space="preserve"> </w:t>
-      </w:r>
-      <w:r>
-        <w:t xml:space="preserve">was added as a keyword solely from the researchers’ discretion.</w:t>
-      </w:r>
-    </w:p>
-    <w:p>
-      <w:pPr>
-        <w:pStyle w:val="BodyText"/>
-      </w:pPr>
-      <w:r>
-        <w:t xml:space="preserve">Researcher subjectivity can influence the process on two fronts: legislation inclusion, and keyword list development. However, using keyword lists allows for the subjectivity to be acknowledged, and the keyword lists to be reported such that the process may be repeatable. The meaning and context behind keywords, especially single words, can cause mis-categorization in unexpected ways. For example, the word</w:t>
-      </w:r>
-      <w:r>
-        <w:t xml:space="preserve"> </w:t>
-      </w:r>
-      <w:r>
-        <w:t xml:space="preserve">“</w:t>
-      </w:r>
-      <w:r>
-        <w:t xml:space="preserve">stock</w:t>
-      </w:r>
-      <w:r>
-        <w:t xml:space="preserve">”</w:t>
-      </w:r>
-      <w:r>
-        <w:t xml:space="preserve"> </w:t>
-      </w:r>
-      <w:r>
-        <w:t xml:space="preserve">is an important keyword for salmon management (the Fisheries management domain category). However, as a single word,</w:t>
-      </w:r>
-      <w:r>
-        <w:t xml:space="preserve"> </w:t>
-      </w:r>
-      <w:r>
-        <w:t xml:space="preserve">“</w:t>
-      </w:r>
-      <w:r>
-        <w:t xml:space="preserve">stock</w:t>
-      </w:r>
-      <w:r>
-        <w:t xml:space="preserve">”</w:t>
-      </w:r>
-      <w:r>
-        <w:t xml:space="preserve"> </w:t>
-      </w:r>
-      <w:r>
-        <w:t xml:space="preserve">can also refer to business holdings, freight cars, and cattle, which do not fit the Fisheries management domain. Revision of</w:t>
-      </w:r>
-      <w:r>
-        <w:t xml:space="preserve"> </w:t>
-      </w:r>
-      <w:r>
-        <w:t xml:space="preserve">“</w:t>
-      </w:r>
-      <w:r>
-        <w:t xml:space="preserve">stock</w:t>
-      </w:r>
-      <w:r>
-        <w:t xml:space="preserve">”</w:t>
-      </w:r>
-      <w:r>
-        <w:t xml:space="preserve"> </w:t>
-      </w:r>
-      <w:r>
-        <w:t xml:space="preserve">as a keyword is important for the accuracy of categorization. Outputs were reviewed iteratively, and keyword revision was a continuous process to find more relevant bigram or trigram alternatives; remove keywords where sections are already matched with other, more applicable keywords; and search for more specific word variations (plural, past tense, etc.)</w:t>
       </w:r>
     </w:p>
     <w:p>
@@ -2828,7 +2737,359 @@
         <w:pStyle w:val="Compact"/>
         <w:numPr>
           <w:ilvl w:val="0"/>
-          <w:numId w:val="1002"/>
+          <w:numId w:val="1005"/>
+        </w:numPr>
+      </w:pPr>
+      <w:r>
+        <w:rPr>
+          <w:b/>
+          <w:bCs/>
+        </w:rPr>
+        <w:t xml:space="preserve">DG - Also needs a citation. Note to be consistent in the introduction of R package names. udpipe doesn’t have quotation marks, this one does. The formatting depends on the citation style, so it can be changed later, but a consistent starting point would be good.</w:t>
+      </w:r>
+    </w:p>
+    <w:bookmarkEnd w:id="45"/>
+    <w:bookmarkStart w:id="46" w:name="compendium-development"/>
+    <w:p>
+      <w:pPr>
+        <w:pStyle w:val="Heading2"/>
+      </w:pPr>
+      <w:r>
+        <w:t xml:space="preserve">Compendium development</w:t>
+      </w:r>
+    </w:p>
+    <w:p>
+      <w:pPr>
+        <w:pStyle w:val="FirstParagraph"/>
+      </w:pPr>
+      <w:r>
+        <w:t xml:space="preserve">The parsed legislation was stored in a SQLite database with datatables including jurisdiction, act name, legislation name, legislation type, paragraph content, section, heading, management domain, IUCN threat category, scope, and keywords matched. Storing the data as a database rather than one large spreadsheet allowed for a more dynamic and versatile system for querying, while streamlining the parsing and collection process.</w:t>
+      </w:r>
+    </w:p>
+    <w:bookmarkEnd w:id="46"/>
+    <w:bookmarkStart w:id="47" w:name="keyword-and-keyphrase-development"/>
+    <w:p>
+      <w:pPr>
+        <w:pStyle w:val="Heading2"/>
+      </w:pPr>
+      <w:r>
+        <w:t xml:space="preserve">Keyword and keyphrase development</w:t>
+      </w:r>
+    </w:p>
+    <w:p>
+      <w:pPr>
+        <w:pStyle w:val="FirstParagraph"/>
+      </w:pPr>
+      <w:r>
+        <w:t xml:space="preserve">The management domain and IUCN threat matching process pivoted around an established list of keywords and phrases relevant to Pacific salmon management. Keywords act as the language link between categorization and the legislative clauses. Keywords must be specific enough to match an IUCN threat, yet general enough to appear in multiple acts and regulations that span many decades of legislative language.</w:t>
+      </w:r>
+    </w:p>
+    <w:p>
+      <w:pPr>
+        <w:pStyle w:val="BodyText"/>
+      </w:pPr>
+      <w:r>
+        <w:t xml:space="preserve">We derived keyword lists from the</w:t>
+      </w:r>
+      <w:r>
+        <w:t xml:space="preserve"> </w:t>
+      </w:r>
+      <w:r>
+        <w:rPr>
+          <w:i/>
+          <w:iCs/>
+        </w:rPr>
+        <w:t xml:space="preserve">IUCN - CMP Direct Threats Classification 4.0</w:t>
+      </w:r>
+      <w:r>
+        <w:t xml:space="preserve"> </w:t>
+      </w:r>
+      <w:r>
+        <w:t xml:space="preserve">examples and definitions; word frequency analyses (unigrams, bigrams, and trigrams) of collected legislation; and iterative researcher input and revision. The keyword and keyphrase development process required an iterative researcher revision step because of the varied context of language. While the words used in the IUCN threat definitions may be specific to those threats, they may not be relevant to salmon management and may also have multiple meanings leading to an over-assignment of categories. For example, the word</w:t>
+      </w:r>
+      <w:r>
+        <w:t xml:space="preserve"> </w:t>
+      </w:r>
+      <w:r>
+        <w:t xml:space="preserve">“</w:t>
+      </w:r>
+      <w:r>
+        <w:t xml:space="preserve">landfill</w:t>
+      </w:r>
+      <w:r>
+        <w:t xml:space="preserve">”</w:t>
+      </w:r>
+      <w:r>
+        <w:t xml:space="preserve"> </w:t>
+      </w:r>
+      <w:r>
+        <w:t xml:space="preserve">is listed on the IUCN threat examples for</w:t>
+      </w:r>
+      <w:r>
+        <w:t xml:space="preserve"> </w:t>
+      </w:r>
+      <w:r>
+        <w:t xml:space="preserve">“</w:t>
+      </w:r>
+      <w:r>
+        <w:t xml:space="preserve">1.2 Commercial &amp; Industrial Areas,</w:t>
+      </w:r>
+      <w:r>
+        <w:t xml:space="preserve">”</w:t>
+      </w:r>
+      <w:r>
+        <w:t xml:space="preserve"> </w:t>
+      </w:r>
+      <w:r>
+        <w:t xml:space="preserve">in the context of the physical footprint of landfill sites. Much of the collected legislation deals with pollution, in which landfills are mentioned as a source of effluent. However, for salmon habitat, the main threat would come from water effluent, rather than the physical impact of landfill sites proximal to salmon habitat, and pollution would be a more accurate designation.</w:t>
+      </w:r>
+      <w:r>
+        <w:t xml:space="preserve"> </w:t>
+      </w:r>
+      <w:r>
+        <w:t xml:space="preserve">“</w:t>
+      </w:r>
+      <w:r>
+        <w:t xml:space="preserve">Landfill</w:t>
+      </w:r>
+      <w:r>
+        <w:t xml:space="preserve">”</w:t>
+      </w:r>
+      <w:r>
+        <w:t xml:space="preserve"> </w:t>
+      </w:r>
+      <w:r>
+        <w:t xml:space="preserve">as a keyword adds many clauses that could be considered outside of the scope of this tool, and so</w:t>
+      </w:r>
+      <w:r>
+        <w:t xml:space="preserve"> </w:t>
+      </w:r>
+      <w:r>
+        <w:t xml:space="preserve">“</w:t>
+      </w:r>
+      <w:r>
+        <w:t xml:space="preserve">landfill</w:t>
+      </w:r>
+      <w:r>
+        <w:t xml:space="preserve">”</w:t>
+      </w:r>
+      <w:r>
+        <w:t xml:space="preserve"> </w:t>
+      </w:r>
+      <w:r>
+        <w:t xml:space="preserve">was removed from the keyword list. Conversely, the word</w:t>
+      </w:r>
+      <w:r>
+        <w:t xml:space="preserve"> </w:t>
+      </w:r>
+      <w:r>
+        <w:t xml:space="preserve">“</w:t>
+      </w:r>
+      <w:r>
+        <w:t xml:space="preserve">riparian</w:t>
+      </w:r>
+      <w:r>
+        <w:t xml:space="preserve">”</w:t>
+      </w:r>
+      <w:r>
+        <w:t xml:space="preserve"> </w:t>
+      </w:r>
+      <w:r>
+        <w:t xml:space="preserve">is very relevant to salmon habitat management in British Columbia, yet that word doesn’t appear in the IUCN threat examples or word frequency analyses. As well,</w:t>
+      </w:r>
+      <w:r>
+        <w:t xml:space="preserve"> </w:t>
+      </w:r>
+      <w:r>
+        <w:t xml:space="preserve">“</w:t>
+      </w:r>
+      <w:r>
+        <w:t xml:space="preserve">riparian</w:t>
+      </w:r>
+      <w:r>
+        <w:t xml:space="preserve">”</w:t>
+      </w:r>
+      <w:r>
+        <w:t xml:space="preserve"> </w:t>
+      </w:r>
+      <w:r>
+        <w:t xml:space="preserve">doesn’t appear in word frequency analyses of other legislation.</w:t>
+      </w:r>
+      <w:r>
+        <w:t xml:space="preserve"> </w:t>
+      </w:r>
+      <w:r>
+        <w:t xml:space="preserve">“</w:t>
+      </w:r>
+      <w:r>
+        <w:t xml:space="preserve">Riparian</w:t>
+      </w:r>
+      <w:r>
+        <w:t xml:space="preserve">”</w:t>
+      </w:r>
+      <w:r>
+        <w:t xml:space="preserve"> </w:t>
+      </w:r>
+      <w:r>
+        <w:t xml:space="preserve">was added as a keyword solely from the researchers’ discretion.</w:t>
+      </w:r>
+    </w:p>
+    <w:p>
+      <w:pPr>
+        <w:numPr>
+          <w:ilvl w:val="0"/>
+          <w:numId w:val="1006"/>
+        </w:numPr>
+      </w:pPr>
+      <w:r>
+        <w:rPr>
+          <w:b/>
+          <w:bCs/>
+        </w:rPr>
+        <w:t xml:space="preserve">DG - I think this example adequately gets across the idea that keywords may have multiple meanings and may be misaligned with threat categories. I’ve provided some edits for consideration that attempt to refine the context of the threat category definitions. Feel free to refine/reject my edits, and let me know if the ideas I’m attempting to introduce don’t make sense. Happy to discuss further.</w:t>
+      </w:r>
+    </w:p>
+    <w:p>
+      <w:pPr>
+        <w:numPr>
+          <w:ilvl w:val="0"/>
+          <w:numId w:val="1006"/>
+        </w:numPr>
+      </w:pPr>
+      <w:r>
+        <w:rPr>
+          <w:b/>
+          <w:bCs/>
+        </w:rPr>
+        <w:t xml:space="preserve">DG</w:t>
+      </w:r>
+      <w:r>
+        <w:t xml:space="preserve"> </w:t>
+      </w:r>
+      <w:r>
+        <w:t xml:space="preserve">-</w:t>
+      </w:r>
+      <w:r>
+        <w:t xml:space="preserve"> </w:t>
+      </w:r>
+      <w:r>
+        <w:rPr>
+          <w:b/>
+          <w:bCs/>
+        </w:rPr>
+        <w:t xml:space="preserve">This is the first time that</w:t>
+      </w:r>
+      <w:r>
+        <w:rPr>
+          <w:b/>
+          <w:bCs/>
+        </w:rPr>
+        <w:t xml:space="preserve"> </w:t>
+      </w:r>
+      <w:r>
+        <w:rPr>
+          <w:b/>
+          <w:bCs/>
+        </w:rPr>
+        <w:t xml:space="preserve">“</w:t>
+      </w:r>
+      <w:r>
+        <w:rPr>
+          <w:b/>
+          <w:bCs/>
+        </w:rPr>
+        <w:t xml:space="preserve">tool</w:t>
+      </w:r>
+      <w:r>
+        <w:rPr>
+          <w:b/>
+          <w:bCs/>
+        </w:rPr>
+        <w:t xml:space="preserve">”</w:t>
+      </w:r>
+      <w:r>
+        <w:rPr>
+          <w:b/>
+          <w:bCs/>
+        </w:rPr>
+        <w:t xml:space="preserve"> </w:t>
+      </w:r>
+      <w:r>
+        <w:rPr>
+          <w:b/>
+          <w:bCs/>
+        </w:rPr>
+        <w:t xml:space="preserve">is used to describe the project. It may be helpful to introduce the concept of this project’s outcomes as a tool in an earlier part of the report, possibly in the section introducing the objectives.</w:t>
+      </w:r>
+    </w:p>
+    <w:p>
+      <w:pPr>
+        <w:pStyle w:val="FirstParagraph"/>
+      </w:pPr>
+      <w:r>
+        <w:t xml:space="preserve">Researcher subjectivity can influence the process on two fronts: legislation inclusion, and keyword list development. However, using keyword lists allows for the subjectivity to be acknowledged, and the keyword lists to be reported such that the process may be repeatable. The meaning and context behind keywords, especially single words, can cause mis-categorization in unexpected ways. For example, the word</w:t>
+      </w:r>
+      <w:r>
+        <w:t xml:space="preserve"> </w:t>
+      </w:r>
+      <w:r>
+        <w:t xml:space="preserve">“</w:t>
+      </w:r>
+      <w:r>
+        <w:t xml:space="preserve">stock</w:t>
+      </w:r>
+      <w:r>
+        <w:t xml:space="preserve">”</w:t>
+      </w:r>
+      <w:r>
+        <w:t xml:space="preserve"> </w:t>
+      </w:r>
+      <w:r>
+        <w:t xml:space="preserve">is an important keyword for salmon management (the Fisheries management domain category). However, as a single word,</w:t>
+      </w:r>
+      <w:r>
+        <w:t xml:space="preserve"> </w:t>
+      </w:r>
+      <w:r>
+        <w:t xml:space="preserve">“</w:t>
+      </w:r>
+      <w:r>
+        <w:t xml:space="preserve">stock</w:t>
+      </w:r>
+      <w:r>
+        <w:t xml:space="preserve">”</w:t>
+      </w:r>
+      <w:r>
+        <w:t xml:space="preserve"> </w:t>
+      </w:r>
+      <w:r>
+        <w:t xml:space="preserve">can also refer to business holdings, freight cars, and cattle, which do not fit the Fisheries management domain. Revision of</w:t>
+      </w:r>
+      <w:r>
+        <w:t xml:space="preserve"> </w:t>
+      </w:r>
+      <w:r>
+        <w:t xml:space="preserve">“</w:t>
+      </w:r>
+      <w:r>
+        <w:t xml:space="preserve">stock</w:t>
+      </w:r>
+      <w:r>
+        <w:t xml:space="preserve">”</w:t>
+      </w:r>
+      <w:r>
+        <w:t xml:space="preserve"> </w:t>
+      </w:r>
+      <w:r>
+        <w:t xml:space="preserve">as a keyword is important for the accuracy of categorization. Outputs were reviewed iteratively, and keyword revision was a continuous process to find more relevant bigram or trigram alternatives; remove keywords where sections are already matched with other, more applicable keywords; and search for more specific word variations (plural, past tense, etc.)</w:t>
+      </w:r>
+    </w:p>
+    <w:p>
+      <w:pPr>
+        <w:pStyle w:val="Compact"/>
+        <w:numPr>
+          <w:ilvl w:val="0"/>
+          <w:numId w:val="1007"/>
         </w:numPr>
       </w:pPr>
       <w:r>
@@ -2853,9 +3114,9 @@
         <w:t xml:space="preserve">(Ray et al. 2021)</w:t>
       </w:r>
     </w:p>
-    <w:bookmarkEnd w:id="46"/>
     <w:bookmarkEnd w:id="47"/>
-    <w:bookmarkStart w:id="68" w:name="X21d2b709a3b2e27437c410286f2936ef3517541"/>
+    <w:bookmarkEnd w:id="48"/>
+    <w:bookmarkStart w:id="69" w:name="X21d2b709a3b2e27437c410286f2936ef3517541"/>
     <w:p>
       <w:pPr>
         <w:pStyle w:val="Heading1"/>
@@ -2878,15 +3139,15 @@
         <w:t xml:space="preserve">2</w:t>
       </w:r>
       <w:r>
-        <w:t xml:space="preserve">)</w:t>
+        <w:t xml:space="preserve">).</w:t>
       </w:r>
     </w:p>
     <w:p>
       <w:pPr>
         <w:pStyle w:val="TableCaption"/>
       </w:pPr>
-      <w:bookmarkStart w:id="48" w:name="tab:management-domain-tally"/>
-      <w:bookmarkEnd w:id="48"/>
+      <w:bookmarkStart w:id="49" w:name="tab:management-domain-tally"/>
+      <w:bookmarkEnd w:id="49"/>
       <w:r>
         <w:t xml:space="preserve">Table 2:</w:t>
       </w:r>
@@ -6719,18 +6980,18 @@
           <wp:inline>
             <wp:extent cx="5943600" cy="4457699"/>
             <wp:effectExtent b="0" l="0" r="0" t="0"/>
-            <wp:docPr descr="Figure 5: Count of sections matched by management domain, stacked by jurisdiction." title="" id="50" name="Picture"/>
+            <wp:docPr descr="Figure 5: Count of sections matched by management domain, stacked by jurisdiction." title="" id="51" name="Picture"/>
             <a:graphic>
               <a:graphicData uri="http://schemas.openxmlformats.org/drawingml/2006/picture">
                 <pic:pic>
                   <pic:nvPicPr>
-                    <pic:cNvPr descr="LAPSE_primary_publication_files/figure-docx/section-count-by-management-domain-1.png" id="51" name="Picture"/>
+                    <pic:cNvPr descr="LAPSE_primary_publication_files/figure-docx/section-count-by-management-domain-1.png" id="52" name="Picture"/>
                     <pic:cNvPicPr>
                       <a:picLocks noChangeArrowheads="1" noChangeAspect="1"/>
                     </pic:cNvPicPr>
                   </pic:nvPicPr>
                   <pic:blipFill>
-                    <a:blip r:embed="rId49"/>
+                    <a:blip r:embed="rId50"/>
                     <a:stretch>
                       <a:fillRect/>
                     </a:stretch>
@@ -6761,13 +7022,13 @@
       <w:pPr>
         <w:pStyle w:val="ImageCaption"/>
       </w:pPr>
-      <w:bookmarkStart w:id="52" w:name="fig:section-count-by-management-domain"/>
-      <w:bookmarkEnd w:id="52"/>
+      <w:bookmarkStart w:id="53" w:name="fig:section-count-by-management-domain"/>
+      <w:bookmarkEnd w:id="53"/>
       <w:r>
         <w:t xml:space="preserve">Figure 5: Count of sections matched by management domain, stacked by jurisdiction.</w:t>
       </w:r>
     </w:p>
-    <w:bookmarkStart w:id="57" w:name="iucn-level-2-categories"/>
+    <w:bookmarkStart w:id="58" w:name="iucn-level-2-categories"/>
     <w:p>
       <w:pPr>
         <w:pStyle w:val="Heading2"/>
@@ -6856,18 +7117,18 @@
           <wp:inline>
             <wp:extent cx="5943600" cy="4754880"/>
             <wp:effectExtent b="0" l="0" r="0" t="0"/>
-            <wp:docPr descr="Figure 6: Section counts by IUCN threat category, separated by jurisdiction." title="" id="54" name="Picture"/>
+            <wp:docPr descr="Figure 6: Section counts by IUCN threat category, separated by jurisdiction." title="" id="55" name="Picture"/>
             <a:graphic>
               <a:graphicData uri="http://schemas.openxmlformats.org/drawingml/2006/picture">
                 <pic:pic>
                   <pic:nvPicPr>
-                    <pic:cNvPr descr="LAPSE_primary_publication_files/figure-docx/fig-section-count-by-iucn-1.png" id="55" name="Picture"/>
+                    <pic:cNvPr descr="LAPSE_primary_publication_files/figure-docx/fig-section-count-by-iucn-1.png" id="56" name="Picture"/>
                     <pic:cNvPicPr>
                       <a:picLocks noChangeArrowheads="1" noChangeAspect="1"/>
                     </pic:cNvPicPr>
                   </pic:nvPicPr>
                   <pic:blipFill>
-                    <a:blip r:embed="rId53"/>
+                    <a:blip r:embed="rId54"/>
                     <a:stretch>
                       <a:fillRect/>
                     </a:stretch>
@@ -6898,14 +7159,14 @@
       <w:pPr>
         <w:pStyle w:val="ImageCaption"/>
       </w:pPr>
-      <w:bookmarkStart w:id="56" w:name="fig:fig-section-count-by-iucn"/>
-      <w:bookmarkEnd w:id="56"/>
+      <w:bookmarkStart w:id="57" w:name="fig:fig-section-count-by-iucn"/>
+      <w:bookmarkEnd w:id="57"/>
       <w:r>
         <w:t xml:space="preserve">Figure 6: Section counts by IUCN threat category, separated by jurisdiction.</w:t>
       </w:r>
     </w:p>
-    <w:bookmarkEnd w:id="57"/>
-    <w:bookmarkStart w:id="67" w:name="salmon-specific-scope"/>
+    <w:bookmarkEnd w:id="58"/>
+    <w:bookmarkStart w:id="68" w:name="salmon-specific-scope"/>
     <w:p>
       <w:pPr>
         <w:pStyle w:val="Heading2"/>
@@ -7030,18 +7291,18 @@
           <wp:inline>
             <wp:extent cx="5943600" cy="5200649"/>
             <wp:effectExtent b="0" l="0" r="0" t="0"/>
-            <wp:docPr descr="Figure 7: Proportion of sections by management domain, displayed as concentric rings representing scope categories (inner to outer: 1 - Salmon, 2 - Fish, 3 - Habitat, 4 - Governance)." title="" id="59" name="Picture"/>
+            <wp:docPr descr="Figure 7: Proportion of sections by management domain, displayed as concentric rings representing scope categories (inner to outer: 1 - Salmon, 2 - Fish, 3 - Habitat, 4 - Governance)." title="" id="60" name="Picture"/>
             <a:graphic>
               <a:graphicData uri="http://schemas.openxmlformats.org/drawingml/2006/picture">
                 <pic:pic>
                   <pic:nvPicPr>
-                    <pic:cNvPr descr="LAPSE_primary_publication_files/figure-docx/multiscope-donut-1.png" id="60" name="Picture"/>
+                    <pic:cNvPr descr="LAPSE_primary_publication_files/figure-docx/multiscope-donut-1.png" id="61" name="Picture"/>
                     <pic:cNvPicPr>
                       <a:picLocks noChangeArrowheads="1" noChangeAspect="1"/>
                     </pic:cNvPicPr>
                   </pic:nvPicPr>
                   <pic:blipFill>
-                    <a:blip r:embed="rId58"/>
+                    <a:blip r:embed="rId59"/>
                     <a:stretch>
                       <a:fillRect/>
                     </a:stretch>
@@ -7072,15 +7333,31 @@
       <w:pPr>
         <w:pStyle w:val="ImageCaption"/>
       </w:pPr>
-      <w:bookmarkStart w:id="61" w:name="fig:multiscope-donut"/>
-      <w:bookmarkEnd w:id="61"/>
+      <w:bookmarkStart w:id="62" w:name="fig:multiscope-donut"/>
+      <w:bookmarkEnd w:id="62"/>
       <w:r>
         <w:t xml:space="preserve">Figure 7: Proportion of sections by management domain, displayed as concentric rings representing scope categories (inner to outer: 1 - Salmon, 2 - Fish, 3 - Habitat, 4 - Governance).</w:t>
       </w:r>
     </w:p>
     <w:p>
       <w:pPr>
-        <w:pStyle w:val="BodyText"/>
+        <w:pStyle w:val="Compact"/>
+        <w:numPr>
+          <w:ilvl w:val="0"/>
+          <w:numId w:val="1008"/>
+        </w:numPr>
+      </w:pPr>
+      <w:r>
+        <w:rPr>
+          <w:b/>
+          <w:bCs/>
+        </w:rPr>
+        <w:t xml:space="preserve">DG - This is a super cool figure. I have a couple of questions about it. How was the order of the categories decided? Governance is the largest ring as #4, but it has the fewest management domains, so it could be more easily interpreted as a smaller ring compared to salmon, which relates to many categories but is the smallest ring at #1. I also find the colours difficult to distinguish. I assume this pattern was used because there are so many categories and a categorical colour scheme may be difficult with so many categories. I suggest devising an accessible colour scheme using an online tool for the maximum feasible number of categories, and then perhaps add linework/cross hatching to further distinguish the remaining categories. Currently, the gradient suggests in a way that there’s a relationship between proximal management domains, but it merely is arranged alphabetically.</w:t>
+      </w:r>
+    </w:p>
+    <w:p>
+      <w:pPr>
+        <w:pStyle w:val="FirstParagraph"/>
       </w:pPr>
       <w:r>
         <w:t xml:space="preserve">The scope assignment process was linked, but occurred independent of the management domain and IUCN threat assignment process. The</w:t>
@@ -7186,8 +7463,8 @@
       <w:pPr>
         <w:pStyle w:val="TableCaption"/>
       </w:pPr>
-      <w:bookmarkStart w:id="62" w:name="tab:scope-tally"/>
-      <w:bookmarkEnd w:id="62"/>
+      <w:bookmarkStart w:id="63" w:name="tab:scope-tally"/>
+      <w:bookmarkEnd w:id="63"/>
       <w:r>
         <w:t xml:space="preserve">Table 3:</w:t>
       </w:r>
@@ -8631,18 +8908,18 @@
           <wp:inline>
             <wp:extent cx="5943600" cy="4457699"/>
             <wp:effectExtent b="0" l="0" r="0" t="0"/>
-            <wp:docPr descr="Figure 8: Count of sections by legislation for scope category ‘1 - Salmon’, coloured by jurisdiction." title="" id="64" name="Picture"/>
+            <wp:docPr descr="Figure 8: Count of sections by legislation for scope category ‘1 - Salmon’, coloured by jurisdiction." title="" id="65" name="Picture"/>
             <a:graphic>
               <a:graphicData uri="http://schemas.openxmlformats.org/drawingml/2006/picture">
                 <pic:pic>
                   <pic:nvPicPr>
-                    <pic:cNvPr descr="LAPSE_primary_publication_files/figure-docx/section-count-salmon-scope-1.png" id="65" name="Picture"/>
+                    <pic:cNvPr descr="LAPSE_primary_publication_files/figure-docx/section-count-salmon-scope-1.png" id="66" name="Picture"/>
                     <pic:cNvPicPr>
                       <a:picLocks noChangeArrowheads="1" noChangeAspect="1"/>
                     </pic:cNvPicPr>
                   </pic:nvPicPr>
                   <pic:blipFill>
-                    <a:blip r:embed="rId63"/>
+                    <a:blip r:embed="rId64"/>
                     <a:stretch>
                       <a:fillRect/>
                     </a:stretch>
@@ -8673,8 +8950,8 @@
       <w:pPr>
         <w:pStyle w:val="ImageCaption"/>
       </w:pPr>
-      <w:bookmarkStart w:id="66" w:name="fig:section-count-salmon-scope"/>
-      <w:bookmarkEnd w:id="66"/>
+      <w:bookmarkStart w:id="67" w:name="fig:section-count-salmon-scope"/>
+      <w:bookmarkEnd w:id="67"/>
       <w:r>
         <w:t xml:space="preserve">Figure 8: Count of sections by legislation for scope category</w:t>
       </w:r>
@@ -8702,9 +8979,9 @@
         <w:br/>
       </w:r>
     </w:p>
-    <w:bookmarkEnd w:id="67"/>
     <w:bookmarkEnd w:id="68"/>
-    <w:bookmarkStart w:id="70" w:name="legislative-factors-clause-types"/>
+    <w:bookmarkEnd w:id="69"/>
+    <w:bookmarkStart w:id="71" w:name="legislative-factors-clause-types"/>
     <w:p>
       <w:pPr>
         <w:pStyle w:val="Heading1"/>
@@ -8752,8 +9029,8 @@
       <w:pPr>
         <w:pStyle w:val="TableCaption"/>
       </w:pPr>
-      <w:bookmarkStart w:id="69" w:name="tab:clause-type-with-domain-tally"/>
-      <w:bookmarkEnd w:id="69"/>
+      <w:bookmarkStart w:id="70" w:name="tab:clause-type-with-domain-tally"/>
+      <w:bookmarkEnd w:id="70"/>
       <w:r>
         <w:t xml:space="preserve">Table 4:</w:t>
       </w:r>
@@ -17145,8 +17422,8 @@
         <w:br/>
       </w:r>
     </w:p>
-    <w:bookmarkEnd w:id="70"/>
-    <w:bookmarkStart w:id="88" w:name="X3d1f28ebf57a42a02e6321b912ef3127a66a1d5"/>
+    <w:bookmarkEnd w:id="71"/>
+    <w:bookmarkStart w:id="90" w:name="X3d1f28ebf57a42a02e6321b912ef3127a66a1d5"/>
     <w:p>
       <w:pPr>
         <w:pStyle w:val="Heading1"/>
@@ -17160,10 +17437,7 @@
         <w:pStyle w:val="FirstParagraph"/>
       </w:pPr>
       <w:r>
-        <w:t xml:space="preserve">The</w:t>
-      </w:r>
-      <w:r>
-        <w:t xml:space="preserve"> </w:t>
+        <w:t xml:space="preserve">The </w:t>
       </w:r>
       <w:r>
         <w:rPr>
@@ -17176,7 +17450,7 @@
         <w:t xml:space="preserve"> </w:t>
       </w:r>
       <w:r>
-        <w:t xml:space="preserve">(COSEWIC) assesses the current status of aquatic species, including Pacific salmon stocks, as part of the</w:t>
+        <w:t xml:space="preserve">(COSEWIC) assesses the status of wildlife species at risk in Canada, which is the first step in the process of listing a wildlife species under the</w:t>
       </w:r>
       <w:r>
         <w:t xml:space="preserve"> </w:t>
@@ -17192,16 +17466,7 @@
         <w:t xml:space="preserve"> </w:t>
       </w:r>
       <w:r>
-        <w:t xml:space="preserve">(SARA) process</w:t>
-      </w:r>
-      <w:r>
-        <w:t xml:space="preserve"> </w:t>
-      </w:r>
-      <w:r>
-        <w:t xml:space="preserve">(Arbeider et al. 2020)</w:t>
-      </w:r>
-      <w:r>
-        <w:t xml:space="preserve">. Salmon populations are grouped into genetically and ecologically distinct Diagnostic Units (DU) for the purpose of assessment. When a DU is classified as</w:t>
+        <w:t xml:space="preserve">(SARA). COSEWIC uses Designatable Units (DUs) to assess units below the level of a recognized taxonomic species if it has attributes that make it both</w:t>
       </w:r>
       <w:r>
         <w:t xml:space="preserve"> </w:t>
@@ -17210,21 +17475,86 @@
         <w:t xml:space="preserve">“</w:t>
       </w:r>
       <w:r>
-        <w:t xml:space="preserve">Threatened, Endangered or Extirpated</w:t>
+        <w:t xml:space="preserve">discrete</w:t>
       </w:r>
       <w:r>
         <w:t xml:space="preserve">”</w:t>
       </w:r>
       <w:r>
-        <w:t xml:space="preserve">, a Recovery Potential Assessment (RPA) process is initiated, which calculates risk incorporating the same IUCN-CMP threat classification used in this legislative assessment.</w:t>
+        <w:t xml:space="preserve"> </w:t>
+      </w:r>
+      <w:r>
+        <w:t xml:space="preserve">and</w:t>
+      </w:r>
+      <w:r>
+        <w:t xml:space="preserve"> </w:t>
+      </w:r>
+      <w:r>
+        <w:t xml:space="preserve">“</w:t>
+      </w:r>
+      <w:r>
+        <w:t xml:space="preserve">evolutionarily significant</w:t>
+      </w:r>
+      <w:r>
+        <w:t xml:space="preserve">”</w:t>
+      </w:r>
+      <w:r>
+        <w:t xml:space="preserve">. COSEWIC has delineated DUs within Pacific salmon species according to these criteria for the purposes of its status assessments of these species. When a DU under DFO’s responsibility is designated as Threatened, Endangered, or Extirpated, a DFO-led Recovery Potential Assessment (RPA) process is initiated, which typically includes a threat assessment using the same IUCN-CMP threat classification used in this legislative assessment.</w:t>
       </w:r>
     </w:p>
     <w:p>
       <w:pPr>
-        <w:pStyle w:val="BodyText"/>
+        <w:numPr>
+          <w:ilvl w:val="0"/>
+          <w:numId w:val="1009"/>
+        </w:numPr>
       </w:pPr>
       <w:r>
-        <w:t xml:space="preserve">Fisheries and Oceans Canada published</w:t>
+        <w:rPr>
+          <w:b/>
+          <w:bCs/>
+        </w:rPr>
+        <w:t xml:space="preserve">DG - I made some edits for your consideration to fill in some missing details about COSEWIC and the SARA process. Originally my revisions were a bit longer but I scaled it back to try and focus on key pieces. Happy to discuss if needed.</w:t>
+      </w:r>
+    </w:p>
+    <w:p>
+      <w:pPr>
+        <w:numPr>
+          <w:ilvl w:val="0"/>
+          <w:numId w:val="1009"/>
+        </w:numPr>
+      </w:pPr>
+      <w:r>
+        <w:rPr>
+          <w:b/>
+          <w:bCs/>
+        </w:rPr>
+        <w:t xml:space="preserve">DG - Add this citation for this sentence</w:t>
+      </w:r>
+      <w:r>
+        <w:rPr>
+          <w:b/>
+          <w:bCs/>
+        </w:rPr>
+        <w:t xml:space="preserve"> </w:t>
+      </w:r>
+      <w:hyperlink r:id="rId72">
+        <w:r>
+          <w:rPr>
+            <w:rStyle w:val="Hyperlink"/>
+            <w:b/>
+            <w:bCs/>
+          </w:rPr>
+          <w:t xml:space="preserve">Cosewic - Guidelines for Recognizing Designatable Units</w:t>
+        </w:r>
+      </w:hyperlink>
+    </w:p>
+    <w:p>
+      <w:pPr>
+        <w:pStyle w:val="FirstParagraph"/>
+      </w:pPr>
+      <w:r>
+        <w:t xml:space="preserve">DFO published</w:t>
       </w:r>
       <w:r>
         <w:t xml:space="preserve"> </w:t>
@@ -17255,27 +17585,80 @@
         <w:t xml:space="preserve"> </w:t>
       </w:r>
       <w:r>
-        <w:t xml:space="preserve">(Canada 2005)</w:t>
-      </w:r>
-      <w:r>
-        <w:t xml:space="preserve">. Since CUs are the most current unit for managing salmon in British Columbia, we incorporated CUs in this effort (Table</w:t>
-      </w:r>
-      <w:r>
-        <w:t xml:space="preserve"> </w:t>
-      </w:r>
-      <w:r>
-        <w:t xml:space="preserve">5</w:t>
-      </w:r>
-      <w:r>
-        <w:t xml:space="preserve">).</w:t>
+        <w:t xml:space="preserve">(Canada 2005). Since CUs are the most current unit for managing salmon in British Columbia, we incorporated CUs in this effort (Table 5).</w:t>
+      </w:r>
+    </w:p>
+    <w:p>
+      <w:pPr>
+        <w:numPr>
+          <w:ilvl w:val="0"/>
+          <w:numId w:val="1010"/>
+        </w:numPr>
+      </w:pPr>
+      <w:r>
+        <w:rPr>
+          <w:b/>
+          <w:bCs/>
+        </w:rPr>
+        <w:t xml:space="preserve">DG - The COSEWIC status assessments for Pacific salmon have a good discussion of the similarities and differences between DUs and CUs. In my view, there are more similarities than differences, and this sentence seems to frame the two as being different.</w:t>
+      </w:r>
+    </w:p>
+    <w:p>
+      <w:pPr>
+        <w:numPr>
+          <w:ilvl w:val="0"/>
+          <w:numId w:val="1010"/>
+        </w:numPr>
+      </w:pPr>
+      <w:r>
+        <w:rPr>
+          <w:b/>
+          <w:bCs/>
+        </w:rPr>
+        <w:t xml:space="preserve">DG - The RPAs were conducted with respect to DUs, since it is a part of the DFO SARA listing process. What this paragraph may be lacking is a discussion of how the salmon DUs were derived, partly based on the CUs DFO had already described. This results in most of the CUs/DUs lining up, except for Interior Fraser Coho (assessed as 1 DU in 2016, 5 CUs currently). Perhaps something to the effect of,</w:t>
+      </w:r>
+      <w:r>
+        <w:rPr>
+          <w:b/>
+          <w:bCs/>
+        </w:rPr>
+        <w:t xml:space="preserve"> </w:t>
+      </w:r>
+      <w:r>
+        <w:rPr>
+          <w:b/>
+          <w:bCs/>
+        </w:rPr>
+        <w:t xml:space="preserve">“</w:t>
+      </w:r>
+      <w:r>
+        <w:rPr>
+          <w:b/>
+          <w:bCs/>
+        </w:rPr>
+        <w:t xml:space="preserve">Since the population structure described through the DU and CU systems largely overlaps for most salmon populations, we attribute the RPA threat assessment results for DUs to their corresponding CUs; however, in a case where a DU is represented by multiple CUs (e.g., interior Fraser Coho) or vice versa, we attributed the overall assessment to each component population</w:t>
+      </w:r>
+      <w:r>
+        <w:rPr>
+          <w:b/>
+          <w:bCs/>
+        </w:rPr>
+        <w:t xml:space="preserve">”</w:t>
+      </w:r>
+      <w:r>
+        <w:rPr>
+          <w:b/>
+          <w:bCs/>
+        </w:rPr>
+        <w:t xml:space="preserve">.</w:t>
       </w:r>
     </w:p>
     <w:p>
       <w:pPr>
         <w:pStyle w:val="TableCaption"/>
       </w:pPr>
-      <w:bookmarkStart w:id="71" w:name="tab:cu-species-cu-name-table"/>
-      <w:bookmarkEnd w:id="71"/>
+      <w:bookmarkStart w:id="73" w:name="tab:cu-species-cu-name-table"/>
+      <w:bookmarkEnd w:id="73"/>
       <w:r>
         <w:t xml:space="preserve">Table 5:</w:t>
       </w:r>
@@ -17283,7 +17666,7 @@
         <w:t xml:space="preserve"> </w:t>
       </w:r>
       <w:r>
-        <w:t xml:space="preserve">Conservation Units included in the COSEWIC Recovery Potential Assessment analysis.</w:t>
+        <w:t xml:space="preserve">Conservation Units included in the DFO Recovery Potential Assessment analyses.</w:t>
       </w:r>
     </w:p>
     <w:tbl xmlns:w="http://schemas.openxmlformats.org/wordprocessingml/2006/main" xmlns:r="http://schemas.openxmlformats.org/officeDocument/2006/relationships" xmlns:w14="http://schemas.microsoft.com/office/word/2010/wordml" xmlns:wp="http://schemas.openxmlformats.org/drawingml/2006/wordprocessingDrawing" xmlns:a="http://schemas.openxmlformats.org/drawingml/2006/main" xmlns:pic="http://schemas.openxmlformats.org/drawingml/2006/picture">
@@ -20945,17 +21328,69 @@
     </w:tbl>
     <w:p>
       <w:pPr>
-        <w:pStyle w:val="BodyText"/>
+        <w:numPr>
+          <w:ilvl w:val="0"/>
+          <w:numId w:val="1011"/>
+        </w:numPr>
       </w:pPr>
       <w:r>
-        <w:br/>
+        <w:rPr>
+          <w:b/>
+          <w:bCs/>
+        </w:rPr>
+        <w:t xml:space="preserve">DG - I suggest adding a column that has the RPA citation that covers each group of DUs, since I don’t see the RPAs cited anywhere else.</w:t>
       </w:r>
     </w:p>
     <w:p>
       <w:pPr>
-        <w:pStyle w:val="BodyText"/>
+        <w:numPr>
+          <w:ilvl w:val="0"/>
+          <w:numId w:val="1011"/>
+        </w:numPr>
       </w:pPr>
       <w:r>
+        <w:rPr>
+          <w:b/>
+          <w:bCs/>
+        </w:rPr>
+        <w:t xml:space="preserve">DG - For consideration: mapping the CUs to their corresponding DUs in this table. The STREAM platform has a crosswalk for this.</w:t>
+      </w:r>
+    </w:p>
+    <w:p>
+      <w:pPr>
+        <w:numPr>
+          <w:ilvl w:val="0"/>
+          <w:numId w:val="1011"/>
+        </w:numPr>
+      </w:pPr>
+      <w:r>
+        <w:rPr>
+          <w:b/>
+          <w:bCs/>
+        </w:rPr>
+        <w:t xml:space="preserve">DG - Following that train of thought, I think a more appropriate caption for this table would be: Designatable Units included in DFO’s Recovery Potential Assessment analyses and their corresponding Conservation Units</w:t>
+      </w:r>
+    </w:p>
+    <w:p>
+      <w:pPr>
+        <w:numPr>
+          <w:ilvl w:val="0"/>
+          <w:numId w:val="1011"/>
+        </w:numPr>
+      </w:pPr>
+      <w:r>
+        <w:rPr>
+          <w:b/>
+          <w:bCs/>
+        </w:rPr>
+        <w:t xml:space="preserve">DG - I think it would be worth mentioning how this selection of RPAs done. My understanding is that it only included RPAs that conducted threat assessments following the IUCN threat categories. My recollection is that the Sakinaw Lake Sockeye RPA didn’t exactly follow it, so it was excluded from your analysis. Is this correct?</w:t>
+      </w:r>
+    </w:p>
+    <w:p>
+      <w:pPr>
+        <w:pStyle w:val="FirstParagraph"/>
+      </w:pPr>
+      <w:r>
         <w:t xml:space="preserve">The RPA process identified two IUCN threat categories as being</w:t>
       </w:r>
       <w:r>
@@ -21038,6 +21473,22 @@
       </w:r>
       <w:r>
         <w:t xml:space="preserve">received an extreme-high ranking.</w:t>
+      </w:r>
+    </w:p>
+    <w:p>
+      <w:pPr>
+        <w:pStyle w:val="Compact"/>
+        <w:numPr>
+          <w:ilvl w:val="0"/>
+          <w:numId w:val="1012"/>
+        </w:numPr>
+      </w:pPr>
+      <w:r>
+        <w:rPr>
+          <w:b/>
+          <w:bCs/>
+        </w:rPr>
+        <w:t xml:space="preserve">DG - Did you use the main threat tables in the body of the RPAs? Chinook DU14 also received a High-Extreme threat risk for 7.3 Other ecosystem modifications</w:t>
       </w:r>
     </w:p>
     <w:p>
@@ -21049,18 +21500,18 @@
           <wp:inline>
             <wp:extent cx="5943600" cy="4457699"/>
             <wp:effectExtent b="0" l="0" r="0" t="0"/>
-            <wp:docPr descr="Figure 9: Conservation Unit count across IUCN threat categories and RPA threat rankings. Darker cells indicate more Conservation Units assessed at that threat level." title="" id="73" name="Picture"/>
+            <wp:docPr descr="Figure 9: Conservation Unit count across IUCN threat categories and RPA threat rankings. Darker cells indicate more Conservation Units assessed at that threat level." title="" id="75" name="Picture"/>
             <a:graphic>
               <a:graphicData uri="http://schemas.openxmlformats.org/drawingml/2006/picture">
                 <pic:pic>
                   <pic:nvPicPr>
-                    <pic:cNvPr descr="LAPSE_primary_publication_files/figure-docx/cu-ranking-heatmap-1.png" id="74" name="Picture"/>
+                    <pic:cNvPr descr="LAPSE_primary_publication_files/figure-docx/cu-ranking-heatmap-1.png" id="76" name="Picture"/>
                     <pic:cNvPicPr>
                       <a:picLocks noChangeArrowheads="1" noChangeAspect="1"/>
                     </pic:cNvPicPr>
                   </pic:nvPicPr>
                   <pic:blipFill>
-                    <a:blip r:embed="rId72"/>
+                    <a:blip r:embed="rId74"/>
                     <a:stretch>
                       <a:fillRect/>
                     </a:stretch>
@@ -21091,13 +21542,43 @@
       <w:pPr>
         <w:pStyle w:val="ImageCaption"/>
       </w:pPr>
-      <w:bookmarkStart w:id="75" w:name="fig:cu-ranking-heatmap"/>
-      <w:bookmarkEnd w:id="75"/>
+      <w:bookmarkStart w:id="77" w:name="fig:cu-ranking-heatmap"/>
+      <w:bookmarkEnd w:id="77"/>
       <w:r>
         <w:t xml:space="preserve">Figure 9: Conservation Unit count across IUCN threat categories and RPA threat rankings. Darker cells indicate more Conservation Units assessed at that threat level.</w:t>
       </w:r>
     </w:p>
-    <w:bookmarkStart w:id="81" w:name="case-study-iucn-10.1-geological-events"/>
+    <w:p>
+      <w:pPr>
+        <w:numPr>
+          <w:ilvl w:val="0"/>
+          <w:numId w:val="1013"/>
+        </w:numPr>
+      </w:pPr>
+      <w:r>
+        <w:rPr>
+          <w:b/>
+          <w:bCs/>
+        </w:rPr>
+        <w:t xml:space="preserve">DG - It looks like the x-axis is organized alphabetically, causing some of the threats in categories 10 and 11 to be up at the top.</w:t>
+      </w:r>
+    </w:p>
+    <w:p>
+      <w:pPr>
+        <w:numPr>
+          <w:ilvl w:val="0"/>
+          <w:numId w:val="1013"/>
+        </w:numPr>
+      </w:pPr>
+      <w:r>
+        <w:rPr>
+          <w:b/>
+          <w:bCs/>
+        </w:rPr>
+        <w:t xml:space="preserve">DG - Certain threat categories (e.g., pathogens) were only assessed in select RPAs (in this case, Interior Fraser Coho I think), which would bias the CU count. I think it would make the analysis more standardized if there was a common subset of threats assessed within each RPA that was chosen.</w:t>
+      </w:r>
+    </w:p>
+    <w:bookmarkStart w:id="83" w:name="case-study-iucn-10.1-geological-events"/>
     <w:p>
       <w:pPr>
         <w:pStyle w:val="Heading2"/>
@@ -21129,7 +21610,7 @@
         <w:t xml:space="preserve"> </w:t>
       </w:r>
       <w:r>
-        <w:t xml:space="preserve">through COSEWIC Recovery Potential Assessment processes, which was</w:t>
+        <w:t xml:space="preserve">through DFO Recovery Potential Assessment processes, which was</w:t>
       </w:r>
       <w:r>
         <w:t xml:space="preserve"> </w:t>
@@ -21187,14 +21668,158 @@
       </w:r>
       <w:r>
         <w:t xml:space="preserve">:</w:t>
+      </w:r>
+    </w:p>
+    <w:p>
+      <w:pPr>
+        <w:numPr>
+          <w:ilvl w:val="0"/>
+          <w:numId w:val="1014"/>
+        </w:numPr>
+      </w:pPr>
+      <w:r>
+        <w:rPr>
+          <w:b/>
+          <w:bCs/>
+        </w:rPr>
+        <w:t xml:space="preserve">DG - Suggest using IUCN-CMP throughout if that’s what we’re starting with.</w:t>
+      </w:r>
+    </w:p>
+    <w:p>
+      <w:pPr>
+        <w:numPr>
+          <w:ilvl w:val="0"/>
+          <w:numId w:val="1014"/>
+        </w:numPr>
+      </w:pPr>
+      <w:r>
+        <w:rPr>
+          <w:b/>
+          <w:bCs/>
+        </w:rPr>
+        <w:t xml:space="preserve">DG - I’m not super familiar with the most recent version of the IUCN-CMP threat classification framework that you’re using in this analysis, but in the RPAs, Geological events is</w:t>
+      </w:r>
+      <w:r>
+        <w:rPr>
+          <w:b/>
+          <w:bCs/>
+        </w:rPr>
+        <w:t xml:space="preserve"> </w:t>
+      </w:r>
+      <w:r>
+        <w:rPr>
+          <w:b/>
+          <w:bCs/>
+        </w:rPr>
+        <w:t xml:space="preserve">“</w:t>
+      </w:r>
+      <w:r>
+        <w:rPr>
+          <w:b/>
+          <w:bCs/>
+        </w:rPr>
+        <w:t xml:space="preserve">10</w:t>
+      </w:r>
+      <w:r>
+        <w:rPr>
+          <w:b/>
+          <w:bCs/>
+        </w:rPr>
+        <w:t xml:space="preserve">”</w:t>
+      </w:r>
+      <w:r>
+        <w:rPr>
+          <w:b/>
+          <w:bCs/>
+        </w:rPr>
+        <w:t xml:space="preserve"> </w:t>
+      </w:r>
+      <w:r>
+        <w:rPr>
+          <w:b/>
+          <w:bCs/>
+        </w:rPr>
+        <w:t xml:space="preserve">and is a first-level threat, and Avalanches/landslides is</w:t>
+      </w:r>
+      <w:r>
+        <w:rPr>
+          <w:b/>
+          <w:bCs/>
+        </w:rPr>
+        <w:t xml:space="preserve"> </w:t>
+      </w:r>
+      <w:r>
+        <w:rPr>
+          <w:b/>
+          <w:bCs/>
+        </w:rPr>
+        <w:t xml:space="preserve">“</w:t>
+      </w:r>
+      <w:r>
+        <w:rPr>
+          <w:b/>
+          <w:bCs/>
+        </w:rPr>
+        <w:t xml:space="preserve">10.1</w:t>
+      </w:r>
+      <w:r>
+        <w:rPr>
+          <w:b/>
+          <w:bCs/>
+        </w:rPr>
+        <w:t xml:space="preserve">”</w:t>
+      </w:r>
+      <w:r>
+        <w:rPr>
+          <w:b/>
+          <w:bCs/>
+        </w:rPr>
+        <w:t xml:space="preserve"> </w:t>
+      </w:r>
+      <w:r>
+        <w:rPr>
+          <w:b/>
+          <w:bCs/>
+        </w:rPr>
+        <w:t xml:space="preserve">and is a second-level threat.</w:t>
+      </w:r>
+    </w:p>
+    <w:p>
+      <w:pPr>
+        <w:numPr>
+          <w:ilvl w:val="0"/>
+          <w:numId w:val="1014"/>
+        </w:numPr>
+      </w:pPr>
+      <w:r>
+        <w:rPr>
+          <w:b/>
+          <w:bCs/>
+        </w:rPr>
+        <w:t xml:space="preserve">DG - I suggest just citing the RES Docs instead of the SARs</w:t>
+      </w:r>
+    </w:p>
+    <w:p>
+      <w:pPr>
+        <w:numPr>
+          <w:ilvl w:val="0"/>
+          <w:numId w:val="1014"/>
+        </w:numPr>
+      </w:pPr>
+      <w:r>
+        <w:rPr>
+          <w:b/>
+          <w:bCs/>
+        </w:rPr>
+        <w:t xml:space="preserve">DG - Are we referring to the DFO administrative area or is this a more generic term? If it’s more generic, perhaps something like middle/upper Fraser River area would be more precise for these DUs.</w:t>
       </w:r>
     </w:p>
     <w:p>
       <w:pPr>
         <w:pStyle w:val="TableCaption"/>
       </w:pPr>
-      <w:bookmarkStart w:id="76" w:name="tab:cu-extreme-threat-table"/>
-      <w:bookmarkEnd w:id="76"/>
+      <w:bookmarkStart w:id="78" w:name="tab:cu-extreme-threat-table"/>
+      <w:bookmarkEnd w:id="78"/>
       <w:r>
         <w:t xml:space="preserve">Table 6:</w:t>
       </w:r>
@@ -21789,14 +22414,6 @@
         <w:pStyle w:val="BodyText"/>
       </w:pPr>
       <w:r>
-        <w:br/>
-      </w:r>
-    </w:p>
-    <w:p>
-      <w:pPr>
-        <w:pStyle w:val="BodyText"/>
-      </w:pPr>
-      <w:r>
         <w:t xml:space="preserve">“</w:t>
       </w:r>
       <w:r>
@@ -21818,7 +22435,7 @@
         <w:t xml:space="preserve">6</w:t>
       </w:r>
       <w:r>
-        <w:t xml:space="preserve">. Aside from landscape-scale changes due to actions like forestry or mining, much of the nature of this category might not be viewed as human-caused or managed. Subsequently, this threat has a small proportion of keywords that match the relevant legislation. The</w:t>
+        <w:t xml:space="preserve">). Aside from landscape-scale changes due to actions like forestry or mining, much of the nature of this category might not be viewed as human-caused or managed. Subsequently, this threat has a small proportion of keywords that match the relevant legislation. The</w:t>
       </w:r>
       <w:r>
         <w:t xml:space="preserve"> </w:t>
@@ -21902,18 +22519,18 @@
           <wp:inline>
             <wp:extent cx="5943600" cy="4245428"/>
             <wp:effectExtent b="0" l="0" r="0" t="0"/>
-            <wp:docPr descr="Figure 10: Section counts by clause type for IUCN threat category 10.1 Geological Events." title="" id="78" name="Picture"/>
+            <wp:docPr descr="Figure 10: Section counts by clause type for IUCN threat category 10.1 Geological Events." title="" id="80" name="Picture"/>
             <a:graphic>
               <a:graphicData uri="http://schemas.openxmlformats.org/drawingml/2006/picture">
                 <pic:pic>
                   <pic:nvPicPr>
-                    <pic:cNvPr descr="LAPSE_primary_publication_files/figure-docx/fig-clause-type-geological-events-1.png" id="79" name="Picture"/>
+                    <pic:cNvPr descr="LAPSE_primary_publication_files/figure-docx/fig-clause-type-geological-events-1.png" id="81" name="Picture"/>
                     <pic:cNvPicPr>
                       <a:picLocks noChangeArrowheads="1" noChangeAspect="1"/>
                     </pic:cNvPicPr>
                   </pic:nvPicPr>
                   <pic:blipFill>
-                    <a:blip r:embed="rId77"/>
+                    <a:blip r:embed="rId79"/>
                     <a:stretch>
                       <a:fillRect/>
                     </a:stretch>
@@ -21944,8 +22561,8 @@
       <w:pPr>
         <w:pStyle w:val="ImageCaption"/>
       </w:pPr>
-      <w:bookmarkStart w:id="80" w:name="fig:fig-clause-type-geological-events"/>
-      <w:bookmarkEnd w:id="80"/>
+      <w:bookmarkStart w:id="82" w:name="fig:fig-clause-type-geological-events"/>
+      <w:bookmarkEnd w:id="82"/>
       <w:r>
         <w:t xml:space="preserve">Figure 10: Section counts by clause type for IUCN threat category 10.1 Geological Events.</w:t>
       </w:r>
@@ -21954,7 +22571,22 @@
       <w:pPr>
         <w:numPr>
           <w:ilvl w:val="0"/>
-          <w:numId w:val="1003"/>
+          <w:numId w:val="1015"/>
+        </w:numPr>
+      </w:pPr>
+      <w:r>
+        <w:rPr>
+          <w:b/>
+          <w:bCs/>
+        </w:rPr>
+        <w:t xml:space="preserve">DG - Could be helpful to note the different values on the x-axis between this and the next figure</w:t>
+      </w:r>
+    </w:p>
+    <w:p>
+      <w:pPr>
+        <w:numPr>
+          <w:ilvl w:val="0"/>
+          <w:numId w:val="1015"/>
         </w:numPr>
       </w:pPr>
       <w:r>
@@ -21969,7 +22601,7 @@
       <w:pPr>
         <w:numPr>
           <w:ilvl w:val="0"/>
-          <w:numId w:val="1003"/>
+          <w:numId w:val="1015"/>
         </w:numPr>
       </w:pPr>
       <w:r>
@@ -21980,8 +22612,8 @@
         <w:t xml:space="preserve">Comment on the most relevant legislation and why</w:t>
       </w:r>
     </w:p>
-    <w:bookmarkEnd w:id="81"/>
-    <w:bookmarkStart w:id="87" w:name="X0845d6834917053ec444eadf52e64b0021c48a3"/>
+    <w:bookmarkEnd w:id="83"/>
+    <w:bookmarkStart w:id="89" w:name="X0845d6834917053ec444eadf52e64b0021c48a3"/>
     <w:p>
       <w:pPr>
         <w:pStyle w:val="Heading2"/>
@@ -22013,7 +22645,7 @@
         <w:t xml:space="preserve"> </w:t>
       </w:r>
       <w:r>
-        <w:t xml:space="preserve">through COSEWIC Recovery Potential Assessment processes, which was</w:t>
+        <w:t xml:space="preserve">through DFO Recovery Potential Assessment processes, which was</w:t>
       </w:r>
       <w:r>
         <w:t xml:space="preserve"> </w:t>
@@ -22053,14 +22685,44 @@
       </w:r>
       <w:r>
         <w:t xml:space="preserve">).</w:t>
+      </w:r>
+    </w:p>
+    <w:p>
+      <w:pPr>
+        <w:numPr>
+          <w:ilvl w:val="0"/>
+          <w:numId w:val="1016"/>
+        </w:numPr>
+      </w:pPr>
+      <w:r>
+        <w:rPr>
+          <w:b/>
+          <w:bCs/>
+        </w:rPr>
+        <w:t xml:space="preserve">DG - And 7.3 Other ecosystem modifications</w:t>
+      </w:r>
+    </w:p>
+    <w:p>
+      <w:pPr>
+        <w:numPr>
+          <w:ilvl w:val="0"/>
+          <w:numId w:val="1016"/>
+        </w:numPr>
+      </w:pPr>
+      <w:r>
+        <w:rPr>
+          <w:b/>
+          <w:bCs/>
+        </w:rPr>
+        <w:t xml:space="preserve">DG - Likewise, this DU spawns in the South Thompson River watershed, so there’s an opportunity to make this description a bit more precise if wanted.</w:t>
       </w:r>
     </w:p>
     <w:p>
       <w:pPr>
         <w:pStyle w:val="TableCaption"/>
       </w:pPr>
-      <w:bookmarkStart w:id="82" w:name="tab:cu-extreme-high-threat-table"/>
-      <w:bookmarkEnd w:id="82"/>
+      <w:bookmarkStart w:id="84" w:name="tab:cu-extreme-high-threat-table"/>
+      <w:bookmarkEnd w:id="84"/>
       <w:r>
         <w:t xml:space="preserve">Table 7:</w:t>
       </w:r>
@@ -22347,10 +23009,54 @@
     </w:p>
     <w:p>
       <w:pPr>
-        <w:pStyle w:val="BodyText"/>
+        <w:pStyle w:val="Compact"/>
+        <w:numPr>
+          <w:ilvl w:val="0"/>
+          <w:numId w:val="1017"/>
+        </w:numPr>
       </w:pPr>
       <w:r>
-        <w:t xml:space="preserve">The clause type matches for Dams and Water Management / Use was much more evenly distributed likely due to the large number of clause matches in total for that IUCN threat category.</w:t>
+        <w:rPr>
+          <w:b/>
+          <w:bCs/>
+        </w:rPr>
+        <w:t xml:space="preserve">DG - This made me think that there was going to be a citation at the end of this sentence. Is this statement based on the present analysis? If so, then perhaps something to the effect of</w:t>
+      </w:r>
+      <w:r>
+        <w:rPr>
+          <w:b/>
+          <w:bCs/>
+        </w:rPr>
+        <w:t xml:space="preserve"> </w:t>
+      </w:r>
+      <w:r>
+        <w:rPr>
+          <w:b/>
+          <w:bCs/>
+        </w:rPr>
+        <w:t xml:space="preserve">“</w:t>
+      </w:r>
+      <w:r>
+        <w:rPr>
+          <w:b/>
+          <w:bCs/>
+        </w:rPr>
+        <w:t xml:space="preserve">this analysis suggests that watercourse alternations are one of the top…</w:t>
+      </w:r>
+      <w:r>
+        <w:rPr>
+          <w:b/>
+          <w:bCs/>
+        </w:rPr>
+        <w:t xml:space="preserve">”</w:t>
+      </w:r>
+    </w:p>
+    <w:p>
+      <w:pPr>
+        <w:pStyle w:val="FirstParagraph"/>
+      </w:pPr>
+      <w:r>
+        <w:t xml:space="preserve">The clause type matches for Dams and Water Management / Use were much more evenly distributed likely due to the large number of clause matches in total for that IUCN threat category.</w:t>
       </w:r>
       <w:r>
         <w:t xml:space="preserve"> </w:t>
@@ -22410,18 +23116,18 @@
           <wp:inline>
             <wp:extent cx="5943600" cy="4245428"/>
             <wp:effectExtent b="0" l="0" r="0" t="0"/>
-            <wp:docPr descr="Figure 11: Section counts by clause type for IUCN threat category 7.2 Dams &amp; Water Management / Use." title="" id="84" name="Picture"/>
+            <wp:docPr descr="Figure 11: Section counts by clause type for IUCN threat category 7.2 Dams &amp; Water Management / Use." title="" id="86" name="Picture"/>
             <a:graphic>
               <a:graphicData uri="http://schemas.openxmlformats.org/drawingml/2006/picture">
                 <pic:pic>
                   <pic:nvPicPr>
-                    <pic:cNvPr descr="LAPSE_primary_publication_files/figure-docx/fig-clause-type-water-use-1.png" id="85" name="Picture"/>
+                    <pic:cNvPr descr="LAPSE_primary_publication_files/figure-docx/fig-clause-type-water-use-1.png" id="87" name="Picture"/>
                     <pic:cNvPicPr>
                       <a:picLocks noChangeArrowheads="1" noChangeAspect="1"/>
                     </pic:cNvPicPr>
                   </pic:nvPicPr>
                   <pic:blipFill>
-                    <a:blip r:embed="rId83"/>
+                    <a:blip r:embed="rId85"/>
                     <a:stretch>
                       <a:fillRect/>
                     </a:stretch>
@@ -22452,8 +23158,8 @@
       <w:pPr>
         <w:pStyle w:val="ImageCaption"/>
       </w:pPr>
-      <w:bookmarkStart w:id="86" w:name="fig:fig-clause-type-water-use"/>
-      <w:bookmarkEnd w:id="86"/>
+      <w:bookmarkStart w:id="88" w:name="fig:fig-clause-type-water-use"/>
+      <w:bookmarkEnd w:id="88"/>
       <w:r>
         <w:t xml:space="preserve">Figure 11: Section counts by clause type for IUCN threat category 7.2 Dams &amp; Water Management / Use.</w:t>
       </w:r>
@@ -22462,7 +23168,7 @@
       <w:pPr>
         <w:numPr>
           <w:ilvl w:val="0"/>
-          <w:numId w:val="1004"/>
+          <w:numId w:val="1018"/>
         </w:numPr>
       </w:pPr>
       <w:r>
@@ -22477,7 +23183,7 @@
       <w:pPr>
         <w:numPr>
           <w:ilvl w:val="0"/>
-          <w:numId w:val="1004"/>
+          <w:numId w:val="1018"/>
         </w:numPr>
       </w:pPr>
       <w:r>
@@ -22488,9 +23194,9 @@
         <w:t xml:space="preserve">Comment on the most relevant legislation and why</w:t>
       </w:r>
     </w:p>
-    <w:bookmarkEnd w:id="87"/>
-    <w:bookmarkEnd w:id="88"/>
-    <w:bookmarkStart w:id="89" w:name="co-occurrence-of-management-domains"/>
+    <w:bookmarkEnd w:id="89"/>
+    <w:bookmarkEnd w:id="90"/>
+    <w:bookmarkStart w:id="91" w:name="co-occurrence-of-management-domains"/>
     <w:p>
       <w:pPr>
         <w:pStyle w:val="Heading1"/>
@@ -22595,8 +23301,8 @@
         <w:t xml:space="preserve">Domain co-occurrence within sections allows for an interesting study of how management domains overlap (Figure 11). A frequent co-occurrence among management domains doesn’t necessarily represent a relationship in reality, simply the legal framing used to regulate these aspects. The Pollution management domain and Water Use and Watercourse Modifications are in the top four most matched to sections (Figure 4), and expectedly, these domains have the largest number of co-occurrences. Both domains relate generally to the impacts from anthropogenic industrialization and commercial development, which is reflected in the legal language.</w:t>
       </w:r>
     </w:p>
-    <w:bookmarkEnd w:id="89"/>
-    <w:bookmarkStart w:id="91" w:name="discussion"/>
+    <w:bookmarkEnd w:id="91"/>
+    <w:bookmarkStart w:id="93" w:name="discussion"/>
     <w:p>
       <w:pPr>
         <w:pStyle w:val="Heading1"/>
@@ -22779,7 +23485,7 @@
         <w:t xml:space="preserve">(Order) for economic and political reasons (co-migrating with other stocks), denying the population larger legislative protections.</w:t>
       </w:r>
     </w:p>
-    <w:bookmarkStart w:id="90" w:name="conclusions"/>
+    <w:bookmarkStart w:id="92" w:name="conclusions"/>
     <w:p>
       <w:pPr>
         <w:pStyle w:val="Heading2"/>
@@ -22798,15 +23504,31 @@
     </w:p>
     <w:p>
       <w:pPr>
-        <w:pStyle w:val="BodyText"/>
+        <w:pStyle w:val="Compact"/>
+        <w:numPr>
+          <w:ilvl w:val="0"/>
+          <w:numId w:val="1019"/>
+        </w:numPr>
       </w:pPr>
       <w:r>
+        <w:rPr>
+          <w:b/>
+          <w:bCs/>
+        </w:rPr>
+        <w:t xml:space="preserve">DG - I feel as though LAPSE provides practitioners with more than knowledge, but also accessibility and navigability of the legal landscape</w:t>
+      </w:r>
+    </w:p>
+    <w:p>
+      <w:pPr>
+        <w:pStyle w:val="FirstParagraph"/>
+      </w:pPr>
+      <w:r>
         <w:t xml:space="preserve">The LAPSE tool provides a novel approach of linking legal language with salmon management categorization by developing management domain categories based on internationally recognized biodiversity threat categories (IUCN threats). The methods developed to identify and match salmon management keywords and keyphrases to clauses allow for multiple outputs and opportunities including: an extensive list of legislation (acts, regulations, sections, and paragraphs) relevant to a human activity or salmon management decisions; assessment of the nature or context of the statute (clause type) by management domain and threat; assessment of the overlap and connectedness in management domains (co-occurrence) to better understand the relationship between salmon threats in legislation. While this process and tool are relatively new and untested, further development could lead to a better integration of salmon management decisions and administrative responsibility.</w:t>
       </w:r>
     </w:p>
-    <w:bookmarkEnd w:id="90"/>
-    <w:bookmarkEnd w:id="91"/>
-    <w:bookmarkStart w:id="144" w:name="references"/>
+    <w:bookmarkEnd w:id="92"/>
+    <w:bookmarkEnd w:id="93"/>
+    <w:bookmarkStart w:id="145" w:name="references"/>
     <w:p>
       <w:pPr>
         <w:pStyle w:val="Heading1"/>
@@ -22815,8 +23537,8 @@
         <w:t xml:space="preserve">References</w:t>
       </w:r>
     </w:p>
-    <w:bookmarkStart w:id="143" w:name="refs"/>
-    <w:bookmarkStart w:id="92" w:name="ref-arbeider2020"/>
+    <w:bookmarkStart w:id="144" w:name="refs"/>
+    <w:bookmarkStart w:id="94" w:name="ref-arbeider2020"/>
     <w:p>
       <w:pPr>
         <w:pStyle w:val="Bibliography"/>
@@ -22834,8 +23556,8 @@
         <w:t xml:space="preserve">.</w:t>
       </w:r>
     </w:p>
-    <w:bookmarkEnd w:id="92"/>
-    <w:bookmarkStart w:id="94" w:name="ref-atkinson2024"/>
+    <w:bookmarkEnd w:id="94"/>
+    <w:bookmarkStart w:id="96" w:name="ref-atkinson2024"/>
     <w:p>
       <w:pPr>
         <w:pStyle w:val="Bibliography"/>
@@ -22855,7 +23577,7 @@
       <w:r>
         <w:t xml:space="preserve">in monitoring of salmon spawners continue despite a conservation crisis. doi:</w:t>
       </w:r>
-      <w:hyperlink r:id="rId93">
+      <w:hyperlink r:id="rId95">
         <w:r>
           <w:rPr>
             <w:rStyle w:val="Hyperlink"/>
@@ -22867,8 +23589,8 @@
         <w:t xml:space="preserve">.</w:t>
       </w:r>
     </w:p>
-    <w:bookmarkEnd w:id="94"/>
-    <w:bookmarkStart w:id="96" w:name="ref-bankes2014"/>
+    <w:bookmarkEnd w:id="96"/>
+    <w:bookmarkStart w:id="98" w:name="ref-bankes2014"/>
     <w:p>
       <w:pPr>
         <w:pStyle w:val="Bibliography"/>
@@ -22919,7 +23641,7 @@
       <w:r>
         <w:t xml:space="preserve">(9): 6024–6048. doi:</w:t>
       </w:r>
-      <w:hyperlink r:id="rId95">
+      <w:hyperlink r:id="rId97">
         <w:r>
           <w:rPr>
             <w:rStyle w:val="Hyperlink"/>
@@ -22931,8 +23653,8 @@
         <w:t xml:space="preserve">.</w:t>
       </w:r>
     </w:p>
-    <w:bookmarkEnd w:id="96"/>
-    <w:bookmarkStart w:id="97" w:name="ref-becklumb2013"/>
+    <w:bookmarkEnd w:id="98"/>
+    <w:bookmarkStart w:id="99" w:name="ref-becklumb2013"/>
     <w:p>
       <w:pPr>
         <w:pStyle w:val="Bibliography"/>
@@ -22962,8 +23684,8 @@
         <w:t xml:space="preserve">.</w:t>
       </w:r>
     </w:p>
-    <w:bookmarkEnd w:id="97"/>
-    <w:bookmarkStart w:id="99" w:name="ref-bisson2009"/>
+    <w:bookmarkEnd w:id="99"/>
+    <w:bookmarkStart w:id="101" w:name="ref-bisson2009"/>
     <w:p>
       <w:pPr>
         <w:pStyle w:val="Bibliography"/>
@@ -23038,7 +23760,7 @@
       <w:r>
         <w:t xml:space="preserve">(1): art45. doi:</w:t>
       </w:r>
-      <w:hyperlink r:id="rId98">
+      <w:hyperlink r:id="rId100">
         <w:r>
           <w:rPr>
             <w:rStyle w:val="Hyperlink"/>
@@ -23050,8 +23772,8 @@
         <w:t xml:space="preserve">.</w:t>
       </w:r>
     </w:p>
-    <w:bookmarkEnd w:id="99"/>
-    <w:bookmarkStart w:id="101" w:name="ref-bogetti2025"/>
+    <w:bookmarkEnd w:id="101"/>
+    <w:bookmarkStart w:id="103" w:name="ref-bogetti2025"/>
     <w:p>
       <w:pPr>
         <w:pStyle w:val="Bibliography"/>
@@ -23093,7 +23815,7 @@
       <w:r>
         <w:t xml:space="preserve">: 1–11. doi:</w:t>
       </w:r>
-      <w:hyperlink r:id="rId100">
+      <w:hyperlink r:id="rId102">
         <w:r>
           <w:rPr>
             <w:rStyle w:val="Hyperlink"/>
@@ -23105,8 +23827,8 @@
         <w:t xml:space="preserve">.</w:t>
       </w:r>
     </w:p>
-    <w:bookmarkEnd w:id="101"/>
-    <w:bookmarkStart w:id="103" w:name="ref-campbell2002"/>
+    <w:bookmarkEnd w:id="103"/>
+    <w:bookmarkStart w:id="105" w:name="ref-campbell2002"/>
     <w:p>
       <w:pPr>
         <w:pStyle w:val="Bibliography"/>
@@ -23181,7 +23903,7 @@
       <w:r>
         <w:t xml:space="preserve">(5): 223–232. doi:</w:t>
       </w:r>
-      <w:hyperlink r:id="rId102">
+      <w:hyperlink r:id="rId104">
         <w:r>
           <w:rPr>
             <w:rStyle w:val="Hyperlink"/>
@@ -23193,42 +23915,13 @@
         <w:t xml:space="preserve">.</w:t>
       </w:r>
     </w:p>
-    <w:bookmarkEnd w:id="103"/>
-    <w:bookmarkStart w:id="104" w:name="ref-canada2005"/>
+    <w:bookmarkEnd w:id="105"/>
+    <w:bookmarkStart w:id="107" w:name="X0deca4265bf6bbafed91be61c4a47264114da06"/>
     <w:p>
       <w:pPr>
         <w:pStyle w:val="Bibliography"/>
       </w:pPr>
       <w:r>
-        <w:t xml:space="preserve">Canada (</w:t>
-      </w:r>
-      <w:r>
-        <w:rPr>
-          <w:i/>
-          <w:iCs/>
-        </w:rPr>
-        <w:t xml:space="preserve">Editor</w:t>
-      </w:r>
-      <w:r>
-        <w:t xml:space="preserve">). 2005. Canada’s policy for conservation of wild pacific salmon.</w:t>
-      </w:r>
-      <w:r>
-        <w:t xml:space="preserve"> </w:t>
-      </w:r>
-      <w:r>
-        <w:t xml:space="preserve">Department of Fisheries and Oceans</w:t>
-      </w:r>
-      <w:r>
-        <w:t xml:space="preserve">, Vancouver, BC.</w:t>
-      </w:r>
-    </w:p>
-    <w:bookmarkEnd w:id="104"/>
-    <w:bookmarkStart w:id="106" w:name="X0deca4265bf6bbafed91be61c4a47264114da06"/>
-    <w:p>
-      <w:pPr>
-        <w:pStyle w:val="Bibliography"/>
-      </w:pPr>
-      <w:r>
         <w:t xml:space="preserve">Canadian Legal Information Institute. 2025, December 18.</w:t>
       </w:r>
       <w:r>
@@ -23243,7 +23936,7 @@
       <w:r>
         <w:t xml:space="preserve"> </w:t>
       </w:r>
-      <w:hyperlink r:id="rId105">
+      <w:hyperlink r:id="rId106">
         <w:r>
           <w:rPr>
             <w:rStyle w:val="Hyperlink"/>
@@ -23258,8 +23951,8 @@
         <w:t xml:space="preserve">[accessed 18 December 2025].</w:t>
       </w:r>
     </w:p>
-    <w:bookmarkEnd w:id="106"/>
-    <w:bookmarkStart w:id="108" w:name="ref-chalifour2022"/>
+    <w:bookmarkEnd w:id="107"/>
+    <w:bookmarkStart w:id="109" w:name="ref-chalifour2022"/>
     <w:p>
       <w:pPr>
         <w:pStyle w:val="Bibliography"/>
@@ -23267,7 +23960,7 @@
       <w:r>
         <w:t xml:space="preserve">Chalifour, L., Holt, C., Camaclang, A.E., Bradford, M.J., Dixon, R., Finn, R.J.R., Hemming, V., Hinch, S.G., Levings, C.D., MacDuffee, M., Nishimura, D.J.H., Pearson, M., Reynolds, J.D., Scott, D.C., Spremberg, U., Stark, S., Stevens, J., Baum, J.K., and Martin, T.G. 2022. Identifying a pathway towards recovery for depleted wild pacific salmon populations in a large watershed under multiple stressors. Journal of Applied Ecology (November 2021): 2212–2226. doi:</w:t>
       </w:r>
-      <w:hyperlink r:id="rId107">
+      <w:hyperlink r:id="rId108">
         <w:r>
           <w:rPr>
             <w:rStyle w:val="Hyperlink"/>
@@ -23279,8 +23972,8 @@
         <w:t xml:space="preserve">.</w:t>
       </w:r>
     </w:p>
-    <w:bookmarkEnd w:id="108"/>
-    <w:bookmarkStart w:id="109" w:name="ref-collins2019"/>
+    <w:bookmarkEnd w:id="109"/>
+    <w:bookmarkStart w:id="110" w:name="ref-collins2019"/>
     <w:p>
       <w:pPr>
         <w:pStyle w:val="Bibliography"/>
@@ -23335,8 +24028,8 @@
         <w:t xml:space="preserve">.</w:t>
       </w:r>
     </w:p>
-    <w:bookmarkEnd w:id="109"/>
-    <w:bookmarkStart w:id="111" w:name="ref-dallimer2015"/>
+    <w:bookmarkEnd w:id="110"/>
+    <w:bookmarkStart w:id="112" w:name="ref-dallimer2015"/>
     <w:p>
       <w:pPr>
         <w:pStyle w:val="Bibliography"/>
@@ -23357,7 +24050,7 @@
       <w:r>
         <w:t xml:space="preserve">(3): 132–139. doi:</w:t>
       </w:r>
-      <w:hyperlink r:id="rId110">
+      <w:hyperlink r:id="rId111">
         <w:r>
           <w:rPr>
             <w:rStyle w:val="Hyperlink"/>
@@ -23369,8 +24062,8 @@
         <w:t xml:space="preserve">.</w:t>
       </w:r>
     </w:p>
-    <w:bookmarkEnd w:id="111"/>
-    <w:bookmarkStart w:id="113" w:name="ref-delvalle2024"/>
+    <w:bookmarkEnd w:id="112"/>
+    <w:bookmarkStart w:id="114" w:name="ref-delvalle2024"/>
     <w:p>
       <w:pPr>
         <w:pStyle w:val="Bibliography"/>
@@ -23397,7 +24090,7 @@
       <w:r>
         <w:t xml:space="preserve">(1): 1–17. doi:</w:t>
       </w:r>
-      <w:hyperlink r:id="rId112">
+      <w:hyperlink r:id="rId113">
         <w:r>
           <w:rPr>
             <w:rStyle w:val="Hyperlink"/>
@@ -23409,8 +24102,8 @@
         <w:t xml:space="preserve">.</w:t>
       </w:r>
     </w:p>
-    <w:bookmarkEnd w:id="113"/>
-    <w:bookmarkStart w:id="115" w:name="ref-departmentofjusticecanada2022"/>
+    <w:bookmarkEnd w:id="114"/>
+    <w:bookmarkStart w:id="116" w:name="ref-departmentofjusticecanada2022"/>
     <w:p>
       <w:pPr>
         <w:pStyle w:val="Bibliography"/>
@@ -23430,7 +24123,7 @@
       <w:r>
         <w:t xml:space="preserve"> </w:t>
       </w:r>
-      <w:hyperlink r:id="rId114">
+      <w:hyperlink r:id="rId115">
         <w:r>
           <w:rPr>
             <w:rStyle w:val="Hyperlink"/>
@@ -23445,8 +24138,8 @@
         <w:t xml:space="preserve">[accessed 18 December 2025].</w:t>
       </w:r>
     </w:p>
-    <w:bookmarkEnd w:id="115"/>
-    <w:bookmarkStart w:id="116" w:name="ref-dfo2020"/>
+    <w:bookmarkEnd w:id="116"/>
+    <w:bookmarkStart w:id="117" w:name="ref-dfo2020"/>
     <w:p>
       <w:pPr>
         <w:pStyle w:val="Bibliography"/>
@@ -23521,8 +24214,8 @@
         <w:t xml:space="preserve">11.</w:t>
       </w:r>
     </w:p>
-    <w:bookmarkEnd w:id="116"/>
-    <w:bookmarkStart w:id="117" w:name="ref-dfo2022"/>
+    <w:bookmarkEnd w:id="117"/>
+    <w:bookmarkStart w:id="118" w:name="ref-dfo2022"/>
     <w:p>
       <w:pPr>
         <w:pStyle w:val="Bibliography"/>
@@ -23624,8 +24317,8 @@
         <w:t xml:space="preserve">.</w:t>
       </w:r>
     </w:p>
-    <w:bookmarkEnd w:id="117"/>
-    <w:bookmarkStart w:id="118" w:name="ref-dionne2023"/>
+    <w:bookmarkEnd w:id="118"/>
+    <w:bookmarkStart w:id="119" w:name="ref-dionne2023"/>
     <w:p>
       <w:pPr>
         <w:pStyle w:val="Bibliography"/>
@@ -23658,8 +24351,8 @@
         <w:t xml:space="preserve">and southern mainland chinook designatable units (1, 6, 13 and 15). Canadian Science Advisory Secretariat (CSAS), Ottawa ON.</w:t>
       </w:r>
     </w:p>
-    <w:bookmarkEnd w:id="118"/>
-    <w:bookmarkStart w:id="119" w:name="ref-doutaz2023"/>
+    <w:bookmarkEnd w:id="119"/>
+    <w:bookmarkStart w:id="120" w:name="ref-doutaz2023"/>
     <w:p>
       <w:pPr>
         <w:pStyle w:val="Bibliography"/>
@@ -23668,8 +24361,8 @@
         <w:t xml:space="preserve">Doutaz, D., Huang, A., Decker, S., and Vivian, T. 2023. Recovery potential assessment for fraser river sockeye salmon (oncorhynchus nerka), nine designatable units part 2: Biology, habitat, threats, mitigations and allowable harm - elements 1-11, 14, 16-18, 22.</w:t>
       </w:r>
     </w:p>
-    <w:bookmarkEnd w:id="119"/>
-    <w:bookmarkStart w:id="120" w:name="ref-grant2019"/>
+    <w:bookmarkEnd w:id="120"/>
+    <w:bookmarkStart w:id="121" w:name="ref-grant2019"/>
     <w:p>
       <w:pPr>
         <w:pStyle w:val="Bibliography"/>
@@ -23678,8 +24371,8 @@
         <w:t xml:space="preserve">Grant, S.C.H., MacDonald, B.L., and Winston, M.L. 2019. State of canadian pacific salmon: Responses to changing climate and habitats.</w:t>
       </w:r>
     </w:p>
-    <w:bookmarkEnd w:id="120"/>
-    <w:bookmarkStart w:id="122" w:name="ref-kraus2021"/>
+    <w:bookmarkEnd w:id="121"/>
+    <w:bookmarkStart w:id="123" w:name="ref-kraus2021"/>
     <w:p>
       <w:pPr>
         <w:pStyle w:val="Bibliography"/>
@@ -23709,7 +24402,7 @@
       <w:r>
         <w:t xml:space="preserve">: 1088–1127. doi:</w:t>
       </w:r>
-      <w:hyperlink r:id="rId121">
+      <w:hyperlink r:id="rId122">
         <w:r>
           <w:rPr>
             <w:rStyle w:val="Hyperlink"/>
@@ -23721,8 +24414,8 @@
         <w:t xml:space="preserve">.</w:t>
       </w:r>
     </w:p>
-    <w:bookmarkEnd w:id="122"/>
-    <w:bookmarkStart w:id="123" w:name="ref-marentette2020"/>
+    <w:bookmarkEnd w:id="123"/>
+    <w:bookmarkStart w:id="124" w:name="ref-marentette2020"/>
     <w:p>
       <w:pPr>
         <w:pStyle w:val="Bibliography"/>
@@ -23764,8 +24457,8 @@
         <w:t xml:space="preserve">, Ottawa, ON.</w:t>
       </w:r>
     </w:p>
-    <w:bookmarkEnd w:id="123"/>
-    <w:bookmarkStart w:id="125" w:name="ref-mccune2013"/>
+    <w:bookmarkEnd w:id="124"/>
+    <w:bookmarkStart w:id="126" w:name="ref-mccune2013"/>
     <w:p>
       <w:pPr>
         <w:pStyle w:val="Bibliography"/>
@@ -23810,7 +24503,7 @@
       <w:r>
         <w:t xml:space="preserve">: 254–265. doi:</w:t>
       </w:r>
-      <w:hyperlink r:id="rId124">
+      <w:hyperlink r:id="rId125">
         <w:r>
           <w:rPr>
             <w:rStyle w:val="Hyperlink"/>
@@ -23822,8 +24515,8 @@
         <w:t xml:space="preserve">.</w:t>
       </w:r>
     </w:p>
-    <w:bookmarkEnd w:id="125"/>
-    <w:bookmarkStart w:id="127" w:name="ref-moore2025"/>
+    <w:bookmarkEnd w:id="126"/>
+    <w:bookmarkStart w:id="128" w:name="ref-moore2025"/>
     <w:p>
       <w:pPr>
         <w:pStyle w:val="Bibliography"/>
@@ -23831,7 +24524,7 @@
       <w:r>
         <w:t xml:space="preserve">Moore, J.W., Ulaski, M.E., Wilson, K.L., Martin, T.G., Kuiper, S.D., Peacock, S.J., Braun, D.C., Naman, S.M., Pitman, K.J., Reid, A.J., Rosenfeld, J.S., Sainsbury, N.C., Wilson, S.M., and Zdasiuk, B.J. 2025. A Safe Operating Space for Salmon Watersheds Under Rapid Climate Change. Fish and Fisheries: faf.70027. doi:</w:t>
       </w:r>
-      <w:hyperlink r:id="rId126">
+      <w:hyperlink r:id="rId127">
         <w:r>
           <w:rPr>
             <w:rStyle w:val="Hyperlink"/>
@@ -23843,8 +24536,8 @@
         <w:t xml:space="preserve">.</w:t>
       </w:r>
     </w:p>
-    <w:bookmarkEnd w:id="127"/>
-    <w:bookmarkStart w:id="129" w:name="ref-price2017"/>
+    <w:bookmarkEnd w:id="128"/>
+    <w:bookmarkStart w:id="130" w:name="ref-price2017"/>
     <w:p>
       <w:pPr>
         <w:pStyle w:val="Bibliography"/>
@@ -23895,7 +24588,7 @@
       <w:r>
         <w:t xml:space="preserve">(10): 1507–1518. doi:</w:t>
       </w:r>
-      <w:hyperlink r:id="rId128">
+      <w:hyperlink r:id="rId129">
         <w:r>
           <w:rPr>
             <w:rStyle w:val="Hyperlink"/>
@@ -23907,8 +24600,8 @@
         <w:t xml:space="preserve">.</w:t>
       </w:r>
     </w:p>
-    <w:bookmarkEnd w:id="129"/>
-    <w:bookmarkStart w:id="131" w:name="ref-ray2021"/>
+    <w:bookmarkEnd w:id="130"/>
+    <w:bookmarkStart w:id="132" w:name="ref-ray2021"/>
     <w:p>
       <w:pPr>
         <w:pStyle w:val="Bibliography"/>
@@ -23950,7 +24643,7 @@
       <w:r>
         <w:t xml:space="preserve">: 1044–1068. doi:</w:t>
       </w:r>
-      <w:hyperlink r:id="rId130">
+      <w:hyperlink r:id="rId131">
         <w:r>
           <w:rPr>
             <w:rStyle w:val="Hyperlink"/>
@@ -23962,8 +24655,8 @@
         <w:t xml:space="preserve">.</w:t>
       </w:r>
     </w:p>
-    <w:bookmarkEnd w:id="131"/>
-    <w:bookmarkStart w:id="133" w:name="ref-salafsky2025"/>
+    <w:bookmarkEnd w:id="132"/>
+    <w:bookmarkStart w:id="134" w:name="ref-salafsky2025"/>
     <w:p>
       <w:pPr>
         <w:pStyle w:val="Bibliography"/>
@@ -23984,7 +24677,7 @@
       <w:r>
         <w:t xml:space="preserve">(3): e14434. doi:</w:t>
       </w:r>
-      <w:hyperlink r:id="rId132">
+      <w:hyperlink r:id="rId133">
         <w:r>
           <w:rPr>
             <w:rStyle w:val="Hyperlink"/>
@@ -23996,8 +24689,8 @@
         <w:t xml:space="preserve">.</w:t>
       </w:r>
     </w:p>
-    <w:bookmarkEnd w:id="133"/>
-    <w:bookmarkStart w:id="135" w:name="ref-salafsky2008"/>
+    <w:bookmarkEnd w:id="134"/>
+    <w:bookmarkStart w:id="136" w:name="ref-salafsky2008"/>
     <w:p>
       <w:pPr>
         <w:pStyle w:val="Bibliography"/>
@@ -24072,7 +24765,7 @@
       <w:r>
         <w:t xml:space="preserve">(4): 897–911. doi:</w:t>
       </w:r>
-      <w:hyperlink r:id="rId134">
+      <w:hyperlink r:id="rId135">
         <w:r>
           <w:rPr>
             <w:rStyle w:val="Hyperlink"/>
@@ -24084,8 +24777,8 @@
         <w:t xml:space="preserve">.</w:t>
       </w:r>
     </w:p>
-    <w:bookmarkEnd w:id="135"/>
-    <w:bookmarkStart w:id="137" w:name="ref-swerdfager2023"/>
+    <w:bookmarkEnd w:id="136"/>
+    <w:bookmarkStart w:id="138" w:name="ref-swerdfager2023"/>
     <w:p>
       <w:pPr>
         <w:pStyle w:val="Bibliography"/>
@@ -24115,7 +24808,7 @@
       <w:r>
         <w:t xml:space="preserve">: 1–13. doi:</w:t>
       </w:r>
-      <w:hyperlink r:id="rId136">
+      <w:hyperlink r:id="rId137">
         <w:r>
           <w:rPr>
             <w:rStyle w:val="Hyperlink"/>
@@ -24127,8 +24820,8 @@
         <w:t xml:space="preserve">.</w:t>
       </w:r>
     </w:p>
-    <w:bookmarkEnd w:id="137"/>
-    <w:bookmarkStart w:id="138" w:name="ref-thompson1974"/>
+    <w:bookmarkEnd w:id="138"/>
+    <w:bookmarkStart w:id="139" w:name="ref-thompson1974"/>
     <w:p>
       <w:pPr>
         <w:pStyle w:val="Bibliography"/>
@@ -24158,8 +24851,8 @@
         <w:t xml:space="preserve">.</w:t>
       </w:r>
     </w:p>
-    <w:bookmarkEnd w:id="138"/>
-    <w:bookmarkStart w:id="140" w:name="ref-turcotte2021"/>
+    <w:bookmarkEnd w:id="139"/>
+    <w:bookmarkStart w:id="141" w:name="ref-turcotte2021"/>
     <w:p>
       <w:pPr>
         <w:pStyle w:val="Bibliography"/>
@@ -24242,7 +24935,7 @@
       <w:r>
         <w:t xml:space="preserve">: 1474–1494. doi:</w:t>
       </w:r>
-      <w:hyperlink r:id="rId139">
+      <w:hyperlink r:id="rId140">
         <w:r>
           <w:rPr>
             <w:rStyle w:val="Hyperlink"/>
@@ -24254,8 +24947,8 @@
         <w:t xml:space="preserve">.</w:t>
       </w:r>
     </w:p>
-    <w:bookmarkEnd w:id="140"/>
-    <w:bookmarkStart w:id="142" w:name="ref-ulaski2025"/>
+    <w:bookmarkEnd w:id="141"/>
+    <w:bookmarkStart w:id="143" w:name="ref-ulaski2025"/>
     <w:p>
       <w:pPr>
         <w:pStyle w:val="Bibliography"/>
@@ -24294,7 +24987,7 @@
       <w:r>
         <w:t xml:space="preserve">: 1–25. doi:</w:t>
       </w:r>
-      <w:hyperlink r:id="rId141">
+      <w:hyperlink r:id="rId142">
         <w:r>
           <w:rPr>
             <w:rStyle w:val="Hyperlink"/>
@@ -24306,10 +24999,10 @@
         <w:t xml:space="preserve">.</w:t>
       </w:r>
     </w:p>
-    <w:bookmarkEnd w:id="142"/>
     <w:bookmarkEnd w:id="143"/>
     <w:bookmarkEnd w:id="144"/>
-    <w:bookmarkStart w:id="145" w:name="supplementary-material"/>
+    <w:bookmarkEnd w:id="145"/>
+    <w:bookmarkStart w:id="146" w:name="supplementary-material"/>
     <w:p>
       <w:pPr>
         <w:pStyle w:val="Heading1"/>
@@ -24323,7 +25016,7 @@
         <w:pStyle w:val="Compact"/>
         <w:numPr>
           <w:ilvl w:val="0"/>
-          <w:numId w:val="1005"/>
+          <w:numId w:val="1020"/>
         </w:numPr>
       </w:pPr>
       <w:r>
@@ -24334,7 +25027,7 @@
         <w:t xml:space="preserve">Links or downloads for the LAPSE tool materials (app etc.)</w:t>
       </w:r>
     </w:p>
-    <w:bookmarkEnd w:id="145"/>
+    <w:bookmarkEnd w:id="146"/>
     <w:sectPr>
       <w:headerReference r:id="rId10" w:type="even"/>
       <w:headerReference r:id="rId9" w:type="default"/>
@@ -25010,6 +25703,51 @@
     <w:abstractNumId w:val="991"/>
   </w:num>
   <w:num w:numId="1005">
+    <w:abstractNumId w:val="991"/>
+  </w:num>
+  <w:num w:numId="1006">
+    <w:abstractNumId w:val="991"/>
+  </w:num>
+  <w:num w:numId="1007">
+    <w:abstractNumId w:val="991"/>
+  </w:num>
+  <w:num w:numId="1008">
+    <w:abstractNumId w:val="991"/>
+  </w:num>
+  <w:num w:numId="1009">
+    <w:abstractNumId w:val="991"/>
+  </w:num>
+  <w:num w:numId="1010">
+    <w:abstractNumId w:val="991"/>
+  </w:num>
+  <w:num w:numId="1011">
+    <w:abstractNumId w:val="991"/>
+  </w:num>
+  <w:num w:numId="1012">
+    <w:abstractNumId w:val="991"/>
+  </w:num>
+  <w:num w:numId="1013">
+    <w:abstractNumId w:val="991"/>
+  </w:num>
+  <w:num w:numId="1014">
+    <w:abstractNumId w:val="991"/>
+  </w:num>
+  <w:num w:numId="1015">
+    <w:abstractNumId w:val="991"/>
+  </w:num>
+  <w:num w:numId="1016">
+    <w:abstractNumId w:val="991"/>
+  </w:num>
+  <w:num w:numId="1017">
+    <w:abstractNumId w:val="991"/>
+  </w:num>
+  <w:num w:numId="1018">
+    <w:abstractNumId w:val="991"/>
+  </w:num>
+  <w:num w:numId="1019">
+    <w:abstractNumId w:val="991"/>
+  </w:num>
+  <w:num w:numId="1020">
     <w:abstractNumId w:val="991"/>
   </w:num>
 </w:numbering>

</xml_diff>

<commit_message>
Added Marina's edits and comments
</commit_message>
<xml_diff>
--- a/reports/LAPSE_primary_publication.docx
+++ b/reports/LAPSE_primary_publication.docx
@@ -123,7 +123,31 @@
         <w:t xml:space="preserve"> </w:t>
       </w:r>
       <w:r>
-        <w:t xml:space="preserve">Lagasse</w:t>
+        <w:t xml:space="preserve">Lagasse,</w:t>
+      </w:r>
+      <w:r>
+        <w:t xml:space="preserve"> </w:t>
+      </w:r>
+      <w:r>
+        <w:t xml:space="preserve">Daniel</w:t>
+      </w:r>
+      <w:r>
+        <w:t xml:space="preserve"> </w:t>
+      </w:r>
+      <w:r>
+        <w:t xml:space="preserve">Gillis,</w:t>
+      </w:r>
+      <w:r>
+        <w:t xml:space="preserve"> </w:t>
+      </w:r>
+      <w:r>
+        <w:t xml:space="preserve">Marina</w:t>
+      </w:r>
+      <w:r>
+        <w:t xml:space="preserve"> </w:t>
+      </w:r>
+      <w:r>
+        <w:t xml:space="preserve">Wright</w:t>
       </w:r>
     </w:p>
     <w:p>
@@ -609,7 +633,7 @@
         <w:t xml:space="preserve">Forestry Act</w:t>
       </w:r>
       <w:r>
-        <w:t xml:space="preserve">, water licensing under the Water Sustainability Act, environmental assessment of a mine under the Environmental Assessment Act, enforcement of activities that cause harm to salmon habitat under the</w:t>
+        <w:t xml:space="preserve">, water licensing under the Water Sustainability Act, environmental assessment of a mine under the Environmental Assessment Act, regulation of activities that cause harm to salmon habitat under the</w:t>
       </w:r>
       <w:r>
         <w:t xml:space="preserve"> </w:t>
@@ -626,132 +650,6 @@
       </w:r>
       <w:r>
         <w:t xml:space="preserve">….</w:t>
-      </w:r>
-    </w:p>
-    <w:p>
-      <w:pPr>
-        <w:pStyle w:val="BodyText"/>
-      </w:pPr>
-      <w:r>
-        <w:t xml:space="preserve">Amidst this uncertainty and complexity, multiple assessment frameworks have been developed to evaluate risks arising from anthropogenic activities and limiting factors for the survival and recovery of Pacific salmon populations [</w:t>
-      </w:r>
-      <w:r>
-        <w:t xml:space="preserve">Chalifour et al. (2022)</w:t>
-      </w:r>
-      <w:r>
-        <w:t xml:space="preserve">;</w:t>
-      </w:r>
-      <w:r>
-        <w:t xml:space="preserve"> </w:t>
-      </w:r>
-      <w:r>
-        <w:t xml:space="preserve">Salafsky et al. (2008)</w:t>
-      </w:r>
-      <w:r>
-        <w:t xml:space="preserve">;</w:t>
-      </w:r>
-      <w:r>
-        <w:t xml:space="preserve"> </w:t>
-      </w:r>
-      <w:r>
-        <w:rPr>
-          <w:b/>
-          <w:bCs/>
-        </w:rPr>
-        <w:t xml:space="preserve">RAMS citation?</w:t>
-      </w:r>
-      <w:r>
-        <w:t xml:space="preserve">]. While varied in their approaches, these frameworks generally aim to be comprehensive in assessing the wide range of threats that may impact Pacific salmon across their life cycle to inform status assessments, recovery planning, and conservation strategies. One of the most widely used risk assessment frameworks for Pacific salmon is the</w:t>
-      </w:r>
-      <w:r>
-        <w:t xml:space="preserve"> </w:t>
-      </w:r>
-      <w:r>
-        <w:rPr>
-          <w:i/>
-          <w:iCs/>
-        </w:rPr>
-        <w:t xml:space="preserve">International Union for Conservation of Nature</w:t>
-      </w:r>
-      <w:r>
-        <w:t xml:space="preserve"> </w:t>
-      </w:r>
-      <w:r>
-        <w:t xml:space="preserve">(IUCN) Direct Threats Classification</w:t>
-      </w:r>
-      <w:r>
-        <w:t xml:space="preserve"> </w:t>
-      </w:r>
-      <w:r>
-        <w:t xml:space="preserve">(Salafsky et al. 2008)</w:t>
-      </w:r>
-      <w:r>
-        <w:t xml:space="preserve">, which is applied for Recovery Potential Assessments as part of</w:t>
-      </w:r>
-      <w:r>
-        <w:t xml:space="preserve"> </w:t>
-      </w:r>
-      <w:r>
-        <w:rPr>
-          <w:i/>
-          <w:iCs/>
-        </w:rPr>
-        <w:t xml:space="preserve">Species at Risk Act</w:t>
-      </w:r>
-      <w:r>
-        <w:t xml:space="preserve"> </w:t>
-      </w:r>
-      <w:r>
-        <w:t xml:space="preserve">listing processes and for COSEWIC status assessments</w:t>
-      </w:r>
-      <w:r>
-        <w:t xml:space="preserve"> </w:t>
-      </w:r>
-      <w:r>
-        <w:t xml:space="preserve">(Arbeider et al. 2020; Dionne 2023; Doutaz et al. 2023)</w:t>
-      </w:r>
-      <w:r>
-        <w:t xml:space="preserve">.</w:t>
-      </w:r>
-    </w:p>
-    <w:p>
-      <w:pPr>
-        <w:pStyle w:val="BodyText"/>
-      </w:pPr>
-      <w:r>
-        <w:t xml:space="preserve">Assuming there is agreement upon the most important threats, risk assessments are intended to guide the development of recovery plans and mitigation actions with the ultimate aim of reversing declines and improving conservation status. A key challenge is identifying actions that are impactful and feasible across the wide geographic range and diverse life history of Pacific salmon. In many cases, regulatory complexity, ambiguous responsibility, and dispersed authority become barriers to effective and timely action.</w:t>
-      </w:r>
-    </w:p>
-    <w:bookmarkEnd w:id="29"/>
-    <w:bookmarkStart w:id="31" w:name="Xf99c42c3166c79d6e14b14d7da12046c07a47b6"/>
-    <w:p>
-      <w:pPr>
-        <w:pStyle w:val="Heading2"/>
-      </w:pPr>
-      <w:r>
-        <w:t xml:space="preserve">Why study salmon legislation: purpose and objectives</w:t>
-      </w:r>
-    </w:p>
-    <w:p>
-      <w:pPr>
-        <w:pStyle w:val="FirstParagraph"/>
-      </w:pPr>
-      <w:r>
-        <w:t xml:space="preserve">The need for collaborative, coordinated action to address Pacific salmon declines is recognized by governments throughout policies, plans, and initiatives (e.g. the WSP,</w:t>
-      </w:r>
-      <w:r>
-        <w:t xml:space="preserve"> </w:t>
-      </w:r>
-      <w:hyperlink r:id="rId30">
-        <w:r>
-          <w:rPr>
-            <w:rStyle w:val="Hyperlink"/>
-          </w:rPr>
-          <w:t xml:space="preserve">the trilateral accord 2024</w:t>
-        </w:r>
-      </w:hyperlink>
-      <w:r>
-        <w:t xml:space="preserve">). Coordinated action requires adequate organizational capacity and systems for implementation to ensure that regulatory controls and mitigation activities address underlying threats to salmon and their habitat. However, linking threats and recovery actions to the relevant regulatory systems can be complex because salmon are often affected by multiple threats that each span across agencies and governmental jurisdiction.</w:t>
       </w:r>
     </w:p>
     <w:p>
@@ -767,6 +665,267 @@
           <w:b/>
           <w:bCs/>
         </w:rPr>
+        <w:t xml:space="preserve">MW - Minor suggestions. The FFHPP regulates</w:t>
+      </w:r>
+      <w:r>
+        <w:rPr>
+          <w:b/>
+          <w:bCs/>
+        </w:rPr>
+        <w:t xml:space="preserve"> </w:t>
+      </w:r>
+      <w:r>
+        <w:rPr>
+          <w:b/>
+          <w:bCs/>
+        </w:rPr>
+        <w:t xml:space="preserve">“</w:t>
+      </w:r>
+      <w:r>
+        <w:rPr>
+          <w:b/>
+          <w:bCs/>
+        </w:rPr>
+        <w:t xml:space="preserve">Projects Near Water</w:t>
+      </w:r>
+      <w:r>
+        <w:rPr>
+          <w:b/>
+          <w:bCs/>
+        </w:rPr>
+        <w:t xml:space="preserve">”</w:t>
+      </w:r>
+      <w:r>
+        <w:rPr>
+          <w:b/>
+          <w:bCs/>
+        </w:rPr>
+        <w:t xml:space="preserve"> </w:t>
+      </w:r>
+      <w:r>
+        <w:rPr>
+          <w:b/>
+          <w:bCs/>
+        </w:rPr>
+        <w:t xml:space="preserve">based on the prohibition against causing Harmful Alteration, Disruption or Destruction of fish habitat or Death of Fish. Fisheries Officers may work with FFHPP biologist in enforcement when someone contravenes the Fisheries Act. As you know, also under the fisheries Act, is the prohibition on deleterious substances regulated by Environment Canada.</w:t>
+      </w:r>
+    </w:p>
+    <w:p>
+      <w:pPr>
+        <w:pStyle w:val="FirstParagraph"/>
+      </w:pPr>
+      <w:r>
+        <w:t xml:space="preserve">Amidst this uncertainty and complexity, multiple assessment frameworks have been developed to evaluate risks arising from anthropogenic activities and limiting factors for the survival and recovery of Pacific salmon populations [</w:t>
+      </w:r>
+      <w:r>
+        <w:t xml:space="preserve">Chalifour et al. (2022)</w:t>
+      </w:r>
+      <w:r>
+        <w:t xml:space="preserve">;</w:t>
+      </w:r>
+      <w:r>
+        <w:t xml:space="preserve"> </w:t>
+      </w:r>
+      <w:r>
+        <w:t xml:space="preserve">Salafsky et al. (2008)</w:t>
+      </w:r>
+      <w:r>
+        <w:t xml:space="preserve">;</w:t>
+      </w:r>
+      <w:r>
+        <w:t xml:space="preserve"> </w:t>
+      </w:r>
+      <w:r>
+        <w:rPr>
+          <w:b/>
+          <w:bCs/>
+        </w:rPr>
+        <w:t xml:space="preserve">RAMS citation?</w:t>
+      </w:r>
+      <w:r>
+        <w:t xml:space="preserve">]. While varied in their approaches, these frameworks generally aim to be comprehensive in assessing the wide range of threats that may impact Pacific salmon across their life cycle to inform status assessments, recovery planning, and conservation strategies. One of the most widely used risk assessment frameworks for Pacific salmon is the</w:t>
+      </w:r>
+      <w:r>
+        <w:t xml:space="preserve"> </w:t>
+      </w:r>
+      <w:r>
+        <w:rPr>
+          <w:i/>
+          <w:iCs/>
+        </w:rPr>
+        <w:t xml:space="preserve">International Union for Conservation of Nature</w:t>
+      </w:r>
+      <w:r>
+        <w:t xml:space="preserve"> </w:t>
+      </w:r>
+      <w:r>
+        <w:t xml:space="preserve">(IUCN) Direct Threats Classification</w:t>
+      </w:r>
+      <w:r>
+        <w:t xml:space="preserve"> </w:t>
+      </w:r>
+      <w:r>
+        <w:t xml:space="preserve">(Salafsky et al. 2008)</w:t>
+      </w:r>
+      <w:r>
+        <w:t xml:space="preserve">, which is applied for Recovery Potential Assessments as part of</w:t>
+      </w:r>
+      <w:r>
+        <w:t xml:space="preserve"> </w:t>
+      </w:r>
+      <w:r>
+        <w:rPr>
+          <w:i/>
+          <w:iCs/>
+        </w:rPr>
+        <w:t xml:space="preserve">Species at Risk Act</w:t>
+      </w:r>
+      <w:r>
+        <w:t xml:space="preserve"> </w:t>
+      </w:r>
+      <w:r>
+        <w:t xml:space="preserve">listing processes and for COSEWIC status assessments</w:t>
+      </w:r>
+      <w:r>
+        <w:t xml:space="preserve"> </w:t>
+      </w:r>
+      <w:r>
+        <w:t xml:space="preserve">(Arbeider et al. 2020; Dionne 2023; Doutaz et al. 2023)</w:t>
+      </w:r>
+      <w:r>
+        <w:t xml:space="preserve">.</w:t>
+      </w:r>
+    </w:p>
+    <w:p>
+      <w:pPr>
+        <w:pStyle w:val="BodyText"/>
+      </w:pPr>
+      <w:r>
+        <w:t xml:space="preserve">Assuming there is agreement upon the most important threats, risk assessments are intended to guide the development of recovery plans and mitigation actions with the ultimate aim of reversing declines and improving conservation status. A key challenge is identifying actions that are</w:t>
+      </w:r>
+      <w:r>
+        <w:t xml:space="preserve"> </w:t>
+      </w:r>
+      <w:r>
+        <w:rPr>
+          <w:b/>
+          <w:bCs/>
+        </w:rPr>
+        <w:t xml:space="preserve">impactful</w:t>
+      </w:r>
+      <w:r>
+        <w:t xml:space="preserve"> </w:t>
+      </w:r>
+      <w:r>
+        <w:rPr>
+          <w:b/>
+          <w:bCs/>
+        </w:rPr>
+        <w:t xml:space="preserve">(**is that a word?)</w:t>
+      </w:r>
+      <w:r>
+        <w:t xml:space="preserve"> </w:t>
+      </w:r>
+      <w:r>
+        <w:t xml:space="preserve">and feasible across the wide geographic range and diverse life history of Pacific salmon. In many cases, regulatory complexity, ambiguous responsibility, unclear conservation objectives across jurisdictions and dispersed authority become barriers to effective and timely action.</w:t>
+      </w:r>
+    </w:p>
+    <w:p>
+      <w:pPr>
+        <w:pStyle w:val="Compact"/>
+        <w:numPr>
+          <w:ilvl w:val="0"/>
+          <w:numId w:val="1003"/>
+        </w:numPr>
+      </w:pPr>
+      <w:r>
+        <w:rPr>
+          <w:b/>
+          <w:bCs/>
+        </w:rPr>
+        <w:t xml:space="preserve">MW - Option of adding</w:t>
+      </w:r>
+      <w:r>
+        <w:rPr>
+          <w:b/>
+          <w:bCs/>
+        </w:rPr>
+        <w:t xml:space="preserve"> </w:t>
+      </w:r>
+      <w:r>
+        <w:rPr>
+          <w:b/>
+          <w:bCs/>
+        </w:rPr>
+        <w:t xml:space="preserve">“</w:t>
+      </w:r>
+      <w:r>
+        <w:rPr>
+          <w:b/>
+          <w:bCs/>
+        </w:rPr>
+        <w:t xml:space="preserve">unclear standards of management</w:t>
+      </w:r>
+      <w:r>
+        <w:rPr>
+          <w:b/>
+          <w:bCs/>
+        </w:rPr>
+        <w:t xml:space="preserve">”</w:t>
+      </w:r>
+      <w:r>
+        <w:rPr>
+          <w:b/>
+          <w:bCs/>
+        </w:rPr>
+        <w:t xml:space="preserve">, or similar, to the list? Unclear environmental or conservation objectives across jurisdictions maybe.</w:t>
+      </w:r>
+    </w:p>
+    <w:bookmarkEnd w:id="29"/>
+    <w:bookmarkStart w:id="31" w:name="Xf99c42c3166c79d6e14b14d7da12046c07a47b6"/>
+    <w:p>
+      <w:pPr>
+        <w:pStyle w:val="Heading2"/>
+      </w:pPr>
+      <w:r>
+        <w:t xml:space="preserve">Why study salmon legislation: purpose and objectives</w:t>
+      </w:r>
+    </w:p>
+    <w:p>
+      <w:pPr>
+        <w:pStyle w:val="FirstParagraph"/>
+      </w:pPr>
+      <w:r>
+        <w:t xml:space="preserve">The need for collaborative, coordinated action to address Pacific salmon declines is recognized by governments throughout policies, plans, and initiatives (e.g. the WSP,</w:t>
+      </w:r>
+      <w:r>
+        <w:t xml:space="preserve"> </w:t>
+      </w:r>
+      <w:hyperlink r:id="rId30">
+        <w:r>
+          <w:rPr>
+            <w:rStyle w:val="Hyperlink"/>
+          </w:rPr>
+          <w:t xml:space="preserve">the trilateral accord 2024</w:t>
+        </w:r>
+      </w:hyperlink>
+      <w:r>
+        <w:t xml:space="preserve">). Coordinated action requires adequate organizational capacity and systems for implementation to ensure that regulatory controls and mitigation activities address underlying threats to salmon and their habitat. However, linking threats and recovery actions to the relevant regulatory systems can be complex because salmon are often affected by multiple threats that each span across agencies and governmental jurisdiction.</w:t>
+      </w:r>
+    </w:p>
+    <w:p>
+      <w:pPr>
+        <w:pStyle w:val="Compact"/>
+        <w:numPr>
+          <w:ilvl w:val="0"/>
+          <w:numId w:val="1004"/>
+        </w:numPr>
+      </w:pPr>
+      <w:r>
+        <w:rPr>
+          <w:b/>
+          <w:bCs/>
+        </w:rPr>
         <w:t xml:space="preserve">Add examples of rebuilding plans, OK Chinook, WCVI Chinook, Fish stock provision rebuilding plans (DG)</w:t>
       </w:r>
     </w:p>
@@ -906,7 +1065,7 @@
         <w:pStyle w:val="Compact"/>
         <w:numPr>
           <w:ilvl w:val="0"/>
-          <w:numId w:val="1003"/>
+          <w:numId w:val="1005"/>
         </w:numPr>
       </w:pPr>
       <w:r>
@@ -1108,7 +1267,23 @@
     </w:p>
     <w:p>
       <w:pPr>
-        <w:pStyle w:val="BodyText"/>
+        <w:pStyle w:val="Compact"/>
+        <w:numPr>
+          <w:ilvl w:val="0"/>
+          <w:numId w:val="1006"/>
+        </w:numPr>
+      </w:pPr>
+      <w:r>
+        <w:rPr>
+          <w:b/>
+          <w:bCs/>
+        </w:rPr>
+        <w:t xml:space="preserve">MW - That’s true, although many sections of the Water Sustainability Act aren’t built out and utilized.</w:t>
+      </w:r>
+    </w:p>
+    <w:p>
+      <w:pPr>
+        <w:pStyle w:val="FirstParagraph"/>
       </w:pPr>
       <w:r>
         <w:t xml:space="preserve">Indigenous legislation, Yukon Territorial legislation, municipal bylaws, and international conventions were also not included explicitly. Although this other legislation is pivotal in the management of Pacific salmon, this regionally diverse administration was outside the scope of this legislative review in terms of feasibility and timelines.</w:t>
@@ -1152,7 +1327,7 @@
         <w:pStyle w:val="Compact"/>
         <w:numPr>
           <w:ilvl w:val="0"/>
-          <w:numId w:val="1004"/>
+          <w:numId w:val="1007"/>
         </w:numPr>
       </w:pPr>
       <w:r>
@@ -2737,7 +2912,7 @@
         <w:pStyle w:val="Compact"/>
         <w:numPr>
           <w:ilvl w:val="0"/>
-          <w:numId w:val="1005"/>
+          <w:numId w:val="1008"/>
         </w:numPr>
       </w:pPr>
       <w:r>
@@ -2746,6 +2921,22 @@
           <w:bCs/>
         </w:rPr>
         <w:t xml:space="preserve">DG - Also needs a citation. Note to be consistent in the introduction of R package names. udpipe doesn’t have quotation marks, this one does. The formatting depends on the citation style, so it can be changed later, but a consistent starting point would be good.</w:t>
+      </w:r>
+    </w:p>
+    <w:p>
+      <w:pPr>
+        <w:pStyle w:val="Compact"/>
+        <w:numPr>
+          <w:ilvl w:val="0"/>
+          <w:numId w:val="1008"/>
+        </w:numPr>
+      </w:pPr>
+      <w:r>
+        <w:rPr>
+          <w:b/>
+          <w:bCs/>
+        </w:rPr>
+        <w:t xml:space="preserve">MW - Define the statute being the Fisheries Act into the figure or title? For some reason, the term statute is confusing me. I had to look up the definition to check if it included regulations or not. I wonder if it should be defined for readability earlier in the report or if people should just know this term.</w:t>
       </w:r>
     </w:p>
     <w:bookmarkEnd w:id="45"/>
@@ -2938,7 +3129,7 @@
       <w:pPr>
         <w:numPr>
           <w:ilvl w:val="0"/>
-          <w:numId w:val="1006"/>
+          <w:numId w:val="1009"/>
         </w:numPr>
       </w:pPr>
       <w:r>
@@ -2953,7 +3144,7 @@
       <w:pPr>
         <w:numPr>
           <w:ilvl w:val="0"/>
-          <w:numId w:val="1006"/>
+          <w:numId w:val="1009"/>
         </w:numPr>
       </w:pPr>
       <w:r>
@@ -3089,7 +3280,7 @@
         <w:pStyle w:val="Compact"/>
         <w:numPr>
           <w:ilvl w:val="0"/>
-          <w:numId w:val="1007"/>
+          <w:numId w:val="1010"/>
         </w:numPr>
       </w:pPr>
       <w:r>
@@ -6968,7 +7159,39 @@
         <w:t xml:space="preserve">5</w:t>
       </w:r>
       <w:r>
-        <w:t xml:space="preserve">), split almost evenly between federal and provincial jurisdictions. Human Disturbance (research activities) and Climate Change and Natural Disasters had the fewest section count. Fisheries was in the top three for section count, with a majority of sections under federal jurisdiction. Water Use and Watercourse Modifications was in the top four for section count, with a majority of sections under provincial jurisdiction. This count indicates an underlying possibly dysfunctional relationship where salmon harvest is controlled federally while habitat aspects are governed provincially.</w:t>
+        <w:t xml:space="preserve">), split almost evenly between federal and provincial jurisdictions. Human Disturbance (research</w:t>
+      </w:r>
+      <w:r>
+        <w:t xml:space="preserve"> </w:t>
+      </w:r>
+      <w:r>
+        <w:rPr>
+          <w:b/>
+          <w:bCs/>
+        </w:rPr>
+        <w:t xml:space="preserve">**scientific?</w:t>
+      </w:r>
+      <w:r>
+        <w:t xml:space="preserve"> </w:t>
+      </w:r>
+      <w:r>
+        <w:t xml:space="preserve">activities) and Climate Change and Natural Disasters had the fewest section count. Fisheries was in the top three for section count, with a majority of sections under federal jurisdiction. Water Use and Watercourse Modifications was in the top four for section count, with a majority of sections under provincial jurisdiction. This count indicates an underlying possibly dysfunctional relationship where salmon harvest is controlled federally while habitat aspects are governed provincially.</w:t>
+      </w:r>
+    </w:p>
+    <w:p>
+      <w:pPr>
+        <w:pStyle w:val="Compact"/>
+        <w:numPr>
+          <w:ilvl w:val="0"/>
+          <w:numId w:val="1011"/>
+        </w:numPr>
+      </w:pPr>
+      <w:r>
+        <w:rPr>
+          <w:b/>
+          <w:bCs/>
+        </w:rPr>
+        <w:t xml:space="preserve">MW - The Management Domain of Human Disturbance is just research activities? This seems less intuitive for me than the other management domains since human disturbance could refer to most of them.</w:t>
       </w:r>
     </w:p>
     <w:p>
@@ -7344,7 +7567,7 @@
         <w:pStyle w:val="Compact"/>
         <w:numPr>
           <w:ilvl w:val="0"/>
-          <w:numId w:val="1008"/>
+          <w:numId w:val="1012"/>
         </w:numPr>
       </w:pPr>
       <w:r>
@@ -8971,14 +9194,6 @@
         <w:t xml:space="preserve">, coloured by jurisdiction.</w:t>
       </w:r>
     </w:p>
-    <w:p>
-      <w:pPr>
-        <w:pStyle w:val="BodyText"/>
-      </w:pPr>
-      <w:r>
-        <w:br/>
-      </w:r>
-    </w:p>
     <w:bookmarkEnd w:id="68"/>
     <w:bookmarkEnd w:id="69"/>
     <w:bookmarkStart w:id="71" w:name="legislative-factors-clause-types"/>
@@ -17423,7 +17638,7 @@
       </w:r>
     </w:p>
     <w:bookmarkEnd w:id="71"/>
-    <w:bookmarkStart w:id="90" w:name="X3d1f28ebf57a42a02e6321b912ef3127a66a1d5"/>
+    <w:bookmarkStart w:id="91" w:name="X3d1f28ebf57a42a02e6321b912ef3127a66a1d5"/>
     <w:p>
       <w:pPr>
         <w:pStyle w:val="Heading1"/>
@@ -17506,7 +17721,7 @@
       <w:pPr>
         <w:numPr>
           <w:ilvl w:val="0"/>
-          <w:numId w:val="1009"/>
+          <w:numId w:val="1013"/>
         </w:numPr>
       </w:pPr>
       <w:r>
@@ -17521,7 +17736,7 @@
       <w:pPr>
         <w:numPr>
           <w:ilvl w:val="0"/>
-          <w:numId w:val="1009"/>
+          <w:numId w:val="1013"/>
         </w:numPr>
       </w:pPr>
       <w:r>
@@ -17592,7 +17807,7 @@
       <w:pPr>
         <w:numPr>
           <w:ilvl w:val="0"/>
-          <w:numId w:val="1010"/>
+          <w:numId w:val="1014"/>
         </w:numPr>
       </w:pPr>
       <w:r>
@@ -17607,7 +17822,7 @@
       <w:pPr>
         <w:numPr>
           <w:ilvl w:val="0"/>
-          <w:numId w:val="1010"/>
+          <w:numId w:val="1014"/>
         </w:numPr>
       </w:pPr>
       <w:r>
@@ -21330,7 +21545,7 @@
       <w:pPr>
         <w:numPr>
           <w:ilvl w:val="0"/>
-          <w:numId w:val="1011"/>
+          <w:numId w:val="1015"/>
         </w:numPr>
       </w:pPr>
       <w:r>
@@ -21345,7 +21560,7 @@
       <w:pPr>
         <w:numPr>
           <w:ilvl w:val="0"/>
-          <w:numId w:val="1011"/>
+          <w:numId w:val="1015"/>
         </w:numPr>
       </w:pPr>
       <w:r>
@@ -21360,7 +21575,7 @@
       <w:pPr>
         <w:numPr>
           <w:ilvl w:val="0"/>
-          <w:numId w:val="1011"/>
+          <w:numId w:val="1015"/>
         </w:numPr>
       </w:pPr>
       <w:r>
@@ -21375,7 +21590,7 @@
       <w:pPr>
         <w:numPr>
           <w:ilvl w:val="0"/>
-          <w:numId w:val="1011"/>
+          <w:numId w:val="1015"/>
         </w:numPr>
       </w:pPr>
       <w:r>
@@ -21480,7 +21695,7 @@
         <w:pStyle w:val="Compact"/>
         <w:numPr>
           <w:ilvl w:val="0"/>
-          <w:numId w:val="1012"/>
+          <w:numId w:val="1016"/>
         </w:numPr>
       </w:pPr>
       <w:r>
@@ -21552,7 +21767,7 @@
       <w:pPr>
         <w:numPr>
           <w:ilvl w:val="0"/>
-          <w:numId w:val="1013"/>
+          <w:numId w:val="1017"/>
         </w:numPr>
       </w:pPr>
       <w:r>
@@ -21567,7 +21782,7 @@
       <w:pPr>
         <w:numPr>
           <w:ilvl w:val="0"/>
-          <w:numId w:val="1013"/>
+          <w:numId w:val="1017"/>
         </w:numPr>
       </w:pPr>
       <w:r>
@@ -21674,7 +21889,7 @@
       <w:pPr>
         <w:numPr>
           <w:ilvl w:val="0"/>
-          <w:numId w:val="1014"/>
+          <w:numId w:val="1018"/>
         </w:numPr>
       </w:pPr>
       <w:r>
@@ -21689,7 +21904,7 @@
       <w:pPr>
         <w:numPr>
           <w:ilvl w:val="0"/>
-          <w:numId w:val="1014"/>
+          <w:numId w:val="1018"/>
         </w:numPr>
       </w:pPr>
       <w:r>
@@ -21788,7 +22003,7 @@
       <w:pPr>
         <w:numPr>
           <w:ilvl w:val="0"/>
-          <w:numId w:val="1014"/>
+          <w:numId w:val="1018"/>
         </w:numPr>
       </w:pPr>
       <w:r>
@@ -21803,7 +22018,7 @@
       <w:pPr>
         <w:numPr>
           <w:ilvl w:val="0"/>
-          <w:numId w:val="1014"/>
+          <w:numId w:val="1018"/>
         </w:numPr>
       </w:pPr>
       <w:r>
@@ -22571,7 +22786,7 @@
       <w:pPr>
         <w:numPr>
           <w:ilvl w:val="0"/>
-          <w:numId w:val="1015"/>
+          <w:numId w:val="1019"/>
         </w:numPr>
       </w:pPr>
       <w:r>
@@ -22586,7 +22801,7 @@
       <w:pPr>
         <w:numPr>
           <w:ilvl w:val="0"/>
-          <w:numId w:val="1015"/>
+          <w:numId w:val="1019"/>
         </w:numPr>
       </w:pPr>
       <w:r>
@@ -22601,7 +22816,7 @@
       <w:pPr>
         <w:numPr>
           <w:ilvl w:val="0"/>
-          <w:numId w:val="1015"/>
+          <w:numId w:val="1019"/>
         </w:numPr>
       </w:pPr>
       <w:r>
@@ -22613,7 +22828,7 @@
       </w:r>
     </w:p>
     <w:bookmarkEnd w:id="83"/>
-    <w:bookmarkStart w:id="89" w:name="X0845d6834917053ec444eadf52e64b0021c48a3"/>
+    <w:bookmarkStart w:id="90" w:name="X0845d6834917053ec444eadf52e64b0021c48a3"/>
     <w:p>
       <w:pPr>
         <w:pStyle w:val="Heading2"/>
@@ -22691,7 +22906,7 @@
       <w:pPr>
         <w:numPr>
           <w:ilvl w:val="0"/>
-          <w:numId w:val="1016"/>
+          <w:numId w:val="1020"/>
         </w:numPr>
       </w:pPr>
       <w:r>
@@ -22706,7 +22921,7 @@
       <w:pPr>
         <w:numPr>
           <w:ilvl w:val="0"/>
-          <w:numId w:val="1016"/>
+          <w:numId w:val="1020"/>
         </w:numPr>
       </w:pPr>
       <w:r>
@@ -23012,7 +23227,7 @@
         <w:pStyle w:val="Compact"/>
         <w:numPr>
           <w:ilvl w:val="0"/>
-          <w:numId w:val="1017"/>
+          <w:numId w:val="1021"/>
         </w:numPr>
       </w:pPr>
       <w:r>
@@ -23168,7 +23383,7 @@
       <w:pPr>
         <w:numPr>
           <w:ilvl w:val="0"/>
-          <w:numId w:val="1018"/>
+          <w:numId w:val="1022"/>
         </w:numPr>
       </w:pPr>
       <w:r>
@@ -23183,7 +23398,39 @@
       <w:pPr>
         <w:numPr>
           <w:ilvl w:val="0"/>
-          <w:numId w:val="1018"/>
+          <w:numId w:val="1022"/>
+        </w:numPr>
+      </w:pPr>
+      <w:r>
+        <w:rPr>
+          <w:b/>
+          <w:bCs/>
+        </w:rPr>
+        <w:t xml:space="preserve">MW - This may be out of scope for your review but here is a report that outlines the burden of proof needed for the Gov of BC to deny an application for an irrigation well in the Bessette Watershed. Their refusal decision was appealed by the applicant. It may have some background info you are looking for.</w:t>
+      </w:r>
+      <w:r>
+        <w:rPr>
+          <w:b/>
+          <w:bCs/>
+        </w:rPr>
+        <w:t xml:space="preserve"> </w:t>
+      </w:r>
+      <w:hyperlink r:id="rId89">
+        <w:r>
+          <w:rPr>
+            <w:rStyle w:val="Hyperlink"/>
+            <w:b/>
+            <w:bCs/>
+          </w:rPr>
+          <w:t xml:space="preserve">Aquatic Report Catalogue</w:t>
+        </w:r>
+      </w:hyperlink>
+    </w:p>
+    <w:p>
+      <w:pPr>
+        <w:numPr>
+          <w:ilvl w:val="0"/>
+          <w:numId w:val="1022"/>
         </w:numPr>
       </w:pPr>
       <w:r>
@@ -23194,9 +23441,147 @@
         <w:t xml:space="preserve">Comment on the most relevant legislation and why</w:t>
       </w:r>
     </w:p>
-    <w:bookmarkEnd w:id="89"/>
+    <w:p>
+      <w:pPr>
+        <w:numPr>
+          <w:ilvl w:val="0"/>
+          <w:numId w:val="1022"/>
+        </w:numPr>
+      </w:pPr>
+      <w:r>
+        <w:rPr>
+          <w:b/>
+          <w:bCs/>
+        </w:rPr>
+        <w:t xml:space="preserve">MW - In case this is helpful context:</w:t>
+      </w:r>
+    </w:p>
+    <w:p>
+      <w:pPr>
+        <w:numPr>
+          <w:ilvl w:val="0"/>
+          <w:numId w:val="1000"/>
+        </w:numPr>
+      </w:pPr>
+      <w:r>
+        <w:rPr>
+          <w:b/>
+          <w:bCs/>
+        </w:rPr>
+        <w:t xml:space="preserve">Water Sustainability Act Sections for water use/licencing:</w:t>
+      </w:r>
+      <w:r>
+        <w:br/>
+      </w:r>
+    </w:p>
+    <w:p>
+      <w:pPr>
+        <w:numPr>
+          <w:ilvl w:val="0"/>
+          <w:numId w:val="1000"/>
+        </w:numPr>
+      </w:pPr>
+      <w:r>
+        <w:rPr>
+          <w:b/>
+          <w:bCs/>
+        </w:rPr>
+        <w:t xml:space="preserve">14 Powers respecting applications and decision maker initiatives</w:t>
+      </w:r>
+    </w:p>
+    <w:p>
+      <w:pPr>
+        <w:numPr>
+          <w:ilvl w:val="0"/>
+          <w:numId w:val="1000"/>
+        </w:numPr>
+      </w:pPr>
+      <w:r>
+        <w:rPr>
+          <w:b/>
+          <w:bCs/>
+        </w:rPr>
+        <w:t xml:space="preserve">Decision point:</w:t>
+      </w:r>
+    </w:p>
+    <w:p>
+      <w:pPr>
+        <w:numPr>
+          <w:ilvl w:val="0"/>
+          <w:numId w:val="1000"/>
+        </w:numPr>
+      </w:pPr>
+      <w:r>
+        <w:rPr>
+          <w:b/>
+          <w:bCs/>
+        </w:rPr>
+        <w:t xml:space="preserve">The decision maker may refuse an application, require additional information from the applicant, include special conditions, amend or grant the application.</w:t>
+      </w:r>
+    </w:p>
+    <w:p>
+      <w:pPr>
+        <w:numPr>
+          <w:ilvl w:val="0"/>
+          <w:numId w:val="1000"/>
+        </w:numPr>
+      </w:pPr>
+      <w:r>
+        <w:rPr>
+          <w:b/>
+          <w:bCs/>
+        </w:rPr>
+        <w:t xml:space="preserve">15 EFN</w:t>
+      </w:r>
+    </w:p>
+    <w:p>
+      <w:pPr>
+        <w:numPr>
+          <w:ilvl w:val="0"/>
+          <w:numId w:val="1000"/>
+        </w:numPr>
+      </w:pPr>
+      <w:r>
+        <w:rPr>
+          <w:b/>
+          <w:bCs/>
+        </w:rPr>
+        <w:t xml:space="preserve">Decision points:</w:t>
+      </w:r>
+    </w:p>
+    <w:p>
+      <w:pPr>
+        <w:numPr>
+          <w:ilvl w:val="1"/>
+          <w:numId w:val="1023"/>
+        </w:numPr>
+      </w:pPr>
+      <w:r>
+        <w:rPr>
+          <w:b/>
+          <w:bCs/>
+        </w:rPr>
+        <w:t xml:space="preserve">The decision maker must consider the environmental flow needs of the stream (as outlined in the EFN Policy).</w:t>
+      </w:r>
+    </w:p>
+    <w:p>
+      <w:pPr>
+        <w:numPr>
+          <w:ilvl w:val="1"/>
+          <w:numId w:val="1023"/>
+        </w:numPr>
+      </w:pPr>
+      <w:r>
+        <w:rPr>
+          <w:b/>
+          <w:bCs/>
+        </w:rPr>
+        <w:t xml:space="preserve">In some cases, the decision maker must determine the EFN and may require further assessment from the applicant or a QEP — typically when regulations apply (e.g., the stream is identified as a Sensitive Stream in regulation) or when the decision maker deems additional information necessary to properly assess the application.</w:t>
+      </w:r>
+    </w:p>
     <w:bookmarkEnd w:id="90"/>
-    <w:bookmarkStart w:id="91" w:name="co-occurrence-of-management-domains"/>
+    <w:bookmarkEnd w:id="91"/>
+    <w:bookmarkStart w:id="92" w:name="co-occurrence-of-management-domains"/>
     <w:p>
       <w:pPr>
         <w:pStyle w:val="Heading1"/>
@@ -23301,8 +23686,8 @@
         <w:t xml:space="preserve">Domain co-occurrence within sections allows for an interesting study of how management domains overlap (Figure 11). A frequent co-occurrence among management domains doesn’t necessarily represent a relationship in reality, simply the legal framing used to regulate these aspects. The Pollution management domain and Water Use and Watercourse Modifications are in the top four most matched to sections (Figure 4), and expectedly, these domains have the largest number of co-occurrences. Both domains relate generally to the impacts from anthropogenic industrialization and commercial development, which is reflected in the legal language.</w:t>
       </w:r>
     </w:p>
-    <w:bookmarkEnd w:id="91"/>
-    <w:bookmarkStart w:id="93" w:name="discussion"/>
+    <w:bookmarkEnd w:id="92"/>
+    <w:bookmarkStart w:id="94" w:name="discussion"/>
     <w:p>
       <w:pPr>
         <w:pStyle w:val="Heading1"/>
@@ -23485,7 +23870,7 @@
         <w:t xml:space="preserve">(Order) for economic and political reasons (co-migrating with other stocks), denying the population larger legislative protections.</w:t>
       </w:r>
     </w:p>
-    <w:bookmarkStart w:id="92" w:name="conclusions"/>
+    <w:bookmarkStart w:id="93" w:name="conclusions"/>
     <w:p>
       <w:pPr>
         <w:pStyle w:val="Heading2"/>
@@ -23507,7 +23892,7 @@
         <w:pStyle w:val="Compact"/>
         <w:numPr>
           <w:ilvl w:val="0"/>
-          <w:numId w:val="1019"/>
+          <w:numId w:val="1024"/>
         </w:numPr>
       </w:pPr>
       <w:r>
@@ -23526,9 +23911,9 @@
         <w:t xml:space="preserve">The LAPSE tool provides a novel approach of linking legal language with salmon management categorization by developing management domain categories based on internationally recognized biodiversity threat categories (IUCN threats). The methods developed to identify and match salmon management keywords and keyphrases to clauses allow for multiple outputs and opportunities including: an extensive list of legislation (acts, regulations, sections, and paragraphs) relevant to a human activity or salmon management decisions; assessment of the nature or context of the statute (clause type) by management domain and threat; assessment of the overlap and connectedness in management domains (co-occurrence) to better understand the relationship between salmon threats in legislation. While this process and tool are relatively new and untested, further development could lead to a better integration of salmon management decisions and administrative responsibility.</w:t>
       </w:r>
     </w:p>
-    <w:bookmarkEnd w:id="92"/>
     <w:bookmarkEnd w:id="93"/>
-    <w:bookmarkStart w:id="145" w:name="references"/>
+    <w:bookmarkEnd w:id="94"/>
+    <w:bookmarkStart w:id="146" w:name="references"/>
     <w:p>
       <w:pPr>
         <w:pStyle w:val="Heading1"/>
@@ -23537,8 +23922,8 @@
         <w:t xml:space="preserve">References</w:t>
       </w:r>
     </w:p>
-    <w:bookmarkStart w:id="144" w:name="refs"/>
-    <w:bookmarkStart w:id="94" w:name="ref-arbeider2020"/>
+    <w:bookmarkStart w:id="145" w:name="refs"/>
+    <w:bookmarkStart w:id="95" w:name="ref-arbeider2020"/>
     <w:p>
       <w:pPr>
         <w:pStyle w:val="Bibliography"/>
@@ -23556,8 +23941,8 @@
         <w:t xml:space="preserve">.</w:t>
       </w:r>
     </w:p>
-    <w:bookmarkEnd w:id="94"/>
-    <w:bookmarkStart w:id="96" w:name="ref-atkinson2024"/>
+    <w:bookmarkEnd w:id="95"/>
+    <w:bookmarkStart w:id="97" w:name="ref-atkinson2024"/>
     <w:p>
       <w:pPr>
         <w:pStyle w:val="Bibliography"/>
@@ -23577,7 +23962,7 @@
       <w:r>
         <w:t xml:space="preserve">in monitoring of salmon spawners continue despite a conservation crisis. doi:</w:t>
       </w:r>
-      <w:hyperlink r:id="rId95">
+      <w:hyperlink r:id="rId96">
         <w:r>
           <w:rPr>
             <w:rStyle w:val="Hyperlink"/>
@@ -23589,8 +23974,8 @@
         <w:t xml:space="preserve">.</w:t>
       </w:r>
     </w:p>
-    <w:bookmarkEnd w:id="96"/>
-    <w:bookmarkStart w:id="98" w:name="ref-bankes2014"/>
+    <w:bookmarkEnd w:id="97"/>
+    <w:bookmarkStart w:id="99" w:name="ref-bankes2014"/>
     <w:p>
       <w:pPr>
         <w:pStyle w:val="Bibliography"/>
@@ -23641,7 +24026,7 @@
       <w:r>
         <w:t xml:space="preserve">(9): 6024–6048. doi:</w:t>
       </w:r>
-      <w:hyperlink r:id="rId97">
+      <w:hyperlink r:id="rId98">
         <w:r>
           <w:rPr>
             <w:rStyle w:val="Hyperlink"/>
@@ -23653,8 +24038,8 @@
         <w:t xml:space="preserve">.</w:t>
       </w:r>
     </w:p>
-    <w:bookmarkEnd w:id="98"/>
-    <w:bookmarkStart w:id="99" w:name="ref-becklumb2013"/>
+    <w:bookmarkEnd w:id="99"/>
+    <w:bookmarkStart w:id="100" w:name="ref-becklumb2013"/>
     <w:p>
       <w:pPr>
         <w:pStyle w:val="Bibliography"/>
@@ -23684,8 +24069,8 @@
         <w:t xml:space="preserve">.</w:t>
       </w:r>
     </w:p>
-    <w:bookmarkEnd w:id="99"/>
-    <w:bookmarkStart w:id="101" w:name="ref-bisson2009"/>
+    <w:bookmarkEnd w:id="100"/>
+    <w:bookmarkStart w:id="102" w:name="ref-bisson2009"/>
     <w:p>
       <w:pPr>
         <w:pStyle w:val="Bibliography"/>
@@ -23760,7 +24145,7 @@
       <w:r>
         <w:t xml:space="preserve">(1): art45. doi:</w:t>
       </w:r>
-      <w:hyperlink r:id="rId100">
+      <w:hyperlink r:id="rId101">
         <w:r>
           <w:rPr>
             <w:rStyle w:val="Hyperlink"/>
@@ -23772,8 +24157,8 @@
         <w:t xml:space="preserve">.</w:t>
       </w:r>
     </w:p>
-    <w:bookmarkEnd w:id="101"/>
-    <w:bookmarkStart w:id="103" w:name="ref-bogetti2025"/>
+    <w:bookmarkEnd w:id="102"/>
+    <w:bookmarkStart w:id="104" w:name="ref-bogetti2025"/>
     <w:p>
       <w:pPr>
         <w:pStyle w:val="Bibliography"/>
@@ -23815,7 +24200,7 @@
       <w:r>
         <w:t xml:space="preserve">: 1–11. doi:</w:t>
       </w:r>
-      <w:hyperlink r:id="rId102">
+      <w:hyperlink r:id="rId103">
         <w:r>
           <w:rPr>
             <w:rStyle w:val="Hyperlink"/>
@@ -23827,8 +24212,8 @@
         <w:t xml:space="preserve">.</w:t>
       </w:r>
     </w:p>
-    <w:bookmarkEnd w:id="103"/>
-    <w:bookmarkStart w:id="105" w:name="ref-campbell2002"/>
+    <w:bookmarkEnd w:id="104"/>
+    <w:bookmarkStart w:id="106" w:name="ref-campbell2002"/>
     <w:p>
       <w:pPr>
         <w:pStyle w:val="Bibliography"/>
@@ -23903,7 +24288,7 @@
       <w:r>
         <w:t xml:space="preserve">(5): 223–232. doi:</w:t>
       </w:r>
-      <w:hyperlink r:id="rId104">
+      <w:hyperlink r:id="rId105">
         <w:r>
           <w:rPr>
             <w:rStyle w:val="Hyperlink"/>
@@ -23915,8 +24300,8 @@
         <w:t xml:space="preserve">.</w:t>
       </w:r>
     </w:p>
-    <w:bookmarkEnd w:id="105"/>
-    <w:bookmarkStart w:id="107" w:name="X0deca4265bf6bbafed91be61c4a47264114da06"/>
+    <w:bookmarkEnd w:id="106"/>
+    <w:bookmarkStart w:id="108" w:name="X0deca4265bf6bbafed91be61c4a47264114da06"/>
     <w:p>
       <w:pPr>
         <w:pStyle w:val="Bibliography"/>
@@ -23936,7 +24321,7 @@
       <w:r>
         <w:t xml:space="preserve"> </w:t>
       </w:r>
-      <w:hyperlink r:id="rId106">
+      <w:hyperlink r:id="rId107">
         <w:r>
           <w:rPr>
             <w:rStyle w:val="Hyperlink"/>
@@ -23951,8 +24336,8 @@
         <w:t xml:space="preserve">[accessed 18 December 2025].</w:t>
       </w:r>
     </w:p>
-    <w:bookmarkEnd w:id="107"/>
-    <w:bookmarkStart w:id="109" w:name="ref-chalifour2022"/>
+    <w:bookmarkEnd w:id="108"/>
+    <w:bookmarkStart w:id="110" w:name="ref-chalifour2022"/>
     <w:p>
       <w:pPr>
         <w:pStyle w:val="Bibliography"/>
@@ -23960,7 +24345,7 @@
       <w:r>
         <w:t xml:space="preserve">Chalifour, L., Holt, C., Camaclang, A.E., Bradford, M.J., Dixon, R., Finn, R.J.R., Hemming, V., Hinch, S.G., Levings, C.D., MacDuffee, M., Nishimura, D.J.H., Pearson, M., Reynolds, J.D., Scott, D.C., Spremberg, U., Stark, S., Stevens, J., Baum, J.K., and Martin, T.G. 2022. Identifying a pathway towards recovery for depleted wild pacific salmon populations in a large watershed under multiple stressors. Journal of Applied Ecology (November 2021): 2212–2226. doi:</w:t>
       </w:r>
-      <w:hyperlink r:id="rId108">
+      <w:hyperlink r:id="rId109">
         <w:r>
           <w:rPr>
             <w:rStyle w:val="Hyperlink"/>
@@ -23972,8 +24357,8 @@
         <w:t xml:space="preserve">.</w:t>
       </w:r>
     </w:p>
-    <w:bookmarkEnd w:id="109"/>
-    <w:bookmarkStart w:id="110" w:name="ref-collins2019"/>
+    <w:bookmarkEnd w:id="110"/>
+    <w:bookmarkStart w:id="111" w:name="ref-collins2019"/>
     <w:p>
       <w:pPr>
         <w:pStyle w:val="Bibliography"/>
@@ -24028,8 +24413,8 @@
         <w:t xml:space="preserve">.</w:t>
       </w:r>
     </w:p>
-    <w:bookmarkEnd w:id="110"/>
-    <w:bookmarkStart w:id="112" w:name="ref-dallimer2015"/>
+    <w:bookmarkEnd w:id="111"/>
+    <w:bookmarkStart w:id="113" w:name="ref-dallimer2015"/>
     <w:p>
       <w:pPr>
         <w:pStyle w:val="Bibliography"/>
@@ -24050,7 +24435,7 @@
       <w:r>
         <w:t xml:space="preserve">(3): 132–139. doi:</w:t>
       </w:r>
-      <w:hyperlink r:id="rId111">
+      <w:hyperlink r:id="rId112">
         <w:r>
           <w:rPr>
             <w:rStyle w:val="Hyperlink"/>
@@ -24062,8 +24447,8 @@
         <w:t xml:space="preserve">.</w:t>
       </w:r>
     </w:p>
-    <w:bookmarkEnd w:id="112"/>
-    <w:bookmarkStart w:id="114" w:name="ref-delvalle2024"/>
+    <w:bookmarkEnd w:id="113"/>
+    <w:bookmarkStart w:id="115" w:name="ref-delvalle2024"/>
     <w:p>
       <w:pPr>
         <w:pStyle w:val="Bibliography"/>
@@ -24090,7 +24475,7 @@
       <w:r>
         <w:t xml:space="preserve">(1): 1–17. doi:</w:t>
       </w:r>
-      <w:hyperlink r:id="rId113">
+      <w:hyperlink r:id="rId114">
         <w:r>
           <w:rPr>
             <w:rStyle w:val="Hyperlink"/>
@@ -24102,8 +24487,8 @@
         <w:t xml:space="preserve">.</w:t>
       </w:r>
     </w:p>
-    <w:bookmarkEnd w:id="114"/>
-    <w:bookmarkStart w:id="116" w:name="ref-departmentofjusticecanada2022"/>
+    <w:bookmarkEnd w:id="115"/>
+    <w:bookmarkStart w:id="117" w:name="ref-departmentofjusticecanada2022"/>
     <w:p>
       <w:pPr>
         <w:pStyle w:val="Bibliography"/>
@@ -24123,7 +24508,7 @@
       <w:r>
         <w:t xml:space="preserve"> </w:t>
       </w:r>
-      <w:hyperlink r:id="rId115">
+      <w:hyperlink r:id="rId116">
         <w:r>
           <w:rPr>
             <w:rStyle w:val="Hyperlink"/>
@@ -24138,8 +24523,8 @@
         <w:t xml:space="preserve">[accessed 18 December 2025].</w:t>
       </w:r>
     </w:p>
-    <w:bookmarkEnd w:id="116"/>
-    <w:bookmarkStart w:id="117" w:name="ref-dfo2020"/>
+    <w:bookmarkEnd w:id="117"/>
+    <w:bookmarkStart w:id="118" w:name="ref-dfo2020"/>
     <w:p>
       <w:pPr>
         <w:pStyle w:val="Bibliography"/>
@@ -24214,8 +24599,8 @@
         <w:t xml:space="preserve">11.</w:t>
       </w:r>
     </w:p>
-    <w:bookmarkEnd w:id="117"/>
-    <w:bookmarkStart w:id="118" w:name="ref-dfo2022"/>
+    <w:bookmarkEnd w:id="118"/>
+    <w:bookmarkStart w:id="119" w:name="ref-dfo2022"/>
     <w:p>
       <w:pPr>
         <w:pStyle w:val="Bibliography"/>
@@ -24317,8 +24702,8 @@
         <w:t xml:space="preserve">.</w:t>
       </w:r>
     </w:p>
-    <w:bookmarkEnd w:id="118"/>
-    <w:bookmarkStart w:id="119" w:name="ref-dionne2023"/>
+    <w:bookmarkEnd w:id="119"/>
+    <w:bookmarkStart w:id="120" w:name="ref-dionne2023"/>
     <w:p>
       <w:pPr>
         <w:pStyle w:val="Bibliography"/>
@@ -24351,8 +24736,8 @@
         <w:t xml:space="preserve">and southern mainland chinook designatable units (1, 6, 13 and 15). Canadian Science Advisory Secretariat (CSAS), Ottawa ON.</w:t>
       </w:r>
     </w:p>
-    <w:bookmarkEnd w:id="119"/>
-    <w:bookmarkStart w:id="120" w:name="ref-doutaz2023"/>
+    <w:bookmarkEnd w:id="120"/>
+    <w:bookmarkStart w:id="121" w:name="ref-doutaz2023"/>
     <w:p>
       <w:pPr>
         <w:pStyle w:val="Bibliography"/>
@@ -24361,8 +24746,8 @@
         <w:t xml:space="preserve">Doutaz, D., Huang, A., Decker, S., and Vivian, T. 2023. Recovery potential assessment for fraser river sockeye salmon (oncorhynchus nerka), nine designatable units part 2: Biology, habitat, threats, mitigations and allowable harm - elements 1-11, 14, 16-18, 22.</w:t>
       </w:r>
     </w:p>
-    <w:bookmarkEnd w:id="120"/>
-    <w:bookmarkStart w:id="121" w:name="ref-grant2019"/>
+    <w:bookmarkEnd w:id="121"/>
+    <w:bookmarkStart w:id="122" w:name="ref-grant2019"/>
     <w:p>
       <w:pPr>
         <w:pStyle w:val="Bibliography"/>
@@ -24371,8 +24756,8 @@
         <w:t xml:space="preserve">Grant, S.C.H., MacDonald, B.L., and Winston, M.L. 2019. State of canadian pacific salmon: Responses to changing climate and habitats.</w:t>
       </w:r>
     </w:p>
-    <w:bookmarkEnd w:id="121"/>
-    <w:bookmarkStart w:id="123" w:name="ref-kraus2021"/>
+    <w:bookmarkEnd w:id="122"/>
+    <w:bookmarkStart w:id="124" w:name="ref-kraus2021"/>
     <w:p>
       <w:pPr>
         <w:pStyle w:val="Bibliography"/>
@@ -24402,7 +24787,7 @@
       <w:r>
         <w:t xml:space="preserve">: 1088–1127. doi:</w:t>
       </w:r>
-      <w:hyperlink r:id="rId122">
+      <w:hyperlink r:id="rId123">
         <w:r>
           <w:rPr>
             <w:rStyle w:val="Hyperlink"/>
@@ -24414,8 +24799,8 @@
         <w:t xml:space="preserve">.</w:t>
       </w:r>
     </w:p>
-    <w:bookmarkEnd w:id="123"/>
-    <w:bookmarkStart w:id="124" w:name="ref-marentette2020"/>
+    <w:bookmarkEnd w:id="124"/>
+    <w:bookmarkStart w:id="125" w:name="ref-marentette2020"/>
     <w:p>
       <w:pPr>
         <w:pStyle w:val="Bibliography"/>
@@ -24457,8 +24842,8 @@
         <w:t xml:space="preserve">, Ottawa, ON.</w:t>
       </w:r>
     </w:p>
-    <w:bookmarkEnd w:id="124"/>
-    <w:bookmarkStart w:id="126" w:name="ref-mccune2013"/>
+    <w:bookmarkEnd w:id="125"/>
+    <w:bookmarkStart w:id="127" w:name="ref-mccune2013"/>
     <w:p>
       <w:pPr>
         <w:pStyle w:val="Bibliography"/>
@@ -24503,7 +24888,7 @@
       <w:r>
         <w:t xml:space="preserve">: 254–265. doi:</w:t>
       </w:r>
-      <w:hyperlink r:id="rId125">
+      <w:hyperlink r:id="rId126">
         <w:r>
           <w:rPr>
             <w:rStyle w:val="Hyperlink"/>
@@ -24515,8 +24900,8 @@
         <w:t xml:space="preserve">.</w:t>
       </w:r>
     </w:p>
-    <w:bookmarkEnd w:id="126"/>
-    <w:bookmarkStart w:id="128" w:name="ref-moore2025"/>
+    <w:bookmarkEnd w:id="127"/>
+    <w:bookmarkStart w:id="129" w:name="ref-moore2025"/>
     <w:p>
       <w:pPr>
         <w:pStyle w:val="Bibliography"/>
@@ -24524,7 +24909,7 @@
       <w:r>
         <w:t xml:space="preserve">Moore, J.W., Ulaski, M.E., Wilson, K.L., Martin, T.G., Kuiper, S.D., Peacock, S.J., Braun, D.C., Naman, S.M., Pitman, K.J., Reid, A.J., Rosenfeld, J.S., Sainsbury, N.C., Wilson, S.M., and Zdasiuk, B.J. 2025. A Safe Operating Space for Salmon Watersheds Under Rapid Climate Change. Fish and Fisheries: faf.70027. doi:</w:t>
       </w:r>
-      <w:hyperlink r:id="rId127">
+      <w:hyperlink r:id="rId128">
         <w:r>
           <w:rPr>
             <w:rStyle w:val="Hyperlink"/>
@@ -24536,8 +24921,8 @@
         <w:t xml:space="preserve">.</w:t>
       </w:r>
     </w:p>
-    <w:bookmarkEnd w:id="128"/>
-    <w:bookmarkStart w:id="130" w:name="ref-price2017"/>
+    <w:bookmarkEnd w:id="129"/>
+    <w:bookmarkStart w:id="131" w:name="ref-price2017"/>
     <w:p>
       <w:pPr>
         <w:pStyle w:val="Bibliography"/>
@@ -24588,7 +24973,7 @@
       <w:r>
         <w:t xml:space="preserve">(10): 1507–1518. doi:</w:t>
       </w:r>
-      <w:hyperlink r:id="rId129">
+      <w:hyperlink r:id="rId130">
         <w:r>
           <w:rPr>
             <w:rStyle w:val="Hyperlink"/>
@@ -24600,8 +24985,8 @@
         <w:t xml:space="preserve">.</w:t>
       </w:r>
     </w:p>
-    <w:bookmarkEnd w:id="130"/>
-    <w:bookmarkStart w:id="132" w:name="ref-ray2021"/>
+    <w:bookmarkEnd w:id="131"/>
+    <w:bookmarkStart w:id="133" w:name="ref-ray2021"/>
     <w:p>
       <w:pPr>
         <w:pStyle w:val="Bibliography"/>
@@ -24643,7 +25028,7 @@
       <w:r>
         <w:t xml:space="preserve">: 1044–1068. doi:</w:t>
       </w:r>
-      <w:hyperlink r:id="rId131">
+      <w:hyperlink r:id="rId132">
         <w:r>
           <w:rPr>
             <w:rStyle w:val="Hyperlink"/>
@@ -24655,8 +25040,8 @@
         <w:t xml:space="preserve">.</w:t>
       </w:r>
     </w:p>
-    <w:bookmarkEnd w:id="132"/>
-    <w:bookmarkStart w:id="134" w:name="ref-salafsky2025"/>
+    <w:bookmarkEnd w:id="133"/>
+    <w:bookmarkStart w:id="135" w:name="ref-salafsky2025"/>
     <w:p>
       <w:pPr>
         <w:pStyle w:val="Bibliography"/>
@@ -24677,7 +25062,7 @@
       <w:r>
         <w:t xml:space="preserve">(3): e14434. doi:</w:t>
       </w:r>
-      <w:hyperlink r:id="rId133">
+      <w:hyperlink r:id="rId134">
         <w:r>
           <w:rPr>
             <w:rStyle w:val="Hyperlink"/>
@@ -24689,8 +25074,8 @@
         <w:t xml:space="preserve">.</w:t>
       </w:r>
     </w:p>
-    <w:bookmarkEnd w:id="134"/>
-    <w:bookmarkStart w:id="136" w:name="ref-salafsky2008"/>
+    <w:bookmarkEnd w:id="135"/>
+    <w:bookmarkStart w:id="137" w:name="ref-salafsky2008"/>
     <w:p>
       <w:pPr>
         <w:pStyle w:val="Bibliography"/>
@@ -24765,7 +25150,7 @@
       <w:r>
         <w:t xml:space="preserve">(4): 897–911. doi:</w:t>
       </w:r>
-      <w:hyperlink r:id="rId135">
+      <w:hyperlink r:id="rId136">
         <w:r>
           <w:rPr>
             <w:rStyle w:val="Hyperlink"/>
@@ -24777,8 +25162,8 @@
         <w:t xml:space="preserve">.</w:t>
       </w:r>
     </w:p>
-    <w:bookmarkEnd w:id="136"/>
-    <w:bookmarkStart w:id="138" w:name="ref-swerdfager2023"/>
+    <w:bookmarkEnd w:id="137"/>
+    <w:bookmarkStart w:id="139" w:name="ref-swerdfager2023"/>
     <w:p>
       <w:pPr>
         <w:pStyle w:val="Bibliography"/>
@@ -24808,7 +25193,7 @@
       <w:r>
         <w:t xml:space="preserve">: 1–13. doi:</w:t>
       </w:r>
-      <w:hyperlink r:id="rId137">
+      <w:hyperlink r:id="rId138">
         <w:r>
           <w:rPr>
             <w:rStyle w:val="Hyperlink"/>
@@ -24820,8 +25205,8 @@
         <w:t xml:space="preserve">.</w:t>
       </w:r>
     </w:p>
-    <w:bookmarkEnd w:id="138"/>
-    <w:bookmarkStart w:id="139" w:name="ref-thompson1974"/>
+    <w:bookmarkEnd w:id="139"/>
+    <w:bookmarkStart w:id="140" w:name="ref-thompson1974"/>
     <w:p>
       <w:pPr>
         <w:pStyle w:val="Bibliography"/>
@@ -24851,8 +25236,8 @@
         <w:t xml:space="preserve">.</w:t>
       </w:r>
     </w:p>
-    <w:bookmarkEnd w:id="139"/>
-    <w:bookmarkStart w:id="141" w:name="ref-turcotte2021"/>
+    <w:bookmarkEnd w:id="140"/>
+    <w:bookmarkStart w:id="142" w:name="ref-turcotte2021"/>
     <w:p>
       <w:pPr>
         <w:pStyle w:val="Bibliography"/>
@@ -24935,7 +25320,7 @@
       <w:r>
         <w:t xml:space="preserve">: 1474–1494. doi:</w:t>
       </w:r>
-      <w:hyperlink r:id="rId140">
+      <w:hyperlink r:id="rId141">
         <w:r>
           <w:rPr>
             <w:rStyle w:val="Hyperlink"/>
@@ -24947,8 +25332,8 @@
         <w:t xml:space="preserve">.</w:t>
       </w:r>
     </w:p>
-    <w:bookmarkEnd w:id="141"/>
-    <w:bookmarkStart w:id="143" w:name="ref-ulaski2025"/>
+    <w:bookmarkEnd w:id="142"/>
+    <w:bookmarkStart w:id="144" w:name="ref-ulaski2025"/>
     <w:p>
       <w:pPr>
         <w:pStyle w:val="Bibliography"/>
@@ -24987,7 +25372,7 @@
       <w:r>
         <w:t xml:space="preserve">: 1–25. doi:</w:t>
       </w:r>
-      <w:hyperlink r:id="rId142">
+      <w:hyperlink r:id="rId143">
         <w:r>
           <w:rPr>
             <w:rStyle w:val="Hyperlink"/>
@@ -24999,10 +25384,10 @@
         <w:t xml:space="preserve">.</w:t>
       </w:r>
     </w:p>
-    <w:bookmarkEnd w:id="143"/>
     <w:bookmarkEnd w:id="144"/>
     <w:bookmarkEnd w:id="145"/>
-    <w:bookmarkStart w:id="146" w:name="supplementary-material"/>
+    <w:bookmarkEnd w:id="146"/>
+    <w:bookmarkStart w:id="147" w:name="supplementary-material"/>
     <w:p>
       <w:pPr>
         <w:pStyle w:val="Heading1"/>
@@ -25016,7 +25401,7 @@
         <w:pStyle w:val="Compact"/>
         <w:numPr>
           <w:ilvl w:val="0"/>
-          <w:numId w:val="1020"/>
+          <w:numId w:val="1025"/>
         </w:numPr>
       </w:pPr>
       <w:r>
@@ -25027,7 +25412,7 @@
         <w:t xml:space="preserve">Links or downloads for the LAPSE tool materials (app etc.)</w:t>
       </w:r>
     </w:p>
-    <w:bookmarkEnd w:id="146"/>
+    <w:bookmarkEnd w:id="147"/>
     <w:sectPr>
       <w:headerReference r:id="rId10" w:type="even"/>
       <w:headerReference r:id="rId9" w:type="default"/>
@@ -25687,6 +26072,91 @@
       </w:rPr>
     </w:lvl>
   </w:abstractNum>
+  <w:abstractNum w:abstractNumId="99411">
+    <w:nsid w:val="00A99411"/>
+    <w:multiLevelType w:val="multilevel"/>
+    <w:lvl w:ilvl="0">
+      <w:start w:val="1"/>
+      <w:numFmt w:val="decimal"/>
+      <w:lvlText w:val="%1."/>
+      <w:lvlJc w:val="left"/>
+      <w:pPr>
+        <w:ind w:left="720" w:hanging="360"/>
+      </w:pPr>
+    </w:lvl>
+    <w:lvl w:ilvl="1">
+      <w:start w:val="1"/>
+      <w:numFmt w:val="decimal"/>
+      <w:lvlText w:val="%2."/>
+      <w:lvlJc w:val="left"/>
+      <w:pPr>
+        <w:ind w:left="1440" w:hanging="360"/>
+      </w:pPr>
+    </w:lvl>
+    <w:lvl w:ilvl="2">
+      <w:start w:val="1"/>
+      <w:numFmt w:val="decimal"/>
+      <w:lvlText w:val="%3."/>
+      <w:lvlJc w:val="left"/>
+      <w:pPr>
+        <w:ind w:left="2160" w:hanging="360"/>
+      </w:pPr>
+    </w:lvl>
+    <w:lvl w:ilvl="3">
+      <w:start w:val="1"/>
+      <w:numFmt w:val="decimal"/>
+      <w:lvlText w:val="%4."/>
+      <w:lvlJc w:val="left"/>
+      <w:pPr>
+        <w:ind w:left="2880" w:hanging="360"/>
+      </w:pPr>
+    </w:lvl>
+    <w:lvl w:ilvl="4">
+      <w:start w:val="1"/>
+      <w:numFmt w:val="decimal"/>
+      <w:lvlText w:val="%5."/>
+      <w:lvlJc w:val="left"/>
+      <w:pPr>
+        <w:ind w:left="3600" w:hanging="360"/>
+      </w:pPr>
+    </w:lvl>
+    <w:lvl w:ilvl="5">
+      <w:start w:val="1"/>
+      <w:numFmt w:val="decimal"/>
+      <w:lvlText w:val="%6."/>
+      <w:lvlJc w:val="left"/>
+      <w:pPr>
+        <w:ind w:left="4320" w:hanging="360"/>
+      </w:pPr>
+    </w:lvl>
+    <w:lvl w:ilvl="6">
+      <w:start w:val="1"/>
+      <w:numFmt w:val="decimal"/>
+      <w:lvlText w:val="%7."/>
+      <w:lvlJc w:val="left"/>
+      <w:pPr>
+        <w:ind w:left="5040" w:hanging="360"/>
+      </w:pPr>
+    </w:lvl>
+    <w:lvl w:ilvl="7">
+      <w:start w:val="1"/>
+      <w:numFmt w:val="decimal"/>
+      <w:lvlText w:val="%8."/>
+      <w:lvlJc w:val="left"/>
+      <w:pPr>
+        <w:ind w:left="5760" w:hanging="360"/>
+      </w:pPr>
+    </w:lvl>
+    <w:lvl w:ilvl="8">
+      <w:start w:val="1"/>
+      <w:numFmt w:val="decimal"/>
+      <w:lvlText w:val="%9."/>
+      <w:lvlJc w:val="left"/>
+      <w:pPr>
+        <w:ind w:left="6480" w:hanging="360"/>
+      </w:pPr>
+    </w:lvl>
+  </w:abstractNum>
   <w:num w:numId="1000">
     <w:abstractNumId w:val="990"/>
   </w:num>
@@ -25748,6 +26218,48 @@
     <w:abstractNumId w:val="991"/>
   </w:num>
   <w:num w:numId="1020">
+    <w:abstractNumId w:val="991"/>
+  </w:num>
+  <w:num w:numId="1021">
+    <w:abstractNumId w:val="991"/>
+  </w:num>
+  <w:num w:numId="1022">
+    <w:abstractNumId w:val="991"/>
+  </w:num>
+  <w:num w:numId="1023">
+    <w:abstractNumId w:val="99411"/>
+    <w:lvlOverride w:ilvl="0">
+      <w:startOverride w:val="1"/>
+    </w:lvlOverride>
+    <w:lvlOverride w:ilvl="1">
+      <w:startOverride w:val="1"/>
+    </w:lvlOverride>
+    <w:lvlOverride w:ilvl="2">
+      <w:startOverride w:val="1"/>
+    </w:lvlOverride>
+    <w:lvlOverride w:ilvl="3">
+      <w:startOverride w:val="1"/>
+    </w:lvlOverride>
+    <w:lvlOverride w:ilvl="4">
+      <w:startOverride w:val="1"/>
+    </w:lvlOverride>
+    <w:lvlOverride w:ilvl="5">
+      <w:startOverride w:val="1"/>
+    </w:lvlOverride>
+    <w:lvlOverride w:ilvl="6">
+      <w:startOverride w:val="1"/>
+    </w:lvlOverride>
+    <w:lvlOverride w:ilvl="7">
+      <w:startOverride w:val="1"/>
+    </w:lvlOverride>
+    <w:lvlOverride w:ilvl="8">
+      <w:startOverride w:val="1"/>
+    </w:lvlOverride>
+  </w:num>
+  <w:num w:numId="1024">
+    <w:abstractNumId w:val="991"/>
+  </w:num>
+  <w:num w:numId="1025">
     <w:abstractNumId w:val="991"/>
   </w:num>
 </w:numbering>

</xml_diff>

<commit_message>
Moved sankey charts to legislation compilation section
</commit_message>
<xml_diff>
--- a/reports/LAPSE_primary_publication.docx
+++ b/reports/LAPSE_primary_publication.docx
@@ -158,7 +158,7 @@
         <w:t xml:space="preserve">2026-01-13</w:t>
       </w:r>
     </w:p>
-    <w:bookmarkStart w:id="32" w:name="introduction"/>
+    <w:bookmarkStart w:id="24" w:name="introduction"/>
     <w:p>
       <w:pPr>
         <w:pStyle w:val="Heading1"/>
@@ -167,7 +167,7 @@
         <w:t xml:space="preserve">Introduction</w:t>
       </w:r>
     </w:p>
-    <w:bookmarkStart w:id="28" w:name="X23eb75eb73759b85a41a4830e98a3f1b0635388"/>
+    <w:bookmarkStart w:id="20" w:name="X23eb75eb73759b85a41a4830e98a3f1b0635388"/>
     <w:p>
       <w:pPr>
         <w:pStyle w:val="Heading2"/>
@@ -267,13 +267,975 @@
         <w:pStyle w:val="BodyText"/>
       </w:pPr>
       <w:r>
+        <w:t xml:space="preserve">Acts and regulations in British Columbia might be designed to address one broad category of human activity, but this activity can cover many aspects of salmon management. For example, the provincial</w:t>
+      </w:r>
+      <w:r>
+        <w:t xml:space="preserve"> </w:t>
+      </w:r>
+      <w:r>
+        <w:rPr>
+          <w:i/>
+          <w:iCs/>
+        </w:rPr>
+        <w:t xml:space="preserve">Forest and Range Practices Act</w:t>
+      </w:r>
+      <w:r>
+        <w:t xml:space="preserve"> </w:t>
+      </w:r>
+      <w:r>
+        <w:t xml:space="preserve">is specific to forestry practices and planning, along with cattle ranging, but in terms of salmon threats, these activities impact many aspects including stream hydrology, water temperature, effluent, riparian habitat destruction, watercourse changes from road infrastructure</w:t>
+      </w:r>
+      <w:r>
+        <w:t xml:space="preserve"> </w:t>
+      </w:r>
+      <w:r>
+        <w:t xml:space="preserve">(Ulaski et al. 2025)</w:t>
+      </w:r>
+      <w:r>
+        <w:t xml:space="preserve">, and the spread of invasive species. Projects that influence environmental factors can be subject to both provincial and federal environmental assessments during the planning stages</w:t>
+      </w:r>
+      <w:r>
+        <w:t xml:space="preserve"> </w:t>
+      </w:r>
+      <w:r>
+        <w:t xml:space="preserve">(Becklumb 2013)</w:t>
+      </w:r>
+      <w:r>
+        <w:t xml:space="preserve">. Natural resource legislation and programs often operate on a sector-by-sector and individual resource basis where integrated stewardship relies on scale-appropriate planning and decision making</w:t>
+      </w:r>
+      <w:r>
+        <w:t xml:space="preserve"> </w:t>
+      </w:r>
+      <w:r>
+        <w:t xml:space="preserve">(Ray et al. 2021)</w:t>
+      </w:r>
+      <w:r>
+        <w:t xml:space="preserve">. Provinces generally decide when, or if, to regulate on matters of environmental concern</w:t>
+      </w:r>
+      <w:r>
+        <w:t xml:space="preserve"> </w:t>
+      </w:r>
+      <w:r>
+        <w:t xml:space="preserve">(Campbell and Thomas 2002)</w:t>
+      </w:r>
+      <w:r>
+        <w:t xml:space="preserve">. British Columbia is even more decentralized than other provinces, especially in terms of species at risk legislation, because British Columbia’s relevant provisions are spread over the greatest number of statutes and regulations</w:t>
+      </w:r>
+      <w:r>
+        <w:t xml:space="preserve"> </w:t>
+      </w:r>
+      <w:r>
+        <w:t xml:space="preserve">(Bogetti and Mason 2025)</w:t>
+      </w:r>
+      <w:r>
+        <w:t xml:space="preserve">.</w:t>
+      </w:r>
+    </w:p>
+    <w:bookmarkEnd w:id="20"/>
+    <w:bookmarkStart w:id="21" w:name="X73644377a907dce2b45cf6342b97f459a660bc0"/>
+    <w:p>
+      <w:pPr>
+        <w:pStyle w:val="Heading2"/>
+      </w:pPr>
+      <w:r>
+        <w:t xml:space="preserve">Complexity in addressing Pacific Salmon population declines</w:t>
+      </w:r>
+    </w:p>
+    <w:p>
+      <w:pPr>
+        <w:pStyle w:val="FirstParagraph"/>
+      </w:pPr>
+      <w:r>
+        <w:t xml:space="preserve">Despite considerable attention towards policies and recovery programs for salmon conservation and governance (e.g. </w:t>
+      </w:r>
+      <w:r>
+        <w:rPr>
+          <w:i/>
+          <w:iCs/>
+        </w:rPr>
+        <w:t xml:space="preserve">Canada’s Policy for Conservation of Wild Pacific Salmon,</w:t>
+      </w:r>
+      <w:r>
+        <w:t xml:space="preserve"> </w:t>
+      </w:r>
+      <w:r>
+        <w:t xml:space="preserve">the</w:t>
+      </w:r>
+      <w:r>
+        <w:t xml:space="preserve"> </w:t>
+      </w:r>
+      <w:r>
+        <w:rPr>
+          <w:i/>
+          <w:iCs/>
+        </w:rPr>
+        <w:t xml:space="preserve">Pacific Salmon Strategy Initiative</w:t>
+      </w:r>
+      <w:r>
+        <w:t xml:space="preserve">), Pacific salmon populations are generally declining across Canada, while the number of populations monitored continues to drop</w:t>
+      </w:r>
+      <w:r>
+        <w:t xml:space="preserve"> </w:t>
+      </w:r>
+      <w:r>
+        <w:t xml:space="preserve">(Price et al. 2017; Atkinson et al. 2024)</w:t>
+      </w:r>
+      <w:r>
+        <w:t xml:space="preserve">.</w:t>
+      </w:r>
+    </w:p>
+    <w:p>
+      <w:pPr>
+        <w:pStyle w:val="BodyText"/>
+      </w:pPr>
+      <w:r>
+        <w:t xml:space="preserve">The causes of Pacific salmon population declines in Canada are varied and have been the subject of numerous studies and reviews over the last few decades (e.g. the</w:t>
+      </w:r>
+      <w:r>
+        <w:t xml:space="preserve"> </w:t>
+      </w:r>
+      <w:r>
+        <w:rPr>
+          <w:b/>
+          <w:bCs/>
+        </w:rPr>
+        <w:t xml:space="preserve">Cohen Commission 2010, Report of the Standing Committee On Fisheries and Oceans 2021</w:t>
+      </w:r>
+      <w:r>
+        <w:t xml:space="preserve">,</w:t>
+      </w:r>
+      <w:r>
+        <w:t xml:space="preserve">(Grant et al. 2019)</w:t>
+      </w:r>
+      <w:r>
+        <w:t xml:space="preserve">).</w:t>
+      </w:r>
+    </w:p>
+    <w:p>
+      <w:pPr>
+        <w:pStyle w:val="BodyText"/>
+      </w:pPr>
+      <w:r>
+        <w:t xml:space="preserve">Decline in salmon populations are recognized as a consequence of human activity, including the loss or degradation of freshwater habitat</w:t>
+      </w:r>
+      <w:r>
+        <w:t xml:space="preserve"> </w:t>
+      </w:r>
+      <w:r>
+        <w:t xml:space="preserve">(Bisson et al. 2009)</w:t>
+      </w:r>
+      <w:r>
+        <w:t xml:space="preserve">, unsustainable fisheries harvest, and climate change.</w:t>
+      </w:r>
+    </w:p>
+    <w:p>
+      <w:pPr>
+        <w:pStyle w:val="Compact"/>
+        <w:numPr>
+          <w:ilvl w:val="0"/>
+          <w:numId w:val="1001"/>
+        </w:numPr>
+      </w:pPr>
+      <w:r>
+        <w:rPr>
+          <w:b/>
+          <w:bCs/>
+        </w:rPr>
+        <w:t xml:space="preserve">Get references</w:t>
+      </w:r>
+    </w:p>
+    <w:p>
+      <w:pPr>
+        <w:pStyle w:val="FirstParagraph"/>
+      </w:pPr>
+      <w:r>
+        <w:t xml:space="preserve">Commercial fisheries harvests have been substantially curtailed in recent decades in response to wild-origin salmon abundance declines</w:t>
+      </w:r>
+      <w:r>
+        <w:t xml:space="preserve"> </w:t>
+      </w:r>
+      <w:r>
+        <w:t xml:space="preserve">(Del Valle et al. 2024)</w:t>
+      </w:r>
+      <w:r>
+        <w:t xml:space="preserve"> </w:t>
+      </w:r>
+      <w:r>
+        <w:t xml:space="preserve">as Fisheries and Oceans Canada (DFO) aims to manage fisheries to preserve biodiversity in a manner consistent with the</w:t>
+      </w:r>
+      <w:r>
+        <w:t xml:space="preserve"> </w:t>
+      </w:r>
+      <w:r>
+        <w:rPr>
+          <w:i/>
+          <w:iCs/>
+        </w:rPr>
+        <w:t xml:space="preserve">Wild Salmon Policy</w:t>
+      </w:r>
+      <w:r>
+        <w:t xml:space="preserve"> </w:t>
+      </w:r>
+      <w:r>
+        <w:t xml:space="preserve">and the</w:t>
+      </w:r>
+      <w:r>
+        <w:t xml:space="preserve"> </w:t>
+      </w:r>
+      <w:r>
+        <w:rPr>
+          <w:b/>
+          <w:bCs/>
+        </w:rPr>
+        <w:t xml:space="preserve">Precautionary Approach</w:t>
+      </w:r>
+      <w:r>
+        <w:t xml:space="preserve">.</w:t>
+      </w:r>
+    </w:p>
+    <w:p>
+      <w:pPr>
+        <w:pStyle w:val="BodyText"/>
+      </w:pPr>
+      <w:r>
+        <w:rPr>
+          <w:b/>
+          <w:bCs/>
+        </w:rPr>
+        <w:t xml:space="preserve">Fisheries, particularly commercial fisheries, are legislated under the distinct authority of the</w:t>
+      </w:r>
+      <w:r>
+        <w:rPr>
+          <w:b/>
+          <w:bCs/>
+        </w:rPr>
+        <w:t xml:space="preserve"> </w:t>
+      </w:r>
+      <w:r>
+        <w:rPr>
+          <w:b/>
+          <w:bCs/>
+          <w:i/>
+          <w:iCs/>
+        </w:rPr>
+        <w:t xml:space="preserve">Fisheries Act</w:t>
+      </w:r>
+      <w:r>
+        <w:rPr>
+          <w:b/>
+          <w:bCs/>
+        </w:rPr>
+        <w:t xml:space="preserve"> </w:t>
+      </w:r>
+      <w:r>
+        <w:rPr>
+          <w:b/>
+          <w:bCs/>
+        </w:rPr>
+        <w:t xml:space="preserve">where laws and regulations prescribe how, when, and where fisheries harvest may occur within Canadian waters (**need to cite this statement…).</w:t>
+      </w:r>
+    </w:p>
+    <w:p>
+      <w:pPr>
+        <w:pStyle w:val="Compact"/>
+        <w:numPr>
+          <w:ilvl w:val="0"/>
+          <w:numId w:val="1002"/>
+        </w:numPr>
+      </w:pPr>
+      <w:r>
+        <w:rPr>
+          <w:b/>
+          <w:bCs/>
+        </w:rPr>
+        <w:t xml:space="preserve">Is this really true… Fisheries of Pacific salmon…</w:t>
+      </w:r>
+      <w:r>
+        <w:t xml:space="preserve"> </w:t>
+      </w:r>
+      <w:r>
+        <w:t xml:space="preserve">Maybe quote the legislation on this. Quite a definitive statement.</w:t>
+      </w:r>
+    </w:p>
+    <w:p>
+      <w:pPr>
+        <w:pStyle w:val="FirstParagraph"/>
+      </w:pPr>
+      <w:r>
+        <w:rPr>
+          <w:b/>
+          <w:bCs/>
+        </w:rPr>
+        <w:t xml:space="preserve">There is no ambiguity in jurisdiction or responsibility, at least for fisheries intercepting Pacific salmon within Canada, therefore fisheries harvest impacts can be adjusted relatively easily in response to declines or changing abundances.</w:t>
+      </w:r>
+    </w:p>
+    <w:p>
+      <w:pPr>
+        <w:pStyle w:val="BodyText"/>
+      </w:pPr>
+      <w:r>
+        <w:t xml:space="preserve">Fisheries also result in direct mortality to salmon, therefore, impacts can be directly measured and managed using quantifiable targets, assuming adequate monitoring information is collected.</w:t>
+      </w:r>
+    </w:p>
+    <w:p>
+      <w:pPr>
+        <w:pStyle w:val="BodyText"/>
+      </w:pPr>
+      <w:r>
+        <w:t xml:space="preserve">By contrast, threats to salmon habitat require a much more coordinated and inter-jurisdictional approach to evaluate and address. Freshwater habitat, including water quantity (discharge and timing) and water quality (temperature and chemistry), are impacted by actions and conditions throughout the entire watershed. Local activities, such as forestry and urbanisation, act cumulatively and compound with climate changes to degrade salmon watersheds, threatening their ability to sustain salmon abundance and diversity</w:t>
+      </w:r>
+      <w:r>
+        <w:t xml:space="preserve"> </w:t>
+      </w:r>
+      <w:r>
+        <w:t xml:space="preserve">(Moore et al. 2025)</w:t>
+      </w:r>
+      <w:r>
+        <w:t xml:space="preserve">. Impacts from activities are often indirect, requiring monitoring and long-term studies to identify with confidence</w:t>
+      </w:r>
+      <w:r>
+        <w:t xml:space="preserve"> </w:t>
+      </w:r>
+      <w:r>
+        <w:t xml:space="preserve">(Ulaski et al. 2025)</w:t>
+      </w:r>
+      <w:r>
+        <w:t xml:space="preserve">. Regulation of threats to salmon freshwater habitat in British Columbia therefore requires the application of multiple acts and regulations across both federal and provincial jurisdiction, where the impacts from activities and the benefits of mitigation are uncertain and spread out over time and space.</w:t>
+      </w:r>
+    </w:p>
+    <w:p>
+      <w:pPr>
+        <w:pStyle w:val="BodyText"/>
+      </w:pPr>
+      <w:r>
+        <w:t xml:space="preserve">For example, regulation of forestry under the</w:t>
+      </w:r>
+      <w:r>
+        <w:t xml:space="preserve"> </w:t>
+      </w:r>
+      <w:r>
+        <w:rPr>
+          <w:i/>
+          <w:iCs/>
+        </w:rPr>
+        <w:t xml:space="preserve">Forestry Act</w:t>
+      </w:r>
+      <w:r>
+        <w:t xml:space="preserve">, water licensing under the Water Sustainability Act, environmental assessment of a mine under the Environmental Assessment Act, regulation of activities that cause harm to salmon habitat under the</w:t>
+      </w:r>
+      <w:r>
+        <w:t xml:space="preserve"> </w:t>
+      </w:r>
+      <w:r>
+        <w:rPr>
+          <w:i/>
+          <w:iCs/>
+        </w:rPr>
+        <w:t xml:space="preserve">Fisheries Act</w:t>
+      </w:r>
+      <w:r>
+        <w:t xml:space="preserve"> </w:t>
+      </w:r>
+      <w:r>
+        <w:t xml:space="preserve">….</w:t>
+      </w:r>
+    </w:p>
+    <w:p>
+      <w:pPr>
+        <w:pStyle w:val="Compact"/>
+        <w:numPr>
+          <w:ilvl w:val="0"/>
+          <w:numId w:val="1003"/>
+        </w:numPr>
+      </w:pPr>
+      <w:r>
+        <w:rPr>
+          <w:b/>
+          <w:bCs/>
+        </w:rPr>
+        <w:t xml:space="preserve">MW - Minor suggestions. The FFHPP regulates</w:t>
+      </w:r>
+      <w:r>
+        <w:rPr>
+          <w:b/>
+          <w:bCs/>
+        </w:rPr>
+        <w:t xml:space="preserve"> </w:t>
+      </w:r>
+      <w:r>
+        <w:rPr>
+          <w:b/>
+          <w:bCs/>
+        </w:rPr>
+        <w:t xml:space="preserve">“</w:t>
+      </w:r>
+      <w:r>
+        <w:rPr>
+          <w:b/>
+          <w:bCs/>
+        </w:rPr>
+        <w:t xml:space="preserve">Projects Near Water</w:t>
+      </w:r>
+      <w:r>
+        <w:rPr>
+          <w:b/>
+          <w:bCs/>
+        </w:rPr>
+        <w:t xml:space="preserve">”</w:t>
+      </w:r>
+      <w:r>
+        <w:rPr>
+          <w:b/>
+          <w:bCs/>
+        </w:rPr>
+        <w:t xml:space="preserve"> </w:t>
+      </w:r>
+      <w:r>
+        <w:rPr>
+          <w:b/>
+          <w:bCs/>
+        </w:rPr>
+        <w:t xml:space="preserve">based on the prohibition against causing Harmful Alteration, Disruption or Destruction of fish habitat or Death of Fish. Fisheries Officers may work with FFHPP biologist in enforcement when someone contravenes the Fisheries Act. As you know, also under the fisheries Act, is the prohibition on deleterious substances regulated by Environment Canada.</w:t>
+      </w:r>
+    </w:p>
+    <w:p>
+      <w:pPr>
+        <w:pStyle w:val="FirstParagraph"/>
+      </w:pPr>
+      <w:r>
+        <w:t xml:space="preserve">Amidst this uncertainty and complexity, multiple assessment frameworks have been developed to evaluate risks arising from anthropogenic activities and limiting factors for the survival and recovery of Pacific salmon populations [</w:t>
+      </w:r>
+      <w:r>
+        <w:t xml:space="preserve">Chalifour et al. (2022)</w:t>
+      </w:r>
+      <w:r>
+        <w:t xml:space="preserve">;</w:t>
+      </w:r>
+      <w:r>
+        <w:t xml:space="preserve"> </w:t>
+      </w:r>
+      <w:r>
+        <w:t xml:space="preserve">Salafsky et al. (2008)</w:t>
+      </w:r>
+      <w:r>
+        <w:t xml:space="preserve">;</w:t>
+      </w:r>
+      <w:r>
+        <w:t xml:space="preserve"> </w:t>
+      </w:r>
+      <w:r>
+        <w:rPr>
+          <w:b/>
+          <w:bCs/>
+        </w:rPr>
+        <w:t xml:space="preserve">RAMS citation?</w:t>
+      </w:r>
+      <w:r>
+        <w:t xml:space="preserve">]. While varied in their approaches, these frameworks generally aim to be comprehensive in assessing the wide range of threats that may impact Pacific salmon across their life cycle to inform status assessments, recovery planning, and conservation strategies. One of the most widely used risk assessment frameworks for Pacific salmon is the</w:t>
+      </w:r>
+      <w:r>
+        <w:t xml:space="preserve"> </w:t>
+      </w:r>
+      <w:r>
+        <w:rPr>
+          <w:i/>
+          <w:iCs/>
+        </w:rPr>
+        <w:t xml:space="preserve">International Union for Conservation of Nature</w:t>
+      </w:r>
+      <w:r>
+        <w:t xml:space="preserve"> </w:t>
+      </w:r>
+      <w:r>
+        <w:t xml:space="preserve">(IUCN) Direct Threats Classification</w:t>
+      </w:r>
+      <w:r>
+        <w:t xml:space="preserve"> </w:t>
+      </w:r>
+      <w:r>
+        <w:t xml:space="preserve">(Salafsky et al. 2008)</w:t>
+      </w:r>
+      <w:r>
+        <w:t xml:space="preserve">, which is applied for Recovery Potential Assessments as part of</w:t>
+      </w:r>
+      <w:r>
+        <w:t xml:space="preserve"> </w:t>
+      </w:r>
+      <w:r>
+        <w:rPr>
+          <w:i/>
+          <w:iCs/>
+        </w:rPr>
+        <w:t xml:space="preserve">Species at Risk Act</w:t>
+      </w:r>
+      <w:r>
+        <w:t xml:space="preserve"> </w:t>
+      </w:r>
+      <w:r>
+        <w:t xml:space="preserve">listing processes and for COSEWIC status assessments</w:t>
+      </w:r>
+      <w:r>
+        <w:t xml:space="preserve"> </w:t>
+      </w:r>
+      <w:r>
+        <w:t xml:space="preserve">(Arbeider et al. 2020; Dionne 2023; Doutaz et al. 2023)</w:t>
+      </w:r>
+      <w:r>
+        <w:t xml:space="preserve">.</w:t>
+      </w:r>
+    </w:p>
+    <w:p>
+      <w:pPr>
+        <w:pStyle w:val="BodyText"/>
+      </w:pPr>
+      <w:r>
+        <w:t xml:space="preserve">Assuming there is agreement upon the most important threats, risk assessments are intended to guide the development of recovery plans and mitigation actions with the ultimate aim of reversing declines and improving conservation status. A key challenge is identifying actions that are</w:t>
+      </w:r>
+      <w:r>
+        <w:t xml:space="preserve"> </w:t>
+      </w:r>
+      <w:r>
+        <w:rPr>
+          <w:b/>
+          <w:bCs/>
+        </w:rPr>
+        <w:t xml:space="preserve">impactful</w:t>
+      </w:r>
+      <w:r>
+        <w:t xml:space="preserve"> </w:t>
+      </w:r>
+      <w:r>
+        <w:rPr>
+          <w:b/>
+          <w:bCs/>
+        </w:rPr>
+        <w:t xml:space="preserve">(**is that a word?)</w:t>
+      </w:r>
+      <w:r>
+        <w:t xml:space="preserve"> </w:t>
+      </w:r>
+      <w:r>
+        <w:t xml:space="preserve">and feasible across the wide geographic range and diverse life history of Pacific salmon. In many cases, regulatory complexity, ambiguous responsibility, unclear conservation objectives across jurisdictions and dispersed authority become barriers to effective and timely action.</w:t>
+      </w:r>
+    </w:p>
+    <w:p>
+      <w:pPr>
+        <w:pStyle w:val="Compact"/>
+        <w:numPr>
+          <w:ilvl w:val="0"/>
+          <w:numId w:val="1004"/>
+        </w:numPr>
+      </w:pPr>
+      <w:r>
+        <w:rPr>
+          <w:b/>
+          <w:bCs/>
+        </w:rPr>
+        <w:t xml:space="preserve">MW - Option of adding</w:t>
+      </w:r>
+      <w:r>
+        <w:rPr>
+          <w:b/>
+          <w:bCs/>
+        </w:rPr>
+        <w:t xml:space="preserve"> </w:t>
+      </w:r>
+      <w:r>
+        <w:rPr>
+          <w:b/>
+          <w:bCs/>
+        </w:rPr>
+        <w:t xml:space="preserve">“</w:t>
+      </w:r>
+      <w:r>
+        <w:rPr>
+          <w:b/>
+          <w:bCs/>
+        </w:rPr>
+        <w:t xml:space="preserve">unclear standards of management</w:t>
+      </w:r>
+      <w:r>
+        <w:rPr>
+          <w:b/>
+          <w:bCs/>
+        </w:rPr>
+        <w:t xml:space="preserve">”</w:t>
+      </w:r>
+      <w:r>
+        <w:rPr>
+          <w:b/>
+          <w:bCs/>
+        </w:rPr>
+        <w:t xml:space="preserve">, or similar, to the list? Unclear environmental or conservation objectives across jurisdictions maybe.</w:t>
+      </w:r>
+    </w:p>
+    <w:bookmarkEnd w:id="21"/>
+    <w:bookmarkStart w:id="23" w:name="Xf99c42c3166c79d6e14b14d7da12046c07a47b6"/>
+    <w:p>
+      <w:pPr>
+        <w:pStyle w:val="Heading2"/>
+      </w:pPr>
+      <w:r>
+        <w:t xml:space="preserve">Why study salmon legislation: purpose and objectives</w:t>
+      </w:r>
+    </w:p>
+    <w:p>
+      <w:pPr>
+        <w:pStyle w:val="FirstParagraph"/>
+      </w:pPr>
+      <w:r>
+        <w:t xml:space="preserve">The need for collaborative, coordinated action to address Pacific salmon declines is recognized by governments throughout policies, plans, and initiatives (e.g. the WSP,</w:t>
+      </w:r>
+      <w:r>
+        <w:t xml:space="preserve"> </w:t>
+      </w:r>
+      <w:hyperlink r:id="rId22">
+        <w:r>
+          <w:rPr>
+            <w:rStyle w:val="Hyperlink"/>
+          </w:rPr>
+          <w:t xml:space="preserve">the trilateral accord 2024</w:t>
+        </w:r>
+      </w:hyperlink>
+      <w:r>
+        <w:t xml:space="preserve">). Coordinated action requires adequate organizational capacity and systems for implementation to ensure that regulatory controls and mitigation activities address underlying threats to salmon and their habitat. However, linking threats and recovery actions to the relevant regulatory systems can be complex because salmon are often affected by multiple threats that each span across agencies and governmental jurisdiction.</w:t>
+      </w:r>
+    </w:p>
+    <w:p>
+      <w:pPr>
+        <w:pStyle w:val="Compact"/>
+        <w:numPr>
+          <w:ilvl w:val="0"/>
+          <w:numId w:val="1005"/>
+        </w:numPr>
+      </w:pPr>
+      <w:r>
+        <w:rPr>
+          <w:b/>
+          <w:bCs/>
+        </w:rPr>
+        <w:t xml:space="preserve">Add examples of rebuilding plans, OK Chinook, WCVI Chinook, Fish stock provision rebuilding plans (DG)</w:t>
+      </w:r>
+    </w:p>
+    <w:p>
+      <w:pPr>
+        <w:pStyle w:val="FirstParagraph"/>
+      </w:pPr>
+      <w:r>
+        <w:t xml:space="preserve">In this study, we seek to decode the complexity between salmon threats and environmental legislation by creating an interface between regulatory language and anthropogenic threat categories. We describe and apply the Legislation Applicable to Pacific Salmon and their Ecosystems (LAPSE) database, a repository of federal and provincial legislation and regulations that apply to Pacific salmon in British Columbia. Using a novel method for parsing and classifying legislative clauses, we develop keyword relationships between IUCN threats classifications and XXXX clauses from XX acts and XX regulations. By creating an extensive, open-source, and easily accessible database linking legislation to salmon, we aim to facilitate a better understanding of the legislative and regulatory context through which salmon and their ecosystems are governed in British Columbia, while providing a framework to support systematic and critical reviews of strengths and shortcomings of regulations with respect to salmon threats.</w:t>
+      </w:r>
+    </w:p>
+    <w:bookmarkEnd w:id="23"/>
+    <w:bookmarkEnd w:id="24"/>
+    <w:bookmarkStart w:id="30" w:name="X06bc8cf00ca5baea230857c3fdd1788ec12acc8"/>
+    <w:p>
+      <w:pPr>
+        <w:pStyle w:val="Heading1"/>
+      </w:pPr>
+      <w:r>
+        <w:t xml:space="preserve">International Union for Conservation of Nature (IUCN) threat categories</w:t>
+      </w:r>
+    </w:p>
+    <w:p>
+      <w:pPr>
+        <w:pStyle w:val="FirstParagraph"/>
+      </w:pPr>
+      <w:r>
+        <w:t xml:space="preserve">Management decisions and activities related to salmon are often in response to identifiable threats to salmon health and population status. Legislated recovery planning also relies on a description of identified threats</w:t>
+      </w:r>
+      <w:r>
+        <w:t xml:space="preserve"> </w:t>
+      </w:r>
+      <w:r>
+        <w:t xml:space="preserve">(McCune et al. 2013)</w:t>
+      </w:r>
+      <w:r>
+        <w:t xml:space="preserve">. Human systems can be categorized as direct threats to biodiversity more specifically for conservation strategies</w:t>
+      </w:r>
+      <w:r>
+        <w:t xml:space="preserve"> </w:t>
+      </w:r>
+      <w:r>
+        <w:t xml:space="preserve">(Salafsky et al. 2008)</w:t>
+      </w:r>
+      <w:r>
+        <w:t xml:space="preserve">. The</w:t>
+      </w:r>
+      <w:r>
+        <w:t xml:space="preserve"> </w:t>
+      </w:r>
+      <w:r>
+        <w:rPr>
+          <w:i/>
+          <w:iCs/>
+        </w:rPr>
+        <w:t xml:space="preserve">International Union for Conservation of Nature</w:t>
+      </w:r>
+      <w:r>
+        <w:t xml:space="preserve"> </w:t>
+      </w:r>
+      <w:r>
+        <w:t xml:space="preserve">(IUCN) and</w:t>
+      </w:r>
+      <w:r>
+        <w:t xml:space="preserve"> </w:t>
+      </w:r>
+      <w:r>
+        <w:rPr>
+          <w:i/>
+          <w:iCs/>
+        </w:rPr>
+        <w:t xml:space="preserve">Conservation Measures Partnership</w:t>
+      </w:r>
+      <w:r>
+        <w:t xml:space="preserve"> </w:t>
+      </w:r>
+      <w:r>
+        <w:t xml:space="preserve">(CMP) has developed a hierarchical grouping of threats used globally by conservation practitioners. IUCN direct threat categories are widely used to assess threats as part of IUCN red list assessments, as well as, in status assessments for Pacific salmon populations conducted by the</w:t>
+      </w:r>
+      <w:r>
+        <w:t xml:space="preserve"> </w:t>
+      </w:r>
+      <w:r>
+        <w:rPr>
+          <w:i/>
+          <w:iCs/>
+        </w:rPr>
+        <w:t xml:space="preserve">Committee for the Status of Endangered Wildlife in Canada</w:t>
+      </w:r>
+      <w:r>
+        <w:t xml:space="preserve"> </w:t>
+      </w:r>
+      <w:r>
+        <w:t xml:space="preserve">(COSEWIC). For this study, the</w:t>
+      </w:r>
+      <w:r>
+        <w:t xml:space="preserve"> </w:t>
+      </w:r>
+      <w:r>
+        <w:rPr>
+          <w:i/>
+          <w:iCs/>
+        </w:rPr>
+        <w:t xml:space="preserve">IUCN - CMP Direct Threats Classification 4.0</w:t>
+      </w:r>
+      <w:r>
+        <w:t xml:space="preserve"> </w:t>
+      </w:r>
+      <w:r>
+        <w:t xml:space="preserve">(Salafsky et al. 2025)</w:t>
+      </w:r>
+      <w:r>
+        <w:t xml:space="preserve"> </w:t>
+      </w:r>
+      <w:r>
+        <w:t xml:space="preserve">was used to categorize legislation by direct threats to salmon conservation.</w:t>
+      </w:r>
+      <w:r>
+        <w:t xml:space="preserve"> </w:t>
+      </w:r>
+      <w:r>
+        <w:rPr>
+          <w:b/>
+          <w:bCs/>
+        </w:rPr>
+        <w:t xml:space="preserve">Level 2 threat classification</w:t>
+      </w:r>
+      <w:r>
+        <w:t xml:space="preserve"> </w:t>
+      </w:r>
+      <w:r>
+        <w:t xml:space="preserve">was used as the finest resolution that could be applied consistently.</w:t>
+      </w:r>
+    </w:p>
+    <w:p>
+      <w:pPr>
+        <w:pStyle w:val="Compact"/>
+        <w:numPr>
+          <w:ilvl w:val="0"/>
+          <w:numId w:val="1006"/>
+        </w:numPr>
+      </w:pPr>
+      <w:r>
+        <w:rPr>
+          <w:b/>
+          <w:bCs/>
+        </w:rPr>
+        <w:t xml:space="preserve">DG - Not everyone will be familiar with the different threat levels in this framework. Before this sentence, a brief explanation of the threats hierarchy could help the unfamiliar reader. You could point the reader to the original publication of this framework (</w:t>
+      </w:r>
+      <w:hyperlink r:id="rId25">
+        <w:r>
+          <w:rPr>
+            <w:rStyle w:val="Hyperlink"/>
+            <w:b/>
+            <w:bCs/>
+          </w:rPr>
+          <w:t xml:space="preserve">The Society for Conservation Biology</w:t>
+        </w:r>
+      </w:hyperlink>
+      <w:r>
+        <w:rPr>
+          <w:b/>
+          <w:bCs/>
+        </w:rPr>
+        <w:t xml:space="preserve">), and/or summarize some key information from this paper, such as,</w:t>
+      </w:r>
+      <w:r>
+        <w:rPr>
+          <w:b/>
+          <w:bCs/>
+        </w:rPr>
+        <w:t xml:space="preserve"> </w:t>
+      </w:r>
+      <w:r>
+        <w:rPr>
+          <w:b/>
+          <w:bCs/>
+        </w:rPr>
+        <w:t xml:space="preserve">“</w:t>
+      </w:r>
+      <w:r>
+        <w:rPr>
+          <w:b/>
+          <w:bCs/>
+        </w:rPr>
+        <w:t xml:space="preserve">The threat classification hierarchically categorizes threats into three levels. Each level one category (e.g., Agriculture &amp; Aquaculture) is further subdivided into several level two categories (e.g., Annual &amp; Perennial Non-Timber Crops, Marine &amp; Freshwater Aquaculture), and are subsequently into numerous level three and four categories.</w:t>
+      </w:r>
+      <w:r>
+        <w:rPr>
+          <w:b/>
+          <w:bCs/>
+        </w:rPr>
+        <w:t xml:space="preserve">”</w:t>
+      </w:r>
+      <w:r>
+        <w:rPr>
+          <w:b/>
+          <w:bCs/>
+        </w:rPr>
+        <w:t xml:space="preserve"> </w:t>
+      </w:r>
+      <w:r>
+        <w:rPr>
+          <w:b/>
+          <w:bCs/>
+        </w:rPr>
+        <w:t xml:space="preserve">Something like this could help the reader follow the sentence that explains why level two was chosen (consistent application).</w:t>
+      </w:r>
+    </w:p>
+    <w:p>
+      <w:pPr>
+        <w:pStyle w:val="FirstParagraph"/>
+      </w:pPr>
+      <w:r>
+        <w:t xml:space="preserve">Legislative clauses that influence Pacific salmon governance in British Columbia are not always associated with conservation threats. As well, some clauses may involve all threats. For example, statutes that outline species status or determine ecological reserves have relevance to how salmon are managed, but can’t be attributed to any one IUCN threat category. Pacific salmon life history also ranges over a broad geography of marine and freshwater habitat (including terrestrial watershed aspects), touching on almost every conservation threat available. We developed management domain categories through this study as a clearer and more comprehensive alignment between regulatory administrative concern and conservation threat categories (Figure</w:t>
+      </w:r>
+      <w:r>
+        <w:t xml:space="preserve"> </w:t>
+      </w:r>
+      <w:r>
+        <w:t xml:space="preserve">1</w:t>
+      </w:r>
+      <w:r>
+        <w:t xml:space="preserve">).</w:t>
+      </w:r>
+    </w:p>
+    <w:p>
+      <w:pPr>
+        <w:pStyle w:val="CaptionedFigure"/>
+      </w:pPr>
+      <w:r>
+        <w:drawing>
+          <wp:inline>
+            <wp:extent cx="5943600" cy="3343275"/>
+            <wp:effectExtent b="0" l="0" r="0" t="0"/>
+            <wp:docPr descr="Figure 1: Flowchart showing alignment of IUCN Level 2 threat categories with Management Domain in relation to legislation and jurisdiction." title="" id="27" name="Picture"/>
+            <a:graphic>
+              <a:graphicData uri="http://schemas.openxmlformats.org/drawingml/2006/picture">
+                <pic:pic>
+                  <pic:nvPicPr>
+                    <pic:cNvPr descr="../assets/Management%20Domain%20Flowchart.png" id="28" name="Picture"/>
+                    <pic:cNvPicPr>
+                      <a:picLocks noChangeArrowheads="1" noChangeAspect="1"/>
+                    </pic:cNvPicPr>
+                  </pic:nvPicPr>
+                  <pic:blipFill>
+                    <a:blip r:embed="rId26"/>
+                    <a:stretch>
+                      <a:fillRect/>
+                    </a:stretch>
+                  </pic:blipFill>
+                  <pic:spPr bwMode="auto">
+                    <a:xfrm>
+                      <a:off x="0" y="0"/>
+                      <a:ext cx="5943600" cy="3343275"/>
+                    </a:xfrm>
+                    <a:prstGeom prst="rect">
+                      <a:avLst/>
+                    </a:prstGeom>
+                    <a:noFill/>
+                    <a:ln w="9525">
+                      <a:noFill/>
+                      <a:headEnd/>
+                      <a:tailEnd/>
+                    </a:ln>
+                  </pic:spPr>
+                </pic:pic>
+              </a:graphicData>
+            </a:graphic>
+          </wp:inline>
+        </w:drawing>
+      </w:r>
+    </w:p>
+    <w:p>
+      <w:pPr>
+        <w:pStyle w:val="ImageCaption"/>
+      </w:pPr>
+      <w:bookmarkStart w:id="29" w:name="fig:fig-flowchart-image"/>
+      <w:bookmarkEnd w:id="29"/>
+      <w:r>
+        <w:t xml:space="preserve">Figure 1: Flowchart showing alignment of IUCN Level 2 threat categories with Management Domain in relation to legislation and jurisdiction.</w:t>
+      </w:r>
+    </w:p>
+    <w:bookmarkEnd w:id="30"/>
+    <w:bookmarkStart w:id="48" w:name="a-process-for-clause-categorization"/>
+    <w:p>
+      <w:pPr>
+        <w:pStyle w:val="Heading1"/>
+      </w:pPr>
+      <w:r>
+        <w:t xml:space="preserve">A process for clause categorization</w:t>
+      </w:r>
+    </w:p>
+    <w:p>
+      <w:pPr>
+        <w:pStyle w:val="FirstParagraph"/>
+      </w:pPr>
+      <w:r>
+        <w:t xml:space="preserve">Assessment of legislative context is prone to subjective interpretation. The inclusion and exclusion of both the overall acts and the clauses within the acts creates points of assumption and bias. For this exercise we cast as wide a net as possible and created a process that is publicly accessible, automated, and repeatable if legislation changes. The process steps are: accumulate and review legislation (CanLii); parse legislation by clause (paragraph), section, and heading; match management domain and IUCN threat keywords to clauses; assign salmon-specific scope categories; match clause type keywords to clauses.</w:t>
+      </w:r>
+    </w:p>
+    <w:bookmarkStart w:id="40" w:name="legislation-accumulation-and-review"/>
+    <w:p>
+      <w:pPr>
+        <w:pStyle w:val="Heading2"/>
+      </w:pPr>
+      <w:r>
+        <w:t xml:space="preserve">Legislation accumulation and review</w:t>
+      </w:r>
+    </w:p>
+    <w:p>
+      <w:pPr>
+        <w:pStyle w:val="FirstParagraph"/>
+      </w:pPr>
+      <w:r>
         <w:t xml:space="preserve">Administrative concerns specific to natural resource stewardship are also often split between ministries at the federal and provincial level, which can further decentralize responsibility. Figures</w:t>
       </w:r>
       <w:r>
         <w:t xml:space="preserve"> </w:t>
       </w:r>
       <w:r>
-        <w:t xml:space="preserve">1</w:t>
+        <w:t xml:space="preserve">2</w:t>
       </w:r>
       <w:r>
         <w:t xml:space="preserve"> </w:t>
@@ -285,7 +1247,7 @@
         <w:t xml:space="preserve"> </w:t>
       </w:r>
       <w:r>
-        <w:t xml:space="preserve">2</w:t>
+        <w:t xml:space="preserve">3</w:t>
       </w:r>
       <w:r>
         <w:t xml:space="preserve"> </w:t>
@@ -300,10 +1262,7 @@
         <w:t xml:space="preserve">(Canadian Legal Information Institute 2025)</w:t>
       </w:r>
       <w:r>
-        <w:t xml:space="preserve"> </w:t>
-      </w:r>
-      <w:r>
-        <w:t xml:space="preserve">and the ministries referenced from the federal</w:t>
+        <w:t xml:space="preserve">. The ministries were referenced from the federal</w:t>
       </w:r>
       <w:r>
         <w:t xml:space="preserve"> </w:t>
@@ -338,17 +1297,9 @@
         <w:t xml:space="preserve">Acts - Minsters’ Responsibilities</w:t>
       </w:r>
       <w:r>
-        <w:rPr>
-          <w:i/>
-          <w:iCs/>
-        </w:rPr>
-        <w:t xml:space="preserve"> </w:t>
-      </w:r>
-      <w:r>
-        <w:rPr>
-          <w:i/>
-          <w:iCs/>
-        </w:rPr>
+        <w:t xml:space="preserve"> </w:t>
+      </w:r>
+      <w:r>
         <w:t xml:space="preserve">(Province of British Columbia 2025)</w:t>
       </w:r>
       <w:r>
@@ -362,7 +1313,7 @@
         <w:t xml:space="preserve"> </w:t>
       </w:r>
       <w:r>
-        <w:t xml:space="preserve">The ministry and minister names shown may not necessarily represent the current cabinet names, which can be changed arbitrarily by the government of the day. The table represents the minister and ministry names as they are stated in the legislation and corresponding tables, which are less prone to short-term changes.</w:t>
+        <w:t xml:space="preserve">The ministry and minister names shown may not necessarily represent the current cabinet names, which can be changed arbitrarily by the government of the day. The table represents the minister and ministry names as they are stated in the legislation and corresponding minister responsibility tables, which are less prone to short-term changes.</w:t>
       </w:r>
     </w:p>
     <w:p>
@@ -374,18 +1325,18 @@
           <wp:inline>
             <wp:extent cx="5943600" cy="5094514"/>
             <wp:effectExtent b="0" l="0" r="0" t="0"/>
-            <wp:docPr descr="Figure 1: List of Canadian federal acts relevant to Pacific salmon and habitat governance with assigned ministries." title="" id="21" name="Picture"/>
+            <wp:docPr descr="Figure 2: List of Canadian federal acts relevant to Pacific salmon and habitat governance with assigned ministries." title="" id="32" name="Picture"/>
             <a:graphic>
               <a:graphicData uri="http://schemas.openxmlformats.org/drawingml/2006/picture">
                 <pic:pic>
                   <pic:nvPicPr>
-                    <pic:cNvPr descr="LAPSE_primary_publication_files/figure-docx/fig-sankey-federal-1.png" id="22" name="Picture"/>
+                    <pic:cNvPr descr="LAPSE_primary_publication_files/figure-docx/fig-sankey-federal-1.png" id="33" name="Picture"/>
                     <pic:cNvPicPr>
                       <a:picLocks noChangeArrowheads="1" noChangeAspect="1"/>
                     </pic:cNvPicPr>
                   </pic:nvPicPr>
                   <pic:blipFill>
-                    <a:blip r:embed="rId20"/>
+                    <a:blip r:embed="rId31"/>
                     <a:stretch>
                       <a:fillRect/>
                     </a:stretch>
@@ -416,10 +1367,10 @@
       <w:pPr>
         <w:pStyle w:val="ImageCaption"/>
       </w:pPr>
-      <w:bookmarkStart w:id="23" w:name="fig:fig-sankey-federal"/>
-      <w:bookmarkEnd w:id="23"/>
-      <w:r>
-        <w:t xml:space="preserve">Figure 1: List of Canadian federal acts relevant to Pacific salmon and habitat governance with assigned ministries.</w:t>
+      <w:bookmarkStart w:id="34" w:name="fig:fig-sankey-federal"/>
+      <w:bookmarkEnd w:id="34"/>
+      <w:r>
+        <w:t xml:space="preserve">Figure 2: List of Canadian federal acts relevant to Pacific salmon and habitat governance with assigned ministries.</w:t>
       </w:r>
     </w:p>
     <w:p>
@@ -431,18 +1382,18 @@
           <wp:inline>
             <wp:extent cx="5943600" cy="5094514"/>
             <wp:effectExtent b="0" l="0" r="0" t="0"/>
-            <wp:docPr descr="Figure 2: List of British Columbian provincial acts relevant to Pacific salmon and habitat governance with assigned ministries." title="" id="25" name="Picture"/>
+            <wp:docPr descr="Figure 3: List of British Columbian provincial acts relevant to Pacific salmon and habitat governance with assigned ministries." title="" id="36" name="Picture"/>
             <a:graphic>
               <a:graphicData uri="http://schemas.openxmlformats.org/drawingml/2006/picture">
                 <pic:pic>
                   <pic:nvPicPr>
-                    <pic:cNvPr descr="LAPSE_primary_publication_files/figure-docx/fig-sankey-provincial-1.png" id="26" name="Picture"/>
+                    <pic:cNvPr descr="LAPSE_primary_publication_files/figure-docx/fig-sankey-provincial-1.png" id="37" name="Picture"/>
                     <pic:cNvPicPr>
                       <a:picLocks noChangeArrowheads="1" noChangeAspect="1"/>
                     </pic:cNvPicPr>
                   </pic:nvPicPr>
                   <pic:blipFill>
-                    <a:blip r:embed="rId24"/>
+                    <a:blip r:embed="rId35"/>
                     <a:stretch>
                       <a:fillRect/>
                     </a:stretch>
@@ -473,977 +1424,15 @@
       <w:pPr>
         <w:pStyle w:val="ImageCaption"/>
       </w:pPr>
-      <w:bookmarkStart w:id="27" w:name="fig:fig-sankey-provincial"/>
-      <w:bookmarkEnd w:id="27"/>
-      <w:r>
-        <w:t xml:space="preserve">Figure 2: List of British Columbian provincial acts relevant to Pacific salmon and habitat governance with assigned ministries.</w:t>
+      <w:bookmarkStart w:id="38" w:name="fig:fig-sankey-provincial"/>
+      <w:bookmarkEnd w:id="38"/>
+      <w:r>
+        <w:t xml:space="preserve">Figure 3: List of British Columbian provincial acts relevant to Pacific salmon and habitat governance with assigned ministries.</w:t>
       </w:r>
     </w:p>
     <w:p>
       <w:pPr>
         <w:pStyle w:val="BodyText"/>
-      </w:pPr>
-      <w:r>
-        <w:t xml:space="preserve">Acts and regulations in British Columbia might be designed to address one broad category of human activity, but this activity can cover many aspects of salmon management. For example, the provincial</w:t>
-      </w:r>
-      <w:r>
-        <w:t xml:space="preserve"> </w:t>
-      </w:r>
-      <w:r>
-        <w:rPr>
-          <w:i/>
-          <w:iCs/>
-        </w:rPr>
-        <w:t xml:space="preserve">Forest and Range Practices Act</w:t>
-      </w:r>
-      <w:r>
-        <w:t xml:space="preserve"> </w:t>
-      </w:r>
-      <w:r>
-        <w:t xml:space="preserve">is specific to forestry practices and planning, along with cattle ranging, but in terms of salmon threats, these activities impact many aspects including stream hydrology, water temperature, effluent, riparian habitat destruction, watercourse changes from road infrastructure</w:t>
-      </w:r>
-      <w:r>
-        <w:t xml:space="preserve"> </w:t>
-      </w:r>
-      <w:r>
-        <w:t xml:space="preserve">(Ulaski et al. 2025)</w:t>
-      </w:r>
-      <w:r>
-        <w:t xml:space="preserve">, and the spread of invasive species. Projects that influence environmental factors can be subject to both provincial and federal environmental assessments during the planning stages</w:t>
-      </w:r>
-      <w:r>
-        <w:t xml:space="preserve"> </w:t>
-      </w:r>
-      <w:r>
-        <w:t xml:space="preserve">(Becklumb 2013)</w:t>
-      </w:r>
-      <w:r>
-        <w:t xml:space="preserve">. Natural resource legislation and programs often operate on a sector-by-sector and individual resource basis where integrated stewardship relies on scale-appropriate planning and decision making</w:t>
-      </w:r>
-      <w:r>
-        <w:t xml:space="preserve"> </w:t>
-      </w:r>
-      <w:r>
-        <w:t xml:space="preserve">(Ray et al. 2021)</w:t>
-      </w:r>
-      <w:r>
-        <w:t xml:space="preserve">. Provinces generally decide when, or if, to regulate on matters of environmental concern</w:t>
-      </w:r>
-      <w:r>
-        <w:t xml:space="preserve"> </w:t>
-      </w:r>
-      <w:r>
-        <w:t xml:space="preserve">(Campbell and Thomas 2002)</w:t>
-      </w:r>
-      <w:r>
-        <w:t xml:space="preserve">. British Columbia is even more decentralized than other provinces, especially in terms of species at risk legislation, because British Columbia’s relevant provisions are spread over the greatest number of statutes and regulations</w:t>
-      </w:r>
-      <w:r>
-        <w:t xml:space="preserve"> </w:t>
-      </w:r>
-      <w:r>
-        <w:t xml:space="preserve">(Bogetti and Mason 2025)</w:t>
-      </w:r>
-      <w:r>
-        <w:t xml:space="preserve">.</w:t>
-      </w:r>
-    </w:p>
-    <w:bookmarkEnd w:id="28"/>
-    <w:bookmarkStart w:id="29" w:name="X73644377a907dce2b45cf6342b97f459a660bc0"/>
-    <w:p>
-      <w:pPr>
-        <w:pStyle w:val="Heading2"/>
-      </w:pPr>
-      <w:r>
-        <w:t xml:space="preserve">Complexity in addressing Pacific Salmon population declines</w:t>
-      </w:r>
-    </w:p>
-    <w:p>
-      <w:pPr>
-        <w:pStyle w:val="FirstParagraph"/>
-      </w:pPr>
-      <w:r>
-        <w:t xml:space="preserve">Despite considerable attention towards policies and recovery programs for salmon conservation and governance (e.g. </w:t>
-      </w:r>
-      <w:r>
-        <w:rPr>
-          <w:i/>
-          <w:iCs/>
-        </w:rPr>
-        <w:t xml:space="preserve">Canada’s Policy for Conservation of Wild Pacific Salmon,</w:t>
-      </w:r>
-      <w:r>
-        <w:t xml:space="preserve"> </w:t>
-      </w:r>
-      <w:r>
-        <w:t xml:space="preserve">the</w:t>
-      </w:r>
-      <w:r>
-        <w:t xml:space="preserve"> </w:t>
-      </w:r>
-      <w:r>
-        <w:rPr>
-          <w:i/>
-          <w:iCs/>
-        </w:rPr>
-        <w:t xml:space="preserve">Pacific Salmon Strategy Initiative</w:t>
-      </w:r>
-      <w:r>
-        <w:t xml:space="preserve">), Pacific salmon populations are generally declining across Canada, while the number of populations monitored continues to drop</w:t>
-      </w:r>
-      <w:r>
-        <w:t xml:space="preserve"> </w:t>
-      </w:r>
-      <w:r>
-        <w:t xml:space="preserve">(Price et al. 2017; Atkinson et al. 2024)</w:t>
-      </w:r>
-      <w:r>
-        <w:t xml:space="preserve">.</w:t>
-      </w:r>
-    </w:p>
-    <w:p>
-      <w:pPr>
-        <w:pStyle w:val="BodyText"/>
-      </w:pPr>
-      <w:r>
-        <w:t xml:space="preserve">The causes of Pacific salmon population declines in Canada are varied and have been the subject of numerous studies and reviews over the last few decades (e.g. the</w:t>
-      </w:r>
-      <w:r>
-        <w:t xml:space="preserve"> </w:t>
-      </w:r>
-      <w:r>
-        <w:rPr>
-          <w:b/>
-          <w:bCs/>
-        </w:rPr>
-        <w:t xml:space="preserve">Cohen Commission 2010, Report of the Standing Committee On Fisheries and Oceans 2021</w:t>
-      </w:r>
-      <w:r>
-        <w:t xml:space="preserve">,</w:t>
-      </w:r>
-      <w:r>
-        <w:t xml:space="preserve">(Grant et al. 2019)</w:t>
-      </w:r>
-      <w:r>
-        <w:t xml:space="preserve">).</w:t>
-      </w:r>
-    </w:p>
-    <w:p>
-      <w:pPr>
-        <w:pStyle w:val="BodyText"/>
-      </w:pPr>
-      <w:r>
-        <w:t xml:space="preserve">Decline in salmon populations are recognized as a consequence of human activity, including the loss or degradation of freshwater habitat</w:t>
-      </w:r>
-      <w:r>
-        <w:t xml:space="preserve"> </w:t>
-      </w:r>
-      <w:r>
-        <w:t xml:space="preserve">(Bisson et al. 2009)</w:t>
-      </w:r>
-      <w:r>
-        <w:t xml:space="preserve">, unsustainable fisheries harvest, and climate change.</w:t>
-      </w:r>
-    </w:p>
-    <w:p>
-      <w:pPr>
-        <w:pStyle w:val="Compact"/>
-        <w:numPr>
-          <w:ilvl w:val="0"/>
-          <w:numId w:val="1001"/>
-        </w:numPr>
-      </w:pPr>
-      <w:r>
-        <w:rPr>
-          <w:b/>
-          <w:bCs/>
-        </w:rPr>
-        <w:t xml:space="preserve">Get references</w:t>
-      </w:r>
-    </w:p>
-    <w:p>
-      <w:pPr>
-        <w:pStyle w:val="FirstParagraph"/>
-      </w:pPr>
-      <w:r>
-        <w:t xml:space="preserve">Commercial fisheries harvests have been substantially curtailed in recent decades in response to wild-origin salmon abundance declines</w:t>
-      </w:r>
-      <w:r>
-        <w:t xml:space="preserve"> </w:t>
-      </w:r>
-      <w:r>
-        <w:t xml:space="preserve">(Del Valle et al. 2024)</w:t>
-      </w:r>
-      <w:r>
-        <w:t xml:space="preserve"> </w:t>
-      </w:r>
-      <w:r>
-        <w:t xml:space="preserve">as Fisheries and Oceans Canada (DFO) aims to manage fisheries to preserve biodiversity in a manner consistent with the</w:t>
-      </w:r>
-      <w:r>
-        <w:t xml:space="preserve"> </w:t>
-      </w:r>
-      <w:r>
-        <w:rPr>
-          <w:i/>
-          <w:iCs/>
-        </w:rPr>
-        <w:t xml:space="preserve">Wild Salmon Policy</w:t>
-      </w:r>
-      <w:r>
-        <w:t xml:space="preserve"> </w:t>
-      </w:r>
-      <w:r>
-        <w:t xml:space="preserve">and the</w:t>
-      </w:r>
-      <w:r>
-        <w:t xml:space="preserve"> </w:t>
-      </w:r>
-      <w:r>
-        <w:rPr>
-          <w:b/>
-          <w:bCs/>
-        </w:rPr>
-        <w:t xml:space="preserve">Precautionary Approach</w:t>
-      </w:r>
-      <w:r>
-        <w:t xml:space="preserve">.</w:t>
-      </w:r>
-    </w:p>
-    <w:p>
-      <w:pPr>
-        <w:pStyle w:val="BodyText"/>
-      </w:pPr>
-      <w:r>
-        <w:rPr>
-          <w:b/>
-          <w:bCs/>
-        </w:rPr>
-        <w:t xml:space="preserve">Fisheries, particularly commercial fisheries, are legislated under the distinct authority of the</w:t>
-      </w:r>
-      <w:r>
-        <w:rPr>
-          <w:b/>
-          <w:bCs/>
-        </w:rPr>
-        <w:t xml:space="preserve"> </w:t>
-      </w:r>
-      <w:r>
-        <w:rPr>
-          <w:b/>
-          <w:bCs/>
-          <w:i/>
-          <w:iCs/>
-        </w:rPr>
-        <w:t xml:space="preserve">Fisheries Act</w:t>
-      </w:r>
-      <w:r>
-        <w:rPr>
-          <w:b/>
-          <w:bCs/>
-        </w:rPr>
-        <w:t xml:space="preserve"> </w:t>
-      </w:r>
-      <w:r>
-        <w:rPr>
-          <w:b/>
-          <w:bCs/>
-        </w:rPr>
-        <w:t xml:space="preserve">where laws and regulations prescribe how, when, and where fisheries harvest may occur within Canadian waters (**need to cite this statement…).</w:t>
-      </w:r>
-    </w:p>
-    <w:p>
-      <w:pPr>
-        <w:pStyle w:val="Compact"/>
-        <w:numPr>
-          <w:ilvl w:val="0"/>
-          <w:numId w:val="1002"/>
-        </w:numPr>
-      </w:pPr>
-      <w:r>
-        <w:rPr>
-          <w:b/>
-          <w:bCs/>
-        </w:rPr>
-        <w:t xml:space="preserve">Is this really true… Fisheries of Pacific salmon…</w:t>
-      </w:r>
-      <w:r>
-        <w:t xml:space="preserve"> </w:t>
-      </w:r>
-      <w:r>
-        <w:t xml:space="preserve">Maybe quote the legislation on this. Quite a definitive statement.</w:t>
-      </w:r>
-    </w:p>
-    <w:p>
-      <w:pPr>
-        <w:pStyle w:val="FirstParagraph"/>
-      </w:pPr>
-      <w:r>
-        <w:rPr>
-          <w:b/>
-          <w:bCs/>
-        </w:rPr>
-        <w:t xml:space="preserve">There is no ambiguity in jurisdiction or responsibility, at least for fisheries intercepting Pacific salmon within Canada, therefore fisheries harvest impacts can be adjusted relatively easily in response to declines or changing abundances.</w:t>
-      </w:r>
-    </w:p>
-    <w:p>
-      <w:pPr>
-        <w:pStyle w:val="BodyText"/>
-      </w:pPr>
-      <w:r>
-        <w:t xml:space="preserve">Fisheries also result in direct mortality to salmon, therefore, impacts can be directly measured and managed using quantifiable targets, assuming adequate monitoring information is collected.</w:t>
-      </w:r>
-    </w:p>
-    <w:p>
-      <w:pPr>
-        <w:pStyle w:val="BodyText"/>
-      </w:pPr>
-      <w:r>
-        <w:t xml:space="preserve">By contrast, threats to salmon habitat require a much more coordinated and inter-jurisdictional approach to evaluate and address. Freshwater habitat, including water quantity (discharge and timing) and water quality (temperature and chemistry), are impacted by actions and conditions throughout the entire watershed. Local activities, such as forestry and urbanisation, act cumulatively and compound with climate changes to degrade salmon watersheds, threatening their ability to sustain salmon abundance and diversity</w:t>
-      </w:r>
-      <w:r>
-        <w:t xml:space="preserve"> </w:t>
-      </w:r>
-      <w:r>
-        <w:t xml:space="preserve">(Moore et al. 2025)</w:t>
-      </w:r>
-      <w:r>
-        <w:t xml:space="preserve">. Impacts from activities are often indirect, requiring monitoring and long-term studies to identify with confidence</w:t>
-      </w:r>
-      <w:r>
-        <w:t xml:space="preserve"> </w:t>
-      </w:r>
-      <w:r>
-        <w:t xml:space="preserve">(Ulaski et al. 2025)</w:t>
-      </w:r>
-      <w:r>
-        <w:t xml:space="preserve">. Regulation of threats to salmon freshwater habitat in British Columbia therefore requires the application of multiple acts and regulations across both federal and provincial jurisdiction, where the impacts from activities and the benefits of mitigation are uncertain and spread out over time and space.</w:t>
-      </w:r>
-    </w:p>
-    <w:p>
-      <w:pPr>
-        <w:pStyle w:val="BodyText"/>
-      </w:pPr>
-      <w:r>
-        <w:t xml:space="preserve">For example, regulation of forestry under the</w:t>
-      </w:r>
-      <w:r>
-        <w:t xml:space="preserve"> </w:t>
-      </w:r>
-      <w:r>
-        <w:rPr>
-          <w:i/>
-          <w:iCs/>
-        </w:rPr>
-        <w:t xml:space="preserve">Forestry Act</w:t>
-      </w:r>
-      <w:r>
-        <w:t xml:space="preserve">, water licensing under the Water Sustainability Act, environmental assessment of a mine under the Environmental Assessment Act, regulation of activities that cause harm to salmon habitat under the</w:t>
-      </w:r>
-      <w:r>
-        <w:t xml:space="preserve"> </w:t>
-      </w:r>
-      <w:r>
-        <w:rPr>
-          <w:i/>
-          <w:iCs/>
-        </w:rPr>
-        <w:t xml:space="preserve">Fisheries Act</w:t>
-      </w:r>
-      <w:r>
-        <w:t xml:space="preserve"> </w:t>
-      </w:r>
-      <w:r>
-        <w:t xml:space="preserve">….</w:t>
-      </w:r>
-    </w:p>
-    <w:p>
-      <w:pPr>
-        <w:pStyle w:val="Compact"/>
-        <w:numPr>
-          <w:ilvl w:val="0"/>
-          <w:numId w:val="1003"/>
-        </w:numPr>
-      </w:pPr>
-      <w:r>
-        <w:rPr>
-          <w:b/>
-          <w:bCs/>
-        </w:rPr>
-        <w:t xml:space="preserve">MW - Minor suggestions. The FFHPP regulates</w:t>
-      </w:r>
-      <w:r>
-        <w:rPr>
-          <w:b/>
-          <w:bCs/>
-        </w:rPr>
-        <w:t xml:space="preserve"> </w:t>
-      </w:r>
-      <w:r>
-        <w:rPr>
-          <w:b/>
-          <w:bCs/>
-        </w:rPr>
-        <w:t xml:space="preserve">“</w:t>
-      </w:r>
-      <w:r>
-        <w:rPr>
-          <w:b/>
-          <w:bCs/>
-        </w:rPr>
-        <w:t xml:space="preserve">Projects Near Water</w:t>
-      </w:r>
-      <w:r>
-        <w:rPr>
-          <w:b/>
-          <w:bCs/>
-        </w:rPr>
-        <w:t xml:space="preserve">”</w:t>
-      </w:r>
-      <w:r>
-        <w:rPr>
-          <w:b/>
-          <w:bCs/>
-        </w:rPr>
-        <w:t xml:space="preserve"> </w:t>
-      </w:r>
-      <w:r>
-        <w:rPr>
-          <w:b/>
-          <w:bCs/>
-        </w:rPr>
-        <w:t xml:space="preserve">based on the prohibition against causing Harmful Alteration, Disruption or Destruction of fish habitat or Death of Fish. Fisheries Officers may work with FFHPP biologist in enforcement when someone contravenes the Fisheries Act. As you know, also under the fisheries Act, is the prohibition on deleterious substances regulated by Environment Canada.</w:t>
-      </w:r>
-    </w:p>
-    <w:p>
-      <w:pPr>
-        <w:pStyle w:val="FirstParagraph"/>
-      </w:pPr>
-      <w:r>
-        <w:t xml:space="preserve">Amidst this uncertainty and complexity, multiple assessment frameworks have been developed to evaluate risks arising from anthropogenic activities and limiting factors for the survival and recovery of Pacific salmon populations [</w:t>
-      </w:r>
-      <w:r>
-        <w:t xml:space="preserve">Chalifour et al. (2022)</w:t>
-      </w:r>
-      <w:r>
-        <w:t xml:space="preserve">;</w:t>
-      </w:r>
-      <w:r>
-        <w:t xml:space="preserve"> </w:t>
-      </w:r>
-      <w:r>
-        <w:t xml:space="preserve">Salafsky et al. (2008)</w:t>
-      </w:r>
-      <w:r>
-        <w:t xml:space="preserve">;</w:t>
-      </w:r>
-      <w:r>
-        <w:t xml:space="preserve"> </w:t>
-      </w:r>
-      <w:r>
-        <w:rPr>
-          <w:b/>
-          <w:bCs/>
-        </w:rPr>
-        <w:t xml:space="preserve">RAMS citation?</w:t>
-      </w:r>
-      <w:r>
-        <w:t xml:space="preserve">]. While varied in their approaches, these frameworks generally aim to be comprehensive in assessing the wide range of threats that may impact Pacific salmon across their life cycle to inform status assessments, recovery planning, and conservation strategies. One of the most widely used risk assessment frameworks for Pacific salmon is the</w:t>
-      </w:r>
-      <w:r>
-        <w:t xml:space="preserve"> </w:t>
-      </w:r>
-      <w:r>
-        <w:rPr>
-          <w:i/>
-          <w:iCs/>
-        </w:rPr>
-        <w:t xml:space="preserve">International Union for Conservation of Nature</w:t>
-      </w:r>
-      <w:r>
-        <w:t xml:space="preserve"> </w:t>
-      </w:r>
-      <w:r>
-        <w:t xml:space="preserve">(IUCN) Direct Threats Classification</w:t>
-      </w:r>
-      <w:r>
-        <w:t xml:space="preserve"> </w:t>
-      </w:r>
-      <w:r>
-        <w:t xml:space="preserve">(Salafsky et al. 2008)</w:t>
-      </w:r>
-      <w:r>
-        <w:t xml:space="preserve">, which is applied for Recovery Potential Assessments as part of</w:t>
-      </w:r>
-      <w:r>
-        <w:t xml:space="preserve"> </w:t>
-      </w:r>
-      <w:r>
-        <w:rPr>
-          <w:i/>
-          <w:iCs/>
-        </w:rPr>
-        <w:t xml:space="preserve">Species at Risk Act</w:t>
-      </w:r>
-      <w:r>
-        <w:t xml:space="preserve"> </w:t>
-      </w:r>
-      <w:r>
-        <w:t xml:space="preserve">listing processes and for COSEWIC status assessments</w:t>
-      </w:r>
-      <w:r>
-        <w:t xml:space="preserve"> </w:t>
-      </w:r>
-      <w:r>
-        <w:t xml:space="preserve">(Arbeider et al. 2020; Dionne 2023; Doutaz et al. 2023)</w:t>
-      </w:r>
-      <w:r>
-        <w:t xml:space="preserve">.</w:t>
-      </w:r>
-    </w:p>
-    <w:p>
-      <w:pPr>
-        <w:pStyle w:val="BodyText"/>
-      </w:pPr>
-      <w:r>
-        <w:t xml:space="preserve">Assuming there is agreement upon the most important threats, risk assessments are intended to guide the development of recovery plans and mitigation actions with the ultimate aim of reversing declines and improving conservation status. A key challenge is identifying actions that are</w:t>
-      </w:r>
-      <w:r>
-        <w:t xml:space="preserve"> </w:t>
-      </w:r>
-      <w:r>
-        <w:rPr>
-          <w:b/>
-          <w:bCs/>
-        </w:rPr>
-        <w:t xml:space="preserve">impactful</w:t>
-      </w:r>
-      <w:r>
-        <w:t xml:space="preserve"> </w:t>
-      </w:r>
-      <w:r>
-        <w:rPr>
-          <w:b/>
-          <w:bCs/>
-        </w:rPr>
-        <w:t xml:space="preserve">(**is that a word?)</w:t>
-      </w:r>
-      <w:r>
-        <w:t xml:space="preserve"> </w:t>
-      </w:r>
-      <w:r>
-        <w:t xml:space="preserve">and feasible across the wide geographic range and diverse life history of Pacific salmon. In many cases, regulatory complexity, ambiguous responsibility, unclear conservation objectives across jurisdictions and dispersed authority become barriers to effective and timely action.</w:t>
-      </w:r>
-    </w:p>
-    <w:p>
-      <w:pPr>
-        <w:pStyle w:val="Compact"/>
-        <w:numPr>
-          <w:ilvl w:val="0"/>
-          <w:numId w:val="1004"/>
-        </w:numPr>
-      </w:pPr>
-      <w:r>
-        <w:rPr>
-          <w:b/>
-          <w:bCs/>
-        </w:rPr>
-        <w:t xml:space="preserve">MW - Option of adding</w:t>
-      </w:r>
-      <w:r>
-        <w:rPr>
-          <w:b/>
-          <w:bCs/>
-        </w:rPr>
-        <w:t xml:space="preserve"> </w:t>
-      </w:r>
-      <w:r>
-        <w:rPr>
-          <w:b/>
-          <w:bCs/>
-        </w:rPr>
-        <w:t xml:space="preserve">“</w:t>
-      </w:r>
-      <w:r>
-        <w:rPr>
-          <w:b/>
-          <w:bCs/>
-        </w:rPr>
-        <w:t xml:space="preserve">unclear standards of management</w:t>
-      </w:r>
-      <w:r>
-        <w:rPr>
-          <w:b/>
-          <w:bCs/>
-        </w:rPr>
-        <w:t xml:space="preserve">”</w:t>
-      </w:r>
-      <w:r>
-        <w:rPr>
-          <w:b/>
-          <w:bCs/>
-        </w:rPr>
-        <w:t xml:space="preserve">, or similar, to the list? Unclear environmental or conservation objectives across jurisdictions maybe.</w:t>
-      </w:r>
-    </w:p>
-    <w:bookmarkEnd w:id="29"/>
-    <w:bookmarkStart w:id="31" w:name="Xf99c42c3166c79d6e14b14d7da12046c07a47b6"/>
-    <w:p>
-      <w:pPr>
-        <w:pStyle w:val="Heading2"/>
-      </w:pPr>
-      <w:r>
-        <w:t xml:space="preserve">Why study salmon legislation: purpose and objectives</w:t>
-      </w:r>
-    </w:p>
-    <w:p>
-      <w:pPr>
-        <w:pStyle w:val="FirstParagraph"/>
-      </w:pPr>
-      <w:r>
-        <w:t xml:space="preserve">The need for collaborative, coordinated action to address Pacific salmon declines is recognized by governments throughout policies, plans, and initiatives (e.g. the WSP,</w:t>
-      </w:r>
-      <w:r>
-        <w:t xml:space="preserve"> </w:t>
-      </w:r>
-      <w:hyperlink r:id="rId30">
-        <w:r>
-          <w:rPr>
-            <w:rStyle w:val="Hyperlink"/>
-          </w:rPr>
-          <w:t xml:space="preserve">the trilateral accord 2024</w:t>
-        </w:r>
-      </w:hyperlink>
-      <w:r>
-        <w:t xml:space="preserve">). Coordinated action requires adequate organizational capacity and systems for implementation to ensure that regulatory controls and mitigation activities address underlying threats to salmon and their habitat. However, linking threats and recovery actions to the relevant regulatory systems can be complex because salmon are often affected by multiple threats that each span across agencies and governmental jurisdiction.</w:t>
-      </w:r>
-    </w:p>
-    <w:p>
-      <w:pPr>
-        <w:pStyle w:val="Compact"/>
-        <w:numPr>
-          <w:ilvl w:val="0"/>
-          <w:numId w:val="1005"/>
-        </w:numPr>
-      </w:pPr>
-      <w:r>
-        <w:rPr>
-          <w:b/>
-          <w:bCs/>
-        </w:rPr>
-        <w:t xml:space="preserve">Add examples of rebuilding plans, OK Chinook, WCVI Chinook, Fish stock provision rebuilding plans (DG)</w:t>
-      </w:r>
-    </w:p>
-    <w:p>
-      <w:pPr>
-        <w:pStyle w:val="FirstParagraph"/>
-      </w:pPr>
-      <w:r>
-        <w:t xml:space="preserve">In this study, we seek to decode the complexity between salmon threats and environmental legislation by creating an interface between regulatory language and anthropogenic threat categories. We describe and apply the Legislation Applicable to Pacific Salmon and their Ecosystems (LAPSE) database, a repository of federal and provincial legislation and regulations that apply to Pacific salmon in British Columbia. Using a novel method for parsing and classifying legislative clauses, we develop keyword relationships between IUCN threats classifications and XXXX clauses from XX acts and XX regulations. By creating an extensive, open-source, and easily accessible database linking legislation to salmon, we aim to facilitate a better understanding of the legislative and regulatory context through which salmon and their ecosystems are governed in British Columbia, while providing a framework to support systematic and critical reviews of strengths and shortcomings of regulations with respect to salmon threats.</w:t>
-      </w:r>
-    </w:p>
-    <w:bookmarkEnd w:id="31"/>
-    <w:bookmarkEnd w:id="32"/>
-    <w:bookmarkStart w:id="38" w:name="X06bc8cf00ca5baea230857c3fdd1788ec12acc8"/>
-    <w:p>
-      <w:pPr>
-        <w:pStyle w:val="Heading1"/>
-      </w:pPr>
-      <w:r>
-        <w:t xml:space="preserve">International Union for Conservation of Nature (IUCN) threat categories</w:t>
-      </w:r>
-    </w:p>
-    <w:p>
-      <w:pPr>
-        <w:pStyle w:val="FirstParagraph"/>
-      </w:pPr>
-      <w:r>
-        <w:t xml:space="preserve">Management decisions and activities related to salmon are often in response to identifiable threats to salmon health and population status. Legislated recovery planning also relies on a description of identified threats</w:t>
-      </w:r>
-      <w:r>
-        <w:t xml:space="preserve"> </w:t>
-      </w:r>
-      <w:r>
-        <w:t xml:space="preserve">(McCune et al. 2013)</w:t>
-      </w:r>
-      <w:r>
-        <w:t xml:space="preserve">. Human systems can be categorized as direct threats to biodiversity more specifically for conservation strategies</w:t>
-      </w:r>
-      <w:r>
-        <w:t xml:space="preserve"> </w:t>
-      </w:r>
-      <w:r>
-        <w:t xml:space="preserve">(Salafsky et al. 2008)</w:t>
-      </w:r>
-      <w:r>
-        <w:t xml:space="preserve">. The</w:t>
-      </w:r>
-      <w:r>
-        <w:t xml:space="preserve"> </w:t>
-      </w:r>
-      <w:r>
-        <w:rPr>
-          <w:i/>
-          <w:iCs/>
-        </w:rPr>
-        <w:t xml:space="preserve">International Union for Conservation of Nature</w:t>
-      </w:r>
-      <w:r>
-        <w:t xml:space="preserve"> </w:t>
-      </w:r>
-      <w:r>
-        <w:t xml:space="preserve">(IUCN) and</w:t>
-      </w:r>
-      <w:r>
-        <w:t xml:space="preserve"> </w:t>
-      </w:r>
-      <w:r>
-        <w:rPr>
-          <w:i/>
-          <w:iCs/>
-        </w:rPr>
-        <w:t xml:space="preserve">Conservation Measures Partnership</w:t>
-      </w:r>
-      <w:r>
-        <w:t xml:space="preserve"> </w:t>
-      </w:r>
-      <w:r>
-        <w:t xml:space="preserve">(CMP) has developed a hierarchical grouping of threats used globally by conservation practitioners. IUCN direct threat categories are widely used to assess threats as part of IUCN red list assessments, as well as, in status assessments for Pacific salmon populations conducted by the</w:t>
-      </w:r>
-      <w:r>
-        <w:t xml:space="preserve"> </w:t>
-      </w:r>
-      <w:r>
-        <w:rPr>
-          <w:i/>
-          <w:iCs/>
-        </w:rPr>
-        <w:t xml:space="preserve">Committee for the Status of Endangered Wildlife in Canada</w:t>
-      </w:r>
-      <w:r>
-        <w:t xml:space="preserve"> </w:t>
-      </w:r>
-      <w:r>
-        <w:t xml:space="preserve">(COSEWIC). For this study, the</w:t>
-      </w:r>
-      <w:r>
-        <w:t xml:space="preserve"> </w:t>
-      </w:r>
-      <w:r>
-        <w:rPr>
-          <w:i/>
-          <w:iCs/>
-        </w:rPr>
-        <w:t xml:space="preserve">IUCN - CMP Direct Threats Classification 4.0</w:t>
-      </w:r>
-      <w:r>
-        <w:t xml:space="preserve"> </w:t>
-      </w:r>
-      <w:r>
-        <w:t xml:space="preserve">(Salafsky et al. 2025)</w:t>
-      </w:r>
-      <w:r>
-        <w:t xml:space="preserve"> </w:t>
-      </w:r>
-      <w:r>
-        <w:t xml:space="preserve">was used to categorize legislation by direct threats to salmon conservation.</w:t>
-      </w:r>
-      <w:r>
-        <w:t xml:space="preserve"> </w:t>
-      </w:r>
-      <w:r>
-        <w:rPr>
-          <w:b/>
-          <w:bCs/>
-        </w:rPr>
-        <w:t xml:space="preserve">Level 2 threat classification</w:t>
-      </w:r>
-      <w:r>
-        <w:t xml:space="preserve"> </w:t>
-      </w:r>
-      <w:r>
-        <w:t xml:space="preserve">was used as the finest resolution that could be applied consistently.</w:t>
-      </w:r>
-    </w:p>
-    <w:p>
-      <w:pPr>
-        <w:pStyle w:val="Compact"/>
-        <w:numPr>
-          <w:ilvl w:val="0"/>
-          <w:numId w:val="1006"/>
-        </w:numPr>
-      </w:pPr>
-      <w:r>
-        <w:rPr>
-          <w:b/>
-          <w:bCs/>
-        </w:rPr>
-        <w:t xml:space="preserve">DG - Not everyone will be familiar with the different threat levels in this framework. Before this sentence, a brief explanation of the threats hierarchy could help the unfamiliar reader. You could point the reader to the original publication of this framework (</w:t>
-      </w:r>
-      <w:hyperlink r:id="rId33">
-        <w:r>
-          <w:rPr>
-            <w:rStyle w:val="Hyperlink"/>
-            <w:b/>
-            <w:bCs/>
-          </w:rPr>
-          <w:t xml:space="preserve">The Society for Conservation Biology</w:t>
-        </w:r>
-      </w:hyperlink>
-      <w:r>
-        <w:rPr>
-          <w:b/>
-          <w:bCs/>
-        </w:rPr>
-        <w:t xml:space="preserve">), and/or summarize some key information from this paper, such as,</w:t>
-      </w:r>
-      <w:r>
-        <w:rPr>
-          <w:b/>
-          <w:bCs/>
-        </w:rPr>
-        <w:t xml:space="preserve"> </w:t>
-      </w:r>
-      <w:r>
-        <w:rPr>
-          <w:b/>
-          <w:bCs/>
-        </w:rPr>
-        <w:t xml:space="preserve">“</w:t>
-      </w:r>
-      <w:r>
-        <w:rPr>
-          <w:b/>
-          <w:bCs/>
-        </w:rPr>
-        <w:t xml:space="preserve">The threat classification hierarchically categorizes threats into three levels. Each level one category (e.g., Agriculture &amp; Aquaculture) is further subdivided into several level two categories (e.g., Annual &amp; Perennial Non-Timber Crops, Marine &amp; Freshwater Aquaculture), and are subsequently into numerous level three and four categories.</w:t>
-      </w:r>
-      <w:r>
-        <w:rPr>
-          <w:b/>
-          <w:bCs/>
-        </w:rPr>
-        <w:t xml:space="preserve">”</w:t>
-      </w:r>
-      <w:r>
-        <w:rPr>
-          <w:b/>
-          <w:bCs/>
-        </w:rPr>
-        <w:t xml:space="preserve"> </w:t>
-      </w:r>
-      <w:r>
-        <w:rPr>
-          <w:b/>
-          <w:bCs/>
-        </w:rPr>
-        <w:t xml:space="preserve">Something like this could help the reader follow the sentence that explains why level two was chosen (consistent application).</w:t>
-      </w:r>
-    </w:p>
-    <w:p>
-      <w:pPr>
-        <w:pStyle w:val="FirstParagraph"/>
-      </w:pPr>
-      <w:r>
-        <w:t xml:space="preserve">Legislative clauses that influence Pacific salmon governance in British Columbia are not always associated with conservation threats. As well, some clauses may involve all threats. For example, statutes that outline species status or determine ecological reserves have relevance to how salmon are managed, but can’t be attributed to any one IUCN threat category. Pacific salmon life history also ranges over a broad geography of marine and freshwater habitat (including terrestrial watershed aspects), touching on almost every conservation threat available. We developed management domain categories through this study as a clearer and more comprehensive alignment between regulatory administrative concern and conservation threat categories (Figure</w:t>
-      </w:r>
-      <w:r>
-        <w:t xml:space="preserve"> </w:t>
-      </w:r>
-      <w:r>
-        <w:t xml:space="preserve">3</w:t>
-      </w:r>
-      <w:r>
-        <w:t xml:space="preserve">).</w:t>
-      </w:r>
-    </w:p>
-    <w:p>
-      <w:pPr>
-        <w:pStyle w:val="CaptionedFigure"/>
-      </w:pPr>
-      <w:r>
-        <w:drawing>
-          <wp:inline>
-            <wp:extent cx="5943600" cy="3343275"/>
-            <wp:effectExtent b="0" l="0" r="0" t="0"/>
-            <wp:docPr descr="Figure 3: Flowchart showing alignment of IUCN Level 2 threat categories with Management Domain in relation to legislation and jurisdiction." title="" id="35" name="Picture"/>
-            <a:graphic>
-              <a:graphicData uri="http://schemas.openxmlformats.org/drawingml/2006/picture">
-                <pic:pic>
-                  <pic:nvPicPr>
-                    <pic:cNvPr descr="../assets/Management%20Domain%20Flowchart.png" id="36" name="Picture"/>
-                    <pic:cNvPicPr>
-                      <a:picLocks noChangeArrowheads="1" noChangeAspect="1"/>
-                    </pic:cNvPicPr>
-                  </pic:nvPicPr>
-                  <pic:blipFill>
-                    <a:blip r:embed="rId34"/>
-                    <a:stretch>
-                      <a:fillRect/>
-                    </a:stretch>
-                  </pic:blipFill>
-                  <pic:spPr bwMode="auto">
-                    <a:xfrm>
-                      <a:off x="0" y="0"/>
-                      <a:ext cx="5943600" cy="3343275"/>
-                    </a:xfrm>
-                    <a:prstGeom prst="rect">
-                      <a:avLst/>
-                    </a:prstGeom>
-                    <a:noFill/>
-                    <a:ln w="9525">
-                      <a:noFill/>
-                      <a:headEnd/>
-                      <a:tailEnd/>
-                    </a:ln>
-                  </pic:spPr>
-                </pic:pic>
-              </a:graphicData>
-            </a:graphic>
-          </wp:inline>
-        </w:drawing>
-      </w:r>
-    </w:p>
-    <w:p>
-      <w:pPr>
-        <w:pStyle w:val="ImageCaption"/>
-      </w:pPr>
-      <w:bookmarkStart w:id="37" w:name="fig:fig-flowchart-image"/>
-      <w:bookmarkEnd w:id="37"/>
-      <w:r>
-        <w:t xml:space="preserve">Figure 3: Flowchart showing alignment of IUCN Level 2 threat categories with Management Domain in relation to legislation and jurisdiction.</w:t>
-      </w:r>
-    </w:p>
-    <w:bookmarkEnd w:id="38"/>
-    <w:bookmarkStart w:id="48" w:name="a-process-for-clause-categorization"/>
-    <w:p>
-      <w:pPr>
-        <w:pStyle w:val="Heading1"/>
-      </w:pPr>
-      <w:r>
-        <w:t xml:space="preserve">A process for clause categorization</w:t>
-      </w:r>
-    </w:p>
-    <w:p>
-      <w:pPr>
-        <w:pStyle w:val="FirstParagraph"/>
-      </w:pPr>
-      <w:r>
-        <w:t xml:space="preserve">Assessment of legislative context is prone to subjective interpretation. The inclusion and exclusion of both the overall acts and the clauses within the acts creates points of assumption and bias. For this exercise we cast as wide a net as possible and created a process that is publicly accessible, automated, and repeatable if legislation changes. The process steps are: accumulate and review legislation (CanLii); parse legislation by clause (paragraph), section, and heading; match management domain and IUCN threat keywords to clauses; assign salmon-specific scope categories; match clause type keywords to clauses.</w:t>
-      </w:r>
-    </w:p>
-    <w:bookmarkStart w:id="40" w:name="legislation-accumulation-and-review"/>
-    <w:p>
-      <w:pPr>
-        <w:pStyle w:val="Heading2"/>
-      </w:pPr>
-      <w:r>
-        <w:t xml:space="preserve">Legislation accumulation and review</w:t>
-      </w:r>
-    </w:p>
-    <w:p>
-      <w:pPr>
-        <w:pStyle w:val="FirstParagraph"/>
       </w:pPr>
       <w:r>
         <w:t xml:space="preserve">We accumulated Canadian federal and British Columbian provincial legislation according to their relevance to salmon and habitat management. For this study, the term legislation refers to acts, regulations, codes, and orders. Policies are formal statements about how the government of the day plans to execute the legislative requirements</w:t>

</xml_diff>

<commit_message>
Reran code after revising keywords
</commit_message>
<xml_diff>
--- a/reports/LAPSE_primary_publication.docx
+++ b/reports/LAPSE_primary_publication.docx
@@ -564,25 +564,7 @@
         <w:pStyle w:val="FirstParagraph"/>
       </w:pPr>
       <w:r>
-        <w:t xml:space="preserve">Threats to salmon habitat require a much more coordinated and inter-jurisdictional approach to evaluate and address. Freshwater habitat, including water quantity (discharge and timing) and water quality (temperature and chemistry), are impacted by actions and conditions throughout the entire watershed. Local activities, such as forestry and urbanisation, act cumulatively and compound with climate changes to degrade salmon watersheds, threatening their ability to sustain salmon abundance and diversity</w:t>
-      </w:r>
-      <w:r>
-        <w:t xml:space="preserve"> </w:t>
-      </w:r>
-      <w:r>
-        <w:t xml:space="preserve">(Moore et al. 2025)</w:t>
-      </w:r>
-      <w:r>
-        <w:t xml:space="preserve">. Impacts from activities are often indirect, requiring monitoring and long-term studies to identify with confidence</w:t>
-      </w:r>
-      <w:r>
-        <w:t xml:space="preserve"> </w:t>
-      </w:r>
-      <w:r>
-        <w:t xml:space="preserve">(Ulaski et al. 2025)</w:t>
-      </w:r>
-      <w:r>
-        <w:t xml:space="preserve">. Regulation of threats to salmon freshwater habitat in British Columbia therefore requires the application of multiple acts and regulations across both federal and provincial jurisdiction, where the impacts from activities and the benefits of mitigation are uncertain and spread out over time and space.</w:t>
+        <w:t xml:space="preserve">Threats to salmon habitat require a much more coordinated and inter-jurisdictional approach to evaluate and address. Freshwater habitat, including water quantity (discharge and timing) and water quality (temperature and chemistry), are impacted by actions and conditions throughout the entire watershed.</w:t>
       </w:r>
     </w:p>
     <w:p>
@@ -590,7 +572,49 @@
         <w:pStyle w:val="BodyText"/>
       </w:pPr>
       <w:r>
-        <w:t xml:space="preserve">For example, regulation of forestry under the</w:t>
+        <w:t xml:space="preserve">Local activities, such as forestry and urbanization, act cumulatively and compound with climate changes to degrade salmon watersheds, threatening their ability to sustain salmon abundance and diversity</w:t>
+      </w:r>
+      <w:r>
+        <w:t xml:space="preserve"> </w:t>
+      </w:r>
+      <w:r>
+        <w:t xml:space="preserve">(Moore et al. 2025)</w:t>
+      </w:r>
+      <w:r>
+        <w:t xml:space="preserve">.</w:t>
+      </w:r>
+    </w:p>
+    <w:p>
+      <w:pPr>
+        <w:pStyle w:val="BodyText"/>
+      </w:pPr>
+      <w:r>
+        <w:t xml:space="preserve">Impacts from activities are often indirect, requiring monitoring and long-term studies to identify with confidence</w:t>
+      </w:r>
+      <w:r>
+        <w:t xml:space="preserve"> </w:t>
+      </w:r>
+      <w:r>
+        <w:t xml:space="preserve">(Ulaski et al. 2025)</w:t>
+      </w:r>
+      <w:r>
+        <w:t xml:space="preserve">.</w:t>
+      </w:r>
+    </w:p>
+    <w:p>
+      <w:pPr>
+        <w:pStyle w:val="BodyText"/>
+      </w:pPr>
+      <w:r>
+        <w:t xml:space="preserve">Regulation of threats to salmon freshwater habitat in British Columbia therefore requires the application of multiple acts and regulations across both federal and provincial jurisdiction, where the impacts from activities and the benefits of mitigation are uncertain and spread out over time and space.</w:t>
+      </w:r>
+    </w:p>
+    <w:p>
+      <w:pPr>
+        <w:pStyle w:val="BodyText"/>
+      </w:pPr>
+      <w:r>
+        <w:t xml:space="preserve">For example, regulation of forestry practices under the</w:t>
       </w:r>
       <w:r>
         <w:t xml:space="preserve"> </w:t>
@@ -600,10 +624,36 @@
           <w:i/>
           <w:iCs/>
         </w:rPr>
-        <w:t xml:space="preserve">Forestry Act</w:t>
-      </w:r>
-      <w:r>
-        <w:t xml:space="preserve">, water licensing under the Water Sustainability Act, environmental assessment of a mine under the Environmental Assessment Act, regulation of activities that cause harm to salmon habitat under the</w:t>
+        <w:t xml:space="preserve">Forest and Range Practices Act</w:t>
+      </w:r>
+      <w:r>
+        <w:t xml:space="preserve">, water licensing under the</w:t>
+      </w:r>
+      <w:r>
+        <w:t xml:space="preserve"> </w:t>
+      </w:r>
+      <w:r>
+        <w:rPr>
+          <w:i/>
+          <w:iCs/>
+        </w:rPr>
+        <w:t xml:space="preserve">Water Sustainability Act</w:t>
+      </w:r>
+      <w:r>
+        <w:t xml:space="preserve">, environmental assessment of a mine under the</w:t>
+      </w:r>
+      <w:r>
+        <w:t xml:space="preserve"> </w:t>
+      </w:r>
+      <w:r>
+        <w:rPr>
+          <w:i/>
+          <w:iCs/>
+        </w:rPr>
+        <w:t xml:space="preserve">Environmental Assessment Act</w:t>
+      </w:r>
+      <w:r>
+        <w:t xml:space="preserve">, regulation of activities that cause harm to salmon habitat under the</w:t>
       </w:r>
       <w:r>
         <w:t xml:space="preserve"> </w:t>
@@ -713,7 +763,7 @@
         <w:t xml:space="preserve">RAMS citation?</w:t>
       </w:r>
       <w:r>
-        <w:t xml:space="preserve">]. While varied in their approaches, these frameworks generally aim to be comprehensive in assessing the wide range of threats that may impact Pacific salmon across their life cycle to inform status assessments, recovery planning, and conservation strategies. One of the most widely used risk assessment frameworks for Pacific salmon is the</w:t>
+        <w:t xml:space="preserve">]. While varied in their approaches, these frameworks generally aim to be comprehensive in assessing the wide range of concerns that may impact Pacific salmon across their life cycle to inform status assessments, recovery planning, and conservation strategies. One of the most widely used risk assessment frameworks for Pacific salmon is the</w:t>
       </w:r>
       <w:r>
         <w:t xml:space="preserve"> </w:t>
@@ -729,7 +779,17 @@
         <w:t xml:space="preserve"> </w:t>
       </w:r>
       <w:r>
-        <w:t xml:space="preserve">(IUCN) Direct Threats Classification</w:t>
+        <w:t xml:space="preserve">(IUCN)</w:t>
+      </w:r>
+      <w:r>
+        <w:t xml:space="preserve"> </w:t>
+      </w:r>
+      <w:r>
+        <w:rPr>
+          <w:i/>
+          <w:iCs/>
+        </w:rPr>
+        <w:t xml:space="preserve">Direct Threats Classification</w:t>
       </w:r>
       <w:r>
         <w:t xml:space="preserve"> </w:t>
@@ -754,7 +814,23 @@
         <w:t xml:space="preserve"> </w:t>
       </w:r>
       <w:r>
-        <w:t xml:space="preserve">listing processes and for COSEWIC status assessments</w:t>
+        <w:t xml:space="preserve">listing processes and for</w:t>
+      </w:r>
+      <w:r>
+        <w:t xml:space="preserve"> </w:t>
+      </w:r>
+      <w:r>
+        <w:rPr>
+          <w:b/>
+          <w:bCs/>
+        </w:rPr>
+        <w:t xml:space="preserve">COSEWIC</w:t>
+      </w:r>
+      <w:r>
+        <w:t xml:space="preserve"> </w:t>
+      </w:r>
+      <w:r>
+        <w:t xml:space="preserve">status assessments</w:t>
       </w:r>
       <w:r>
         <w:t xml:space="preserve"> </w:t>
@@ -4979,7 +5055,7 @@
                 <w:szCs w:val="22"/>
                 <w:color w:val="000000"/>
               </w:rPr>
-              <w:t xml:space="preserve">133</w:t>
+              <w:t xml:space="preserve">97</w:t>
             </w:r>
           </w:p>
         </w:tc>
@@ -5033,7 +5109,7 @@
                 <w:szCs w:val="22"/>
                 <w:color w:val="000000"/>
               </w:rPr>
-              <w:t xml:space="preserve">1,778</w:t>
+              <w:t xml:space="preserve">864</w:t>
             </w:r>
           </w:p>
         </w:tc>
@@ -5087,7 +5163,7 @@
                 <w:szCs w:val="22"/>
                 <w:color w:val="000000"/>
               </w:rPr>
-              <w:t xml:space="preserve">4,004</w:t>
+              <w:t xml:space="preserve">1,585</w:t>
             </w:r>
           </w:p>
         </w:tc>
@@ -7253,7 +7329,7 @@
                 <w:szCs w:val="22"/>
                 <w:color w:val="000000"/>
               </w:rPr>
-              <w:t xml:space="preserve">9,468</w:t>
+              <w:t xml:space="preserve">8,554</w:t>
             </w:r>
           </w:p>
         </w:tc>
@@ -7307,7 +7383,7 @@
                 <w:szCs w:val="22"/>
                 <w:color w:val="000000"/>
               </w:rPr>
-              <w:t xml:space="preserve">32,378</w:t>
+              <w:t xml:space="preserve">29,959</w:t>
             </w:r>
           </w:p>
         </w:tc>
@@ -8884,7 +8960,7 @@
                 <w:szCs w:val="22"/>
                 <w:color w:val="000000"/>
               </w:rPr>
-              <w:t xml:space="preserve">183</w:t>
+              <w:t xml:space="preserve">180</w:t>
             </w:r>
           </w:p>
         </w:tc>
@@ -8938,7 +9014,7 @@
                 <w:szCs w:val="22"/>
                 <w:color w:val="000000"/>
               </w:rPr>
-              <w:t xml:space="preserve">3,257</w:t>
+              <w:t xml:space="preserve">2,622</w:t>
             </w:r>
           </w:p>
         </w:tc>
@@ -8992,7 +9068,7 @@
                 <w:szCs w:val="22"/>
                 <w:color w:val="000000"/>
               </w:rPr>
-              <w:t xml:space="preserve">11,364</w:t>
+              <w:t xml:space="preserve">9,192</w:t>
             </w:r>
           </w:p>
         </w:tc>
@@ -9160,7 +9236,7 @@
                 <w:szCs w:val="22"/>
                 <w:color w:val="000000"/>
               </w:rPr>
-              <w:t xml:space="preserve">7,718</w:t>
+              <w:t xml:space="preserve">7,083</w:t>
             </w:r>
           </w:p>
         </w:tc>
@@ -9214,7 +9290,7 @@
                 <w:szCs w:val="22"/>
                 <w:color w:val="000000"/>
               </w:rPr>
-              <w:t xml:space="preserve">30,839</w:t>
+              <w:t xml:space="preserve">28,667</w:t>
             </w:r>
           </w:p>
         </w:tc>
@@ -10971,7 +11047,7 @@
                 <w:szCs w:val="18"/>
                 <w:color w:val="000000"/>
               </w:rPr>
-              <w:t xml:space="preserve">Governance Administration</w:t>
+              <w:t xml:space="preserve">Water Use and Watercourse Modifications</w:t>
             </w:r>
           </w:p>
         </w:tc>
@@ -11025,7 +11101,7 @@
                 <w:szCs w:val="18"/>
                 <w:color w:val="000000"/>
               </w:rPr>
-              <w:t xml:space="preserve">213</w:t>
+              <w:t xml:space="preserve">125</w:t>
             </w:r>
           </w:p>
         </w:tc>
@@ -11079,7 +11155,7 @@
                 <w:szCs w:val="18"/>
                 <w:color w:val="000000"/>
               </w:rPr>
-              <w:t xml:space="preserve">865</w:t>
+              <w:t xml:space="preserve">353</w:t>
             </w:r>
           </w:p>
         </w:tc>
@@ -11133,7 +11209,7 @@
                 <w:szCs w:val="18"/>
                 <w:color w:val="000000"/>
               </w:rPr>
-              <w:t xml:space="preserve">562</w:t>
+              <w:t xml:space="preserve">355</w:t>
             </w:r>
           </w:p>
         </w:tc>
@@ -11187,7 +11263,7 @@
                 <w:szCs w:val="18"/>
                 <w:color w:val="000000"/>
               </w:rPr>
-              <w:t xml:space="preserve">541</w:t>
+              <w:t xml:space="preserve">339</w:t>
             </w:r>
           </w:p>
         </w:tc>
@@ -11241,7 +11317,7 @@
                 <w:szCs w:val="18"/>
                 <w:color w:val="000000"/>
               </w:rPr>
-              <w:t xml:space="preserve">488</w:t>
+              <w:t xml:space="preserve">349</w:t>
             </w:r>
           </w:p>
         </w:tc>
@@ -11295,7 +11371,7 @@
                 <w:szCs w:val="18"/>
                 <w:color w:val="000000"/>
               </w:rPr>
-              <w:t xml:space="preserve">465</w:t>
+              <w:t xml:space="preserve">255</w:t>
             </w:r>
           </w:p>
         </w:tc>
@@ -11349,7 +11425,7 @@
                 <w:szCs w:val="18"/>
                 <w:color w:val="000000"/>
               </w:rPr>
-              <w:t xml:space="preserve">227</w:t>
+              <w:t xml:space="preserve">178</w:t>
             </w:r>
           </w:p>
         </w:tc>
@@ -11403,7 +11479,7 @@
                 <w:szCs w:val="18"/>
                 <w:color w:val="000000"/>
               </w:rPr>
-              <w:t xml:space="preserve">3,361</w:t>
+              <w:t xml:space="preserve">1,954</w:t>
             </w:r>
           </w:p>
         </w:tc>
@@ -11463,7 +11539,7 @@
                 <w:szCs w:val="18"/>
                 <w:color w:val="000000"/>
               </w:rPr>
-              <w:t xml:space="preserve">Water Use and Watercourse Modifications</w:t>
+              <w:t xml:space="preserve">Fisheries</w:t>
             </w:r>
           </w:p>
         </w:tc>
@@ -11517,7 +11593,7 @@
                 <w:szCs w:val="18"/>
                 <w:color w:val="000000"/>
               </w:rPr>
-              <w:t xml:space="preserve">125</w:t>
+              <w:t xml:space="preserve">91</w:t>
             </w:r>
           </w:p>
         </w:tc>
@@ -11571,7 +11647,7 @@
                 <w:szCs w:val="18"/>
                 <w:color w:val="000000"/>
               </w:rPr>
-              <w:t xml:space="preserve">353</w:t>
+              <w:t xml:space="preserve">297</w:t>
             </w:r>
           </w:p>
         </w:tc>
@@ -11625,7 +11701,7 @@
                 <w:szCs w:val="18"/>
                 <w:color w:val="000000"/>
               </w:rPr>
-              <w:t xml:space="preserve">355</w:t>
+              <w:t xml:space="preserve">187</w:t>
             </w:r>
           </w:p>
         </w:tc>
@@ -11679,7 +11755,7 @@
                 <w:szCs w:val="18"/>
                 <w:color w:val="000000"/>
               </w:rPr>
-              <w:t xml:space="preserve">339</w:t>
+              <w:t xml:space="preserve">292</w:t>
             </w:r>
           </w:p>
         </w:tc>
@@ -11733,7 +11809,7 @@
                 <w:szCs w:val="18"/>
                 <w:color w:val="000000"/>
               </w:rPr>
-              <w:t xml:space="preserve">349</w:t>
+              <w:t xml:space="preserve">196</w:t>
             </w:r>
           </w:p>
         </w:tc>
@@ -11787,7 +11863,7 @@
                 <w:szCs w:val="18"/>
                 <w:color w:val="000000"/>
               </w:rPr>
-              <w:t xml:space="preserve">255</w:t>
+              <w:t xml:space="preserve">334</w:t>
             </w:r>
           </w:p>
         </w:tc>
@@ -11841,7 +11917,7 @@
                 <w:szCs w:val="18"/>
                 <w:color w:val="000000"/>
               </w:rPr>
-              <w:t xml:space="preserve">178</w:t>
+              <w:t xml:space="preserve">288</w:t>
             </w:r>
           </w:p>
         </w:tc>
@@ -11895,7 +11971,7 @@
                 <w:szCs w:val="18"/>
                 <w:color w:val="000000"/>
               </w:rPr>
-              <w:t xml:space="preserve">1,954</w:t>
+              <w:t xml:space="preserve">1,685</w:t>
             </w:r>
           </w:p>
         </w:tc>
@@ -11955,7 +12031,7 @@
                 <w:szCs w:val="18"/>
                 <w:color w:val="000000"/>
               </w:rPr>
-              <w:t xml:space="preserve">Fisheries</w:t>
+              <w:t xml:space="preserve">Governance Administration</w:t>
             </w:r>
           </w:p>
         </w:tc>
@@ -12009,7 +12085,7 @@
                 <w:szCs w:val="18"/>
                 <w:color w:val="000000"/>
               </w:rPr>
-              <w:t xml:space="preserve">91</w:t>
+              <w:t xml:space="preserve">97</w:t>
             </w:r>
           </w:p>
         </w:tc>
@@ -12063,7 +12139,7 @@
                 <w:szCs w:val="18"/>
                 <w:color w:val="000000"/>
               </w:rPr>
-              <w:t xml:space="preserve">297</w:t>
+              <w:t xml:space="preserve">498</w:t>
             </w:r>
           </w:p>
         </w:tc>
@@ -12117,7 +12193,7 @@
                 <w:szCs w:val="18"/>
                 <w:color w:val="000000"/>
               </w:rPr>
-              <w:t xml:space="preserve">187</w:t>
+              <w:t xml:space="preserve">250</w:t>
             </w:r>
           </w:p>
         </w:tc>
@@ -12171,7 +12247,7 @@
                 <w:szCs w:val="18"/>
                 <w:color w:val="000000"/>
               </w:rPr>
-              <w:t xml:space="preserve">292</w:t>
+              <w:t xml:space="preserve">224</w:t>
             </w:r>
           </w:p>
         </w:tc>
@@ -12225,7 +12301,7 @@
                 <w:szCs w:val="18"/>
                 <w:color w:val="000000"/>
               </w:rPr>
-              <w:t xml:space="preserve">196</w:t>
+              <w:t xml:space="preserve">190</w:t>
             </w:r>
           </w:p>
         </w:tc>
@@ -12279,7 +12355,7 @@
                 <w:szCs w:val="18"/>
                 <w:color w:val="000000"/>
               </w:rPr>
-              <w:t xml:space="preserve">334</w:t>
+              <w:t xml:space="preserve">135</w:t>
             </w:r>
           </w:p>
         </w:tc>
@@ -12333,7 +12409,7 @@
                 <w:szCs w:val="18"/>
                 <w:color w:val="000000"/>
               </w:rPr>
-              <w:t xml:space="preserve">288</w:t>
+              <w:t xml:space="preserve">123</w:t>
             </w:r>
           </w:p>
         </w:tc>
@@ -12387,7 +12463,7 @@
                 <w:szCs w:val="18"/>
                 <w:color w:val="000000"/>
               </w:rPr>
-              <w:t xml:space="preserve">1,685</w:t>
+              <w:t xml:space="preserve">1,517</w:t>
             </w:r>
           </w:p>
         </w:tc>
@@ -17421,7 +17497,7 @@
                 <w:szCs w:val="18"/>
                 <w:color w:val="000000"/>
               </w:rPr>
-              <w:t xml:space="preserve">1,239</w:t>
+              <w:t xml:space="preserve">1,123</w:t>
             </w:r>
           </w:p>
         </w:tc>
@@ -17475,7 +17551,7 @@
                 <w:szCs w:val="18"/>
                 <w:color w:val="000000"/>
               </w:rPr>
-              <w:t xml:space="preserve">3,609</w:t>
+              <w:t xml:space="preserve">3,242</w:t>
             </w:r>
           </w:p>
         </w:tc>
@@ -17529,7 +17605,7 @@
                 <w:szCs w:val="18"/>
                 <w:color w:val="000000"/>
               </w:rPr>
-              <w:t xml:space="preserve">3,227</w:t>
+              <w:t xml:space="preserve">2,915</w:t>
             </w:r>
           </w:p>
         </w:tc>
@@ -17583,7 +17659,7 @@
                 <w:szCs w:val="18"/>
                 <w:color w:val="000000"/>
               </w:rPr>
-              <w:t xml:space="preserve">3,474</w:t>
+              <w:t xml:space="preserve">3,157</w:t>
             </w:r>
           </w:p>
         </w:tc>
@@ -17637,7 +17713,7 @@
                 <w:szCs w:val="18"/>
                 <w:color w:val="000000"/>
               </w:rPr>
-              <w:t xml:space="preserve">3,015</w:t>
+              <w:t xml:space="preserve">2,717</w:t>
             </w:r>
           </w:p>
         </w:tc>
@@ -17691,7 +17767,7 @@
                 <w:szCs w:val="18"/>
                 <w:color w:val="000000"/>
               </w:rPr>
-              <w:t xml:space="preserve">2,898</w:t>
+              <w:t xml:space="preserve">2,568</w:t>
             </w:r>
           </w:p>
         </w:tc>
@@ -17745,7 +17821,7 @@
                 <w:szCs w:val="18"/>
                 <w:color w:val="000000"/>
               </w:rPr>
-              <w:t xml:space="preserve">1,702</w:t>
+              <w:t xml:space="preserve">1,598</w:t>
             </w:r>
           </w:p>
         </w:tc>
@@ -17799,7 +17875,7 @@
                 <w:szCs w:val="18"/>
                 <w:color w:val="000000"/>
               </w:rPr>
-              <w:t xml:space="preserve">19,164</w:t>
+              <w:t xml:space="preserve">17,320</w:t>
             </w:r>
           </w:p>
         </w:tc>
@@ -24106,6 +24182,15 @@
       </w:r>
       <w:r>
         <w:t xml:space="preserve">Fraser Coho Salmon Recovery Potential Assessment</w:t>
+      </w:r>
+      <w:r>
+        <w:t xml:space="preserve">.</w:t>
+      </w:r>
+      <w:r>
+        <w:t xml:space="preserve"> </w:t>
+      </w:r>
+      <w:r>
+        <w:t xml:space="preserve">Fisheries and Oceans Canada</w:t>
       </w:r>
       <w:r>
         <w:t xml:space="preserve">.</w:t>

</xml_diff>

<commit_message>
Reran all the scripts
</commit_message>
<xml_diff>
--- a/reports/LAPSE_primary_publication.docx
+++ b/reports/LAPSE_primary_publication.docx
@@ -627,7 +627,7 @@
         <w:t xml:space="preserve">(Salafsky et al. 2008; Fisheries and Oceans Canada 2021; Chalifour et al. 2022)</w:t>
       </w:r>
       <w:r>
-        <w:t xml:space="preserve">. These frameworks are varied in their approaches, but aim to be comprehensive in assessing the wide range of concerns that may impact salmon across their life cycle to inform status assessments, recovery planning, and conservation strategies. One widely used risk assessment frameworks for Pacific salmon is the</w:t>
+        <w:t xml:space="preserve">. These frameworks are varied in their approaches, but aim to be comprehensive in assessing the wide range of concerns that may impact salmon across their life cycle to inform status assessments, recovery planning, and conservation strategies. One widely used risk assessment framework for Pacific salmon is the</w:t>
       </w:r>
       <w:r>
         <w:t xml:space="preserve"> </w:t>
@@ -678,7 +678,29 @@
         <w:t xml:space="preserve"> </w:t>
       </w:r>
       <w:r>
-        <w:t xml:space="preserve">listing processes and for</w:t>
+        <w:t xml:space="preserve">listing processes and for Committee on the Status of Endangered Wildlife in Canada (COSEWIC</w:t>
+      </w:r>
+      <w:r>
+        <w:rPr>
+          <w:b/>
+          <w:bCs/>
+        </w:rPr>
+        <w:t xml:space="preserve">)</w:t>
+      </w:r>
+      <w:r>
+        <w:t xml:space="preserve"> </w:t>
+      </w:r>
+      <w:r>
+        <w:t xml:space="preserve">status assessments</w:t>
+      </w:r>
+      <w:r>
+        <w:t xml:space="preserve"> </w:t>
+      </w:r>
+      <w:r>
+        <w:t xml:space="preserve">(Arbeider et al. 2020; Dionne 2023; Doutaz et al. 2023)</w:t>
+      </w:r>
+      <w:r>
+        <w:t xml:space="preserve">.</w:t>
       </w:r>
     </w:p>
     <w:p>
@@ -686,26 +708,52 @@
         <w:pStyle w:val="BodyText"/>
       </w:pPr>
       <w:r>
+        <w:t xml:space="preserve">Risk assessments are intended to guide the development of recovery plans and mitigation actions with the ultimate aim of reversing declines and improving conservation status, assuming there is agreement upon the most important threats. A key challenge is identifying actions that are impactful and feasible across the wide geographic range and diverse life history of Pacific salmon. In many cases, dispersed authority, regulatory complexities, ambiguous responsibilities, ill-defined standards of management, and unclear conservation objectives across jurisdictions become barriers to effective and timely action.</w:t>
+      </w:r>
+    </w:p>
+    <w:bookmarkEnd w:id="21"/>
+    <w:bookmarkStart w:id="23" w:name="Xf99c42c3166c79d6e14b14d7da12046c07a47b6"/>
+    <w:p>
+      <w:pPr>
+        <w:pStyle w:val="Heading2"/>
+      </w:pPr>
+      <w:r>
+        <w:t xml:space="preserve">Why study salmon legislation: purpose and objectives</w:t>
+      </w:r>
+    </w:p>
+    <w:p>
+      <w:pPr>
+        <w:pStyle w:val="FirstParagraph"/>
+      </w:pPr>
+      <w:r>
+        <w:t xml:space="preserve">The need for collaborative, coordinated action to address Pacific salmon declines is recognized by governments throughout policies, plans, and initiatives (</w:t>
+      </w:r>
+      <w:r>
         <w:rPr>
           <w:b/>
           <w:bCs/>
         </w:rPr>
-        <w:t xml:space="preserve">COSEWIC</w:t>
-      </w:r>
-      <w:r>
-        <w:t xml:space="preserve"> </w:t>
-      </w:r>
-      <w:r>
-        <w:t xml:space="preserve">status assessments</w:t>
-      </w:r>
-      <w:r>
-        <w:t xml:space="preserve"> </w:t>
-      </w:r>
-      <w:r>
-        <w:t xml:space="preserve">(Arbeider et al. 2020; Dionne 2023; Doutaz et al. 2023)</w:t>
-      </w:r>
-      <w:r>
-        <w:t xml:space="preserve">.</w:t>
+        <w:t xml:space="preserve">e.g. the WSP,</w:t>
+      </w:r>
+      <w:r>
+        <w:rPr>
+          <w:b/>
+          <w:bCs/>
+        </w:rPr>
+        <w:t xml:space="preserve"> </w:t>
+      </w:r>
+      <w:hyperlink r:id="rId22">
+        <w:r>
+          <w:rPr>
+            <w:rStyle w:val="Hyperlink"/>
+            <w:b/>
+            <w:bCs/>
+          </w:rPr>
+          <w:t xml:space="preserve">the trilateral accord 2024</w:t>
+        </w:r>
+      </w:hyperlink>
+      <w:r>
+        <w:t xml:space="preserve">).</w:t>
       </w:r>
     </w:p>
     <w:p>
@@ -713,7 +761,7 @@
         <w:pStyle w:val="BodyText"/>
       </w:pPr>
       <w:r>
-        <w:t xml:space="preserve">Assuming there is agreement upon the most important threats, risk assessments are intended to guide the development of recovery plans and mitigation actions with the ultimate aim of reversing declines and improving conservation status.</w:t>
+        <w:t xml:space="preserve">Coordinated action requires adequate organizational capacity and systems for implementation to ensure that regulatory controls and mitigation activities address underlying threats to salmon and their habitat.</w:t>
       </w:r>
     </w:p>
     <w:p>
@@ -721,33 +769,7 @@
         <w:pStyle w:val="BodyText"/>
       </w:pPr>
       <w:r>
-        <w:t xml:space="preserve">A key challenge is identifying actions that are</w:t>
-      </w:r>
-      <w:r>
-        <w:t xml:space="preserve"> </w:t>
-      </w:r>
-      <w:r>
-        <w:rPr>
-          <w:b/>
-          <w:bCs/>
-        </w:rPr>
-        <w:t xml:space="preserve">impactful</w:t>
-      </w:r>
-      <w:r>
-        <w:t xml:space="preserve"> </w:t>
-      </w:r>
-      <w:r>
-        <w:rPr>
-          <w:b/>
-          <w:bCs/>
-        </w:rPr>
-        <w:t xml:space="preserve">(**is that a word?)</w:t>
-      </w:r>
-      <w:r>
-        <w:t xml:space="preserve"> </w:t>
-      </w:r>
-      <w:r>
-        <w:t xml:space="preserve">and feasible across the wide geographic range and diverse life history of Pacific salmon. In many cases, regulatory complexity, ambiguous responsibility, unclear conservation objectives across jurisdictions and dispersed authority become barriers to effective and timely action.</w:t>
+        <w:t xml:space="preserve">However, linking threats and recovery actions to the relevant regulatory systems can be complex because salmon are often affected by multiple threats that each span across agencies and governmental jurisdiction.</w:t>
       </w:r>
     </w:p>
     <w:p>
@@ -763,89 +785,6 @@
           <w:b/>
           <w:bCs/>
         </w:rPr>
-        <w:t xml:space="preserve">MW - Option of adding</w:t>
-      </w:r>
-      <w:r>
-        <w:rPr>
-          <w:b/>
-          <w:bCs/>
-        </w:rPr>
-        <w:t xml:space="preserve"> </w:t>
-      </w:r>
-      <w:r>
-        <w:rPr>
-          <w:b/>
-          <w:bCs/>
-        </w:rPr>
-        <w:t xml:space="preserve">“</w:t>
-      </w:r>
-      <w:r>
-        <w:rPr>
-          <w:b/>
-          <w:bCs/>
-        </w:rPr>
-        <w:t xml:space="preserve">unclear standards of management</w:t>
-      </w:r>
-      <w:r>
-        <w:rPr>
-          <w:b/>
-          <w:bCs/>
-        </w:rPr>
-        <w:t xml:space="preserve">”</w:t>
-      </w:r>
-      <w:r>
-        <w:rPr>
-          <w:b/>
-          <w:bCs/>
-        </w:rPr>
-        <w:t xml:space="preserve">, or similar, to the list? Unclear environmental or conservation objectives across jurisdictions maybe.</w:t>
-      </w:r>
-    </w:p>
-    <w:bookmarkEnd w:id="21"/>
-    <w:bookmarkStart w:id="23" w:name="Xf99c42c3166c79d6e14b14d7da12046c07a47b6"/>
-    <w:p>
-      <w:pPr>
-        <w:pStyle w:val="Heading2"/>
-      </w:pPr>
-      <w:r>
-        <w:t xml:space="preserve">Why study salmon legislation: purpose and objectives</w:t>
-      </w:r>
-    </w:p>
-    <w:p>
-      <w:pPr>
-        <w:pStyle w:val="FirstParagraph"/>
-      </w:pPr>
-      <w:r>
-        <w:t xml:space="preserve">The need for collaborative, coordinated action to address Pacific salmon declines is recognized by governments throughout policies, plans, and initiatives (e.g. the WSP,</w:t>
-      </w:r>
-      <w:r>
-        <w:t xml:space="preserve"> </w:t>
-      </w:r>
-      <w:hyperlink r:id="rId22">
-        <w:r>
-          <w:rPr>
-            <w:rStyle w:val="Hyperlink"/>
-          </w:rPr>
-          <w:t xml:space="preserve">the trilateral accord 2024</w:t>
-        </w:r>
-      </w:hyperlink>
-      <w:r>
-        <w:t xml:space="preserve">). Coordinated action requires adequate organizational capacity and systems for implementation to ensure that regulatory controls and mitigation activities address underlying threats to salmon and their habitat. However, linking threats and recovery actions to the relevant regulatory systems can be complex because salmon are often affected by multiple threats that each span across agencies and governmental jurisdiction.</w:t>
-      </w:r>
-    </w:p>
-    <w:p>
-      <w:pPr>
-        <w:pStyle w:val="Compact"/>
-        <w:numPr>
-          <w:ilvl w:val="0"/>
-          <w:numId w:val="1004"/>
-        </w:numPr>
-      </w:pPr>
-      <w:r>
-        <w:rPr>
-          <w:b/>
-          <w:bCs/>
-        </w:rPr>
         <w:t xml:space="preserve">Add examples of rebuilding plans, OK Chinook, WCVI Chinook, Fish stock provision rebuilding plans (DG)</w:t>
       </w:r>
     </w:p>
@@ -984,7 +923,7 @@
       <w:pPr>
         <w:numPr>
           <w:ilvl w:val="0"/>
-          <w:numId w:val="1005"/>
+          <w:numId w:val="1004"/>
         </w:numPr>
       </w:pPr>
       <w:r>
@@ -999,7 +938,7 @@
       <w:pPr>
         <w:numPr>
           <w:ilvl w:val="0"/>
-          <w:numId w:val="1005"/>
+          <w:numId w:val="1004"/>
         </w:numPr>
       </w:pPr>
       <w:r>
@@ -1410,7 +1349,7 @@
         <w:pStyle w:val="Compact"/>
         <w:numPr>
           <w:ilvl w:val="0"/>
-          <w:numId w:val="1006"/>
+          <w:numId w:val="1005"/>
         </w:numPr>
       </w:pPr>
       <w:r>
@@ -1467,7 +1406,7 @@
         <w:pStyle w:val="Compact"/>
         <w:numPr>
           <w:ilvl w:val="0"/>
-          <w:numId w:val="1007"/>
+          <w:numId w:val="1006"/>
         </w:numPr>
       </w:pPr>
       <w:r>
@@ -2323,7 +2262,7 @@
                 <w:szCs w:val="22"/>
                 <w:color w:val="000000"/>
               </w:rPr>
-              <w:t xml:space="preserve">43</w:t>
+              <w:t xml:space="preserve">44</w:t>
             </w:r>
           </w:p>
         </w:tc>
@@ -2485,7 +2424,7 @@
                 <w:szCs w:val="22"/>
                 <w:color w:val="000000"/>
               </w:rPr>
-              <w:t xml:space="preserve">3</w:t>
+              <w:t xml:space="preserve">2</w:t>
             </w:r>
           </w:p>
         </w:tc>
@@ -2653,7 +2592,7 @@
                 <w:szCs w:val="22"/>
                 <w:color w:val="000000"/>
               </w:rPr>
-              <w:t xml:space="preserve">72</w:t>
+              <w:t xml:space="preserve">73</w:t>
             </w:r>
           </w:p>
         </w:tc>
@@ -2815,7 +2754,7 @@
                 <w:szCs w:val="22"/>
                 <w:color w:val="000000"/>
               </w:rPr>
-              <w:t xml:space="preserve">3</w:t>
+              <w:t xml:space="preserve">2</w:t>
             </w:r>
           </w:p>
         </w:tc>
@@ -3052,7 +2991,7 @@
         <w:pStyle w:val="Compact"/>
         <w:numPr>
           <w:ilvl w:val="0"/>
-          <w:numId w:val="1008"/>
+          <w:numId w:val="1007"/>
         </w:numPr>
       </w:pPr>
       <w:r>
@@ -3068,7 +3007,7 @@
         <w:pStyle w:val="Compact"/>
         <w:numPr>
           <w:ilvl w:val="0"/>
-          <w:numId w:val="1008"/>
+          <w:numId w:val="1007"/>
         </w:numPr>
       </w:pPr>
       <w:r>
@@ -3269,7 +3208,7 @@
       <w:pPr>
         <w:numPr>
           <w:ilvl w:val="0"/>
-          <w:numId w:val="1009"/>
+          <w:numId w:val="1008"/>
         </w:numPr>
       </w:pPr>
       <w:r>
@@ -3284,7 +3223,7 @@
       <w:pPr>
         <w:numPr>
           <w:ilvl w:val="0"/>
-          <w:numId w:val="1009"/>
+          <w:numId w:val="1008"/>
         </w:numPr>
       </w:pPr>
       <w:r>
@@ -3420,7 +3359,7 @@
         <w:pStyle w:val="Compact"/>
         <w:numPr>
           <w:ilvl w:val="0"/>
-          <w:numId w:val="1010"/>
+          <w:numId w:val="1009"/>
         </w:numPr>
       </w:pPr>
       <w:r>
@@ -7323,7 +7262,7 @@
         <w:pStyle w:val="Compact"/>
         <w:numPr>
           <w:ilvl w:val="0"/>
-          <w:numId w:val="1011"/>
+          <w:numId w:val="1010"/>
         </w:numPr>
       </w:pPr>
       <w:r>
@@ -7707,7 +7646,7 @@
         <w:pStyle w:val="Compact"/>
         <w:numPr>
           <w:ilvl w:val="0"/>
-          <w:numId w:val="1012"/>
+          <w:numId w:val="1011"/>
         </w:numPr>
       </w:pPr>
       <w:r>
@@ -17861,7 +17800,7 @@
       <w:pPr>
         <w:numPr>
           <w:ilvl w:val="0"/>
-          <w:numId w:val="1013"/>
+          <w:numId w:val="1012"/>
         </w:numPr>
       </w:pPr>
       <w:r>
@@ -17876,7 +17815,7 @@
       <w:pPr>
         <w:numPr>
           <w:ilvl w:val="0"/>
-          <w:numId w:val="1013"/>
+          <w:numId w:val="1012"/>
         </w:numPr>
       </w:pPr>
       <w:r>
@@ -17947,7 +17886,7 @@
       <w:pPr>
         <w:numPr>
           <w:ilvl w:val="0"/>
-          <w:numId w:val="1014"/>
+          <w:numId w:val="1013"/>
         </w:numPr>
       </w:pPr>
       <w:r>
@@ -17962,7 +17901,7 @@
       <w:pPr>
         <w:numPr>
           <w:ilvl w:val="0"/>
-          <w:numId w:val="1014"/>
+          <w:numId w:val="1013"/>
         </w:numPr>
       </w:pPr>
       <w:r>
@@ -21685,7 +21624,7 @@
       <w:pPr>
         <w:numPr>
           <w:ilvl w:val="0"/>
-          <w:numId w:val="1015"/>
+          <w:numId w:val="1014"/>
         </w:numPr>
       </w:pPr>
       <w:r>
@@ -21700,7 +21639,7 @@
       <w:pPr>
         <w:numPr>
           <w:ilvl w:val="0"/>
-          <w:numId w:val="1015"/>
+          <w:numId w:val="1014"/>
         </w:numPr>
       </w:pPr>
       <w:r>
@@ -21715,7 +21654,7 @@
       <w:pPr>
         <w:numPr>
           <w:ilvl w:val="0"/>
-          <w:numId w:val="1015"/>
+          <w:numId w:val="1014"/>
         </w:numPr>
       </w:pPr>
       <w:r>
@@ -21730,7 +21669,7 @@
       <w:pPr>
         <w:numPr>
           <w:ilvl w:val="0"/>
-          <w:numId w:val="1015"/>
+          <w:numId w:val="1014"/>
         </w:numPr>
       </w:pPr>
       <w:r>
@@ -21835,7 +21774,7 @@
         <w:pStyle w:val="Compact"/>
         <w:numPr>
           <w:ilvl w:val="0"/>
-          <w:numId w:val="1016"/>
+          <w:numId w:val="1015"/>
         </w:numPr>
       </w:pPr>
       <w:r>
@@ -21907,7 +21846,7 @@
       <w:pPr>
         <w:numPr>
           <w:ilvl w:val="0"/>
-          <w:numId w:val="1017"/>
+          <w:numId w:val="1016"/>
         </w:numPr>
       </w:pPr>
       <w:r>
@@ -21916,6 +21855,119 @@
           <w:bCs/>
         </w:rPr>
         <w:t xml:space="preserve">DG - It looks like the x-axis is organized alphabetically, causing some of the threats in categories 10 and 11 to be up at the top.</w:t>
+      </w:r>
+    </w:p>
+    <w:p>
+      <w:pPr>
+        <w:numPr>
+          <w:ilvl w:val="0"/>
+          <w:numId w:val="1016"/>
+        </w:numPr>
+      </w:pPr>
+      <w:r>
+        <w:rPr>
+          <w:b/>
+          <w:bCs/>
+        </w:rPr>
+        <w:t xml:space="preserve">DG - Certain threat categories (e.g., pathogens) were only assessed in select RPAs (in this case, Interior Fraser Coho I think), which would bias the CU count. I think it would make the analysis more standardized if there was a common subset of threats assessed within each RPA that was chosen.</w:t>
+      </w:r>
+    </w:p>
+    <w:bookmarkStart w:id="83" w:name="case-study-iucn-10.1-geological-events"/>
+    <w:p>
+      <w:pPr>
+        <w:pStyle w:val="Heading2"/>
+      </w:pPr>
+      <w:r>
+        <w:t xml:space="preserve">Case Study: IUCN 10.1 Geological events</w:t>
+      </w:r>
+    </w:p>
+    <w:p>
+      <w:pPr>
+        <w:pStyle w:val="FirstParagraph"/>
+      </w:pPr>
+      <w:r>
+        <w:t xml:space="preserve">One IUCN threat was assessed as</w:t>
+      </w:r>
+      <w:r>
+        <w:t xml:space="preserve"> </w:t>
+      </w:r>
+      <w:r>
+        <w:t xml:space="preserve">“</w:t>
+      </w:r>
+      <w:r>
+        <w:t xml:space="preserve">Extreme</w:t>
+      </w:r>
+      <w:r>
+        <w:t xml:space="preserve">”</w:t>
+      </w:r>
+      <w:r>
+        <w:t xml:space="preserve"> </w:t>
+      </w:r>
+      <w:r>
+        <w:t xml:space="preserve">through DFO Recovery Potential Assessment processes, which was</w:t>
+      </w:r>
+      <w:r>
+        <w:t xml:space="preserve"> </w:t>
+      </w:r>
+      <w:r>
+        <w:t xml:space="preserve">“</w:t>
+      </w:r>
+      <w:r>
+        <w:t xml:space="preserve">10.1 Geological Events</w:t>
+      </w:r>
+      <w:r>
+        <w:t xml:space="preserve">”</w:t>
+      </w:r>
+      <w:r>
+        <w:t xml:space="preserve"> </w:t>
+      </w:r>
+      <w:r>
+        <w:t xml:space="preserve">[doutaz2020;</w:t>
+      </w:r>
+      <w:r>
+        <w:t xml:space="preserve"> </w:t>
+      </w:r>
+      <w:r>
+        <w:t xml:space="preserve">Fisheries and Oceans Canada (2022)</w:t>
+      </w:r>
+      <w:r>
+        <w:t xml:space="preserve">]. This threat was assigned to one sockeye and three Chinook conservation units (Table</w:t>
+      </w:r>
+      <w:r>
+        <w:t xml:space="preserve"> </w:t>
+      </w:r>
+      <w:r>
+        <w:t xml:space="preserve">6</w:t>
+      </w:r>
+      <w:r>
+        <w:t xml:space="preserve">), all in the Fraser Interior area related to the</w:t>
+      </w:r>
+      <w:r>
+        <w:t xml:space="preserve"> </w:t>
+      </w:r>
+      <w:r>
+        <w:t xml:space="preserve">“</w:t>
+      </w:r>
+      <w:r>
+        <w:t xml:space="preserve">ongoing effects from Big Bar landslide</w:t>
+      </w:r>
+      <w:r>
+        <w:t xml:space="preserve">”</w:t>
+      </w:r>
+      <w:r>
+        <w:t xml:space="preserve"> </w:t>
+      </w:r>
+      <w:r>
+        <w:t xml:space="preserve">in 2018 [doutaz2020;</w:t>
+      </w:r>
+      <w:r>
+        <w:t xml:space="preserve"> </w:t>
+      </w:r>
+      <w:r>
+        <w:t xml:space="preserve">Fisheries and Oceans Canada (2022)</w:t>
+      </w:r>
+      <w:r>
+        <w:t xml:space="preserve">]:</w:t>
       </w:r>
     </w:p>
     <w:p>
@@ -21930,112 +21982,14 @@
           <w:b/>
           <w:bCs/>
         </w:rPr>
-        <w:t xml:space="preserve">DG - Certain threat categories (e.g., pathogens) were only assessed in select RPAs (in this case, Interior Fraser Coho I think), which would bias the CU count. I think it would make the analysis more standardized if there was a common subset of threats assessed within each RPA that was chosen.</w:t>
-      </w:r>
-    </w:p>
-    <w:bookmarkStart w:id="83" w:name="case-study-iucn-10.1-geological-events"/>
-    <w:p>
-      <w:pPr>
-        <w:pStyle w:val="Heading2"/>
-      </w:pPr>
-      <w:r>
-        <w:t xml:space="preserve">Case Study: IUCN 10.1 Geological events</w:t>
-      </w:r>
-    </w:p>
-    <w:p>
-      <w:pPr>
-        <w:pStyle w:val="FirstParagraph"/>
-      </w:pPr>
-      <w:r>
-        <w:t xml:space="preserve">One IUCN threat was assessed as</w:t>
-      </w:r>
-      <w:r>
-        <w:t xml:space="preserve"> </w:t>
-      </w:r>
-      <w:r>
-        <w:t xml:space="preserve">“</w:t>
-      </w:r>
-      <w:r>
-        <w:t xml:space="preserve">Extreme</w:t>
-      </w:r>
-      <w:r>
-        <w:t xml:space="preserve">”</w:t>
-      </w:r>
-      <w:r>
-        <w:t xml:space="preserve"> </w:t>
-      </w:r>
-      <w:r>
-        <w:t xml:space="preserve">through DFO Recovery Potential Assessment processes, which was</w:t>
-      </w:r>
-      <w:r>
-        <w:t xml:space="preserve"> </w:t>
-      </w:r>
-      <w:r>
-        <w:t xml:space="preserve">“</w:t>
-      </w:r>
-      <w:r>
-        <w:t xml:space="preserve">10.1 Geological Events</w:t>
-      </w:r>
-      <w:r>
-        <w:t xml:space="preserve">”</w:t>
-      </w:r>
-      <w:r>
-        <w:t xml:space="preserve"> </w:t>
-      </w:r>
-      <w:r>
-        <w:t xml:space="preserve">[doutaz2020;</w:t>
-      </w:r>
-      <w:r>
-        <w:t xml:space="preserve"> </w:t>
-      </w:r>
-      <w:r>
-        <w:t xml:space="preserve">Fisheries and Oceans Canada (2022)</w:t>
-      </w:r>
-      <w:r>
-        <w:t xml:space="preserve">]. This threat was assigned to one sockeye and three Chinook conservation units (Table</w:t>
-      </w:r>
-      <w:r>
-        <w:t xml:space="preserve"> </w:t>
-      </w:r>
-      <w:r>
-        <w:t xml:space="preserve">6</w:t>
-      </w:r>
-      <w:r>
-        <w:t xml:space="preserve">), all in the Fraser Interior area related to the</w:t>
-      </w:r>
-      <w:r>
-        <w:t xml:space="preserve"> </w:t>
-      </w:r>
-      <w:r>
-        <w:t xml:space="preserve">“</w:t>
-      </w:r>
-      <w:r>
-        <w:t xml:space="preserve">ongoing effects from Big Bar landslide</w:t>
-      </w:r>
-      <w:r>
-        <w:t xml:space="preserve">”</w:t>
-      </w:r>
-      <w:r>
-        <w:t xml:space="preserve"> </w:t>
-      </w:r>
-      <w:r>
-        <w:t xml:space="preserve">in 2018 [doutaz2020;</w:t>
-      </w:r>
-      <w:r>
-        <w:t xml:space="preserve"> </w:t>
-      </w:r>
-      <w:r>
-        <w:t xml:space="preserve">Fisheries and Oceans Canada (2022)</w:t>
-      </w:r>
-      <w:r>
-        <w:t xml:space="preserve">]:</w:t>
+        <w:t xml:space="preserve">DG - Suggest using IUCN-CMP throughout if that’s what we’re starting with.</w:t>
       </w:r>
     </w:p>
     <w:p>
       <w:pPr>
         <w:numPr>
           <w:ilvl w:val="0"/>
-          <w:numId w:val="1018"/>
+          <w:numId w:val="1017"/>
         </w:numPr>
       </w:pPr>
       <w:r>
@@ -22043,14 +21997,98 @@
           <w:b/>
           <w:bCs/>
         </w:rPr>
-        <w:t xml:space="preserve">DG - Suggest using IUCN-CMP throughout if that’s what we’re starting with.</w:t>
+        <w:t xml:space="preserve">DG - I’m not super familiar with the most recent version of the IUCN-CMP threat classification framework that you’re using in this analysis, but in the RPAs, Geological events is</w:t>
+      </w:r>
+      <w:r>
+        <w:rPr>
+          <w:b/>
+          <w:bCs/>
+        </w:rPr>
+        <w:t xml:space="preserve"> </w:t>
+      </w:r>
+      <w:r>
+        <w:rPr>
+          <w:b/>
+          <w:bCs/>
+        </w:rPr>
+        <w:t xml:space="preserve">“</w:t>
+      </w:r>
+      <w:r>
+        <w:rPr>
+          <w:b/>
+          <w:bCs/>
+        </w:rPr>
+        <w:t xml:space="preserve">10</w:t>
+      </w:r>
+      <w:r>
+        <w:rPr>
+          <w:b/>
+          <w:bCs/>
+        </w:rPr>
+        <w:t xml:space="preserve">”</w:t>
+      </w:r>
+      <w:r>
+        <w:rPr>
+          <w:b/>
+          <w:bCs/>
+        </w:rPr>
+        <w:t xml:space="preserve"> </w:t>
+      </w:r>
+      <w:r>
+        <w:rPr>
+          <w:b/>
+          <w:bCs/>
+        </w:rPr>
+        <w:t xml:space="preserve">and is a first-level threat, and Avalanches/landslides is</w:t>
+      </w:r>
+      <w:r>
+        <w:rPr>
+          <w:b/>
+          <w:bCs/>
+        </w:rPr>
+        <w:t xml:space="preserve"> </w:t>
+      </w:r>
+      <w:r>
+        <w:rPr>
+          <w:b/>
+          <w:bCs/>
+        </w:rPr>
+        <w:t xml:space="preserve">“</w:t>
+      </w:r>
+      <w:r>
+        <w:rPr>
+          <w:b/>
+          <w:bCs/>
+        </w:rPr>
+        <w:t xml:space="preserve">10.1</w:t>
+      </w:r>
+      <w:r>
+        <w:rPr>
+          <w:b/>
+          <w:bCs/>
+        </w:rPr>
+        <w:t xml:space="preserve">”</w:t>
+      </w:r>
+      <w:r>
+        <w:rPr>
+          <w:b/>
+          <w:bCs/>
+        </w:rPr>
+        <w:t xml:space="preserve"> </w:t>
+      </w:r>
+      <w:r>
+        <w:rPr>
+          <w:b/>
+          <w:bCs/>
+        </w:rPr>
+        <w:t xml:space="preserve">and is a second-level threat.</w:t>
       </w:r>
     </w:p>
     <w:p>
       <w:pPr>
         <w:numPr>
           <w:ilvl w:val="0"/>
-          <w:numId w:val="1018"/>
+          <w:numId w:val="1017"/>
         </w:numPr>
       </w:pPr>
       <w:r>
@@ -22058,113 +22096,14 @@
           <w:b/>
           <w:bCs/>
         </w:rPr>
-        <w:t xml:space="preserve">DG - I’m not super familiar with the most recent version of the IUCN-CMP threat classification framework that you’re using in this analysis, but in the RPAs, Geological events is</w:t>
-      </w:r>
-      <w:r>
-        <w:rPr>
-          <w:b/>
-          <w:bCs/>
-        </w:rPr>
-        <w:t xml:space="preserve"> </w:t>
-      </w:r>
-      <w:r>
-        <w:rPr>
-          <w:b/>
-          <w:bCs/>
-        </w:rPr>
-        <w:t xml:space="preserve">“</w:t>
-      </w:r>
-      <w:r>
-        <w:rPr>
-          <w:b/>
-          <w:bCs/>
-        </w:rPr>
-        <w:t xml:space="preserve">10</w:t>
-      </w:r>
-      <w:r>
-        <w:rPr>
-          <w:b/>
-          <w:bCs/>
-        </w:rPr>
-        <w:t xml:space="preserve">”</w:t>
-      </w:r>
-      <w:r>
-        <w:rPr>
-          <w:b/>
-          <w:bCs/>
-        </w:rPr>
-        <w:t xml:space="preserve"> </w:t>
-      </w:r>
-      <w:r>
-        <w:rPr>
-          <w:b/>
-          <w:bCs/>
-        </w:rPr>
-        <w:t xml:space="preserve">and is a first-level threat, and Avalanches/landslides is</w:t>
-      </w:r>
-      <w:r>
-        <w:rPr>
-          <w:b/>
-          <w:bCs/>
-        </w:rPr>
-        <w:t xml:space="preserve"> </w:t>
-      </w:r>
-      <w:r>
-        <w:rPr>
-          <w:b/>
-          <w:bCs/>
-        </w:rPr>
-        <w:t xml:space="preserve">“</w:t>
-      </w:r>
-      <w:r>
-        <w:rPr>
-          <w:b/>
-          <w:bCs/>
-        </w:rPr>
-        <w:t xml:space="preserve">10.1</w:t>
-      </w:r>
-      <w:r>
-        <w:rPr>
-          <w:b/>
-          <w:bCs/>
-        </w:rPr>
-        <w:t xml:space="preserve">”</w:t>
-      </w:r>
-      <w:r>
-        <w:rPr>
-          <w:b/>
-          <w:bCs/>
-        </w:rPr>
-        <w:t xml:space="preserve"> </w:t>
-      </w:r>
-      <w:r>
-        <w:rPr>
-          <w:b/>
-          <w:bCs/>
-        </w:rPr>
-        <w:t xml:space="preserve">and is a second-level threat.</w:t>
+        <w:t xml:space="preserve">DG - I suggest just citing the RES Docs instead of the SARs</w:t>
       </w:r>
     </w:p>
     <w:p>
       <w:pPr>
         <w:numPr>
           <w:ilvl w:val="0"/>
-          <w:numId w:val="1018"/>
-        </w:numPr>
-      </w:pPr>
-      <w:r>
-        <w:rPr>
-          <w:b/>
-          <w:bCs/>
-        </w:rPr>
-        <w:t xml:space="preserve">DG - I suggest just citing the RES Docs instead of the SARs</w:t>
-      </w:r>
-    </w:p>
-    <w:p>
-      <w:pPr>
-        <w:numPr>
-          <w:ilvl w:val="0"/>
-          <w:numId w:val="1018"/>
+          <w:numId w:val="1017"/>
         </w:numPr>
       </w:pPr>
       <w:r>
@@ -22932,7 +22871,7 @@
       <w:pPr>
         <w:numPr>
           <w:ilvl w:val="0"/>
-          <w:numId w:val="1019"/>
+          <w:numId w:val="1018"/>
         </w:numPr>
       </w:pPr>
       <w:r>
@@ -22941,6 +22880,99 @@
           <w:bCs/>
         </w:rPr>
         <w:t xml:space="preserve">DG - Could be helpful to note the different values on the x-axis between this and the next figure</w:t>
+      </w:r>
+    </w:p>
+    <w:p>
+      <w:pPr>
+        <w:numPr>
+          <w:ilvl w:val="0"/>
+          <w:numId w:val="1018"/>
+        </w:numPr>
+      </w:pPr>
+      <w:r>
+        <w:rPr>
+          <w:b/>
+          <w:bCs/>
+        </w:rPr>
+        <w:t xml:space="preserve">Add more description of Big Bar slide</w:t>
+      </w:r>
+    </w:p>
+    <w:p>
+      <w:pPr>
+        <w:numPr>
+          <w:ilvl w:val="0"/>
+          <w:numId w:val="1018"/>
+        </w:numPr>
+      </w:pPr>
+      <w:r>
+        <w:rPr>
+          <w:b/>
+          <w:bCs/>
+        </w:rPr>
+        <w:t xml:space="preserve">Comment on the most relevant legislation and why</w:t>
+      </w:r>
+    </w:p>
+    <w:bookmarkEnd w:id="83"/>
+    <w:bookmarkStart w:id="90" w:name="X0845d6834917053ec444eadf52e64b0021c48a3"/>
+    <w:p>
+      <w:pPr>
+        <w:pStyle w:val="Heading2"/>
+      </w:pPr>
+      <w:r>
+        <w:t xml:space="preserve">Case Study: IUCN 7.2 Dams &amp; Water Management / Use</w:t>
+      </w:r>
+    </w:p>
+    <w:p>
+      <w:pPr>
+        <w:pStyle w:val="FirstParagraph"/>
+      </w:pPr>
+      <w:r>
+        <w:t xml:space="preserve">One IUCN threat was assessed as</w:t>
+      </w:r>
+      <w:r>
+        <w:t xml:space="preserve"> </w:t>
+      </w:r>
+      <w:r>
+        <w:t xml:space="preserve">“</w:t>
+      </w:r>
+      <w:r>
+        <w:t xml:space="preserve">Extreme-High</w:t>
+      </w:r>
+      <w:r>
+        <w:t xml:space="preserve">”</w:t>
+      </w:r>
+      <w:r>
+        <w:t xml:space="preserve"> </w:t>
+      </w:r>
+      <w:r>
+        <w:t xml:space="preserve">through DFO Recovery Potential Assessment processes, which was</w:t>
+      </w:r>
+      <w:r>
+        <w:t xml:space="preserve"> </w:t>
+      </w:r>
+      <w:r>
+        <w:t xml:space="preserve">“</w:t>
+      </w:r>
+      <w:r>
+        <w:t xml:space="preserve">7.2 Dams &amp; Water Management / Use</w:t>
+      </w:r>
+      <w:r>
+        <w:t xml:space="preserve">”</w:t>
+      </w:r>
+      <w:r>
+        <w:t xml:space="preserve"> </w:t>
+      </w:r>
+      <w:r>
+        <w:t xml:space="preserve">[doutaz2020]. Water extraction, including groundwater, for irrigation and domestic purposes is listed as the most significant concern [doutaz2020]. This threat was assigned to one Chinook conservation unit in the Fraser Interior area (Table</w:t>
+      </w:r>
+      <w:r>
+        <w:t xml:space="preserve"> </w:t>
+      </w:r>
+      <w:r>
+        <w:t xml:space="preserve">7</w:t>
+      </w:r>
+      <w:r>
+        <w:t xml:space="preserve">).</w:t>
       </w:r>
     </w:p>
     <w:p>
@@ -22955,7 +22987,7 @@
           <w:b/>
           <w:bCs/>
         </w:rPr>
-        <w:t xml:space="preserve">Add more description of Big Bar slide</w:t>
+        <w:t xml:space="preserve">DG - And 7.3 Other ecosystem modifications</w:t>
       </w:r>
     </w:p>
     <w:p>
@@ -22963,99 +22995,6 @@
         <w:numPr>
           <w:ilvl w:val="0"/>
           <w:numId w:val="1019"/>
-        </w:numPr>
-      </w:pPr>
-      <w:r>
-        <w:rPr>
-          <w:b/>
-          <w:bCs/>
-        </w:rPr>
-        <w:t xml:space="preserve">Comment on the most relevant legislation and why</w:t>
-      </w:r>
-    </w:p>
-    <w:bookmarkEnd w:id="83"/>
-    <w:bookmarkStart w:id="90" w:name="X0845d6834917053ec444eadf52e64b0021c48a3"/>
-    <w:p>
-      <w:pPr>
-        <w:pStyle w:val="Heading2"/>
-      </w:pPr>
-      <w:r>
-        <w:t xml:space="preserve">Case Study: IUCN 7.2 Dams &amp; Water Management / Use</w:t>
-      </w:r>
-    </w:p>
-    <w:p>
-      <w:pPr>
-        <w:pStyle w:val="FirstParagraph"/>
-      </w:pPr>
-      <w:r>
-        <w:t xml:space="preserve">One IUCN threat was assessed as</w:t>
-      </w:r>
-      <w:r>
-        <w:t xml:space="preserve"> </w:t>
-      </w:r>
-      <w:r>
-        <w:t xml:space="preserve">“</w:t>
-      </w:r>
-      <w:r>
-        <w:t xml:space="preserve">Extreme-High</w:t>
-      </w:r>
-      <w:r>
-        <w:t xml:space="preserve">”</w:t>
-      </w:r>
-      <w:r>
-        <w:t xml:space="preserve"> </w:t>
-      </w:r>
-      <w:r>
-        <w:t xml:space="preserve">through DFO Recovery Potential Assessment processes, which was</w:t>
-      </w:r>
-      <w:r>
-        <w:t xml:space="preserve"> </w:t>
-      </w:r>
-      <w:r>
-        <w:t xml:space="preserve">“</w:t>
-      </w:r>
-      <w:r>
-        <w:t xml:space="preserve">7.2 Dams &amp; Water Management / Use</w:t>
-      </w:r>
-      <w:r>
-        <w:t xml:space="preserve">”</w:t>
-      </w:r>
-      <w:r>
-        <w:t xml:space="preserve"> </w:t>
-      </w:r>
-      <w:r>
-        <w:t xml:space="preserve">[doutaz2020]. Water extraction, including groundwater, for irrigation and domestic purposes is listed as the most significant concern [doutaz2020]. This threat was assigned to one Chinook conservation unit in the Fraser Interior area (Table</w:t>
-      </w:r>
-      <w:r>
-        <w:t xml:space="preserve"> </w:t>
-      </w:r>
-      <w:r>
-        <w:t xml:space="preserve">7</w:t>
-      </w:r>
-      <w:r>
-        <w:t xml:space="preserve">).</w:t>
-      </w:r>
-    </w:p>
-    <w:p>
-      <w:pPr>
-        <w:numPr>
-          <w:ilvl w:val="0"/>
-          <w:numId w:val="1020"/>
-        </w:numPr>
-      </w:pPr>
-      <w:r>
-        <w:rPr>
-          <w:b/>
-          <w:bCs/>
-        </w:rPr>
-        <w:t xml:space="preserve">DG - And 7.3 Other ecosystem modifications</w:t>
-      </w:r>
-    </w:p>
-    <w:p>
-      <w:pPr>
-        <w:numPr>
-          <w:ilvl w:val="0"/>
-          <w:numId w:val="1020"/>
         </w:numPr>
       </w:pPr>
       <w:r>
@@ -23361,7 +23300,7 @@
         <w:pStyle w:val="Compact"/>
         <w:numPr>
           <w:ilvl w:val="0"/>
-          <w:numId w:val="1021"/>
+          <w:numId w:val="1020"/>
         </w:numPr>
       </w:pPr>
       <w:r>
@@ -23517,7 +23456,7 @@
       <w:pPr>
         <w:numPr>
           <w:ilvl w:val="0"/>
-          <w:numId w:val="1022"/>
+          <w:numId w:val="1021"/>
         </w:numPr>
       </w:pPr>
       <w:r>
@@ -23532,7 +23471,7 @@
       <w:pPr>
         <w:numPr>
           <w:ilvl w:val="0"/>
-          <w:numId w:val="1022"/>
+          <w:numId w:val="1021"/>
         </w:numPr>
       </w:pPr>
       <w:r>
@@ -23564,7 +23503,7 @@
       <w:pPr>
         <w:numPr>
           <w:ilvl w:val="0"/>
-          <w:numId w:val="1022"/>
+          <w:numId w:val="1021"/>
         </w:numPr>
       </w:pPr>
       <w:r>
@@ -23579,7 +23518,7 @@
       <w:pPr>
         <w:numPr>
           <w:ilvl w:val="0"/>
-          <w:numId w:val="1022"/>
+          <w:numId w:val="1021"/>
         </w:numPr>
       </w:pPr>
       <w:r>
@@ -23687,7 +23626,7 @@
       <w:pPr>
         <w:numPr>
           <w:ilvl w:val="1"/>
-          <w:numId w:val="1023"/>
+          <w:numId w:val="1022"/>
         </w:numPr>
       </w:pPr>
       <w:r>
@@ -23702,7 +23641,7 @@
       <w:pPr>
         <w:numPr>
           <w:ilvl w:val="1"/>
-          <w:numId w:val="1023"/>
+          <w:numId w:val="1022"/>
         </w:numPr>
       </w:pPr>
       <w:r>
@@ -24026,7 +23965,7 @@
         <w:pStyle w:val="Compact"/>
         <w:numPr>
           <w:ilvl w:val="0"/>
-          <w:numId w:val="1024"/>
+          <w:numId w:val="1023"/>
         </w:numPr>
       </w:pPr>
       <w:r>
@@ -26039,7 +25978,7 @@
         <w:pStyle w:val="Compact"/>
         <w:numPr>
           <w:ilvl w:val="0"/>
-          <w:numId w:val="1025"/>
+          <w:numId w:val="1024"/>
         </w:numPr>
       </w:pPr>
       <w:r>
@@ -26862,9 +26801,6 @@
     <w:abstractNumId w:val="991"/>
   </w:num>
   <w:num w:numId="1022">
-    <w:abstractNumId w:val="991"/>
-  </w:num>
-  <w:num w:numId="1023">
     <w:abstractNumId w:val="99411"/>
     <w:lvlOverride w:ilvl="0">
       <w:startOverride w:val="1"/>
@@ -26894,10 +26830,10 @@
       <w:startOverride w:val="1"/>
     </w:lvlOverride>
   </w:num>
-  <w:num w:numId="1024">
+  <w:num w:numId="1023">
     <w:abstractNumId w:val="991"/>
   </w:num>
-  <w:num w:numId="1025">
+  <w:num w:numId="1024">
     <w:abstractNumId w:val="991"/>
   </w:num>
 </w:numbering>

</xml_diff>

<commit_message>
Revised the mgmt d and IUCN explanation
</commit_message>
<xml_diff>
--- a/reports/LAPSE_primary_publication.docx
+++ b/reports/LAPSE_primary_publication.docx
@@ -953,7 +953,7 @@
     </w:p>
     <w:bookmarkEnd w:id="22"/>
     <w:bookmarkEnd w:id="23"/>
-    <w:bookmarkStart w:id="25" w:name="Xf36a64da03c825d64fdc209fc6c979849cc8a9e"/>
+    <w:bookmarkStart w:id="30" w:name="Xf36a64da03c825d64fdc209fc6c979849cc8a9e"/>
     <w:p>
       <w:pPr>
         <w:pStyle w:val="Heading1"/>
@@ -967,35 +967,44 @@
         <w:pStyle w:val="FirstParagraph"/>
       </w:pPr>
       <w:r>
-        <w:t xml:space="preserve">(</w:t>
+        <w:t xml:space="preserve">Salafsky et al. (2008)</w:t>
+      </w:r>
+      <w:r>
+        <w:t xml:space="preserve"> </w:t>
+      </w:r>
+      <w:r>
+        <w:t xml:space="preserve">recognized that using a common language or a standard lexicon is essential for conservation science. Threats are a fundamental conservation concept, and can be defined as</w:t>
+      </w:r>
+      <w:r>
+        <w:t xml:space="preserve"> </w:t>
+      </w:r>
+      <w:r>
+        <w:t xml:space="preserve">“</w:t>
+      </w:r>
+      <w:r>
+        <w:t xml:space="preserve">current or future human activities or altered natural phenomena that affect one or more ecosystems or species of interest</w:t>
+      </w:r>
+      <w:r>
+        <w:t xml:space="preserve">”</w:t>
+      </w:r>
+      <w:r>
+        <w:t xml:space="preserve"> </w:t>
+      </w:r>
+      <w:r>
+        <w:t xml:space="preserve">(Salafsky et al. 2024)</w:t>
+      </w:r>
+      <w:r>
+        <w:t xml:space="preserve">. The IUCN and the CMP began developing classifications of direct threats in the early 2000s, which were then compiled and developed further through an iterative process resulting in the</w:t>
+      </w:r>
+      <w:r>
+        <w:t xml:space="preserve"> </w:t>
       </w:r>
       <w:r>
         <w:rPr>
-          <w:b/>
-          <w:bCs/>
+          <w:i/>
+          <w:iCs/>
         </w:rPr>
-        <w:t xml:space="preserve">salafsky?</w:t>
-      </w:r>
-      <w:r>
-        <w:t xml:space="preserve">)</w:t>
-      </w:r>
-      <w:r>
-        <w:t xml:space="preserve"> </w:t>
-      </w:r>
-      <w:r>
-        <w:t xml:space="preserve">recognized that using a common language or a standard lexicon is essential for conservation science. Threats are used as a fundamental conservation concept, and can be defined as</w:t>
-      </w:r>
-      <w:r>
-        <w:t xml:space="preserve"> </w:t>
-      </w:r>
-      <w:r>
-        <w:t xml:space="preserve">“</w:t>
-      </w:r>
-      <w:r>
-        <w:t xml:space="preserve">current or future human activities or altered natural phenomena that affect one or more ecosystems or species of interest</w:t>
-      </w:r>
-      <w:r>
-        <w:t xml:space="preserve">”</w:t>
+        <w:t xml:space="preserve">IUCN – CMP Direct Threats Classification Version 4.0</w:t>
       </w:r>
       <w:r>
         <w:t xml:space="preserve"> </w:t>
@@ -1004,7 +1013,19 @@
         <w:t xml:space="preserve">(Salafsky et al. 2024)</w:t>
       </w:r>
       <w:r>
-        <w:t xml:space="preserve">. The IUCN and the CMP began developing classifications of direct threats in the early 2000s.</w:t>
+        <w:t xml:space="preserve"> </w:t>
+      </w:r>
+      <w:r>
+        <w:t xml:space="preserve">used for this exercise. The IUCN Direct Threats Classification uses a hierarchical, exclusive, comprehensive, and expandable structure of three levels similar to the Linnean system of grouping by family, genera, and species</w:t>
+      </w:r>
+      <w:r>
+        <w:t xml:space="preserve"> </w:t>
+      </w:r>
+      <w:r>
+        <w:t xml:space="preserve">(Salafsky et al. 2008)</w:t>
+      </w:r>
+      <w:r>
+        <w:t xml:space="preserve">. First-level categories (Level 1), the broadest, are subdivided into second-level categories (Level 2), which are further subdivided into the most specific, third-level categories (Level 3).</w:t>
       </w:r>
     </w:p>
     <w:p>
@@ -1012,226 +1033,113 @@
         <w:pStyle w:val="BodyText"/>
       </w:pPr>
       <w:r>
+        <w:t xml:space="preserve">Canadian and British Columbian legislation has been enacted on a sector-by-sector basis, which doesn’t exactly align well with the IUCN Level 1 categories. At the same time, the IUCN Level 2 categories can be too fine of a resolution. IUCN Level 3 categories were not used in this assessment. Lumping and splitting between IUCN Levels 1 and 2 categories was required to match threats with legislation</w:t>
+      </w:r>
+      <w:r>
+        <w:t xml:space="preserve"> </w:t>
+      </w:r>
+      <w:r>
+        <w:t xml:space="preserve">1</w:t>
+      </w:r>
+      <w:r>
+        <w:t xml:space="preserve">, which is why the management domain categories were required. For example, aquaculture and hatcheries are important aspects that impact Pacific salmon populations. This topic spans two IUCN Level 1 categories: 2. Agriculture &amp; Aquaculture and 8. Invasive / Other Problematic Species, Genes &amp; Pathogens, but would be more specifically aligned with the IUCN Level 2 categories: 2.4 Marine &amp; Freshwater Aquaculture and 8.3 Introduced Genetic Material to match legislation such as the</w:t>
+      </w:r>
+      <w:r>
+        <w:t xml:space="preserve"> </w:t>
+      </w:r>
+      <w:r>
         <w:rPr>
-          <w:b/>
-          <w:bCs/>
+          <w:i/>
+          <w:iCs/>
         </w:rPr>
-        <w:t xml:space="preserve">hierarchical (creates a logical way of grouping items that are related to one another to facilitate use of the classification and meaningful analyses at different levels); comprehensive (contains all possible items, at least at higher levels of the hierarchy; consistent (ensures that entries at a given level of the classification are of the same type); expandable (enables new items to be added to the classification if they are discovered); exclusive (allows any given item to only be placed in one cell within the hierarchy); and scalable (permits the same terms to be used at all geographic scales).</w:t>
+        <w:t xml:space="preserve">Aquaculture Activities Regulations</w:t>
+      </w:r>
+      <w:r>
+        <w:t xml:space="preserve"> </w:t>
+      </w:r>
+      <w:r>
+        <w:t xml:space="preserve">under the</w:t>
+      </w:r>
+      <w:r>
+        <w:t xml:space="preserve"> </w:t>
       </w:r>
       <w:r>
         <w:rPr>
-          <w:b/>
-          <w:bCs/>
+          <w:i/>
+          <w:iCs/>
         </w:rPr>
-        <w:t xml:space="preserve"> </w:t>
+        <w:t xml:space="preserve">Fisheries Act</w:t>
+      </w:r>
+      <w:r>
+        <w:t xml:space="preserve">. For clarity and better alignment, we created a management domain called</w:t>
+      </w:r>
+      <w:r>
+        <w:t xml:space="preserve"> </w:t>
+      </w:r>
+      <w:r>
+        <w:t xml:space="preserve">“</w:t>
+      </w:r>
+      <w:r>
+        <w:t xml:space="preserve">Aquaculture and Hatcheries.</w:t>
+      </w:r>
+      <w:r>
+        <w:t xml:space="preserve">”</w:t>
+      </w:r>
+      <w:r>
+        <w:t xml:space="preserve"> </w:t>
+      </w:r>
+      <w:r>
+        <w:t xml:space="preserve">A similar misalignment occurs when assessing the provincial</w:t>
+      </w:r>
+      <w:r>
+        <w:t xml:space="preserve"> </w:t>
+      </w:r>
+      <w:r>
+        <w:t xml:space="preserve">“</w:t>
       </w:r>
       <w:r>
         <w:rPr>
-          <w:b/>
-          <w:bCs/>
+          <w:i/>
+          <w:iCs/>
         </w:rPr>
-        <w:t xml:space="preserve">(Salafsky et al. 2008)</w:t>
+        <w:t xml:space="preserve">Forest And Range Practices Act</w:t>
+      </w:r>
+      <w:r>
+        <w:t xml:space="preserve">.</w:t>
+      </w:r>
+      <w:r>
+        <w:t xml:space="preserve">”</w:t>
+      </w:r>
+      <w:r>
+        <w:t xml:space="preserve"> </w:t>
+      </w:r>
+      <w:r>
+        <w:t xml:space="preserve">Since the management domain categories were derived as close as possible to the IUCN threat categories (a mix of Level 1 and Level 2), most can be viewed as equivalent</w:t>
+      </w:r>
+      <w:r>
+        <w:t xml:space="preserve"> </w:t>
+      </w:r>
+      <w:r>
+        <w:t xml:space="preserve">1</w:t>
+      </w:r>
+      <w:r>
+        <w:t xml:space="preserve">.</w:t>
       </w:r>
     </w:p>
     <w:p>
       <w:pPr>
-        <w:pStyle w:val="BodyText"/>
+        <w:pStyle w:val="TableCaption"/>
       </w:pPr>
-      <w:r>
-        <w:rPr>
-          <w:b/>
-          <w:bCs/>
-        </w:rPr>
-        <w:t xml:space="preserve">hierarchical fashion with 3 different levels (the equivalent of families, genera, and species in</w:t>
-      </w:r>
-      <w:r>
-        <w:rPr>
-          <w:b/>
-          <w:bCs/>
-        </w:rPr>
-        <w:t xml:space="preserve"> </w:t>
-      </w:r>
-      <w:r>
-        <w:rPr>
-          <w:b/>
-          <w:bCs/>
-        </w:rPr>
-        <w:t xml:space="preserve">(Salafsky et al. 2008)</w:t>
-      </w:r>
-    </w:p>
-    <w:p>
-      <w:pPr>
-        <w:pStyle w:val="BodyText"/>
-      </w:pPr>
-      <w:r>
-        <w:rPr>
-          <w:b/>
-          <w:bCs/>
-        </w:rPr>
-        <w:t xml:space="preserve">the Linnaean system). Each first-level entry (e.g., threat [1] residential and commercial development) is subdivided into several second-level entries (e.g., threat [1.1] housing and urban areas, [1.2] commercial and industrial areas, and [1.3] tourism and recreation areas), and these are in turn subdivided into numerous third-level entries.</w:t>
-      </w:r>
-      <w:r>
-        <w:rPr>
-          <w:b/>
-          <w:bCs/>
-        </w:rPr>
-        <w:t xml:space="preserve"> </w:t>
-      </w:r>
-      <w:r>
-        <w:rPr>
-          <w:b/>
-          <w:bCs/>
-        </w:rPr>
-        <w:t xml:space="preserve">(Salafsky et al. 2008)</w:t>
-      </w:r>
-    </w:p>
-    <w:p>
-      <w:pPr>
-        <w:pStyle w:val="BodyText"/>
-      </w:pPr>
-      <w:r>
-        <w:rPr>
-          <w:b/>
-          <w:bCs/>
-        </w:rPr>
-        <w:t xml:space="preserve">The classifications are designed to be comprehensive, consistent, and exclusive for the first and second levels. The third level, by contrast, is at a much finer scale and thus only contains some illustrative examples rather than comprehensive listings of threats and actions at this level.</w:t>
-      </w:r>
-      <w:r>
-        <w:rPr>
-          <w:b/>
-          <w:bCs/>
-        </w:rPr>
-        <w:t xml:space="preserve"> </w:t>
-      </w:r>
-      <w:r>
-        <w:rPr>
-          <w:b/>
-          <w:bCs/>
-        </w:rPr>
-        <w:t xml:space="preserve">(Salafsky et al. 2008)</w:t>
-      </w:r>
-    </w:p>
-    <w:p>
-      <w:pPr>
-        <w:pStyle w:val="BodyText"/>
-      </w:pPr>
-      <w:r>
-        <w:rPr>
-          <w:b/>
-          <w:bCs/>
-        </w:rPr>
-        <w:t xml:space="preserve">One widely used risk assessment framework for Pacific salmon is the</w:t>
-      </w:r>
-      <w:r>
-        <w:rPr>
-          <w:b/>
-          <w:bCs/>
-        </w:rPr>
-        <w:t xml:space="preserve"> </w:t>
-      </w:r>
-      <w:r>
-        <w:rPr>
-          <w:b/>
-          <w:bCs/>
-          <w:i/>
-          <w:iCs/>
-        </w:rPr>
-        <w:t xml:space="preserve">International Union for Conservation of Nature</w:t>
-      </w:r>
-      <w:r>
-        <w:rPr>
-          <w:b/>
-          <w:bCs/>
-        </w:rPr>
-        <w:t xml:space="preserve"> </w:t>
-      </w:r>
-      <w:r>
-        <w:rPr>
-          <w:b/>
-          <w:bCs/>
-        </w:rPr>
-        <w:t xml:space="preserve">(IUCN)</w:t>
-      </w:r>
-      <w:r>
-        <w:rPr>
-          <w:b/>
-          <w:bCs/>
-        </w:rPr>
-        <w:t xml:space="preserve"> </w:t>
-      </w:r>
-      <w:r>
-        <w:rPr>
-          <w:b/>
-          <w:bCs/>
-          <w:i/>
-          <w:iCs/>
-        </w:rPr>
-        <w:t xml:space="preserve">Direct Threats Classification</w:t>
-      </w:r>
-      <w:r>
-        <w:rPr>
-          <w:b/>
-          <w:bCs/>
-        </w:rPr>
-        <w:t xml:space="preserve">(Salafsky et al. 2008)</w:t>
-      </w:r>
-      <w:r>
-        <w:rPr>
-          <w:b/>
-          <w:bCs/>
-        </w:rPr>
-        <w:t xml:space="preserve">, which is applied for Recovery Potential Assessments as part of</w:t>
-      </w:r>
-      <w:r>
-        <w:rPr>
-          <w:b/>
-          <w:bCs/>
-        </w:rPr>
-        <w:t xml:space="preserve"> </w:t>
-      </w:r>
-      <w:r>
-        <w:rPr>
-          <w:b/>
-          <w:bCs/>
-          <w:i/>
-          <w:iCs/>
-        </w:rPr>
-        <w:t xml:space="preserve">Species at Risk Act</w:t>
-      </w:r>
-      <w:r>
-        <w:rPr>
-          <w:b/>
-          <w:bCs/>
-        </w:rPr>
-        <w:t xml:space="preserve"> </w:t>
-      </w:r>
-      <w:r>
-        <w:rPr>
-          <w:b/>
-          <w:bCs/>
-        </w:rPr>
-        <w:t xml:space="preserve">listing processes and for Committee on the Status of Endangered Wildlife in Canada (COSEWIC) status assessments</w:t>
-      </w:r>
-      <w:r>
-        <w:rPr>
-          <w:b/>
-          <w:bCs/>
-        </w:rPr>
-        <w:t xml:space="preserve"> </w:t>
-      </w:r>
-      <w:r>
-        <w:rPr>
-          <w:b/>
-          <w:bCs/>
-        </w:rPr>
-        <w:t xml:space="preserve">(Arbeider et al. 2020; Dionne 2023; Doutaz et al. 2023)</w:t>
-      </w:r>
-      <w:r>
-        <w:rPr>
-          <w:b/>
-          <w:bCs/>
-        </w:rPr>
-        <w:t xml:space="preserve">.</w:t>
+      <w:bookmarkStart w:id="24" w:name="tab:management-domain-threat-table"/>
+      <w:bookmarkEnd w:id="24"/>
+      <w:r>
+        <w:t xml:space="preserve">Table 1:</w:t>
+      </w:r>
+      <w:r>
+        <w:t xml:space="preserve"> </w:t>
+      </w:r>
+      <w:r>
+        <w:t xml:space="preserve">Management domains and corresponding IUCN threat categories.</w:t>
       </w:r>
     </w:p>
     <w:tbl xmlns:w="http://schemas.openxmlformats.org/wordprocessingml/2006/main" xmlns:r="http://schemas.openxmlformats.org/officeDocument/2006/relationships" xmlns:w14="http://schemas.microsoft.com/office/word/2010/wordml" xmlns:wp="http://schemas.openxmlformats.org/drawingml/2006/wordprocessingDrawing" xmlns:a="http://schemas.openxmlformats.org/drawingml/2006/main" xmlns:pic="http://schemas.openxmlformats.org/drawingml/2006/picture">
@@ -1242,8 +1150,8 @@
       </w:tblPr>
       <w:tblGrid>
         <w:gridCol w:w="2592"/>
-        <w:gridCol w:w="2880"/>
-        <w:gridCol w:w="3168"/>
+        <w:gridCol w:w="3600"/>
+        <w:gridCol w:w="3312"/>
       </w:tblGrid>
       <w:tr>
         <w:trPr>
@@ -1355,7 +1263,7 @@
                 <w:szCs w:val="22"/>
                 <w:color w:val="000000"/>
               </w:rPr>
-              <w:t xml:space="preserve">IUCN Level 1</w:t>
+              <w:t xml:space="preserve">IUCN Level 2</w:t>
             </w:r>
           </w:p>
         </w:tc>
@@ -1409,7 +1317,7 @@
                 <w:szCs w:val="22"/>
                 <w:color w:val="000000"/>
               </w:rPr>
-              <w:t xml:space="preserve">IUCN Level 2</w:t>
+              <w:t xml:space="preserve">IUCN Level 1</w:t>
             </w:r>
           </w:p>
         </w:tc>
@@ -1475,7 +1383,6 @@
         </w:tc>
         <w:tc>
           <w:tcPr>
-            <w:vMerge w:val="restart"/>
             <w:tcBorders>
               <w:bottom w:val="single" w:sz="8" w:space="0" w:color="CCCCCC"/>
               <w:top w:val="single" w:sz="12" w:space="0" w:color="666666"/>
@@ -1524,12 +1431,13 @@
                 <w:szCs w:val="22"/>
                 <w:color w:val="000000"/>
               </w:rPr>
-              <w:t xml:space="preserve">Agriculture &amp; Aquaculture</w:t>
-            </w:r>
-          </w:p>
-        </w:tc>
-        <w:tc>
-          <w:tcPr>
+              <w:t xml:space="preserve">2.1 Annual &amp; Perennial Non-Timber Crops</w:t>
+            </w:r>
+          </w:p>
+        </w:tc>
+        <w:tc>
+          <w:tcPr>
+            <w:vMerge w:val="restart"/>
             <w:tcBorders>
               <w:bottom w:val="single" w:sz="8" w:space="0" w:color="CCCCCC"/>
               <w:top w:val="single" w:sz="12" w:space="0" w:color="666666"/>
@@ -1578,7 +1486,7 @@
                 <w:szCs w:val="22"/>
                 <w:color w:val="000000"/>
               </w:rPr>
-              <w:t xml:space="preserve">Annual &amp; Perennial Non-Timber Crops</w:t>
+              <w:t xml:space="preserve">2. Agriculture &amp; Aquaculture</w:t>
             </w:r>
           </w:p>
         </w:tc>
@@ -1645,7 +1553,6 @@
         </w:tc>
         <w:tc>
           <w:tcPr>
-            <w:vMerge/>
             <w:tcBorders>
               <w:bottom w:val="single" w:sz="8" w:space="0" w:color="CCCCCC"/>
               <w:top w:val="single" w:sz="8" w:space="0" w:color="CCCCCC"/>
@@ -1683,10 +1590,24 @@
                 <w:color w:val="000000"/>
               </w:rPr>
             </w:pPr>
-          </w:p>
-        </w:tc>
-        <w:tc>
-          <w:tcPr>
+            <w:r xmlns:w="http://schemas.openxmlformats.org/wordprocessingml/2006/main" xmlns:wp="http://schemas.openxmlformats.org/drawingml/2006/wordprocessingDrawing" xmlns:r="http://schemas.openxmlformats.org/officeDocument/2006/relationships" xmlns:w14="http://schemas.microsoft.com/office/word/2010/wordml">
+              <w:rPr>
+                <w:rFonts w:ascii="Arial" w:hAnsi="Arial" w:eastAsia="Arial" w:cs="Arial"/>
+                <w:i w:val="false"/>
+                <w:b w:val="false"/>
+                <w:u w:val="none"/>
+                <w:strike w:val="false"/>
+                <w:sz w:val="22"/>
+                <w:szCs w:val="22"/>
+                <w:color w:val="000000"/>
+              </w:rPr>
+              <w:t xml:space="preserve">2.4 Marine &amp; Freshwater Aquaculture</w:t>
+            </w:r>
+          </w:p>
+        </w:tc>
+        <w:tc>
+          <w:tcPr>
+            <w:vMerge/>
             <w:tcBorders>
               <w:bottom w:val="single" w:sz="8" w:space="0" w:color="CCCCCC"/>
               <w:top w:val="single" w:sz="8" w:space="0" w:color="CCCCCC"/>
@@ -1724,19 +1645,6 @@
                 <w:color w:val="000000"/>
               </w:rPr>
             </w:pPr>
-            <w:r xmlns:w="http://schemas.openxmlformats.org/wordprocessingml/2006/main" xmlns:wp="http://schemas.openxmlformats.org/drawingml/2006/wordprocessingDrawing" xmlns:r="http://schemas.openxmlformats.org/officeDocument/2006/relationships" xmlns:w14="http://schemas.microsoft.com/office/word/2010/wordml">
-              <w:rPr>
-                <w:rFonts w:ascii="Arial" w:hAnsi="Arial" w:eastAsia="Arial" w:cs="Arial"/>
-                <w:i w:val="false"/>
-                <w:b w:val="false"/>
-                <w:u w:val="none"/>
-                <w:strike w:val="false"/>
-                <w:sz w:val="22"/>
-                <w:szCs w:val="22"/>
-                <w:color w:val="000000"/>
-              </w:rPr>
-              <w:t xml:space="preserve">Marine &amp; Freshwater Aquaculture</w:t>
-            </w:r>
           </w:p>
         </w:tc>
       </w:tr>
@@ -1837,7 +1745,7 @@
                 <w:szCs w:val="22"/>
                 <w:color w:val="000000"/>
               </w:rPr>
-              <w:t xml:space="preserve">Invasive / Other Problematic Species, Genes &amp; Pathogens</w:t>
+              <w:t xml:space="preserve">8.3 Introduced Genetic Material</w:t>
             </w:r>
           </w:p>
         </w:tc>
@@ -1891,7 +1799,7 @@
                 <w:szCs w:val="22"/>
                 <w:color w:val="000000"/>
               </w:rPr>
-              <w:t xml:space="preserve">Introduced Genetic Material</w:t>
+              <w:t xml:space="preserve">8. Invasive / Other Problematic Species, Genes &amp; Pathogens</w:t>
             </w:r>
           </w:p>
         </w:tc>
@@ -2006,7 +1914,7 @@
                 <w:szCs w:val="22"/>
                 <w:color w:val="000000"/>
               </w:rPr>
-              <w:t xml:space="preserve">Natural Disasters</w:t>
+              <w:t xml:space="preserve">10.1 Geological Events</w:t>
             </w:r>
           </w:p>
         </w:tc>
@@ -2060,7 +1968,7 @@
                 <w:szCs w:val="22"/>
                 <w:color w:val="000000"/>
               </w:rPr>
-              <w:t xml:space="preserve">Geological Events</w:t>
+              <w:t xml:space="preserve">10. Natural Disasters</w:t>
             </w:r>
           </w:p>
         </w:tc>
@@ -2114,7 +2022,6 @@
         </w:tc>
         <w:tc>
           <w:tcPr>
-            <w:vMerge w:val="restart"/>
             <w:tcBorders>
               <w:bottom w:val="single" w:sz="8" w:space="0" w:color="CCCCCC"/>
               <w:top w:val="single" w:sz="8" w:space="0" w:color="CCCCCC"/>
@@ -2163,12 +2070,13 @@
                 <w:szCs w:val="22"/>
                 <w:color w:val="000000"/>
               </w:rPr>
-              <w:t xml:space="preserve">Climate Change</w:t>
-            </w:r>
-          </w:p>
-        </w:tc>
-        <w:tc>
-          <w:tcPr>
+              <w:t xml:space="preserve">11.2 Changes in Temperature Regimes</w:t>
+            </w:r>
+          </w:p>
+        </w:tc>
+        <w:tc>
+          <w:tcPr>
+            <w:vMerge w:val="restart"/>
             <w:tcBorders>
               <w:bottom w:val="single" w:sz="8" w:space="0" w:color="CCCCCC"/>
               <w:top w:val="single" w:sz="8" w:space="0" w:color="CCCCCC"/>
@@ -2217,7 +2125,7 @@
                 <w:szCs w:val="22"/>
                 <w:color w:val="000000"/>
               </w:rPr>
-              <w:t xml:space="preserve">Changes in Temperature Regimes</w:t>
+              <w:t xml:space="preserve">11. Climate Change</w:t>
             </w:r>
           </w:p>
         </w:tc>
@@ -2271,7 +2179,6 @@
         </w:tc>
         <w:tc>
           <w:tcPr>
-            <w:vMerge/>
             <w:tcBorders>
               <w:bottom w:val="single" w:sz="8" w:space="0" w:color="CCCCCC"/>
               <w:top w:val="single" w:sz="8" w:space="0" w:color="CCCCCC"/>
@@ -2309,10 +2216,24 @@
                 <w:color w:val="000000"/>
               </w:rPr>
             </w:pPr>
-          </w:p>
-        </w:tc>
-        <w:tc>
-          <w:tcPr>
+            <w:r xmlns:w="http://schemas.openxmlformats.org/wordprocessingml/2006/main" xmlns:wp="http://schemas.openxmlformats.org/drawingml/2006/wordprocessingDrawing" xmlns:r="http://schemas.openxmlformats.org/officeDocument/2006/relationships" xmlns:w14="http://schemas.microsoft.com/office/word/2010/wordml">
+              <w:rPr>
+                <w:rFonts w:ascii="Arial" w:hAnsi="Arial" w:eastAsia="Arial" w:cs="Arial"/>
+                <w:i w:val="false"/>
+                <w:b w:val="false"/>
+                <w:u w:val="none"/>
+                <w:strike w:val="false"/>
+                <w:sz w:val="22"/>
+                <w:szCs w:val="22"/>
+                <w:color w:val="000000"/>
+              </w:rPr>
+              <w:t xml:space="preserve">11.3 Changes in Precipitation &amp; Hydrological Regimes</w:t>
+            </w:r>
+          </w:p>
+        </w:tc>
+        <w:tc>
+          <w:tcPr>
+            <w:vMerge/>
             <w:tcBorders>
               <w:bottom w:val="single" w:sz="8" w:space="0" w:color="CCCCCC"/>
               <w:top w:val="single" w:sz="8" w:space="0" w:color="CCCCCC"/>
@@ -2350,19 +2271,6 @@
                 <w:color w:val="000000"/>
               </w:rPr>
             </w:pPr>
-            <w:r xmlns:w="http://schemas.openxmlformats.org/wordprocessingml/2006/main" xmlns:wp="http://schemas.openxmlformats.org/drawingml/2006/wordprocessingDrawing" xmlns:r="http://schemas.openxmlformats.org/officeDocument/2006/relationships" xmlns:w14="http://schemas.microsoft.com/office/word/2010/wordml">
-              <w:rPr>
-                <w:rFonts w:ascii="Arial" w:hAnsi="Arial" w:eastAsia="Arial" w:cs="Arial"/>
-                <w:i w:val="false"/>
-                <w:b w:val="false"/>
-                <w:u w:val="none"/>
-                <w:strike w:val="false"/>
-                <w:sz w:val="22"/>
-                <w:szCs w:val="22"/>
-                <w:color w:val="000000"/>
-              </w:rPr>
-              <w:t xml:space="preserve">Changes in Precipitation &amp; Hydrological Regimes</w:t>
-            </w:r>
           </w:p>
         </w:tc>
       </w:tr>
@@ -2475,7 +2383,7 @@
                 <w:szCs w:val="22"/>
                 <w:color w:val="000000"/>
               </w:rPr>
-              <w:t xml:space="preserve">Biological Resource Use &amp; Control</w:t>
+              <w:t xml:space="preserve">5.4 Fishing, Harvesting &amp; Controlling Aquatic Species</w:t>
             </w:r>
           </w:p>
         </w:tc>
@@ -2529,7 +2437,7 @@
                 <w:szCs w:val="22"/>
                 <w:color w:val="000000"/>
               </w:rPr>
-              <w:t xml:space="preserve">Fishing, Harvesting &amp; Controlling Aquatic Species</w:t>
+              <w:t xml:space="preserve">5. Biological Resource Use &amp; Control</w:t>
             </w:r>
           </w:p>
         </w:tc>
@@ -2596,7 +2504,6 @@
         </w:tc>
         <w:tc>
           <w:tcPr>
-            <w:vMerge w:val="restart"/>
             <w:tcBorders>
               <w:bottom w:val="single" w:sz="8" w:space="0" w:color="CCCCCC"/>
               <w:top w:val="single" w:sz="8" w:space="0" w:color="CCCCCC"/>
@@ -2645,12 +2552,13 @@
                 <w:szCs w:val="22"/>
                 <w:color w:val="000000"/>
               </w:rPr>
-              <w:t xml:space="preserve">Agriculture &amp; Aquaculture</w:t>
-            </w:r>
-          </w:p>
-        </w:tc>
-        <w:tc>
-          <w:tcPr>
+              <w:t xml:space="preserve">2.2 Wood &amp; Pulp Plantations</w:t>
+            </w:r>
+          </w:p>
+        </w:tc>
+        <w:tc>
+          <w:tcPr>
+            <w:vMerge w:val="restart"/>
             <w:tcBorders>
               <w:bottom w:val="single" w:sz="8" w:space="0" w:color="CCCCCC"/>
               <w:top w:val="single" w:sz="8" w:space="0" w:color="CCCCCC"/>
@@ -2699,7 +2607,7 @@
                 <w:szCs w:val="22"/>
                 <w:color w:val="000000"/>
               </w:rPr>
-              <w:t xml:space="preserve">Wood &amp; Pulp Plantations</w:t>
+              <w:t xml:space="preserve">2. Agriculture &amp; Aquaculture</w:t>
             </w:r>
           </w:p>
         </w:tc>
@@ -2753,7 +2661,6 @@
         </w:tc>
         <w:tc>
           <w:tcPr>
-            <w:vMerge/>
             <w:tcBorders>
               <w:bottom w:val="single" w:sz="8" w:space="0" w:color="CCCCCC"/>
               <w:top w:val="single" w:sz="8" w:space="0" w:color="CCCCCC"/>
@@ -2791,10 +2698,24 @@
                 <w:color w:val="000000"/>
               </w:rPr>
             </w:pPr>
-          </w:p>
-        </w:tc>
-        <w:tc>
-          <w:tcPr>
+            <w:r xmlns:w="http://schemas.openxmlformats.org/wordprocessingml/2006/main" xmlns:wp="http://schemas.openxmlformats.org/drawingml/2006/wordprocessingDrawing" xmlns:r="http://schemas.openxmlformats.org/officeDocument/2006/relationships" xmlns:w14="http://schemas.microsoft.com/office/word/2010/wordml">
+              <w:rPr>
+                <w:rFonts w:ascii="Arial" w:hAnsi="Arial" w:eastAsia="Arial" w:cs="Arial"/>
+                <w:i w:val="false"/>
+                <w:b w:val="false"/>
+                <w:u w:val="none"/>
+                <w:strike w:val="false"/>
+                <w:sz w:val="22"/>
+                <w:szCs w:val="22"/>
+                <w:color w:val="000000"/>
+              </w:rPr>
+              <w:t xml:space="preserve">2.3 Terrestrial Animal Farming, Ranching &amp; Herding</w:t>
+            </w:r>
+          </w:p>
+        </w:tc>
+        <w:tc>
+          <w:tcPr>
+            <w:vMerge/>
             <w:tcBorders>
               <w:bottom w:val="single" w:sz="8" w:space="0" w:color="CCCCCC"/>
               <w:top w:val="single" w:sz="8" w:space="0" w:color="CCCCCC"/>
@@ -2832,19 +2753,6 @@
                 <w:color w:val="000000"/>
               </w:rPr>
             </w:pPr>
-            <w:r xmlns:w="http://schemas.openxmlformats.org/wordprocessingml/2006/main" xmlns:wp="http://schemas.openxmlformats.org/drawingml/2006/wordprocessingDrawing" xmlns:r="http://schemas.openxmlformats.org/officeDocument/2006/relationships" xmlns:w14="http://schemas.microsoft.com/office/word/2010/wordml">
-              <w:rPr>
-                <w:rFonts w:ascii="Arial" w:hAnsi="Arial" w:eastAsia="Arial" w:cs="Arial"/>
-                <w:i w:val="false"/>
-                <w:b w:val="false"/>
-                <w:u w:val="none"/>
-                <w:strike w:val="false"/>
-                <w:sz w:val="22"/>
-                <w:szCs w:val="22"/>
-                <w:color w:val="000000"/>
-              </w:rPr>
-              <w:t xml:space="preserve">Terrestrial Animal Farming, Ranching &amp; Herding</w:t>
-            </w:r>
           </w:p>
         </w:tc>
       </w:tr>
@@ -2945,7 +2853,7 @@
                 <w:szCs w:val="22"/>
                 <w:color w:val="000000"/>
               </w:rPr>
-              <w:t xml:space="preserve">Biological Resource Use &amp; Control</w:t>
+              <w:t xml:space="preserve">5.3 Logging, Harvesting &amp; Controlling Trees</w:t>
             </w:r>
           </w:p>
         </w:tc>
@@ -2999,7 +2907,7 @@
                 <w:szCs w:val="22"/>
                 <w:color w:val="000000"/>
               </w:rPr>
-              <w:t xml:space="preserve">Logging, Harvesting &amp; Controlling Trees</w:t>
+              <w:t xml:space="preserve">5. Biological Resource Use &amp; Control</w:t>
             </w:r>
           </w:p>
         </w:tc>
@@ -3113,7 +3021,7 @@
                 <w:szCs w:val="22"/>
                 <w:color w:val="000000"/>
               </w:rPr>
-              <w:t xml:space="preserve">Human Intrusions &amp; Disturbances</w:t>
+              <w:t xml:space="preserve">6.3 Other Human Disturbances</w:t>
             </w:r>
           </w:p>
         </w:tc>
@@ -3167,7 +3075,7 @@
                 <w:szCs w:val="22"/>
                 <w:color w:val="000000"/>
               </w:rPr>
-              <w:t xml:space="preserve">Other Human Disturbances</w:t>
+              <w:t xml:space="preserve">6. Human Intrusions &amp; Disturbances</w:t>
             </w:r>
           </w:p>
         </w:tc>
@@ -3234,7 +3142,6 @@
         </w:tc>
         <w:tc>
           <w:tcPr>
-            <w:vMerge w:val="restart"/>
             <w:tcBorders>
               <w:bottom w:val="single" w:sz="8" w:space="0" w:color="CCCCCC"/>
               <w:top w:val="single" w:sz="8" w:space="0" w:color="CCCCCC"/>
@@ -3283,12 +3190,13 @@
                 <w:szCs w:val="22"/>
                 <w:color w:val="000000"/>
               </w:rPr>
-              <w:t xml:space="preserve">Invasive / Other Problematic Species, Genes &amp; Pathogens</w:t>
-            </w:r>
-          </w:p>
-        </w:tc>
-        <w:tc>
-          <w:tcPr>
+              <w:t xml:space="preserve">8.1 Invasive Non-Native / Alien Species</w:t>
+            </w:r>
+          </w:p>
+        </w:tc>
+        <w:tc>
+          <w:tcPr>
+            <w:vMerge w:val="restart"/>
             <w:tcBorders>
               <w:bottom w:val="single" w:sz="8" w:space="0" w:color="CCCCCC"/>
               <w:top w:val="single" w:sz="8" w:space="0" w:color="CCCCCC"/>
@@ -3337,7 +3245,7 @@
                 <w:szCs w:val="22"/>
                 <w:color w:val="000000"/>
               </w:rPr>
-              <w:t xml:space="preserve">Invasive Non-Native / Alien Species</w:t>
+              <w:t xml:space="preserve">8. Invasive / Other Problematic Species, Genes &amp; Pathogens</w:t>
             </w:r>
           </w:p>
         </w:tc>
@@ -3391,7 +3299,6 @@
         </w:tc>
         <w:tc>
           <w:tcPr>
-            <w:vMerge/>
             <w:tcBorders>
               <w:bottom w:val="single" w:sz="8" w:space="0" w:color="CCCCCC"/>
               <w:top w:val="single" w:sz="8" w:space="0" w:color="CCCCCC"/>
@@ -3429,10 +3336,24 @@
                 <w:color w:val="000000"/>
               </w:rPr>
             </w:pPr>
-          </w:p>
-        </w:tc>
-        <w:tc>
-          <w:tcPr>
+            <w:r xmlns:w="http://schemas.openxmlformats.org/wordprocessingml/2006/main" xmlns:wp="http://schemas.openxmlformats.org/drawingml/2006/wordprocessingDrawing" xmlns:r="http://schemas.openxmlformats.org/officeDocument/2006/relationships" xmlns:w14="http://schemas.microsoft.com/office/word/2010/wordml">
+              <w:rPr>
+                <w:rFonts w:ascii="Arial" w:hAnsi="Arial" w:eastAsia="Arial" w:cs="Arial"/>
+                <w:i w:val="false"/>
+                <w:b w:val="false"/>
+                <w:u w:val="none"/>
+                <w:strike w:val="false"/>
+                <w:sz w:val="22"/>
+                <w:szCs w:val="22"/>
+                <w:color w:val="000000"/>
+              </w:rPr>
+              <w:t xml:space="preserve">8.2 Problematic Native Species</w:t>
+            </w:r>
+          </w:p>
+        </w:tc>
+        <w:tc>
+          <w:tcPr>
+            <w:vMerge/>
             <w:tcBorders>
               <w:bottom w:val="single" w:sz="8" w:space="0" w:color="CCCCCC"/>
               <w:top w:val="single" w:sz="8" w:space="0" w:color="CCCCCC"/>
@@ -3470,19 +3391,6 @@
                 <w:color w:val="000000"/>
               </w:rPr>
             </w:pPr>
-            <w:r xmlns:w="http://schemas.openxmlformats.org/wordprocessingml/2006/main" xmlns:wp="http://schemas.openxmlformats.org/drawingml/2006/wordprocessingDrawing" xmlns:r="http://schemas.openxmlformats.org/officeDocument/2006/relationships" xmlns:w14="http://schemas.microsoft.com/office/word/2010/wordml">
-              <w:rPr>
-                <w:rFonts w:ascii="Arial" w:hAnsi="Arial" w:eastAsia="Arial" w:cs="Arial"/>
-                <w:i w:val="false"/>
-                <w:b w:val="false"/>
-                <w:u w:val="none"/>
-                <w:strike w:val="false"/>
-                <w:sz w:val="22"/>
-                <w:szCs w:val="22"/>
-                <w:color w:val="000000"/>
-              </w:rPr>
-              <w:t xml:space="preserve">Problematic Native Species</w:t>
-            </w:r>
           </w:p>
         </w:tc>
       </w:tr>
@@ -3535,7 +3443,6 @@
         </w:tc>
         <w:tc>
           <w:tcPr>
-            <w:vMerge/>
             <w:tcBorders>
               <w:bottom w:val="single" w:sz="8" w:space="0" w:color="CCCCCC"/>
               <w:top w:val="single" w:sz="8" w:space="0" w:color="CCCCCC"/>
@@ -3573,10 +3480,24 @@
                 <w:color w:val="000000"/>
               </w:rPr>
             </w:pPr>
-          </w:p>
-        </w:tc>
-        <w:tc>
-          <w:tcPr>
+            <w:r xmlns:w="http://schemas.openxmlformats.org/wordprocessingml/2006/main" xmlns:wp="http://schemas.openxmlformats.org/drawingml/2006/wordprocessingDrawing" xmlns:r="http://schemas.openxmlformats.org/officeDocument/2006/relationships" xmlns:w14="http://schemas.microsoft.com/office/word/2010/wordml">
+              <w:rPr>
+                <w:rFonts w:ascii="Arial" w:hAnsi="Arial" w:eastAsia="Arial" w:cs="Arial"/>
+                <w:i w:val="false"/>
+                <w:b w:val="false"/>
+                <w:u w:val="none"/>
+                <w:strike w:val="false"/>
+                <w:sz w:val="22"/>
+                <w:szCs w:val="22"/>
+                <w:color w:val="000000"/>
+              </w:rPr>
+              <w:t xml:space="preserve">8.4 Pathogens</w:t>
+            </w:r>
+          </w:p>
+        </w:tc>
+        <w:tc>
+          <w:tcPr>
+            <w:vMerge/>
             <w:tcBorders>
               <w:bottom w:val="single" w:sz="8" w:space="0" w:color="CCCCCC"/>
               <w:top w:val="single" w:sz="8" w:space="0" w:color="CCCCCC"/>
@@ -3614,19 +3535,6 @@
                 <w:color w:val="000000"/>
               </w:rPr>
             </w:pPr>
-            <w:r xmlns:w="http://schemas.openxmlformats.org/wordprocessingml/2006/main" xmlns:wp="http://schemas.openxmlformats.org/drawingml/2006/wordprocessingDrawing" xmlns:r="http://schemas.openxmlformats.org/officeDocument/2006/relationships" xmlns:w14="http://schemas.microsoft.com/office/word/2010/wordml">
-              <w:rPr>
-                <w:rFonts w:ascii="Arial" w:hAnsi="Arial" w:eastAsia="Arial" w:cs="Arial"/>
-                <w:i w:val="false"/>
-                <w:b w:val="false"/>
-                <w:u w:val="none"/>
-                <w:strike w:val="false"/>
-                <w:sz w:val="22"/>
-                <w:szCs w:val="22"/>
-                <w:color w:val="000000"/>
-              </w:rPr>
-              <w:t xml:space="preserve">Pathogens</w:t>
-            </w:r>
           </w:p>
         </w:tc>
       </w:tr>
@@ -3692,7 +3600,6 @@
         </w:tc>
         <w:tc>
           <w:tcPr>
-            <w:vMerge w:val="restart"/>
             <w:tcBorders>
               <w:bottom w:val="single" w:sz="8" w:space="0" w:color="CCCCCC"/>
               <w:top w:val="single" w:sz="8" w:space="0" w:color="CCCCCC"/>
@@ -3741,12 +3648,13 @@
                 <w:szCs w:val="22"/>
                 <w:color w:val="000000"/>
               </w:rPr>
-              <w:t xml:space="preserve">Energy Production &amp; Mining</w:t>
-            </w:r>
-          </w:p>
-        </w:tc>
-        <w:tc>
-          <w:tcPr>
+              <w:t xml:space="preserve">3.1 Oil &amp; Gas Exploration &amp; Extraction</w:t>
+            </w:r>
+          </w:p>
+        </w:tc>
+        <w:tc>
+          <w:tcPr>
+            <w:vMerge w:val="restart"/>
             <w:tcBorders>
               <w:bottom w:val="single" w:sz="8" w:space="0" w:color="CCCCCC"/>
               <w:top w:val="single" w:sz="8" w:space="0" w:color="CCCCCC"/>
@@ -3795,7 +3703,7 @@
                 <w:szCs w:val="22"/>
                 <w:color w:val="000000"/>
               </w:rPr>
-              <w:t xml:space="preserve">Oil &amp; Gas Exploration &amp; Extraction</w:t>
+              <w:t xml:space="preserve">3. Energy Production &amp; Mining</w:t>
             </w:r>
           </w:p>
         </w:tc>
@@ -3849,7 +3757,6 @@
         </w:tc>
         <w:tc>
           <w:tcPr>
-            <w:vMerge/>
             <w:tcBorders>
               <w:bottom w:val="single" w:sz="8" w:space="0" w:color="CCCCCC"/>
               <w:top w:val="single" w:sz="8" w:space="0" w:color="CCCCCC"/>
@@ -3887,10 +3794,24 @@
                 <w:color w:val="000000"/>
               </w:rPr>
             </w:pPr>
-          </w:p>
-        </w:tc>
-        <w:tc>
-          <w:tcPr>
+            <w:r xmlns:w="http://schemas.openxmlformats.org/wordprocessingml/2006/main" xmlns:wp="http://schemas.openxmlformats.org/drawingml/2006/wordprocessingDrawing" xmlns:r="http://schemas.openxmlformats.org/officeDocument/2006/relationships" xmlns:w14="http://schemas.microsoft.com/office/word/2010/wordml">
+              <w:rPr>
+                <w:rFonts w:ascii="Arial" w:hAnsi="Arial" w:eastAsia="Arial" w:cs="Arial"/>
+                <w:i w:val="false"/>
+                <w:b w:val="false"/>
+                <w:u w:val="none"/>
+                <w:strike w:val="false"/>
+                <w:sz w:val="22"/>
+                <w:szCs w:val="22"/>
+                <w:color w:val="000000"/>
+              </w:rPr>
+              <w:t xml:space="preserve">3.2 Mining &amp; Quarrying</w:t>
+            </w:r>
+          </w:p>
+        </w:tc>
+        <w:tc>
+          <w:tcPr>
+            <w:vMerge/>
             <w:tcBorders>
               <w:bottom w:val="single" w:sz="8" w:space="0" w:color="CCCCCC"/>
               <w:top w:val="single" w:sz="8" w:space="0" w:color="CCCCCC"/>
@@ -3928,19 +3849,6 @@
                 <w:color w:val="000000"/>
               </w:rPr>
             </w:pPr>
-            <w:r xmlns:w="http://schemas.openxmlformats.org/wordprocessingml/2006/main" xmlns:wp="http://schemas.openxmlformats.org/drawingml/2006/wordprocessingDrawing" xmlns:r="http://schemas.openxmlformats.org/officeDocument/2006/relationships" xmlns:w14="http://schemas.microsoft.com/office/word/2010/wordml">
-              <w:rPr>
-                <w:rFonts w:ascii="Arial" w:hAnsi="Arial" w:eastAsia="Arial" w:cs="Arial"/>
-                <w:i w:val="false"/>
-                <w:b w:val="false"/>
-                <w:u w:val="none"/>
-                <w:strike w:val="false"/>
-                <w:sz w:val="22"/>
-                <w:szCs w:val="22"/>
-                <w:color w:val="000000"/>
-              </w:rPr>
-              <w:t xml:space="preserve">Mining &amp; Quarrying</w:t>
-            </w:r>
           </w:p>
         </w:tc>
       </w:tr>
@@ -3993,7 +3901,6 @@
         </w:tc>
         <w:tc>
           <w:tcPr>
-            <w:vMerge/>
             <w:tcBorders>
               <w:bottom w:val="single" w:sz="8" w:space="0" w:color="CCCCCC"/>
               <w:top w:val="single" w:sz="8" w:space="0" w:color="CCCCCC"/>
@@ -4031,10 +3938,24 @@
                 <w:color w:val="000000"/>
               </w:rPr>
             </w:pPr>
-          </w:p>
-        </w:tc>
-        <w:tc>
-          <w:tcPr>
+            <w:r xmlns:w="http://schemas.openxmlformats.org/wordprocessingml/2006/main" xmlns:wp="http://schemas.openxmlformats.org/drawingml/2006/wordprocessingDrawing" xmlns:r="http://schemas.openxmlformats.org/officeDocument/2006/relationships" xmlns:w14="http://schemas.microsoft.com/office/word/2010/wordml">
+              <w:rPr>
+                <w:rFonts w:ascii="Arial" w:hAnsi="Arial" w:eastAsia="Arial" w:cs="Arial"/>
+                <w:i w:val="false"/>
+                <w:b w:val="false"/>
+                <w:u w:val="none"/>
+                <w:strike w:val="false"/>
+                <w:sz w:val="22"/>
+                <w:szCs w:val="22"/>
+                <w:color w:val="000000"/>
+              </w:rPr>
+              <w:t xml:space="preserve">3.3 Renewable Energy</w:t>
+            </w:r>
+          </w:p>
+        </w:tc>
+        <w:tc>
+          <w:tcPr>
+            <w:vMerge/>
             <w:tcBorders>
               <w:bottom w:val="single" w:sz="8" w:space="0" w:color="CCCCCC"/>
               <w:top w:val="single" w:sz="8" w:space="0" w:color="CCCCCC"/>
@@ -4072,19 +3993,6 @@
                 <w:color w:val="000000"/>
               </w:rPr>
             </w:pPr>
-            <w:r xmlns:w="http://schemas.openxmlformats.org/wordprocessingml/2006/main" xmlns:wp="http://schemas.openxmlformats.org/drawingml/2006/wordprocessingDrawing" xmlns:r="http://schemas.openxmlformats.org/officeDocument/2006/relationships" xmlns:w14="http://schemas.microsoft.com/office/word/2010/wordml">
-              <w:rPr>
-                <w:rFonts w:ascii="Arial" w:hAnsi="Arial" w:eastAsia="Arial" w:cs="Arial"/>
-                <w:i w:val="false"/>
-                <w:b w:val="false"/>
-                <w:u w:val="none"/>
-                <w:strike w:val="false"/>
-                <w:sz w:val="22"/>
-                <w:szCs w:val="22"/>
-                <w:color w:val="000000"/>
-              </w:rPr>
-              <w:t xml:space="preserve">Renewable Energy</w:t>
-            </w:r>
           </w:p>
         </w:tc>
       </w:tr>
@@ -4150,7 +4058,6 @@
         </w:tc>
         <w:tc>
           <w:tcPr>
-            <w:vMerge w:val="restart"/>
             <w:tcBorders>
               <w:bottom w:val="single" w:sz="8" w:space="0" w:color="CCCCCC"/>
               <w:top w:val="single" w:sz="8" w:space="0" w:color="CCCCCC"/>
@@ -4199,12 +4106,13 @@
                 <w:szCs w:val="22"/>
                 <w:color w:val="000000"/>
               </w:rPr>
-              <w:t xml:space="preserve">Pollution</w:t>
-            </w:r>
-          </w:p>
-        </w:tc>
-        <w:tc>
-          <w:tcPr>
+              <w:t xml:space="preserve">9.1 Water-Borne &amp; Other Effluent Pollution</w:t>
+            </w:r>
+          </w:p>
+        </w:tc>
+        <w:tc>
+          <w:tcPr>
+            <w:vMerge w:val="restart"/>
             <w:tcBorders>
               <w:bottom w:val="single" w:sz="8" w:space="0" w:color="CCCCCC"/>
               <w:top w:val="single" w:sz="8" w:space="0" w:color="CCCCCC"/>
@@ -4253,7 +4161,7 @@
                 <w:szCs w:val="22"/>
                 <w:color w:val="000000"/>
               </w:rPr>
-              <w:t xml:space="preserve">Water-Borne &amp; Other Effluent Pollution</w:t>
+              <w:t xml:space="preserve">9. Pollution</w:t>
             </w:r>
           </w:p>
         </w:tc>
@@ -4307,7 +4215,6 @@
         </w:tc>
         <w:tc>
           <w:tcPr>
-            <w:vMerge/>
             <w:tcBorders>
               <w:bottom w:val="single" w:sz="8" w:space="0" w:color="CCCCCC"/>
               <w:top w:val="single" w:sz="8" w:space="0" w:color="CCCCCC"/>
@@ -4345,10 +4252,24 @@
                 <w:color w:val="000000"/>
               </w:rPr>
             </w:pPr>
-          </w:p>
-        </w:tc>
-        <w:tc>
-          <w:tcPr>
+            <w:r xmlns:w="http://schemas.openxmlformats.org/wordprocessingml/2006/main" xmlns:wp="http://schemas.openxmlformats.org/drawingml/2006/wordprocessingDrawing" xmlns:r="http://schemas.openxmlformats.org/officeDocument/2006/relationships" xmlns:w14="http://schemas.microsoft.com/office/word/2010/wordml">
+              <w:rPr>
+                <w:rFonts w:ascii="Arial" w:hAnsi="Arial" w:eastAsia="Arial" w:cs="Arial"/>
+                <w:i w:val="false"/>
+                <w:b w:val="false"/>
+                <w:u w:val="none"/>
+                <w:strike w:val="false"/>
+                <w:sz w:val="22"/>
+                <w:szCs w:val="22"/>
+                <w:color w:val="000000"/>
+              </w:rPr>
+              <w:t xml:space="preserve">9.2 Garbage &amp; Solid Waste</w:t>
+            </w:r>
+          </w:p>
+        </w:tc>
+        <w:tc>
+          <w:tcPr>
+            <w:vMerge/>
             <w:tcBorders>
               <w:bottom w:val="single" w:sz="8" w:space="0" w:color="CCCCCC"/>
               <w:top w:val="single" w:sz="8" w:space="0" w:color="CCCCCC"/>
@@ -4386,19 +4307,6 @@
                 <w:color w:val="000000"/>
               </w:rPr>
             </w:pPr>
-            <w:r xmlns:w="http://schemas.openxmlformats.org/wordprocessingml/2006/main" xmlns:wp="http://schemas.openxmlformats.org/drawingml/2006/wordprocessingDrawing" xmlns:r="http://schemas.openxmlformats.org/officeDocument/2006/relationships" xmlns:w14="http://schemas.microsoft.com/office/word/2010/wordml">
-              <w:rPr>
-                <w:rFonts w:ascii="Arial" w:hAnsi="Arial" w:eastAsia="Arial" w:cs="Arial"/>
-                <w:i w:val="false"/>
-                <w:b w:val="false"/>
-                <w:u w:val="none"/>
-                <w:strike w:val="false"/>
-                <w:sz w:val="22"/>
-                <w:szCs w:val="22"/>
-                <w:color w:val="000000"/>
-              </w:rPr>
-              <w:t xml:space="preserve">Garbage &amp; Solid Waste</w:t>
-            </w:r>
           </w:p>
         </w:tc>
       </w:tr>
@@ -4464,7 +4372,6 @@
         </w:tc>
         <w:tc>
           <w:tcPr>
-            <w:vMerge w:val="restart"/>
             <w:tcBorders>
               <w:bottom w:val="single" w:sz="8" w:space="0" w:color="CCCCCC"/>
               <w:top w:val="single" w:sz="8" w:space="0" w:color="CCCCCC"/>
@@ -4513,12 +4420,13 @@
                 <w:szCs w:val="22"/>
                 <w:color w:val="000000"/>
               </w:rPr>
-              <w:t xml:space="preserve">Transportation, Service &amp; Security Corridors</w:t>
-            </w:r>
-          </w:p>
-        </w:tc>
-        <w:tc>
-          <w:tcPr>
+              <w:t xml:space="preserve">4.1 Roads, Trails &amp; Railroads</w:t>
+            </w:r>
+          </w:p>
+        </w:tc>
+        <w:tc>
+          <w:tcPr>
+            <w:vMerge w:val="restart"/>
             <w:tcBorders>
               <w:bottom w:val="single" w:sz="8" w:space="0" w:color="CCCCCC"/>
               <w:top w:val="single" w:sz="8" w:space="0" w:color="CCCCCC"/>
@@ -4567,7 +4475,7 @@
                 <w:szCs w:val="22"/>
                 <w:color w:val="000000"/>
               </w:rPr>
-              <w:t xml:space="preserve">Roads, Trails &amp; Railroads</w:t>
+              <w:t xml:space="preserve">4. Transportation, Service &amp; Security Corridors</w:t>
             </w:r>
           </w:p>
         </w:tc>
@@ -4621,7 +4529,6 @@
         </w:tc>
         <w:tc>
           <w:tcPr>
-            <w:vMerge/>
             <w:tcBorders>
               <w:bottom w:val="single" w:sz="8" w:space="0" w:color="CCCCCC"/>
               <w:top w:val="single" w:sz="8" w:space="0" w:color="CCCCCC"/>
@@ -4659,10 +4566,24 @@
                 <w:color w:val="000000"/>
               </w:rPr>
             </w:pPr>
-          </w:p>
-        </w:tc>
-        <w:tc>
-          <w:tcPr>
+            <w:r xmlns:w="http://schemas.openxmlformats.org/wordprocessingml/2006/main" xmlns:wp="http://schemas.openxmlformats.org/drawingml/2006/wordprocessingDrawing" xmlns:r="http://schemas.openxmlformats.org/officeDocument/2006/relationships" xmlns:w14="http://schemas.microsoft.com/office/word/2010/wordml">
+              <w:rPr>
+                <w:rFonts w:ascii="Arial" w:hAnsi="Arial" w:eastAsia="Arial" w:cs="Arial"/>
+                <w:i w:val="false"/>
+                <w:b w:val="false"/>
+                <w:u w:val="none"/>
+                <w:strike w:val="false"/>
+                <w:sz w:val="22"/>
+                <w:szCs w:val="22"/>
+                <w:color w:val="000000"/>
+              </w:rPr>
+              <w:t xml:space="preserve">4.2 Utility &amp; Service Lines</w:t>
+            </w:r>
+          </w:p>
+        </w:tc>
+        <w:tc>
+          <w:tcPr>
+            <w:vMerge/>
             <w:tcBorders>
               <w:bottom w:val="single" w:sz="8" w:space="0" w:color="CCCCCC"/>
               <w:top w:val="single" w:sz="8" w:space="0" w:color="CCCCCC"/>
@@ -4700,19 +4621,6 @@
                 <w:color w:val="000000"/>
               </w:rPr>
             </w:pPr>
-            <w:r xmlns:w="http://schemas.openxmlformats.org/wordprocessingml/2006/main" xmlns:wp="http://schemas.openxmlformats.org/drawingml/2006/wordprocessingDrawing" xmlns:r="http://schemas.openxmlformats.org/officeDocument/2006/relationships" xmlns:w14="http://schemas.microsoft.com/office/word/2010/wordml">
-              <w:rPr>
-                <w:rFonts w:ascii="Arial" w:hAnsi="Arial" w:eastAsia="Arial" w:cs="Arial"/>
-                <w:i w:val="false"/>
-                <w:b w:val="false"/>
-                <w:u w:val="none"/>
-                <w:strike w:val="false"/>
-                <w:sz w:val="22"/>
-                <w:szCs w:val="22"/>
-                <w:color w:val="000000"/>
-              </w:rPr>
-              <w:t xml:space="preserve">Utility &amp; Service Lines</w:t>
-            </w:r>
           </w:p>
         </w:tc>
       </w:tr>
@@ -4765,7 +4673,6 @@
         </w:tc>
         <w:tc>
           <w:tcPr>
-            <w:vMerge/>
             <w:tcBorders>
               <w:bottom w:val="single" w:sz="8" w:space="0" w:color="CCCCCC"/>
               <w:top w:val="single" w:sz="8" w:space="0" w:color="CCCCCC"/>
@@ -4803,10 +4710,24 @@
                 <w:color w:val="000000"/>
               </w:rPr>
             </w:pPr>
-          </w:p>
-        </w:tc>
-        <w:tc>
-          <w:tcPr>
+            <w:r xmlns:w="http://schemas.openxmlformats.org/wordprocessingml/2006/main" xmlns:wp="http://schemas.openxmlformats.org/drawingml/2006/wordprocessingDrawing" xmlns:r="http://schemas.openxmlformats.org/officeDocument/2006/relationships" xmlns:w14="http://schemas.microsoft.com/office/word/2010/wordml">
+              <w:rPr>
+                <w:rFonts w:ascii="Arial" w:hAnsi="Arial" w:eastAsia="Arial" w:cs="Arial"/>
+                <w:i w:val="false"/>
+                <w:b w:val="false"/>
+                <w:u w:val="none"/>
+                <w:strike w:val="false"/>
+                <w:sz w:val="22"/>
+                <w:szCs w:val="22"/>
+                <w:color w:val="000000"/>
+              </w:rPr>
+              <w:t xml:space="preserve">4.3 Shipping Lanes</w:t>
+            </w:r>
+          </w:p>
+        </w:tc>
+        <w:tc>
+          <w:tcPr>
+            <w:vMerge/>
             <w:tcBorders>
               <w:bottom w:val="single" w:sz="8" w:space="0" w:color="CCCCCC"/>
               <w:top w:val="single" w:sz="8" w:space="0" w:color="CCCCCC"/>
@@ -4844,19 +4765,6 @@
                 <w:color w:val="000000"/>
               </w:rPr>
             </w:pPr>
-            <w:r xmlns:w="http://schemas.openxmlformats.org/wordprocessingml/2006/main" xmlns:wp="http://schemas.openxmlformats.org/drawingml/2006/wordprocessingDrawing" xmlns:r="http://schemas.openxmlformats.org/officeDocument/2006/relationships" xmlns:w14="http://schemas.microsoft.com/office/word/2010/wordml">
-              <w:rPr>
-                <w:rFonts w:ascii="Arial" w:hAnsi="Arial" w:eastAsia="Arial" w:cs="Arial"/>
-                <w:i w:val="false"/>
-                <w:b w:val="false"/>
-                <w:u w:val="none"/>
-                <w:strike w:val="false"/>
-                <w:sz w:val="22"/>
-                <w:szCs w:val="22"/>
-                <w:color w:val="000000"/>
-              </w:rPr>
-              <w:t xml:space="preserve">Shipping Lanes</w:t>
-            </w:r>
           </w:p>
         </w:tc>
       </w:tr>
@@ -4970,7 +4878,7 @@
                 <w:szCs w:val="22"/>
                 <w:color w:val="000000"/>
               </w:rPr>
-              <w:t xml:space="preserve">Residential, Commercial &amp; Recreation Areas</w:t>
+              <w:t xml:space="preserve">1.1 Residential Areas</w:t>
             </w:r>
           </w:p>
         </w:tc>
@@ -5024,7 +4932,7 @@
                 <w:szCs w:val="22"/>
                 <w:color w:val="000000"/>
               </w:rPr>
-              <w:t xml:space="preserve">Residential Areas</w:t>
+              <w:t xml:space="preserve">1. Residential, Commercial &amp; Recreation Areas</w:t>
             </w:r>
           </w:p>
         </w:tc>
@@ -5078,7 +4986,6 @@
         </w:tc>
         <w:tc>
           <w:tcPr>
-            <w:vMerge w:val="restart"/>
             <w:tcBorders>
               <w:bottom w:val="single" w:sz="8" w:space="0" w:color="CCCCCC"/>
               <w:top w:val="single" w:sz="8" w:space="0" w:color="CCCCCC"/>
@@ -5127,12 +5034,13 @@
                 <w:szCs w:val="22"/>
                 <w:color w:val="000000"/>
               </w:rPr>
-              <w:t xml:space="preserve">Natural System Management &amp; Modifications</w:t>
-            </w:r>
-          </w:p>
-        </w:tc>
-        <w:tc>
-          <w:tcPr>
+              <w:t xml:space="preserve">7.2 Dams &amp; Water Management / Use</w:t>
+            </w:r>
+          </w:p>
+        </w:tc>
+        <w:tc>
+          <w:tcPr>
+            <w:vMerge w:val="restart"/>
             <w:tcBorders>
               <w:bottom w:val="single" w:sz="8" w:space="0" w:color="CCCCCC"/>
               <w:top w:val="single" w:sz="8" w:space="0" w:color="CCCCCC"/>
@@ -5181,7 +5089,7 @@
                 <w:szCs w:val="22"/>
                 <w:color w:val="000000"/>
               </w:rPr>
-              <w:t xml:space="preserve">Dams &amp; Water Management / Use</w:t>
+              <w:t xml:space="preserve">7. Natural System Management &amp; Modifications</w:t>
             </w:r>
           </w:p>
         </w:tc>
@@ -5235,7 +5143,6 @@
         </w:tc>
         <w:tc>
           <w:tcPr>
-            <w:vMerge/>
             <w:tcBorders>
               <w:bottom w:val="single" w:sz="8" w:space="0" w:color="CCCCCC"/>
               <w:top w:val="single" w:sz="8" w:space="0" w:color="CCCCCC"/>
@@ -5273,10 +5180,24 @@
                 <w:color w:val="000000"/>
               </w:rPr>
             </w:pPr>
-          </w:p>
-        </w:tc>
-        <w:tc>
-          <w:tcPr>
+            <w:r xmlns:w="http://schemas.openxmlformats.org/wordprocessingml/2006/main" xmlns:wp="http://schemas.openxmlformats.org/drawingml/2006/wordprocessingDrawing" xmlns:r="http://schemas.openxmlformats.org/officeDocument/2006/relationships" xmlns:w14="http://schemas.microsoft.com/office/word/2010/wordml">
+              <w:rPr>
+                <w:rFonts w:ascii="Arial" w:hAnsi="Arial" w:eastAsia="Arial" w:cs="Arial"/>
+                <w:i w:val="false"/>
+                <w:b w:val="false"/>
+                <w:u w:val="none"/>
+                <w:strike w:val="false"/>
+                <w:sz w:val="22"/>
+                <w:szCs w:val="22"/>
+                <w:color w:val="000000"/>
+              </w:rPr>
+              <w:t xml:space="preserve">7.3 Earth &amp; Sediment Management</w:t>
+            </w:r>
+          </w:p>
+        </w:tc>
+        <w:tc>
+          <w:tcPr>
+            <w:vMerge/>
             <w:tcBorders>
               <w:bottom w:val="single" w:sz="8" w:space="0" w:color="CCCCCC"/>
               <w:top w:val="single" w:sz="8" w:space="0" w:color="CCCCCC"/>
@@ -5314,19 +5235,6 @@
                 <w:color w:val="000000"/>
               </w:rPr>
             </w:pPr>
-            <w:r xmlns:w="http://schemas.openxmlformats.org/wordprocessingml/2006/main" xmlns:wp="http://schemas.openxmlformats.org/drawingml/2006/wordprocessingDrawing" xmlns:r="http://schemas.openxmlformats.org/officeDocument/2006/relationships" xmlns:w14="http://schemas.microsoft.com/office/word/2010/wordml">
-              <w:rPr>
-                <w:rFonts w:ascii="Arial" w:hAnsi="Arial" w:eastAsia="Arial" w:cs="Arial"/>
-                <w:i w:val="false"/>
-                <w:b w:val="false"/>
-                <w:u w:val="none"/>
-                <w:strike w:val="false"/>
-                <w:sz w:val="22"/>
-                <w:szCs w:val="22"/>
-                <w:color w:val="000000"/>
-              </w:rPr>
-              <w:t xml:space="preserve">Earth &amp; Sediment Management</w:t>
-            </w:r>
           </w:p>
         </w:tc>
       </w:tr>
@@ -5379,7 +5287,6 @@
         </w:tc>
         <w:tc>
           <w:tcPr>
-            <w:vMerge/>
             <w:tcBorders>
               <w:bottom w:val="single" w:sz="8" w:space="0" w:color="CCCCCC"/>
               <w:top w:val="single" w:sz="8" w:space="0" w:color="CCCCCC"/>
@@ -5417,10 +5324,24 @@
                 <w:color w:val="000000"/>
               </w:rPr>
             </w:pPr>
-          </w:p>
-        </w:tc>
-        <w:tc>
-          <w:tcPr>
+            <w:r xmlns:w="http://schemas.openxmlformats.org/wordprocessingml/2006/main" xmlns:wp="http://schemas.openxmlformats.org/drawingml/2006/wordprocessingDrawing" xmlns:r="http://schemas.openxmlformats.org/officeDocument/2006/relationships" xmlns:w14="http://schemas.microsoft.com/office/word/2010/wordml">
+              <w:rPr>
+                <w:rFonts w:ascii="Arial" w:hAnsi="Arial" w:eastAsia="Arial" w:cs="Arial"/>
+                <w:i w:val="false"/>
+                <w:b w:val="false"/>
+                <w:u w:val="none"/>
+                <w:strike w:val="false"/>
+                <w:sz w:val="22"/>
+                <w:szCs w:val="22"/>
+                <w:color w:val="000000"/>
+              </w:rPr>
+              <w:t xml:space="preserve">7.5 Biological System Management</w:t>
+            </w:r>
+          </w:p>
+        </w:tc>
+        <w:tc>
+          <w:tcPr>
+            <w:vMerge/>
             <w:tcBorders>
               <w:bottom w:val="single" w:sz="8" w:space="0" w:color="CCCCCC"/>
               <w:top w:val="single" w:sz="8" w:space="0" w:color="CCCCCC"/>
@@ -5458,19 +5379,487 @@
                 <w:color w:val="000000"/>
               </w:rPr>
             </w:pPr>
-            <w:r xmlns:w="http://schemas.openxmlformats.org/wordprocessingml/2006/main" xmlns:wp="http://schemas.openxmlformats.org/drawingml/2006/wordprocessingDrawing" xmlns:r="http://schemas.openxmlformats.org/officeDocument/2006/relationships" xmlns:w14="http://schemas.microsoft.com/office/word/2010/wordml">
-              <w:rPr>
-                <w:rFonts w:ascii="Arial" w:hAnsi="Arial" w:eastAsia="Arial" w:cs="Arial"/>
-                <w:i w:val="false"/>
-                <w:b w:val="false"/>
-                <w:u w:val="none"/>
-                <w:strike w:val="false"/>
-                <w:sz w:val="22"/>
-                <w:szCs w:val="22"/>
-                <w:color w:val="000000"/>
-              </w:rPr>
-              <w:t xml:space="preserve">Biological System Management</w:t>
-            </w:r>
+          </w:p>
+        </w:tc>
+      </w:tr>
+      <w:tr>
+        <w:trPr>
+          <w:trHeight w:val="360" w:hRule="auto"/>
+        </w:trPr>
+        body27
+        <w:tc>
+          <w:tcPr>
+            <w:tcBorders>
+              <w:bottom w:val="single" w:sz="8" w:space="0" w:color="CCCCCC"/>
+              <w:top w:val="single" w:sz="8" w:space="0" w:color="CCCCCC"/>
+              <w:left w:val="none" w:sz="0" w:space="0" w:color="000000"/>
+              <w:right w:val="none" w:sz="0" w:space="0" w:color="000000"/>
+            </w:tcBorders>
+            <w:shd w:val="clear" w:color="auto" w:fill="FFFFFF"/>
+            <w:tcMar>
+              <w:top w:w="0" w:type="dxa"/>
+              <w:bottom w:w="0" w:type="dxa"/>
+              <w:left w:w="0" w:type="dxa"/>
+              <w:right w:w="0" w:type="dxa"/>
+            </w:tcMar>
+            <w:vAlign w:val="top"/>
+          </w:tcPr>
+          <w:p>
+            <w:pPr>
+              <w:jc w:val="left"/>
+              <w:pBdr>
+                <w:bottom w:val="none" w:sz="0" w:space="0" w:color="000000"/>
+                <w:top w:val="none" w:sz="0" w:space="0" w:color="000000"/>
+                <w:left w:val="none" w:sz="0" w:space="0" w:color="000000"/>
+                <w:right w:val="none" w:sz="0" w:space="0" w:color="000000"/>
+              </w:pBdr>
+              <w:spacing w:after="100" w:before="100" w:line="240"/>
+              <w:ind w:left="100" w:right="100" w:firstLine="0" w:firstLineChars="0"/>
+              <w:rPr>
+                <w:rFonts w:ascii="Arial" w:hAnsi="Arial" w:eastAsia="Arial" w:cs="Arial"/>
+                <w:i w:val="false"/>
+                <w:b w:val="false"/>
+                <w:u w:val="none"/>
+                <w:strike w:val="false"/>
+                <w:sz w:val="22"/>
+                <w:szCs w:val="22"/>
+                <w:color w:val="000000"/>
+              </w:rPr>
+            </w:pPr>
+            <w:r xmlns:w="http://schemas.openxmlformats.org/wordprocessingml/2006/main" xmlns:wp="http://schemas.openxmlformats.org/drawingml/2006/wordprocessingDrawing" xmlns:r="http://schemas.openxmlformats.org/officeDocument/2006/relationships" xmlns:w14="http://schemas.microsoft.com/office/word/2010/wordml">
+              <w:rPr>
+                <w:rFonts w:ascii="Arial" w:hAnsi="Arial" w:eastAsia="Arial" w:cs="Arial"/>
+                <w:i w:val="false"/>
+                <w:b w:val="false"/>
+                <w:u w:val="none"/>
+                <w:strike w:val="false"/>
+                <w:sz w:val="22"/>
+                <w:szCs w:val="22"/>
+                <w:color w:val="000000"/>
+              </w:rPr>
+              <w:t xml:space="preserve">Restoration</w:t>
+            </w:r>
+          </w:p>
+        </w:tc>
+        <w:tc>
+          <w:tcPr>
+            <w:tcBorders>
+              <w:bottom w:val="single" w:sz="8" w:space="0" w:color="CCCCCC"/>
+              <w:top w:val="single" w:sz="8" w:space="0" w:color="CCCCCC"/>
+              <w:left w:val="none" w:sz="0" w:space="0" w:color="000000"/>
+              <w:right w:val="none" w:sz="0" w:space="0" w:color="000000"/>
+            </w:tcBorders>
+            <w:shd w:val="clear" w:color="auto" w:fill="FFFFFF"/>
+            <w:tcMar>
+              <w:top w:w="0" w:type="dxa"/>
+              <w:bottom w:w="0" w:type="dxa"/>
+              <w:left w:w="0" w:type="dxa"/>
+              <w:right w:w="0" w:type="dxa"/>
+            </w:tcMar>
+            <w:vAlign w:val="top"/>
+          </w:tcPr>
+          <w:p>
+            <w:pPr>
+              <w:jc w:val="left"/>
+              <w:pBdr>
+                <w:bottom w:val="none" w:sz="0" w:space="0" w:color="000000"/>
+                <w:top w:val="none" w:sz="0" w:space="0" w:color="000000"/>
+                <w:left w:val="none" w:sz="0" w:space="0" w:color="000000"/>
+                <w:right w:val="none" w:sz="0" w:space="0" w:color="000000"/>
+              </w:pBdr>
+              <w:spacing w:after="100" w:before="100" w:line="240"/>
+              <w:ind w:left="100" w:right="100" w:firstLine="0" w:firstLineChars="0"/>
+              <w:rPr>
+                <w:rFonts w:ascii="Arial" w:hAnsi="Arial" w:eastAsia="Arial" w:cs="Arial"/>
+                <w:i w:val="false"/>
+                <w:b w:val="false"/>
+                <w:u w:val="none"/>
+                <w:strike w:val="false"/>
+                <w:sz w:val="22"/>
+                <w:szCs w:val="22"/>
+                <w:color w:val="000000"/>
+              </w:rPr>
+            </w:pPr>
+            <w:r xmlns:w="http://schemas.openxmlformats.org/wordprocessingml/2006/main" xmlns:wp="http://schemas.openxmlformats.org/drawingml/2006/wordprocessingDrawing" xmlns:r="http://schemas.openxmlformats.org/officeDocument/2006/relationships" xmlns:w14="http://schemas.microsoft.com/office/word/2010/wordml">
+              <w:rPr>
+                <w:rFonts w:ascii="Arial" w:hAnsi="Arial" w:eastAsia="Arial" w:cs="Arial"/>
+                <w:i w:val="false"/>
+                <w:b w:val="false"/>
+                <w:u w:val="none"/>
+                <w:strike w:val="false"/>
+                <w:sz w:val="22"/>
+                <w:szCs w:val="22"/>
+                <w:color w:val="000000"/>
+              </w:rPr>
+              <w:t xml:space="preserve">—</w:t>
+            </w:r>
+          </w:p>
+        </w:tc>
+        <w:tc>
+          <w:tcPr>
+            <w:vMerge w:val="restart"/>
+            <w:tcBorders>
+              <w:bottom w:val="single" w:sz="8" w:space="0" w:color="CCCCCC"/>
+              <w:top w:val="single" w:sz="8" w:space="0" w:color="CCCCCC"/>
+              <w:left w:val="none" w:sz="0" w:space="0" w:color="000000"/>
+              <w:right w:val="none" w:sz="0" w:space="0" w:color="000000"/>
+            </w:tcBorders>
+            <w:shd w:val="clear" w:color="auto" w:fill="FFFFFF"/>
+            <w:tcMar>
+              <w:top w:w="0" w:type="dxa"/>
+              <w:bottom w:w="0" w:type="dxa"/>
+              <w:left w:w="0" w:type="dxa"/>
+              <w:right w:w="0" w:type="dxa"/>
+            </w:tcMar>
+            <w:vAlign w:val="top"/>
+          </w:tcPr>
+          <w:p>
+            <w:pPr>
+              <w:jc w:val="left"/>
+              <w:pBdr>
+                <w:bottom w:val="none" w:sz="0" w:space="0" w:color="000000"/>
+                <w:top w:val="none" w:sz="0" w:space="0" w:color="000000"/>
+                <w:left w:val="none" w:sz="0" w:space="0" w:color="000000"/>
+                <w:right w:val="none" w:sz="0" w:space="0" w:color="000000"/>
+              </w:pBdr>
+              <w:spacing w:after="100" w:before="100" w:line="240"/>
+              <w:ind w:left="100" w:right="100" w:firstLine="0" w:firstLineChars="0"/>
+              <w:rPr>
+                <w:rFonts w:ascii="Arial" w:hAnsi="Arial" w:eastAsia="Arial" w:cs="Arial"/>
+                <w:i w:val="false"/>
+                <w:b w:val="false"/>
+                <w:u w:val="none"/>
+                <w:strike w:val="false"/>
+                <w:sz w:val="22"/>
+                <w:szCs w:val="22"/>
+                <w:color w:val="000000"/>
+              </w:rPr>
+            </w:pPr>
+            <w:r xmlns:w="http://schemas.openxmlformats.org/wordprocessingml/2006/main" xmlns:wp="http://schemas.openxmlformats.org/drawingml/2006/wordprocessingDrawing" xmlns:r="http://schemas.openxmlformats.org/officeDocument/2006/relationships" xmlns:w14="http://schemas.microsoft.com/office/word/2010/wordml">
+              <w:rPr>
+                <w:rFonts w:ascii="Arial" w:hAnsi="Arial" w:eastAsia="Arial" w:cs="Arial"/>
+                <w:i w:val="false"/>
+                <w:b w:val="false"/>
+                <w:u w:val="none"/>
+                <w:strike w:val="false"/>
+                <w:sz w:val="22"/>
+                <w:szCs w:val="22"/>
+                <w:color w:val="000000"/>
+              </w:rPr>
+              <w:t xml:space="preserve">—</w:t>
+            </w:r>
+          </w:p>
+        </w:tc>
+      </w:tr>
+      <w:tr>
+        <w:trPr>
+          <w:trHeight w:val="360" w:hRule="auto"/>
+        </w:trPr>
+        body28
+        <w:tc>
+          <w:tcPr>
+            <w:tcBorders>
+              <w:bottom w:val="single" w:sz="8" w:space="0" w:color="CCCCCC"/>
+              <w:top w:val="single" w:sz="8" w:space="0" w:color="CCCCCC"/>
+              <w:left w:val="none" w:sz="0" w:space="0" w:color="000000"/>
+              <w:right w:val="none" w:sz="0" w:space="0" w:color="000000"/>
+            </w:tcBorders>
+            <w:shd w:val="clear" w:color="auto" w:fill="FFFFFF"/>
+            <w:tcMar>
+              <w:top w:w="0" w:type="dxa"/>
+              <w:bottom w:w="0" w:type="dxa"/>
+              <w:left w:w="0" w:type="dxa"/>
+              <w:right w:w="0" w:type="dxa"/>
+            </w:tcMar>
+            <w:vAlign w:val="top"/>
+          </w:tcPr>
+          <w:p>
+            <w:pPr>
+              <w:jc w:val="left"/>
+              <w:pBdr>
+                <w:bottom w:val="none" w:sz="0" w:space="0" w:color="000000"/>
+                <w:top w:val="none" w:sz="0" w:space="0" w:color="000000"/>
+                <w:left w:val="none" w:sz="0" w:space="0" w:color="000000"/>
+                <w:right w:val="none" w:sz="0" w:space="0" w:color="000000"/>
+              </w:pBdr>
+              <w:spacing w:after="100" w:before="100" w:line="240"/>
+              <w:ind w:left="100" w:right="100" w:firstLine="0" w:firstLineChars="0"/>
+              <w:rPr>
+                <w:rFonts w:ascii="Arial" w:hAnsi="Arial" w:eastAsia="Arial" w:cs="Arial"/>
+                <w:i w:val="false"/>
+                <w:b w:val="false"/>
+                <w:u w:val="none"/>
+                <w:strike w:val="false"/>
+                <w:sz w:val="22"/>
+                <w:szCs w:val="22"/>
+                <w:color w:val="000000"/>
+              </w:rPr>
+            </w:pPr>
+            <w:r xmlns:w="http://schemas.openxmlformats.org/wordprocessingml/2006/main" xmlns:wp="http://schemas.openxmlformats.org/drawingml/2006/wordprocessingDrawing" xmlns:r="http://schemas.openxmlformats.org/officeDocument/2006/relationships" xmlns:w14="http://schemas.microsoft.com/office/word/2010/wordml">
+              <w:rPr>
+                <w:rFonts w:ascii="Arial" w:hAnsi="Arial" w:eastAsia="Arial" w:cs="Arial"/>
+                <w:i w:val="false"/>
+                <w:b w:val="false"/>
+                <w:u w:val="none"/>
+                <w:strike w:val="false"/>
+                <w:sz w:val="22"/>
+                <w:szCs w:val="22"/>
+                <w:color w:val="000000"/>
+              </w:rPr>
+              <w:t xml:space="preserve">Spatial Designation</w:t>
+            </w:r>
+          </w:p>
+        </w:tc>
+        <w:tc>
+          <w:tcPr>
+            <w:tcBorders>
+              <w:bottom w:val="single" w:sz="8" w:space="0" w:color="CCCCCC"/>
+              <w:top w:val="single" w:sz="8" w:space="0" w:color="CCCCCC"/>
+              <w:left w:val="none" w:sz="0" w:space="0" w:color="000000"/>
+              <w:right w:val="none" w:sz="0" w:space="0" w:color="000000"/>
+            </w:tcBorders>
+            <w:shd w:val="clear" w:color="auto" w:fill="FFFFFF"/>
+            <w:tcMar>
+              <w:top w:w="0" w:type="dxa"/>
+              <w:bottom w:w="0" w:type="dxa"/>
+              <w:left w:w="0" w:type="dxa"/>
+              <w:right w:w="0" w:type="dxa"/>
+            </w:tcMar>
+            <w:vAlign w:val="top"/>
+          </w:tcPr>
+          <w:p>
+            <w:pPr>
+              <w:jc w:val="left"/>
+              <w:pBdr>
+                <w:bottom w:val="none" w:sz="0" w:space="0" w:color="000000"/>
+                <w:top w:val="none" w:sz="0" w:space="0" w:color="000000"/>
+                <w:left w:val="none" w:sz="0" w:space="0" w:color="000000"/>
+                <w:right w:val="none" w:sz="0" w:space="0" w:color="000000"/>
+              </w:pBdr>
+              <w:spacing w:after="100" w:before="100" w:line="240"/>
+              <w:ind w:left="100" w:right="100" w:firstLine="0" w:firstLineChars="0"/>
+              <w:rPr>
+                <w:rFonts w:ascii="Arial" w:hAnsi="Arial" w:eastAsia="Arial" w:cs="Arial"/>
+                <w:i w:val="false"/>
+                <w:b w:val="false"/>
+                <w:u w:val="none"/>
+                <w:strike w:val="false"/>
+                <w:sz w:val="22"/>
+                <w:szCs w:val="22"/>
+                <w:color w:val="000000"/>
+              </w:rPr>
+            </w:pPr>
+            <w:r xmlns:w="http://schemas.openxmlformats.org/wordprocessingml/2006/main" xmlns:wp="http://schemas.openxmlformats.org/drawingml/2006/wordprocessingDrawing" xmlns:r="http://schemas.openxmlformats.org/officeDocument/2006/relationships" xmlns:w14="http://schemas.microsoft.com/office/word/2010/wordml">
+              <w:rPr>
+                <w:rFonts w:ascii="Arial" w:hAnsi="Arial" w:eastAsia="Arial" w:cs="Arial"/>
+                <w:i w:val="false"/>
+                <w:b w:val="false"/>
+                <w:u w:val="none"/>
+                <w:strike w:val="false"/>
+                <w:sz w:val="22"/>
+                <w:szCs w:val="22"/>
+                <w:color w:val="000000"/>
+              </w:rPr>
+              <w:t xml:space="preserve">—</w:t>
+            </w:r>
+          </w:p>
+        </w:tc>
+        <w:tc>
+          <w:tcPr>
+            <w:vMerge/>
+            <w:tcBorders>
+              <w:bottom w:val="single" w:sz="8" w:space="0" w:color="CCCCCC"/>
+              <w:top w:val="single" w:sz="8" w:space="0" w:color="CCCCCC"/>
+              <w:left w:val="none" w:sz="0" w:space="0" w:color="000000"/>
+              <w:right w:val="none" w:sz="0" w:space="0" w:color="000000"/>
+            </w:tcBorders>
+            <w:shd w:val="clear" w:color="auto" w:fill="FFFFFF"/>
+            <w:tcMar>
+              <w:top w:w="0" w:type="dxa"/>
+              <w:bottom w:w="0" w:type="dxa"/>
+              <w:left w:w="0" w:type="dxa"/>
+              <w:right w:w="0" w:type="dxa"/>
+            </w:tcMar>
+            <w:vAlign w:val="top"/>
+          </w:tcPr>
+          <w:p>
+            <w:pPr>
+              <w:jc w:val="left"/>
+              <w:pBdr>
+                <w:bottom w:val="none" w:sz="0" w:space="0" w:color="000000"/>
+                <w:top w:val="none" w:sz="0" w:space="0" w:color="000000"/>
+                <w:left w:val="none" w:sz="0" w:space="0" w:color="000000"/>
+                <w:right w:val="none" w:sz="0" w:space="0" w:color="000000"/>
+              </w:pBdr>
+              <w:spacing w:after="100" w:before="100" w:line="240"/>
+              <w:ind w:left="100" w:right="100" w:firstLine="0" w:firstLineChars="0"/>
+              <w:rPr>
+                <w:rFonts w:ascii="Arial" w:hAnsi="Arial" w:eastAsia="Arial" w:cs="Arial"/>
+                <w:i w:val="false"/>
+                <w:b w:val="false"/>
+                <w:u w:val="none"/>
+                <w:strike w:val="false"/>
+                <w:sz w:val="22"/>
+                <w:szCs w:val="22"/>
+                <w:color w:val="000000"/>
+              </w:rPr>
+            </w:pPr>
+          </w:p>
+        </w:tc>
+      </w:tr>
+      <w:tr>
+        <w:trPr>
+          <w:trHeight w:val="360" w:hRule="auto"/>
+        </w:trPr>
+        body29
+        <w:tc>
+          <w:tcPr>
+            <w:tcBorders>
+              <w:bottom w:val="single" w:sz="8" w:space="0" w:color="CCCCCC"/>
+              <w:top w:val="single" w:sz="8" w:space="0" w:color="CCCCCC"/>
+              <w:left w:val="none" w:sz="0" w:space="0" w:color="000000"/>
+              <w:right w:val="none" w:sz="0" w:space="0" w:color="000000"/>
+            </w:tcBorders>
+            <w:shd w:val="clear" w:color="auto" w:fill="FFFFFF"/>
+            <w:tcMar>
+              <w:top w:w="0" w:type="dxa"/>
+              <w:bottom w:w="0" w:type="dxa"/>
+              <w:left w:w="0" w:type="dxa"/>
+              <w:right w:w="0" w:type="dxa"/>
+            </w:tcMar>
+            <w:vAlign w:val="top"/>
+          </w:tcPr>
+          <w:p>
+            <w:pPr>
+              <w:jc w:val="left"/>
+              <w:pBdr>
+                <w:bottom w:val="none" w:sz="0" w:space="0" w:color="000000"/>
+                <w:top w:val="none" w:sz="0" w:space="0" w:color="000000"/>
+                <w:left w:val="none" w:sz="0" w:space="0" w:color="000000"/>
+                <w:right w:val="none" w:sz="0" w:space="0" w:color="000000"/>
+              </w:pBdr>
+              <w:spacing w:after="100" w:before="100" w:line="240"/>
+              <w:ind w:left="100" w:right="100" w:firstLine="0" w:firstLineChars="0"/>
+              <w:rPr>
+                <w:rFonts w:ascii="Arial" w:hAnsi="Arial" w:eastAsia="Arial" w:cs="Arial"/>
+                <w:i w:val="false"/>
+                <w:b w:val="false"/>
+                <w:u w:val="none"/>
+                <w:strike w:val="false"/>
+                <w:sz w:val="22"/>
+                <w:szCs w:val="22"/>
+                <w:color w:val="000000"/>
+              </w:rPr>
+            </w:pPr>
+            <w:r xmlns:w="http://schemas.openxmlformats.org/wordprocessingml/2006/main" xmlns:wp="http://schemas.openxmlformats.org/drawingml/2006/wordprocessingDrawing" xmlns:r="http://schemas.openxmlformats.org/officeDocument/2006/relationships" xmlns:w14="http://schemas.microsoft.com/office/word/2010/wordml">
+              <w:rPr>
+                <w:rFonts w:ascii="Arial" w:hAnsi="Arial" w:eastAsia="Arial" w:cs="Arial"/>
+                <w:i w:val="false"/>
+                <w:b w:val="false"/>
+                <w:u w:val="none"/>
+                <w:strike w:val="false"/>
+                <w:sz w:val="22"/>
+                <w:szCs w:val="22"/>
+                <w:color w:val="000000"/>
+              </w:rPr>
+              <w:t xml:space="preserve">Species Status and Assessment</w:t>
+            </w:r>
+          </w:p>
+        </w:tc>
+        <w:tc>
+          <w:tcPr>
+            <w:tcBorders>
+              <w:bottom w:val="single" w:sz="8" w:space="0" w:color="CCCCCC"/>
+              <w:top w:val="single" w:sz="8" w:space="0" w:color="CCCCCC"/>
+              <w:left w:val="none" w:sz="0" w:space="0" w:color="000000"/>
+              <w:right w:val="none" w:sz="0" w:space="0" w:color="000000"/>
+            </w:tcBorders>
+            <w:shd w:val="clear" w:color="auto" w:fill="FFFFFF"/>
+            <w:tcMar>
+              <w:top w:w="0" w:type="dxa"/>
+              <w:bottom w:w="0" w:type="dxa"/>
+              <w:left w:w="0" w:type="dxa"/>
+              <w:right w:w="0" w:type="dxa"/>
+            </w:tcMar>
+            <w:vAlign w:val="top"/>
+          </w:tcPr>
+          <w:p>
+            <w:pPr>
+              <w:jc w:val="left"/>
+              <w:pBdr>
+                <w:bottom w:val="none" w:sz="0" w:space="0" w:color="000000"/>
+                <w:top w:val="none" w:sz="0" w:space="0" w:color="000000"/>
+                <w:left w:val="none" w:sz="0" w:space="0" w:color="000000"/>
+                <w:right w:val="none" w:sz="0" w:space="0" w:color="000000"/>
+              </w:pBdr>
+              <w:spacing w:after="100" w:before="100" w:line="240"/>
+              <w:ind w:left="100" w:right="100" w:firstLine="0" w:firstLineChars="0"/>
+              <w:rPr>
+                <w:rFonts w:ascii="Arial" w:hAnsi="Arial" w:eastAsia="Arial" w:cs="Arial"/>
+                <w:i w:val="false"/>
+                <w:b w:val="false"/>
+                <w:u w:val="none"/>
+                <w:strike w:val="false"/>
+                <w:sz w:val="22"/>
+                <w:szCs w:val="22"/>
+                <w:color w:val="000000"/>
+              </w:rPr>
+            </w:pPr>
+            <w:r xmlns:w="http://schemas.openxmlformats.org/wordprocessingml/2006/main" xmlns:wp="http://schemas.openxmlformats.org/drawingml/2006/wordprocessingDrawing" xmlns:r="http://schemas.openxmlformats.org/officeDocument/2006/relationships" xmlns:w14="http://schemas.microsoft.com/office/word/2010/wordml">
+              <w:rPr>
+                <w:rFonts w:ascii="Arial" w:hAnsi="Arial" w:eastAsia="Arial" w:cs="Arial"/>
+                <w:i w:val="false"/>
+                <w:b w:val="false"/>
+                <w:u w:val="none"/>
+                <w:strike w:val="false"/>
+                <w:sz w:val="22"/>
+                <w:szCs w:val="22"/>
+                <w:color w:val="000000"/>
+              </w:rPr>
+              <w:t xml:space="preserve">—</w:t>
+            </w:r>
+          </w:p>
+        </w:tc>
+        <w:tc>
+          <w:tcPr>
+            <w:vMerge/>
+            <w:tcBorders>
+              <w:bottom w:val="single" w:sz="8" w:space="0" w:color="CCCCCC"/>
+              <w:top w:val="single" w:sz="8" w:space="0" w:color="CCCCCC"/>
+              <w:left w:val="none" w:sz="0" w:space="0" w:color="000000"/>
+              <w:right w:val="none" w:sz="0" w:space="0" w:color="000000"/>
+            </w:tcBorders>
+            <w:shd w:val="clear" w:color="auto" w:fill="FFFFFF"/>
+            <w:tcMar>
+              <w:top w:w="0" w:type="dxa"/>
+              <w:bottom w:w="0" w:type="dxa"/>
+              <w:left w:w="0" w:type="dxa"/>
+              <w:right w:w="0" w:type="dxa"/>
+            </w:tcMar>
+            <w:vAlign w:val="top"/>
+          </w:tcPr>
+          <w:p>
+            <w:pPr>
+              <w:jc w:val="left"/>
+              <w:pBdr>
+                <w:bottom w:val="none" w:sz="0" w:space="0" w:color="000000"/>
+                <w:top w:val="none" w:sz="0" w:space="0" w:color="000000"/>
+                <w:left w:val="none" w:sz="0" w:space="0" w:color="000000"/>
+                <w:right w:val="none" w:sz="0" w:space="0" w:color="000000"/>
+              </w:pBdr>
+              <w:spacing w:after="100" w:before="100" w:line="240"/>
+              <w:ind w:left="100" w:right="100" w:firstLine="0" w:firstLineChars="0"/>
+              <w:rPr>
+                <w:rFonts w:ascii="Arial" w:hAnsi="Arial" w:eastAsia="Arial" w:cs="Arial"/>
+                <w:i w:val="false"/>
+                <w:b w:val="false"/>
+                <w:u w:val="none"/>
+                <w:strike w:val="false"/>
+                <w:sz w:val="22"/>
+                <w:szCs w:val="22"/>
+                <w:color w:val="000000"/>
+              </w:rPr>
+            </w:pPr>
           </w:p>
         </w:tc>
       </w:tr>
@@ -5630,17 +6019,7 @@
         <w:t xml:space="preserve"> </w:t>
       </w:r>
       <w:r>
-        <w:t xml:space="preserve">(</w:t>
-      </w:r>
-      <w:r>
-        <w:rPr>
-          <w:b/>
-          <w:bCs/>
-        </w:rPr>
-        <w:t xml:space="preserve">salafsky2025?</w:t>
-      </w:r>
-      <w:r>
-        <w:t xml:space="preserve">)</w:t>
+        <w:t xml:space="preserve">(Salafsky et al. 2024)</w:t>
       </w:r>
       <w:r>
         <w:t xml:space="preserve"> </w:t>
@@ -5711,7 +6090,7 @@
         </w:rPr>
         <w:t xml:space="preserve">You could point the reader to the original publication of this framework (</w:t>
       </w:r>
-      <w:hyperlink r:id="rId24">
+      <w:hyperlink r:id="rId25">
         <w:r>
           <w:rPr>
             <w:rStyle w:val="Hyperlink"/>
@@ -5774,28 +6153,6 @@
       </w:r>
       <w:r>
         <w:t xml:space="preserve">).</w:t>
-      </w:r>
-    </w:p>
-    <w:bookmarkEnd w:id="25"/>
-    <w:bookmarkStart w:id="30" w:name="management-domain-categories"/>
-    <w:p>
-      <w:pPr>
-        <w:pStyle w:val="Heading1"/>
-      </w:pPr>
-      <w:r>
-        <w:t xml:space="preserve">Management domain categories</w:t>
-      </w:r>
-    </w:p>
-    <w:p>
-      <w:pPr>
-        <w:pStyle w:val="FirstParagraph"/>
-      </w:pPr>
-      <w:r>
-        <w:rPr>
-          <w:b/>
-          <w:bCs/>
-        </w:rPr>
-        <w:t xml:space="preserve">**We haven’t mentioned Management Domains yet before this image!</w:t>
       </w:r>
     </w:p>
     <w:p>
@@ -6229,7 +6586,7 @@
         <w:t xml:space="preserve"> </w:t>
       </w:r>
       <w:r>
-        <w:t xml:space="preserve">1</w:t>
+        <w:t xml:space="preserve">2</w:t>
       </w:r>
       <w:r>
         <w:t xml:space="preserve">.</w:t>
@@ -6242,7 +6599,7 @@
       <w:bookmarkStart w:id="39" w:name="tab:legislation-summary-table"/>
       <w:bookmarkEnd w:id="39"/>
       <w:r>
-        <w:t xml:space="preserve">Table 1:</w:t>
+        <w:t xml:space="preserve">Table 2:</w:t>
       </w:r>
       <w:r>
         <w:t xml:space="preserve"> </w:t>
@@ -8171,7 +8528,7 @@
         <w:t xml:space="preserve"> </w:t>
       </w:r>
       <w:r>
-        <w:t xml:space="preserve">2</w:t>
+        <w:t xml:space="preserve">3</w:t>
       </w:r>
       <w:r>
         <w:t xml:space="preserve">).</w:t>
@@ -8184,7 +8541,7 @@
       <w:bookmarkStart w:id="49" w:name="tab:management-domain-tally"/>
       <w:bookmarkEnd w:id="49"/>
       <w:r>
-        <w:t xml:space="preserve">Table 2:</w:t>
+        <w:t xml:space="preserve">Table 3:</w:t>
       </w:r>
       <w:r>
         <w:t xml:space="preserve"> </w:t>
@@ -12520,7 +12877,7 @@
         <w:t xml:space="preserve"> </w:t>
       </w:r>
       <w:r>
-        <w:t xml:space="preserve">3</w:t>
+        <w:t xml:space="preserve">4</w:t>
       </w:r>
       <w:r>
         <w:t xml:space="preserve">). More federal legislation sections matched with salmon harvest categories than provincial.</w:t>
@@ -12533,7 +12890,7 @@
       <w:bookmarkStart w:id="63" w:name="tab:scope-tally"/>
       <w:bookmarkEnd w:id="63"/>
       <w:r>
-        <w:t xml:space="preserve">Table 3:</w:t>
+        <w:t xml:space="preserve">Table 4:</w:t>
       </w:r>
       <w:r>
         <w:t xml:space="preserve"> </w:t>
@@ -14078,7 +14435,7 @@
         <w:t xml:space="preserve"> </w:t>
       </w:r>
       <w:r>
-        <w:t xml:space="preserve">4</w:t>
+        <w:t xml:space="preserve">5</w:t>
       </w:r>
       <w:r>
         <w:t xml:space="preserve">). Clauses, in general, fit into groupings by their context and the nature of their intent. For this exercise, the categories and keywords were developed solely by the researchers through a subjective process.</w:t>
@@ -14091,7 +14448,7 @@
       <w:bookmarkStart w:id="70" w:name="tab:clause-type-with-domain-tally"/>
       <w:bookmarkEnd w:id="70"/>
       <w:r>
-        <w:t xml:space="preserve">Table 4:</w:t>
+        <w:t xml:space="preserve">Table 5:</w:t>
       </w:r>
       <w:r>
         <w:t xml:space="preserve"> </w:t>
@@ -22719,7 +23076,7 @@
       <w:bookmarkStart w:id="73" w:name="tab:cu-species-cu-name-table"/>
       <w:bookmarkEnd w:id="73"/>
       <w:r>
-        <w:t xml:space="preserve">Table 5:</w:t>
+        <w:t xml:space="preserve">Table 6:</w:t>
       </w:r>
       <w:r>
         <w:t xml:space="preserve"> </w:t>
@@ -26702,7 +27059,7 @@
         <w:t xml:space="preserve"> </w:t>
       </w:r>
       <w:r>
-        <w:t xml:space="preserve">6</w:t>
+        <w:t xml:space="preserve">7</w:t>
       </w:r>
       <w:r>
         <w:t xml:space="preserve">), all in the Fraser Interior area related to the</w:t>
@@ -26886,7 +27243,7 @@
       <w:bookmarkStart w:id="78" w:name="tab:cu-extreme-threat-table"/>
       <w:bookmarkEnd w:id="78"/>
       <w:r>
-        <w:t xml:space="preserve">Table 6:</w:t>
+        <w:t xml:space="preserve">Table 7:</w:t>
       </w:r>
       <w:r>
         <w:t xml:space="preserve"> </w:t>
@@ -27734,7 +28091,7 @@
         <w:t xml:space="preserve"> </w:t>
       </w:r>
       <w:r>
-        <w:t xml:space="preserve">7</w:t>
+        <w:t xml:space="preserve">8</w:t>
       </w:r>
       <w:r>
         <w:t xml:space="preserve">).</w:t>
@@ -27777,7 +28134,7 @@
       <w:bookmarkStart w:id="84" w:name="tab:cu-extreme-high-threat-table"/>
       <w:bookmarkEnd w:id="84"/>
       <w:r>
-        <w:t xml:space="preserve">Table 7:</w:t>
+        <w:t xml:space="preserve">Table 8:</w:t>
       </w:r>
       <w:r>
         <w:t xml:space="preserve"> </w:t>

</xml_diff>

<commit_message>
Switched to only show DUs instead of CUs. Created a list of DUs by reference for table
</commit_message>
<xml_diff>
--- a/reports/LAPSE_primary_publication.docx
+++ b/reports/LAPSE_primary_publication.docx
@@ -155,7 +155,7 @@
         <w:pStyle w:val="Date"/>
       </w:pPr>
       <w:r>
-        <w:t xml:space="preserve">2026-01-23</w:t>
+        <w:t xml:space="preserve">2026-01-26</w:t>
       </w:r>
     </w:p>
     <w:sdt>
@@ -8054,7 +8054,7 @@
     </w:p>
     <w:bookmarkEnd w:id="46"/>
     <w:bookmarkEnd w:id="47"/>
-    <w:bookmarkStart w:id="64" w:name="results"/>
+    <w:bookmarkStart w:id="66" w:name="results"/>
     <w:p>
       <w:pPr>
         <w:pStyle w:val="Heading1"/>
@@ -10058,11 +10058,10 @@
       </w:r>
     </w:p>
     <w:bookmarkEnd w:id="63"/>
-    <w:bookmarkEnd w:id="64"/>
-    <w:bookmarkStart w:id="66" w:name="clause-types-as-legislative-factors"/>
+    <w:bookmarkStart w:id="65" w:name="clause-types-as-legislative-factors"/>
     <w:p>
       <w:pPr>
-        <w:pStyle w:val="Heading1"/>
+        <w:pStyle w:val="Heading2"/>
       </w:pPr>
       <w:r>
         <w:t xml:space="preserve">Clause types as legislative factors</w:t>
@@ -10107,8 +10106,8 @@
       <w:pPr>
         <w:pStyle w:val="TableCaption"/>
       </w:pPr>
-      <w:bookmarkStart w:id="65" w:name="tab:clause-type-with-domain-tally"/>
-      <w:bookmarkEnd w:id="65"/>
+      <w:bookmarkStart w:id="64" w:name="tab:clause-type-with-domain-tally"/>
+      <w:bookmarkEnd w:id="64"/>
       <w:r>
         <w:t xml:space="preserve">Table 4:</w:t>
       </w:r>
@@ -10116,7 +10115,7 @@
         <w:t xml:space="preserve"> </w:t>
       </w:r>
       <w:r>
-        <w:t xml:space="preserve">Section counts by management domain and clause type. Column abbreviations: Admin. = Administration, Application, &amp; Structure; Auth. = Authorization &amp; Mandate; Desig. = Designation; Instr. = Instruction; Interp. = Interpretation &amp; Purpose; Licence = Licence, Permitting, &amp; Exemptions; Prohib. = Prohibition, Restriction, or Limitation.</w:t>
+        <w:t xml:space="preserve">Section counts by management domain and clause type.</w:t>
       </w:r>
     </w:p>
     <w:tbl xmlns:w="http://schemas.openxmlformats.org/wordprocessingml/2006/main" xmlns:r="http://schemas.openxmlformats.org/officeDocument/2006/relationships" xmlns:w14="http://schemas.microsoft.com/office/word/2010/wordml" xmlns:wp="http://schemas.openxmlformats.org/drawingml/2006/wordprocessingDrawing" xmlns:a="http://schemas.openxmlformats.org/drawingml/2006/main" xmlns:pic="http://schemas.openxmlformats.org/drawingml/2006/picture">
@@ -18491,15 +18490,69 @@
           </w:p>
         </w:tc>
       </w:tr>
+      <w:tr>
+        <w:trPr>
+          <w:trHeight w:val="360" w:hRule="auto"/>
+        </w:trPr>
+        footer 1
+        <w:tc>
+          <w:tcPr>
+            <w:gridSpan w:val="9"/>
+            <w:tcBorders>
+              <w:bottom w:val="none" w:sz="0" w:space="0" w:color="FFFFFF"/>
+              <w:top w:val="single" w:sz="12" w:space="0" w:color="666666"/>
+              <w:left w:val="none" w:sz="0" w:space="0" w:color="FFFFFF"/>
+              <w:right w:val="none" w:sz="0" w:space="0" w:color="FFFFFF"/>
+            </w:tcBorders>
+            <w:shd w:val="clear" w:color="auto" w:fill="FFFFFF"/>
+            <w:tcMar>
+              <w:top w:w="0" w:type="dxa"/>
+              <w:bottom w:w="0" w:type="dxa"/>
+              <w:left w:w="0" w:type="dxa"/>
+              <w:right w:w="0" w:type="dxa"/>
+            </w:tcMar>
+            <w:vAlign w:val="center"/>
+          </w:tcPr>
+          <w:p>
+            <w:pPr>
+              <w:jc w:val="left"/>
+              <w:pBdr>
+                <w:bottom w:val="none" w:sz="0" w:space="0" w:color="000000"/>
+                <w:top w:val="none" w:sz="0" w:space="0" w:color="000000"/>
+                <w:left w:val="none" w:sz="0" w:space="0" w:color="000000"/>
+                <w:right w:val="none" w:sz="0" w:space="0" w:color="000000"/>
+              </w:pBdr>
+              <w:spacing w:after="100" w:before="100" w:line="240"/>
+              <w:ind w:left="100" w:right="100" w:firstLine="0" w:firstLineChars="0"/>
+              <w:rPr>
+                <w:rFonts w:ascii="Arial" w:hAnsi="Arial" w:eastAsia="Arial" w:cs="Arial"/>
+                <w:i w:val="true"/>
+                <w:b w:val="false"/>
+                <w:u w:val="none"/>
+                <w:strike w:val="false"/>
+                <w:sz w:val="16"/>
+                <w:szCs w:val="16"/>
+                <w:color w:val="000000"/>
+              </w:rPr>
+            </w:pPr>
+            <w:r xmlns:w="http://schemas.openxmlformats.org/wordprocessingml/2006/main" xmlns:wp="http://schemas.openxmlformats.org/drawingml/2006/wordprocessingDrawing" xmlns:r="http://schemas.openxmlformats.org/officeDocument/2006/relationships" xmlns:w14="http://schemas.microsoft.com/office/word/2010/wordml">
+              <w:rPr>
+                <w:rFonts w:ascii="Arial" w:hAnsi="Arial" w:eastAsia="Arial" w:cs="Arial"/>
+                <w:i w:val="true"/>
+                <w:b w:val="false"/>
+                <w:u w:val="none"/>
+                <w:strike w:val="false"/>
+                <w:sz w:val="16"/>
+                <w:szCs w:val="16"/>
+                <w:color w:val="000000"/>
+              </w:rPr>
+              <w:t xml:space="preserve">Abbreviations: Admin. = Administration, Application, &amp; Structure; Auth. = Authorization &amp; Mandate; Desig. = Designation; Instr. = Instruction; Interp. = Interpretation &amp; Purpose; Licence = Licence, Permitting, &amp; Exemptions; Prohib. = Prohibition, Restriction, or Limitation.</w:t>
+            </w:r>
+          </w:p>
+        </w:tc>
+      </w:tr>
     </w:tbl>
-    <w:p>
-      <w:pPr>
-        <w:pStyle w:val="BodyText"/>
-      </w:pPr>
-      <w:r>
-        <w:br/>
-      </w:r>
-    </w:p>
+    <w:bookmarkEnd w:id="65"/>
     <w:bookmarkEnd w:id="66"/>
     <w:bookmarkStart w:id="85" w:name="X3d1f28ebf57a42a02e6321b912ef3127a66a1d5"/>
     <w:p>
@@ -18591,29 +18644,23 @@
         <w:pStyle w:val="BodyText"/>
       </w:pPr>
       <w:r>
-        <w:t xml:space="preserve">DFO published</w:t>
+        <w:t xml:space="preserve">DFO’s</w:t>
       </w:r>
       <w:r>
         <w:t xml:space="preserve"> </w:t>
       </w:r>
       <w:r>
         <w:rPr>
-          <w:b/>
-          <w:bCs/>
           <w:i/>
           <w:iCs/>
         </w:rPr>
-        <w:t xml:space="preserve">Canada’s Policy for Conservation of Wild Pacific Salmon</w:t>
-      </w:r>
-      <w:r>
-        <w:rPr>
-          <w:b/>
-          <w:bCs/>
-        </w:rPr>
-        <w:t xml:space="preserve">, or the Wild Salmon Policy (WSP)</w:t>
-      </w:r>
-      <w:r>
-        <w:t xml:space="preserve">, in 2005, which outlines managing salmon as Conservation Units (CU), differing somewhat from the DUs used by COSEWIC. Conservation Units are defined in the WSP as:</w:t>
+        <w:t xml:space="preserve">Wild Salmon Policy</w:t>
+      </w:r>
+      <w:r>
+        <w:t xml:space="preserve"> </w:t>
+      </w:r>
+      <w:r>
+        <w:t xml:space="preserve">(WSP) outlines salmon management delineated by Conservation Units (CU), which are defined as:</w:t>
       </w:r>
       <w:r>
         <w:t xml:space="preserve"> </w:t>
@@ -18631,7 +18678,7 @@
         <w:t xml:space="preserve"> </w:t>
       </w:r>
       <w:r>
-        <w:t xml:space="preserve">(Canada 2005). Since CUs are the most current unit for managing salmon in British Columbia, we incorporated CUs in this effort (Table 5).</w:t>
+        <w:t xml:space="preserve">(Canada 2005). In most cases, DUs and CUs are equivalent with some lumping and splitting for specific populations. Any differences are explained within the RPA documents (@dfo2022). Since RPA-delineated populations, descriptions, and corresponding threats are conducted in the context of DUs, we incorporated DUs for the purpose of this study (Table 5).</w:t>
       </w:r>
     </w:p>
     <w:p>
@@ -18646,7 +18693,7 @@
           <w:b/>
           <w:bCs/>
         </w:rPr>
-        <w:t xml:space="preserve">DG - The COSEWIC status assessments for Pacific salmon have a good discussion of the similarities and differences between DUs and CUs. In my view, there are more similarities than differences, and this sentence seems to frame the two as being different.</w:t>
+        <w:t xml:space="preserve">This results in most of the CUs/DUs lining up, except for Interior Fraser Coho (assessed as 1 DU in 2016, 5 CUs currently).</w:t>
       </w:r>
     </w:p>
     <w:p>
@@ -18661,7 +18708,7 @@
           <w:b/>
           <w:bCs/>
         </w:rPr>
-        <w:t xml:space="preserve">DG - The RPAs were conducted with respect to DUs, since it is a part of the DFO SARA listing process. What this paragraph may be lacking is a discussion of how the salmon DUs were derived, partly based on the CUs DFO had already described. This results in most of the CUs/DUs lining up, except for Interior Fraser Coho (assessed as 1 DU in 2016, 5 CUs currently). Perhaps something to the effect of,</w:t>
+        <w:t xml:space="preserve">Perhaps something to the effect of,</w:t>
       </w:r>
       <w:r>
         <w:rPr>
@@ -18703,7 +18750,7 @@
       <w:pPr>
         <w:pStyle w:val="TableCaption"/>
       </w:pPr>
-      <w:bookmarkStart w:id="67" w:name="tab:cu-species-cu-name-table"/>
+      <w:bookmarkStart w:id="67" w:name="tab:du-species-du-name-table"/>
       <w:bookmarkEnd w:id="67"/>
       <w:r>
         <w:t xml:space="preserve">Table 5:</w:t>
@@ -18712,7 +18759,7 @@
         <w:t xml:space="preserve"> </w:t>
       </w:r>
       <w:r>
-        <w:t xml:space="preserve">Conservation Units included in the DFO Recovery Potential Assessment analyses.</w:t>
+        <w:t xml:space="preserve">Designatable Units included in the DFO Recovery Potential Assessment analyses.</w:t>
       </w:r>
     </w:p>
     <w:tbl xmlns:w="http://schemas.openxmlformats.org/wordprocessingml/2006/main" xmlns:r="http://schemas.openxmlformats.org/officeDocument/2006/relationships" xmlns:w14="http://schemas.microsoft.com/office/word/2010/wordml" xmlns:wp="http://schemas.openxmlformats.org/drawingml/2006/wordprocessingDrawing" xmlns:a="http://schemas.openxmlformats.org/drawingml/2006/main" xmlns:pic="http://schemas.openxmlformats.org/drawingml/2006/picture">
@@ -18832,7 +18879,61 @@
                 <w:szCs w:val="22"/>
                 <w:color w:val="000000"/>
               </w:rPr>
-              <w:t xml:space="preserve">Conservation Unit</w:t>
+              <w:t xml:space="preserve">Designatable Unit</w:t>
+            </w:r>
+          </w:p>
+        </w:tc>
+        <w:tc>
+          <w:tcPr>
+            <w:tcBorders>
+              <w:bottom w:val="single" w:sz="12" w:space="0" w:color="666666"/>
+              <w:top w:val="single" w:sz="12" w:space="0" w:color="666666"/>
+              <w:left w:val="none" w:sz="0" w:space="0" w:color="000000"/>
+              <w:right w:val="none" w:sz="0" w:space="0" w:color="000000"/>
+            </w:tcBorders>
+            <w:shd w:val="clear" w:color="auto" w:fill="FFFFFF"/>
+            <w:tcMar>
+              <w:top w:w="0" w:type="dxa"/>
+              <w:bottom w:w="0" w:type="dxa"/>
+              <w:left w:w="0" w:type="dxa"/>
+              <w:right w:w="0" w:type="dxa"/>
+            </w:tcMar>
+            <w:vAlign w:val="center"/>
+          </w:tcPr>
+          <w:p>
+            <w:pPr>
+              <w:jc w:val="left"/>
+              <w:pBdr>
+                <w:bottom w:val="none" w:sz="0" w:space="0" w:color="000000"/>
+                <w:top w:val="none" w:sz="0" w:space="0" w:color="000000"/>
+                <w:left w:val="none" w:sz="0" w:space="0" w:color="000000"/>
+                <w:right w:val="none" w:sz="0" w:space="0" w:color="000000"/>
+              </w:pBdr>
+              <w:spacing w:after="100" w:before="100" w:line="240"/>
+              <w:ind w:left="100" w:right="100" w:firstLine="0" w:firstLineChars="0"/>
+              <w:rPr>
+                <w:rFonts w:ascii="Arial" w:hAnsi="Arial" w:eastAsia="Arial" w:cs="Arial"/>
+                <w:i w:val="false"/>
+                <w:b w:val="true"/>
+                <w:u w:val="none"/>
+                <w:strike w:val="false"/>
+                <w:sz w:val="22"/>
+                <w:szCs w:val="22"/>
+                <w:color w:val="000000"/>
+              </w:rPr>
+            </w:pPr>
+            <w:r xmlns:w="http://schemas.openxmlformats.org/wordprocessingml/2006/main" xmlns:wp="http://schemas.openxmlformats.org/drawingml/2006/wordprocessingDrawing" xmlns:r="http://schemas.openxmlformats.org/officeDocument/2006/relationships" xmlns:w14="http://schemas.microsoft.com/office/word/2010/wordml">
+              <w:rPr>
+                <w:rFonts w:ascii="Arial" w:hAnsi="Arial" w:eastAsia="Arial" w:cs="Arial"/>
+                <w:i w:val="false"/>
+                <w:b w:val="true"/>
+                <w:u w:val="none"/>
+                <w:strike w:val="false"/>
+                <w:sz w:val="22"/>
+                <w:szCs w:val="22"/>
+                <w:color w:val="000000"/>
+              </w:rPr>
+              <w:t xml:space="preserve">RPA Reference</w:t>
             </w:r>
           </w:p>
         </w:tc>
@@ -18946,7 +19047,61 @@
                 <w:szCs w:val="22"/>
                 <w:color w:val="000000"/>
               </w:rPr>
-              <w:t xml:space="preserve">BOUNDARY BAY_FA_0.3</w:t>
+              <w:t xml:space="preserve">Lower Fraser, Ocean, Fall (Harrison)</w:t>
+            </w:r>
+          </w:p>
+        </w:tc>
+        <w:tc>
+          <w:tcPr>
+            <w:tcBorders>
+              <w:bottom w:val="none" w:sz="0" w:space="0" w:color="000000"/>
+              <w:top w:val="single" w:sz="12" w:space="0" w:color="666666"/>
+              <w:left w:val="none" w:sz="0" w:space="0" w:color="000000"/>
+              <w:right w:val="none" w:sz="0" w:space="0" w:color="000000"/>
+            </w:tcBorders>
+            <w:shd w:val="clear" w:color="auto" w:fill="FFFFFF"/>
+            <w:tcMar>
+              <w:top w:w="0" w:type="dxa"/>
+              <w:bottom w:w="0" w:type="dxa"/>
+              <w:left w:w="0" w:type="dxa"/>
+              <w:right w:w="0" w:type="dxa"/>
+            </w:tcMar>
+            <w:vAlign w:val="center"/>
+          </w:tcPr>
+          <w:p>
+            <w:pPr>
+              <w:jc w:val="left"/>
+              <w:pBdr>
+                <w:bottom w:val="none" w:sz="0" w:space="0" w:color="000000"/>
+                <w:top w:val="none" w:sz="0" w:space="0" w:color="000000"/>
+                <w:left w:val="none" w:sz="0" w:space="0" w:color="000000"/>
+                <w:right w:val="none" w:sz="0" w:space="0" w:color="000000"/>
+              </w:pBdr>
+              <w:spacing w:after="100" w:before="100" w:line="240"/>
+              <w:ind w:left="100" w:right="100" w:firstLine="0" w:firstLineChars="0"/>
+              <w:rPr>
+                <w:rFonts w:ascii="Arial" w:hAnsi="Arial" w:eastAsia="Arial" w:cs="Arial"/>
+                <w:i w:val="false"/>
+                <w:b w:val="false"/>
+                <w:u w:val="none"/>
+                <w:strike w:val="false"/>
+                <w:sz w:val="22"/>
+                <w:szCs w:val="22"/>
+                <w:color w:val="000000"/>
+              </w:rPr>
+            </w:pPr>
+            <w:r xmlns:w="http://schemas.openxmlformats.org/wordprocessingml/2006/main" xmlns:wp="http://schemas.openxmlformats.org/drawingml/2006/wordprocessingDrawing" xmlns:r="http://schemas.openxmlformats.org/officeDocument/2006/relationships" xmlns:w14="http://schemas.microsoft.com/office/word/2010/wordml">
+              <w:rPr>
+                <w:rFonts w:ascii="Arial" w:hAnsi="Arial" w:eastAsia="Arial" w:cs="Arial"/>
+                <w:i w:val="false"/>
+                <w:b w:val="false"/>
+                <w:u w:val="none"/>
+                <w:strike w:val="false"/>
+                <w:sz w:val="22"/>
+                <w:szCs w:val="22"/>
+                <w:color w:val="000000"/>
+              </w:rPr>
+              <w:t xml:space="preserve">Doutaz et al. 2020</w:t>
             </w:r>
           </w:p>
         </w:tc>
@@ -19060,7 +19215,61 @@
                 <w:szCs w:val="22"/>
                 <w:color w:val="000000"/>
               </w:rPr>
-              <w:t xml:space="preserve">LOWER FRASER RIVER-UPPER PITT_SU_1.3</w:t>
+              <w:t xml:space="preserve">Lower Fraser, Ocean, Summer (Maria Slough)</w:t>
+            </w:r>
+          </w:p>
+        </w:tc>
+        <w:tc>
+          <w:tcPr>
+            <w:tcBorders>
+              <w:bottom w:val="none" w:sz="0" w:space="0" w:color="000000"/>
+              <w:top w:val="none" w:sz="0" w:space="0" w:color="000000"/>
+              <w:left w:val="none" w:sz="0" w:space="0" w:color="000000"/>
+              <w:right w:val="none" w:sz="0" w:space="0" w:color="000000"/>
+            </w:tcBorders>
+            <w:shd w:val="clear" w:color="auto" w:fill="FFFFFF"/>
+            <w:tcMar>
+              <w:top w:w="0" w:type="dxa"/>
+              <w:bottom w:w="0" w:type="dxa"/>
+              <w:left w:w="0" w:type="dxa"/>
+              <w:right w:w="0" w:type="dxa"/>
+            </w:tcMar>
+            <w:vAlign w:val="center"/>
+          </w:tcPr>
+          <w:p>
+            <w:pPr>
+              <w:jc w:val="left"/>
+              <w:pBdr>
+                <w:bottom w:val="none" w:sz="0" w:space="0" w:color="000000"/>
+                <w:top w:val="none" w:sz="0" w:space="0" w:color="000000"/>
+                <w:left w:val="none" w:sz="0" w:space="0" w:color="000000"/>
+                <w:right w:val="none" w:sz="0" w:space="0" w:color="000000"/>
+              </w:pBdr>
+              <w:spacing w:after="100" w:before="100" w:line="240"/>
+              <w:ind w:left="100" w:right="100" w:firstLine="0" w:firstLineChars="0"/>
+              <w:rPr>
+                <w:rFonts w:ascii="Arial" w:hAnsi="Arial" w:eastAsia="Arial" w:cs="Arial"/>
+                <w:i w:val="false"/>
+                <w:b w:val="false"/>
+                <w:u w:val="none"/>
+                <w:strike w:val="false"/>
+                <w:sz w:val="22"/>
+                <w:szCs w:val="22"/>
+                <w:color w:val="000000"/>
+              </w:rPr>
+            </w:pPr>
+            <w:r xmlns:w="http://schemas.openxmlformats.org/wordprocessingml/2006/main" xmlns:wp="http://schemas.openxmlformats.org/drawingml/2006/wordprocessingDrawing" xmlns:r="http://schemas.openxmlformats.org/officeDocument/2006/relationships" xmlns:w14="http://schemas.microsoft.com/office/word/2010/wordml">
+              <w:rPr>
+                <w:rFonts w:ascii="Arial" w:hAnsi="Arial" w:eastAsia="Arial" w:cs="Arial"/>
+                <w:i w:val="false"/>
+                <w:b w:val="false"/>
+                <w:u w:val="none"/>
+                <w:strike w:val="false"/>
+                <w:sz w:val="22"/>
+                <w:szCs w:val="22"/>
+                <w:color w:val="000000"/>
+              </w:rPr>
+              <w:t xml:space="preserve">Dionne et al. 2023</w:t>
             </w:r>
           </w:p>
         </w:tc>
@@ -19174,7 +19383,61 @@
                 <w:szCs w:val="22"/>
                 <w:color w:val="000000"/>
               </w:rPr>
-              <w:t xml:space="preserve">LOWER FRASER RIVER_FA_0.3</w:t>
+              <w:t xml:space="preserve">Lower Fraser, Stream, Summer (Lillooet) </w:t>
+            </w:r>
+          </w:p>
+        </w:tc>
+        <w:tc>
+          <w:tcPr>
+            <w:tcBorders>
+              <w:bottom w:val="none" w:sz="0" w:space="0" w:color="000000"/>
+              <w:top w:val="none" w:sz="0" w:space="0" w:color="000000"/>
+              <w:left w:val="none" w:sz="0" w:space="0" w:color="000000"/>
+              <w:right w:val="none" w:sz="0" w:space="0" w:color="000000"/>
+            </w:tcBorders>
+            <w:shd w:val="clear" w:color="auto" w:fill="FFFFFF"/>
+            <w:tcMar>
+              <w:top w:w="0" w:type="dxa"/>
+              <w:bottom w:w="0" w:type="dxa"/>
+              <w:left w:w="0" w:type="dxa"/>
+              <w:right w:w="0" w:type="dxa"/>
+            </w:tcMar>
+            <w:vAlign w:val="center"/>
+          </w:tcPr>
+          <w:p>
+            <w:pPr>
+              <w:jc w:val="left"/>
+              <w:pBdr>
+                <w:bottom w:val="none" w:sz="0" w:space="0" w:color="000000"/>
+                <w:top w:val="none" w:sz="0" w:space="0" w:color="000000"/>
+                <w:left w:val="none" w:sz="0" w:space="0" w:color="000000"/>
+                <w:right w:val="none" w:sz="0" w:space="0" w:color="000000"/>
+              </w:pBdr>
+              <w:spacing w:after="100" w:before="100" w:line="240"/>
+              <w:ind w:left="100" w:right="100" w:firstLine="0" w:firstLineChars="0"/>
+              <w:rPr>
+                <w:rFonts w:ascii="Arial" w:hAnsi="Arial" w:eastAsia="Arial" w:cs="Arial"/>
+                <w:i w:val="false"/>
+                <w:b w:val="false"/>
+                <w:u w:val="none"/>
+                <w:strike w:val="false"/>
+                <w:sz w:val="22"/>
+                <w:szCs w:val="22"/>
+                <w:color w:val="000000"/>
+              </w:rPr>
+            </w:pPr>
+            <w:r xmlns:w="http://schemas.openxmlformats.org/wordprocessingml/2006/main" xmlns:wp="http://schemas.openxmlformats.org/drawingml/2006/wordprocessingDrawing" xmlns:r="http://schemas.openxmlformats.org/officeDocument/2006/relationships" xmlns:w14="http://schemas.microsoft.com/office/word/2010/wordml">
+              <w:rPr>
+                <w:rFonts w:ascii="Arial" w:hAnsi="Arial" w:eastAsia="Arial" w:cs="Arial"/>
+                <w:i w:val="false"/>
+                <w:b w:val="false"/>
+                <w:u w:val="none"/>
+                <w:strike w:val="false"/>
+                <w:sz w:val="22"/>
+                <w:szCs w:val="22"/>
+                <w:color w:val="000000"/>
+              </w:rPr>
+              <w:t xml:space="preserve">Doutaz et al. 2020</w:t>
             </w:r>
           </w:p>
         </w:tc>
@@ -19288,7 +19551,61 @@
                 <w:szCs w:val="22"/>
                 <w:color w:val="000000"/>
               </w:rPr>
-              <w:t xml:space="preserve">LOWER FRASER RIVER_SU_1.3</w:t>
+              <w:t xml:space="preserve">Lower Fraser, Stream. Summer  (Upper Pitt)</w:t>
+            </w:r>
+          </w:p>
+        </w:tc>
+        <w:tc>
+          <w:tcPr>
+            <w:tcBorders>
+              <w:bottom w:val="none" w:sz="0" w:space="0" w:color="000000"/>
+              <w:top w:val="none" w:sz="0" w:space="0" w:color="000000"/>
+              <w:left w:val="none" w:sz="0" w:space="0" w:color="000000"/>
+              <w:right w:val="none" w:sz="0" w:space="0" w:color="000000"/>
+            </w:tcBorders>
+            <w:shd w:val="clear" w:color="auto" w:fill="FFFFFF"/>
+            <w:tcMar>
+              <w:top w:w="0" w:type="dxa"/>
+              <w:bottom w:w="0" w:type="dxa"/>
+              <w:left w:w="0" w:type="dxa"/>
+              <w:right w:w="0" w:type="dxa"/>
+            </w:tcMar>
+            <w:vAlign w:val="center"/>
+          </w:tcPr>
+          <w:p>
+            <w:pPr>
+              <w:jc w:val="left"/>
+              <w:pBdr>
+                <w:bottom w:val="none" w:sz="0" w:space="0" w:color="000000"/>
+                <w:top w:val="none" w:sz="0" w:space="0" w:color="000000"/>
+                <w:left w:val="none" w:sz="0" w:space="0" w:color="000000"/>
+                <w:right w:val="none" w:sz="0" w:space="0" w:color="000000"/>
+              </w:pBdr>
+              <w:spacing w:after="100" w:before="100" w:line="240"/>
+              <w:ind w:left="100" w:right="100" w:firstLine="0" w:firstLineChars="0"/>
+              <w:rPr>
+                <w:rFonts w:ascii="Arial" w:hAnsi="Arial" w:eastAsia="Arial" w:cs="Arial"/>
+                <w:i w:val="false"/>
+                <w:b w:val="false"/>
+                <w:u w:val="none"/>
+                <w:strike w:val="false"/>
+                <w:sz w:val="22"/>
+                <w:szCs w:val="22"/>
+                <w:color w:val="000000"/>
+              </w:rPr>
+            </w:pPr>
+            <w:r xmlns:w="http://schemas.openxmlformats.org/wordprocessingml/2006/main" xmlns:wp="http://schemas.openxmlformats.org/drawingml/2006/wordprocessingDrawing" xmlns:r="http://schemas.openxmlformats.org/officeDocument/2006/relationships" xmlns:w14="http://schemas.microsoft.com/office/word/2010/wordml">
+              <w:rPr>
+                <w:rFonts w:ascii="Arial" w:hAnsi="Arial" w:eastAsia="Arial" w:cs="Arial"/>
+                <w:i w:val="false"/>
+                <w:b w:val="false"/>
+                <w:u w:val="none"/>
+                <w:strike w:val="false"/>
+                <w:sz w:val="22"/>
+                <w:szCs w:val="22"/>
+                <w:color w:val="000000"/>
+              </w:rPr>
+              <w:t xml:space="preserve">Doutaz et al. 2020</w:t>
             </w:r>
           </w:p>
         </w:tc>
@@ -19402,7 +19719,61 @@
                 <w:szCs w:val="22"/>
                 <w:color w:val="000000"/>
               </w:rPr>
-              <w:t xml:space="preserve">LOWER THOMPSON_SP_1.2</w:t>
+              <w:t xml:space="preserve">Lower Thompson, Stream, Spring</w:t>
+            </w:r>
+          </w:p>
+        </w:tc>
+        <w:tc>
+          <w:tcPr>
+            <w:tcBorders>
+              <w:bottom w:val="none" w:sz="0" w:space="0" w:color="000000"/>
+              <w:top w:val="none" w:sz="0" w:space="0" w:color="000000"/>
+              <w:left w:val="none" w:sz="0" w:space="0" w:color="000000"/>
+              <w:right w:val="none" w:sz="0" w:space="0" w:color="000000"/>
+            </w:tcBorders>
+            <w:shd w:val="clear" w:color="auto" w:fill="FFFFFF"/>
+            <w:tcMar>
+              <w:top w:w="0" w:type="dxa"/>
+              <w:bottom w:w="0" w:type="dxa"/>
+              <w:left w:w="0" w:type="dxa"/>
+              <w:right w:w="0" w:type="dxa"/>
+            </w:tcMar>
+            <w:vAlign w:val="center"/>
+          </w:tcPr>
+          <w:p>
+            <w:pPr>
+              <w:jc w:val="left"/>
+              <w:pBdr>
+                <w:bottom w:val="none" w:sz="0" w:space="0" w:color="000000"/>
+                <w:top w:val="none" w:sz="0" w:space="0" w:color="000000"/>
+                <w:left w:val="none" w:sz="0" w:space="0" w:color="000000"/>
+                <w:right w:val="none" w:sz="0" w:space="0" w:color="000000"/>
+              </w:pBdr>
+              <w:spacing w:after="100" w:before="100" w:line="240"/>
+              <w:ind w:left="100" w:right="100" w:firstLine="0" w:firstLineChars="0"/>
+              <w:rPr>
+                <w:rFonts w:ascii="Arial" w:hAnsi="Arial" w:eastAsia="Arial" w:cs="Arial"/>
+                <w:i w:val="false"/>
+                <w:b w:val="false"/>
+                <w:u w:val="none"/>
+                <w:strike w:val="false"/>
+                <w:sz w:val="22"/>
+                <w:szCs w:val="22"/>
+                <w:color w:val="000000"/>
+              </w:rPr>
+            </w:pPr>
+            <w:r xmlns:w="http://schemas.openxmlformats.org/wordprocessingml/2006/main" xmlns:wp="http://schemas.openxmlformats.org/drawingml/2006/wordprocessingDrawing" xmlns:r="http://schemas.openxmlformats.org/officeDocument/2006/relationships" xmlns:w14="http://schemas.microsoft.com/office/word/2010/wordml">
+              <w:rPr>
+                <w:rFonts w:ascii="Arial" w:hAnsi="Arial" w:eastAsia="Arial" w:cs="Arial"/>
+                <w:i w:val="false"/>
+                <w:b w:val="false"/>
+                <w:u w:val="none"/>
+                <w:strike w:val="false"/>
+                <w:sz w:val="22"/>
+                <w:szCs w:val="22"/>
+                <w:color w:val="000000"/>
+              </w:rPr>
+              <w:t xml:space="preserve">Dionne et al. 2023</w:t>
             </w:r>
           </w:p>
         </w:tc>
@@ -19516,7 +19887,61 @@
                 <w:szCs w:val="22"/>
                 <w:color w:val="000000"/>
               </w:rPr>
-              <w:t xml:space="preserve">MARIA SLOUGH_SU_0.3</w:t>
+              <w:t xml:space="preserve">Middle Fraser, Stream, Fall (Portage)</w:t>
+            </w:r>
+          </w:p>
+        </w:tc>
+        <w:tc>
+          <w:tcPr>
+            <w:tcBorders>
+              <w:bottom w:val="none" w:sz="0" w:space="0" w:color="000000"/>
+              <w:top w:val="none" w:sz="0" w:space="0" w:color="000000"/>
+              <w:left w:val="none" w:sz="0" w:space="0" w:color="000000"/>
+              <w:right w:val="none" w:sz="0" w:space="0" w:color="000000"/>
+            </w:tcBorders>
+            <w:shd w:val="clear" w:color="auto" w:fill="FFFFFF"/>
+            <w:tcMar>
+              <w:top w:w="0" w:type="dxa"/>
+              <w:bottom w:w="0" w:type="dxa"/>
+              <w:left w:w="0" w:type="dxa"/>
+              <w:right w:w="0" w:type="dxa"/>
+            </w:tcMar>
+            <w:vAlign w:val="center"/>
+          </w:tcPr>
+          <w:p>
+            <w:pPr>
+              <w:jc w:val="left"/>
+              <w:pBdr>
+                <w:bottom w:val="none" w:sz="0" w:space="0" w:color="000000"/>
+                <w:top w:val="none" w:sz="0" w:space="0" w:color="000000"/>
+                <w:left w:val="none" w:sz="0" w:space="0" w:color="000000"/>
+                <w:right w:val="none" w:sz="0" w:space="0" w:color="000000"/>
+              </w:pBdr>
+              <w:spacing w:after="100" w:before="100" w:line="240"/>
+              <w:ind w:left="100" w:right="100" w:firstLine="0" w:firstLineChars="0"/>
+              <w:rPr>
+                <w:rFonts w:ascii="Arial" w:hAnsi="Arial" w:eastAsia="Arial" w:cs="Arial"/>
+                <w:i w:val="false"/>
+                <w:b w:val="false"/>
+                <w:u w:val="none"/>
+                <w:strike w:val="false"/>
+                <w:sz w:val="22"/>
+                <w:szCs w:val="22"/>
+                <w:color w:val="000000"/>
+              </w:rPr>
+            </w:pPr>
+            <w:r xmlns:w="http://schemas.openxmlformats.org/wordprocessingml/2006/main" xmlns:wp="http://schemas.openxmlformats.org/drawingml/2006/wordprocessingDrawing" xmlns:r="http://schemas.openxmlformats.org/officeDocument/2006/relationships" xmlns:w14="http://schemas.microsoft.com/office/word/2010/wordml">
+              <w:rPr>
+                <w:rFonts w:ascii="Arial" w:hAnsi="Arial" w:eastAsia="Arial" w:cs="Arial"/>
+                <w:i w:val="false"/>
+                <w:b w:val="false"/>
+                <w:u w:val="none"/>
+                <w:strike w:val="false"/>
+                <w:sz w:val="22"/>
+                <w:szCs w:val="22"/>
+                <w:color w:val="000000"/>
+              </w:rPr>
+              <w:t xml:space="preserve">Doutaz et al. 2020</w:t>
             </w:r>
           </w:p>
         </w:tc>
@@ -19630,7 +20055,61 @@
                 <w:szCs w:val="22"/>
                 <w:color w:val="000000"/>
               </w:rPr>
-              <w:t xml:space="preserve">MIDDLE FRASER RIVER-PORTAGE_FA_1.3</w:t>
+              <w:t xml:space="preserve">Middle Fraser, Stream, Spring </w:t>
+            </w:r>
+          </w:p>
+        </w:tc>
+        <w:tc>
+          <w:tcPr>
+            <w:tcBorders>
+              <w:bottom w:val="none" w:sz="0" w:space="0" w:color="000000"/>
+              <w:top w:val="none" w:sz="0" w:space="0" w:color="000000"/>
+              <w:left w:val="none" w:sz="0" w:space="0" w:color="000000"/>
+              <w:right w:val="none" w:sz="0" w:space="0" w:color="000000"/>
+            </w:tcBorders>
+            <w:shd w:val="clear" w:color="auto" w:fill="FFFFFF"/>
+            <w:tcMar>
+              <w:top w:w="0" w:type="dxa"/>
+              <w:bottom w:w="0" w:type="dxa"/>
+              <w:left w:w="0" w:type="dxa"/>
+              <w:right w:w="0" w:type="dxa"/>
+            </w:tcMar>
+            <w:vAlign w:val="center"/>
+          </w:tcPr>
+          <w:p>
+            <w:pPr>
+              <w:jc w:val="left"/>
+              <w:pBdr>
+                <w:bottom w:val="none" w:sz="0" w:space="0" w:color="000000"/>
+                <w:top w:val="none" w:sz="0" w:space="0" w:color="000000"/>
+                <w:left w:val="none" w:sz="0" w:space="0" w:color="000000"/>
+                <w:right w:val="none" w:sz="0" w:space="0" w:color="000000"/>
+              </w:pBdr>
+              <w:spacing w:after="100" w:before="100" w:line="240"/>
+              <w:ind w:left="100" w:right="100" w:firstLine="0" w:firstLineChars="0"/>
+              <w:rPr>
+                <w:rFonts w:ascii="Arial" w:hAnsi="Arial" w:eastAsia="Arial" w:cs="Arial"/>
+                <w:i w:val="false"/>
+                <w:b w:val="false"/>
+                <w:u w:val="none"/>
+                <w:strike w:val="false"/>
+                <w:sz w:val="22"/>
+                <w:szCs w:val="22"/>
+                <w:color w:val="000000"/>
+              </w:rPr>
+            </w:pPr>
+            <w:r xmlns:w="http://schemas.openxmlformats.org/wordprocessingml/2006/main" xmlns:wp="http://schemas.openxmlformats.org/drawingml/2006/wordprocessingDrawing" xmlns:r="http://schemas.openxmlformats.org/officeDocument/2006/relationships" xmlns:w14="http://schemas.microsoft.com/office/word/2010/wordml">
+              <w:rPr>
+                <w:rFonts w:ascii="Arial" w:hAnsi="Arial" w:eastAsia="Arial" w:cs="Arial"/>
+                <w:i w:val="false"/>
+                <w:b w:val="false"/>
+                <w:u w:val="none"/>
+                <w:strike w:val="false"/>
+                <w:sz w:val="22"/>
+                <w:szCs w:val="22"/>
+                <w:color w:val="000000"/>
+              </w:rPr>
+              <w:t xml:space="preserve">Doutaz et al. 2020</w:t>
             </w:r>
           </w:p>
         </w:tc>
@@ -19744,7 +20223,61 @@
                 <w:szCs w:val="22"/>
                 <w:color w:val="000000"/>
               </w:rPr>
-              <w:t xml:space="preserve">MIDDLE FRASER RIVER_SP_1.3</w:t>
+              <w:t xml:space="preserve">Middle Fraser, Stream, Spring (FRCanyon)</w:t>
+            </w:r>
+          </w:p>
+        </w:tc>
+        <w:tc>
+          <w:tcPr>
+            <w:tcBorders>
+              <w:bottom w:val="none" w:sz="0" w:space="0" w:color="000000"/>
+              <w:top w:val="none" w:sz="0" w:space="0" w:color="000000"/>
+              <w:left w:val="none" w:sz="0" w:space="0" w:color="000000"/>
+              <w:right w:val="none" w:sz="0" w:space="0" w:color="000000"/>
+            </w:tcBorders>
+            <w:shd w:val="clear" w:color="auto" w:fill="FFFFFF"/>
+            <w:tcMar>
+              <w:top w:w="0" w:type="dxa"/>
+              <w:bottom w:w="0" w:type="dxa"/>
+              <w:left w:w="0" w:type="dxa"/>
+              <w:right w:w="0" w:type="dxa"/>
+            </w:tcMar>
+            <w:vAlign w:val="center"/>
+          </w:tcPr>
+          <w:p>
+            <w:pPr>
+              <w:jc w:val="left"/>
+              <w:pBdr>
+                <w:bottom w:val="none" w:sz="0" w:space="0" w:color="000000"/>
+                <w:top w:val="none" w:sz="0" w:space="0" w:color="000000"/>
+                <w:left w:val="none" w:sz="0" w:space="0" w:color="000000"/>
+                <w:right w:val="none" w:sz="0" w:space="0" w:color="000000"/>
+              </w:pBdr>
+              <w:spacing w:after="100" w:before="100" w:line="240"/>
+              <w:ind w:left="100" w:right="100" w:firstLine="0" w:firstLineChars="0"/>
+              <w:rPr>
+                <w:rFonts w:ascii="Arial" w:hAnsi="Arial" w:eastAsia="Arial" w:cs="Arial"/>
+                <w:i w:val="false"/>
+                <w:b w:val="false"/>
+                <w:u w:val="none"/>
+                <w:strike w:val="false"/>
+                <w:sz w:val="22"/>
+                <w:szCs w:val="22"/>
+                <w:color w:val="000000"/>
+              </w:rPr>
+            </w:pPr>
+            <w:r xmlns:w="http://schemas.openxmlformats.org/wordprocessingml/2006/main" xmlns:wp="http://schemas.openxmlformats.org/drawingml/2006/wordprocessingDrawing" xmlns:r="http://schemas.openxmlformats.org/officeDocument/2006/relationships" xmlns:w14="http://schemas.microsoft.com/office/word/2010/wordml">
+              <w:rPr>
+                <w:rFonts w:ascii="Arial" w:hAnsi="Arial" w:eastAsia="Arial" w:cs="Arial"/>
+                <w:i w:val="false"/>
+                <w:b w:val="false"/>
+                <w:u w:val="none"/>
+                <w:strike w:val="false"/>
+                <w:sz w:val="22"/>
+                <w:szCs w:val="22"/>
+                <w:color w:val="000000"/>
+              </w:rPr>
+              <w:t xml:space="preserve">Doutaz et al. 2020</w:t>
             </w:r>
           </w:p>
         </w:tc>
@@ -19858,7 +20391,61 @@
                 <w:szCs w:val="22"/>
                 <w:color w:val="000000"/>
               </w:rPr>
-              <w:t xml:space="preserve">MIDDLE FRASER RIVER_SU_1.3</w:t>
+              <w:t xml:space="preserve">Middle Fraser,Stream, Summer</w:t>
+            </w:r>
+          </w:p>
+        </w:tc>
+        <w:tc>
+          <w:tcPr>
+            <w:tcBorders>
+              <w:bottom w:val="none" w:sz="0" w:space="0" w:color="000000"/>
+              <w:top w:val="none" w:sz="0" w:space="0" w:color="000000"/>
+              <w:left w:val="none" w:sz="0" w:space="0" w:color="000000"/>
+              <w:right w:val="none" w:sz="0" w:space="0" w:color="000000"/>
+            </w:tcBorders>
+            <w:shd w:val="clear" w:color="auto" w:fill="FFFFFF"/>
+            <w:tcMar>
+              <w:top w:w="0" w:type="dxa"/>
+              <w:bottom w:w="0" w:type="dxa"/>
+              <w:left w:w="0" w:type="dxa"/>
+              <w:right w:w="0" w:type="dxa"/>
+            </w:tcMar>
+            <w:vAlign w:val="center"/>
+          </w:tcPr>
+          <w:p>
+            <w:pPr>
+              <w:jc w:val="left"/>
+              <w:pBdr>
+                <w:bottom w:val="none" w:sz="0" w:space="0" w:color="000000"/>
+                <w:top w:val="none" w:sz="0" w:space="0" w:color="000000"/>
+                <w:left w:val="none" w:sz="0" w:space="0" w:color="000000"/>
+                <w:right w:val="none" w:sz="0" w:space="0" w:color="000000"/>
+              </w:pBdr>
+              <w:spacing w:after="100" w:before="100" w:line="240"/>
+              <w:ind w:left="100" w:right="100" w:firstLine="0" w:firstLineChars="0"/>
+              <w:rPr>
+                <w:rFonts w:ascii="Arial" w:hAnsi="Arial" w:eastAsia="Arial" w:cs="Arial"/>
+                <w:i w:val="false"/>
+                <w:b w:val="false"/>
+                <w:u w:val="none"/>
+                <w:strike w:val="false"/>
+                <w:sz w:val="22"/>
+                <w:szCs w:val="22"/>
+                <w:color w:val="000000"/>
+              </w:rPr>
+            </w:pPr>
+            <w:r xmlns:w="http://schemas.openxmlformats.org/wordprocessingml/2006/main" xmlns:wp="http://schemas.openxmlformats.org/drawingml/2006/wordprocessingDrawing" xmlns:r="http://schemas.openxmlformats.org/officeDocument/2006/relationships" xmlns:w14="http://schemas.microsoft.com/office/word/2010/wordml">
+              <w:rPr>
+                <w:rFonts w:ascii="Arial" w:hAnsi="Arial" w:eastAsia="Arial" w:cs="Arial"/>
+                <w:i w:val="false"/>
+                <w:b w:val="false"/>
+                <w:u w:val="none"/>
+                <w:strike w:val="false"/>
+                <w:sz w:val="22"/>
+                <w:szCs w:val="22"/>
+                <w:color w:val="000000"/>
+              </w:rPr>
+              <w:t xml:space="preserve">Doutaz et al. 2020</w:t>
             </w:r>
           </w:p>
         </w:tc>
@@ -19972,7 +20559,61 @@
                 <w:szCs w:val="22"/>
                 <w:color w:val="000000"/>
               </w:rPr>
-              <w:t xml:space="preserve">MIDDLE FRASER-FRASER CANYON_SP_1.3</w:t>
+              <w:t xml:space="preserve">North Thompson, Stream, Spring</w:t>
+            </w:r>
+          </w:p>
+        </w:tc>
+        <w:tc>
+          <w:tcPr>
+            <w:tcBorders>
+              <w:bottom w:val="none" w:sz="0" w:space="0" w:color="000000"/>
+              <w:top w:val="none" w:sz="0" w:space="0" w:color="000000"/>
+              <w:left w:val="none" w:sz="0" w:space="0" w:color="000000"/>
+              <w:right w:val="none" w:sz="0" w:space="0" w:color="000000"/>
+            </w:tcBorders>
+            <w:shd w:val="clear" w:color="auto" w:fill="FFFFFF"/>
+            <w:tcMar>
+              <w:top w:w="0" w:type="dxa"/>
+              <w:bottom w:w="0" w:type="dxa"/>
+              <w:left w:w="0" w:type="dxa"/>
+              <w:right w:w="0" w:type="dxa"/>
+            </w:tcMar>
+            <w:vAlign w:val="center"/>
+          </w:tcPr>
+          <w:p>
+            <w:pPr>
+              <w:jc w:val="left"/>
+              <w:pBdr>
+                <w:bottom w:val="none" w:sz="0" w:space="0" w:color="000000"/>
+                <w:top w:val="none" w:sz="0" w:space="0" w:color="000000"/>
+                <w:left w:val="none" w:sz="0" w:space="0" w:color="000000"/>
+                <w:right w:val="none" w:sz="0" w:space="0" w:color="000000"/>
+              </w:pBdr>
+              <w:spacing w:after="100" w:before="100" w:line="240"/>
+              <w:ind w:left="100" w:right="100" w:firstLine="0" w:firstLineChars="0"/>
+              <w:rPr>
+                <w:rFonts w:ascii="Arial" w:hAnsi="Arial" w:eastAsia="Arial" w:cs="Arial"/>
+                <w:i w:val="false"/>
+                <w:b w:val="false"/>
+                <w:u w:val="none"/>
+                <w:strike w:val="false"/>
+                <w:sz w:val="22"/>
+                <w:szCs w:val="22"/>
+                <w:color w:val="000000"/>
+              </w:rPr>
+            </w:pPr>
+            <w:r xmlns:w="http://schemas.openxmlformats.org/wordprocessingml/2006/main" xmlns:wp="http://schemas.openxmlformats.org/drawingml/2006/wordprocessingDrawing" xmlns:r="http://schemas.openxmlformats.org/officeDocument/2006/relationships" xmlns:w14="http://schemas.microsoft.com/office/word/2010/wordml">
+              <w:rPr>
+                <w:rFonts w:ascii="Arial" w:hAnsi="Arial" w:eastAsia="Arial" w:cs="Arial"/>
+                <w:i w:val="false"/>
+                <w:b w:val="false"/>
+                <w:u w:val="none"/>
+                <w:strike w:val="false"/>
+                <w:sz w:val="22"/>
+                <w:szCs w:val="22"/>
+                <w:color w:val="000000"/>
+              </w:rPr>
+              <w:t xml:space="preserve">Doutaz et al. 2020</w:t>
             </w:r>
           </w:p>
         </w:tc>
@@ -20086,7 +20727,61 @@
                 <w:szCs w:val="22"/>
                 <w:color w:val="000000"/>
               </w:rPr>
-              <w:t xml:space="preserve">NORTH THOMPSON_SP_1.3</w:t>
+              <w:t xml:space="preserve">North Thompson, Stream, Summer</w:t>
+            </w:r>
+          </w:p>
+        </w:tc>
+        <w:tc>
+          <w:tcPr>
+            <w:tcBorders>
+              <w:bottom w:val="none" w:sz="0" w:space="0" w:color="000000"/>
+              <w:top w:val="none" w:sz="0" w:space="0" w:color="000000"/>
+              <w:left w:val="none" w:sz="0" w:space="0" w:color="000000"/>
+              <w:right w:val="none" w:sz="0" w:space="0" w:color="000000"/>
+            </w:tcBorders>
+            <w:shd w:val="clear" w:color="auto" w:fill="FFFFFF"/>
+            <w:tcMar>
+              <w:top w:w="0" w:type="dxa"/>
+              <w:bottom w:w="0" w:type="dxa"/>
+              <w:left w:w="0" w:type="dxa"/>
+              <w:right w:w="0" w:type="dxa"/>
+            </w:tcMar>
+            <w:vAlign w:val="center"/>
+          </w:tcPr>
+          <w:p>
+            <w:pPr>
+              <w:jc w:val="left"/>
+              <w:pBdr>
+                <w:bottom w:val="none" w:sz="0" w:space="0" w:color="000000"/>
+                <w:top w:val="none" w:sz="0" w:space="0" w:color="000000"/>
+                <w:left w:val="none" w:sz="0" w:space="0" w:color="000000"/>
+                <w:right w:val="none" w:sz="0" w:space="0" w:color="000000"/>
+              </w:pBdr>
+              <w:spacing w:after="100" w:before="100" w:line="240"/>
+              <w:ind w:left="100" w:right="100" w:firstLine="0" w:firstLineChars="0"/>
+              <w:rPr>
+                <w:rFonts w:ascii="Arial" w:hAnsi="Arial" w:eastAsia="Arial" w:cs="Arial"/>
+                <w:i w:val="false"/>
+                <w:b w:val="false"/>
+                <w:u w:val="none"/>
+                <w:strike w:val="false"/>
+                <w:sz w:val="22"/>
+                <w:szCs w:val="22"/>
+                <w:color w:val="000000"/>
+              </w:rPr>
+            </w:pPr>
+            <w:r xmlns:w="http://schemas.openxmlformats.org/wordprocessingml/2006/main" xmlns:wp="http://schemas.openxmlformats.org/drawingml/2006/wordprocessingDrawing" xmlns:r="http://schemas.openxmlformats.org/officeDocument/2006/relationships" xmlns:w14="http://schemas.microsoft.com/office/word/2010/wordml">
+              <w:rPr>
+                <w:rFonts w:ascii="Arial" w:hAnsi="Arial" w:eastAsia="Arial" w:cs="Arial"/>
+                <w:i w:val="false"/>
+                <w:b w:val="false"/>
+                <w:u w:val="none"/>
+                <w:strike w:val="false"/>
+                <w:sz w:val="22"/>
+                <w:szCs w:val="22"/>
+                <w:color w:val="000000"/>
+              </w:rPr>
+              <w:t xml:space="preserve">Doutaz et al. 2020</w:t>
             </w:r>
           </w:p>
         </w:tc>
@@ -20200,7 +20895,61 @@
                 <w:szCs w:val="22"/>
                 <w:color w:val="000000"/>
               </w:rPr>
-              <w:t xml:space="preserve">NORTH THOMPSON_SU_1.3</w:t>
+              <w:t xml:space="preserve">Okanagan River,Ocean, Summer</w:t>
+            </w:r>
+          </w:p>
+        </w:tc>
+        <w:tc>
+          <w:tcPr>
+            <w:tcBorders>
+              <w:bottom w:val="none" w:sz="0" w:space="0" w:color="000000"/>
+              <w:top w:val="none" w:sz="0" w:space="0" w:color="000000"/>
+              <w:left w:val="none" w:sz="0" w:space="0" w:color="000000"/>
+              <w:right w:val="none" w:sz="0" w:space="0" w:color="000000"/>
+            </w:tcBorders>
+            <w:shd w:val="clear" w:color="auto" w:fill="FFFFFF"/>
+            <w:tcMar>
+              <w:top w:w="0" w:type="dxa"/>
+              <w:bottom w:w="0" w:type="dxa"/>
+              <w:left w:w="0" w:type="dxa"/>
+              <w:right w:w="0" w:type="dxa"/>
+            </w:tcMar>
+            <w:vAlign w:val="center"/>
+          </w:tcPr>
+          <w:p>
+            <w:pPr>
+              <w:jc w:val="left"/>
+              <w:pBdr>
+                <w:bottom w:val="none" w:sz="0" w:space="0" w:color="000000"/>
+                <w:top w:val="none" w:sz="0" w:space="0" w:color="000000"/>
+                <w:left w:val="none" w:sz="0" w:space="0" w:color="000000"/>
+                <w:right w:val="none" w:sz="0" w:space="0" w:color="000000"/>
+              </w:pBdr>
+              <w:spacing w:after="100" w:before="100" w:line="240"/>
+              <w:ind w:left="100" w:right="100" w:firstLine="0" w:firstLineChars="0"/>
+              <w:rPr>
+                <w:rFonts w:ascii="Arial" w:hAnsi="Arial" w:eastAsia="Arial" w:cs="Arial"/>
+                <w:i w:val="false"/>
+                <w:b w:val="false"/>
+                <w:u w:val="none"/>
+                <w:strike w:val="false"/>
+                <w:sz w:val="22"/>
+                <w:szCs w:val="22"/>
+                <w:color w:val="000000"/>
+              </w:rPr>
+            </w:pPr>
+            <w:r xmlns:w="http://schemas.openxmlformats.org/wordprocessingml/2006/main" xmlns:wp="http://schemas.openxmlformats.org/drawingml/2006/wordprocessingDrawing" xmlns:r="http://schemas.openxmlformats.org/officeDocument/2006/relationships" xmlns:w14="http://schemas.microsoft.com/office/word/2010/wordml">
+              <w:rPr>
+                <w:rFonts w:ascii="Arial" w:hAnsi="Arial" w:eastAsia="Arial" w:cs="Arial"/>
+                <w:i w:val="false"/>
+                <w:b w:val="false"/>
+                <w:u w:val="none"/>
+                <w:strike w:val="false"/>
+                <w:sz w:val="22"/>
+                <w:szCs w:val="22"/>
+                <w:color w:val="000000"/>
+              </w:rPr>
+              <w:t xml:space="preserve">Mahony et al. 2021</w:t>
             </w:r>
           </w:p>
         </w:tc>
@@ -20314,7 +21063,61 @@
                 <w:szCs w:val="22"/>
                 <w:color w:val="000000"/>
               </w:rPr>
-              <w:t xml:space="preserve">OKANAGAN_0.X</w:t>
+              <w:t xml:space="preserve">South Thompson, Stream, Summer </w:t>
+            </w:r>
+          </w:p>
+        </w:tc>
+        <w:tc>
+          <w:tcPr>
+            <w:tcBorders>
+              <w:bottom w:val="none" w:sz="0" w:space="0" w:color="000000"/>
+              <w:top w:val="none" w:sz="0" w:space="0" w:color="000000"/>
+              <w:left w:val="none" w:sz="0" w:space="0" w:color="000000"/>
+              <w:right w:val="none" w:sz="0" w:space="0" w:color="000000"/>
+            </w:tcBorders>
+            <w:shd w:val="clear" w:color="auto" w:fill="FFFFFF"/>
+            <w:tcMar>
+              <w:top w:w="0" w:type="dxa"/>
+              <w:bottom w:w="0" w:type="dxa"/>
+              <w:left w:w="0" w:type="dxa"/>
+              <w:right w:w="0" w:type="dxa"/>
+            </w:tcMar>
+            <w:vAlign w:val="center"/>
+          </w:tcPr>
+          <w:p>
+            <w:pPr>
+              <w:jc w:val="left"/>
+              <w:pBdr>
+                <w:bottom w:val="none" w:sz="0" w:space="0" w:color="000000"/>
+                <w:top w:val="none" w:sz="0" w:space="0" w:color="000000"/>
+                <w:left w:val="none" w:sz="0" w:space="0" w:color="000000"/>
+                <w:right w:val="none" w:sz="0" w:space="0" w:color="000000"/>
+              </w:pBdr>
+              <w:spacing w:after="100" w:before="100" w:line="240"/>
+              <w:ind w:left="100" w:right="100" w:firstLine="0" w:firstLineChars="0"/>
+              <w:rPr>
+                <w:rFonts w:ascii="Arial" w:hAnsi="Arial" w:eastAsia="Arial" w:cs="Arial"/>
+                <w:i w:val="false"/>
+                <w:b w:val="false"/>
+                <w:u w:val="none"/>
+                <w:strike w:val="false"/>
+                <w:sz w:val="22"/>
+                <w:szCs w:val="22"/>
+                <w:color w:val="000000"/>
+              </w:rPr>
+            </w:pPr>
+            <w:r xmlns:w="http://schemas.openxmlformats.org/wordprocessingml/2006/main" xmlns:wp="http://schemas.openxmlformats.org/drawingml/2006/wordprocessingDrawing" xmlns:r="http://schemas.openxmlformats.org/officeDocument/2006/relationships" xmlns:w14="http://schemas.microsoft.com/office/word/2010/wordml">
+              <w:rPr>
+                <w:rFonts w:ascii="Arial" w:hAnsi="Arial" w:eastAsia="Arial" w:cs="Arial"/>
+                <w:i w:val="false"/>
+                <w:b w:val="false"/>
+                <w:u w:val="none"/>
+                <w:strike w:val="false"/>
+                <w:sz w:val="22"/>
+                <w:szCs w:val="22"/>
+                <w:color w:val="000000"/>
+              </w:rPr>
+              <w:t xml:space="preserve">Dionne et al. 2023</w:t>
             </w:r>
           </w:p>
         </w:tc>
@@ -20428,7 +21231,61 @@
                 <w:szCs w:val="22"/>
                 <w:color w:val="000000"/>
               </w:rPr>
-              <w:t xml:space="preserve">SOUTH THOMPSON-BESSETTE CREEK_SU_1.2</w:t>
+              <w:t xml:space="preserve">South Thompson, Stream, Summer (Bessette)</w:t>
+            </w:r>
+          </w:p>
+        </w:tc>
+        <w:tc>
+          <w:tcPr>
+            <w:tcBorders>
+              <w:bottom w:val="none" w:sz="0" w:space="0" w:color="000000"/>
+              <w:top w:val="none" w:sz="0" w:space="0" w:color="000000"/>
+              <w:left w:val="none" w:sz="0" w:space="0" w:color="000000"/>
+              <w:right w:val="none" w:sz="0" w:space="0" w:color="000000"/>
+            </w:tcBorders>
+            <w:shd w:val="clear" w:color="auto" w:fill="FFFFFF"/>
+            <w:tcMar>
+              <w:top w:w="0" w:type="dxa"/>
+              <w:bottom w:w="0" w:type="dxa"/>
+              <w:left w:w="0" w:type="dxa"/>
+              <w:right w:w="0" w:type="dxa"/>
+            </w:tcMar>
+            <w:vAlign w:val="center"/>
+          </w:tcPr>
+          <w:p>
+            <w:pPr>
+              <w:jc w:val="left"/>
+              <w:pBdr>
+                <w:bottom w:val="none" w:sz="0" w:space="0" w:color="000000"/>
+                <w:top w:val="none" w:sz="0" w:space="0" w:color="000000"/>
+                <w:left w:val="none" w:sz="0" w:space="0" w:color="000000"/>
+                <w:right w:val="none" w:sz="0" w:space="0" w:color="000000"/>
+              </w:pBdr>
+              <w:spacing w:after="100" w:before="100" w:line="240"/>
+              <w:ind w:left="100" w:right="100" w:firstLine="0" w:firstLineChars="0"/>
+              <w:rPr>
+                <w:rFonts w:ascii="Arial" w:hAnsi="Arial" w:eastAsia="Arial" w:cs="Arial"/>
+                <w:i w:val="false"/>
+                <w:b w:val="false"/>
+                <w:u w:val="none"/>
+                <w:strike w:val="false"/>
+                <w:sz w:val="22"/>
+                <w:szCs w:val="22"/>
+                <w:color w:val="000000"/>
+              </w:rPr>
+            </w:pPr>
+            <w:r xmlns:w="http://schemas.openxmlformats.org/wordprocessingml/2006/main" xmlns:wp="http://schemas.openxmlformats.org/drawingml/2006/wordprocessingDrawing" xmlns:r="http://schemas.openxmlformats.org/officeDocument/2006/relationships" xmlns:w14="http://schemas.microsoft.com/office/word/2010/wordml">
+              <w:rPr>
+                <w:rFonts w:ascii="Arial" w:hAnsi="Arial" w:eastAsia="Arial" w:cs="Arial"/>
+                <w:i w:val="false"/>
+                <w:b w:val="false"/>
+                <w:u w:val="none"/>
+                <w:strike w:val="false"/>
+                <w:sz w:val="22"/>
+                <w:szCs w:val="22"/>
+                <w:color w:val="000000"/>
+              </w:rPr>
+              <w:t xml:space="preserve">Doutaz et al. 2020</w:t>
             </w:r>
           </w:p>
         </w:tc>
@@ -20542,7 +21399,61 @@
                 <w:szCs w:val="22"/>
                 <w:color w:val="000000"/>
               </w:rPr>
-              <w:t xml:space="preserve">SOUTH THOMPSON_SU_1.3</w:t>
+              <w:t xml:space="preserve">Southern Mainland Boundary Bay, Ocean, Fall population</w:t>
+            </w:r>
+          </w:p>
+        </w:tc>
+        <w:tc>
+          <w:tcPr>
+            <w:tcBorders>
+              <w:bottom w:val="none" w:sz="0" w:space="0" w:color="000000"/>
+              <w:top w:val="none" w:sz="0" w:space="0" w:color="000000"/>
+              <w:left w:val="none" w:sz="0" w:space="0" w:color="000000"/>
+              <w:right w:val="none" w:sz="0" w:space="0" w:color="000000"/>
+            </w:tcBorders>
+            <w:shd w:val="clear" w:color="auto" w:fill="FFFFFF"/>
+            <w:tcMar>
+              <w:top w:w="0" w:type="dxa"/>
+              <w:bottom w:w="0" w:type="dxa"/>
+              <w:left w:w="0" w:type="dxa"/>
+              <w:right w:w="0" w:type="dxa"/>
+            </w:tcMar>
+            <w:vAlign w:val="center"/>
+          </w:tcPr>
+          <w:p>
+            <w:pPr>
+              <w:jc w:val="left"/>
+              <w:pBdr>
+                <w:bottom w:val="none" w:sz="0" w:space="0" w:color="000000"/>
+                <w:top w:val="none" w:sz="0" w:space="0" w:color="000000"/>
+                <w:left w:val="none" w:sz="0" w:space="0" w:color="000000"/>
+                <w:right w:val="none" w:sz="0" w:space="0" w:color="000000"/>
+              </w:pBdr>
+              <w:spacing w:after="100" w:before="100" w:line="240"/>
+              <w:ind w:left="100" w:right="100" w:firstLine="0" w:firstLineChars="0"/>
+              <w:rPr>
+                <w:rFonts w:ascii="Arial" w:hAnsi="Arial" w:eastAsia="Arial" w:cs="Arial"/>
+                <w:i w:val="false"/>
+                <w:b w:val="false"/>
+                <w:u w:val="none"/>
+                <w:strike w:val="false"/>
+                <w:sz w:val="22"/>
+                <w:szCs w:val="22"/>
+                <w:color w:val="000000"/>
+              </w:rPr>
+            </w:pPr>
+            <w:r xmlns:w="http://schemas.openxmlformats.org/wordprocessingml/2006/main" xmlns:wp="http://schemas.openxmlformats.org/drawingml/2006/wordprocessingDrawing" xmlns:r="http://schemas.openxmlformats.org/officeDocument/2006/relationships" xmlns:w14="http://schemas.microsoft.com/office/word/2010/wordml">
+              <w:rPr>
+                <w:rFonts w:ascii="Arial" w:hAnsi="Arial" w:eastAsia="Arial" w:cs="Arial"/>
+                <w:i w:val="false"/>
+                <w:b w:val="false"/>
+                <w:u w:val="none"/>
+                <w:strike w:val="false"/>
+                <w:sz w:val="22"/>
+                <w:szCs w:val="22"/>
+                <w:color w:val="000000"/>
+              </w:rPr>
+              <w:t xml:space="preserve">Dionne et al. 2023</w:t>
             </w:r>
           </w:p>
         </w:tc>
@@ -20656,7 +21567,61 @@
                 <w:szCs w:val="22"/>
                 <w:color w:val="000000"/>
               </w:rPr>
-              <w:t xml:space="preserve">UPPER FRASER RIVER_SP_1.3</w:t>
+              <w:t xml:space="preserve">Upper Fraser, Stream, Spring</w:t>
+            </w:r>
+          </w:p>
+        </w:tc>
+        <w:tc>
+          <w:tcPr>
+            <w:tcBorders>
+              <w:bottom w:val="none" w:sz="0" w:space="0" w:color="000000"/>
+              <w:top w:val="none" w:sz="0" w:space="0" w:color="000000"/>
+              <w:left w:val="none" w:sz="0" w:space="0" w:color="000000"/>
+              <w:right w:val="none" w:sz="0" w:space="0" w:color="000000"/>
+            </w:tcBorders>
+            <w:shd w:val="clear" w:color="auto" w:fill="FFFFFF"/>
+            <w:tcMar>
+              <w:top w:w="0" w:type="dxa"/>
+              <w:bottom w:w="0" w:type="dxa"/>
+              <w:left w:w="0" w:type="dxa"/>
+              <w:right w:w="0" w:type="dxa"/>
+            </w:tcMar>
+            <w:vAlign w:val="center"/>
+          </w:tcPr>
+          <w:p>
+            <w:pPr>
+              <w:jc w:val="left"/>
+              <w:pBdr>
+                <w:bottom w:val="none" w:sz="0" w:space="0" w:color="000000"/>
+                <w:top w:val="none" w:sz="0" w:space="0" w:color="000000"/>
+                <w:left w:val="none" w:sz="0" w:space="0" w:color="000000"/>
+                <w:right w:val="none" w:sz="0" w:space="0" w:color="000000"/>
+              </w:pBdr>
+              <w:spacing w:after="100" w:before="100" w:line="240"/>
+              <w:ind w:left="100" w:right="100" w:firstLine="0" w:firstLineChars="0"/>
+              <w:rPr>
+                <w:rFonts w:ascii="Arial" w:hAnsi="Arial" w:eastAsia="Arial" w:cs="Arial"/>
+                <w:i w:val="false"/>
+                <w:b w:val="false"/>
+                <w:u w:val="none"/>
+                <w:strike w:val="false"/>
+                <w:sz w:val="22"/>
+                <w:szCs w:val="22"/>
+                <w:color w:val="000000"/>
+              </w:rPr>
+            </w:pPr>
+            <w:r xmlns:w="http://schemas.openxmlformats.org/wordprocessingml/2006/main" xmlns:wp="http://schemas.openxmlformats.org/drawingml/2006/wordprocessingDrawing" xmlns:r="http://schemas.openxmlformats.org/officeDocument/2006/relationships" xmlns:w14="http://schemas.microsoft.com/office/word/2010/wordml">
+              <w:rPr>
+                <w:rFonts w:ascii="Arial" w:hAnsi="Arial" w:eastAsia="Arial" w:cs="Arial"/>
+                <w:i w:val="false"/>
+                <w:b w:val="false"/>
+                <w:u w:val="none"/>
+                <w:strike w:val="false"/>
+                <w:sz w:val="22"/>
+                <w:szCs w:val="22"/>
+                <w:color w:val="000000"/>
+              </w:rPr>
+              <w:t xml:space="preserve">Doutaz et al. 2020</w:t>
             </w:r>
           </w:p>
         </w:tc>
@@ -20770,7 +21735,61 @@
                 <w:szCs w:val="22"/>
                 <w:color w:val="000000"/>
               </w:rPr>
-              <w:t xml:space="preserve">FRASER CANYON</w:t>
+              <w:t xml:space="preserve">Interior Fraser Coho</w:t>
+            </w:r>
+          </w:p>
+        </w:tc>
+        <w:tc>
+          <w:tcPr>
+            <w:tcBorders>
+              <w:bottom w:val="none" w:sz="0" w:space="0" w:color="000000"/>
+              <w:top w:val="none" w:sz="0" w:space="0" w:color="000000"/>
+              <w:left w:val="none" w:sz="0" w:space="0" w:color="000000"/>
+              <w:right w:val="none" w:sz="0" w:space="0" w:color="000000"/>
+            </w:tcBorders>
+            <w:shd w:val="clear" w:color="auto" w:fill="FFFFFF"/>
+            <w:tcMar>
+              <w:top w:w="0" w:type="dxa"/>
+              <w:bottom w:w="0" w:type="dxa"/>
+              <w:left w:w="0" w:type="dxa"/>
+              <w:right w:w="0" w:type="dxa"/>
+            </w:tcMar>
+            <w:vAlign w:val="center"/>
+          </w:tcPr>
+          <w:p>
+            <w:pPr>
+              <w:jc w:val="left"/>
+              <w:pBdr>
+                <w:bottom w:val="none" w:sz="0" w:space="0" w:color="000000"/>
+                <w:top w:val="none" w:sz="0" w:space="0" w:color="000000"/>
+                <w:left w:val="none" w:sz="0" w:space="0" w:color="000000"/>
+                <w:right w:val="none" w:sz="0" w:space="0" w:color="000000"/>
+              </w:pBdr>
+              <w:spacing w:after="100" w:before="100" w:line="240"/>
+              <w:ind w:left="100" w:right="100" w:firstLine="0" w:firstLineChars="0"/>
+              <w:rPr>
+                <w:rFonts w:ascii="Arial" w:hAnsi="Arial" w:eastAsia="Arial" w:cs="Arial"/>
+                <w:i w:val="false"/>
+                <w:b w:val="false"/>
+                <w:u w:val="none"/>
+                <w:strike w:val="false"/>
+                <w:sz w:val="22"/>
+                <w:szCs w:val="22"/>
+                <w:color w:val="000000"/>
+              </w:rPr>
+            </w:pPr>
+            <w:r xmlns:w="http://schemas.openxmlformats.org/wordprocessingml/2006/main" xmlns:wp="http://schemas.openxmlformats.org/drawingml/2006/wordprocessingDrawing" xmlns:r="http://schemas.openxmlformats.org/officeDocument/2006/relationships" xmlns:w14="http://schemas.microsoft.com/office/word/2010/wordml">
+              <w:rPr>
+                <w:rFonts w:ascii="Arial" w:hAnsi="Arial" w:eastAsia="Arial" w:cs="Arial"/>
+                <w:i w:val="false"/>
+                <w:b w:val="false"/>
+                <w:u w:val="none"/>
+                <w:strike w:val="false"/>
+                <w:sz w:val="22"/>
+                <w:szCs w:val="22"/>
+                <w:color w:val="000000"/>
+              </w:rPr>
+              <w:t xml:space="preserve">Arbeider et al. 2020</w:t>
             </w:r>
           </w:p>
         </w:tc>
@@ -20830,7 +21849,7 @@
                 <w:szCs w:val="22"/>
                 <w:color w:val="000000"/>
               </w:rPr>
-              <w:t xml:space="preserve">Coho</w:t>
+              <w:t xml:space="preserve">Sockeye</w:t>
             </w:r>
           </w:p>
         </w:tc>
@@ -20884,7 +21903,61 @@
                 <w:szCs w:val="22"/>
                 <w:color w:val="000000"/>
               </w:rPr>
-              <w:t xml:space="preserve">LOWER THOMPSON</w:t>
+              <w:t xml:space="preserve">Bowron-ES population</w:t>
+            </w:r>
+          </w:p>
+        </w:tc>
+        <w:tc>
+          <w:tcPr>
+            <w:tcBorders>
+              <w:bottom w:val="none" w:sz="0" w:space="0" w:color="000000"/>
+              <w:top w:val="none" w:sz="0" w:space="0" w:color="000000"/>
+              <w:left w:val="none" w:sz="0" w:space="0" w:color="000000"/>
+              <w:right w:val="none" w:sz="0" w:space="0" w:color="000000"/>
+            </w:tcBorders>
+            <w:shd w:val="clear" w:color="auto" w:fill="FFFFFF"/>
+            <w:tcMar>
+              <w:top w:w="0" w:type="dxa"/>
+              <w:bottom w:w="0" w:type="dxa"/>
+              <w:left w:w="0" w:type="dxa"/>
+              <w:right w:w="0" w:type="dxa"/>
+            </w:tcMar>
+            <w:vAlign w:val="center"/>
+          </w:tcPr>
+          <w:p>
+            <w:pPr>
+              <w:jc w:val="left"/>
+              <w:pBdr>
+                <w:bottom w:val="none" w:sz="0" w:space="0" w:color="000000"/>
+                <w:top w:val="none" w:sz="0" w:space="0" w:color="000000"/>
+                <w:left w:val="none" w:sz="0" w:space="0" w:color="000000"/>
+                <w:right w:val="none" w:sz="0" w:space="0" w:color="000000"/>
+              </w:pBdr>
+              <w:spacing w:after="100" w:before="100" w:line="240"/>
+              <w:ind w:left="100" w:right="100" w:firstLine="0" w:firstLineChars="0"/>
+              <w:rPr>
+                <w:rFonts w:ascii="Arial" w:hAnsi="Arial" w:eastAsia="Arial" w:cs="Arial"/>
+                <w:i w:val="false"/>
+                <w:b w:val="false"/>
+                <w:u w:val="none"/>
+                <w:strike w:val="false"/>
+                <w:sz w:val="22"/>
+                <w:szCs w:val="22"/>
+                <w:color w:val="000000"/>
+              </w:rPr>
+            </w:pPr>
+            <w:r xmlns:w="http://schemas.openxmlformats.org/wordprocessingml/2006/main" xmlns:wp="http://schemas.openxmlformats.org/drawingml/2006/wordprocessingDrawing" xmlns:r="http://schemas.openxmlformats.org/officeDocument/2006/relationships" xmlns:w14="http://schemas.microsoft.com/office/word/2010/wordml">
+              <w:rPr>
+                <w:rFonts w:ascii="Arial" w:hAnsi="Arial" w:eastAsia="Arial" w:cs="Arial"/>
+                <w:i w:val="false"/>
+                <w:b w:val="false"/>
+                <w:u w:val="none"/>
+                <w:strike w:val="false"/>
+                <w:sz w:val="22"/>
+                <w:szCs w:val="22"/>
+                <w:color w:val="000000"/>
+              </w:rPr>
+              <w:t xml:space="preserve">Doutaz et al. 2023</w:t>
             </w:r>
           </w:p>
         </w:tc>
@@ -20944,7 +22017,7 @@
                 <w:szCs w:val="22"/>
                 <w:color w:val="000000"/>
               </w:rPr>
-              <w:t xml:space="preserve">Coho</w:t>
+              <w:t xml:space="preserve">Sockeye</w:t>
             </w:r>
           </w:p>
         </w:tc>
@@ -20998,7 +22071,61 @@
                 <w:szCs w:val="22"/>
                 <w:color w:val="000000"/>
               </w:rPr>
-              <w:t xml:space="preserve">MIDDLE FRASER</w:t>
+              <w:t xml:space="preserve">Cultus-L population</w:t>
+            </w:r>
+          </w:p>
+        </w:tc>
+        <w:tc>
+          <w:tcPr>
+            <w:tcBorders>
+              <w:bottom w:val="none" w:sz="0" w:space="0" w:color="000000"/>
+              <w:top w:val="none" w:sz="0" w:space="0" w:color="000000"/>
+              <w:left w:val="none" w:sz="0" w:space="0" w:color="000000"/>
+              <w:right w:val="none" w:sz="0" w:space="0" w:color="000000"/>
+            </w:tcBorders>
+            <w:shd w:val="clear" w:color="auto" w:fill="FFFFFF"/>
+            <w:tcMar>
+              <w:top w:w="0" w:type="dxa"/>
+              <w:bottom w:w="0" w:type="dxa"/>
+              <w:left w:w="0" w:type="dxa"/>
+              <w:right w:w="0" w:type="dxa"/>
+            </w:tcMar>
+            <w:vAlign w:val="center"/>
+          </w:tcPr>
+          <w:p>
+            <w:pPr>
+              <w:jc w:val="left"/>
+              <w:pBdr>
+                <w:bottom w:val="none" w:sz="0" w:space="0" w:color="000000"/>
+                <w:top w:val="none" w:sz="0" w:space="0" w:color="000000"/>
+                <w:left w:val="none" w:sz="0" w:space="0" w:color="000000"/>
+                <w:right w:val="none" w:sz="0" w:space="0" w:color="000000"/>
+              </w:pBdr>
+              <w:spacing w:after="100" w:before="100" w:line="240"/>
+              <w:ind w:left="100" w:right="100" w:firstLine="0" w:firstLineChars="0"/>
+              <w:rPr>
+                <w:rFonts w:ascii="Arial" w:hAnsi="Arial" w:eastAsia="Arial" w:cs="Arial"/>
+                <w:i w:val="false"/>
+                <w:b w:val="false"/>
+                <w:u w:val="none"/>
+                <w:strike w:val="false"/>
+                <w:sz w:val="22"/>
+                <w:szCs w:val="22"/>
+                <w:color w:val="000000"/>
+              </w:rPr>
+            </w:pPr>
+            <w:r xmlns:w="http://schemas.openxmlformats.org/wordprocessingml/2006/main" xmlns:wp="http://schemas.openxmlformats.org/drawingml/2006/wordprocessingDrawing" xmlns:r="http://schemas.openxmlformats.org/officeDocument/2006/relationships" xmlns:w14="http://schemas.microsoft.com/office/word/2010/wordml">
+              <w:rPr>
+                <w:rFonts w:ascii="Arial" w:hAnsi="Arial" w:eastAsia="Arial" w:cs="Arial"/>
+                <w:i w:val="false"/>
+                <w:b w:val="false"/>
+                <w:u w:val="none"/>
+                <w:strike w:val="false"/>
+                <w:sz w:val="22"/>
+                <w:szCs w:val="22"/>
+                <w:color w:val="000000"/>
+              </w:rPr>
+              <w:t xml:space="preserve">DFO 2019</w:t>
             </w:r>
           </w:p>
         </w:tc>
@@ -21058,7 +22185,7 @@
                 <w:szCs w:val="22"/>
                 <w:color w:val="000000"/>
               </w:rPr>
-              <w:t xml:space="preserve">Coho</w:t>
+              <w:t xml:space="preserve">Sockeye</w:t>
             </w:r>
           </w:p>
         </w:tc>
@@ -21112,7 +22239,61 @@
                 <w:szCs w:val="22"/>
                 <w:color w:val="000000"/>
               </w:rPr>
-              <w:t xml:space="preserve">NORTH THOMPSON</w:t>
+              <w:t xml:space="preserve">Harrison (U/S)-L population</w:t>
+            </w:r>
+          </w:p>
+        </w:tc>
+        <w:tc>
+          <w:tcPr>
+            <w:tcBorders>
+              <w:bottom w:val="none" w:sz="0" w:space="0" w:color="000000"/>
+              <w:top w:val="none" w:sz="0" w:space="0" w:color="000000"/>
+              <w:left w:val="none" w:sz="0" w:space="0" w:color="000000"/>
+              <w:right w:val="none" w:sz="0" w:space="0" w:color="000000"/>
+            </w:tcBorders>
+            <w:shd w:val="clear" w:color="auto" w:fill="FFFFFF"/>
+            <w:tcMar>
+              <w:top w:w="0" w:type="dxa"/>
+              <w:bottom w:w="0" w:type="dxa"/>
+              <w:left w:w="0" w:type="dxa"/>
+              <w:right w:w="0" w:type="dxa"/>
+            </w:tcMar>
+            <w:vAlign w:val="center"/>
+          </w:tcPr>
+          <w:p>
+            <w:pPr>
+              <w:jc w:val="left"/>
+              <w:pBdr>
+                <w:bottom w:val="none" w:sz="0" w:space="0" w:color="000000"/>
+                <w:top w:val="none" w:sz="0" w:space="0" w:color="000000"/>
+                <w:left w:val="none" w:sz="0" w:space="0" w:color="000000"/>
+                <w:right w:val="none" w:sz="0" w:space="0" w:color="000000"/>
+              </w:pBdr>
+              <w:spacing w:after="100" w:before="100" w:line="240"/>
+              <w:ind w:left="100" w:right="100" w:firstLine="0" w:firstLineChars="0"/>
+              <w:rPr>
+                <w:rFonts w:ascii="Arial" w:hAnsi="Arial" w:eastAsia="Arial" w:cs="Arial"/>
+                <w:i w:val="false"/>
+                <w:b w:val="false"/>
+                <w:u w:val="none"/>
+                <w:strike w:val="false"/>
+                <w:sz w:val="22"/>
+                <w:szCs w:val="22"/>
+                <w:color w:val="000000"/>
+              </w:rPr>
+            </w:pPr>
+            <w:r xmlns:w="http://schemas.openxmlformats.org/wordprocessingml/2006/main" xmlns:wp="http://schemas.openxmlformats.org/drawingml/2006/wordprocessingDrawing" xmlns:r="http://schemas.openxmlformats.org/officeDocument/2006/relationships" xmlns:w14="http://schemas.microsoft.com/office/word/2010/wordml">
+              <w:rPr>
+                <w:rFonts w:ascii="Arial" w:hAnsi="Arial" w:eastAsia="Arial" w:cs="Arial"/>
+                <w:i w:val="false"/>
+                <w:b w:val="false"/>
+                <w:u w:val="none"/>
+                <w:strike w:val="false"/>
+                <w:sz w:val="22"/>
+                <w:szCs w:val="22"/>
+                <w:color w:val="000000"/>
+              </w:rPr>
+              <w:t xml:space="preserve">Doutaz et al. 2023</w:t>
             </w:r>
           </w:p>
         </w:tc>
@@ -21172,7 +22353,7 @@
                 <w:szCs w:val="22"/>
                 <w:color w:val="000000"/>
               </w:rPr>
-              <w:t xml:space="preserve">Coho</w:t>
+              <w:t xml:space="preserve">Sockeye</w:t>
             </w:r>
           </w:p>
         </w:tc>
@@ -21226,7 +22407,61 @@
                 <w:szCs w:val="22"/>
                 <w:color w:val="000000"/>
               </w:rPr>
-              <w:t xml:space="preserve">SOUTH THOMPSON</w:t>
+              <w:t xml:space="preserve">North Barriere-ES population (original)</w:t>
+            </w:r>
+          </w:p>
+        </w:tc>
+        <w:tc>
+          <w:tcPr>
+            <w:tcBorders>
+              <w:bottom w:val="none" w:sz="0" w:space="0" w:color="000000"/>
+              <w:top w:val="none" w:sz="0" w:space="0" w:color="000000"/>
+              <w:left w:val="none" w:sz="0" w:space="0" w:color="000000"/>
+              <w:right w:val="none" w:sz="0" w:space="0" w:color="000000"/>
+            </w:tcBorders>
+            <w:shd w:val="clear" w:color="auto" w:fill="FFFFFF"/>
+            <w:tcMar>
+              <w:top w:w="0" w:type="dxa"/>
+              <w:bottom w:w="0" w:type="dxa"/>
+              <w:left w:w="0" w:type="dxa"/>
+              <w:right w:w="0" w:type="dxa"/>
+            </w:tcMar>
+            <w:vAlign w:val="center"/>
+          </w:tcPr>
+          <w:p>
+            <w:pPr>
+              <w:jc w:val="left"/>
+              <w:pBdr>
+                <w:bottom w:val="none" w:sz="0" w:space="0" w:color="000000"/>
+                <w:top w:val="none" w:sz="0" w:space="0" w:color="000000"/>
+                <w:left w:val="none" w:sz="0" w:space="0" w:color="000000"/>
+                <w:right w:val="none" w:sz="0" w:space="0" w:color="000000"/>
+              </w:pBdr>
+              <w:spacing w:after="100" w:before="100" w:line="240"/>
+              <w:ind w:left="100" w:right="100" w:firstLine="0" w:firstLineChars="0"/>
+              <w:rPr>
+                <w:rFonts w:ascii="Arial" w:hAnsi="Arial" w:eastAsia="Arial" w:cs="Arial"/>
+                <w:i w:val="false"/>
+                <w:b w:val="false"/>
+                <w:u w:val="none"/>
+                <w:strike w:val="false"/>
+                <w:sz w:val="22"/>
+                <w:szCs w:val="22"/>
+                <w:color w:val="000000"/>
+              </w:rPr>
+            </w:pPr>
+            <w:r xmlns:w="http://schemas.openxmlformats.org/wordprocessingml/2006/main" xmlns:wp="http://schemas.openxmlformats.org/drawingml/2006/wordprocessingDrawing" xmlns:r="http://schemas.openxmlformats.org/officeDocument/2006/relationships" xmlns:w14="http://schemas.microsoft.com/office/word/2010/wordml">
+              <w:rPr>
+                <w:rFonts w:ascii="Arial" w:hAnsi="Arial" w:eastAsia="Arial" w:cs="Arial"/>
+                <w:i w:val="false"/>
+                <w:b w:val="false"/>
+                <w:u w:val="none"/>
+                <w:strike w:val="false"/>
+                <w:sz w:val="22"/>
+                <w:szCs w:val="22"/>
+                <w:color w:val="000000"/>
+              </w:rPr>
+              <w:t xml:space="preserve">Doutaz et al. 2023</w:t>
             </w:r>
           </w:p>
         </w:tc>
@@ -21340,7 +22575,61 @@
                 <w:szCs w:val="22"/>
                 <w:color w:val="000000"/>
               </w:rPr>
-              <w:t xml:space="preserve">BOWRON-EARLY SUMMER TIMING</w:t>
+              <w:t xml:space="preserve">Quesnel-S population</w:t>
+            </w:r>
+          </w:p>
+        </w:tc>
+        <w:tc>
+          <w:tcPr>
+            <w:tcBorders>
+              <w:bottom w:val="none" w:sz="0" w:space="0" w:color="000000"/>
+              <w:top w:val="none" w:sz="0" w:space="0" w:color="000000"/>
+              <w:left w:val="none" w:sz="0" w:space="0" w:color="000000"/>
+              <w:right w:val="none" w:sz="0" w:space="0" w:color="000000"/>
+            </w:tcBorders>
+            <w:shd w:val="clear" w:color="auto" w:fill="FFFFFF"/>
+            <w:tcMar>
+              <w:top w:w="0" w:type="dxa"/>
+              <w:bottom w:w="0" w:type="dxa"/>
+              <w:left w:w="0" w:type="dxa"/>
+              <w:right w:w="0" w:type="dxa"/>
+            </w:tcMar>
+            <w:vAlign w:val="center"/>
+          </w:tcPr>
+          <w:p>
+            <w:pPr>
+              <w:jc w:val="left"/>
+              <w:pBdr>
+                <w:bottom w:val="none" w:sz="0" w:space="0" w:color="000000"/>
+                <w:top w:val="none" w:sz="0" w:space="0" w:color="000000"/>
+                <w:left w:val="none" w:sz="0" w:space="0" w:color="000000"/>
+                <w:right w:val="none" w:sz="0" w:space="0" w:color="000000"/>
+              </w:pBdr>
+              <w:spacing w:after="100" w:before="100" w:line="240"/>
+              <w:ind w:left="100" w:right="100" w:firstLine="0" w:firstLineChars="0"/>
+              <w:rPr>
+                <w:rFonts w:ascii="Arial" w:hAnsi="Arial" w:eastAsia="Arial" w:cs="Arial"/>
+                <w:i w:val="false"/>
+                <w:b w:val="false"/>
+                <w:u w:val="none"/>
+                <w:strike w:val="false"/>
+                <w:sz w:val="22"/>
+                <w:szCs w:val="22"/>
+                <w:color w:val="000000"/>
+              </w:rPr>
+            </w:pPr>
+            <w:r xmlns:w="http://schemas.openxmlformats.org/wordprocessingml/2006/main" xmlns:wp="http://schemas.openxmlformats.org/drawingml/2006/wordprocessingDrawing" xmlns:r="http://schemas.openxmlformats.org/officeDocument/2006/relationships" xmlns:w14="http://schemas.microsoft.com/office/word/2010/wordml">
+              <w:rPr>
+                <w:rFonts w:ascii="Arial" w:hAnsi="Arial" w:eastAsia="Arial" w:cs="Arial"/>
+                <w:i w:val="false"/>
+                <w:b w:val="false"/>
+                <w:u w:val="none"/>
+                <w:strike w:val="false"/>
+                <w:sz w:val="22"/>
+                <w:szCs w:val="22"/>
+                <w:color w:val="000000"/>
+              </w:rPr>
+              <w:t xml:space="preserve">Doutaz et al. 2023</w:t>
             </w:r>
           </w:p>
         </w:tc>
@@ -21454,7 +22743,61 @@
                 <w:szCs w:val="22"/>
                 <w:color w:val="000000"/>
               </w:rPr>
-              <w:t xml:space="preserve">CULTUS-LATE TIMING</w:t>
+              <w:t xml:space="preserve">Seton-L population</w:t>
+            </w:r>
+          </w:p>
+        </w:tc>
+        <w:tc>
+          <w:tcPr>
+            <w:tcBorders>
+              <w:bottom w:val="none" w:sz="0" w:space="0" w:color="000000"/>
+              <w:top w:val="none" w:sz="0" w:space="0" w:color="000000"/>
+              <w:left w:val="none" w:sz="0" w:space="0" w:color="000000"/>
+              <w:right w:val="none" w:sz="0" w:space="0" w:color="000000"/>
+            </w:tcBorders>
+            <w:shd w:val="clear" w:color="auto" w:fill="FFFFFF"/>
+            <w:tcMar>
+              <w:top w:w="0" w:type="dxa"/>
+              <w:bottom w:w="0" w:type="dxa"/>
+              <w:left w:w="0" w:type="dxa"/>
+              <w:right w:w="0" w:type="dxa"/>
+            </w:tcMar>
+            <w:vAlign w:val="center"/>
+          </w:tcPr>
+          <w:p>
+            <w:pPr>
+              <w:jc w:val="left"/>
+              <w:pBdr>
+                <w:bottom w:val="none" w:sz="0" w:space="0" w:color="000000"/>
+                <w:top w:val="none" w:sz="0" w:space="0" w:color="000000"/>
+                <w:left w:val="none" w:sz="0" w:space="0" w:color="000000"/>
+                <w:right w:val="none" w:sz="0" w:space="0" w:color="000000"/>
+              </w:pBdr>
+              <w:spacing w:after="100" w:before="100" w:line="240"/>
+              <w:ind w:left="100" w:right="100" w:firstLine="0" w:firstLineChars="0"/>
+              <w:rPr>
+                <w:rFonts w:ascii="Arial" w:hAnsi="Arial" w:eastAsia="Arial" w:cs="Arial"/>
+                <w:i w:val="false"/>
+                <w:b w:val="false"/>
+                <w:u w:val="none"/>
+                <w:strike w:val="false"/>
+                <w:sz w:val="22"/>
+                <w:szCs w:val="22"/>
+                <w:color w:val="000000"/>
+              </w:rPr>
+            </w:pPr>
+            <w:r xmlns:w="http://schemas.openxmlformats.org/wordprocessingml/2006/main" xmlns:wp="http://schemas.openxmlformats.org/drawingml/2006/wordprocessingDrawing" xmlns:r="http://schemas.openxmlformats.org/officeDocument/2006/relationships" xmlns:w14="http://schemas.microsoft.com/office/word/2010/wordml">
+              <w:rPr>
+                <w:rFonts w:ascii="Arial" w:hAnsi="Arial" w:eastAsia="Arial" w:cs="Arial"/>
+                <w:i w:val="false"/>
+                <w:b w:val="false"/>
+                <w:u w:val="none"/>
+                <w:strike w:val="false"/>
+                <w:sz w:val="22"/>
+                <w:szCs w:val="22"/>
+                <w:color w:val="000000"/>
+              </w:rPr>
+              <w:t xml:space="preserve">Doutaz et al. 2023</w:t>
             </w:r>
           </w:p>
         </w:tc>
@@ -21568,7 +22911,61 @@
                 <w:szCs w:val="22"/>
                 <w:color w:val="000000"/>
               </w:rPr>
-              <w:t xml:space="preserve">HARRISON-UPSTREAM MIGRATING-LATE TIMING</w:t>
+              <w:t xml:space="preserve">Takla-Trembleur-EStu population</w:t>
+            </w:r>
+          </w:p>
+        </w:tc>
+        <w:tc>
+          <w:tcPr>
+            <w:tcBorders>
+              <w:bottom w:val="none" w:sz="0" w:space="0" w:color="000000"/>
+              <w:top w:val="none" w:sz="0" w:space="0" w:color="000000"/>
+              <w:left w:val="none" w:sz="0" w:space="0" w:color="000000"/>
+              <w:right w:val="none" w:sz="0" w:space="0" w:color="000000"/>
+            </w:tcBorders>
+            <w:shd w:val="clear" w:color="auto" w:fill="FFFFFF"/>
+            <w:tcMar>
+              <w:top w:w="0" w:type="dxa"/>
+              <w:bottom w:w="0" w:type="dxa"/>
+              <w:left w:w="0" w:type="dxa"/>
+              <w:right w:w="0" w:type="dxa"/>
+            </w:tcMar>
+            <w:vAlign w:val="center"/>
+          </w:tcPr>
+          <w:p>
+            <w:pPr>
+              <w:jc w:val="left"/>
+              <w:pBdr>
+                <w:bottom w:val="none" w:sz="0" w:space="0" w:color="000000"/>
+                <w:top w:val="none" w:sz="0" w:space="0" w:color="000000"/>
+                <w:left w:val="none" w:sz="0" w:space="0" w:color="000000"/>
+                <w:right w:val="none" w:sz="0" w:space="0" w:color="000000"/>
+              </w:pBdr>
+              <w:spacing w:after="100" w:before="100" w:line="240"/>
+              <w:ind w:left="100" w:right="100" w:firstLine="0" w:firstLineChars="0"/>
+              <w:rPr>
+                <w:rFonts w:ascii="Arial" w:hAnsi="Arial" w:eastAsia="Arial" w:cs="Arial"/>
+                <w:i w:val="false"/>
+                <w:b w:val="false"/>
+                <w:u w:val="none"/>
+                <w:strike w:val="false"/>
+                <w:sz w:val="22"/>
+                <w:szCs w:val="22"/>
+                <w:color w:val="000000"/>
+              </w:rPr>
+            </w:pPr>
+            <w:r xmlns:w="http://schemas.openxmlformats.org/wordprocessingml/2006/main" xmlns:wp="http://schemas.openxmlformats.org/drawingml/2006/wordprocessingDrawing" xmlns:r="http://schemas.openxmlformats.org/officeDocument/2006/relationships" xmlns:w14="http://schemas.microsoft.com/office/word/2010/wordml">
+              <w:rPr>
+                <w:rFonts w:ascii="Arial" w:hAnsi="Arial" w:eastAsia="Arial" w:cs="Arial"/>
+                <w:i w:val="false"/>
+                <w:b w:val="false"/>
+                <w:u w:val="none"/>
+                <w:strike w:val="false"/>
+                <w:sz w:val="22"/>
+                <w:szCs w:val="22"/>
+                <w:color w:val="000000"/>
+              </w:rPr>
+              <w:t xml:space="preserve">Doutaz et al. 2023</w:t>
             </w:r>
           </w:p>
         </w:tc>
@@ -21682,7 +23079,61 @@
                 <w:szCs w:val="22"/>
                 <w:color w:val="000000"/>
               </w:rPr>
-              <w:t xml:space="preserve">NORTH BARRIERE-EARLY SUMMER TIMING</w:t>
+              <w:t xml:space="preserve">Takla-Trembleur-Stuart-S population</w:t>
+            </w:r>
+          </w:p>
+        </w:tc>
+        <w:tc>
+          <w:tcPr>
+            <w:tcBorders>
+              <w:bottom w:val="none" w:sz="0" w:space="0" w:color="000000"/>
+              <w:top w:val="none" w:sz="0" w:space="0" w:color="000000"/>
+              <w:left w:val="none" w:sz="0" w:space="0" w:color="000000"/>
+              <w:right w:val="none" w:sz="0" w:space="0" w:color="000000"/>
+            </w:tcBorders>
+            <w:shd w:val="clear" w:color="auto" w:fill="FFFFFF"/>
+            <w:tcMar>
+              <w:top w:w="0" w:type="dxa"/>
+              <w:bottom w:w="0" w:type="dxa"/>
+              <w:left w:w="0" w:type="dxa"/>
+              <w:right w:w="0" w:type="dxa"/>
+            </w:tcMar>
+            <w:vAlign w:val="center"/>
+          </w:tcPr>
+          <w:p>
+            <w:pPr>
+              <w:jc w:val="left"/>
+              <w:pBdr>
+                <w:bottom w:val="none" w:sz="0" w:space="0" w:color="000000"/>
+                <w:top w:val="none" w:sz="0" w:space="0" w:color="000000"/>
+                <w:left w:val="none" w:sz="0" w:space="0" w:color="000000"/>
+                <w:right w:val="none" w:sz="0" w:space="0" w:color="000000"/>
+              </w:pBdr>
+              <w:spacing w:after="100" w:before="100" w:line="240"/>
+              <w:ind w:left="100" w:right="100" w:firstLine="0" w:firstLineChars="0"/>
+              <w:rPr>
+                <w:rFonts w:ascii="Arial" w:hAnsi="Arial" w:eastAsia="Arial" w:cs="Arial"/>
+                <w:i w:val="false"/>
+                <w:b w:val="false"/>
+                <w:u w:val="none"/>
+                <w:strike w:val="false"/>
+                <w:sz w:val="22"/>
+                <w:szCs w:val="22"/>
+                <w:color w:val="000000"/>
+              </w:rPr>
+            </w:pPr>
+            <w:r xmlns:w="http://schemas.openxmlformats.org/wordprocessingml/2006/main" xmlns:wp="http://schemas.openxmlformats.org/drawingml/2006/wordprocessingDrawing" xmlns:r="http://schemas.openxmlformats.org/officeDocument/2006/relationships" xmlns:w14="http://schemas.microsoft.com/office/word/2010/wordml">
+              <w:rPr>
+                <w:rFonts w:ascii="Arial" w:hAnsi="Arial" w:eastAsia="Arial" w:cs="Arial"/>
+                <w:i w:val="false"/>
+                <w:b w:val="false"/>
+                <w:u w:val="none"/>
+                <w:strike w:val="false"/>
+                <w:sz w:val="22"/>
+                <w:szCs w:val="22"/>
+                <w:color w:val="000000"/>
+              </w:rPr>
+              <w:t xml:space="preserve">Doutaz et al. 2023</w:t>
             </w:r>
           </w:p>
         </w:tc>
@@ -21796,7 +23247,61 @@
                 <w:szCs w:val="22"/>
                 <w:color w:val="000000"/>
               </w:rPr>
-              <w:t xml:space="preserve">QUESNEL-SUMMER TIMING</w:t>
+              <w:t xml:space="preserve">Taseko-ES population</w:t>
+            </w:r>
+          </w:p>
+        </w:tc>
+        <w:tc>
+          <w:tcPr>
+            <w:tcBorders>
+              <w:bottom w:val="none" w:sz="0" w:space="0" w:color="000000"/>
+              <w:top w:val="none" w:sz="0" w:space="0" w:color="000000"/>
+              <w:left w:val="none" w:sz="0" w:space="0" w:color="000000"/>
+              <w:right w:val="none" w:sz="0" w:space="0" w:color="000000"/>
+            </w:tcBorders>
+            <w:shd w:val="clear" w:color="auto" w:fill="FFFFFF"/>
+            <w:tcMar>
+              <w:top w:w="0" w:type="dxa"/>
+              <w:bottom w:w="0" w:type="dxa"/>
+              <w:left w:w="0" w:type="dxa"/>
+              <w:right w:w="0" w:type="dxa"/>
+            </w:tcMar>
+            <w:vAlign w:val="center"/>
+          </w:tcPr>
+          <w:p>
+            <w:pPr>
+              <w:jc w:val="left"/>
+              <w:pBdr>
+                <w:bottom w:val="none" w:sz="0" w:space="0" w:color="000000"/>
+                <w:top w:val="none" w:sz="0" w:space="0" w:color="000000"/>
+                <w:left w:val="none" w:sz="0" w:space="0" w:color="000000"/>
+                <w:right w:val="none" w:sz="0" w:space="0" w:color="000000"/>
+              </w:pBdr>
+              <w:spacing w:after="100" w:before="100" w:line="240"/>
+              <w:ind w:left="100" w:right="100" w:firstLine="0" w:firstLineChars="0"/>
+              <w:rPr>
+                <w:rFonts w:ascii="Arial" w:hAnsi="Arial" w:eastAsia="Arial" w:cs="Arial"/>
+                <w:i w:val="false"/>
+                <w:b w:val="false"/>
+                <w:u w:val="none"/>
+                <w:strike w:val="false"/>
+                <w:sz w:val="22"/>
+                <w:szCs w:val="22"/>
+                <w:color w:val="000000"/>
+              </w:rPr>
+            </w:pPr>
+            <w:r xmlns:w="http://schemas.openxmlformats.org/wordprocessingml/2006/main" xmlns:wp="http://schemas.openxmlformats.org/drawingml/2006/wordprocessingDrawing" xmlns:r="http://schemas.openxmlformats.org/officeDocument/2006/relationships" xmlns:w14="http://schemas.microsoft.com/office/word/2010/wordml">
+              <w:rPr>
+                <w:rFonts w:ascii="Arial" w:hAnsi="Arial" w:eastAsia="Arial" w:cs="Arial"/>
+                <w:i w:val="false"/>
+                <w:b w:val="false"/>
+                <w:u w:val="none"/>
+                <w:strike w:val="false"/>
+                <w:sz w:val="22"/>
+                <w:szCs w:val="22"/>
+                <w:color w:val="000000"/>
+              </w:rPr>
+              <w:t xml:space="preserve">Doutaz et al. 2023</w:t>
             </w:r>
           </w:p>
         </w:tc>
@@ -21809,462 +23314,6 @@
         <w:tc>
           <w:tcPr>
             <w:tcBorders>
-              <w:bottom w:val="none" w:sz="0" w:space="0" w:color="000000"/>
-              <w:top w:val="none" w:sz="0" w:space="0" w:color="000000"/>
-              <w:left w:val="none" w:sz="0" w:space="0" w:color="000000"/>
-              <w:right w:val="none" w:sz="0" w:space="0" w:color="000000"/>
-            </w:tcBorders>
-            <w:shd w:val="clear" w:color="auto" w:fill="FFFFFF"/>
-            <w:tcMar>
-              <w:top w:w="0" w:type="dxa"/>
-              <w:bottom w:w="0" w:type="dxa"/>
-              <w:left w:w="0" w:type="dxa"/>
-              <w:right w:w="0" w:type="dxa"/>
-            </w:tcMar>
-            <w:vAlign w:val="center"/>
-          </w:tcPr>
-          <w:p>
-            <w:pPr>
-              <w:jc w:val="left"/>
-              <w:pBdr>
-                <w:bottom w:val="none" w:sz="0" w:space="0" w:color="000000"/>
-                <w:top w:val="none" w:sz="0" w:space="0" w:color="000000"/>
-                <w:left w:val="none" w:sz="0" w:space="0" w:color="000000"/>
-                <w:right w:val="none" w:sz="0" w:space="0" w:color="000000"/>
-              </w:pBdr>
-              <w:spacing w:after="100" w:before="100" w:line="240"/>
-              <w:ind w:left="100" w:right="100" w:firstLine="0" w:firstLineChars="0"/>
-              <w:rPr>
-                <w:rFonts w:ascii="Arial" w:hAnsi="Arial" w:eastAsia="Arial" w:cs="Arial"/>
-                <w:i w:val="false"/>
-                <w:b w:val="false"/>
-                <w:u w:val="none"/>
-                <w:strike w:val="false"/>
-                <w:sz w:val="22"/>
-                <w:szCs w:val="22"/>
-                <w:color w:val="000000"/>
-              </w:rPr>
-            </w:pPr>
-            <w:r xmlns:w="http://schemas.openxmlformats.org/wordprocessingml/2006/main" xmlns:wp="http://schemas.openxmlformats.org/drawingml/2006/wordprocessingDrawing" xmlns:r="http://schemas.openxmlformats.org/officeDocument/2006/relationships" xmlns:w14="http://schemas.microsoft.com/office/word/2010/wordml">
-              <w:rPr>
-                <w:rFonts w:ascii="Arial" w:hAnsi="Arial" w:eastAsia="Arial" w:cs="Arial"/>
-                <w:i w:val="false"/>
-                <w:b w:val="false"/>
-                <w:u w:val="none"/>
-                <w:strike w:val="false"/>
-                <w:sz w:val="22"/>
-                <w:szCs w:val="22"/>
-                <w:color w:val="000000"/>
-              </w:rPr>
-              <w:t xml:space="preserve">Sockeye</w:t>
-            </w:r>
-          </w:p>
-        </w:tc>
-        <w:tc>
-          <w:tcPr>
-            <w:tcBorders>
-              <w:bottom w:val="none" w:sz="0" w:space="0" w:color="000000"/>
-              <w:top w:val="none" w:sz="0" w:space="0" w:color="000000"/>
-              <w:left w:val="none" w:sz="0" w:space="0" w:color="000000"/>
-              <w:right w:val="none" w:sz="0" w:space="0" w:color="000000"/>
-            </w:tcBorders>
-            <w:shd w:val="clear" w:color="auto" w:fill="FFFFFF"/>
-            <w:tcMar>
-              <w:top w:w="0" w:type="dxa"/>
-              <w:bottom w:w="0" w:type="dxa"/>
-              <w:left w:w="0" w:type="dxa"/>
-              <w:right w:w="0" w:type="dxa"/>
-            </w:tcMar>
-            <w:vAlign w:val="center"/>
-          </w:tcPr>
-          <w:p>
-            <w:pPr>
-              <w:jc w:val="left"/>
-              <w:pBdr>
-                <w:bottom w:val="none" w:sz="0" w:space="0" w:color="000000"/>
-                <w:top w:val="none" w:sz="0" w:space="0" w:color="000000"/>
-                <w:left w:val="none" w:sz="0" w:space="0" w:color="000000"/>
-                <w:right w:val="none" w:sz="0" w:space="0" w:color="000000"/>
-              </w:pBdr>
-              <w:spacing w:after="100" w:before="100" w:line="240"/>
-              <w:ind w:left="100" w:right="100" w:firstLine="0" w:firstLineChars="0"/>
-              <w:rPr>
-                <w:rFonts w:ascii="Arial" w:hAnsi="Arial" w:eastAsia="Arial" w:cs="Arial"/>
-                <w:i w:val="false"/>
-                <w:b w:val="false"/>
-                <w:u w:val="none"/>
-                <w:strike w:val="false"/>
-                <w:sz w:val="22"/>
-                <w:szCs w:val="22"/>
-                <w:color w:val="000000"/>
-              </w:rPr>
-            </w:pPr>
-            <w:r xmlns:w="http://schemas.openxmlformats.org/wordprocessingml/2006/main" xmlns:wp="http://schemas.openxmlformats.org/drawingml/2006/wordprocessingDrawing" xmlns:r="http://schemas.openxmlformats.org/officeDocument/2006/relationships" xmlns:w14="http://schemas.microsoft.com/office/word/2010/wordml">
-              <w:rPr>
-                <w:rFonts w:ascii="Arial" w:hAnsi="Arial" w:eastAsia="Arial" w:cs="Arial"/>
-                <w:i w:val="false"/>
-                <w:b w:val="false"/>
-                <w:u w:val="none"/>
-                <w:strike w:val="false"/>
-                <w:sz w:val="22"/>
-                <w:szCs w:val="22"/>
-                <w:color w:val="000000"/>
-              </w:rPr>
-              <w:t xml:space="preserve">SETON-LATE TIMING</w:t>
-            </w:r>
-          </w:p>
-        </w:tc>
-      </w:tr>
-      <w:tr>
-        <w:trPr>
-          <w:trHeight w:val="360" w:hRule="auto"/>
-        </w:trPr>
-        body28
-        <w:tc>
-          <w:tcPr>
-            <w:tcBorders>
-              <w:bottom w:val="none" w:sz="0" w:space="0" w:color="000000"/>
-              <w:top w:val="none" w:sz="0" w:space="0" w:color="000000"/>
-              <w:left w:val="none" w:sz="0" w:space="0" w:color="000000"/>
-              <w:right w:val="none" w:sz="0" w:space="0" w:color="000000"/>
-            </w:tcBorders>
-            <w:shd w:val="clear" w:color="auto" w:fill="FFFFFF"/>
-            <w:tcMar>
-              <w:top w:w="0" w:type="dxa"/>
-              <w:bottom w:w="0" w:type="dxa"/>
-              <w:left w:w="0" w:type="dxa"/>
-              <w:right w:w="0" w:type="dxa"/>
-            </w:tcMar>
-            <w:vAlign w:val="center"/>
-          </w:tcPr>
-          <w:p>
-            <w:pPr>
-              <w:jc w:val="left"/>
-              <w:pBdr>
-                <w:bottom w:val="none" w:sz="0" w:space="0" w:color="000000"/>
-                <w:top w:val="none" w:sz="0" w:space="0" w:color="000000"/>
-                <w:left w:val="none" w:sz="0" w:space="0" w:color="000000"/>
-                <w:right w:val="none" w:sz="0" w:space="0" w:color="000000"/>
-              </w:pBdr>
-              <w:spacing w:after="100" w:before="100" w:line="240"/>
-              <w:ind w:left="100" w:right="100" w:firstLine="0" w:firstLineChars="0"/>
-              <w:rPr>
-                <w:rFonts w:ascii="Arial" w:hAnsi="Arial" w:eastAsia="Arial" w:cs="Arial"/>
-                <w:i w:val="false"/>
-                <w:b w:val="false"/>
-                <w:u w:val="none"/>
-                <w:strike w:val="false"/>
-                <w:sz w:val="22"/>
-                <w:szCs w:val="22"/>
-                <w:color w:val="000000"/>
-              </w:rPr>
-            </w:pPr>
-            <w:r xmlns:w="http://schemas.openxmlformats.org/wordprocessingml/2006/main" xmlns:wp="http://schemas.openxmlformats.org/drawingml/2006/wordprocessingDrawing" xmlns:r="http://schemas.openxmlformats.org/officeDocument/2006/relationships" xmlns:w14="http://schemas.microsoft.com/office/word/2010/wordml">
-              <w:rPr>
-                <w:rFonts w:ascii="Arial" w:hAnsi="Arial" w:eastAsia="Arial" w:cs="Arial"/>
-                <w:i w:val="false"/>
-                <w:b w:val="false"/>
-                <w:u w:val="none"/>
-                <w:strike w:val="false"/>
-                <w:sz w:val="22"/>
-                <w:szCs w:val="22"/>
-                <w:color w:val="000000"/>
-              </w:rPr>
-              <w:t xml:space="preserve">Sockeye</w:t>
-            </w:r>
-          </w:p>
-        </w:tc>
-        <w:tc>
-          <w:tcPr>
-            <w:tcBorders>
-              <w:bottom w:val="none" w:sz="0" w:space="0" w:color="000000"/>
-              <w:top w:val="none" w:sz="0" w:space="0" w:color="000000"/>
-              <w:left w:val="none" w:sz="0" w:space="0" w:color="000000"/>
-              <w:right w:val="none" w:sz="0" w:space="0" w:color="000000"/>
-            </w:tcBorders>
-            <w:shd w:val="clear" w:color="auto" w:fill="FFFFFF"/>
-            <w:tcMar>
-              <w:top w:w="0" w:type="dxa"/>
-              <w:bottom w:w="0" w:type="dxa"/>
-              <w:left w:w="0" w:type="dxa"/>
-              <w:right w:w="0" w:type="dxa"/>
-            </w:tcMar>
-            <w:vAlign w:val="center"/>
-          </w:tcPr>
-          <w:p>
-            <w:pPr>
-              <w:jc w:val="left"/>
-              <w:pBdr>
-                <w:bottom w:val="none" w:sz="0" w:space="0" w:color="000000"/>
-                <w:top w:val="none" w:sz="0" w:space="0" w:color="000000"/>
-                <w:left w:val="none" w:sz="0" w:space="0" w:color="000000"/>
-                <w:right w:val="none" w:sz="0" w:space="0" w:color="000000"/>
-              </w:pBdr>
-              <w:spacing w:after="100" w:before="100" w:line="240"/>
-              <w:ind w:left="100" w:right="100" w:firstLine="0" w:firstLineChars="0"/>
-              <w:rPr>
-                <w:rFonts w:ascii="Arial" w:hAnsi="Arial" w:eastAsia="Arial" w:cs="Arial"/>
-                <w:i w:val="false"/>
-                <w:b w:val="false"/>
-                <w:u w:val="none"/>
-                <w:strike w:val="false"/>
-                <w:sz w:val="22"/>
-                <w:szCs w:val="22"/>
-                <w:color w:val="000000"/>
-              </w:rPr>
-            </w:pPr>
-            <w:r xmlns:w="http://schemas.openxmlformats.org/wordprocessingml/2006/main" xmlns:wp="http://schemas.openxmlformats.org/drawingml/2006/wordprocessingDrawing" xmlns:r="http://schemas.openxmlformats.org/officeDocument/2006/relationships" xmlns:w14="http://schemas.microsoft.com/office/word/2010/wordml">
-              <w:rPr>
-                <w:rFonts w:ascii="Arial" w:hAnsi="Arial" w:eastAsia="Arial" w:cs="Arial"/>
-                <w:i w:val="false"/>
-                <w:b w:val="false"/>
-                <w:u w:val="none"/>
-                <w:strike w:val="false"/>
-                <w:sz w:val="22"/>
-                <w:szCs w:val="22"/>
-                <w:color w:val="000000"/>
-              </w:rPr>
-              <w:t xml:space="preserve">TAKLA/TREMBLEUR-EARLY STUART TIMING</w:t>
-            </w:r>
-          </w:p>
-        </w:tc>
-      </w:tr>
-      <w:tr>
-        <w:trPr>
-          <w:trHeight w:val="360" w:hRule="auto"/>
-        </w:trPr>
-        body29
-        <w:tc>
-          <w:tcPr>
-            <w:tcBorders>
-              <w:bottom w:val="none" w:sz="0" w:space="0" w:color="000000"/>
-              <w:top w:val="none" w:sz="0" w:space="0" w:color="000000"/>
-              <w:left w:val="none" w:sz="0" w:space="0" w:color="000000"/>
-              <w:right w:val="none" w:sz="0" w:space="0" w:color="000000"/>
-            </w:tcBorders>
-            <w:shd w:val="clear" w:color="auto" w:fill="FFFFFF"/>
-            <w:tcMar>
-              <w:top w:w="0" w:type="dxa"/>
-              <w:bottom w:w="0" w:type="dxa"/>
-              <w:left w:w="0" w:type="dxa"/>
-              <w:right w:w="0" w:type="dxa"/>
-            </w:tcMar>
-            <w:vAlign w:val="center"/>
-          </w:tcPr>
-          <w:p>
-            <w:pPr>
-              <w:jc w:val="left"/>
-              <w:pBdr>
-                <w:bottom w:val="none" w:sz="0" w:space="0" w:color="000000"/>
-                <w:top w:val="none" w:sz="0" w:space="0" w:color="000000"/>
-                <w:left w:val="none" w:sz="0" w:space="0" w:color="000000"/>
-                <w:right w:val="none" w:sz="0" w:space="0" w:color="000000"/>
-              </w:pBdr>
-              <w:spacing w:after="100" w:before="100" w:line="240"/>
-              <w:ind w:left="100" w:right="100" w:firstLine="0" w:firstLineChars="0"/>
-              <w:rPr>
-                <w:rFonts w:ascii="Arial" w:hAnsi="Arial" w:eastAsia="Arial" w:cs="Arial"/>
-                <w:i w:val="false"/>
-                <w:b w:val="false"/>
-                <w:u w:val="none"/>
-                <w:strike w:val="false"/>
-                <w:sz w:val="22"/>
-                <w:szCs w:val="22"/>
-                <w:color w:val="000000"/>
-              </w:rPr>
-            </w:pPr>
-            <w:r xmlns:w="http://schemas.openxmlformats.org/wordprocessingml/2006/main" xmlns:wp="http://schemas.openxmlformats.org/drawingml/2006/wordprocessingDrawing" xmlns:r="http://schemas.openxmlformats.org/officeDocument/2006/relationships" xmlns:w14="http://schemas.microsoft.com/office/word/2010/wordml">
-              <w:rPr>
-                <w:rFonts w:ascii="Arial" w:hAnsi="Arial" w:eastAsia="Arial" w:cs="Arial"/>
-                <w:i w:val="false"/>
-                <w:b w:val="false"/>
-                <w:u w:val="none"/>
-                <w:strike w:val="false"/>
-                <w:sz w:val="22"/>
-                <w:szCs w:val="22"/>
-                <w:color w:val="000000"/>
-              </w:rPr>
-              <w:t xml:space="preserve">Sockeye</w:t>
-            </w:r>
-          </w:p>
-        </w:tc>
-        <w:tc>
-          <w:tcPr>
-            <w:tcBorders>
-              <w:bottom w:val="none" w:sz="0" w:space="0" w:color="000000"/>
-              <w:top w:val="none" w:sz="0" w:space="0" w:color="000000"/>
-              <w:left w:val="none" w:sz="0" w:space="0" w:color="000000"/>
-              <w:right w:val="none" w:sz="0" w:space="0" w:color="000000"/>
-            </w:tcBorders>
-            <w:shd w:val="clear" w:color="auto" w:fill="FFFFFF"/>
-            <w:tcMar>
-              <w:top w:w="0" w:type="dxa"/>
-              <w:bottom w:w="0" w:type="dxa"/>
-              <w:left w:w="0" w:type="dxa"/>
-              <w:right w:w="0" w:type="dxa"/>
-            </w:tcMar>
-            <w:vAlign w:val="center"/>
-          </w:tcPr>
-          <w:p>
-            <w:pPr>
-              <w:jc w:val="left"/>
-              <w:pBdr>
-                <w:bottom w:val="none" w:sz="0" w:space="0" w:color="000000"/>
-                <w:top w:val="none" w:sz="0" w:space="0" w:color="000000"/>
-                <w:left w:val="none" w:sz="0" w:space="0" w:color="000000"/>
-                <w:right w:val="none" w:sz="0" w:space="0" w:color="000000"/>
-              </w:pBdr>
-              <w:spacing w:after="100" w:before="100" w:line="240"/>
-              <w:ind w:left="100" w:right="100" w:firstLine="0" w:firstLineChars="0"/>
-              <w:rPr>
-                <w:rFonts w:ascii="Arial" w:hAnsi="Arial" w:eastAsia="Arial" w:cs="Arial"/>
-                <w:i w:val="false"/>
-                <w:b w:val="false"/>
-                <w:u w:val="none"/>
-                <w:strike w:val="false"/>
-                <w:sz w:val="22"/>
-                <w:szCs w:val="22"/>
-                <w:color w:val="000000"/>
-              </w:rPr>
-            </w:pPr>
-            <w:r xmlns:w="http://schemas.openxmlformats.org/wordprocessingml/2006/main" xmlns:wp="http://schemas.openxmlformats.org/drawingml/2006/wordprocessingDrawing" xmlns:r="http://schemas.openxmlformats.org/officeDocument/2006/relationships" xmlns:w14="http://schemas.microsoft.com/office/word/2010/wordml">
-              <w:rPr>
-                <w:rFonts w:ascii="Arial" w:hAnsi="Arial" w:eastAsia="Arial" w:cs="Arial"/>
-                <w:i w:val="false"/>
-                <w:b w:val="false"/>
-                <w:u w:val="none"/>
-                <w:strike w:val="false"/>
-                <w:sz w:val="22"/>
-                <w:szCs w:val="22"/>
-                <w:color w:val="000000"/>
-              </w:rPr>
-              <w:t xml:space="preserve">TAKLA/TREMBLEUR/STUART-SUMMER TIMING</w:t>
-            </w:r>
-          </w:p>
-        </w:tc>
-      </w:tr>
-      <w:tr>
-        <w:trPr>
-          <w:trHeight w:val="360" w:hRule="auto"/>
-        </w:trPr>
-        body30
-        <w:tc>
-          <w:tcPr>
-            <w:tcBorders>
-              <w:bottom w:val="none" w:sz="0" w:space="0" w:color="000000"/>
-              <w:top w:val="none" w:sz="0" w:space="0" w:color="000000"/>
-              <w:left w:val="none" w:sz="0" w:space="0" w:color="000000"/>
-              <w:right w:val="none" w:sz="0" w:space="0" w:color="000000"/>
-            </w:tcBorders>
-            <w:shd w:val="clear" w:color="auto" w:fill="FFFFFF"/>
-            <w:tcMar>
-              <w:top w:w="0" w:type="dxa"/>
-              <w:bottom w:w="0" w:type="dxa"/>
-              <w:left w:w="0" w:type="dxa"/>
-              <w:right w:w="0" w:type="dxa"/>
-            </w:tcMar>
-            <w:vAlign w:val="center"/>
-          </w:tcPr>
-          <w:p>
-            <w:pPr>
-              <w:jc w:val="left"/>
-              <w:pBdr>
-                <w:bottom w:val="none" w:sz="0" w:space="0" w:color="000000"/>
-                <w:top w:val="none" w:sz="0" w:space="0" w:color="000000"/>
-                <w:left w:val="none" w:sz="0" w:space="0" w:color="000000"/>
-                <w:right w:val="none" w:sz="0" w:space="0" w:color="000000"/>
-              </w:pBdr>
-              <w:spacing w:after="100" w:before="100" w:line="240"/>
-              <w:ind w:left="100" w:right="100" w:firstLine="0" w:firstLineChars="0"/>
-              <w:rPr>
-                <w:rFonts w:ascii="Arial" w:hAnsi="Arial" w:eastAsia="Arial" w:cs="Arial"/>
-                <w:i w:val="false"/>
-                <w:b w:val="false"/>
-                <w:u w:val="none"/>
-                <w:strike w:val="false"/>
-                <w:sz w:val="22"/>
-                <w:szCs w:val="22"/>
-                <w:color w:val="000000"/>
-              </w:rPr>
-            </w:pPr>
-            <w:r xmlns:w="http://schemas.openxmlformats.org/wordprocessingml/2006/main" xmlns:wp="http://schemas.openxmlformats.org/drawingml/2006/wordprocessingDrawing" xmlns:r="http://schemas.openxmlformats.org/officeDocument/2006/relationships" xmlns:w14="http://schemas.microsoft.com/office/word/2010/wordml">
-              <w:rPr>
-                <w:rFonts w:ascii="Arial" w:hAnsi="Arial" w:eastAsia="Arial" w:cs="Arial"/>
-                <w:i w:val="false"/>
-                <w:b w:val="false"/>
-                <w:u w:val="none"/>
-                <w:strike w:val="false"/>
-                <w:sz w:val="22"/>
-                <w:szCs w:val="22"/>
-                <w:color w:val="000000"/>
-              </w:rPr>
-              <w:t xml:space="preserve">Sockeye</w:t>
-            </w:r>
-          </w:p>
-        </w:tc>
-        <w:tc>
-          <w:tcPr>
-            <w:tcBorders>
-              <w:bottom w:val="none" w:sz="0" w:space="0" w:color="000000"/>
-              <w:top w:val="none" w:sz="0" w:space="0" w:color="000000"/>
-              <w:left w:val="none" w:sz="0" w:space="0" w:color="000000"/>
-              <w:right w:val="none" w:sz="0" w:space="0" w:color="000000"/>
-            </w:tcBorders>
-            <w:shd w:val="clear" w:color="auto" w:fill="FFFFFF"/>
-            <w:tcMar>
-              <w:top w:w="0" w:type="dxa"/>
-              <w:bottom w:w="0" w:type="dxa"/>
-              <w:left w:w="0" w:type="dxa"/>
-              <w:right w:w="0" w:type="dxa"/>
-            </w:tcMar>
-            <w:vAlign w:val="center"/>
-          </w:tcPr>
-          <w:p>
-            <w:pPr>
-              <w:jc w:val="left"/>
-              <w:pBdr>
-                <w:bottom w:val="none" w:sz="0" w:space="0" w:color="000000"/>
-                <w:top w:val="none" w:sz="0" w:space="0" w:color="000000"/>
-                <w:left w:val="none" w:sz="0" w:space="0" w:color="000000"/>
-                <w:right w:val="none" w:sz="0" w:space="0" w:color="000000"/>
-              </w:pBdr>
-              <w:spacing w:after="100" w:before="100" w:line="240"/>
-              <w:ind w:left="100" w:right="100" w:firstLine="0" w:firstLineChars="0"/>
-              <w:rPr>
-                <w:rFonts w:ascii="Arial" w:hAnsi="Arial" w:eastAsia="Arial" w:cs="Arial"/>
-                <w:i w:val="false"/>
-                <w:b w:val="false"/>
-                <w:u w:val="none"/>
-                <w:strike w:val="false"/>
-                <w:sz w:val="22"/>
-                <w:szCs w:val="22"/>
-                <w:color w:val="000000"/>
-              </w:rPr>
-            </w:pPr>
-            <w:r xmlns:w="http://schemas.openxmlformats.org/wordprocessingml/2006/main" xmlns:wp="http://schemas.openxmlformats.org/drawingml/2006/wordprocessingDrawing" xmlns:r="http://schemas.openxmlformats.org/officeDocument/2006/relationships" xmlns:w14="http://schemas.microsoft.com/office/word/2010/wordml">
-              <w:rPr>
-                <w:rFonts w:ascii="Arial" w:hAnsi="Arial" w:eastAsia="Arial" w:cs="Arial"/>
-                <w:i w:val="false"/>
-                <w:b w:val="false"/>
-                <w:u w:val="none"/>
-                <w:strike w:val="false"/>
-                <w:sz w:val="22"/>
-                <w:szCs w:val="22"/>
-                <w:color w:val="000000"/>
-              </w:rPr>
-              <w:t xml:space="preserve">TASEKO-EARLY SUMMER TIMING</w:t>
-            </w:r>
-          </w:p>
-        </w:tc>
-      </w:tr>
-      <w:tr>
-        <w:trPr>
-          <w:trHeight w:val="360" w:hRule="auto"/>
-        </w:trPr>
-        body31
-        <w:tc>
-          <w:tcPr>
-            <w:tcBorders>
               <w:bottom w:val="single" w:sz="12" w:space="0" w:color="666666"/>
               <w:top w:val="none" w:sz="0" w:space="0" w:color="000000"/>
               <w:left w:val="none" w:sz="0" w:space="0" w:color="000000"/>
@@ -22366,7 +23415,61 @@
                 <w:szCs w:val="22"/>
                 <w:color w:val="000000"/>
               </w:rPr>
-              <w:t xml:space="preserve">WIDGEON</w:t>
+              <w:t xml:space="preserve">Widgeon (River-Type) population</w:t>
+            </w:r>
+          </w:p>
+        </w:tc>
+        <w:tc>
+          <w:tcPr>
+            <w:tcBorders>
+              <w:bottom w:val="single" w:sz="12" w:space="0" w:color="666666"/>
+              <w:top w:val="none" w:sz="0" w:space="0" w:color="000000"/>
+              <w:left w:val="none" w:sz="0" w:space="0" w:color="000000"/>
+              <w:right w:val="none" w:sz="0" w:space="0" w:color="000000"/>
+            </w:tcBorders>
+            <w:shd w:val="clear" w:color="auto" w:fill="FFFFFF"/>
+            <w:tcMar>
+              <w:top w:w="0" w:type="dxa"/>
+              <w:bottom w:w="0" w:type="dxa"/>
+              <w:left w:w="0" w:type="dxa"/>
+              <w:right w:w="0" w:type="dxa"/>
+            </w:tcMar>
+            <w:vAlign w:val="center"/>
+          </w:tcPr>
+          <w:p>
+            <w:pPr>
+              <w:jc w:val="left"/>
+              <w:pBdr>
+                <w:bottom w:val="none" w:sz="0" w:space="0" w:color="000000"/>
+                <w:top w:val="none" w:sz="0" w:space="0" w:color="000000"/>
+                <w:left w:val="none" w:sz="0" w:space="0" w:color="000000"/>
+                <w:right w:val="none" w:sz="0" w:space="0" w:color="000000"/>
+              </w:pBdr>
+              <w:spacing w:after="100" w:before="100" w:line="240"/>
+              <w:ind w:left="100" w:right="100" w:firstLine="0" w:firstLineChars="0"/>
+              <w:rPr>
+                <w:rFonts w:ascii="Arial" w:hAnsi="Arial" w:eastAsia="Arial" w:cs="Arial"/>
+                <w:i w:val="false"/>
+                <w:b w:val="false"/>
+                <w:u w:val="none"/>
+                <w:strike w:val="false"/>
+                <w:sz w:val="22"/>
+                <w:szCs w:val="22"/>
+                <w:color w:val="000000"/>
+              </w:rPr>
+            </w:pPr>
+            <w:r xmlns:w="http://schemas.openxmlformats.org/wordprocessingml/2006/main" xmlns:wp="http://schemas.openxmlformats.org/drawingml/2006/wordprocessingDrawing" xmlns:r="http://schemas.openxmlformats.org/officeDocument/2006/relationships" xmlns:w14="http://schemas.microsoft.com/office/word/2010/wordml">
+              <w:rPr>
+                <w:rFonts w:ascii="Arial" w:hAnsi="Arial" w:eastAsia="Arial" w:cs="Arial"/>
+                <w:i w:val="false"/>
+                <w:b w:val="false"/>
+                <w:u w:val="none"/>
+                <w:strike w:val="false"/>
+                <w:sz w:val="22"/>
+                <w:szCs w:val="22"/>
+                <w:color w:val="000000"/>
+              </w:rPr>
+              <w:t xml:space="preserve">Doutaz et al. 2023</w:t>
             </w:r>
           </w:p>
         </w:tc>

</xml_diff>

<commit_message>
Revised first case study
</commit_message>
<xml_diff>
--- a/reports/LAPSE_primary_publication.docx
+++ b/reports/LAPSE_primary_publication.docx
@@ -26864,7 +26864,7 @@
         <w:t xml:space="preserve">(Doutaz et al. 2023)</w:t>
       </w:r>
       <w:r>
-        <w:t xml:space="preserve">. The blockage created a massive impediment to returning adult salmon, and occurred in a narrow and remote reach of the Fraser River where few options for mitigation were available. Landslides, in general, can occur naturally, but the severity and frequency can also be exacerbated by human activities</w:t>
+        <w:t xml:space="preserve">. The blockage created a massive impediment to returning adult salmon, and occurred in a narrow and remote reach of the Fraser River where few options for mitigation were available. Landslides, in general, can occur naturally, but the severity and frequency can also be exacerbated by human activities such as landscape-scale changes and climate change</w:t>
       </w:r>
       <w:r>
         <w:t xml:space="preserve"> </w:t>
@@ -26873,10 +26873,7 @@
         <w:t xml:space="preserve">(Doutaz et al. 2023)</w:t>
       </w:r>
       <w:r>
-        <w:t xml:space="preserve"> </w:t>
-      </w:r>
-      <w:r>
-        <w:t xml:space="preserve">such as landscape-scale changes and climate change. This indirect connection to human activities means that</w:t>
+        <w:t xml:space="preserve">. This indirect connection to human activities means that</w:t>
       </w:r>
       <w:r>
         <w:t xml:space="preserve"> </w:t>
@@ -26894,7 +26891,25 @@
         <w:t xml:space="preserve"> </w:t>
       </w:r>
       <w:r>
-        <w:t xml:space="preserve">is not a large category to be matched with regulation (Figure</w:t>
+        <w:t xml:space="preserve">is not a large category to be matched with regulation. The LAPSE process and tool matched eight pieces of federal and provincial legislation specific to</w:t>
+      </w:r>
+      <w:r>
+        <w:t xml:space="preserve"> </w:t>
+      </w:r>
+      <w:r>
+        <w:t xml:space="preserve">“</w:t>
+      </w:r>
+      <w:r>
+        <w:t xml:space="preserve">10.1 Geological Events</w:t>
+      </w:r>
+      <w:r>
+        <w:t xml:space="preserve">”</w:t>
+      </w:r>
+      <w:r>
+        <w:t xml:space="preserve"> </w:t>
+      </w:r>
+      <w:r>
+        <w:t xml:space="preserve">(Figure</w:t>
       </w:r>
       <w:r>
         <w:t xml:space="preserve"> </w:t>
@@ -26903,7 +26918,7 @@
         <w:t xml:space="preserve">6</w:t>
       </w:r>
       <w:r>
-        <w:t xml:space="preserve">).</w:t>
+        <w:t xml:space="preserve">), largely related to forestry.</w:t>
       </w:r>
     </w:p>
     <w:p>
@@ -26983,7 +26998,7 @@
         <w:pStyle w:val="BodyText"/>
       </w:pPr>
       <w:r>
-        <w:t xml:space="preserve">The</w:t>
+        <w:t xml:space="preserve">Users of the LAPSE process and tool who might be researching geological events such as landslides can get a list of possibly relevant legislation and will see that this legislation is tied to forestry in British Columbia. As well, the user can see that the nature of the clauses are mostly</w:t>
       </w:r>
       <w:r>
         <w:t xml:space="preserve"> </w:t>
@@ -26992,6 +27007,24 @@
         <w:t xml:space="preserve">“</w:t>
       </w:r>
       <w:r>
+        <w:t xml:space="preserve">Instruction</w:t>
+      </w:r>
+      <w:r>
+        <w:t xml:space="preserve">”</w:t>
+      </w:r>
+      <w:r>
+        <w:t xml:space="preserve"> </w:t>
+      </w:r>
+      <w:r>
+        <w:t xml:space="preserve">and</w:t>
+      </w:r>
+      <w:r>
+        <w:t xml:space="preserve"> </w:t>
+      </w:r>
+      <w:r>
+        <w:t xml:space="preserve">“</w:t>
+      </w:r>
+      <w:r>
         <w:t xml:space="preserve">Designation</w:t>
       </w:r>
       <w:r>
@@ -27001,7 +27034,48 @@
         <w:t xml:space="preserve"> </w:t>
       </w:r>
       <w:r>
-        <w:t xml:space="preserve">clause type category matched the largest proportion of clauses that also match</w:t>
+        <w:t xml:space="preserve">(Figure</w:t>
+      </w:r>
+      <w:r>
+        <w:t xml:space="preserve"> </w:t>
+      </w:r>
+      <w:r>
+        <w:t xml:space="preserve">10</w:t>
+      </w:r>
+      <w:r>
+        <w:t xml:space="preserve">). The provincial</w:t>
+      </w:r>
+      <w:r>
+        <w:t xml:space="preserve"> </w:t>
+      </w:r>
+      <w:r>
+        <w:rPr>
+          <w:i/>
+          <w:iCs/>
+        </w:rPr>
+        <w:t xml:space="preserve">Forest Planning and Practices Regulation</w:t>
+      </w:r>
+      <w:r>
+        <w:t xml:space="preserve"> </w:t>
+      </w:r>
+      <w:r>
+        <w:t xml:space="preserve">under the</w:t>
+      </w:r>
+      <w:r>
+        <w:t xml:space="preserve"> </w:t>
+      </w:r>
+      <w:r>
+        <w:rPr>
+          <w:i/>
+          <w:iCs/>
+        </w:rPr>
+        <w:t xml:space="preserve">Forest and Range Practices Act</w:t>
+      </w:r>
+      <w:r>
+        <w:t xml:space="preserve"> </w:t>
+      </w:r>
+      <w:r>
+        <w:t xml:space="preserve">appears as one of the most relevant statutes specific to landslides. Examples of matched sections include Section 3, Damage to the environment, which states</w:t>
       </w:r>
       <w:r>
         <w:t xml:space="preserve"> </w:t>
@@ -27010,16 +27084,29 @@
         <w:t xml:space="preserve">“</w:t>
       </w:r>
       <w:r>
-        <w:t xml:space="preserve">10.1 Geological Events.</w:t>
+        <w:t xml:space="preserve">(1)For the purpose of section 46 (1) and (1.1)</w:t>
+      </w:r>
+      <w:r>
+        <w:t xml:space="preserve"> </w:t>
+      </w:r>
+      <w:r>
+        <w:rPr>
+          <w:i/>
+          <w:iCs/>
+        </w:rPr>
+        <w:t xml:space="preserve">[protection of the environment]</w:t>
+      </w:r>
+      <w:r>
+        <w:t xml:space="preserve"> </w:t>
+      </w:r>
+      <w:r>
+        <w:t xml:space="preserve">of the Act,</w:t>
       </w:r>
       <w:r>
         <w:t xml:space="preserve">”</w:t>
       </w:r>
       <w:r>
-        <w:t xml:space="preserve"> </w:t>
-      </w:r>
-      <w:r>
-        <w:t xml:space="preserve">This is largely due to the designation of avalanche and landslide areas.</w:t>
+        <w:t xml:space="preserve">damage” means any of the following that adversely alters an ecosystem: (a)a landslide…” Section 37, Landslides, states,</w:t>
       </w:r>
       <w:r>
         <w:t xml:space="preserve"> </w:t>
@@ -27028,34 +27115,10 @@
         <w:t xml:space="preserve">“</w:t>
       </w:r>
       <w:r>
-        <w:t xml:space="preserve">Instruction</w:t>
+        <w:t xml:space="preserve">An authorized person who carries out a primary forest activity must ensure that the primary forest activity does not cause a landslide that has a material adverse effect in relation to one or more of the subjects listed in section 149 (1) of the Act.</w:t>
       </w:r>
       <w:r>
         <w:t xml:space="preserve">”</w:t>
-      </w:r>
-      <w:r>
-        <w:t xml:space="preserve"> </w:t>
-      </w:r>
-      <w:r>
-        <w:t xml:space="preserve">also had a large proportion of clause type matches due to the nature of forestry legislation and the prevalence of forestry actions to result in landslides.</w:t>
-      </w:r>
-      <w:r>
-        <w:t xml:space="preserve"> </w:t>
-      </w:r>
-      <w:r>
-        <w:t xml:space="preserve">“</w:t>
-      </w:r>
-      <w:r>
-        <w:t xml:space="preserve">Prohibition, Restriction, or Limitation</w:t>
-      </w:r>
-      <w:r>
-        <w:t xml:space="preserve">”</w:t>
-      </w:r>
-      <w:r>
-        <w:t xml:space="preserve"> </w:t>
-      </w:r>
-      <w:r>
-        <w:t xml:space="preserve">clause types matched the fewest clauses.</w:t>
       </w:r>
     </w:p>
     <w:p>
@@ -27115,19 +27178,91 @@
         <w:t xml:space="preserve">Figure 10: Section counts by clause type and legislation for IUCN-CMP threat category 10.1 Geological Events. Dot size represents section count.</w:t>
       </w:r>
     </w:p>
+    <w:bookmarkEnd w:id="81"/>
+    <w:bookmarkStart w:id="92" w:name="X15485f2d7aa370fe8bb44ad6615478afca66336"/>
     <w:p>
       <w:pPr>
-        <w:numPr>
-          <w:ilvl w:val="0"/>
-          <w:numId w:val="1005"/>
-        </w:numPr>
+        <w:pStyle w:val="Heading2"/>
       </w:pPr>
       <w:r>
-        <w:rPr>
-          <w:b/>
-          <w:bCs/>
-        </w:rPr>
-        <w:t xml:space="preserve">DG - Could be helpful to note the different values on the x-axis between this and the next figure</w:t>
+        <w:t xml:space="preserve">Case Study: IUCN-CMP</w:t>
+      </w:r>
+      <w:r>
+        <w:t xml:space="preserve"> </w:t>
+      </w:r>
+      <w:r>
+        <w:t xml:space="preserve">“</w:t>
+      </w:r>
+      <w:r>
+        <w:t xml:space="preserve">7.2 Dams &amp; Water Management / Use</w:t>
+      </w:r>
+      <w:r>
+        <w:t xml:space="preserve">”</w:t>
+      </w:r>
+    </w:p>
+    <w:p>
+      <w:pPr>
+        <w:pStyle w:val="FirstParagraph"/>
+      </w:pPr>
+      <w:r>
+        <w:t xml:space="preserve">One IUCN-CMP threat was assessed as</w:t>
+      </w:r>
+      <w:r>
+        <w:t xml:space="preserve"> </w:t>
+      </w:r>
+      <w:r>
+        <w:t xml:space="preserve">“</w:t>
+      </w:r>
+      <w:r>
+        <w:t xml:space="preserve">Extreme-High</w:t>
+      </w:r>
+      <w:r>
+        <w:t xml:space="preserve">”</w:t>
+      </w:r>
+      <w:r>
+        <w:t xml:space="preserve"> </w:t>
+      </w:r>
+      <w:r>
+        <w:t xml:space="preserve">through DFO Recovery Potential Assessment processes, which was</w:t>
+      </w:r>
+      <w:r>
+        <w:t xml:space="preserve"> </w:t>
+      </w:r>
+      <w:r>
+        <w:t xml:space="preserve">“</w:t>
+      </w:r>
+      <w:r>
+        <w:t xml:space="preserve">7.2 Dams &amp; Water Management / Use</w:t>
+      </w:r>
+      <w:r>
+        <w:t xml:space="preserve">”</w:t>
+      </w:r>
+      <w:r>
+        <w:t xml:space="preserve"> </w:t>
+      </w:r>
+      <w:r>
+        <w:t xml:space="preserve">(DFO 2020)</w:t>
+      </w:r>
+      <w:r>
+        <w:t xml:space="preserve">. Water extraction, including groundwater, for irrigation and domestic purposes is listed as the most significant concern</w:t>
+      </w:r>
+      <w:r>
+        <w:t xml:space="preserve"> </w:t>
+      </w:r>
+      <w:r>
+        <w:t xml:space="preserve">(DFO 2020)</w:t>
+      </w:r>
+      <w:r>
+        <w:t xml:space="preserve">. This threat was assigned to one Chinook conservation unit in the Fraser Interior area (Table</w:t>
+      </w:r>
+      <w:r>
+        <w:t xml:space="preserve"> </w:t>
+      </w:r>
+      <w:r>
+        <w:t xml:space="preserve">??</w:t>
+      </w:r>
+      <w:r>
+        <w:t xml:space="preserve">).</w:t>
       </w:r>
     </w:p>
     <w:p>
@@ -27142,295 +27277,14 @@
           <w:b/>
           <w:bCs/>
         </w:rPr>
-        <w:t xml:space="preserve">Comment on the most relevant legislation and why</w:t>
-      </w:r>
-    </w:p>
-    <w:p>
-      <w:pPr>
-        <w:pStyle w:val="FirstParagraph"/>
-      </w:pPr>
-      <w:r>
-        <w:t xml:space="preserve">This is the outputs of the LAPSE tool and it shows that…</w:t>
-      </w:r>
-    </w:p>
-    <w:p>
-      <w:pPr>
-        <w:pStyle w:val="BodyText"/>
-      </w:pPr>
-      <w:r>
-        <w:t xml:space="preserve">the main legislation specific to landslides and salmon is…</w:t>
-      </w:r>
-    </w:p>
-    <w:p>
-      <w:pPr>
-        <w:pStyle w:val="BodyText"/>
-      </w:pPr>
-      <w:r>
-        <w:t xml:space="preserve">And the nature of that legislation is…</w:t>
-      </w:r>
-    </w:p>
-    <w:p>
-      <w:pPr>
-        <w:pStyle w:val="BodyText"/>
-      </w:pPr>
-      <w:r>
-        <w:rPr>
-          <w:b/>
-          <w:bCs/>
-        </w:rPr>
-        <w:t xml:space="preserve">Forest and Range Practices Act</w:t>
-      </w:r>
-    </w:p>
-    <w:p>
-      <w:pPr>
-        <w:pStyle w:val="BodyText"/>
-      </w:pPr>
-      <w:r>
-        <w:rPr>
-          <w:b/>
-          <w:bCs/>
-        </w:rPr>
-        <w:t xml:space="preserve">Forest Planning and Practices Regulation</w:t>
-      </w:r>
-    </w:p>
-    <w:p>
-      <w:pPr>
-        <w:pStyle w:val="BlockText"/>
-      </w:pPr>
-      <w:r>
-        <w:rPr>
-          <w:b/>
-          <w:bCs/>
-        </w:rPr>
-        <w:t xml:space="preserve">Damage to the environment”</w:t>
-      </w:r>
-    </w:p>
-    <w:p>
-      <w:pPr>
-        <w:pStyle w:val="BlockText"/>
-      </w:pPr>
-      <w:r>
-        <w:rPr>
-          <w:b/>
-          <w:bCs/>
-        </w:rPr>
-        <w:t xml:space="preserve">3</w:t>
-      </w:r>
-      <w:r>
-        <w:t xml:space="preserve"> </w:t>
-      </w:r>
-      <w:r>
-        <w:t xml:space="preserve">  (1)For the purpose of section 46 (1) and (1.1)</w:t>
-      </w:r>
-      <w:r>
-        <w:t xml:space="preserve"> </w:t>
-      </w:r>
-      <w:r>
-        <w:rPr>
-          <w:i/>
-          <w:iCs/>
-        </w:rPr>
-        <w:t xml:space="preserve">[protection of the environment]</w:t>
-      </w:r>
-      <w:r>
-        <w:t xml:space="preserve"> </w:t>
-      </w:r>
-      <w:r>
-        <w:t xml:space="preserve">of the Act,</w:t>
-      </w:r>
-      <w:r>
-        <w:t xml:space="preserve"> </w:t>
-      </w:r>
-      <w:r>
-        <w:t xml:space="preserve">“</w:t>
-      </w:r>
-      <w:r>
-        <w:t xml:space="preserve">damage</w:t>
-      </w:r>
-      <w:r>
-        <w:t xml:space="preserve">”</w:t>
-      </w:r>
-      <w:r>
-        <w:t xml:space="preserve"> </w:t>
-      </w:r>
-      <w:r>
-        <w:t xml:space="preserve">means any of the following that adversely alters an ecosystem: (a)a landslide…</w:t>
-      </w:r>
-    </w:p>
-    <w:p>
-      <w:pPr>
-        <w:pStyle w:val="FirstParagraph"/>
-      </w:pPr>
-      <w:r>
-        <w:rPr>
-          <w:b/>
-          <w:bCs/>
-        </w:rPr>
-        <w:t xml:space="preserve">Environmental Management Act</w:t>
-      </w:r>
-    </w:p>
-    <w:p>
-      <w:pPr>
-        <w:pStyle w:val="BodyText"/>
-      </w:pPr>
-      <w:r>
-        <w:rPr>
-          <w:b/>
-          <w:bCs/>
-        </w:rPr>
-        <w:t xml:space="preserve">Environmental emergency measures</w:t>
-      </w:r>
-    </w:p>
-    <w:p>
-      <w:pPr>
-        <w:pStyle w:val="BlockText"/>
-      </w:pPr>
-      <w:r>
-        <w:rPr>
-          <w:b/>
-          <w:bCs/>
-        </w:rPr>
-        <w:t xml:space="preserve">87</w:t>
-      </w:r>
-      <w:r>
-        <w:t xml:space="preserve"> </w:t>
-      </w:r>
-      <w:r>
-        <w:t xml:space="preserve">  (1)In this section and section 88 </w:t>
-      </w:r>
-      <w:r>
-        <w:rPr>
-          <w:i/>
-          <w:iCs/>
-        </w:rPr>
-        <w:t xml:space="preserve">[recovery of costs — environmental emergency]</w:t>
-      </w:r>
-      <w:r>
-        <w:t xml:space="preserve">, </w:t>
-      </w:r>
-      <w:r>
-        <w:t xml:space="preserve">“</w:t>
-      </w:r>
-      <w:r>
-        <w:t xml:space="preserve">environmental emergency</w:t>
-      </w:r>
-      <w:r>
-        <w:t xml:space="preserve">”</w:t>
-      </w:r>
-      <w:r>
-        <w:t xml:space="preserve"> </w:t>
-      </w:r>
-      <w:r>
-        <w:t xml:space="preserve">means an occurrence or natural disaster that affects the environment and includes the following: (a)a flood; (b)a landslide…</w:t>
-      </w:r>
-    </w:p>
-    <w:bookmarkEnd w:id="81"/>
-    <w:bookmarkStart w:id="92" w:name="X15485f2d7aa370fe8bb44ad6615478afca66336"/>
-    <w:p>
-      <w:pPr>
-        <w:pStyle w:val="Heading2"/>
-      </w:pPr>
-      <w:r>
-        <w:t xml:space="preserve">Case Study: IUCN-CMP</w:t>
-      </w:r>
-      <w:r>
-        <w:t xml:space="preserve"> </w:t>
-      </w:r>
-      <w:r>
-        <w:t xml:space="preserve">“</w:t>
-      </w:r>
-      <w:r>
-        <w:t xml:space="preserve">7.2 Dams &amp; Water Management / Use</w:t>
-      </w:r>
-      <w:r>
-        <w:t xml:space="preserve">”</w:t>
-      </w:r>
-    </w:p>
-    <w:p>
-      <w:pPr>
-        <w:pStyle w:val="FirstParagraph"/>
-      </w:pPr>
-      <w:r>
-        <w:t xml:space="preserve">One IUCN-CMP threat was assessed as</w:t>
-      </w:r>
-      <w:r>
-        <w:t xml:space="preserve"> </w:t>
-      </w:r>
-      <w:r>
-        <w:t xml:space="preserve">“</w:t>
-      </w:r>
-      <w:r>
-        <w:t xml:space="preserve">Extreme-High</w:t>
-      </w:r>
-      <w:r>
-        <w:t xml:space="preserve">”</w:t>
-      </w:r>
-      <w:r>
-        <w:t xml:space="preserve"> </w:t>
-      </w:r>
-      <w:r>
-        <w:t xml:space="preserve">through DFO Recovery Potential Assessment processes, which was</w:t>
-      </w:r>
-      <w:r>
-        <w:t xml:space="preserve"> </w:t>
-      </w:r>
-      <w:r>
-        <w:t xml:space="preserve">“</w:t>
-      </w:r>
-      <w:r>
-        <w:t xml:space="preserve">7.2 Dams &amp; Water Management / Use</w:t>
-      </w:r>
-      <w:r>
-        <w:t xml:space="preserve">”</w:t>
-      </w:r>
-      <w:r>
-        <w:t xml:space="preserve"> </w:t>
-      </w:r>
-      <w:r>
-        <w:t xml:space="preserve">(DFO 2020)</w:t>
-      </w:r>
-      <w:r>
-        <w:t xml:space="preserve">. Water extraction, including groundwater, for irrigation and domestic purposes is listed as the most significant concern</w:t>
-      </w:r>
-      <w:r>
-        <w:t xml:space="preserve"> </w:t>
-      </w:r>
-      <w:r>
-        <w:t xml:space="preserve">(DFO 2020)</w:t>
-      </w:r>
-      <w:r>
-        <w:t xml:space="preserve">. This threat was assigned to one Chinook conservation unit in the Fraser Interior area (Table</w:t>
-      </w:r>
-      <w:r>
-        <w:t xml:space="preserve"> </w:t>
-      </w:r>
-      <w:r>
-        <w:t xml:space="preserve">??</w:t>
-      </w:r>
-      <w:r>
-        <w:t xml:space="preserve">).</w:t>
+        <w:t xml:space="preserve">DG - And 7.3 Other ecosystem modifications</w:t>
       </w:r>
     </w:p>
     <w:p>
       <w:pPr>
         <w:numPr>
           <w:ilvl w:val="0"/>
-          <w:numId w:val="1006"/>
-        </w:numPr>
-      </w:pPr>
-      <w:r>
-        <w:rPr>
-          <w:b/>
-          <w:bCs/>
-        </w:rPr>
-        <w:t xml:space="preserve">DG - And 7.3 Other ecosystem modifications</w:t>
-      </w:r>
-    </w:p>
-    <w:p>
-      <w:pPr>
-        <w:numPr>
-          <w:ilvl w:val="0"/>
-          <w:numId w:val="1006"/>
+          <w:numId w:val="1005"/>
         </w:numPr>
       </w:pPr>
       <w:r>
@@ -27844,7 +27698,7 @@
         <w:pStyle w:val="Compact"/>
         <w:numPr>
           <w:ilvl w:val="0"/>
-          <w:numId w:val="1007"/>
+          <w:numId w:val="1006"/>
         </w:numPr>
       </w:pPr>
       <w:r>
@@ -28072,7 +27926,7 @@
       <w:pPr>
         <w:numPr>
           <w:ilvl w:val="0"/>
-          <w:numId w:val="1008"/>
+          <w:numId w:val="1007"/>
         </w:numPr>
       </w:pPr>
       <w:r>
@@ -28087,7 +27941,7 @@
       <w:pPr>
         <w:numPr>
           <w:ilvl w:val="0"/>
-          <w:numId w:val="1008"/>
+          <w:numId w:val="1007"/>
         </w:numPr>
       </w:pPr>
       <w:r>
@@ -28119,7 +27973,7 @@
       <w:pPr>
         <w:numPr>
           <w:ilvl w:val="0"/>
-          <w:numId w:val="1008"/>
+          <w:numId w:val="1007"/>
         </w:numPr>
       </w:pPr>
       <w:r>
@@ -28134,7 +27988,7 @@
       <w:pPr>
         <w:numPr>
           <w:ilvl w:val="0"/>
-          <w:numId w:val="1008"/>
+          <w:numId w:val="1007"/>
         </w:numPr>
       </w:pPr>
       <w:r>
@@ -28242,7 +28096,7 @@
       <w:pPr>
         <w:numPr>
           <w:ilvl w:val="1"/>
-          <w:numId w:val="1009"/>
+          <w:numId w:val="1008"/>
         </w:numPr>
       </w:pPr>
       <w:r>
@@ -28257,7 +28111,7 @@
       <w:pPr>
         <w:numPr>
           <w:ilvl w:val="1"/>
-          <w:numId w:val="1009"/>
+          <w:numId w:val="1008"/>
         </w:numPr>
       </w:pPr>
       <w:r>
@@ -28581,7 +28435,7 @@
         <w:pStyle w:val="Compact"/>
         <w:numPr>
           <w:ilvl w:val="0"/>
-          <w:numId w:val="1010"/>
+          <w:numId w:val="1009"/>
         </w:numPr>
       </w:pPr>
       <w:r>
@@ -31195,7 +31049,7 @@
         <w:pStyle w:val="Compact"/>
         <w:numPr>
           <w:ilvl w:val="0"/>
-          <w:numId w:val="1011"/>
+          <w:numId w:val="1010"/>
         </w:numPr>
       </w:pPr>
       <w:r>
@@ -31976,9 +31830,6 @@
     <w:abstractNumId w:val="991"/>
   </w:num>
   <w:num w:numId="1008">
-    <w:abstractNumId w:val="991"/>
-  </w:num>
-  <w:num w:numId="1009">
     <w:abstractNumId w:val="99411"/>
     <w:lvlOverride w:ilvl="0">
       <w:startOverride w:val="1"/>
@@ -32008,10 +31859,10 @@
       <w:startOverride w:val="1"/>
     </w:lvlOverride>
   </w:num>
-  <w:num w:numId="1010">
+  <w:num w:numId="1009">
     <w:abstractNumId w:val="991"/>
   </w:num>
-  <w:num w:numId="1011">
+  <w:num w:numId="1010">
     <w:abstractNumId w:val="991"/>
   </w:num>
 </w:numbering>

</xml_diff>

<commit_message>
Rewrote Abstract, revised cpation formatting, revised figure dimensions. COnsider this Draft 2 to email to group
</commit_message>
<xml_diff>
--- a/reports/LAPSE_primary_publication.docx
+++ b/reports/LAPSE_primary_publication.docx
@@ -155,7 +155,7 @@
         <w:pStyle w:val="Date"/>
       </w:pPr>
       <w:r>
-        <w:t xml:space="preserve">2026-02-10</w:t>
+        <w:t xml:space="preserve">2026-02-11</w:t>
       </w:r>
     </w:p>
     <w:sdt>
@@ -211,7 +211,7 @@
         <w:t xml:space="preserve"> </w:t>
       </w:r>
       <w:r>
-        <w:t xml:space="preserve">spp.) populations across British Columbia, Canada are experiencing widespread declines driven by multiple anthropogenic stressors including habitat degradation, climate change, and overharvest. Addressing these threats requires coordinated action across a fragmented governance landscape where federal jurisdiction over fisheries intersects with provincial authority over freshwater habitat, creating regulatory complexity that impedes effective conservation. Despite the recognized need for integrated stewardship, practitioners often lack accessible frameworks for navigating the legislative architecture governing salmon and their ecosystems. Here, we present the Legislation Applicable to Pacific Salmon and Ecosystems (LAPSE) framework—a systematic process and open-source tool that bridges regulatory language with standardized threat classifications to facilitate evidence-based conservation planning. We accumulated 196 Canadian federal and British Columbian provincial statutes relevant to Pacific salmon stewardship and parsed them into individual clauses using automated HTML extraction. We then developed keyword-matching algorithms to assign clauses to</w:t>
+        <w:t xml:space="preserve">spp.) populations are generally declining in Canada, while the number of populations monitored continues to drop, despite considerable attention towards policies and recovery programs for salmon conservation. Wild-origin salmon abundance declines are recognized as a consequence of numerous aspects of human activity, including the loss or degradation of habitat, climate change, hatchery pressures, and harvest. Addressing these threats requires coordinated action across a fragmented governance landscape where federal jurisdiction over fisheries intersects with provincial authority over freshwater habitat, creating regulatory complexity that impedes effective stewardship. Practitioners often lack accessible frameworks for navigating the legislative architecture governing salmon and their ecosystems. To address this gap, we present the Legislation Applicable to Pacific Salmon and Ecosystems (LAPSE) framework, which is a systematic process and open-source tool that bridges regulatory language with standardized threat classifications. We accumulated 196 Canadian federal and British Columbian provincial statutes relevant to Pacific salmon stewardship and parsed them by individual clause using automated HTML extraction. Using keyword-matching algorithms, we assigned clauses by</w:t>
       </w:r>
       <w:r>
         <w:t xml:space="preserve"> </w:t>
@@ -226,25 +226,39 @@
         <w:t xml:space="preserve">”</w:t>
       </w:r>
       <w:r>
-        <w:t xml:space="preserve">—discrete areas of administrative concern aligned with the International Union for Conservation of Nature–Conservation Measures Partnership (IUCN-CMP) Direct Threats Classification. Additionally, we categorized clauses by salmon-specific scope (from direct salmon references to general governance) and clause type (e.g., prohibition, authorization, designation). Our analysis reveals that pollution-related provisions are most prevalent across both jurisdictions, while fisheries management is predominantly federal and water use regulations are predominantly provincial—reflecting a structural disconnect between harvest control and habitat protection. Case studies linking Recovery Potential Assessment threat rankings for endangered designatable units to corresponding legislation demonstrate the framework’s utility for identifying regulatory pathways relevant to specific threats. The LAPSE framework provides salmon stewardship practitioners with navigability of the legal landscape, enabling more informed evaluation of regulatory tools available to address threats and supporting the development of coordinated, inter-jurisdictional recovery strategies.</w:t>
-      </w:r>
-    </w:p>
-    <w:p>
-      <w:pPr>
-        <w:pStyle w:val="BodyText"/>
-      </w:pPr>
+        <w:t xml:space="preserve"> </w:t>
+      </w:r>
+      <w:r>
+        <w:t xml:space="preserve">that we define as discrete areas of administrative concern. These management domains align with the</w:t>
+      </w:r>
+      <w:r>
+        <w:t xml:space="preserve"> </w:t>
+      </w:r>
       <w:r>
         <w:rPr>
-          <w:b/>
-          <w:bCs/>
+          <w:i/>
+          <w:iCs/>
         </w:rPr>
-        <w:t xml:space="preserve">Keywords:</w:t>
-      </w:r>
-      <w:r>
-        <w:t xml:space="preserve"> </w:t>
-      </w:r>
-      <w:r>
-        <w:t xml:space="preserve">Pacific salmon, legislation, governance, IUCN-CMP threats, conservation policy, British Columbia, regulatory framework, species at risk</w:t>
+        <w:t xml:space="preserve">International Union for Conservation of Nature–Conservation Measures Partnership</w:t>
+      </w:r>
+      <w:r>
+        <w:t xml:space="preserve"> </w:t>
+      </w:r>
+      <w:r>
+        <w:t xml:space="preserve">(IUCN-CMP)</w:t>
+      </w:r>
+      <w:r>
+        <w:t xml:space="preserve"> </w:t>
+      </w:r>
+      <w:r>
+        <w:rPr>
+          <w:i/>
+          <w:iCs/>
+        </w:rPr>
+        <w:t xml:space="preserve">Direct Threats Classification version 4.0</w:t>
+      </w:r>
+      <w:r>
+        <w:t xml:space="preserve">. Additionally, we categorized clauses by salmon-specific scope (from direct salmon references to general governance) and clause type (e.g., prohibition, authorization, designation). Our analysis reveals that spatial designation and pollution-related provisions are most prevalent across both jurisdictions. Fisheries (harvest) management of salmon is primarily federal, while water use regulations are mostly provincial, which reflects a structural disconnect between harvest control and habitat protection. Case studies linking Fisheries and Oceans Canada’s (DFO) Recovery Potential Assessment threat rankings for assessed Designatable Units to corresponding legislation demonstrate the framework’s utility for identifying regulatory pathways relevant to specific threats. The LAPSE framework provides salmon stewardship practitioners with navigability of the legal landscape, enabling more informed evaluation of regulatory tools available to address threats and supporting the development of coordinated, inter-jurisdictional recovery strategies.</w:t>
       </w:r>
     </w:p>
     <w:bookmarkEnd w:id="20"/>
@@ -1131,100 +1145,10 @@
         <w:t xml:space="preserve">1</w:t>
       </w:r>
       <w:r>
-        <w:t xml:space="preserve">), which is why the management domain categories were required. For example, aquaculture and hatcheries are important aspects that impact Pacific salmon populations. This topic spans two IUCN-CMP Level 1 categories:</w:t>
-      </w:r>
-      <w:r>
-        <w:t xml:space="preserve"> </w:t>
-      </w:r>
-      <w:r>
-        <w:t xml:space="preserve">“</w:t>
-      </w:r>
-      <w:r>
-        <w:t xml:space="preserve">2. Agriculture &amp; Aquaculture</w:t>
-      </w:r>
-      <w:r>
-        <w:t xml:space="preserve">”</w:t>
-      </w:r>
-      <w:r>
-        <w:t xml:space="preserve"> </w:t>
-      </w:r>
-      <w:r>
-        <w:t xml:space="preserve">and</w:t>
-      </w:r>
-      <w:r>
-        <w:t xml:space="preserve"> </w:t>
-      </w:r>
-      <w:r>
-        <w:t xml:space="preserve">“</w:t>
-      </w:r>
-      <w:r>
-        <w:t xml:space="preserve">8. Invasive / Other Problematic Species, Genes &amp; Pathogens</w:t>
-      </w:r>
-      <w:r>
-        <w:t xml:space="preserve">”</w:t>
-      </w:r>
-      <w:r>
-        <w:t xml:space="preserve">, but would be more specifically aligned with the IUCN-CMP Level 2 categories:</w:t>
-      </w:r>
-      <w:r>
-        <w:t xml:space="preserve"> </w:t>
-      </w:r>
-      <w:r>
-        <w:t xml:space="preserve">“</w:t>
-      </w:r>
-      <w:r>
-        <w:t xml:space="preserve">2.4 Marine &amp; Freshwater Aquaculture</w:t>
-      </w:r>
-      <w:r>
-        <w:t xml:space="preserve">”</w:t>
-      </w:r>
-      <w:r>
-        <w:t xml:space="preserve"> </w:t>
-      </w:r>
-      <w:r>
-        <w:t xml:space="preserve">and</w:t>
-      </w:r>
-      <w:r>
-        <w:t xml:space="preserve"> </w:t>
-      </w:r>
-      <w:r>
-        <w:t xml:space="preserve">“</w:t>
-      </w:r>
-      <w:r>
-        <w:t xml:space="preserve">8.3 Introduced Genetic Material.</w:t>
-      </w:r>
-      <w:r>
-        <w:t xml:space="preserve">”</w:t>
-      </w:r>
-      <w:r>
-        <w:t xml:space="preserve"> </w:t>
-      </w:r>
-      <w:r>
-        <w:t xml:space="preserve">For clarity and better alignment, we created a management domain called</w:t>
-      </w:r>
-      <w:r>
-        <w:t xml:space="preserve"> </w:t>
-      </w:r>
-      <w:r>
-        <w:t xml:space="preserve">“</w:t>
-      </w:r>
-      <w:r>
-        <w:t xml:space="preserve">Aquaculture and Hatcheries.</w:t>
-      </w:r>
-      <w:r>
-        <w:t xml:space="preserve">”</w:t>
-      </w:r>
-      <w:r>
-        <w:t xml:space="preserve"> </w:t>
-      </w:r>
-      <w:r>
-        <w:t xml:space="preserve">A similar misalignment occurs when assessing the provincial</w:t>
-      </w:r>
-      <w:r>
-        <w:t xml:space="preserve"> </w:t>
-      </w:r>
-      <w:r>
-        <w:t xml:space="preserve">“</w:t>
+        <w:t xml:space="preserve">), which is why the management domain categories were required. For example, aquaculture and hatcheries are important aspects that impact Pacific salmon populations. This topic spans two IUCN-CMP Level 1 categories: 2. Agriculture &amp; Aquaculture and 8. Invasive / Other Problematic Species, Genes &amp; Pathogens, but would be more specifically aligned with the IUCN-CMP Level 2 categories: 2.4 Marine &amp; Freshwater Aquaculture and 8.3 Introduced Genetic Material. For clarity and better alignment, we created a management domain called Aquaculture and Hatcheries. A similar misalignment occurs when assessing the provincial</w:t>
+      </w:r>
+      <w:r>
+        <w:t xml:space="preserve"> </w:t>
       </w:r>
       <w:r>
         <w:rPr>
@@ -1234,16 +1158,7 @@
         <w:t xml:space="preserve">Forest And Range Practices Act</w:t>
       </w:r>
       <w:r>
-        <w:t xml:space="preserve">.</w:t>
-      </w:r>
-      <w:r>
-        <w:t xml:space="preserve">”</w:t>
-      </w:r>
-      <w:r>
-        <w:t xml:space="preserve"> </w:t>
-      </w:r>
-      <w:r>
-        <w:t xml:space="preserve">Since the management domain categories were derived as close as possible to the IUCN-CMP threat categories (a mix of Level 1 and Level 2), most can be viewed as equivalent.</w:t>
+        <w:t xml:space="preserve">. Since the management domain categories were derived as close as possible to the IUCN-CMP threat categories (a mix of Level 1 and Level 2), most can be viewed as equivalent.</w:t>
       </w:r>
     </w:p>
     <w:p>
@@ -7972,25 +7887,7 @@
         <w:t xml:space="preserve"> </w:t>
       </w:r>
       <w:r>
-        <w:t xml:space="preserve">is listed on the IUCN-CMP threat examples for</w:t>
-      </w:r>
-      <w:r>
-        <w:t xml:space="preserve"> </w:t>
-      </w:r>
-      <w:r>
-        <w:t xml:space="preserve">“</w:t>
-      </w:r>
-      <w:r>
-        <w:t xml:space="preserve">1.2 Commercial &amp; Industrial Areas,</w:t>
-      </w:r>
-      <w:r>
-        <w:t xml:space="preserve">”</w:t>
-      </w:r>
-      <w:r>
-        <w:t xml:space="preserve"> </w:t>
-      </w:r>
-      <w:r>
-        <w:t xml:space="preserve">in the context of the physical footprint of landfill sites. Much of the collected legislation deals with pollution, in which landfills are mentioned as a source of effluent. However, for salmon habitat, the main threat would come from water effluent, rather than the physical impact of landfill sites proximal to salmon habitat, and pollution would be a more accurate designation.</w:t>
+        <w:t xml:space="preserve">is listed on the IUCN-CMP threat examples for 1.2 Commercial &amp; Industrial Areas, in the context of the physical footprint of landfill sites. Much of the collected legislation deals with pollution, in which landfills are mentioned as a source of effluent. However, for salmon habitat, the main threat would come from water effluent, rather than the physical impact of landfill sites adjacent to salmon habitat, and pollution would be a more accurate designation.</w:t>
       </w:r>
       <w:r>
         <w:t xml:space="preserve"> </w:t>
@@ -8161,7 +8058,7 @@
         <w:t xml:space="preserve">(Ray et al. 2021)</w:t>
       </w:r>
       <w:r>
-        <w:t xml:space="preserve">, the LAPSE process and tool can be used by practitioners to view the existing acts, regulations, orders, and codes when considering actions or proposals. Management domains were identified within all the collected statutes. Pollution was the management domain with the highest section count (Figure</w:t>
+        <w:t xml:space="preserve">, the LAPSE process and tool can be used by practitioners to view the existing acts, regulations, orders, and codes when considering actions or proposals. Management domains were identified within all the collected statutes. Spatial Designation and Pollution were the management domains with the highest section count (Figure</w:t>
       </w:r>
       <w:r>
         <w:t xml:space="preserve"> </w:t>
@@ -8170,7 +8067,7 @@
         <w:t xml:space="preserve">5</w:t>
       </w:r>
       <w:r>
-        <w:t xml:space="preserve">), split almost evenly between federal and provincial jurisdictions. Human Disturbance (specifically, 6.3 Other Human Disturbances, as in species research activities) and Climate Change and Natural Disasters had the fewest section count. Fisheries was in the top three for section count, with a majority of sections under federal jurisdiction. Water Use and Watercourse Modifications was in the top four for section count, with a majority of sections under provincial jurisdiction. This count indicates an underlying possibly dysfunctional relationship where salmon harvest is controlled federally while habitat aspects are governed provincially.</w:t>
+        <w:t xml:space="preserve">), split almost evenly between federal and provincial jurisdictions. Human Disturbance (specifically, 6.3 Other Human Disturbances, as in species research activities) and Climate Change and Natural Disasters had the fewest section count. Fisheries was in the top five for section count, with a majority of sections under federal jurisdiction. Water Use and Watercourse Modifications was in the top three for section count, with a majority of sections under provincial jurisdiction. This count indicates an underlying possibly dysfunctional relationship where salmon harvest is controlled federally while habitat aspects are governed provincially.</w:t>
       </w:r>
     </w:p>
     <w:p>
@@ -8180,7 +8077,7 @@
       <w:r>
         <w:drawing>
           <wp:inline>
-            <wp:extent cx="5943600" cy="4457699"/>
+            <wp:extent cx="5943600" cy="3566160"/>
             <wp:effectExtent b="0" l="0" r="0" t="0"/>
             <wp:docPr descr="Figure 5: Count of sections matched by management domain, stacked by jurisdiction." title="" id="50" name="Picture"/>
             <a:graphic>
@@ -8201,7 +8098,7 @@
                   <pic:spPr bwMode="auto">
                     <a:xfrm>
                       <a:off x="0" y="0"/>
-                      <a:ext cx="5943600" cy="4457699"/>
+                      <a:ext cx="5943600" cy="3566160"/>
                     </a:xfrm>
                     <a:prstGeom prst="rect">
                       <a:avLst/>
@@ -8254,61 +8151,7 @@
         <w:t xml:space="preserve">6</w:t>
       </w:r>
       <w:r>
-        <w:t xml:space="preserve">) that parallel the management domain categories. Multiple IUCN-CMP threats comprise a management domain; however</w:t>
-      </w:r>
-      <w:r>
-        <w:t xml:space="preserve"> </w:t>
-      </w:r>
-      <w:r>
-        <w:t xml:space="preserve">“</w:t>
-      </w:r>
-      <w:r>
-        <w:t xml:space="preserve">9.1 Water-Borne &amp; Other Effluent Pollution</w:t>
-      </w:r>
-      <w:r>
-        <w:t xml:space="preserve">”</w:t>
-      </w:r>
-      <w:r>
-        <w:t xml:space="preserve"> </w:t>
-      </w:r>
-      <w:r>
-        <w:t xml:space="preserve">matched with the highest number of sections (as in the management domains) followed by</w:t>
-      </w:r>
-      <w:r>
-        <w:t xml:space="preserve"> </w:t>
-      </w:r>
-      <w:r>
-        <w:t xml:space="preserve">“</w:t>
-      </w:r>
-      <w:r>
-        <w:t xml:space="preserve">5.4 Fishing, Harvesting &amp; Controlling Aquatic Species.</w:t>
-      </w:r>
-      <w:r>
-        <w:t xml:space="preserve">”</w:t>
-      </w:r>
-      <w:r>
-        <w:t xml:space="preserve"> </w:t>
-      </w:r>
-      <w:r>
-        <w:t xml:space="preserve">Eight IUCN-CMP threat categories make up the Water Use and Watercourse Modifications management domain, but</w:t>
-      </w:r>
-      <w:r>
-        <w:t xml:space="preserve"> </w:t>
-      </w:r>
-      <w:r>
-        <w:t xml:space="preserve">“</w:t>
-      </w:r>
-      <w:r>
-        <w:t xml:space="preserve">7.2 Dams &amp; Water Management / Use</w:t>
-      </w:r>
-      <w:r>
-        <w:t xml:space="preserve">”</w:t>
-      </w:r>
-      <w:r>
-        <w:t xml:space="preserve"> </w:t>
-      </w:r>
-      <w:r>
-        <w:t xml:space="preserve">has the majority of matches.</w:t>
+        <w:t xml:space="preserve">) that parallel the management domain categories. Multiple IUCN-CMP threats can comprise a management domain; however 9.1 Water-Borne &amp; Other Effluent Pollution matched with the highest number of sections followed by 7.2 Dams &amp; Water Management / Use and 5.4 Fishing, Harvesting &amp; Controlling Aquatic Species. This assessment shows the proportional layout of historic legal attention given to topics, where pollution receives a large amount of attention, while topics such as temperature changes receives very little legal attention.</w:t>
       </w:r>
     </w:p>
     <w:p>
@@ -10067,7 +9910,7 @@
       <w:r>
         <w:drawing>
           <wp:inline>
-            <wp:extent cx="5943600" cy="4457699"/>
+            <wp:extent cx="5943600" cy="3566160"/>
             <wp:effectExtent b="0" l="0" r="0" t="0"/>
             <wp:docPr descr="Figure 7: Count of sections by legislation for scope category ‘1 - Salmon’, coloured by jurisdiction." title="" id="61" name="Picture"/>
             <a:graphic>
@@ -10088,7 +9931,7 @@
                   <pic:spPr bwMode="auto">
                     <a:xfrm>
                       <a:off x="0" y="0"/>
-                      <a:ext cx="5943600" cy="4457699"/>
+                      <a:ext cx="5943600" cy="3566160"/>
                     </a:xfrm>
                     <a:prstGeom prst="rect">
                       <a:avLst/>
@@ -25264,43 +25107,7 @@
         <w:t xml:space="preserve">9</w:t>
       </w:r>
       <w:r>
-        <w:t xml:space="preserve">).</w:t>
-      </w:r>
-      <w:r>
-        <w:t xml:space="preserve"> </w:t>
-      </w:r>
-      <w:r>
-        <w:t xml:space="preserve">“</w:t>
-      </w:r>
-      <w:r>
-        <w:t xml:space="preserve">10.1 Geological Events</w:t>
-      </w:r>
-      <w:r>
-        <w:t xml:space="preserve">”</w:t>
-      </w:r>
-      <w:r>
-        <w:t xml:space="preserve"> </w:t>
-      </w:r>
-      <w:r>
-        <w:t xml:space="preserve">received an extreme ranking, and</w:t>
-      </w:r>
-      <w:r>
-        <w:t xml:space="preserve"> </w:t>
-      </w:r>
-      <w:r>
-        <w:t xml:space="preserve">“</w:t>
-      </w:r>
-      <w:r>
-        <w:t xml:space="preserve">7.2 Dams &amp; Water Management / Use</w:t>
-      </w:r>
-      <w:r>
-        <w:t xml:space="preserve">”</w:t>
-      </w:r>
-      <w:r>
-        <w:t xml:space="preserve"> </w:t>
-      </w:r>
-      <w:r>
-        <w:t xml:space="preserve">received an extreme-high ranking. These two categories were chosen to assess the categories as case studies.</w:t>
+        <w:t xml:space="preserve">). 10.1 Geological Events received an extreme ranking, and 7.2 Dams &amp; Water Management / Use received an extreme-high ranking. These two categories were chosen to assess the categories as case studies.</w:t>
       </w:r>
     </w:p>
     <w:p>
@@ -25501,19 +25308,7 @@
         <w:pStyle w:val="Heading2"/>
       </w:pPr>
       <w:r>
-        <w:t xml:space="preserve">Case Study: IUCN-CMP</w:t>
-      </w:r>
-      <w:r>
-        <w:t xml:space="preserve"> </w:t>
-      </w:r>
-      <w:r>
-        <w:t xml:space="preserve">“</w:t>
-      </w:r>
-      <w:r>
-        <w:t xml:space="preserve">10.1 Geological Events</w:t>
-      </w:r>
-      <w:r>
-        <w:t xml:space="preserve">”</w:t>
+        <w:t xml:space="preserve">Case Study: IUCN-CMP 10.1 Geological Events</w:t>
       </w:r>
     </w:p>
     <w:p>
@@ -25663,25 +25458,7 @@
         <w:t xml:space="preserve"> </w:t>
       </w:r>
       <w:r>
-        <w:t xml:space="preserve">where the the Level 2 threat is called</w:t>
-      </w:r>
-      <w:r>
-        <w:t xml:space="preserve"> </w:t>
-      </w:r>
-      <w:r>
-        <w:t xml:space="preserve">“</w:t>
-      </w:r>
-      <w:r>
-        <w:t xml:space="preserve">10.1 Geological Events,</w:t>
-      </w:r>
-      <w:r>
-        <w:t xml:space="preserve">”</w:t>
-      </w:r>
-      <w:r>
-        <w:t xml:space="preserve"> </w:t>
-      </w:r>
-      <w:r>
-        <w:t xml:space="preserve">and avalanches and landslides are listed as examples of these events. We modified the classification of these assessments to fit the newest IUCN-CMP version for consistency.</w:t>
+        <w:t xml:space="preserve">where the the Level 2 threat is called 10.1 Geological Events, and avalanches and landslides are listed as examples of these events. We modified the classification of these assessments to fit the newest IUCN-CMP version for consistency.</w:t>
       </w:r>
     </w:p>
     <w:p>
@@ -25697,7 +25474,7 @@
         <w:t xml:space="preserve"> </w:t>
       </w:r>
       <w:r>
-        <w:t xml:space="preserve">List of Pacific salmon Designatable Units where an 'Extreme' rating was assigned to the '10.1 Geological Events' IUCN-CMP threat category through the RPA process.</w:t>
+        <w:t xml:space="preserve">List of Pacific salmon Designatable Units where an 'Extreme' rating was assigned to the 10.1 Geological Events IUCN-CMP threat category through the RPA process.</w:t>
       </w:r>
     </w:p>
     <w:tbl xmlns:w="http://schemas.openxmlformats.org/wordprocessingml/2006/main" xmlns:r="http://schemas.openxmlformats.org/officeDocument/2006/relationships" xmlns:w14="http://schemas.microsoft.com/office/word/2010/wordml" xmlns:wp="http://schemas.openxmlformats.org/drawingml/2006/wordprocessingDrawing" xmlns:a="http://schemas.openxmlformats.org/drawingml/2006/main" xmlns:pic="http://schemas.openxmlformats.org/drawingml/2006/picture">
@@ -26577,43 +26354,7 @@
         <w:t xml:space="preserve">(Doutaz et al. 2023)</w:t>
       </w:r>
       <w:r>
-        <w:t xml:space="preserve">. This indirect connection to human activities means that</w:t>
-      </w:r>
-      <w:r>
-        <w:t xml:space="preserve"> </w:t>
-      </w:r>
-      <w:r>
-        <w:t xml:space="preserve">“</w:t>
-      </w:r>
-      <w:r>
-        <w:t xml:space="preserve">10.1 Geological Events</w:t>
-      </w:r>
-      <w:r>
-        <w:t xml:space="preserve">”</w:t>
-      </w:r>
-      <w:r>
-        <w:t xml:space="preserve"> </w:t>
-      </w:r>
-      <w:r>
-        <w:t xml:space="preserve">is not a large category to be matched with regulation. The LAPSE process and tool matched eight pieces of federal and provincial legislation specific to</w:t>
-      </w:r>
-      <w:r>
-        <w:t xml:space="preserve"> </w:t>
-      </w:r>
-      <w:r>
-        <w:t xml:space="preserve">“</w:t>
-      </w:r>
-      <w:r>
-        <w:t xml:space="preserve">10.1 Geological Events</w:t>
-      </w:r>
-      <w:r>
-        <w:t xml:space="preserve">”</w:t>
-      </w:r>
-      <w:r>
-        <w:t xml:space="preserve"> </w:t>
-      </w:r>
-      <w:r>
-        <w:t xml:space="preserve">(Figure</w:t>
+        <w:t xml:space="preserve">. This indirect connection to human activities means that 10.1 Geological Events is not a large category to be matched with regulation. The LAPSE process and tool matched eight pieces of federal and provincial legislation specific to 10.1 Geological Events (Figure</w:t>
       </w:r>
       <w:r>
         <w:t xml:space="preserve"> </w:t>
@@ -26632,9 +26373,9 @@
       <w:r>
         <w:drawing>
           <wp:inline>
-            <wp:extent cx="5943600" cy="4457699"/>
+            <wp:extent cx="5943600" cy="2377440"/>
             <wp:effectExtent b="0" l="0" r="0" t="0"/>
-            <wp:docPr descr="Figure 10: Count of sections by legislation for IUCN threat category ‘10.1 Geological Events’, coloured by jurisdiction." title="" id="80" name="Picture"/>
+            <wp:docPr descr="Figure 10: Count of sections by legislation for IUCN threat category 10.1 Geological Events, coloured by jurisdiction." title="" id="80" name="Picture"/>
             <a:graphic>
               <a:graphicData uri="http://schemas.openxmlformats.org/drawingml/2006/picture">
                 <pic:pic>
@@ -26653,7 +26394,7 @@
                   <pic:spPr bwMode="auto">
                     <a:xfrm>
                       <a:off x="0" y="0"/>
-                      <a:ext cx="5943600" cy="4457699"/>
+                      <a:ext cx="5943600" cy="2377440"/>
                     </a:xfrm>
                     <a:prstGeom prst="rect">
                       <a:avLst/>
@@ -26679,22 +26420,7 @@
       <w:bookmarkStart w:id="82" w:name="fig:section-count-iucn-geological"/>
       <w:bookmarkEnd w:id="82"/>
       <w:r>
-        <w:t xml:space="preserve">Figure 10: Count of sections by legislation for IUCN threat category</w:t>
-      </w:r>
-      <w:r>
-        <w:t xml:space="preserve"> </w:t>
-      </w:r>
-      <w:r>
-        <w:t xml:space="preserve">‘</w:t>
-      </w:r>
-      <w:r>
-        <w:t xml:space="preserve">10.1 Geological Events</w:t>
-      </w:r>
-      <w:r>
-        <w:t xml:space="preserve">’</w:t>
-      </w:r>
-      <w:r>
-        <w:t xml:space="preserve">, coloured by jurisdiction.</w:t>
+        <w:t xml:space="preserve">Figure 10: Count of sections by legislation for IUCN threat category 10.1 Geological Events, coloured by jurisdiction.</w:t>
       </w:r>
     </w:p>
     <w:p>
@@ -26951,19 +26677,7 @@
         <w:pStyle w:val="Heading2"/>
       </w:pPr>
       <w:r>
-        <w:t xml:space="preserve">Case Study: IUCN-CMP</w:t>
-      </w:r>
-      <w:r>
-        <w:t xml:space="preserve"> </w:t>
-      </w:r>
-      <w:r>
-        <w:t xml:space="preserve">“</w:t>
-      </w:r>
-      <w:r>
-        <w:t xml:space="preserve">7.2 Dams &amp; Water Management / Use</w:t>
-      </w:r>
-      <w:r>
-        <w:t xml:space="preserve">”</w:t>
+        <w:t xml:space="preserve">Case Study: IUCN-CMP 7.2 Dams &amp; Water Management / Use</w:t>
       </w:r>
     </w:p>
     <w:p>
@@ -27055,7 +26769,7 @@
         <w:t xml:space="preserve"> </w:t>
       </w:r>
       <w:r>
-        <w:t xml:space="preserve">lists dam construction, dam operations, levees and dikes, channelization, highway culverts, wetland draining, water catchment areas, surface water withdrawals, and groundwater pumping as examples of</w:t>
+        <w:t xml:space="preserve">lists dam construction, dam operations, levees and dikes, channelization, highway culverts, wetland draining, water catchment areas, surface water withdrawals, and groundwater pumping as examples of 7.2 Dams and Water Management / Use, and no longer lists</w:t>
       </w:r>
       <w:r>
         <w:t xml:space="preserve"> </w:t>
@@ -27064,7 +26778,7 @@
         <w:t xml:space="preserve">“</w:t>
       </w:r>
       <w:r>
-        <w:t xml:space="preserve">7.2 Dams and Water Management / Use,</w:t>
+        <w:t xml:space="preserve">Natural systems modifications</w:t>
       </w:r>
       <w:r>
         <w:t xml:space="preserve">”</w:t>
@@ -27073,7 +26787,7 @@
         <w:t xml:space="preserve"> </w:t>
       </w:r>
       <w:r>
-        <w:t xml:space="preserve">and no longer lists</w:t>
+        <w:t xml:space="preserve">as a threat category. We followed the version 4.0 category structure for consistency and considered the</w:t>
       </w:r>
       <w:r>
         <w:t xml:space="preserve"> </w:t>
@@ -27091,43 +26805,7 @@
         <w:t xml:space="preserve"> </w:t>
       </w:r>
       <w:r>
-        <w:t xml:space="preserve">as a threat category. We followed the version 4.0 category structure for consistency and considered the</w:t>
-      </w:r>
-      <w:r>
-        <w:t xml:space="preserve"> </w:t>
-      </w:r>
-      <w:r>
-        <w:t xml:space="preserve">“</w:t>
-      </w:r>
-      <w:r>
-        <w:t xml:space="preserve">Natural systems modifications</w:t>
-      </w:r>
-      <w:r>
-        <w:t xml:space="preserve">”</w:t>
-      </w:r>
-      <w:r>
-        <w:t xml:space="preserve"> </w:t>
-      </w:r>
-      <w:r>
-        <w:t xml:space="preserve">as applying to</w:t>
-      </w:r>
-      <w:r>
-        <w:t xml:space="preserve"> </w:t>
-      </w:r>
-      <w:r>
-        <w:t xml:space="preserve">“</w:t>
-      </w:r>
-      <w:r>
-        <w:t xml:space="preserve">7.2 Dams and Water Management / Use</w:t>
-      </w:r>
-      <w:r>
-        <w:t xml:space="preserve">”</w:t>
-      </w:r>
-      <w:r>
-        <w:t xml:space="preserve"> </w:t>
-      </w:r>
-      <w:r>
-        <w:t xml:space="preserve">since water extraction was described as the most significant factor for this threat in the RPA.</w:t>
+        <w:t xml:space="preserve">as applying to 7.2 Dams and Water Management / Use since water extraction was described as the most significant factor for this threat in the RPA.</w:t>
       </w:r>
     </w:p>
     <w:p>
@@ -27135,25 +26813,7 @@
         <w:pStyle w:val="BodyText"/>
       </w:pPr>
       <w:r>
-        <w:t xml:space="preserve">In contrast to the previous case study,</w:t>
-      </w:r>
-      <w:r>
-        <w:t xml:space="preserve"> </w:t>
-      </w:r>
-      <w:r>
-        <w:t xml:space="preserve">“</w:t>
-      </w:r>
-      <w:r>
-        <w:t xml:space="preserve">7.2 Dams and Water Management / Use</w:t>
-      </w:r>
-      <w:r>
-        <w:t xml:space="preserve">”</w:t>
-      </w:r>
-      <w:r>
-        <w:t xml:space="preserve"> </w:t>
-      </w:r>
-      <w:r>
-        <w:t xml:space="preserve">is one of the largest categories found within the accumulated legislation, matching with 105 statutes, 814 sections, and 3117 clauses. However, just like the previous case study, the most relevant legislation is in the provincial jurisdiction (Figure</w:t>
+        <w:t xml:space="preserve">In contrast to the previous case study, 7.2 Dams and Water Management / Use is one of the largest categories found within the accumulated legislation, matching with 105 statutes, 814 sections, and 3117 clauses. However, just like the previous case study, the most relevant legislation is in the provincial jurisdiction (Figure</w:t>
       </w:r>
       <w:r>
         <w:t xml:space="preserve"> </w:t>
@@ -27190,7 +26850,7 @@
           <wp:inline>
             <wp:extent cx="5943600" cy="4457699"/>
             <wp:effectExtent b="0" l="0" r="0" t="0"/>
-            <wp:docPr descr="Figure 12: Count of sections by legislation for IUCN threat category ‘7.2 Dams &amp; Water Management / Use’, coloured by jurisdiction. Top 15 legislation shown." title="" id="89" name="Picture"/>
+            <wp:docPr descr="Figure 12: Count of sections by legislation for IUCN threat category 7.2 Dams &amp; Water Management / Use, coloured by jurisdiction. Top 15 legislation shown." title="" id="89" name="Picture"/>
             <a:graphic>
               <a:graphicData uri="http://schemas.openxmlformats.org/drawingml/2006/picture">
                 <pic:pic>
@@ -27235,22 +26895,7 @@
       <w:bookmarkStart w:id="91" w:name="fig:section-count-iucn-dams-water"/>
       <w:bookmarkEnd w:id="91"/>
       <w:r>
-        <w:t xml:space="preserve">Figure 12: Count of sections by legislation for IUCN threat category</w:t>
-      </w:r>
-      <w:r>
-        <w:t xml:space="preserve"> </w:t>
-      </w:r>
-      <w:r>
-        <w:t xml:space="preserve">‘</w:t>
-      </w:r>
-      <w:r>
-        <w:t xml:space="preserve">7.2 Dams &amp; Water Management / Use</w:t>
-      </w:r>
-      <w:r>
-        <w:t xml:space="preserve">’</w:t>
-      </w:r>
-      <w:r>
-        <w:t xml:space="preserve">, coloured by jurisdiction. Top 15 legislation shown.</w:t>
+        <w:t xml:space="preserve">Figure 12: Count of sections by legislation for IUCN threat category 7.2 Dams &amp; Water Management / Use, coloured by jurisdiction. Top 15 legislation shown.</w:t>
       </w:r>
     </w:p>
     <w:p>
@@ -27258,25 +26903,7 @@
         <w:pStyle w:val="BodyText"/>
       </w:pPr>
       <w:r>
-        <w:t xml:space="preserve">The clause type matches for</w:t>
-      </w:r>
-      <w:r>
-        <w:t xml:space="preserve"> </w:t>
-      </w:r>
-      <w:r>
-        <w:t xml:space="preserve">“</w:t>
-      </w:r>
-      <w:r>
-        <w:t xml:space="preserve">7.2 Dams and Water Management / Use</w:t>
-      </w:r>
-      <w:r>
-        <w:t xml:space="preserve">”</w:t>
-      </w:r>
-      <w:r>
-        <w:t xml:space="preserve"> </w:t>
-      </w:r>
-      <w:r>
-        <w:t xml:space="preserve">were much more evenly distributed likely due to the large number of clause matches in total for that IUCN-CMP threat category.</w:t>
+        <w:t xml:space="preserve">The clause type matches for 7.2 Dams and Water Management / Use were much more evenly distributed likely due to the large number of clause matches in total for that IUCN-CMP threat category.</w:t>
       </w:r>
       <w:r>
         <w:t xml:space="preserve"> </w:t>
@@ -27804,7 +27431,7 @@
         <w:t xml:space="preserve">Regulate Environmental Issues</w:t>
       </w:r>
       <w:r>
-        <w:t xml:space="preserve">.</w:t>
+        <w:t xml:space="preserve">. Library of Parliament, Canada, Ottawa, ON.</w:t>
       </w:r>
     </w:p>
     <w:bookmarkEnd w:id="105"/>
@@ -28292,7 +27919,7 @@
         <w:t xml:space="preserve">Canada</w:t>
       </w:r>
       <w:r>
-        <w:t xml:space="preserve">.</w:t>
+        <w:t xml:space="preserve">. Articles &amp; Book Chapters</w:t>
       </w:r>
       <w:r>
         <w:t xml:space="preserve"> </w:t>
@@ -28305,7 +27932,7 @@
         <w:t xml:space="preserve">52</w:t>
       </w:r>
       <w:r>
-        <w:t xml:space="preserve">.</w:t>
+        <w:t xml:space="preserve">(2740).</w:t>
       </w:r>
     </w:p>
     <w:bookmarkEnd w:id="118"/>
@@ -32122,10 +31749,28 @@
       <w:sz w:val="22"/>
     </w:rPr>
   </w:style>
-  <w:style w:type="paragraph" w:customStyle="1" w:styleId="TableCaption">
+  <w:style w:customStyle="1" w:styleId="ImageCaption" w:type="paragraph">
+    <w:name w:val="Image Caption"/>
+    <w:basedOn w:val="Normal"/>
+    <w:qFormat/>
+    <w:rsid w:val="00C63FDA"/>
+    <w:pPr>
+      <w:keepNext/>
+      <w:keepLines/>
+      <w:ind w:right="720"/>
+    </w:pPr>
+    <w:rPr>
+      <w:rFonts w:cstheme="majorBidi" w:eastAsiaTheme="majorEastAsia"/>
+      <w:i/>
+      <w:sz w:val="22"/>
+      <w:szCs w:val="40"/>
+    </w:rPr>
+  </w:style>
+  <w:style w:customStyle="1" w:styleId="TableCaption" w:type="paragraph">
     <w:name w:val="Table Caption"/>
-    <w:basedOn w:val="BodyText"/>
+    <w:basedOn w:val="ImageCaption"/>
     <w:qFormat/>
+    <w:rsid w:val="00C63FDA"/>
   </w:style>
   <w:style w:type="paragraph" w:customStyle="1" w:styleId="SourceCode">
     <w:name w:val="Source Code"/>

</xml_diff>